<commit_message>
Updated portfolio-documentation with Phase 2 details
</commit_message>
<xml_diff>
--- a/documentation/nicosys-healthcare-portfolio-documentation.docx
+++ b/documentation/nicosys-healthcare-portfolio-documentation.docx
@@ -12,6 +12,109 @@
         <w:rPr>
           <w:u w:val="single"/>
         </w:rPr>
+        <w:t>Phase 2: Exploratory SQL | Created 7-10-2026 | Completed</w:t>
+      </w:r>
+    </w:p>
+    <w:p>
+      <w:r>
+        <w:t>Beginning to answer business questions:</w:t>
+      </w:r>
+    </w:p>
+    <w:p>
+      <w:pPr>
+        <w:pStyle w:val="ListParagraph"/>
+        <w:numPr>
+          <w:ilvl w:val="0"/>
+          <w:numId w:val="6"/>
+        </w:numPr>
+      </w:pPr>
+      <w:r>
+        <w:t>What is the average and median ER wait time?</w:t>
+      </w:r>
+    </w:p>
+    <w:p>
+      <w:pPr>
+        <w:pStyle w:val="ListParagraph"/>
+        <w:numPr>
+          <w:ilvl w:val="0"/>
+          <w:numId w:val="6"/>
+        </w:numPr>
+      </w:pPr>
+      <w:r>
+        <w:t>Which days have the longest wait times?</w:t>
+      </w:r>
+    </w:p>
+    <w:p>
+      <w:pPr>
+        <w:pStyle w:val="ListParagraph"/>
+        <w:numPr>
+          <w:ilvl w:val="0"/>
+          <w:numId w:val="6"/>
+        </w:numPr>
+      </w:pPr>
+      <w:r>
+        <w:t>Which hours experience the highest patient volume?</w:t>
+      </w:r>
+    </w:p>
+    <w:p>
+      <w:pPr>
+        <w:pStyle w:val="ListParagraph"/>
+        <w:numPr>
+          <w:ilvl w:val="0"/>
+          <w:numId w:val="6"/>
+        </w:numPr>
+      </w:pPr>
+      <w:r>
+        <w:t>Does severity level affect wait-time?</w:t>
+      </w:r>
+    </w:p>
+    <w:p>
+      <w:pPr>
+        <w:pStyle w:val="ListParagraph"/>
+        <w:numPr>
+          <w:ilvl w:val="0"/>
+          <w:numId w:val="6"/>
+        </w:numPr>
+      </w:pPr>
+      <w:r>
+        <w:t>Are admitted patients waiting longer than discharged patients?</w:t>
+      </w:r>
+    </w:p>
+    <w:p>
+      <w:pPr>
+        <w:pStyle w:val="ListParagraph"/>
+        <w:numPr>
+          <w:ilvl w:val="0"/>
+          <w:numId w:val="6"/>
+        </w:numPr>
+      </w:pPr>
+      <w:r>
+        <w:t>Are there operational bottlenecks that explain patient complaints?</w:t>
+      </w:r>
+    </w:p>
+    <w:p>
+      <w:pPr>
+        <w:rPr>
+          <w:u w:val="single"/>
+        </w:rPr>
+      </w:pPr>
+    </w:p>
+    <w:p>
+      <w:pPr>
+        <w:rPr>
+          <w:u w:val="single"/>
+        </w:rPr>
+      </w:pPr>
+      <w:r>
+        <w:rPr>
+          <w:u w:val="single"/>
+        </w:rPr>
+        <w:t xml:space="preserve">Started </w:t>
+      </w:r>
+      <w:r>
+        <w:rPr>
+          <w:u w:val="single"/>
+        </w:rPr>
         <w:t>7</w:t>
       </w:r>
       <w:r>
@@ -98,6 +201,20 @@
         </w:rPr>
         <w:t>ion</w:t>
       </w:r>
+      <w:r>
+        <w:rPr>
+          <w:u w:val="single"/>
+        </w:rPr>
+        <w:t xml:space="preserve"> </w:t>
+      </w:r>
+      <w:r>
+        <w:rPr>
+          <w:b/>
+          <w:bCs/>
+          <w:u w:val="single"/>
+        </w:rPr>
+        <w:t>Completed 7/10/2026</w:t>
+      </w:r>
     </w:p>
     <w:p>
       <w:r>
@@ -116,15 +233,7 @@
     </w:p>
     <w:p>
       <w:r>
-        <w:t xml:space="preserve">2. Identify the primary and </w:t>
-      </w:r>
-      <w:proofErr w:type="gramStart"/>
-      <w:r>
-        <w:t>Foreign</w:t>
-      </w:r>
-      <w:proofErr w:type="gramEnd"/>
-      <w:r>
-        <w:t xml:space="preserve"> key(s).</w:t>
+        <w:t>2. Identify the primary and Foreign key(s).</w:t>
       </w:r>
     </w:p>
     <w:p>
@@ -419,7 +528,6 @@
       <w:r>
         <w:t xml:space="preserve"> </w:t>
       </w:r>
-      <w:proofErr w:type="gramStart"/>
       <w:r>
         <w:t>patie</w:t>
       </w:r>
@@ -427,11 +535,7 @@
         <w:t>nt</w:t>
       </w:r>
       <w:r>
-        <w:t>s</w:t>
-      </w:r>
-      <w:proofErr w:type="gramEnd"/>
-      <w:r>
-        <w:t xml:space="preserve"> data</w:t>
+        <w:t>s data</w:t>
       </w:r>
       <w:r>
         <w:t>se</w:t>
@@ -590,6 +694,7 @@
         </w:numPr>
       </w:pPr>
       <w:r>
+        <w:lastRenderedPageBreak/>
         <w:t>The p</w:t>
       </w:r>
       <w:r>
@@ -737,15 +842,7 @@
         <w:t>imary ke</w:t>
       </w:r>
       <w:r>
-        <w:t xml:space="preserve">y </w:t>
-      </w:r>
-      <w:proofErr w:type="gramStart"/>
-      <w:r>
-        <w:t>to</w:t>
-      </w:r>
-      <w:proofErr w:type="gramEnd"/>
-      <w:r>
-        <w:t xml:space="preserve"> i</w:t>
+        <w:t>y to i</w:t>
       </w:r>
       <w:r>
         <w:t>d</w:t>
@@ -887,14 +984,12 @@
       <w:r>
         <w:t xml:space="preserve">the </w:t>
       </w:r>
-      <w:proofErr w:type="gramStart"/>
       <w:r>
         <w:t>pati</w:t>
       </w:r>
       <w:r>
         <w:t>ents</w:t>
       </w:r>
-      <w:proofErr w:type="gramEnd"/>
       <w:r>
         <w:t xml:space="preserve"> da</w:t>
       </w:r>
@@ -971,14 +1066,767 @@
       </w:pPr>
       <w:proofErr w:type="spellStart"/>
       <w:r>
+        <w:t>Arrival</w:t>
+      </w:r>
+      <w:r>
+        <w:t>_</w:t>
+      </w:r>
+      <w:r>
+        <w:t>day</w:t>
+      </w:r>
+      <w:proofErr w:type="spellEnd"/>
+    </w:p>
+    <w:p>
+      <w:pPr>
+        <w:pStyle w:val="ListParagraph"/>
+        <w:numPr>
+          <w:ilvl w:val="2"/>
+          <w:numId w:val="1"/>
+        </w:numPr>
+      </w:pPr>
+      <w:r>
+        <w:t>The da</w:t>
+      </w:r>
+      <w:r>
+        <w:t xml:space="preserve">y of the </w:t>
+      </w:r>
+      <w:r>
+        <w:t>week</w:t>
+      </w:r>
+      <w:r>
+        <w:t xml:space="preserve">, when </w:t>
+      </w:r>
+      <w:r>
+        <w:t>a pati</w:t>
+      </w:r>
+      <w:r>
+        <w:t>ent arriv</w:t>
+      </w:r>
+      <w:r>
+        <w:t xml:space="preserve">ed </w:t>
+      </w:r>
+      <w:r>
+        <w:t>at the E</w:t>
+      </w:r>
+      <w:r>
+        <w:t>R</w:t>
+      </w:r>
+    </w:p>
+    <w:p>
+      <w:pPr>
+        <w:pStyle w:val="ListParagraph"/>
+        <w:numPr>
+          <w:ilvl w:val="1"/>
+          <w:numId w:val="1"/>
+        </w:numPr>
+      </w:pPr>
+      <w:proofErr w:type="spellStart"/>
+      <w:r>
+        <w:t>Ar</w:t>
+      </w:r>
+      <w:r>
+        <w:t>rival_</w:t>
+      </w:r>
+      <w:r>
+        <w:t>hou</w:t>
+      </w:r>
+      <w:r>
+        <w:t>r</w:t>
+      </w:r>
+      <w:proofErr w:type="spellEnd"/>
+    </w:p>
+    <w:p>
+      <w:pPr>
+        <w:pStyle w:val="ListParagraph"/>
+        <w:numPr>
+          <w:ilvl w:val="2"/>
+          <w:numId w:val="1"/>
+        </w:numPr>
+      </w:pPr>
+      <w:r>
+        <w:t xml:space="preserve">The </w:t>
+      </w:r>
+      <w:r>
+        <w:t xml:space="preserve">time </w:t>
+      </w:r>
+      <w:r>
+        <w:t>of</w:t>
+      </w:r>
+      <w:r>
+        <w:t xml:space="preserve"> day</w:t>
+      </w:r>
+      <w:r>
+        <w:t xml:space="preserve"> (</w:t>
+      </w:r>
+      <w:r>
+        <w:t>at the top of</w:t>
+      </w:r>
+      <w:r>
+        <w:t xml:space="preserve"> the hour</w:t>
+      </w:r>
+      <w:r>
+        <w:t>)</w:t>
+      </w:r>
+      <w:r>
+        <w:t>, whe</w:t>
+      </w:r>
+      <w:r>
+        <w:t>n a patie</w:t>
+      </w:r>
+      <w:r>
+        <w:t xml:space="preserve">nt </w:t>
+      </w:r>
+      <w:r>
+        <w:t xml:space="preserve">arrived </w:t>
+      </w:r>
+      <w:r>
+        <w:t xml:space="preserve">at the </w:t>
+      </w:r>
+      <w:r>
+        <w:t>ER</w:t>
+      </w:r>
+      <w:r>
+        <w:t>.</w:t>
+      </w:r>
+    </w:p>
+    <w:p>
+      <w:pPr>
+        <w:pStyle w:val="ListParagraph"/>
+        <w:numPr>
+          <w:ilvl w:val="1"/>
+          <w:numId w:val="1"/>
+        </w:numPr>
+      </w:pPr>
+      <w:proofErr w:type="spellStart"/>
+      <w:r>
+        <w:t>S</w:t>
+      </w:r>
+      <w:r>
+        <w:t>everit</w:t>
+      </w:r>
+      <w:r>
+        <w:t>y_</w:t>
+      </w:r>
+      <w:r>
+        <w:t>lev</w:t>
+      </w:r>
+      <w:r>
+        <w:t>el</w:t>
+      </w:r>
+      <w:proofErr w:type="spellEnd"/>
+    </w:p>
+    <w:p>
+      <w:pPr>
+        <w:pStyle w:val="ListParagraph"/>
+        <w:numPr>
+          <w:ilvl w:val="2"/>
+          <w:numId w:val="1"/>
+        </w:numPr>
+      </w:pPr>
+      <w:r>
+        <w:t xml:space="preserve">A </w:t>
+      </w:r>
+      <w:r>
+        <w:t>c</w:t>
+      </w:r>
+      <w:r>
+        <w:t>lassi</w:t>
+      </w:r>
+      <w:r>
+        <w:t xml:space="preserve">fication </w:t>
+      </w:r>
+      <w:r>
+        <w:t>of how</w:t>
+      </w:r>
+      <w:r>
+        <w:t xml:space="preserve"> severe a </w:t>
+      </w:r>
+      <w:r>
+        <w:t>patient</w:t>
+      </w:r>
+      <w:r>
+        <w:t>’s vis</w:t>
+      </w:r>
+      <w:r>
+        <w:t xml:space="preserve">it to </w:t>
+      </w:r>
+      <w:r>
+        <w:t>the ER</w:t>
+      </w:r>
+      <w:r>
+        <w:t xml:space="preserve"> was. </w:t>
+      </w:r>
+    </w:p>
+    <w:p>
+      <w:pPr>
+        <w:pStyle w:val="ListParagraph"/>
+        <w:numPr>
+          <w:ilvl w:val="1"/>
+          <w:numId w:val="1"/>
+        </w:numPr>
+      </w:pPr>
+      <w:proofErr w:type="spellStart"/>
+      <w:r>
+        <w:t>Wait_tim</w:t>
+      </w:r>
+      <w:r>
+        <w:t>e_m</w:t>
+      </w:r>
+      <w:r>
+        <w:t>inute</w:t>
+      </w:r>
+      <w:r>
+        <w:t>s</w:t>
+      </w:r>
+      <w:proofErr w:type="spellEnd"/>
+    </w:p>
+    <w:p>
+      <w:pPr>
+        <w:pStyle w:val="ListParagraph"/>
+        <w:numPr>
+          <w:ilvl w:val="2"/>
+          <w:numId w:val="1"/>
+        </w:numPr>
+      </w:pPr>
+      <w:r>
+        <w:t>The a</w:t>
+      </w:r>
+      <w:r>
+        <w:t xml:space="preserve">mount of </w:t>
+      </w:r>
+      <w:r>
+        <w:t>time a p</w:t>
+      </w:r>
+      <w:r>
+        <w:t xml:space="preserve">atient </w:t>
+      </w:r>
+      <w:r>
+        <w:t xml:space="preserve">had to </w:t>
+      </w:r>
+      <w:r>
+        <w:t xml:space="preserve">wait </w:t>
+      </w:r>
+      <w:r>
+        <w:t xml:space="preserve">to be </w:t>
+      </w:r>
+      <w:r>
+        <w:t xml:space="preserve">seen </w:t>
+      </w:r>
+      <w:r>
+        <w:t xml:space="preserve">in </w:t>
+      </w:r>
+      <w:r>
+        <w:t xml:space="preserve">the </w:t>
+      </w:r>
+      <w:r>
+        <w:t xml:space="preserve">ER. </w:t>
+      </w:r>
+    </w:p>
+    <w:p>
+      <w:pPr>
+        <w:pStyle w:val="ListParagraph"/>
+        <w:numPr>
+          <w:ilvl w:val="1"/>
+          <w:numId w:val="1"/>
+        </w:numPr>
+      </w:pPr>
+      <w:proofErr w:type="spellStart"/>
+      <w:r>
+        <w:t>L</w:t>
+      </w:r>
+      <w:r>
+        <w:t>e</w:t>
+      </w:r>
+      <w:r>
+        <w:t>ngth</w:t>
+      </w:r>
+      <w:r>
+        <w:t>_</w:t>
+      </w:r>
+      <w:r>
+        <w:t>of_s</w:t>
+      </w:r>
+      <w:r>
+        <w:t>tay_h</w:t>
+      </w:r>
+      <w:r>
+        <w:t>ours</w:t>
+      </w:r>
+      <w:proofErr w:type="spellEnd"/>
+    </w:p>
+    <w:p>
+      <w:pPr>
+        <w:pStyle w:val="ListParagraph"/>
+        <w:numPr>
+          <w:ilvl w:val="2"/>
+          <w:numId w:val="1"/>
+        </w:numPr>
+      </w:pPr>
+      <w:r>
+        <w:t xml:space="preserve">The </w:t>
+      </w:r>
+      <w:r>
+        <w:t>number</w:t>
+      </w:r>
+      <w:r>
+        <w:t xml:space="preserve"> of</w:t>
+      </w:r>
+      <w:r>
+        <w:t xml:space="preserve"> </w:t>
+      </w:r>
+      <w:r>
+        <w:t>hour</w:t>
+      </w:r>
+      <w:r>
+        <w:t>(s)</w:t>
+      </w:r>
+      <w:r>
+        <w:t xml:space="preserve"> a </w:t>
+      </w:r>
+      <w:r>
+        <w:t>patient</w:t>
+      </w:r>
+      <w:r>
+        <w:t xml:space="preserve"> </w:t>
+      </w:r>
+      <w:r>
+        <w:t xml:space="preserve">stayed </w:t>
+      </w:r>
+      <w:r>
+        <w:t>in the E</w:t>
+      </w:r>
+      <w:r>
+        <w:t>R</w:t>
+      </w:r>
+      <w:r>
+        <w:t xml:space="preserve">, from arrival until discharge from the ER or admission to the hospital. </w:t>
+      </w:r>
+    </w:p>
+    <w:p>
+      <w:pPr>
+        <w:pStyle w:val="ListParagraph"/>
+        <w:numPr>
+          <w:ilvl w:val="3"/>
+          <w:numId w:val="1"/>
+        </w:numPr>
+      </w:pPr>
+      <w:r>
+        <w:t>Hospital stay after admission is not included in this field (</w:t>
+      </w:r>
+      <w:proofErr w:type="spellStart"/>
+      <w:r>
+        <w:t>losh</w:t>
+      </w:r>
+      <w:proofErr w:type="spellEnd"/>
+      <w:r>
+        <w:t>)</w:t>
+      </w:r>
+    </w:p>
+    <w:p>
+      <w:pPr>
+        <w:pStyle w:val="ListParagraph"/>
+        <w:numPr>
+          <w:ilvl w:val="1"/>
+          <w:numId w:val="1"/>
+        </w:numPr>
+      </w:pPr>
+      <w:r>
+        <w:t>A</w:t>
+      </w:r>
+      <w:r>
+        <w:t>dm</w:t>
+      </w:r>
+      <w:r>
+        <w:t>itted</w:t>
+      </w:r>
+    </w:p>
+    <w:p>
+      <w:pPr>
+        <w:pStyle w:val="ListParagraph"/>
+        <w:numPr>
+          <w:ilvl w:val="2"/>
+          <w:numId w:val="1"/>
+        </w:numPr>
+      </w:pPr>
+      <w:r>
+        <w:t xml:space="preserve">Yes: </w:t>
+      </w:r>
+      <w:r>
+        <w:t xml:space="preserve">Shows </w:t>
+      </w:r>
+      <w:r>
+        <w:t>pati</w:t>
+      </w:r>
+      <w:r>
+        <w:t xml:space="preserve">ents </w:t>
+      </w:r>
+      <w:r>
+        <w:t xml:space="preserve">who </w:t>
+      </w:r>
+      <w:r>
+        <w:t>hav</w:t>
+      </w:r>
+      <w:r>
+        <w:t>e</w:t>
+      </w:r>
+      <w:r>
+        <w:t xml:space="preserve"> be</w:t>
+      </w:r>
+      <w:r>
+        <w:t>en assi</w:t>
+      </w:r>
+      <w:r>
+        <w:t>gned to st</w:t>
+      </w:r>
+      <w:r>
+        <w:t>ay at t</w:t>
+      </w:r>
+      <w:r>
+        <w:t>he ho</w:t>
+      </w:r>
+      <w:r>
+        <w:t>spital</w:t>
+      </w:r>
+      <w:r>
+        <w:t xml:space="preserve">, </w:t>
+      </w:r>
+      <w:r>
+        <w:t xml:space="preserve"> or </w:t>
+      </w:r>
+      <w:r>
+        <w:t xml:space="preserve">No: </w:t>
+      </w:r>
+      <w:r>
+        <w:t>dis</w:t>
+      </w:r>
+      <w:r>
+        <w:t>cha</w:t>
+      </w:r>
+      <w:r>
+        <w:t>rg</w:t>
+      </w:r>
+      <w:r>
+        <w:t xml:space="preserve">ed </w:t>
+      </w:r>
+      <w:r>
+        <w:t>afte</w:t>
+      </w:r>
+      <w:r>
+        <w:t xml:space="preserve">r being </w:t>
+      </w:r>
+      <w:r>
+        <w:t xml:space="preserve">seen in the </w:t>
+      </w:r>
+      <w:r>
+        <w:t xml:space="preserve">ER. </w:t>
+      </w:r>
+    </w:p>
+    <w:p>
+      <w:pPr>
+        <w:pStyle w:val="ListParagraph"/>
+        <w:numPr>
+          <w:ilvl w:val="0"/>
+          <w:numId w:val="1"/>
+        </w:numPr>
+      </w:pPr>
+      <w:r>
+        <w:t>A</w:t>
+      </w:r>
+      <w:r>
+        <w:t>p</w:t>
+      </w:r>
+      <w:r>
+        <w:t>pointment</w:t>
+      </w:r>
+      <w:r>
+        <w:t>s</w:t>
+      </w:r>
+    </w:p>
+    <w:p>
+      <w:pPr>
+        <w:pStyle w:val="ListParagraph"/>
+        <w:numPr>
+          <w:ilvl w:val="1"/>
+          <w:numId w:val="1"/>
+        </w:numPr>
+      </w:pPr>
+      <w:proofErr w:type="spellStart"/>
+      <w:r>
+        <w:t>A</w:t>
+      </w:r>
+      <w:r>
+        <w:t>pp</w:t>
+      </w:r>
+      <w:r>
+        <w:t>ointment</w:t>
+      </w:r>
+      <w:r>
+        <w:t>_id</w:t>
+      </w:r>
+      <w:proofErr w:type="spellEnd"/>
+    </w:p>
+    <w:p>
+      <w:pPr>
+        <w:pStyle w:val="ListParagraph"/>
+        <w:numPr>
+          <w:ilvl w:val="2"/>
+          <w:numId w:val="1"/>
+        </w:numPr>
+      </w:pPr>
+      <w:r>
+        <w:t>A number to identify</w:t>
+      </w:r>
+      <w:r>
+        <w:t xml:space="preserve"> each appointment at the </w:t>
+      </w:r>
+      <w:r>
+        <w:t>Valley Regional Medical Center</w:t>
+      </w:r>
+      <w:r>
+        <w:t xml:space="preserve">. </w:t>
+      </w:r>
+    </w:p>
+    <w:p>
+      <w:pPr>
+        <w:pStyle w:val="ListParagraph"/>
+        <w:numPr>
+          <w:ilvl w:val="1"/>
+          <w:numId w:val="1"/>
+        </w:numPr>
+      </w:pPr>
+      <w:proofErr w:type="spellStart"/>
+      <w:r>
+        <w:t>P</w:t>
+      </w:r>
+      <w:r>
+        <w:t>ati</w:t>
+      </w:r>
+      <w:r>
+        <w:t>ent_id</w:t>
+      </w:r>
+      <w:proofErr w:type="spellEnd"/>
+    </w:p>
+    <w:p>
+      <w:pPr>
+        <w:pStyle w:val="ListParagraph"/>
+        <w:numPr>
+          <w:ilvl w:val="2"/>
+          <w:numId w:val="1"/>
+        </w:numPr>
+      </w:pPr>
+      <w:r>
+        <w:t>An id, referencing a specific patient. The details of the p</w:t>
+      </w:r>
+      <w:r>
+        <w:t>atient</w:t>
+      </w:r>
+      <w:r>
+        <w:t xml:space="preserve"> will be found withing the patient dataset. </w:t>
+      </w:r>
+    </w:p>
+    <w:p>
+      <w:pPr>
+        <w:pStyle w:val="ListParagraph"/>
+        <w:numPr>
+          <w:ilvl w:val="1"/>
+          <w:numId w:val="1"/>
+        </w:numPr>
+      </w:pPr>
+      <w:proofErr w:type="spellStart"/>
+      <w:r>
+        <w:t>P</w:t>
+      </w:r>
+      <w:r>
+        <w:t>rovi</w:t>
+      </w:r>
+      <w:r>
+        <w:t>der_id</w:t>
+      </w:r>
+      <w:proofErr w:type="spellEnd"/>
+    </w:p>
+    <w:p>
+      <w:pPr>
+        <w:pStyle w:val="ListParagraph"/>
+        <w:numPr>
+          <w:ilvl w:val="2"/>
+          <w:numId w:val="1"/>
+        </w:numPr>
+      </w:pPr>
+      <w:r>
+        <w:t>An id</w:t>
+      </w:r>
+      <w:r>
+        <w:t>,</w:t>
+      </w:r>
+      <w:r>
+        <w:t xml:space="preserve"> referencing a specific provider. The details of the provider will be found withing the provider dataset. </w:t>
+      </w:r>
+    </w:p>
+    <w:p>
+      <w:pPr>
+        <w:pStyle w:val="ListParagraph"/>
+        <w:numPr>
+          <w:ilvl w:val="1"/>
+          <w:numId w:val="1"/>
+        </w:numPr>
+      </w:pPr>
+      <w:r>
         <w:lastRenderedPageBreak/>
-        <w:t>Arrival</w:t>
+        <w:t>D</w:t>
+      </w:r>
+      <w:r>
+        <w:t>e</w:t>
+      </w:r>
+      <w:r>
+        <w:t>part</w:t>
+      </w:r>
+      <w:r>
+        <w:t>ment</w:t>
+      </w:r>
+    </w:p>
+    <w:p>
+      <w:pPr>
+        <w:pStyle w:val="ListParagraph"/>
+        <w:numPr>
+          <w:ilvl w:val="2"/>
+          <w:numId w:val="1"/>
+        </w:numPr>
+      </w:pPr>
+      <w:r>
+        <w:t xml:space="preserve">Shows which department the appointment is associated with. </w:t>
+      </w:r>
+    </w:p>
+    <w:p>
+      <w:pPr>
+        <w:pStyle w:val="ListParagraph"/>
+        <w:numPr>
+          <w:ilvl w:val="1"/>
+          <w:numId w:val="1"/>
+        </w:numPr>
+      </w:pPr>
+      <w:proofErr w:type="spellStart"/>
+      <w:r>
+        <w:t>A</w:t>
+      </w:r>
+      <w:r>
+        <w:t>ppo</w:t>
+      </w:r>
+      <w:r>
+        <w:t>intment</w:t>
+      </w:r>
+      <w:r>
+        <w:t>_date</w:t>
+      </w:r>
+      <w:proofErr w:type="spellEnd"/>
+    </w:p>
+    <w:p>
+      <w:pPr>
+        <w:pStyle w:val="ListParagraph"/>
+        <w:numPr>
+          <w:ilvl w:val="2"/>
+          <w:numId w:val="1"/>
+        </w:numPr>
+      </w:pPr>
+      <w:r>
+        <w:t xml:space="preserve">Shows the date of the appointment. </w:t>
+      </w:r>
+    </w:p>
+    <w:p>
+      <w:pPr>
+        <w:pStyle w:val="ListParagraph"/>
+        <w:numPr>
+          <w:ilvl w:val="1"/>
+          <w:numId w:val="1"/>
+        </w:numPr>
+      </w:pPr>
+      <w:proofErr w:type="spellStart"/>
+      <w:r>
+        <w:t>A</w:t>
+      </w:r>
+      <w:r>
+        <w:t>pp</w:t>
+      </w:r>
+      <w:r>
+        <w:t>ointment</w:t>
+      </w:r>
+      <w:r>
+        <w:t>_day</w:t>
+      </w:r>
+      <w:proofErr w:type="spellEnd"/>
+    </w:p>
+    <w:p>
+      <w:pPr>
+        <w:pStyle w:val="ListParagraph"/>
+        <w:numPr>
+          <w:ilvl w:val="2"/>
+          <w:numId w:val="1"/>
+        </w:numPr>
+      </w:pPr>
+      <w:r>
+        <w:t xml:space="preserve">Shows the day of the week the appointment was on. </w:t>
+      </w:r>
+    </w:p>
+    <w:p>
+      <w:pPr>
+        <w:pStyle w:val="ListParagraph"/>
+        <w:numPr>
+          <w:ilvl w:val="1"/>
+          <w:numId w:val="1"/>
+        </w:numPr>
+      </w:pPr>
+      <w:proofErr w:type="spellStart"/>
+      <w:r>
+        <w:t>A</w:t>
+      </w:r>
+      <w:r>
+        <w:t>ppoint</w:t>
+      </w:r>
+      <w:r>
+        <w:t>ment_ty</w:t>
+      </w:r>
+      <w:r>
+        <w:t>pe</w:t>
+      </w:r>
+      <w:proofErr w:type="spellEnd"/>
+    </w:p>
+    <w:p>
+      <w:pPr>
+        <w:pStyle w:val="ListParagraph"/>
+        <w:numPr>
+          <w:ilvl w:val="2"/>
+          <w:numId w:val="1"/>
+        </w:numPr>
+      </w:pPr>
+      <w:r>
+        <w:t xml:space="preserve">Defines the type of appointment </w:t>
+      </w:r>
+    </w:p>
+    <w:p>
+      <w:pPr>
+        <w:pStyle w:val="ListParagraph"/>
+        <w:numPr>
+          <w:ilvl w:val="1"/>
+          <w:numId w:val="1"/>
+        </w:numPr>
+      </w:pPr>
+      <w:proofErr w:type="spellStart"/>
+      <w:r>
+        <w:t>A</w:t>
+      </w:r>
+      <w:r>
+        <w:t>pp</w:t>
+      </w:r>
+      <w:r>
+        <w:t>ointment</w:t>
       </w:r>
       <w:r>
         <w:t>_</w:t>
       </w:r>
       <w:r>
-        <w:t>day</w:t>
+        <w:t>sta</w:t>
+      </w:r>
+      <w:r>
+        <w:t>tus</w:t>
       </w:r>
       <w:proofErr w:type="spellEnd"/>
     </w:p>
@@ -991,31 +1839,10 @@
         </w:numPr>
       </w:pPr>
       <w:r>
-        <w:t>The da</w:t>
-      </w:r>
-      <w:r>
-        <w:t xml:space="preserve">y of the </w:t>
-      </w:r>
-      <w:r>
-        <w:t>week</w:t>
-      </w:r>
-      <w:r>
-        <w:t xml:space="preserve">, when </w:t>
-      </w:r>
-      <w:r>
-        <w:t>a pati</w:t>
-      </w:r>
-      <w:r>
-        <w:t>ent arriv</w:t>
-      </w:r>
-      <w:r>
-        <w:t xml:space="preserve">ed </w:t>
-      </w:r>
-      <w:r>
-        <w:t>at the E</w:t>
-      </w:r>
-      <w:r>
-        <w:t>R</w:t>
+        <w:t xml:space="preserve">Defines an appointment as either </w:t>
+      </w:r>
+      <w:r>
+        <w:t>Completed, Cancelled, or no-show</w:t>
       </w:r>
     </w:p>
     <w:p>
@@ -1028,16 +1855,28 @@
       </w:pPr>
       <w:proofErr w:type="spellStart"/>
       <w:r>
-        <w:t>Ar</w:t>
-      </w:r>
-      <w:r>
-        <w:t>rival_</w:t>
-      </w:r>
-      <w:r>
-        <w:t>hou</w:t>
-      </w:r>
-      <w:r>
-        <w:t>r</w:t>
+        <w:t>A</w:t>
+      </w:r>
+      <w:r>
+        <w:t>pp</w:t>
+      </w:r>
+      <w:r>
+        <w:t>ointment</w:t>
+      </w:r>
+      <w:r>
+        <w:t>_dura</w:t>
+      </w:r>
+      <w:r>
+        <w:t>tion</w:t>
+      </w:r>
+      <w:r>
+        <w:t>_</w:t>
+      </w:r>
+      <w:r>
+        <w:t>min</w:t>
+      </w:r>
+      <w:r>
+        <w:t>utes</w:t>
       </w:r>
       <w:proofErr w:type="spellEnd"/>
     </w:p>
@@ -1050,49 +1889,10 @@
         </w:numPr>
       </w:pPr>
       <w:r>
-        <w:t xml:space="preserve">The </w:t>
-      </w:r>
-      <w:r>
-        <w:t xml:space="preserve">time </w:t>
-      </w:r>
-      <w:r>
-        <w:t>of</w:t>
-      </w:r>
-      <w:r>
-        <w:t xml:space="preserve"> day</w:t>
-      </w:r>
-      <w:r>
-        <w:t xml:space="preserve"> (</w:t>
-      </w:r>
-      <w:r>
-        <w:t>at the top of</w:t>
-      </w:r>
-      <w:r>
-        <w:t xml:space="preserve"> the hour</w:t>
-      </w:r>
-      <w:r>
-        <w:t>)</w:t>
-      </w:r>
-      <w:r>
-        <w:t>, whe</w:t>
-      </w:r>
-      <w:r>
-        <w:t>n a patie</w:t>
-      </w:r>
-      <w:r>
-        <w:t xml:space="preserve">nt </w:t>
-      </w:r>
-      <w:r>
-        <w:t xml:space="preserve">arrived </w:t>
-      </w:r>
-      <w:r>
-        <w:t xml:space="preserve">at the </w:t>
-      </w:r>
-      <w:r>
-        <w:t>ER</w:t>
-      </w:r>
-      <w:r>
-        <w:t>.</w:t>
+        <w:t xml:space="preserve">Shows length of time </w:t>
+      </w:r>
+      <w:r>
+        <w:t xml:space="preserve">for the appointment </w:t>
       </w:r>
     </w:p>
     <w:p>
@@ -1105,21 +1905,42 @@
       </w:pPr>
       <w:proofErr w:type="spellStart"/>
       <w:r>
-        <w:t>S</w:t>
-      </w:r>
-      <w:r>
-        <w:t>everit</w:t>
-      </w:r>
-      <w:r>
-        <w:t>y_</w:t>
-      </w:r>
-      <w:r>
-        <w:t>lev</w:t>
-      </w:r>
-      <w:r>
-        <w:t>el</w:t>
+        <w:t>P</w:t>
+      </w:r>
+      <w:r>
+        <w:t>atient</w:t>
+      </w:r>
+      <w:r>
+        <w:t>_</w:t>
+      </w:r>
+      <w:r>
+        <w:t>s</w:t>
+      </w:r>
+      <w:r>
+        <w:t>a</w:t>
+      </w:r>
+      <w:r>
+        <w:t>tient_</w:t>
+      </w:r>
+      <w:r>
+        <w:t>satis</w:t>
+      </w:r>
+      <w:r>
+        <w:t>factio</w:t>
+      </w:r>
+      <w:r>
+        <w:t>n_</w:t>
+      </w:r>
+      <w:r>
+        <w:t>scor</w:t>
+      </w:r>
+      <w:r>
+        <w:t>e</w:t>
       </w:r>
       <w:proofErr w:type="spellEnd"/>
+      <w:r>
+        <w:t xml:space="preserve"> </w:t>
+      </w:r>
     </w:p>
     <w:p>
       <w:pPr>
@@ -1133,34 +1954,60 @@
         <w:t xml:space="preserve">A </w:t>
       </w:r>
       <w:r>
-        <w:t>c</w:t>
-      </w:r>
-      <w:r>
-        <w:t>lassi</w:t>
-      </w:r>
-      <w:r>
-        <w:t xml:space="preserve">fication </w:t>
-      </w:r>
-      <w:r>
-        <w:t>of how</w:t>
-      </w:r>
-      <w:r>
-        <w:t xml:space="preserve"> severe a </w:t>
-      </w:r>
-      <w:r>
-        <w:t>patient</w:t>
-      </w:r>
-      <w:r>
-        <w:t>’s vis</w:t>
-      </w:r>
-      <w:r>
-        <w:t xml:space="preserve">it to </w:t>
-      </w:r>
-      <w:r>
-        <w:t>the ER</w:t>
-      </w:r>
-      <w:r>
-        <w:t xml:space="preserve"> was. </w:t>
+        <w:t xml:space="preserve">decimal scale from </w:t>
+      </w:r>
+      <w:r>
+        <w:t xml:space="preserve">1-5 </w:t>
+      </w:r>
+      <w:proofErr w:type="spellStart"/>
+      <w:r>
+        <w:t>ignifying</w:t>
+      </w:r>
+      <w:proofErr w:type="spellEnd"/>
+      <w:r>
+        <w:t xml:space="preserve"> patient satisfaction</w:t>
+      </w:r>
+    </w:p>
+    <w:p>
+      <w:pPr>
+        <w:pStyle w:val="ListParagraph"/>
+        <w:numPr>
+          <w:ilvl w:val="3"/>
+          <w:numId w:val="1"/>
+        </w:numPr>
+      </w:pPr>
+      <w:r>
+        <w:t xml:space="preserve">There </w:t>
+      </w:r>
+      <w:r>
+        <w:t>are</w:t>
+      </w:r>
+      <w:r>
+        <w:t xml:space="preserve"> about 1,000</w:t>
+      </w:r>
+      <w:r>
+        <w:t xml:space="preserve"> appointments with miss</w:t>
+      </w:r>
+      <w:r>
+        <w:t>ing</w:t>
+      </w:r>
+      <w:r>
+        <w:t xml:space="preserve"> satisfaction scores. </w:t>
+      </w:r>
+      <w:r>
+        <w:t xml:space="preserve">Null values will mean patients either canceled or no-show. </w:t>
+      </w:r>
+    </w:p>
+    <w:p>
+      <w:pPr>
+        <w:pStyle w:val="ListParagraph"/>
+        <w:numPr>
+          <w:ilvl w:val="0"/>
+          <w:numId w:val="1"/>
+        </w:numPr>
+      </w:pPr>
+      <w:r>
+        <w:t>Patients</w:t>
       </w:r>
     </w:p>
     <w:p>
@@ -1173,16 +2020,7 @@
       </w:pPr>
       <w:proofErr w:type="spellStart"/>
       <w:r>
-        <w:t>Wait_tim</w:t>
-      </w:r>
-      <w:r>
-        <w:t>e_m</w:t>
-      </w:r>
-      <w:r>
-        <w:t>inute</w:t>
-      </w:r>
-      <w:r>
-        <w:t>s</w:t>
+        <w:t>Patient_id</w:t>
       </w:r>
       <w:proofErr w:type="spellEnd"/>
     </w:p>
@@ -1195,37 +2033,7 @@
         </w:numPr>
       </w:pPr>
       <w:r>
-        <w:t>The a</w:t>
-      </w:r>
-      <w:r>
-        <w:t xml:space="preserve">mount of </w:t>
-      </w:r>
-      <w:r>
-        <w:t>time a p</w:t>
-      </w:r>
-      <w:r>
-        <w:t xml:space="preserve">atient </w:t>
-      </w:r>
-      <w:r>
-        <w:t xml:space="preserve">had to </w:t>
-      </w:r>
-      <w:r>
-        <w:t xml:space="preserve">wait </w:t>
-      </w:r>
-      <w:r>
-        <w:t xml:space="preserve">to be </w:t>
-      </w:r>
-      <w:r>
-        <w:t xml:space="preserve">seen </w:t>
-      </w:r>
-      <w:r>
-        <w:t xml:space="preserve">in </w:t>
-      </w:r>
-      <w:r>
-        <w:t xml:space="preserve">the </w:t>
-      </w:r>
-      <w:r>
-        <w:t xml:space="preserve">ER. </w:t>
+        <w:t xml:space="preserve">Unique identifier for each patient. </w:t>
       </w:r>
     </w:p>
     <w:p>
@@ -1238,25 +2046,7 @@
       </w:pPr>
       <w:proofErr w:type="spellStart"/>
       <w:r>
-        <w:t>L</w:t>
-      </w:r>
-      <w:r>
-        <w:t>e</w:t>
-      </w:r>
-      <w:r>
-        <w:t>ngth</w:t>
-      </w:r>
-      <w:r>
-        <w:t>_</w:t>
-      </w:r>
-      <w:r>
-        <w:t>of_s</w:t>
-      </w:r>
-      <w:r>
-        <w:t>tay_h</w:t>
-      </w:r>
-      <w:r>
-        <w:t>ours</w:t>
+        <w:t>Patient_name</w:t>
       </w:r>
       <w:proofErr w:type="spellEnd"/>
     </w:p>
@@ -1269,84 +2059,271 @@
         </w:numPr>
       </w:pPr>
       <w:r>
-        <w:t xml:space="preserve">The </w:t>
-      </w:r>
-      <w:r>
-        <w:t>number</w:t>
-      </w:r>
-      <w:r>
-        <w:t xml:space="preserve"> of</w:t>
+        <w:t xml:space="preserve">First and last name of patient </w:t>
+      </w:r>
+    </w:p>
+    <w:p>
+      <w:pPr>
+        <w:pStyle w:val="ListParagraph"/>
+        <w:numPr>
+          <w:ilvl w:val="3"/>
+          <w:numId w:val="1"/>
+        </w:numPr>
+      </w:pPr>
+      <w:r>
+        <w:t xml:space="preserve">First and last name are within the same record. I’m wondering if it’s best to do splitting so that first and last name have their own fields.  </w:t>
+      </w:r>
+    </w:p>
+    <w:p>
+      <w:pPr>
+        <w:pStyle w:val="ListParagraph"/>
+        <w:numPr>
+          <w:ilvl w:val="1"/>
+          <w:numId w:val="1"/>
+        </w:numPr>
+      </w:pPr>
+      <w:r>
+        <w:t>Age</w:t>
+      </w:r>
+    </w:p>
+    <w:p>
+      <w:pPr>
+        <w:pStyle w:val="ListParagraph"/>
+        <w:numPr>
+          <w:ilvl w:val="2"/>
+          <w:numId w:val="1"/>
+        </w:numPr>
+      </w:pPr>
+      <w:r>
+        <w:t>Age in years of patient</w:t>
+      </w:r>
+    </w:p>
+    <w:p>
+      <w:pPr>
+        <w:pStyle w:val="ListParagraph"/>
+        <w:numPr>
+          <w:ilvl w:val="1"/>
+          <w:numId w:val="1"/>
+        </w:numPr>
+      </w:pPr>
+      <w:r>
+        <w:t>Gender</w:t>
+      </w:r>
+    </w:p>
+    <w:p>
+      <w:pPr>
+        <w:pStyle w:val="ListParagraph"/>
+        <w:numPr>
+          <w:ilvl w:val="2"/>
+          <w:numId w:val="1"/>
+        </w:numPr>
+      </w:pPr>
+      <w:r>
+        <w:t xml:space="preserve">Biological sex of patient </w:t>
+      </w:r>
+    </w:p>
+    <w:p>
+      <w:pPr>
+        <w:pStyle w:val="ListParagraph"/>
+        <w:numPr>
+          <w:ilvl w:val="1"/>
+          <w:numId w:val="1"/>
+        </w:numPr>
+      </w:pPr>
+      <w:r>
+        <w:t xml:space="preserve">City </w:t>
+      </w:r>
+    </w:p>
+    <w:p>
+      <w:pPr>
+        <w:pStyle w:val="ListParagraph"/>
+        <w:numPr>
+          <w:ilvl w:val="2"/>
+          <w:numId w:val="1"/>
+        </w:numPr>
+      </w:pPr>
+      <w:r>
+        <w:t xml:space="preserve">The city where the patient is from </w:t>
+      </w:r>
+    </w:p>
+    <w:p>
+      <w:pPr>
+        <w:pStyle w:val="ListParagraph"/>
+        <w:numPr>
+          <w:ilvl w:val="0"/>
+          <w:numId w:val="1"/>
+        </w:numPr>
+      </w:pPr>
+      <w:r>
+        <w:t>Providers</w:t>
+      </w:r>
+    </w:p>
+    <w:p>
+      <w:pPr>
+        <w:pStyle w:val="ListParagraph"/>
+        <w:numPr>
+          <w:ilvl w:val="1"/>
+          <w:numId w:val="1"/>
+        </w:numPr>
+      </w:pPr>
+      <w:proofErr w:type="spellStart"/>
+      <w:r>
+        <w:t>Provider_id</w:t>
+      </w:r>
+      <w:proofErr w:type="spellEnd"/>
+    </w:p>
+    <w:p>
+      <w:pPr>
+        <w:pStyle w:val="ListParagraph"/>
+        <w:numPr>
+          <w:ilvl w:val="2"/>
+          <w:numId w:val="1"/>
+        </w:numPr>
+      </w:pPr>
+      <w:r>
+        <w:t xml:space="preserve">Unique identifier for each provider. </w:t>
+      </w:r>
+    </w:p>
+    <w:p>
+      <w:pPr>
+        <w:pStyle w:val="ListParagraph"/>
+        <w:numPr>
+          <w:ilvl w:val="1"/>
+          <w:numId w:val="1"/>
+        </w:numPr>
+      </w:pPr>
+      <w:r>
+        <w:t>Provider_name</w:t>
+      </w:r>
+    </w:p>
+    <w:p>
+      <w:pPr>
+        <w:pStyle w:val="ListParagraph"/>
+        <w:numPr>
+          <w:ilvl w:val="2"/>
+          <w:numId w:val="1"/>
+        </w:numPr>
+      </w:pPr>
+      <w:r>
+        <w:t>First and last name of provider</w:t>
+      </w:r>
+    </w:p>
+    <w:p>
+      <w:pPr>
+        <w:pStyle w:val="ListParagraph"/>
+        <w:numPr>
+          <w:ilvl w:val="3"/>
+          <w:numId w:val="1"/>
+        </w:numPr>
+      </w:pPr>
+      <w:r>
+        <w:t>Jessica Allen (</w:t>
+      </w:r>
+      <w:proofErr w:type="spellStart"/>
+      <w:r>
+        <w:t>provider_id</w:t>
+      </w:r>
+      <w:proofErr w:type="spellEnd"/>
+      <w:r>
+        <w:t xml:space="preserve">: 19) is the only provider with </w:t>
+      </w:r>
+      <w:r>
+        <w:t xml:space="preserve">‘Dr.’ within the </w:t>
+      </w:r>
+      <w:proofErr w:type="spellStart"/>
+      <w:r>
+        <w:t>provider_name</w:t>
+      </w:r>
+      <w:proofErr w:type="spellEnd"/>
+      <w:r>
+        <w:t xml:space="preserve"> field. Should all records have Dr., or </w:t>
+      </w:r>
+      <w:r>
+        <w:lastRenderedPageBreak/>
+        <w:t xml:space="preserve">since she’s the only one, can we just remove </w:t>
+      </w:r>
+      <w:r>
+        <w:t xml:space="preserve">Dr. from her record. Since they are all providers, it is already assumed that they are doctors. </w:t>
+      </w:r>
+    </w:p>
+    <w:p>
+      <w:pPr>
+        <w:pStyle w:val="ListParagraph"/>
+        <w:numPr>
+          <w:ilvl w:val="4"/>
+          <w:numId w:val="1"/>
+        </w:numPr>
+      </w:pPr>
+      <w:r>
+        <w:t xml:space="preserve">I removed “Dr.” prefix from </w:t>
+      </w:r>
+      <w:proofErr w:type="spellStart"/>
+      <w:r>
+        <w:t>provider_id</w:t>
+      </w:r>
+      <w:proofErr w:type="spellEnd"/>
+      <w:r>
+        <w:t xml:space="preserve">: 19 record to standardize provider-name formatting. </w:t>
+      </w:r>
+    </w:p>
+    <w:p>
+      <w:pPr>
+        <w:pStyle w:val="ListParagraph"/>
+        <w:numPr>
+          <w:ilvl w:val="3"/>
+          <w:numId w:val="1"/>
+        </w:numPr>
+      </w:pPr>
+      <w:r>
+        <w:t xml:space="preserve">First </w:t>
+      </w:r>
+      <w:r>
+        <w:t xml:space="preserve">and last name are within the same record. I’m wondering if it’s best to do </w:t>
+      </w:r>
+      <w:r>
+        <w:t xml:space="preserve">splitting so that first and last name have their own fields. </w:t>
       </w:r>
       <w:r>
         <w:t xml:space="preserve"> </w:t>
       </w:r>
-      <w:proofErr w:type="gramStart"/>
-      <w:r>
-        <w:t>hour</w:t>
-      </w:r>
-      <w:proofErr w:type="gramEnd"/>
-      <w:r>
-        <w:t>(s)</w:t>
-      </w:r>
-      <w:r>
-        <w:t xml:space="preserve"> a </w:t>
-      </w:r>
-      <w:r>
-        <w:t>patient</w:t>
-      </w:r>
-      <w:r>
-        <w:t xml:space="preserve"> </w:t>
-      </w:r>
-      <w:r>
-        <w:t xml:space="preserve">stayed </w:t>
-      </w:r>
-      <w:r>
-        <w:t>in the E</w:t>
-      </w:r>
-      <w:r>
-        <w:t>R</w:t>
-      </w:r>
-      <w:r>
-        <w:t xml:space="preserve">, from arrival until discharge from the ER or admission to the hospital. </w:t>
-      </w:r>
-    </w:p>
-    <w:p>
-      <w:pPr>
-        <w:pStyle w:val="ListParagraph"/>
-        <w:numPr>
-          <w:ilvl w:val="3"/>
-          <w:numId w:val="1"/>
-        </w:numPr>
-      </w:pPr>
-      <w:r>
-        <w:t>Hospital stay after admission is not included in this field (</w:t>
-      </w:r>
+    </w:p>
+    <w:p>
+      <w:pPr>
+        <w:pStyle w:val="ListParagraph"/>
+        <w:numPr>
+          <w:ilvl w:val="1"/>
+          <w:numId w:val="1"/>
+        </w:numPr>
+      </w:pPr>
+      <w:r>
+        <w:t>Department</w:t>
+      </w:r>
+    </w:p>
+    <w:p>
+      <w:pPr>
+        <w:pStyle w:val="ListParagraph"/>
+        <w:numPr>
+          <w:ilvl w:val="2"/>
+          <w:numId w:val="1"/>
+        </w:numPr>
+      </w:pPr>
+      <w:r>
+        <w:t xml:space="preserve">The department which the provider is from </w:t>
+      </w:r>
+    </w:p>
+    <w:p>
+      <w:pPr>
+        <w:pStyle w:val="ListParagraph"/>
+        <w:numPr>
+          <w:ilvl w:val="1"/>
+          <w:numId w:val="1"/>
+        </w:numPr>
+      </w:pPr>
       <w:proofErr w:type="spellStart"/>
       <w:r>
-        <w:t>losh</w:t>
+        <w:t>Years_experience</w:t>
       </w:r>
       <w:proofErr w:type="spellEnd"/>
-      <w:r>
-        <w:t>)</w:t>
-      </w:r>
-    </w:p>
-    <w:p>
-      <w:pPr>
-        <w:pStyle w:val="ListParagraph"/>
-        <w:numPr>
-          <w:ilvl w:val="1"/>
-          <w:numId w:val="1"/>
-        </w:numPr>
-      </w:pPr>
-      <w:r>
-        <w:t>A</w:t>
-      </w:r>
-      <w:r>
-        <w:t>dm</w:t>
-      </w:r>
-      <w:r>
-        <w:t>itted</w:t>
-      </w:r>
     </w:p>
     <w:p>
       <w:pPr>
@@ -1357,909 +2334,11 @@
         </w:numPr>
       </w:pPr>
       <w:r>
-        <w:t xml:space="preserve">Yes: </w:t>
-      </w:r>
-      <w:r>
-        <w:t xml:space="preserve">Shows </w:t>
-      </w:r>
-      <w:r>
-        <w:t>pati</w:t>
-      </w:r>
-      <w:r>
-        <w:t xml:space="preserve">ents </w:t>
-      </w:r>
-      <w:r>
-        <w:t xml:space="preserve">who </w:t>
-      </w:r>
-      <w:r>
-        <w:t>hav</w:t>
-      </w:r>
-      <w:r>
-        <w:t>e</w:t>
-      </w:r>
-      <w:r>
-        <w:t xml:space="preserve"> be</w:t>
-      </w:r>
-      <w:r>
-        <w:t>en assi</w:t>
-      </w:r>
-      <w:r>
-        <w:t>gned to st</w:t>
-      </w:r>
-      <w:r>
-        <w:t>ay at t</w:t>
-      </w:r>
-      <w:r>
-        <w:t xml:space="preserve">he </w:t>
-      </w:r>
-      <w:proofErr w:type="gramStart"/>
-      <w:r>
-        <w:t>ho</w:t>
-      </w:r>
-      <w:r>
-        <w:t>spital</w:t>
-      </w:r>
-      <w:r>
-        <w:t xml:space="preserve">, </w:t>
-      </w:r>
-      <w:r>
-        <w:t xml:space="preserve"> or</w:t>
-      </w:r>
-      <w:proofErr w:type="gramEnd"/>
-      <w:r>
-        <w:t xml:space="preserve"> </w:t>
-      </w:r>
-      <w:r>
-        <w:t xml:space="preserve">No: </w:t>
-      </w:r>
-      <w:r>
-        <w:t>dis</w:t>
-      </w:r>
-      <w:r>
-        <w:t>cha</w:t>
-      </w:r>
-      <w:r>
-        <w:t>rg</w:t>
-      </w:r>
-      <w:r>
-        <w:t xml:space="preserve">ed </w:t>
-      </w:r>
-      <w:r>
-        <w:t>afte</w:t>
-      </w:r>
-      <w:r>
-        <w:t xml:space="preserve">r being </w:t>
-      </w:r>
-      <w:r>
-        <w:t xml:space="preserve">seen in the </w:t>
-      </w:r>
-      <w:r>
-        <w:t xml:space="preserve">ER. </w:t>
-      </w:r>
-    </w:p>
-    <w:p>
-      <w:pPr>
-        <w:pStyle w:val="ListParagraph"/>
-        <w:numPr>
-          <w:ilvl w:val="0"/>
-          <w:numId w:val="1"/>
-        </w:numPr>
-      </w:pPr>
-      <w:r>
-        <w:t>A</w:t>
-      </w:r>
-      <w:r>
-        <w:t>p</w:t>
-      </w:r>
-      <w:r>
-        <w:t>pointment</w:t>
-      </w:r>
-      <w:r>
-        <w:t>s</w:t>
-      </w:r>
-    </w:p>
-    <w:p>
-      <w:pPr>
-        <w:pStyle w:val="ListParagraph"/>
-        <w:numPr>
-          <w:ilvl w:val="1"/>
-          <w:numId w:val="1"/>
-        </w:numPr>
-      </w:pPr>
-      <w:proofErr w:type="spellStart"/>
-      <w:r>
-        <w:t>A</w:t>
-      </w:r>
-      <w:r>
-        <w:t>pp</w:t>
-      </w:r>
-      <w:r>
-        <w:t>ointment</w:t>
-      </w:r>
-      <w:r>
-        <w:t>_id</w:t>
-      </w:r>
-      <w:proofErr w:type="spellEnd"/>
-    </w:p>
-    <w:p>
-      <w:pPr>
-        <w:pStyle w:val="ListParagraph"/>
-        <w:numPr>
-          <w:ilvl w:val="2"/>
-          <w:numId w:val="1"/>
-        </w:numPr>
-      </w:pPr>
-      <w:r>
-        <w:t>A number to identify</w:t>
-      </w:r>
-      <w:r>
-        <w:t xml:space="preserve"> each appointment at the </w:t>
-      </w:r>
-      <w:r>
-        <w:t>Valley Regional Medical Center</w:t>
-      </w:r>
-      <w:r>
-        <w:t xml:space="preserve">. </w:t>
-      </w:r>
-    </w:p>
-    <w:p>
-      <w:pPr>
-        <w:pStyle w:val="ListParagraph"/>
-        <w:numPr>
-          <w:ilvl w:val="1"/>
-          <w:numId w:val="1"/>
-        </w:numPr>
-      </w:pPr>
-      <w:proofErr w:type="spellStart"/>
-      <w:r>
-        <w:t>P</w:t>
-      </w:r>
-      <w:r>
-        <w:t>ati</w:t>
-      </w:r>
-      <w:r>
-        <w:t>ent_id</w:t>
-      </w:r>
-      <w:proofErr w:type="spellEnd"/>
-    </w:p>
-    <w:p>
-      <w:pPr>
-        <w:pStyle w:val="ListParagraph"/>
-        <w:numPr>
-          <w:ilvl w:val="2"/>
-          <w:numId w:val="1"/>
-        </w:numPr>
-      </w:pPr>
-      <w:r>
-        <w:t>An id, referencing a specific patient. The details of the p</w:t>
-      </w:r>
-      <w:r>
-        <w:t>atient</w:t>
-      </w:r>
-      <w:r>
-        <w:t xml:space="preserve"> will be found withing the patient dataset. </w:t>
-      </w:r>
-    </w:p>
-    <w:p>
-      <w:pPr>
-        <w:pStyle w:val="ListParagraph"/>
-        <w:numPr>
-          <w:ilvl w:val="1"/>
-          <w:numId w:val="1"/>
-        </w:numPr>
-      </w:pPr>
-      <w:proofErr w:type="spellStart"/>
-      <w:r>
-        <w:t>P</w:t>
-      </w:r>
-      <w:r>
-        <w:t>rovi</w:t>
-      </w:r>
-      <w:r>
-        <w:t>der_id</w:t>
-      </w:r>
-      <w:proofErr w:type="spellEnd"/>
-    </w:p>
-    <w:p>
-      <w:pPr>
-        <w:pStyle w:val="ListParagraph"/>
-        <w:numPr>
-          <w:ilvl w:val="2"/>
-          <w:numId w:val="1"/>
-        </w:numPr>
-      </w:pPr>
-      <w:r>
-        <w:t>An id</w:t>
-      </w:r>
-      <w:r>
-        <w:t>,</w:t>
-      </w:r>
-      <w:r>
-        <w:t xml:space="preserve"> referencing a specific provider. The details of the provider will be found withing the provider dataset. </w:t>
-      </w:r>
-    </w:p>
-    <w:p>
-      <w:pPr>
-        <w:pStyle w:val="ListParagraph"/>
-        <w:numPr>
-          <w:ilvl w:val="1"/>
-          <w:numId w:val="1"/>
-        </w:numPr>
-      </w:pPr>
-      <w:r>
-        <w:t>D</w:t>
-      </w:r>
-      <w:r>
-        <w:t>e</w:t>
-      </w:r>
-      <w:r>
-        <w:t>part</w:t>
-      </w:r>
-      <w:r>
-        <w:t>ment</w:t>
-      </w:r>
-    </w:p>
-    <w:p>
-      <w:pPr>
-        <w:pStyle w:val="ListParagraph"/>
-        <w:numPr>
-          <w:ilvl w:val="2"/>
-          <w:numId w:val="1"/>
-        </w:numPr>
-      </w:pPr>
-      <w:r>
-        <w:t xml:space="preserve">Shows which department the appointment is associated with. </w:t>
-      </w:r>
-    </w:p>
-    <w:p>
-      <w:pPr>
-        <w:pStyle w:val="ListParagraph"/>
-        <w:numPr>
-          <w:ilvl w:val="1"/>
-          <w:numId w:val="1"/>
-        </w:numPr>
-      </w:pPr>
-      <w:proofErr w:type="spellStart"/>
-      <w:r>
-        <w:t>A</w:t>
-      </w:r>
-      <w:r>
-        <w:t>ppo</w:t>
-      </w:r>
-      <w:r>
-        <w:t>intment</w:t>
-      </w:r>
-      <w:r>
-        <w:t>_date</w:t>
-      </w:r>
-      <w:proofErr w:type="spellEnd"/>
-    </w:p>
-    <w:p>
-      <w:pPr>
-        <w:pStyle w:val="ListParagraph"/>
-        <w:numPr>
-          <w:ilvl w:val="2"/>
-          <w:numId w:val="1"/>
-        </w:numPr>
-      </w:pPr>
-      <w:r>
-        <w:t xml:space="preserve">Shows the date of the appointment. </w:t>
-      </w:r>
-    </w:p>
-    <w:p>
-      <w:pPr>
-        <w:pStyle w:val="ListParagraph"/>
-        <w:numPr>
-          <w:ilvl w:val="1"/>
-          <w:numId w:val="1"/>
-        </w:numPr>
-      </w:pPr>
-      <w:proofErr w:type="spellStart"/>
-      <w:r>
-        <w:t>A</w:t>
-      </w:r>
-      <w:r>
-        <w:t>pp</w:t>
-      </w:r>
-      <w:r>
-        <w:t>ointment</w:t>
-      </w:r>
-      <w:r>
-        <w:t>_day</w:t>
-      </w:r>
-      <w:proofErr w:type="spellEnd"/>
-    </w:p>
-    <w:p>
-      <w:pPr>
-        <w:pStyle w:val="ListParagraph"/>
-        <w:numPr>
-          <w:ilvl w:val="2"/>
-          <w:numId w:val="1"/>
-        </w:numPr>
-      </w:pPr>
-      <w:r>
-        <w:t xml:space="preserve">Shows the day of the week the appointment was on. </w:t>
-      </w:r>
-    </w:p>
-    <w:p>
-      <w:pPr>
-        <w:pStyle w:val="ListParagraph"/>
-        <w:numPr>
-          <w:ilvl w:val="1"/>
-          <w:numId w:val="1"/>
-        </w:numPr>
-      </w:pPr>
-      <w:proofErr w:type="spellStart"/>
-      <w:r>
-        <w:t>A</w:t>
-      </w:r>
-      <w:r>
-        <w:t>ppoint</w:t>
-      </w:r>
-      <w:r>
-        <w:t>ment_ty</w:t>
-      </w:r>
-      <w:r>
-        <w:t>pe</w:t>
-      </w:r>
-      <w:proofErr w:type="spellEnd"/>
-    </w:p>
-    <w:p>
-      <w:pPr>
-        <w:pStyle w:val="ListParagraph"/>
-        <w:numPr>
-          <w:ilvl w:val="2"/>
-          <w:numId w:val="1"/>
-        </w:numPr>
-      </w:pPr>
-      <w:r>
-        <w:t xml:space="preserve">Defines the type of appointment </w:t>
-      </w:r>
-    </w:p>
-    <w:p>
-      <w:pPr>
-        <w:pStyle w:val="ListParagraph"/>
-        <w:numPr>
-          <w:ilvl w:val="1"/>
-          <w:numId w:val="1"/>
-        </w:numPr>
-      </w:pPr>
-      <w:proofErr w:type="spellStart"/>
-      <w:r>
-        <w:t>A</w:t>
-      </w:r>
-      <w:r>
-        <w:t>pp</w:t>
-      </w:r>
-      <w:r>
-        <w:t>ointment</w:t>
-      </w:r>
-      <w:r>
-        <w:t>_</w:t>
-      </w:r>
-      <w:r>
-        <w:t>sta</w:t>
-      </w:r>
-      <w:r>
-        <w:t>tus</w:t>
-      </w:r>
-      <w:proofErr w:type="spellEnd"/>
-    </w:p>
-    <w:p>
-      <w:pPr>
-        <w:pStyle w:val="ListParagraph"/>
-        <w:numPr>
-          <w:ilvl w:val="2"/>
-          <w:numId w:val="1"/>
-        </w:numPr>
-      </w:pPr>
-      <w:r>
-        <w:t xml:space="preserve">Defines an appointment as either </w:t>
-      </w:r>
-      <w:r>
-        <w:t>Completed, Cancelled, or no-show</w:t>
-      </w:r>
-    </w:p>
-    <w:p>
-      <w:pPr>
-        <w:pStyle w:val="ListParagraph"/>
-        <w:numPr>
-          <w:ilvl w:val="1"/>
-          <w:numId w:val="1"/>
-        </w:numPr>
-      </w:pPr>
-      <w:proofErr w:type="spellStart"/>
-      <w:r>
-        <w:t>A</w:t>
-      </w:r>
-      <w:r>
-        <w:t>pp</w:t>
-      </w:r>
-      <w:r>
-        <w:t>ointment</w:t>
-      </w:r>
-      <w:r>
-        <w:t>_dura</w:t>
-      </w:r>
-      <w:r>
-        <w:t>tion</w:t>
-      </w:r>
-      <w:r>
-        <w:t>_</w:t>
-      </w:r>
-      <w:r>
-        <w:t>min</w:t>
-      </w:r>
-      <w:r>
-        <w:t>utes</w:t>
-      </w:r>
-      <w:proofErr w:type="spellEnd"/>
-    </w:p>
-    <w:p>
-      <w:pPr>
-        <w:pStyle w:val="ListParagraph"/>
-        <w:numPr>
-          <w:ilvl w:val="2"/>
-          <w:numId w:val="1"/>
-        </w:numPr>
-      </w:pPr>
-      <w:r>
-        <w:t xml:space="preserve">Shows length of time </w:t>
-      </w:r>
-      <w:r>
-        <w:t xml:space="preserve">for the appointment </w:t>
-      </w:r>
-    </w:p>
-    <w:p>
-      <w:pPr>
-        <w:pStyle w:val="ListParagraph"/>
-        <w:numPr>
-          <w:ilvl w:val="1"/>
-          <w:numId w:val="1"/>
-        </w:numPr>
-      </w:pPr>
-      <w:proofErr w:type="spellStart"/>
-      <w:r>
-        <w:lastRenderedPageBreak/>
-        <w:t>P</w:t>
-      </w:r>
-      <w:r>
-        <w:t>atient</w:t>
-      </w:r>
-      <w:r>
-        <w:t>_</w:t>
-      </w:r>
-      <w:r>
-        <w:t>s</w:t>
-      </w:r>
-      <w:r>
-        <w:t>a</w:t>
-      </w:r>
-      <w:r>
-        <w:t>tient_</w:t>
-      </w:r>
-      <w:r>
-        <w:t>satis</w:t>
-      </w:r>
-      <w:r>
-        <w:t>factio</w:t>
-      </w:r>
-      <w:r>
-        <w:t>n_</w:t>
-      </w:r>
-      <w:r>
-        <w:t>scor</w:t>
-      </w:r>
-      <w:r>
-        <w:t>e</w:t>
-      </w:r>
-      <w:proofErr w:type="spellEnd"/>
-      <w:r>
-        <w:t xml:space="preserve"> </w:t>
-      </w:r>
-    </w:p>
-    <w:p>
-      <w:pPr>
-        <w:pStyle w:val="ListParagraph"/>
-        <w:numPr>
-          <w:ilvl w:val="2"/>
-          <w:numId w:val="1"/>
-        </w:numPr>
-      </w:pPr>
-      <w:r>
-        <w:t xml:space="preserve">A </w:t>
-      </w:r>
-      <w:r>
-        <w:t xml:space="preserve">decimal scale from </w:t>
-      </w:r>
-      <w:r>
-        <w:t xml:space="preserve">1-5 </w:t>
-      </w:r>
-      <w:proofErr w:type="spellStart"/>
-      <w:r>
-        <w:t>ignifying</w:t>
-      </w:r>
-      <w:proofErr w:type="spellEnd"/>
-      <w:r>
-        <w:t xml:space="preserve"> patient satisfaction</w:t>
-      </w:r>
-    </w:p>
-    <w:p>
-      <w:pPr>
-        <w:pStyle w:val="ListParagraph"/>
-        <w:numPr>
-          <w:ilvl w:val="3"/>
-          <w:numId w:val="1"/>
-        </w:numPr>
-      </w:pPr>
-      <w:r>
-        <w:t xml:space="preserve">There </w:t>
-      </w:r>
-      <w:r>
-        <w:t>are</w:t>
-      </w:r>
-      <w:r>
-        <w:t xml:space="preserve"> about 1,000</w:t>
-      </w:r>
-      <w:r>
-        <w:t xml:space="preserve"> appointments with miss</w:t>
-      </w:r>
-      <w:r>
-        <w:t>ing</w:t>
-      </w:r>
-      <w:r>
-        <w:t xml:space="preserve"> satisfaction scores. </w:t>
-      </w:r>
-      <w:r>
-        <w:t xml:space="preserve">Null values will mean patients </w:t>
-      </w:r>
-      <w:proofErr w:type="gramStart"/>
-      <w:r>
-        <w:t>either</w:t>
-      </w:r>
-      <w:proofErr w:type="gramEnd"/>
-      <w:r>
-        <w:t xml:space="preserve"> canceled or no-show. </w:t>
-      </w:r>
-    </w:p>
-    <w:p>
-      <w:pPr>
-        <w:pStyle w:val="ListParagraph"/>
-        <w:numPr>
-          <w:ilvl w:val="0"/>
-          <w:numId w:val="1"/>
-        </w:numPr>
-      </w:pPr>
-      <w:r>
-        <w:t>Patients</w:t>
-      </w:r>
-    </w:p>
-    <w:p>
-      <w:pPr>
-        <w:pStyle w:val="ListParagraph"/>
-        <w:numPr>
-          <w:ilvl w:val="1"/>
-          <w:numId w:val="1"/>
-        </w:numPr>
-      </w:pPr>
-      <w:proofErr w:type="spellStart"/>
-      <w:r>
-        <w:t>Patient_id</w:t>
-      </w:r>
-      <w:proofErr w:type="spellEnd"/>
-    </w:p>
-    <w:p>
-      <w:pPr>
-        <w:pStyle w:val="ListParagraph"/>
-        <w:numPr>
-          <w:ilvl w:val="2"/>
-          <w:numId w:val="1"/>
-        </w:numPr>
-      </w:pPr>
-      <w:r>
-        <w:t xml:space="preserve">Unique identifier for each patient. </w:t>
-      </w:r>
-    </w:p>
-    <w:p>
-      <w:pPr>
-        <w:pStyle w:val="ListParagraph"/>
-        <w:numPr>
-          <w:ilvl w:val="1"/>
-          <w:numId w:val="1"/>
-        </w:numPr>
-      </w:pPr>
-      <w:proofErr w:type="spellStart"/>
-      <w:r>
-        <w:t>Patient_name</w:t>
-      </w:r>
-      <w:proofErr w:type="spellEnd"/>
-    </w:p>
-    <w:p>
-      <w:pPr>
-        <w:pStyle w:val="ListParagraph"/>
-        <w:numPr>
-          <w:ilvl w:val="2"/>
-          <w:numId w:val="1"/>
-        </w:numPr>
-      </w:pPr>
-      <w:r>
-        <w:t xml:space="preserve">First and last name of patient </w:t>
-      </w:r>
-    </w:p>
-    <w:p>
-      <w:pPr>
-        <w:pStyle w:val="ListParagraph"/>
-        <w:numPr>
-          <w:ilvl w:val="3"/>
-          <w:numId w:val="1"/>
-        </w:numPr>
-      </w:pPr>
-      <w:r>
-        <w:t xml:space="preserve">First and last name are within the same record. I’m wondering if it’s best to do splitting so that first and last name have their own fields.  </w:t>
-      </w:r>
-    </w:p>
-    <w:p>
-      <w:pPr>
-        <w:pStyle w:val="ListParagraph"/>
-        <w:numPr>
-          <w:ilvl w:val="1"/>
-          <w:numId w:val="1"/>
-        </w:numPr>
-      </w:pPr>
-      <w:r>
-        <w:t>Age</w:t>
-      </w:r>
-    </w:p>
-    <w:p>
-      <w:pPr>
-        <w:pStyle w:val="ListParagraph"/>
-        <w:numPr>
-          <w:ilvl w:val="2"/>
-          <w:numId w:val="1"/>
-        </w:numPr>
-      </w:pPr>
-      <w:r>
-        <w:t>Age in years of patient</w:t>
-      </w:r>
-    </w:p>
-    <w:p>
-      <w:pPr>
-        <w:pStyle w:val="ListParagraph"/>
-        <w:numPr>
-          <w:ilvl w:val="1"/>
-          <w:numId w:val="1"/>
-        </w:numPr>
-      </w:pPr>
-      <w:r>
-        <w:t>Gender</w:t>
-      </w:r>
-    </w:p>
-    <w:p>
-      <w:pPr>
-        <w:pStyle w:val="ListParagraph"/>
-        <w:numPr>
-          <w:ilvl w:val="2"/>
-          <w:numId w:val="1"/>
-        </w:numPr>
-      </w:pPr>
-      <w:r>
-        <w:t xml:space="preserve">Biological sex of patient </w:t>
-      </w:r>
-    </w:p>
-    <w:p>
-      <w:pPr>
-        <w:pStyle w:val="ListParagraph"/>
-        <w:numPr>
-          <w:ilvl w:val="1"/>
-          <w:numId w:val="1"/>
-        </w:numPr>
-      </w:pPr>
-      <w:r>
-        <w:t xml:space="preserve">City </w:t>
-      </w:r>
-    </w:p>
-    <w:p>
-      <w:pPr>
-        <w:pStyle w:val="ListParagraph"/>
-        <w:numPr>
-          <w:ilvl w:val="2"/>
-          <w:numId w:val="1"/>
-        </w:numPr>
-      </w:pPr>
-      <w:r>
-        <w:t xml:space="preserve">The city where the patient is from </w:t>
-      </w:r>
-    </w:p>
-    <w:p>
-      <w:pPr>
-        <w:pStyle w:val="ListParagraph"/>
-        <w:numPr>
-          <w:ilvl w:val="0"/>
-          <w:numId w:val="1"/>
-        </w:numPr>
-      </w:pPr>
-      <w:r>
-        <w:t>Providers</w:t>
-      </w:r>
-    </w:p>
-    <w:p>
-      <w:pPr>
-        <w:pStyle w:val="ListParagraph"/>
-        <w:numPr>
-          <w:ilvl w:val="1"/>
-          <w:numId w:val="1"/>
-        </w:numPr>
-      </w:pPr>
-      <w:proofErr w:type="spellStart"/>
-      <w:r>
-        <w:t>Provider_id</w:t>
-      </w:r>
-      <w:proofErr w:type="spellEnd"/>
-    </w:p>
-    <w:p>
-      <w:pPr>
-        <w:pStyle w:val="ListParagraph"/>
-        <w:numPr>
-          <w:ilvl w:val="2"/>
-          <w:numId w:val="1"/>
-        </w:numPr>
-      </w:pPr>
-      <w:r>
-        <w:t xml:space="preserve">Unique identifier for each provider. </w:t>
-      </w:r>
-    </w:p>
-    <w:p>
-      <w:pPr>
-        <w:pStyle w:val="ListParagraph"/>
-        <w:numPr>
-          <w:ilvl w:val="1"/>
-          <w:numId w:val="1"/>
-        </w:numPr>
-      </w:pPr>
-      <w:r>
-        <w:t>Provider_name</w:t>
-      </w:r>
-    </w:p>
-    <w:p>
-      <w:pPr>
-        <w:pStyle w:val="ListParagraph"/>
-        <w:numPr>
-          <w:ilvl w:val="2"/>
-          <w:numId w:val="1"/>
-        </w:numPr>
-      </w:pPr>
-      <w:r>
-        <w:t>First and last name of provider</w:t>
-      </w:r>
-    </w:p>
-    <w:p>
-      <w:pPr>
-        <w:pStyle w:val="ListParagraph"/>
-        <w:numPr>
-          <w:ilvl w:val="3"/>
-          <w:numId w:val="1"/>
-        </w:numPr>
-      </w:pPr>
-      <w:r>
-        <w:t>Jessica Allen (</w:t>
-      </w:r>
-      <w:proofErr w:type="spellStart"/>
-      <w:r>
-        <w:t>provider_id</w:t>
-      </w:r>
-      <w:proofErr w:type="spellEnd"/>
-      <w:r>
-        <w:t xml:space="preserve">: 19) is the only provider with </w:t>
-      </w:r>
-      <w:r>
-        <w:t xml:space="preserve">‘Dr.’ within the </w:t>
-      </w:r>
-      <w:proofErr w:type="spellStart"/>
-      <w:r>
-        <w:t>provider_name</w:t>
-      </w:r>
-      <w:proofErr w:type="spellEnd"/>
-      <w:r>
-        <w:t xml:space="preserve"> field. Should all records have Dr., or since she’s the only one, can we just remove </w:t>
-      </w:r>
-      <w:r>
-        <w:t xml:space="preserve">Dr. from her record. Since they are all providers, it is already assumed that they are doctors. </w:t>
-      </w:r>
-    </w:p>
-    <w:p>
-      <w:pPr>
-        <w:pStyle w:val="ListParagraph"/>
-        <w:numPr>
-          <w:ilvl w:val="4"/>
-          <w:numId w:val="1"/>
-        </w:numPr>
-      </w:pPr>
-      <w:r>
-        <w:t xml:space="preserve">I removed “Dr.” prefix from </w:t>
-      </w:r>
-      <w:proofErr w:type="spellStart"/>
-      <w:r>
-        <w:t>provider_id</w:t>
-      </w:r>
-      <w:proofErr w:type="spellEnd"/>
-      <w:r>
-        <w:t xml:space="preserve">: 19 record to standardize provider-name formatting. </w:t>
-      </w:r>
-    </w:p>
-    <w:p>
-      <w:pPr>
-        <w:pStyle w:val="ListParagraph"/>
-        <w:numPr>
-          <w:ilvl w:val="3"/>
-          <w:numId w:val="1"/>
-        </w:numPr>
-      </w:pPr>
-      <w:r>
-        <w:t xml:space="preserve">First </w:t>
-      </w:r>
-      <w:r>
-        <w:t xml:space="preserve">and last name are within the same record. I’m wondering if it’s best to do </w:t>
-      </w:r>
-      <w:r>
-        <w:t xml:space="preserve">splitting so that first and last name have their own fields. </w:t>
-      </w:r>
-      <w:r>
-        <w:t xml:space="preserve"> </w:t>
-      </w:r>
-    </w:p>
-    <w:p>
-      <w:pPr>
-        <w:pStyle w:val="ListParagraph"/>
-        <w:numPr>
-          <w:ilvl w:val="1"/>
-          <w:numId w:val="1"/>
-        </w:numPr>
-      </w:pPr>
-      <w:r>
-        <w:t>Department</w:t>
-      </w:r>
-    </w:p>
-    <w:p>
-      <w:pPr>
-        <w:pStyle w:val="ListParagraph"/>
-        <w:numPr>
-          <w:ilvl w:val="2"/>
-          <w:numId w:val="1"/>
-        </w:numPr>
-      </w:pPr>
-      <w:r>
-        <w:t xml:space="preserve">The department which the provider is from </w:t>
-      </w:r>
-    </w:p>
-    <w:p>
-      <w:pPr>
-        <w:pStyle w:val="ListParagraph"/>
-        <w:numPr>
-          <w:ilvl w:val="1"/>
-          <w:numId w:val="1"/>
-        </w:numPr>
-      </w:pPr>
-      <w:proofErr w:type="spellStart"/>
-      <w:r>
-        <w:t>Years_experience</w:t>
-      </w:r>
-      <w:proofErr w:type="spellEnd"/>
-    </w:p>
-    <w:p>
-      <w:pPr>
-        <w:pStyle w:val="ListParagraph"/>
-        <w:numPr>
-          <w:ilvl w:val="2"/>
-          <w:numId w:val="1"/>
-        </w:numPr>
-      </w:pPr>
-      <w:r>
         <w:t>Number of years as a provider</w:t>
       </w:r>
     </w:p>
     <w:p>
       <w:r>
-        <w:lastRenderedPageBreak/>
         <w:t>6. Look for missing values, duplicate records, inconsistent formatting, or anything unusual.</w:t>
       </w:r>
     </w:p>
@@ -2376,15 +2455,7 @@
     </w:p>
     <w:p>
       <w:r>
-        <w:t xml:space="preserve">What questions </w:t>
-      </w:r>
-      <w:proofErr w:type="gramStart"/>
-      <w:r>
-        <w:t>I need</w:t>
-      </w:r>
-      <w:proofErr w:type="gramEnd"/>
-      <w:r>
-        <w:t xml:space="preserve"> to answer:</w:t>
+        <w:t>What questions I need to answer:</w:t>
       </w:r>
     </w:p>
     <w:p>
@@ -2408,15 +2479,7 @@
         </w:numPr>
       </w:pPr>
       <w:r>
-        <w:t xml:space="preserve">Are the complaints coming from all pts in general, or </w:t>
-      </w:r>
-      <w:proofErr w:type="gramStart"/>
-      <w:r>
-        <w:t>is</w:t>
-      </w:r>
-      <w:proofErr w:type="gramEnd"/>
-      <w:r>
-        <w:t xml:space="preserve"> the</w:t>
+        <w:t>Are the complaints coming from all pts in general, or is the</w:t>
       </w:r>
       <w:r>
         <w:t>re</w:t>
@@ -2454,6 +2517,7 @@
         <w:ind w:left="0"/>
       </w:pPr>
       <w:r>
+        <w:lastRenderedPageBreak/>
         <w:t>Tables I’ll need:</w:t>
       </w:r>
     </w:p>
@@ -2747,6 +2811,119 @@
     </w:lvl>
   </w:abstractNum>
   <w:abstractNum w:abstractNumId="1" w15:restartNumberingAfterBreak="0">
+    <w:nsid w:val="06E949C4"/>
+    <w:multiLevelType w:val="hybridMultilevel"/>
+    <w:tmpl w:val="680ADCE0"/>
+    <w:lvl w:ilvl="0" w:tplc="04090001">
+      <w:start w:val="1"/>
+      <w:numFmt w:val="bullet"/>
+      <w:lvlText w:val=""/>
+      <w:lvlJc w:val="left"/>
+      <w:pPr>
+        <w:ind w:left="720" w:hanging="360"/>
+      </w:pPr>
+      <w:rPr>
+        <w:rFonts w:ascii="Symbol" w:hAnsi="Symbol" w:hint="default"/>
+      </w:rPr>
+    </w:lvl>
+    <w:lvl w:ilvl="1" w:tplc="04090003" w:tentative="1">
+      <w:start w:val="1"/>
+      <w:numFmt w:val="bullet"/>
+      <w:lvlText w:val="o"/>
+      <w:lvlJc w:val="left"/>
+      <w:pPr>
+        <w:ind w:left="1440" w:hanging="360"/>
+      </w:pPr>
+      <w:rPr>
+        <w:rFonts w:ascii="Courier New" w:hAnsi="Courier New" w:cs="Courier New" w:hint="default"/>
+      </w:rPr>
+    </w:lvl>
+    <w:lvl w:ilvl="2" w:tplc="04090005" w:tentative="1">
+      <w:start w:val="1"/>
+      <w:numFmt w:val="bullet"/>
+      <w:lvlText w:val=""/>
+      <w:lvlJc w:val="left"/>
+      <w:pPr>
+        <w:ind w:left="2160" w:hanging="360"/>
+      </w:pPr>
+      <w:rPr>
+        <w:rFonts w:ascii="Wingdings" w:hAnsi="Wingdings" w:hint="default"/>
+      </w:rPr>
+    </w:lvl>
+    <w:lvl w:ilvl="3" w:tplc="04090001" w:tentative="1">
+      <w:start w:val="1"/>
+      <w:numFmt w:val="bullet"/>
+      <w:lvlText w:val=""/>
+      <w:lvlJc w:val="left"/>
+      <w:pPr>
+        <w:ind w:left="2880" w:hanging="360"/>
+      </w:pPr>
+      <w:rPr>
+        <w:rFonts w:ascii="Symbol" w:hAnsi="Symbol" w:hint="default"/>
+      </w:rPr>
+    </w:lvl>
+    <w:lvl w:ilvl="4" w:tplc="04090003" w:tentative="1">
+      <w:start w:val="1"/>
+      <w:numFmt w:val="bullet"/>
+      <w:lvlText w:val="o"/>
+      <w:lvlJc w:val="left"/>
+      <w:pPr>
+        <w:ind w:left="3600" w:hanging="360"/>
+      </w:pPr>
+      <w:rPr>
+        <w:rFonts w:ascii="Courier New" w:hAnsi="Courier New" w:cs="Courier New" w:hint="default"/>
+      </w:rPr>
+    </w:lvl>
+    <w:lvl w:ilvl="5" w:tplc="04090005" w:tentative="1">
+      <w:start w:val="1"/>
+      <w:numFmt w:val="bullet"/>
+      <w:lvlText w:val=""/>
+      <w:lvlJc w:val="left"/>
+      <w:pPr>
+        <w:ind w:left="4320" w:hanging="360"/>
+      </w:pPr>
+      <w:rPr>
+        <w:rFonts w:ascii="Wingdings" w:hAnsi="Wingdings" w:hint="default"/>
+      </w:rPr>
+    </w:lvl>
+    <w:lvl w:ilvl="6" w:tplc="04090001" w:tentative="1">
+      <w:start w:val="1"/>
+      <w:numFmt w:val="bullet"/>
+      <w:lvlText w:val=""/>
+      <w:lvlJc w:val="left"/>
+      <w:pPr>
+        <w:ind w:left="5040" w:hanging="360"/>
+      </w:pPr>
+      <w:rPr>
+        <w:rFonts w:ascii="Symbol" w:hAnsi="Symbol" w:hint="default"/>
+      </w:rPr>
+    </w:lvl>
+    <w:lvl w:ilvl="7" w:tplc="04090003" w:tentative="1">
+      <w:start w:val="1"/>
+      <w:numFmt w:val="bullet"/>
+      <w:lvlText w:val="o"/>
+      <w:lvlJc w:val="left"/>
+      <w:pPr>
+        <w:ind w:left="5760" w:hanging="360"/>
+      </w:pPr>
+      <w:rPr>
+        <w:rFonts w:ascii="Courier New" w:hAnsi="Courier New" w:cs="Courier New" w:hint="default"/>
+      </w:rPr>
+    </w:lvl>
+    <w:lvl w:ilvl="8" w:tplc="04090005" w:tentative="1">
+      <w:start w:val="1"/>
+      <w:numFmt w:val="bullet"/>
+      <w:lvlText w:val=""/>
+      <w:lvlJc w:val="left"/>
+      <w:pPr>
+        <w:ind w:left="6480" w:hanging="360"/>
+      </w:pPr>
+      <w:rPr>
+        <w:rFonts w:ascii="Wingdings" w:hAnsi="Wingdings" w:hint="default"/>
+      </w:rPr>
+    </w:lvl>
+  </w:abstractNum>
+  <w:abstractNum w:abstractNumId="2" w15:restartNumberingAfterBreak="0">
     <w:nsid w:val="36EB21AD"/>
     <w:multiLevelType w:val="hybridMultilevel"/>
     <w:tmpl w:val="491E72A6"/>
@@ -2859,7 +3036,7 @@
       </w:rPr>
     </w:lvl>
   </w:abstractNum>
-  <w:abstractNum w:abstractNumId="2" w15:restartNumberingAfterBreak="0">
+  <w:abstractNum w:abstractNumId="3" w15:restartNumberingAfterBreak="0">
     <w:nsid w:val="4BB812BB"/>
     <w:multiLevelType w:val="hybridMultilevel"/>
     <w:tmpl w:val="B9BC14CC"/>
@@ -2972,7 +3149,7 @@
       </w:rPr>
     </w:lvl>
   </w:abstractNum>
-  <w:abstractNum w:abstractNumId="3" w15:restartNumberingAfterBreak="0">
+  <w:abstractNum w:abstractNumId="4" w15:restartNumberingAfterBreak="0">
     <w:nsid w:val="4FFE04F8"/>
     <w:multiLevelType w:val="hybridMultilevel"/>
     <w:tmpl w:val="90463A1C"/>
@@ -3085,7 +3262,7 @@
       </w:rPr>
     </w:lvl>
   </w:abstractNum>
-  <w:abstractNum w:abstractNumId="4" w15:restartNumberingAfterBreak="0">
+  <w:abstractNum w:abstractNumId="5" w15:restartNumberingAfterBreak="0">
     <w:nsid w:val="7EFD172B"/>
     <w:multiLevelType w:val="hybridMultilevel"/>
     <w:tmpl w:val="1FB48E52"/>
@@ -3202,16 +3379,19 @@
     <w:abstractNumId w:val="0"/>
   </w:num>
   <w:num w:numId="2" w16cid:durableId="1335840007">
+    <w:abstractNumId w:val="3"/>
+  </w:num>
+  <w:num w:numId="3" w16cid:durableId="2126342479">
     <w:abstractNumId w:val="2"/>
   </w:num>
-  <w:num w:numId="3" w16cid:durableId="2126342479">
-    <w:abstractNumId w:val="1"/>
+  <w:num w:numId="4" w16cid:durableId="2127002448">
+    <w:abstractNumId w:val="5"/>
   </w:num>
-  <w:num w:numId="4" w16cid:durableId="2127002448">
+  <w:num w:numId="5" w16cid:durableId="823132378">
     <w:abstractNumId w:val="4"/>
   </w:num>
-  <w:num w:numId="5" w16cid:durableId="823132378">
-    <w:abstractNumId w:val="3"/>
+  <w:num w:numId="6" w16cid:durableId="440222574">
+    <w:abstractNumId w:val="1"/>
   </w:num>
 </w:numbering>
 </file>

</xml_diff>

<commit_message>
Updated SQL code and project documentation
</commit_message>
<xml_diff>
--- a/documentation/nicosys-healthcare-portfolio-documentation.docx
+++ b/documentation/nicosys-healthcare-portfolio-documentation.docx
@@ -29,7 +29,47 @@
         </w:numPr>
       </w:pPr>
       <w:r>
-        <w:t>What is the average and median ER wait time?</w:t>
+        <w:t xml:space="preserve">What </w:t>
+      </w:r>
+      <w:proofErr w:type="gramStart"/>
+      <w:r>
+        <w:t>is</w:t>
+      </w:r>
+      <w:proofErr w:type="gramEnd"/>
+      <w:r>
+        <w:t xml:space="preserve"> the average and median ER wait time?</w:t>
+      </w:r>
+    </w:p>
+    <w:p>
+      <w:pPr>
+        <w:pStyle w:val="ListParagraph"/>
+        <w:numPr>
+          <w:ilvl w:val="1"/>
+          <w:numId w:val="6"/>
+        </w:numPr>
+      </w:pPr>
+      <w:r>
+        <w:t>Average wait time is 74 minutes (74.31)</w:t>
+      </w:r>
+    </w:p>
+    <w:p>
+      <w:pPr>
+        <w:pStyle w:val="ListParagraph"/>
+        <w:numPr>
+          <w:ilvl w:val="1"/>
+          <w:numId w:val="6"/>
+        </w:numPr>
+      </w:pPr>
+      <w:r>
+        <w:t xml:space="preserve">Median </w:t>
+      </w:r>
+      <w:proofErr w:type="gramStart"/>
+      <w:r>
+        <w:t>wait</w:t>
+      </w:r>
+      <w:proofErr w:type="gramEnd"/>
+      <w:r>
+        <w:t xml:space="preserve"> time is 67 minutes </w:t>
       </w:r>
     </w:p>
     <w:p>
@@ -42,6 +82,26 @@
       </w:pPr>
       <w:r>
         <w:t>Which days have the longest wait times?</w:t>
+      </w:r>
+    </w:p>
+    <w:p>
+      <w:pPr>
+        <w:pStyle w:val="ListParagraph"/>
+        <w:numPr>
+          <w:ilvl w:val="1"/>
+          <w:numId w:val="6"/>
+        </w:numPr>
+      </w:pPr>
+      <w:r>
+        <w:t xml:space="preserve">Monday, Tuesday, Thursday, and Saturday, </w:t>
+      </w:r>
+      <w:proofErr w:type="gramStart"/>
+      <w:r>
+        <w:t>experience wait times</w:t>
+      </w:r>
+      <w:proofErr w:type="gramEnd"/>
+      <w:r>
+        <w:t xml:space="preserve"> of 180 minutes (3 hours). </w:t>
       </w:r>
     </w:p>
     <w:p>
@@ -233,7 +293,15 @@
     </w:p>
     <w:p>
       <w:r>
-        <w:t>2. Identify the primary and Foreign key(s).</w:t>
+        <w:t xml:space="preserve">2. Identify the primary and </w:t>
+      </w:r>
+      <w:proofErr w:type="gramStart"/>
+      <w:r>
+        <w:t>Foreign</w:t>
+      </w:r>
+      <w:proofErr w:type="gramEnd"/>
+      <w:r>
+        <w:t xml:space="preserve"> key(s).</w:t>
       </w:r>
     </w:p>
     <w:p>
@@ -495,6 +563,7 @@
       </w:pPr>
       <w:proofErr w:type="spellStart"/>
       <w:r>
+        <w:lastRenderedPageBreak/>
         <w:t>Er</w:t>
       </w:r>
       <w:r>
@@ -528,6 +597,7 @@
       <w:r>
         <w:t xml:space="preserve"> </w:t>
       </w:r>
+      <w:proofErr w:type="gramStart"/>
       <w:r>
         <w:t>patie</w:t>
       </w:r>
@@ -535,7 +605,11 @@
         <w:t>nt</w:t>
       </w:r>
       <w:r>
-        <w:t>s data</w:t>
+        <w:t>s</w:t>
+      </w:r>
+      <w:proofErr w:type="gramEnd"/>
+      <w:r>
+        <w:t xml:space="preserve"> data</w:t>
       </w:r>
       <w:r>
         <w:t>se</w:t>
@@ -694,82 +768,1335 @@
         </w:numPr>
       </w:pPr>
       <w:r>
+        <w:t>The p</w:t>
+      </w:r>
+      <w:r>
+        <w:t>atien</w:t>
+      </w:r>
+      <w:r>
+        <w:t xml:space="preserve">ts and </w:t>
+      </w:r>
+      <w:r>
+        <w:t>pro</w:t>
+      </w:r>
+      <w:r>
+        <w:t>viders d</w:t>
+      </w:r>
+      <w:r>
+        <w:t>atasets</w:t>
+      </w:r>
+      <w:r>
+        <w:t xml:space="preserve"> are t</w:t>
+      </w:r>
+      <w:r>
+        <w:t xml:space="preserve">he only </w:t>
+      </w:r>
+      <w:r>
+        <w:t>dat</w:t>
+      </w:r>
+      <w:r>
+        <w:t>aset</w:t>
+      </w:r>
+      <w:r>
+        <w:t>s</w:t>
+      </w:r>
+      <w:r>
+        <w:t xml:space="preserve"> </w:t>
+      </w:r>
+      <w:r>
+        <w:t xml:space="preserve">in </w:t>
+      </w:r>
+      <w:r>
+        <w:t>isol</w:t>
+      </w:r>
+      <w:r>
+        <w:t>ation me</w:t>
+      </w:r>
+      <w:r>
+        <w:t>aning t</w:t>
+      </w:r>
+      <w:r>
+        <w:t>here are no</w:t>
+      </w:r>
+      <w:r>
+        <w:t xml:space="preserve"> fo</w:t>
+      </w:r>
+      <w:r>
+        <w:t>r</w:t>
+      </w:r>
+      <w:r>
+        <w:t xml:space="preserve">eign </w:t>
+      </w:r>
+      <w:r>
+        <w:t>keys wit</w:t>
+      </w:r>
+      <w:r>
+        <w:t>hin them</w:t>
+      </w:r>
+      <w:r>
+        <w:t xml:space="preserve">. </w:t>
+      </w:r>
+    </w:p>
+    <w:p>
+      <w:r>
+        <w:t>5. Note each column's likely meaning</w:t>
+      </w:r>
+      <w:r>
+        <w:t>:</w:t>
+      </w:r>
+    </w:p>
+    <w:p>
+      <w:pPr>
+        <w:pStyle w:val="ListParagraph"/>
+        <w:numPr>
+          <w:ilvl w:val="0"/>
+          <w:numId w:val="1"/>
+        </w:numPr>
+      </w:pPr>
+      <w:proofErr w:type="spellStart"/>
+      <w:r>
+        <w:t>E</w:t>
+      </w:r>
+      <w:r>
+        <w:t>r</w:t>
+      </w:r>
+      <w:r>
+        <w:t>_</w:t>
+      </w:r>
+      <w:r>
+        <w:t>vis</w:t>
+      </w:r>
+      <w:r>
+        <w:t>its</w:t>
+      </w:r>
+      <w:proofErr w:type="spellEnd"/>
+      <w:r>
+        <w:t>:</w:t>
+      </w:r>
+    </w:p>
+    <w:p>
+      <w:pPr>
+        <w:pStyle w:val="ListParagraph"/>
+        <w:numPr>
+          <w:ilvl w:val="1"/>
+          <w:numId w:val="1"/>
+        </w:numPr>
+      </w:pPr>
+      <w:proofErr w:type="spellStart"/>
+      <w:r>
+        <w:t>V</w:t>
+      </w:r>
+      <w:r>
+        <w:t>i</w:t>
+      </w:r>
+      <w:r>
+        <w:t>sit_id</w:t>
+      </w:r>
+      <w:proofErr w:type="spellEnd"/>
+    </w:p>
+    <w:p>
+      <w:pPr>
+        <w:pStyle w:val="ListParagraph"/>
+        <w:numPr>
+          <w:ilvl w:val="2"/>
+          <w:numId w:val="1"/>
+        </w:numPr>
+      </w:pPr>
+      <w:r>
+        <w:t>T</w:t>
+      </w:r>
+      <w:r>
+        <w:t xml:space="preserve">he </w:t>
+      </w:r>
+      <w:r>
+        <w:t>pr</w:t>
+      </w:r>
+      <w:r>
+        <w:t>imary ke</w:t>
+      </w:r>
+      <w:r>
+        <w:t xml:space="preserve">y </w:t>
+      </w:r>
+      <w:proofErr w:type="gramStart"/>
+      <w:r>
+        <w:t>to</w:t>
+      </w:r>
+      <w:proofErr w:type="gramEnd"/>
+      <w:r>
+        <w:t xml:space="preserve"> i</w:t>
+      </w:r>
+      <w:r>
+        <w:t>d</w:t>
+      </w:r>
+      <w:r>
+        <w:t>e</w:t>
+      </w:r>
+      <w:r>
+        <w:t>ntif</w:t>
+      </w:r>
+      <w:r>
+        <w:t>y an</w:t>
+      </w:r>
+      <w:r>
+        <w:t>d organize</w:t>
+      </w:r>
+      <w:r>
+        <w:t xml:space="preserve"> vis</w:t>
+      </w:r>
+      <w:r>
+        <w:t>its ma</w:t>
+      </w:r>
+      <w:r>
+        <w:t xml:space="preserve">de to the </w:t>
+      </w:r>
+      <w:r>
+        <w:t xml:space="preserve">ER. </w:t>
+      </w:r>
+    </w:p>
+    <w:p>
+      <w:pPr>
+        <w:pStyle w:val="ListParagraph"/>
+        <w:numPr>
+          <w:ilvl w:val="1"/>
+          <w:numId w:val="1"/>
+        </w:numPr>
+      </w:pPr>
+      <w:proofErr w:type="spellStart"/>
+      <w:r>
+        <w:t>P</w:t>
+      </w:r>
+      <w:r>
+        <w:t>a</w:t>
+      </w:r>
+      <w:r>
+        <w:t>tient</w:t>
+      </w:r>
+      <w:r>
+        <w:t>_id</w:t>
+      </w:r>
+      <w:proofErr w:type="spellEnd"/>
+    </w:p>
+    <w:p>
+      <w:pPr>
+        <w:pStyle w:val="ListParagraph"/>
+        <w:numPr>
+          <w:ilvl w:val="2"/>
+          <w:numId w:val="1"/>
+        </w:numPr>
+      </w:pPr>
+      <w:r>
+        <w:t>A fore</w:t>
+      </w:r>
+      <w:r>
+        <w:t xml:space="preserve">ign </w:t>
+      </w:r>
+      <w:r>
+        <w:t xml:space="preserve">key </w:t>
+      </w:r>
+      <w:r>
+        <w:t>t</w:t>
+      </w:r>
+      <w:r>
+        <w:t xml:space="preserve">hat </w:t>
+      </w:r>
+      <w:r>
+        <w:t>referenc</w:t>
+      </w:r>
+      <w:r>
+        <w:t>e</w:t>
+      </w:r>
+      <w:r>
+        <w:t>s</w:t>
+      </w:r>
+      <w:r>
+        <w:t xml:space="preserve"> </w:t>
+      </w:r>
+      <w:r>
+        <w:t xml:space="preserve">a </w:t>
+      </w:r>
+      <w:r>
+        <w:t>sp</w:t>
+      </w:r>
+      <w:r>
+        <w:t xml:space="preserve">ecific </w:t>
+      </w:r>
+      <w:r>
+        <w:t>pa</w:t>
+      </w:r>
+      <w:r>
+        <w:t>tien</w:t>
+      </w:r>
+      <w:r>
+        <w:t>t visi</w:t>
+      </w:r>
+      <w:r>
+        <w:t xml:space="preserve">ting </w:t>
+      </w:r>
+      <w:r>
+        <w:t xml:space="preserve">the </w:t>
+      </w:r>
+      <w:r>
+        <w:t>ER</w:t>
+      </w:r>
+      <w:r>
+        <w:t>.</w:t>
+      </w:r>
+      <w:r>
+        <w:t xml:space="preserve"> De</w:t>
+      </w:r>
+      <w:r>
+        <w:t>tails of</w:t>
+      </w:r>
+      <w:r>
+        <w:t xml:space="preserve"> eac</w:t>
+      </w:r>
+      <w:r>
+        <w:t>h pat</w:t>
+      </w:r>
+      <w:r>
+        <w:t>ie</w:t>
+      </w:r>
+      <w:r>
+        <w:t xml:space="preserve">nt can </w:t>
+      </w:r>
+      <w:r>
+        <w:t xml:space="preserve">be found in </w:t>
+      </w:r>
+      <w:r>
+        <w:t xml:space="preserve">the </w:t>
+      </w:r>
+      <w:proofErr w:type="gramStart"/>
+      <w:r>
+        <w:t>pati</w:t>
+      </w:r>
+      <w:r>
+        <w:t>ents</w:t>
+      </w:r>
+      <w:proofErr w:type="gramEnd"/>
+      <w:r>
+        <w:t xml:space="preserve"> da</w:t>
+      </w:r>
+      <w:r>
+        <w:t>taset</w:t>
+      </w:r>
+      <w:r>
+        <w:t>.</w:t>
+      </w:r>
+    </w:p>
+    <w:p>
+      <w:pPr>
+        <w:pStyle w:val="ListParagraph"/>
+        <w:numPr>
+          <w:ilvl w:val="1"/>
+          <w:numId w:val="1"/>
+        </w:numPr>
+      </w:pPr>
+      <w:proofErr w:type="spellStart"/>
+      <w:r>
+        <w:t>A</w:t>
+      </w:r>
+      <w:r>
+        <w:t>rr</w:t>
+      </w:r>
+      <w:r>
+        <w:t>ival_</w:t>
+      </w:r>
+      <w:r>
+        <w:t>date</w:t>
+      </w:r>
+      <w:proofErr w:type="spellEnd"/>
+    </w:p>
+    <w:p>
+      <w:pPr>
+        <w:pStyle w:val="ListParagraph"/>
+        <w:numPr>
+          <w:ilvl w:val="2"/>
+          <w:numId w:val="1"/>
+        </w:numPr>
+      </w:pPr>
+      <w:r>
+        <w:t>The d</w:t>
+      </w:r>
+      <w:r>
+        <w:t xml:space="preserve">ate </w:t>
+      </w:r>
+      <w:r>
+        <w:t xml:space="preserve">when a </w:t>
+      </w:r>
+      <w:r>
+        <w:t xml:space="preserve">patient </w:t>
+      </w:r>
+      <w:r>
+        <w:t>arr</w:t>
+      </w:r>
+      <w:r>
+        <w:t>ived a</w:t>
+      </w:r>
+      <w:r>
+        <w:t xml:space="preserve">t the </w:t>
+      </w:r>
+      <w:r>
+        <w:t>ER.</w:t>
+      </w:r>
+    </w:p>
+    <w:p>
+      <w:pPr>
+        <w:pStyle w:val="ListParagraph"/>
+        <w:numPr>
+          <w:ilvl w:val="1"/>
+          <w:numId w:val="1"/>
+        </w:numPr>
+      </w:pPr>
+      <w:proofErr w:type="spellStart"/>
+      <w:r>
+        <w:t>Arrival</w:t>
+      </w:r>
+      <w:r>
+        <w:t>_</w:t>
+      </w:r>
+      <w:r>
+        <w:t>day</w:t>
+      </w:r>
+      <w:proofErr w:type="spellEnd"/>
+    </w:p>
+    <w:p>
+      <w:pPr>
+        <w:pStyle w:val="ListParagraph"/>
+        <w:numPr>
+          <w:ilvl w:val="2"/>
+          <w:numId w:val="1"/>
+        </w:numPr>
+      </w:pPr>
+      <w:r>
+        <w:t>The da</w:t>
+      </w:r>
+      <w:r>
+        <w:t xml:space="preserve">y of the </w:t>
+      </w:r>
+      <w:r>
+        <w:t>week</w:t>
+      </w:r>
+      <w:r>
+        <w:t xml:space="preserve">, when </w:t>
+      </w:r>
+      <w:r>
+        <w:t>a pati</w:t>
+      </w:r>
+      <w:r>
+        <w:t>ent arriv</w:t>
+      </w:r>
+      <w:r>
+        <w:t xml:space="preserve">ed </w:t>
+      </w:r>
+      <w:r>
+        <w:t>at the E</w:t>
+      </w:r>
+      <w:r>
+        <w:t>R</w:t>
+      </w:r>
+    </w:p>
+    <w:p>
+      <w:pPr>
+        <w:pStyle w:val="ListParagraph"/>
+        <w:numPr>
+          <w:ilvl w:val="1"/>
+          <w:numId w:val="1"/>
+        </w:numPr>
+      </w:pPr>
+      <w:proofErr w:type="spellStart"/>
+      <w:r>
+        <w:t>Ar</w:t>
+      </w:r>
+      <w:r>
+        <w:t>rival_</w:t>
+      </w:r>
+      <w:r>
+        <w:t>hou</w:t>
+      </w:r>
+      <w:r>
+        <w:t>r</w:t>
+      </w:r>
+      <w:proofErr w:type="spellEnd"/>
+    </w:p>
+    <w:p>
+      <w:pPr>
+        <w:pStyle w:val="ListParagraph"/>
+        <w:numPr>
+          <w:ilvl w:val="2"/>
+          <w:numId w:val="1"/>
+        </w:numPr>
+      </w:pPr>
+      <w:r>
+        <w:t xml:space="preserve">The </w:t>
+      </w:r>
+      <w:r>
+        <w:t xml:space="preserve">time </w:t>
+      </w:r>
+      <w:r>
+        <w:t>of</w:t>
+      </w:r>
+      <w:r>
+        <w:t xml:space="preserve"> day</w:t>
+      </w:r>
+      <w:r>
+        <w:t xml:space="preserve"> (</w:t>
+      </w:r>
+      <w:r>
+        <w:t>at the top of</w:t>
+      </w:r>
+      <w:r>
+        <w:t xml:space="preserve"> the hour</w:t>
+      </w:r>
+      <w:r>
+        <w:t>)</w:t>
+      </w:r>
+      <w:r>
+        <w:t>, whe</w:t>
+      </w:r>
+      <w:r>
+        <w:t>n a patie</w:t>
+      </w:r>
+      <w:r>
+        <w:t xml:space="preserve">nt </w:t>
+      </w:r>
+      <w:r>
+        <w:t xml:space="preserve">arrived </w:t>
+      </w:r>
+      <w:r>
+        <w:t xml:space="preserve">at the </w:t>
+      </w:r>
+      <w:r>
+        <w:t>ER</w:t>
+      </w:r>
+      <w:r>
+        <w:t>.</w:t>
+      </w:r>
+    </w:p>
+    <w:p>
+      <w:pPr>
+        <w:pStyle w:val="ListParagraph"/>
+        <w:numPr>
+          <w:ilvl w:val="1"/>
+          <w:numId w:val="1"/>
+        </w:numPr>
+      </w:pPr>
+      <w:proofErr w:type="spellStart"/>
+      <w:r>
+        <w:t>S</w:t>
+      </w:r>
+      <w:r>
+        <w:t>everit</w:t>
+      </w:r>
+      <w:r>
+        <w:t>y_</w:t>
+      </w:r>
+      <w:r>
+        <w:t>lev</w:t>
+      </w:r>
+      <w:r>
+        <w:t>el</w:t>
+      </w:r>
+      <w:proofErr w:type="spellEnd"/>
+    </w:p>
+    <w:p>
+      <w:pPr>
+        <w:pStyle w:val="ListParagraph"/>
+        <w:numPr>
+          <w:ilvl w:val="2"/>
+          <w:numId w:val="1"/>
+        </w:numPr>
+      </w:pPr>
+      <w:r>
+        <w:t xml:space="preserve">A </w:t>
+      </w:r>
+      <w:r>
+        <w:t>c</w:t>
+      </w:r>
+      <w:r>
+        <w:t>lassi</w:t>
+      </w:r>
+      <w:r>
+        <w:t xml:space="preserve">fication </w:t>
+      </w:r>
+      <w:r>
+        <w:t>of how</w:t>
+      </w:r>
+      <w:r>
+        <w:t xml:space="preserve"> severe a </w:t>
+      </w:r>
+      <w:r>
+        <w:t>patient</w:t>
+      </w:r>
+      <w:r>
+        <w:t>’s vis</w:t>
+      </w:r>
+      <w:r>
+        <w:t xml:space="preserve">it to </w:t>
+      </w:r>
+      <w:r>
+        <w:t>the ER</w:t>
+      </w:r>
+      <w:r>
+        <w:t xml:space="preserve"> was. </w:t>
+      </w:r>
+    </w:p>
+    <w:p>
+      <w:pPr>
+        <w:pStyle w:val="ListParagraph"/>
+        <w:numPr>
+          <w:ilvl w:val="1"/>
+          <w:numId w:val="1"/>
+        </w:numPr>
+      </w:pPr>
+      <w:proofErr w:type="spellStart"/>
+      <w:r>
+        <w:t>Wait_tim</w:t>
+      </w:r>
+      <w:r>
+        <w:t>e_m</w:t>
+      </w:r>
+      <w:r>
+        <w:t>inute</w:t>
+      </w:r>
+      <w:r>
+        <w:t>s</w:t>
+      </w:r>
+      <w:proofErr w:type="spellEnd"/>
+    </w:p>
+    <w:p>
+      <w:pPr>
+        <w:pStyle w:val="ListParagraph"/>
+        <w:numPr>
+          <w:ilvl w:val="2"/>
+          <w:numId w:val="1"/>
+        </w:numPr>
+      </w:pPr>
+      <w:r>
+        <w:t>The a</w:t>
+      </w:r>
+      <w:r>
+        <w:t xml:space="preserve">mount of </w:t>
+      </w:r>
+      <w:r>
+        <w:t>time a p</w:t>
+      </w:r>
+      <w:r>
+        <w:t xml:space="preserve">atient </w:t>
+      </w:r>
+      <w:r>
+        <w:t xml:space="preserve">had to </w:t>
+      </w:r>
+      <w:r>
+        <w:t xml:space="preserve">wait </w:t>
+      </w:r>
+      <w:r>
+        <w:t xml:space="preserve">to be </w:t>
+      </w:r>
+      <w:r>
+        <w:t xml:space="preserve">seen </w:t>
+      </w:r>
+      <w:r>
+        <w:t xml:space="preserve">in </w:t>
+      </w:r>
+      <w:r>
+        <w:t xml:space="preserve">the </w:t>
+      </w:r>
+      <w:r>
+        <w:t xml:space="preserve">ER. </w:t>
+      </w:r>
+    </w:p>
+    <w:p>
+      <w:pPr>
+        <w:pStyle w:val="ListParagraph"/>
+        <w:numPr>
+          <w:ilvl w:val="1"/>
+          <w:numId w:val="1"/>
+        </w:numPr>
+      </w:pPr>
+      <w:proofErr w:type="spellStart"/>
+      <w:r>
+        <w:t>L</w:t>
+      </w:r>
+      <w:r>
+        <w:t>e</w:t>
+      </w:r>
+      <w:r>
+        <w:t>ngth</w:t>
+      </w:r>
+      <w:r>
+        <w:t>_</w:t>
+      </w:r>
+      <w:r>
+        <w:t>of_s</w:t>
+      </w:r>
+      <w:r>
+        <w:t>tay_h</w:t>
+      </w:r>
+      <w:r>
+        <w:t>ours</w:t>
+      </w:r>
+      <w:proofErr w:type="spellEnd"/>
+    </w:p>
+    <w:p>
+      <w:pPr>
+        <w:pStyle w:val="ListParagraph"/>
+        <w:numPr>
+          <w:ilvl w:val="2"/>
+          <w:numId w:val="1"/>
+        </w:numPr>
+      </w:pPr>
+      <w:r>
+        <w:t xml:space="preserve">The </w:t>
+      </w:r>
+      <w:r>
+        <w:t>number</w:t>
+      </w:r>
+      <w:r>
+        <w:t xml:space="preserve"> of</w:t>
+      </w:r>
+      <w:r>
+        <w:t xml:space="preserve"> </w:t>
+      </w:r>
+      <w:proofErr w:type="gramStart"/>
+      <w:r>
+        <w:t>hour</w:t>
+      </w:r>
+      <w:proofErr w:type="gramEnd"/>
+      <w:r>
+        <w:t>(s)</w:t>
+      </w:r>
+      <w:r>
+        <w:t xml:space="preserve"> a </w:t>
+      </w:r>
+      <w:r>
+        <w:t>patient</w:t>
+      </w:r>
+      <w:r>
+        <w:t xml:space="preserve"> </w:t>
+      </w:r>
+      <w:r>
+        <w:t xml:space="preserve">stayed </w:t>
+      </w:r>
+      <w:r>
+        <w:t>in the E</w:t>
+      </w:r>
+      <w:r>
+        <w:t>R</w:t>
+      </w:r>
+      <w:r>
+        <w:t xml:space="preserve">, from arrival until discharge from the ER or admission to the hospital. </w:t>
+      </w:r>
+    </w:p>
+    <w:p>
+      <w:pPr>
+        <w:pStyle w:val="ListParagraph"/>
+        <w:numPr>
+          <w:ilvl w:val="3"/>
+          <w:numId w:val="1"/>
+        </w:numPr>
+      </w:pPr>
+      <w:r>
+        <w:t>Hospital stay after admission is not included in this field (</w:t>
+      </w:r>
+      <w:proofErr w:type="spellStart"/>
+      <w:r>
+        <w:t>losh</w:t>
+      </w:r>
+      <w:proofErr w:type="spellEnd"/>
+      <w:r>
+        <w:t>)</w:t>
+      </w:r>
+    </w:p>
+    <w:p>
+      <w:pPr>
+        <w:pStyle w:val="ListParagraph"/>
+        <w:numPr>
+          <w:ilvl w:val="1"/>
+          <w:numId w:val="1"/>
+        </w:numPr>
+      </w:pPr>
+      <w:r>
+        <w:t>A</w:t>
+      </w:r>
+      <w:r>
+        <w:t>dm</w:t>
+      </w:r>
+      <w:r>
+        <w:t>itted</w:t>
+      </w:r>
+    </w:p>
+    <w:p>
+      <w:pPr>
+        <w:pStyle w:val="ListParagraph"/>
+        <w:numPr>
+          <w:ilvl w:val="2"/>
+          <w:numId w:val="1"/>
+        </w:numPr>
+      </w:pPr>
+      <w:r>
+        <w:t xml:space="preserve">Yes: </w:t>
+      </w:r>
+      <w:r>
+        <w:t xml:space="preserve">Shows </w:t>
+      </w:r>
+      <w:r>
+        <w:t>pati</w:t>
+      </w:r>
+      <w:r>
+        <w:t xml:space="preserve">ents </w:t>
+      </w:r>
+      <w:r>
+        <w:t xml:space="preserve">who </w:t>
+      </w:r>
+      <w:r>
+        <w:t>hav</w:t>
+      </w:r>
+      <w:r>
+        <w:t>e</w:t>
+      </w:r>
+      <w:r>
+        <w:t xml:space="preserve"> be</w:t>
+      </w:r>
+      <w:r>
+        <w:t>en assi</w:t>
+      </w:r>
+      <w:r>
+        <w:t>gned to st</w:t>
+      </w:r>
+      <w:r>
+        <w:t>ay at t</w:t>
+      </w:r>
+      <w:r>
+        <w:t xml:space="preserve">he </w:t>
+      </w:r>
+      <w:proofErr w:type="gramStart"/>
+      <w:r>
+        <w:t>ho</w:t>
+      </w:r>
+      <w:r>
+        <w:t>spital</w:t>
+      </w:r>
+      <w:r>
+        <w:t xml:space="preserve">, </w:t>
+      </w:r>
+      <w:r>
+        <w:t xml:space="preserve"> or</w:t>
+      </w:r>
+      <w:proofErr w:type="gramEnd"/>
+      <w:r>
+        <w:t xml:space="preserve"> </w:t>
+      </w:r>
+      <w:r>
+        <w:t xml:space="preserve">No: </w:t>
+      </w:r>
+      <w:r>
+        <w:t>dis</w:t>
+      </w:r>
+      <w:r>
+        <w:t>cha</w:t>
+      </w:r>
+      <w:r>
+        <w:t>rg</w:t>
+      </w:r>
+      <w:r>
+        <w:t xml:space="preserve">ed </w:t>
+      </w:r>
+      <w:r>
+        <w:t>afte</w:t>
+      </w:r>
+      <w:r>
+        <w:t xml:space="preserve">r being </w:t>
+      </w:r>
+      <w:r>
+        <w:t xml:space="preserve">seen in the </w:t>
+      </w:r>
+      <w:r>
+        <w:t xml:space="preserve">ER. </w:t>
+      </w:r>
+    </w:p>
+    <w:p>
+      <w:pPr>
+        <w:pStyle w:val="ListParagraph"/>
+        <w:numPr>
+          <w:ilvl w:val="0"/>
+          <w:numId w:val="1"/>
+        </w:numPr>
+      </w:pPr>
+      <w:r>
+        <w:t>A</w:t>
+      </w:r>
+      <w:r>
+        <w:t>p</w:t>
+      </w:r>
+      <w:r>
+        <w:t>pointment</w:t>
+      </w:r>
+      <w:r>
+        <w:t>s</w:t>
+      </w:r>
+    </w:p>
+    <w:p>
+      <w:pPr>
+        <w:pStyle w:val="ListParagraph"/>
+        <w:numPr>
+          <w:ilvl w:val="1"/>
+          <w:numId w:val="1"/>
+        </w:numPr>
+      </w:pPr>
+      <w:proofErr w:type="spellStart"/>
+      <w:r>
+        <w:t>A</w:t>
+      </w:r>
+      <w:r>
+        <w:t>pp</w:t>
+      </w:r>
+      <w:r>
+        <w:t>ointment</w:t>
+      </w:r>
+      <w:r>
+        <w:t>_id</w:t>
+      </w:r>
+      <w:proofErr w:type="spellEnd"/>
+    </w:p>
+    <w:p>
+      <w:pPr>
+        <w:pStyle w:val="ListParagraph"/>
+        <w:numPr>
+          <w:ilvl w:val="2"/>
+          <w:numId w:val="1"/>
+        </w:numPr>
+      </w:pPr>
+      <w:r>
+        <w:t>A number to identify</w:t>
+      </w:r>
+      <w:r>
+        <w:t xml:space="preserve"> each appointment at the </w:t>
+      </w:r>
+      <w:r>
+        <w:t>Valley Regional Medical Center</w:t>
+      </w:r>
+      <w:r>
+        <w:t xml:space="preserve">. </w:t>
+      </w:r>
+    </w:p>
+    <w:p>
+      <w:pPr>
+        <w:pStyle w:val="ListParagraph"/>
+        <w:numPr>
+          <w:ilvl w:val="1"/>
+          <w:numId w:val="1"/>
+        </w:numPr>
+      </w:pPr>
+      <w:proofErr w:type="spellStart"/>
+      <w:r>
+        <w:t>P</w:t>
+      </w:r>
+      <w:r>
+        <w:t>ati</w:t>
+      </w:r>
+      <w:r>
+        <w:t>ent_id</w:t>
+      </w:r>
+      <w:proofErr w:type="spellEnd"/>
+    </w:p>
+    <w:p>
+      <w:pPr>
+        <w:pStyle w:val="ListParagraph"/>
+        <w:numPr>
+          <w:ilvl w:val="2"/>
+          <w:numId w:val="1"/>
+        </w:numPr>
+      </w:pPr>
+      <w:r>
         <w:lastRenderedPageBreak/>
-        <w:t>The p</w:t>
-      </w:r>
-      <w:r>
-        <w:t>atien</w:t>
-      </w:r>
-      <w:r>
-        <w:t xml:space="preserve">ts and </w:t>
-      </w:r>
-      <w:r>
-        <w:t>pro</w:t>
-      </w:r>
-      <w:r>
-        <w:t>viders d</w:t>
-      </w:r>
-      <w:r>
-        <w:t>atasets</w:t>
-      </w:r>
-      <w:r>
-        <w:t xml:space="preserve"> are t</w:t>
-      </w:r>
-      <w:r>
-        <w:t xml:space="preserve">he only </w:t>
-      </w:r>
-      <w:r>
-        <w:t>dat</w:t>
-      </w:r>
-      <w:r>
-        <w:t>aset</w:t>
+        <w:t>An id, referencing a specific patient. The details of the p</w:t>
+      </w:r>
+      <w:r>
+        <w:t>atient</w:t>
+      </w:r>
+      <w:r>
+        <w:t xml:space="preserve"> will be found withing the patient dataset. </w:t>
+      </w:r>
+    </w:p>
+    <w:p>
+      <w:pPr>
+        <w:pStyle w:val="ListParagraph"/>
+        <w:numPr>
+          <w:ilvl w:val="1"/>
+          <w:numId w:val="1"/>
+        </w:numPr>
+      </w:pPr>
+      <w:proofErr w:type="spellStart"/>
+      <w:r>
+        <w:t>P</w:t>
+      </w:r>
+      <w:r>
+        <w:t>rovi</w:t>
+      </w:r>
+      <w:r>
+        <w:t>der_id</w:t>
+      </w:r>
+      <w:proofErr w:type="spellEnd"/>
+    </w:p>
+    <w:p>
+      <w:pPr>
+        <w:pStyle w:val="ListParagraph"/>
+        <w:numPr>
+          <w:ilvl w:val="2"/>
+          <w:numId w:val="1"/>
+        </w:numPr>
+      </w:pPr>
+      <w:r>
+        <w:t>An id</w:t>
+      </w:r>
+      <w:r>
+        <w:t>,</w:t>
+      </w:r>
+      <w:r>
+        <w:t xml:space="preserve"> referencing a specific provider. The details of the provider will be found withing the provider dataset. </w:t>
+      </w:r>
+    </w:p>
+    <w:p>
+      <w:pPr>
+        <w:pStyle w:val="ListParagraph"/>
+        <w:numPr>
+          <w:ilvl w:val="1"/>
+          <w:numId w:val="1"/>
+        </w:numPr>
+      </w:pPr>
+      <w:r>
+        <w:t>D</w:t>
+      </w:r>
+      <w:r>
+        <w:t>e</w:t>
+      </w:r>
+      <w:r>
+        <w:t>part</w:t>
+      </w:r>
+      <w:r>
+        <w:t>ment</w:t>
+      </w:r>
+    </w:p>
+    <w:p>
+      <w:pPr>
+        <w:pStyle w:val="ListParagraph"/>
+        <w:numPr>
+          <w:ilvl w:val="2"/>
+          <w:numId w:val="1"/>
+        </w:numPr>
+      </w:pPr>
+      <w:r>
+        <w:t xml:space="preserve">Shows which department the appointment is associated with. </w:t>
+      </w:r>
+    </w:p>
+    <w:p>
+      <w:pPr>
+        <w:pStyle w:val="ListParagraph"/>
+        <w:numPr>
+          <w:ilvl w:val="1"/>
+          <w:numId w:val="1"/>
+        </w:numPr>
+      </w:pPr>
+      <w:proofErr w:type="spellStart"/>
+      <w:r>
+        <w:t>A</w:t>
+      </w:r>
+      <w:r>
+        <w:t>ppo</w:t>
+      </w:r>
+      <w:r>
+        <w:t>intment</w:t>
+      </w:r>
+      <w:r>
+        <w:t>_date</w:t>
+      </w:r>
+      <w:proofErr w:type="spellEnd"/>
+    </w:p>
+    <w:p>
+      <w:pPr>
+        <w:pStyle w:val="ListParagraph"/>
+        <w:numPr>
+          <w:ilvl w:val="2"/>
+          <w:numId w:val="1"/>
+        </w:numPr>
+      </w:pPr>
+      <w:r>
+        <w:t xml:space="preserve">Shows the date of the appointment. </w:t>
+      </w:r>
+    </w:p>
+    <w:p>
+      <w:pPr>
+        <w:pStyle w:val="ListParagraph"/>
+        <w:numPr>
+          <w:ilvl w:val="1"/>
+          <w:numId w:val="1"/>
+        </w:numPr>
+      </w:pPr>
+      <w:proofErr w:type="spellStart"/>
+      <w:r>
+        <w:t>A</w:t>
+      </w:r>
+      <w:r>
+        <w:t>pp</w:t>
+      </w:r>
+      <w:r>
+        <w:t>ointment</w:t>
+      </w:r>
+      <w:r>
+        <w:t>_day</w:t>
+      </w:r>
+      <w:proofErr w:type="spellEnd"/>
+    </w:p>
+    <w:p>
+      <w:pPr>
+        <w:pStyle w:val="ListParagraph"/>
+        <w:numPr>
+          <w:ilvl w:val="2"/>
+          <w:numId w:val="1"/>
+        </w:numPr>
+      </w:pPr>
+      <w:r>
+        <w:t xml:space="preserve">Shows the day of the week the appointment was on. </w:t>
+      </w:r>
+    </w:p>
+    <w:p>
+      <w:pPr>
+        <w:pStyle w:val="ListParagraph"/>
+        <w:numPr>
+          <w:ilvl w:val="1"/>
+          <w:numId w:val="1"/>
+        </w:numPr>
+      </w:pPr>
+      <w:proofErr w:type="spellStart"/>
+      <w:r>
+        <w:t>A</w:t>
+      </w:r>
+      <w:r>
+        <w:t>ppoint</w:t>
+      </w:r>
+      <w:r>
+        <w:t>ment_ty</w:t>
+      </w:r>
+      <w:r>
+        <w:t>pe</w:t>
+      </w:r>
+      <w:proofErr w:type="spellEnd"/>
+    </w:p>
+    <w:p>
+      <w:pPr>
+        <w:pStyle w:val="ListParagraph"/>
+        <w:numPr>
+          <w:ilvl w:val="2"/>
+          <w:numId w:val="1"/>
+        </w:numPr>
+      </w:pPr>
+      <w:r>
+        <w:t xml:space="preserve">Defines the type of appointment </w:t>
+      </w:r>
+    </w:p>
+    <w:p>
+      <w:pPr>
+        <w:pStyle w:val="ListParagraph"/>
+        <w:numPr>
+          <w:ilvl w:val="1"/>
+          <w:numId w:val="1"/>
+        </w:numPr>
+      </w:pPr>
+      <w:proofErr w:type="spellStart"/>
+      <w:r>
+        <w:t>A</w:t>
+      </w:r>
+      <w:r>
+        <w:t>pp</w:t>
+      </w:r>
+      <w:r>
+        <w:t>ointment</w:t>
+      </w:r>
+      <w:r>
+        <w:t>_</w:t>
+      </w:r>
+      <w:r>
+        <w:t>sta</w:t>
+      </w:r>
+      <w:r>
+        <w:t>tus</w:t>
+      </w:r>
+      <w:proofErr w:type="spellEnd"/>
+    </w:p>
+    <w:p>
+      <w:pPr>
+        <w:pStyle w:val="ListParagraph"/>
+        <w:numPr>
+          <w:ilvl w:val="2"/>
+          <w:numId w:val="1"/>
+        </w:numPr>
+      </w:pPr>
+      <w:r>
+        <w:t xml:space="preserve">Defines an appointment as either </w:t>
+      </w:r>
+      <w:r>
+        <w:t>Completed, Cancelled, or no-show</w:t>
+      </w:r>
+    </w:p>
+    <w:p>
+      <w:pPr>
+        <w:pStyle w:val="ListParagraph"/>
+        <w:numPr>
+          <w:ilvl w:val="1"/>
+          <w:numId w:val="1"/>
+        </w:numPr>
+      </w:pPr>
+      <w:proofErr w:type="spellStart"/>
+      <w:r>
+        <w:t>A</w:t>
+      </w:r>
+      <w:r>
+        <w:t>pp</w:t>
+      </w:r>
+      <w:r>
+        <w:t>ointment</w:t>
+      </w:r>
+      <w:r>
+        <w:t>_dura</w:t>
+      </w:r>
+      <w:r>
+        <w:t>tion</w:t>
+      </w:r>
+      <w:r>
+        <w:t>_</w:t>
+      </w:r>
+      <w:r>
+        <w:t>min</w:t>
+      </w:r>
+      <w:r>
+        <w:t>utes</w:t>
+      </w:r>
+      <w:proofErr w:type="spellEnd"/>
+    </w:p>
+    <w:p>
+      <w:pPr>
+        <w:pStyle w:val="ListParagraph"/>
+        <w:numPr>
+          <w:ilvl w:val="2"/>
+          <w:numId w:val="1"/>
+        </w:numPr>
+      </w:pPr>
+      <w:r>
+        <w:t xml:space="preserve">Shows length of time </w:t>
+      </w:r>
+      <w:r>
+        <w:t xml:space="preserve">for the appointment </w:t>
+      </w:r>
+    </w:p>
+    <w:p>
+      <w:pPr>
+        <w:pStyle w:val="ListParagraph"/>
+        <w:numPr>
+          <w:ilvl w:val="1"/>
+          <w:numId w:val="1"/>
+        </w:numPr>
+      </w:pPr>
+      <w:proofErr w:type="spellStart"/>
+      <w:r>
+        <w:t>P</w:t>
+      </w:r>
+      <w:r>
+        <w:t>atient</w:t>
+      </w:r>
+      <w:r>
+        <w:t>_</w:t>
       </w:r>
       <w:r>
         <w:t>s</w:t>
       </w:r>
       <w:r>
+        <w:t>a</w:t>
+      </w:r>
+      <w:r>
+        <w:t>tient_</w:t>
+      </w:r>
+      <w:r>
+        <w:t>satis</w:t>
+      </w:r>
+      <w:r>
+        <w:t>factio</w:t>
+      </w:r>
+      <w:r>
+        <w:t>n_</w:t>
+      </w:r>
+      <w:r>
+        <w:t>scor</w:t>
+      </w:r>
+      <w:r>
+        <w:t>e</w:t>
+      </w:r>
+      <w:proofErr w:type="spellEnd"/>
+      <w:r>
         <w:t xml:space="preserve"> </w:t>
       </w:r>
-      <w:r>
-        <w:t xml:space="preserve">in </w:t>
-      </w:r>
-      <w:r>
-        <w:t>isol</w:t>
-      </w:r>
-      <w:r>
-        <w:t>ation me</w:t>
-      </w:r>
-      <w:r>
-        <w:t>aning t</w:t>
-      </w:r>
-      <w:r>
-        <w:t>here are no</w:t>
-      </w:r>
-      <w:r>
-        <w:t xml:space="preserve"> fo</w:t>
-      </w:r>
-      <w:r>
-        <w:t>r</w:t>
-      </w:r>
-      <w:r>
-        <w:t xml:space="preserve">eign </w:t>
-      </w:r>
-      <w:r>
-        <w:t>keys wit</w:t>
-      </w:r>
-      <w:r>
-        <w:t>hin them</w:t>
-      </w:r>
-      <w:r>
-        <w:t xml:space="preserve">. </w:t>
-      </w:r>
-    </w:p>
-    <w:p>
-      <w:r>
-        <w:t>5. Note each column's likely meaning</w:t>
-      </w:r>
-      <w:r>
-        <w:t>:</w:t>
+    </w:p>
+    <w:p>
+      <w:pPr>
+        <w:pStyle w:val="ListParagraph"/>
+        <w:numPr>
+          <w:ilvl w:val="2"/>
+          <w:numId w:val="1"/>
+        </w:numPr>
+      </w:pPr>
+      <w:r>
+        <w:t xml:space="preserve">A </w:t>
+      </w:r>
+      <w:r>
+        <w:t xml:space="preserve">decimal scale from </w:t>
+      </w:r>
+      <w:r>
+        <w:t xml:space="preserve">1-5 </w:t>
+      </w:r>
+      <w:proofErr w:type="spellStart"/>
+      <w:r>
+        <w:t>ignifying</w:t>
+      </w:r>
+      <w:proofErr w:type="spellEnd"/>
+      <w:r>
+        <w:t xml:space="preserve"> patient satisfaction</w:t>
+      </w:r>
+    </w:p>
+    <w:p>
+      <w:pPr>
+        <w:pStyle w:val="ListParagraph"/>
+        <w:numPr>
+          <w:ilvl w:val="3"/>
+          <w:numId w:val="1"/>
+        </w:numPr>
+      </w:pPr>
+      <w:r>
+        <w:t xml:space="preserve">There </w:t>
+      </w:r>
+      <w:r>
+        <w:t>are</w:t>
+      </w:r>
+      <w:r>
+        <w:t xml:space="preserve"> about 1,000</w:t>
+      </w:r>
+      <w:r>
+        <w:t xml:space="preserve"> appointments with miss</w:t>
+      </w:r>
+      <w:r>
+        <w:t>ing</w:t>
+      </w:r>
+      <w:r>
+        <w:t xml:space="preserve"> satisfaction scores. </w:t>
+      </w:r>
+      <w:r>
+        <w:t xml:space="preserve">Null values will mean patients </w:t>
+      </w:r>
+      <w:proofErr w:type="gramStart"/>
+      <w:r>
+        <w:t>either</w:t>
+      </w:r>
+      <w:proofErr w:type="gramEnd"/>
+      <w:r>
+        <w:t xml:space="preserve"> canceled or no-show. </w:t>
       </w:r>
     </w:p>
     <w:p>
@@ -780,25 +2107,34 @@
           <w:numId w:val="1"/>
         </w:numPr>
       </w:pPr>
+      <w:r>
+        <w:t>Patients</w:t>
+      </w:r>
+    </w:p>
+    <w:p>
+      <w:pPr>
+        <w:pStyle w:val="ListParagraph"/>
+        <w:numPr>
+          <w:ilvl w:val="1"/>
+          <w:numId w:val="1"/>
+        </w:numPr>
+      </w:pPr>
       <w:proofErr w:type="spellStart"/>
       <w:r>
-        <w:t>E</w:t>
-      </w:r>
-      <w:r>
-        <w:t>r</w:t>
-      </w:r>
-      <w:r>
-        <w:t>_</w:t>
-      </w:r>
-      <w:r>
-        <w:t>vis</w:t>
-      </w:r>
-      <w:r>
-        <w:t>its</w:t>
+        <w:t>Patient_id</w:t>
       </w:r>
       <w:proofErr w:type="spellEnd"/>
-      <w:r>
-        <w:t>:</w:t>
+    </w:p>
+    <w:p>
+      <w:pPr>
+        <w:pStyle w:val="ListParagraph"/>
+        <w:numPr>
+          <w:ilvl w:val="2"/>
+          <w:numId w:val="1"/>
+        </w:numPr>
+      </w:pPr>
+      <w:r>
+        <w:t xml:space="preserve">Unique identifier for each patient. </w:t>
       </w:r>
     </w:p>
     <w:p>
@@ -811,13 +2147,7 @@
       </w:pPr>
       <w:proofErr w:type="spellStart"/>
       <w:r>
-        <w:t>V</w:t>
-      </w:r>
-      <w:r>
-        <w:t>i</w:t>
-      </w:r>
-      <w:r>
-        <w:t>sit_id</w:t>
+        <w:t>Patient_name</w:t>
       </w:r>
       <w:proofErr w:type="spellEnd"/>
     </w:p>
@@ -830,46 +2160,19 @@
         </w:numPr>
       </w:pPr>
       <w:r>
-        <w:t>T</w:t>
-      </w:r>
-      <w:r>
-        <w:t xml:space="preserve">he </w:t>
-      </w:r>
-      <w:r>
-        <w:t>pr</w:t>
-      </w:r>
-      <w:r>
-        <w:t>imary ke</w:t>
-      </w:r>
-      <w:r>
-        <w:t>y to i</w:t>
-      </w:r>
-      <w:r>
-        <w:t>d</w:t>
-      </w:r>
-      <w:r>
-        <w:t>e</w:t>
-      </w:r>
-      <w:r>
-        <w:t>ntif</w:t>
-      </w:r>
-      <w:r>
-        <w:t>y an</w:t>
-      </w:r>
-      <w:r>
-        <w:t>d organize</w:t>
-      </w:r>
-      <w:r>
-        <w:t xml:space="preserve"> vis</w:t>
-      </w:r>
-      <w:r>
-        <w:t>its ma</w:t>
-      </w:r>
-      <w:r>
-        <w:t xml:space="preserve">de to the </w:t>
-      </w:r>
-      <w:r>
-        <w:t xml:space="preserve">ER. </w:t>
+        <w:t xml:space="preserve">First and last name of patient </w:t>
+      </w:r>
+    </w:p>
+    <w:p>
+      <w:pPr>
+        <w:pStyle w:val="ListParagraph"/>
+        <w:numPr>
+          <w:ilvl w:val="3"/>
+          <w:numId w:val="1"/>
+        </w:numPr>
+      </w:pPr>
+      <w:r>
+        <w:t xml:space="preserve">First and last name are within the same record. I’m wondering if it’s best to do splitting so that first and last name have their own fields.  </w:t>
       </w:r>
     </w:p>
     <w:p>
@@ -880,18 +2183,93 @@
           <w:numId w:val="1"/>
         </w:numPr>
       </w:pPr>
+      <w:r>
+        <w:t>Age</w:t>
+      </w:r>
+    </w:p>
+    <w:p>
+      <w:pPr>
+        <w:pStyle w:val="ListParagraph"/>
+        <w:numPr>
+          <w:ilvl w:val="2"/>
+          <w:numId w:val="1"/>
+        </w:numPr>
+      </w:pPr>
+      <w:r>
+        <w:t>Age in years of patient</w:t>
+      </w:r>
+    </w:p>
+    <w:p>
+      <w:pPr>
+        <w:pStyle w:val="ListParagraph"/>
+        <w:numPr>
+          <w:ilvl w:val="1"/>
+          <w:numId w:val="1"/>
+        </w:numPr>
+      </w:pPr>
+      <w:r>
+        <w:t>Gender</w:t>
+      </w:r>
+    </w:p>
+    <w:p>
+      <w:pPr>
+        <w:pStyle w:val="ListParagraph"/>
+        <w:numPr>
+          <w:ilvl w:val="2"/>
+          <w:numId w:val="1"/>
+        </w:numPr>
+      </w:pPr>
+      <w:r>
+        <w:t xml:space="preserve">Biological sex of patient </w:t>
+      </w:r>
+    </w:p>
+    <w:p>
+      <w:pPr>
+        <w:pStyle w:val="ListParagraph"/>
+        <w:numPr>
+          <w:ilvl w:val="1"/>
+          <w:numId w:val="1"/>
+        </w:numPr>
+      </w:pPr>
+      <w:r>
+        <w:t xml:space="preserve">City </w:t>
+      </w:r>
+    </w:p>
+    <w:p>
+      <w:pPr>
+        <w:pStyle w:val="ListParagraph"/>
+        <w:numPr>
+          <w:ilvl w:val="2"/>
+          <w:numId w:val="1"/>
+        </w:numPr>
+      </w:pPr>
+      <w:r>
+        <w:t xml:space="preserve">The city where the patient is from </w:t>
+      </w:r>
+    </w:p>
+    <w:p>
+      <w:pPr>
+        <w:pStyle w:val="ListParagraph"/>
+        <w:numPr>
+          <w:ilvl w:val="0"/>
+          <w:numId w:val="1"/>
+        </w:numPr>
+      </w:pPr>
+      <w:r>
+        <w:t>Providers</w:t>
+      </w:r>
+    </w:p>
+    <w:p>
+      <w:pPr>
+        <w:pStyle w:val="ListParagraph"/>
+        <w:numPr>
+          <w:ilvl w:val="1"/>
+          <w:numId w:val="1"/>
+        </w:numPr>
+      </w:pPr>
       <w:proofErr w:type="spellStart"/>
       <w:r>
-        <w:t>P</w:t>
-      </w:r>
-      <w:r>
-        <w:t>a</w:t>
-      </w:r>
-      <w:r>
-        <w:t>tient</w:t>
-      </w:r>
-      <w:r>
-        <w:t>_id</w:t>
+        <w:t>Provider_id</w:t>
       </w:r>
       <w:proofErr w:type="spellEnd"/>
     </w:p>
@@ -904,100 +2282,8 @@
         </w:numPr>
       </w:pPr>
       <w:r>
-        <w:t>A fore</w:t>
-      </w:r>
-      <w:r>
-        <w:t xml:space="preserve">ign </w:t>
-      </w:r>
-      <w:r>
-        <w:t xml:space="preserve">key </w:t>
-      </w:r>
-      <w:r>
-        <w:t>t</w:t>
-      </w:r>
-      <w:r>
-        <w:t xml:space="preserve">hat </w:t>
-      </w:r>
-      <w:r>
-        <w:t>referenc</w:t>
-      </w:r>
-      <w:r>
-        <w:t>e</w:t>
-      </w:r>
-      <w:r>
-        <w:t>s</w:t>
-      </w:r>
-      <w:r>
-        <w:t xml:space="preserve"> </w:t>
-      </w:r>
-      <w:r>
-        <w:t xml:space="preserve">a </w:t>
-      </w:r>
-      <w:r>
-        <w:t>sp</w:t>
-      </w:r>
-      <w:r>
-        <w:t xml:space="preserve">ecific </w:t>
-      </w:r>
-      <w:r>
-        <w:t>pa</w:t>
-      </w:r>
-      <w:r>
-        <w:t>tien</w:t>
-      </w:r>
-      <w:r>
-        <w:t>t visi</w:t>
-      </w:r>
-      <w:r>
-        <w:t xml:space="preserve">ting </w:t>
-      </w:r>
-      <w:r>
-        <w:t xml:space="preserve">the </w:t>
-      </w:r>
-      <w:r>
-        <w:t>ER</w:t>
-      </w:r>
-      <w:r>
-        <w:t>.</w:t>
-      </w:r>
-      <w:r>
-        <w:t xml:space="preserve"> De</w:t>
-      </w:r>
-      <w:r>
-        <w:t>tails of</w:t>
-      </w:r>
-      <w:r>
-        <w:t xml:space="preserve"> eac</w:t>
-      </w:r>
-      <w:r>
-        <w:t>h pat</w:t>
-      </w:r>
-      <w:r>
-        <w:t>ie</w:t>
-      </w:r>
-      <w:r>
-        <w:t xml:space="preserve">nt can </w:t>
-      </w:r>
-      <w:r>
-        <w:t xml:space="preserve">be found in </w:t>
-      </w:r>
-      <w:r>
-        <w:t xml:space="preserve">the </w:t>
-      </w:r>
-      <w:r>
-        <w:t>pati</w:t>
-      </w:r>
-      <w:r>
-        <w:t>ents</w:t>
-      </w:r>
-      <w:r>
-        <w:t xml:space="preserve"> da</w:t>
-      </w:r>
-      <w:r>
-        <w:t>taset</w:t>
-      </w:r>
-      <w:r>
-        <w:t>.</w:t>
+        <w:lastRenderedPageBreak/>
+        <w:t xml:space="preserve">Unique identifier for each provider. </w:t>
       </w:r>
     </w:p>
     <w:p>
@@ -1008,1239 +2294,51 @@
           <w:numId w:val="1"/>
         </w:numPr>
       </w:pPr>
+      <w:r>
+        <w:t>Provider_name</w:t>
+      </w:r>
+    </w:p>
+    <w:p>
+      <w:pPr>
+        <w:pStyle w:val="ListParagraph"/>
+        <w:numPr>
+          <w:ilvl w:val="2"/>
+          <w:numId w:val="1"/>
+        </w:numPr>
+      </w:pPr>
+      <w:r>
+        <w:t>First and last name of provider</w:t>
+      </w:r>
+    </w:p>
+    <w:p>
+      <w:pPr>
+        <w:pStyle w:val="ListParagraph"/>
+        <w:numPr>
+          <w:ilvl w:val="3"/>
+          <w:numId w:val="1"/>
+        </w:numPr>
+      </w:pPr>
+      <w:r>
+        <w:t>Jessica Allen (</w:t>
+      </w:r>
       <w:proofErr w:type="spellStart"/>
       <w:r>
-        <w:t>A</w:t>
-      </w:r>
-      <w:r>
-        <w:t>rr</w:t>
-      </w:r>
-      <w:r>
-        <w:t>ival_</w:t>
-      </w:r>
-      <w:r>
-        <w:t>date</w:t>
+        <w:t>provider_id</w:t>
       </w:r>
       <w:proofErr w:type="spellEnd"/>
-    </w:p>
-    <w:p>
-      <w:pPr>
-        <w:pStyle w:val="ListParagraph"/>
-        <w:numPr>
-          <w:ilvl w:val="2"/>
-          <w:numId w:val="1"/>
-        </w:numPr>
-      </w:pPr>
-      <w:r>
-        <w:t>The d</w:t>
-      </w:r>
-      <w:r>
-        <w:t xml:space="preserve">ate </w:t>
-      </w:r>
-      <w:r>
-        <w:t xml:space="preserve">when a </w:t>
-      </w:r>
-      <w:r>
-        <w:t xml:space="preserve">patient </w:t>
-      </w:r>
-      <w:r>
-        <w:t>arr</w:t>
-      </w:r>
-      <w:r>
-        <w:t>ived a</w:t>
-      </w:r>
-      <w:r>
-        <w:t xml:space="preserve">t the </w:t>
-      </w:r>
-      <w:r>
-        <w:t>ER.</w:t>
-      </w:r>
-    </w:p>
-    <w:p>
-      <w:pPr>
-        <w:pStyle w:val="ListParagraph"/>
-        <w:numPr>
-          <w:ilvl w:val="1"/>
-          <w:numId w:val="1"/>
-        </w:numPr>
-      </w:pPr>
+      <w:r>
+        <w:t xml:space="preserve">: 19) is the only provider with </w:t>
+      </w:r>
+      <w:r>
+        <w:t xml:space="preserve">‘Dr.’ within the </w:t>
+      </w:r>
       <w:proofErr w:type="spellStart"/>
       <w:r>
-        <w:t>Arrival</w:t>
-      </w:r>
-      <w:r>
-        <w:t>_</w:t>
-      </w:r>
-      <w:r>
-        <w:t>day</w:t>
+        <w:t>provider_name</w:t>
       </w:r>
       <w:proofErr w:type="spellEnd"/>
-    </w:p>
-    <w:p>
-      <w:pPr>
-        <w:pStyle w:val="ListParagraph"/>
-        <w:numPr>
-          <w:ilvl w:val="2"/>
-          <w:numId w:val="1"/>
-        </w:numPr>
-      </w:pPr>
-      <w:r>
-        <w:t>The da</w:t>
-      </w:r>
-      <w:r>
-        <w:t xml:space="preserve">y of the </w:t>
-      </w:r>
-      <w:r>
-        <w:t>week</w:t>
-      </w:r>
-      <w:r>
-        <w:t xml:space="preserve">, when </w:t>
-      </w:r>
-      <w:r>
-        <w:t>a pati</w:t>
-      </w:r>
-      <w:r>
-        <w:t>ent arriv</w:t>
-      </w:r>
-      <w:r>
-        <w:t xml:space="preserve">ed </w:t>
-      </w:r>
-      <w:r>
-        <w:t>at the E</w:t>
-      </w:r>
-      <w:r>
-        <w:t>R</w:t>
-      </w:r>
-    </w:p>
-    <w:p>
-      <w:pPr>
-        <w:pStyle w:val="ListParagraph"/>
-        <w:numPr>
-          <w:ilvl w:val="1"/>
-          <w:numId w:val="1"/>
-        </w:numPr>
-      </w:pPr>
-      <w:proofErr w:type="spellStart"/>
-      <w:r>
-        <w:t>Ar</w:t>
-      </w:r>
-      <w:r>
-        <w:t>rival_</w:t>
-      </w:r>
-      <w:r>
-        <w:t>hou</w:t>
-      </w:r>
-      <w:r>
-        <w:t>r</w:t>
-      </w:r>
-      <w:proofErr w:type="spellEnd"/>
-    </w:p>
-    <w:p>
-      <w:pPr>
-        <w:pStyle w:val="ListParagraph"/>
-        <w:numPr>
-          <w:ilvl w:val="2"/>
-          <w:numId w:val="1"/>
-        </w:numPr>
-      </w:pPr>
-      <w:r>
-        <w:t xml:space="preserve">The </w:t>
-      </w:r>
-      <w:r>
-        <w:t xml:space="preserve">time </w:t>
-      </w:r>
-      <w:r>
-        <w:t>of</w:t>
-      </w:r>
-      <w:r>
-        <w:t xml:space="preserve"> day</w:t>
-      </w:r>
-      <w:r>
-        <w:t xml:space="preserve"> (</w:t>
-      </w:r>
-      <w:r>
-        <w:t>at the top of</w:t>
-      </w:r>
-      <w:r>
-        <w:t xml:space="preserve"> the hour</w:t>
-      </w:r>
-      <w:r>
-        <w:t>)</w:t>
-      </w:r>
-      <w:r>
-        <w:t>, whe</w:t>
-      </w:r>
-      <w:r>
-        <w:t>n a patie</w:t>
-      </w:r>
-      <w:r>
-        <w:t xml:space="preserve">nt </w:t>
-      </w:r>
-      <w:r>
-        <w:t xml:space="preserve">arrived </w:t>
-      </w:r>
-      <w:r>
-        <w:t xml:space="preserve">at the </w:t>
-      </w:r>
-      <w:r>
-        <w:t>ER</w:t>
-      </w:r>
-      <w:r>
-        <w:t>.</w:t>
-      </w:r>
-    </w:p>
-    <w:p>
-      <w:pPr>
-        <w:pStyle w:val="ListParagraph"/>
-        <w:numPr>
-          <w:ilvl w:val="1"/>
-          <w:numId w:val="1"/>
-        </w:numPr>
-      </w:pPr>
-      <w:proofErr w:type="spellStart"/>
-      <w:r>
-        <w:t>S</w:t>
-      </w:r>
-      <w:r>
-        <w:t>everit</w:t>
-      </w:r>
-      <w:r>
-        <w:t>y_</w:t>
-      </w:r>
-      <w:r>
-        <w:t>lev</w:t>
-      </w:r>
-      <w:r>
-        <w:t>el</w:t>
-      </w:r>
-      <w:proofErr w:type="spellEnd"/>
-    </w:p>
-    <w:p>
-      <w:pPr>
-        <w:pStyle w:val="ListParagraph"/>
-        <w:numPr>
-          <w:ilvl w:val="2"/>
-          <w:numId w:val="1"/>
-        </w:numPr>
-      </w:pPr>
-      <w:r>
-        <w:t xml:space="preserve">A </w:t>
-      </w:r>
-      <w:r>
-        <w:t>c</w:t>
-      </w:r>
-      <w:r>
-        <w:t>lassi</w:t>
-      </w:r>
-      <w:r>
-        <w:t xml:space="preserve">fication </w:t>
-      </w:r>
-      <w:r>
-        <w:t>of how</w:t>
-      </w:r>
-      <w:r>
-        <w:t xml:space="preserve"> severe a </w:t>
-      </w:r>
-      <w:r>
-        <w:t>patient</w:t>
-      </w:r>
-      <w:r>
-        <w:t>’s vis</w:t>
-      </w:r>
-      <w:r>
-        <w:t xml:space="preserve">it to </w:t>
-      </w:r>
-      <w:r>
-        <w:t>the ER</w:t>
-      </w:r>
-      <w:r>
-        <w:t xml:space="preserve"> was. </w:t>
-      </w:r>
-    </w:p>
-    <w:p>
-      <w:pPr>
-        <w:pStyle w:val="ListParagraph"/>
-        <w:numPr>
-          <w:ilvl w:val="1"/>
-          <w:numId w:val="1"/>
-        </w:numPr>
-      </w:pPr>
-      <w:proofErr w:type="spellStart"/>
-      <w:r>
-        <w:t>Wait_tim</w:t>
-      </w:r>
-      <w:r>
-        <w:t>e_m</w:t>
-      </w:r>
-      <w:r>
-        <w:t>inute</w:t>
-      </w:r>
-      <w:r>
-        <w:t>s</w:t>
-      </w:r>
-      <w:proofErr w:type="spellEnd"/>
-    </w:p>
-    <w:p>
-      <w:pPr>
-        <w:pStyle w:val="ListParagraph"/>
-        <w:numPr>
-          <w:ilvl w:val="2"/>
-          <w:numId w:val="1"/>
-        </w:numPr>
-      </w:pPr>
-      <w:r>
-        <w:t>The a</w:t>
-      </w:r>
-      <w:r>
-        <w:t xml:space="preserve">mount of </w:t>
-      </w:r>
-      <w:r>
-        <w:t>time a p</w:t>
-      </w:r>
-      <w:r>
-        <w:t xml:space="preserve">atient </w:t>
-      </w:r>
-      <w:r>
-        <w:t xml:space="preserve">had to </w:t>
-      </w:r>
-      <w:r>
-        <w:t xml:space="preserve">wait </w:t>
-      </w:r>
-      <w:r>
-        <w:t xml:space="preserve">to be </w:t>
-      </w:r>
-      <w:r>
-        <w:t xml:space="preserve">seen </w:t>
-      </w:r>
-      <w:r>
-        <w:t xml:space="preserve">in </w:t>
-      </w:r>
-      <w:r>
-        <w:t xml:space="preserve">the </w:t>
-      </w:r>
-      <w:r>
-        <w:t xml:space="preserve">ER. </w:t>
-      </w:r>
-    </w:p>
-    <w:p>
-      <w:pPr>
-        <w:pStyle w:val="ListParagraph"/>
-        <w:numPr>
-          <w:ilvl w:val="1"/>
-          <w:numId w:val="1"/>
-        </w:numPr>
-      </w:pPr>
-      <w:proofErr w:type="spellStart"/>
-      <w:r>
-        <w:t>L</w:t>
-      </w:r>
-      <w:r>
-        <w:t>e</w:t>
-      </w:r>
-      <w:r>
-        <w:t>ngth</w:t>
-      </w:r>
-      <w:r>
-        <w:t>_</w:t>
-      </w:r>
-      <w:r>
-        <w:t>of_s</w:t>
-      </w:r>
-      <w:r>
-        <w:t>tay_h</w:t>
-      </w:r>
-      <w:r>
-        <w:t>ours</w:t>
-      </w:r>
-      <w:proofErr w:type="spellEnd"/>
-    </w:p>
-    <w:p>
-      <w:pPr>
-        <w:pStyle w:val="ListParagraph"/>
-        <w:numPr>
-          <w:ilvl w:val="2"/>
-          <w:numId w:val="1"/>
-        </w:numPr>
-      </w:pPr>
-      <w:r>
-        <w:t xml:space="preserve">The </w:t>
-      </w:r>
-      <w:r>
-        <w:t>number</w:t>
-      </w:r>
-      <w:r>
-        <w:t xml:space="preserve"> of</w:t>
-      </w:r>
-      <w:r>
-        <w:t xml:space="preserve"> </w:t>
-      </w:r>
-      <w:r>
-        <w:t>hour</w:t>
-      </w:r>
-      <w:r>
-        <w:t>(s)</w:t>
-      </w:r>
-      <w:r>
-        <w:t xml:space="preserve"> a </w:t>
-      </w:r>
-      <w:r>
-        <w:t>patient</w:t>
-      </w:r>
-      <w:r>
-        <w:t xml:space="preserve"> </w:t>
-      </w:r>
-      <w:r>
-        <w:t xml:space="preserve">stayed </w:t>
-      </w:r>
-      <w:r>
-        <w:t>in the E</w:t>
-      </w:r>
-      <w:r>
-        <w:t>R</w:t>
-      </w:r>
-      <w:r>
-        <w:t xml:space="preserve">, from arrival until discharge from the ER or admission to the hospital. </w:t>
-      </w:r>
-    </w:p>
-    <w:p>
-      <w:pPr>
-        <w:pStyle w:val="ListParagraph"/>
-        <w:numPr>
-          <w:ilvl w:val="3"/>
-          <w:numId w:val="1"/>
-        </w:numPr>
-      </w:pPr>
-      <w:r>
-        <w:t>Hospital stay after admission is not included in this field (</w:t>
-      </w:r>
-      <w:proofErr w:type="spellStart"/>
-      <w:r>
-        <w:t>losh</w:t>
-      </w:r>
-      <w:proofErr w:type="spellEnd"/>
-      <w:r>
-        <w:t>)</w:t>
-      </w:r>
-    </w:p>
-    <w:p>
-      <w:pPr>
-        <w:pStyle w:val="ListParagraph"/>
-        <w:numPr>
-          <w:ilvl w:val="1"/>
-          <w:numId w:val="1"/>
-        </w:numPr>
-      </w:pPr>
-      <w:r>
-        <w:t>A</w:t>
-      </w:r>
-      <w:r>
-        <w:t>dm</w:t>
-      </w:r>
-      <w:r>
-        <w:t>itted</w:t>
-      </w:r>
-    </w:p>
-    <w:p>
-      <w:pPr>
-        <w:pStyle w:val="ListParagraph"/>
-        <w:numPr>
-          <w:ilvl w:val="2"/>
-          <w:numId w:val="1"/>
-        </w:numPr>
-      </w:pPr>
-      <w:r>
-        <w:t xml:space="preserve">Yes: </w:t>
-      </w:r>
-      <w:r>
-        <w:t xml:space="preserve">Shows </w:t>
-      </w:r>
-      <w:r>
-        <w:t>pati</w:t>
-      </w:r>
-      <w:r>
-        <w:t xml:space="preserve">ents </w:t>
-      </w:r>
-      <w:r>
-        <w:t xml:space="preserve">who </w:t>
-      </w:r>
-      <w:r>
-        <w:t>hav</w:t>
-      </w:r>
-      <w:r>
-        <w:t>e</w:t>
-      </w:r>
-      <w:r>
-        <w:t xml:space="preserve"> be</w:t>
-      </w:r>
-      <w:r>
-        <w:t>en assi</w:t>
-      </w:r>
-      <w:r>
-        <w:t>gned to st</w:t>
-      </w:r>
-      <w:r>
-        <w:t>ay at t</w:t>
-      </w:r>
-      <w:r>
-        <w:t>he ho</w:t>
-      </w:r>
-      <w:r>
-        <w:t>spital</w:t>
-      </w:r>
-      <w:r>
-        <w:t xml:space="preserve">, </w:t>
-      </w:r>
-      <w:r>
-        <w:t xml:space="preserve"> or </w:t>
-      </w:r>
-      <w:r>
-        <w:t xml:space="preserve">No: </w:t>
-      </w:r>
-      <w:r>
-        <w:t>dis</w:t>
-      </w:r>
-      <w:r>
-        <w:t>cha</w:t>
-      </w:r>
-      <w:r>
-        <w:t>rg</w:t>
-      </w:r>
-      <w:r>
-        <w:t xml:space="preserve">ed </w:t>
-      </w:r>
-      <w:r>
-        <w:t>afte</w:t>
-      </w:r>
-      <w:r>
-        <w:t xml:space="preserve">r being </w:t>
-      </w:r>
-      <w:r>
-        <w:t xml:space="preserve">seen in the </w:t>
-      </w:r>
-      <w:r>
-        <w:t xml:space="preserve">ER. </w:t>
-      </w:r>
-    </w:p>
-    <w:p>
-      <w:pPr>
-        <w:pStyle w:val="ListParagraph"/>
-        <w:numPr>
-          <w:ilvl w:val="0"/>
-          <w:numId w:val="1"/>
-        </w:numPr>
-      </w:pPr>
-      <w:r>
-        <w:t>A</w:t>
-      </w:r>
-      <w:r>
-        <w:t>p</w:t>
-      </w:r>
-      <w:r>
-        <w:t>pointment</w:t>
-      </w:r>
-      <w:r>
-        <w:t>s</w:t>
-      </w:r>
-    </w:p>
-    <w:p>
-      <w:pPr>
-        <w:pStyle w:val="ListParagraph"/>
-        <w:numPr>
-          <w:ilvl w:val="1"/>
-          <w:numId w:val="1"/>
-        </w:numPr>
-      </w:pPr>
-      <w:proofErr w:type="spellStart"/>
-      <w:r>
-        <w:t>A</w:t>
-      </w:r>
-      <w:r>
-        <w:t>pp</w:t>
-      </w:r>
-      <w:r>
-        <w:t>ointment</w:t>
-      </w:r>
-      <w:r>
-        <w:t>_id</w:t>
-      </w:r>
-      <w:proofErr w:type="spellEnd"/>
-    </w:p>
-    <w:p>
-      <w:pPr>
-        <w:pStyle w:val="ListParagraph"/>
-        <w:numPr>
-          <w:ilvl w:val="2"/>
-          <w:numId w:val="1"/>
-        </w:numPr>
-      </w:pPr>
-      <w:r>
-        <w:t>A number to identify</w:t>
-      </w:r>
-      <w:r>
-        <w:t xml:space="preserve"> each appointment at the </w:t>
-      </w:r>
-      <w:r>
-        <w:t>Valley Regional Medical Center</w:t>
-      </w:r>
-      <w:r>
-        <w:t xml:space="preserve">. </w:t>
-      </w:r>
-    </w:p>
-    <w:p>
-      <w:pPr>
-        <w:pStyle w:val="ListParagraph"/>
-        <w:numPr>
-          <w:ilvl w:val="1"/>
-          <w:numId w:val="1"/>
-        </w:numPr>
-      </w:pPr>
-      <w:proofErr w:type="spellStart"/>
-      <w:r>
-        <w:t>P</w:t>
-      </w:r>
-      <w:r>
-        <w:t>ati</w:t>
-      </w:r>
-      <w:r>
-        <w:t>ent_id</w:t>
-      </w:r>
-      <w:proofErr w:type="spellEnd"/>
-    </w:p>
-    <w:p>
-      <w:pPr>
-        <w:pStyle w:val="ListParagraph"/>
-        <w:numPr>
-          <w:ilvl w:val="2"/>
-          <w:numId w:val="1"/>
-        </w:numPr>
-      </w:pPr>
-      <w:r>
-        <w:t>An id, referencing a specific patient. The details of the p</w:t>
-      </w:r>
-      <w:r>
-        <w:t>atient</w:t>
-      </w:r>
-      <w:r>
-        <w:t xml:space="preserve"> will be found withing the patient dataset. </w:t>
-      </w:r>
-    </w:p>
-    <w:p>
-      <w:pPr>
-        <w:pStyle w:val="ListParagraph"/>
-        <w:numPr>
-          <w:ilvl w:val="1"/>
-          <w:numId w:val="1"/>
-        </w:numPr>
-      </w:pPr>
-      <w:proofErr w:type="spellStart"/>
-      <w:r>
-        <w:t>P</w:t>
-      </w:r>
-      <w:r>
-        <w:t>rovi</w:t>
-      </w:r>
-      <w:r>
-        <w:t>der_id</w:t>
-      </w:r>
-      <w:proofErr w:type="spellEnd"/>
-    </w:p>
-    <w:p>
-      <w:pPr>
-        <w:pStyle w:val="ListParagraph"/>
-        <w:numPr>
-          <w:ilvl w:val="2"/>
-          <w:numId w:val="1"/>
-        </w:numPr>
-      </w:pPr>
-      <w:r>
-        <w:t>An id</w:t>
-      </w:r>
-      <w:r>
-        <w:t>,</w:t>
-      </w:r>
-      <w:r>
-        <w:t xml:space="preserve"> referencing a specific provider. The details of the provider will be found withing the provider dataset. </w:t>
-      </w:r>
-    </w:p>
-    <w:p>
-      <w:pPr>
-        <w:pStyle w:val="ListParagraph"/>
-        <w:numPr>
-          <w:ilvl w:val="1"/>
-          <w:numId w:val="1"/>
-        </w:numPr>
-      </w:pPr>
-      <w:r>
-        <w:lastRenderedPageBreak/>
-        <w:t>D</w:t>
-      </w:r>
-      <w:r>
-        <w:t>e</w:t>
-      </w:r>
-      <w:r>
-        <w:t>part</w:t>
-      </w:r>
-      <w:r>
-        <w:t>ment</w:t>
-      </w:r>
-    </w:p>
-    <w:p>
-      <w:pPr>
-        <w:pStyle w:val="ListParagraph"/>
-        <w:numPr>
-          <w:ilvl w:val="2"/>
-          <w:numId w:val="1"/>
-        </w:numPr>
-      </w:pPr>
-      <w:r>
-        <w:t xml:space="preserve">Shows which department the appointment is associated with. </w:t>
-      </w:r>
-    </w:p>
-    <w:p>
-      <w:pPr>
-        <w:pStyle w:val="ListParagraph"/>
-        <w:numPr>
-          <w:ilvl w:val="1"/>
-          <w:numId w:val="1"/>
-        </w:numPr>
-      </w:pPr>
-      <w:proofErr w:type="spellStart"/>
-      <w:r>
-        <w:t>A</w:t>
-      </w:r>
-      <w:r>
-        <w:t>ppo</w:t>
-      </w:r>
-      <w:r>
-        <w:t>intment</w:t>
-      </w:r>
-      <w:r>
-        <w:t>_date</w:t>
-      </w:r>
-      <w:proofErr w:type="spellEnd"/>
-    </w:p>
-    <w:p>
-      <w:pPr>
-        <w:pStyle w:val="ListParagraph"/>
-        <w:numPr>
-          <w:ilvl w:val="2"/>
-          <w:numId w:val="1"/>
-        </w:numPr>
-      </w:pPr>
-      <w:r>
-        <w:t xml:space="preserve">Shows the date of the appointment. </w:t>
-      </w:r>
-    </w:p>
-    <w:p>
-      <w:pPr>
-        <w:pStyle w:val="ListParagraph"/>
-        <w:numPr>
-          <w:ilvl w:val="1"/>
-          <w:numId w:val="1"/>
-        </w:numPr>
-      </w:pPr>
-      <w:proofErr w:type="spellStart"/>
-      <w:r>
-        <w:t>A</w:t>
-      </w:r>
-      <w:r>
-        <w:t>pp</w:t>
-      </w:r>
-      <w:r>
-        <w:t>ointment</w:t>
-      </w:r>
-      <w:r>
-        <w:t>_day</w:t>
-      </w:r>
-      <w:proofErr w:type="spellEnd"/>
-    </w:p>
-    <w:p>
-      <w:pPr>
-        <w:pStyle w:val="ListParagraph"/>
-        <w:numPr>
-          <w:ilvl w:val="2"/>
-          <w:numId w:val="1"/>
-        </w:numPr>
-      </w:pPr>
-      <w:r>
-        <w:t xml:space="preserve">Shows the day of the week the appointment was on. </w:t>
-      </w:r>
-    </w:p>
-    <w:p>
-      <w:pPr>
-        <w:pStyle w:val="ListParagraph"/>
-        <w:numPr>
-          <w:ilvl w:val="1"/>
-          <w:numId w:val="1"/>
-        </w:numPr>
-      </w:pPr>
-      <w:proofErr w:type="spellStart"/>
-      <w:r>
-        <w:t>A</w:t>
-      </w:r>
-      <w:r>
-        <w:t>ppoint</w:t>
-      </w:r>
-      <w:r>
-        <w:t>ment_ty</w:t>
-      </w:r>
-      <w:r>
-        <w:t>pe</w:t>
-      </w:r>
-      <w:proofErr w:type="spellEnd"/>
-    </w:p>
-    <w:p>
-      <w:pPr>
-        <w:pStyle w:val="ListParagraph"/>
-        <w:numPr>
-          <w:ilvl w:val="2"/>
-          <w:numId w:val="1"/>
-        </w:numPr>
-      </w:pPr>
-      <w:r>
-        <w:t xml:space="preserve">Defines the type of appointment </w:t>
-      </w:r>
-    </w:p>
-    <w:p>
-      <w:pPr>
-        <w:pStyle w:val="ListParagraph"/>
-        <w:numPr>
-          <w:ilvl w:val="1"/>
-          <w:numId w:val="1"/>
-        </w:numPr>
-      </w:pPr>
-      <w:proofErr w:type="spellStart"/>
-      <w:r>
-        <w:t>A</w:t>
-      </w:r>
-      <w:r>
-        <w:t>pp</w:t>
-      </w:r>
-      <w:r>
-        <w:t>ointment</w:t>
-      </w:r>
-      <w:r>
-        <w:t>_</w:t>
-      </w:r>
-      <w:r>
-        <w:t>sta</w:t>
-      </w:r>
-      <w:r>
-        <w:t>tus</w:t>
-      </w:r>
-      <w:proofErr w:type="spellEnd"/>
-    </w:p>
-    <w:p>
-      <w:pPr>
-        <w:pStyle w:val="ListParagraph"/>
-        <w:numPr>
-          <w:ilvl w:val="2"/>
-          <w:numId w:val="1"/>
-        </w:numPr>
-      </w:pPr>
-      <w:r>
-        <w:t xml:space="preserve">Defines an appointment as either </w:t>
-      </w:r>
-      <w:r>
-        <w:t>Completed, Cancelled, or no-show</w:t>
-      </w:r>
-    </w:p>
-    <w:p>
-      <w:pPr>
-        <w:pStyle w:val="ListParagraph"/>
-        <w:numPr>
-          <w:ilvl w:val="1"/>
-          <w:numId w:val="1"/>
-        </w:numPr>
-      </w:pPr>
-      <w:proofErr w:type="spellStart"/>
-      <w:r>
-        <w:t>A</w:t>
-      </w:r>
-      <w:r>
-        <w:t>pp</w:t>
-      </w:r>
-      <w:r>
-        <w:t>ointment</w:t>
-      </w:r>
-      <w:r>
-        <w:t>_dura</w:t>
-      </w:r>
-      <w:r>
-        <w:t>tion</w:t>
-      </w:r>
-      <w:r>
-        <w:t>_</w:t>
-      </w:r>
-      <w:r>
-        <w:t>min</w:t>
-      </w:r>
-      <w:r>
-        <w:t>utes</w:t>
-      </w:r>
-      <w:proofErr w:type="spellEnd"/>
-    </w:p>
-    <w:p>
-      <w:pPr>
-        <w:pStyle w:val="ListParagraph"/>
-        <w:numPr>
-          <w:ilvl w:val="2"/>
-          <w:numId w:val="1"/>
-        </w:numPr>
-      </w:pPr>
-      <w:r>
-        <w:t xml:space="preserve">Shows length of time </w:t>
-      </w:r>
-      <w:r>
-        <w:t xml:space="preserve">for the appointment </w:t>
-      </w:r>
-    </w:p>
-    <w:p>
-      <w:pPr>
-        <w:pStyle w:val="ListParagraph"/>
-        <w:numPr>
-          <w:ilvl w:val="1"/>
-          <w:numId w:val="1"/>
-        </w:numPr>
-      </w:pPr>
-      <w:proofErr w:type="spellStart"/>
-      <w:r>
-        <w:t>P</w:t>
-      </w:r>
-      <w:r>
-        <w:t>atient</w:t>
-      </w:r>
-      <w:r>
-        <w:t>_</w:t>
-      </w:r>
-      <w:r>
-        <w:t>s</w:t>
-      </w:r>
-      <w:r>
-        <w:t>a</w:t>
-      </w:r>
-      <w:r>
-        <w:t>tient_</w:t>
-      </w:r>
-      <w:r>
-        <w:t>satis</w:t>
-      </w:r>
-      <w:r>
-        <w:t>factio</w:t>
-      </w:r>
-      <w:r>
-        <w:t>n_</w:t>
-      </w:r>
-      <w:r>
-        <w:t>scor</w:t>
-      </w:r>
-      <w:r>
-        <w:t>e</w:t>
-      </w:r>
-      <w:proofErr w:type="spellEnd"/>
-      <w:r>
-        <w:t xml:space="preserve"> </w:t>
-      </w:r>
-    </w:p>
-    <w:p>
-      <w:pPr>
-        <w:pStyle w:val="ListParagraph"/>
-        <w:numPr>
-          <w:ilvl w:val="2"/>
-          <w:numId w:val="1"/>
-        </w:numPr>
-      </w:pPr>
-      <w:r>
-        <w:t xml:space="preserve">A </w:t>
-      </w:r>
-      <w:r>
-        <w:t xml:space="preserve">decimal scale from </w:t>
-      </w:r>
-      <w:r>
-        <w:t xml:space="preserve">1-5 </w:t>
-      </w:r>
-      <w:proofErr w:type="spellStart"/>
-      <w:r>
-        <w:t>ignifying</w:t>
-      </w:r>
-      <w:proofErr w:type="spellEnd"/>
-      <w:r>
-        <w:t xml:space="preserve"> patient satisfaction</w:t>
-      </w:r>
-    </w:p>
-    <w:p>
-      <w:pPr>
-        <w:pStyle w:val="ListParagraph"/>
-        <w:numPr>
-          <w:ilvl w:val="3"/>
-          <w:numId w:val="1"/>
-        </w:numPr>
-      </w:pPr>
-      <w:r>
-        <w:t xml:space="preserve">There </w:t>
-      </w:r>
-      <w:r>
-        <w:t>are</w:t>
-      </w:r>
-      <w:r>
-        <w:t xml:space="preserve"> about 1,000</w:t>
-      </w:r>
-      <w:r>
-        <w:t xml:space="preserve"> appointments with miss</w:t>
-      </w:r>
-      <w:r>
-        <w:t>ing</w:t>
-      </w:r>
-      <w:r>
-        <w:t xml:space="preserve"> satisfaction scores. </w:t>
-      </w:r>
-      <w:r>
-        <w:t xml:space="preserve">Null values will mean patients either canceled or no-show. </w:t>
-      </w:r>
-    </w:p>
-    <w:p>
-      <w:pPr>
-        <w:pStyle w:val="ListParagraph"/>
-        <w:numPr>
-          <w:ilvl w:val="0"/>
-          <w:numId w:val="1"/>
-        </w:numPr>
-      </w:pPr>
-      <w:r>
-        <w:t>Patients</w:t>
-      </w:r>
-    </w:p>
-    <w:p>
-      <w:pPr>
-        <w:pStyle w:val="ListParagraph"/>
-        <w:numPr>
-          <w:ilvl w:val="1"/>
-          <w:numId w:val="1"/>
-        </w:numPr>
-      </w:pPr>
-      <w:proofErr w:type="spellStart"/>
-      <w:r>
-        <w:t>Patient_id</w:t>
-      </w:r>
-      <w:proofErr w:type="spellEnd"/>
-    </w:p>
-    <w:p>
-      <w:pPr>
-        <w:pStyle w:val="ListParagraph"/>
-        <w:numPr>
-          <w:ilvl w:val="2"/>
-          <w:numId w:val="1"/>
-        </w:numPr>
-      </w:pPr>
-      <w:r>
-        <w:t xml:space="preserve">Unique identifier for each patient. </w:t>
-      </w:r>
-    </w:p>
-    <w:p>
-      <w:pPr>
-        <w:pStyle w:val="ListParagraph"/>
-        <w:numPr>
-          <w:ilvl w:val="1"/>
-          <w:numId w:val="1"/>
-        </w:numPr>
-      </w:pPr>
-      <w:proofErr w:type="spellStart"/>
-      <w:r>
-        <w:t>Patient_name</w:t>
-      </w:r>
-      <w:proofErr w:type="spellEnd"/>
-    </w:p>
-    <w:p>
-      <w:pPr>
-        <w:pStyle w:val="ListParagraph"/>
-        <w:numPr>
-          <w:ilvl w:val="2"/>
-          <w:numId w:val="1"/>
-        </w:numPr>
-      </w:pPr>
-      <w:r>
-        <w:t xml:space="preserve">First and last name of patient </w:t>
-      </w:r>
-    </w:p>
-    <w:p>
-      <w:pPr>
-        <w:pStyle w:val="ListParagraph"/>
-        <w:numPr>
-          <w:ilvl w:val="3"/>
-          <w:numId w:val="1"/>
-        </w:numPr>
-      </w:pPr>
-      <w:r>
-        <w:t xml:space="preserve">First and last name are within the same record. I’m wondering if it’s best to do splitting so that first and last name have their own fields.  </w:t>
-      </w:r>
-    </w:p>
-    <w:p>
-      <w:pPr>
-        <w:pStyle w:val="ListParagraph"/>
-        <w:numPr>
-          <w:ilvl w:val="1"/>
-          <w:numId w:val="1"/>
-        </w:numPr>
-      </w:pPr>
-      <w:r>
-        <w:t>Age</w:t>
-      </w:r>
-    </w:p>
-    <w:p>
-      <w:pPr>
-        <w:pStyle w:val="ListParagraph"/>
-        <w:numPr>
-          <w:ilvl w:val="2"/>
-          <w:numId w:val="1"/>
-        </w:numPr>
-      </w:pPr>
-      <w:r>
-        <w:t>Age in years of patient</w:t>
-      </w:r>
-    </w:p>
-    <w:p>
-      <w:pPr>
-        <w:pStyle w:val="ListParagraph"/>
-        <w:numPr>
-          <w:ilvl w:val="1"/>
-          <w:numId w:val="1"/>
-        </w:numPr>
-      </w:pPr>
-      <w:r>
-        <w:t>Gender</w:t>
-      </w:r>
-    </w:p>
-    <w:p>
-      <w:pPr>
-        <w:pStyle w:val="ListParagraph"/>
-        <w:numPr>
-          <w:ilvl w:val="2"/>
-          <w:numId w:val="1"/>
-        </w:numPr>
-      </w:pPr>
-      <w:r>
-        <w:t xml:space="preserve">Biological sex of patient </w:t>
-      </w:r>
-    </w:p>
-    <w:p>
-      <w:pPr>
-        <w:pStyle w:val="ListParagraph"/>
-        <w:numPr>
-          <w:ilvl w:val="1"/>
-          <w:numId w:val="1"/>
-        </w:numPr>
-      </w:pPr>
-      <w:r>
-        <w:t xml:space="preserve">City </w:t>
-      </w:r>
-    </w:p>
-    <w:p>
-      <w:pPr>
-        <w:pStyle w:val="ListParagraph"/>
-        <w:numPr>
-          <w:ilvl w:val="2"/>
-          <w:numId w:val="1"/>
-        </w:numPr>
-      </w:pPr>
-      <w:r>
-        <w:t xml:space="preserve">The city where the patient is from </w:t>
-      </w:r>
-    </w:p>
-    <w:p>
-      <w:pPr>
-        <w:pStyle w:val="ListParagraph"/>
-        <w:numPr>
-          <w:ilvl w:val="0"/>
-          <w:numId w:val="1"/>
-        </w:numPr>
-      </w:pPr>
-      <w:r>
-        <w:t>Providers</w:t>
-      </w:r>
-    </w:p>
-    <w:p>
-      <w:pPr>
-        <w:pStyle w:val="ListParagraph"/>
-        <w:numPr>
-          <w:ilvl w:val="1"/>
-          <w:numId w:val="1"/>
-        </w:numPr>
-      </w:pPr>
-      <w:proofErr w:type="spellStart"/>
-      <w:r>
-        <w:t>Provider_id</w:t>
-      </w:r>
-      <w:proofErr w:type="spellEnd"/>
-    </w:p>
-    <w:p>
-      <w:pPr>
-        <w:pStyle w:val="ListParagraph"/>
-        <w:numPr>
-          <w:ilvl w:val="2"/>
-          <w:numId w:val="1"/>
-        </w:numPr>
-      </w:pPr>
-      <w:r>
-        <w:t xml:space="preserve">Unique identifier for each provider. </w:t>
-      </w:r>
-    </w:p>
-    <w:p>
-      <w:pPr>
-        <w:pStyle w:val="ListParagraph"/>
-        <w:numPr>
-          <w:ilvl w:val="1"/>
-          <w:numId w:val="1"/>
-        </w:numPr>
-      </w:pPr>
-      <w:r>
-        <w:t>Provider_name</w:t>
-      </w:r>
-    </w:p>
-    <w:p>
-      <w:pPr>
-        <w:pStyle w:val="ListParagraph"/>
-        <w:numPr>
-          <w:ilvl w:val="2"/>
-          <w:numId w:val="1"/>
-        </w:numPr>
-      </w:pPr>
-      <w:r>
-        <w:t>First and last name of provider</w:t>
-      </w:r>
-    </w:p>
-    <w:p>
-      <w:pPr>
-        <w:pStyle w:val="ListParagraph"/>
-        <w:numPr>
-          <w:ilvl w:val="3"/>
-          <w:numId w:val="1"/>
-        </w:numPr>
-      </w:pPr>
-      <w:r>
-        <w:t>Jessica Allen (</w:t>
-      </w:r>
-      <w:proofErr w:type="spellStart"/>
-      <w:r>
-        <w:t>provider_id</w:t>
-      </w:r>
-      <w:proofErr w:type="spellEnd"/>
-      <w:r>
-        <w:t xml:space="preserve">: 19) is the only provider with </w:t>
-      </w:r>
-      <w:r>
-        <w:t xml:space="preserve">‘Dr.’ within the </w:t>
-      </w:r>
-      <w:proofErr w:type="spellStart"/>
-      <w:r>
-        <w:t>provider_name</w:t>
-      </w:r>
-      <w:proofErr w:type="spellEnd"/>
-      <w:r>
-        <w:t xml:space="preserve"> field. Should all records have Dr., or </w:t>
-      </w:r>
-      <w:r>
-        <w:lastRenderedPageBreak/>
-        <w:t xml:space="preserve">since she’s the only one, can we just remove </w:t>
+      <w:r>
+        <w:t xml:space="preserve"> field. Should all records have Dr., or since she’s the only one, can we just remove </w:t>
       </w:r>
       <w:r>
         <w:t xml:space="preserve">Dr. from her record. Since they are all providers, it is already assumed that they are doctors. </w:t>
@@ -2455,7 +2553,15 @@
     </w:p>
     <w:p>
       <w:r>
-        <w:t>What questions I need to answer:</w:t>
+        <w:t xml:space="preserve">What questions </w:t>
+      </w:r>
+      <w:proofErr w:type="gramStart"/>
+      <w:r>
+        <w:t>I need</w:t>
+      </w:r>
+      <w:proofErr w:type="gramEnd"/>
+      <w:r>
+        <w:t xml:space="preserve"> to answer:</w:t>
       </w:r>
     </w:p>
     <w:p>
@@ -2479,7 +2585,16 @@
         </w:numPr>
       </w:pPr>
       <w:r>
-        <w:t>Are the complaints coming from all pts in general, or is the</w:t>
+        <w:lastRenderedPageBreak/>
+        <w:t xml:space="preserve">Are the complaints coming from all pts in general, or </w:t>
+      </w:r>
+      <w:proofErr w:type="gramStart"/>
+      <w:r>
+        <w:t>is</w:t>
+      </w:r>
+      <w:proofErr w:type="gramEnd"/>
+      <w:r>
+        <w:t xml:space="preserve"> the</w:t>
       </w:r>
       <w:r>
         <w:t>re</w:t>
@@ -2517,7 +2632,6 @@
         <w:ind w:left="0"/>
       </w:pPr>
       <w:r>
-        <w:lastRenderedPageBreak/>
         <w:t>Tables I’ll need:</w:t>
       </w:r>
     </w:p>
@@ -2826,7 +2940,7 @@
         <w:rFonts w:ascii="Symbol" w:hAnsi="Symbol" w:hint="default"/>
       </w:rPr>
     </w:lvl>
-    <w:lvl w:ilvl="1" w:tplc="04090003" w:tentative="1">
+    <w:lvl w:ilvl="1" w:tplc="04090003">
       <w:start w:val="1"/>
       <w:numFmt w:val="bullet"/>
       <w:lvlText w:val="o"/>

</xml_diff>

<commit_message>
Updated SQL and Project Documentation
</commit_message>
<xml_diff>
--- a/documentation/nicosys-healthcare-portfolio-documentation.docx
+++ b/documentation/nicosys-healthcare-portfolio-documentation.docx
@@ -29,15 +29,7 @@
         </w:numPr>
       </w:pPr>
       <w:r>
-        <w:t xml:space="preserve">What </w:t>
-      </w:r>
-      <w:proofErr w:type="gramStart"/>
-      <w:r>
-        <w:t>is</w:t>
-      </w:r>
-      <w:proofErr w:type="gramEnd"/>
-      <w:r>
-        <w:t xml:space="preserve"> the average and median ER wait time?</w:t>
+        <w:t>What is the average and median ER wait time?</w:t>
       </w:r>
     </w:p>
     <w:p>
@@ -61,15 +53,7 @@
         </w:numPr>
       </w:pPr>
       <w:r>
-        <w:t xml:space="preserve">Median </w:t>
-      </w:r>
-      <w:proofErr w:type="gramStart"/>
-      <w:r>
-        <w:t>wait</w:t>
-      </w:r>
-      <w:proofErr w:type="gramEnd"/>
-      <w:r>
-        <w:t xml:space="preserve"> time is 67 minutes </w:t>
+        <w:t xml:space="preserve">Median wait time is 67 minutes </w:t>
       </w:r>
     </w:p>
     <w:p>
@@ -93,15 +77,7 @@
         </w:numPr>
       </w:pPr>
       <w:r>
-        <w:t xml:space="preserve">Monday, Tuesday, Thursday, and Saturday, </w:t>
-      </w:r>
-      <w:proofErr w:type="gramStart"/>
-      <w:r>
-        <w:t>experience wait times</w:t>
-      </w:r>
-      <w:proofErr w:type="gramEnd"/>
-      <w:r>
-        <w:t xml:space="preserve"> of 180 minutes (3 hours). </w:t>
+        <w:t xml:space="preserve">Monday, Tuesday, Thursday, and Saturday, experience wait times of 180 minutes (3 hours). </w:t>
       </w:r>
     </w:p>
     <w:p>
@@ -120,12 +96,39 @@
       <w:pPr>
         <w:pStyle w:val="ListParagraph"/>
         <w:numPr>
+          <w:ilvl w:val="1"/>
+          <w:numId w:val="6"/>
+        </w:numPr>
+      </w:pPr>
+      <w:r>
+        <w:t xml:space="preserve">The 1 and 10 hour experience the most patient volume at 4 patients. </w:t>
+      </w:r>
+    </w:p>
+    <w:p>
+      <w:pPr>
+        <w:pStyle w:val="ListParagraph"/>
+        <w:numPr>
           <w:ilvl w:val="0"/>
           <w:numId w:val="6"/>
         </w:numPr>
       </w:pPr>
       <w:r>
         <w:t>Does severity level affect wait-time?</w:t>
+      </w:r>
+    </w:p>
+    <w:p>
+      <w:pPr>
+        <w:pStyle w:val="ListParagraph"/>
+        <w:numPr>
+          <w:ilvl w:val="1"/>
+          <w:numId w:val="6"/>
+        </w:numPr>
+      </w:pPr>
+      <w:r>
+        <w:t xml:space="preserve">Yes, the lower the severity level, the longer a patient will wait. </w:t>
+      </w:r>
+      <w:r>
+        <w:t xml:space="preserve">Low severity level patients are 36 times more likely to experience longer wait times exceeding 2 hours than medium severity level patients. </w:t>
       </w:r>
     </w:p>
     <w:p>
@@ -293,15 +296,7 @@
     </w:p>
     <w:p>
       <w:r>
-        <w:t xml:space="preserve">2. Identify the primary and </w:t>
-      </w:r>
-      <w:proofErr w:type="gramStart"/>
-      <w:r>
-        <w:t>Foreign</w:t>
-      </w:r>
-      <w:proofErr w:type="gramEnd"/>
-      <w:r>
-        <w:t xml:space="preserve"> key(s).</w:t>
+        <w:t>2. Identify the primary and Foreign key(s).</w:t>
       </w:r>
     </w:p>
     <w:p>
@@ -563,7 +558,6 @@
       </w:pPr>
       <w:proofErr w:type="spellStart"/>
       <w:r>
-        <w:lastRenderedPageBreak/>
         <w:t>Er</w:t>
       </w:r>
       <w:r>
@@ -597,7 +591,6 @@
       <w:r>
         <w:t xml:space="preserve"> </w:t>
       </w:r>
-      <w:proofErr w:type="gramStart"/>
       <w:r>
         <w:t>patie</w:t>
       </w:r>
@@ -605,11 +598,7 @@
         <w:t>nt</w:t>
       </w:r>
       <w:r>
-        <w:t>s</w:t>
-      </w:r>
-      <w:proofErr w:type="gramEnd"/>
-      <w:r>
-        <w:t xml:space="preserve"> data</w:t>
+        <w:t>s data</w:t>
       </w:r>
       <w:r>
         <w:t>se</w:t>
@@ -915,15 +904,7 @@
         <w:t>imary ke</w:t>
       </w:r>
       <w:r>
-        <w:t xml:space="preserve">y </w:t>
-      </w:r>
-      <w:proofErr w:type="gramStart"/>
-      <w:r>
-        <w:t>to</w:t>
-      </w:r>
-      <w:proofErr w:type="gramEnd"/>
-      <w:r>
-        <w:t xml:space="preserve"> i</w:t>
+        <w:t>y to i</w:t>
       </w:r>
       <w:r>
         <w:t>d</w:t>
@@ -1065,14 +1046,12 @@
       <w:r>
         <w:t xml:space="preserve">the </w:t>
       </w:r>
-      <w:proofErr w:type="gramStart"/>
       <w:r>
         <w:t>pati</w:t>
       </w:r>
       <w:r>
         <w:t>ents</w:t>
       </w:r>
-      <w:proofErr w:type="gramEnd"/>
       <w:r>
         <w:t xml:space="preserve"> da</w:t>
       </w:r>
@@ -1457,11 +1436,9 @@
       <w:r>
         <w:t xml:space="preserve"> </w:t>
       </w:r>
-      <w:proofErr w:type="gramStart"/>
       <w:r>
         <w:t>hour</w:t>
       </w:r>
-      <w:proofErr w:type="gramEnd"/>
       <w:r>
         <w:t>(s)</w:t>
       </w:r>
@@ -1567,11 +1544,7 @@
         <w:t>ay at t</w:t>
       </w:r>
       <w:r>
-        <w:t xml:space="preserve">he </w:t>
-      </w:r>
-      <w:proofErr w:type="gramStart"/>
-      <w:r>
-        <w:t>ho</w:t>
+        <w:t>he ho</w:t>
       </w:r>
       <w:r>
         <w:t>spital</w:t>
@@ -1580,38 +1553,511 @@
         <w:t xml:space="preserve">, </w:t>
       </w:r>
       <w:r>
-        <w:t xml:space="preserve"> or</w:t>
-      </w:r>
-      <w:proofErr w:type="gramEnd"/>
+        <w:t xml:space="preserve"> or </w:t>
+      </w:r>
+      <w:r>
+        <w:t xml:space="preserve">No: </w:t>
+      </w:r>
+      <w:r>
+        <w:t>dis</w:t>
+      </w:r>
+      <w:r>
+        <w:t>cha</w:t>
+      </w:r>
+      <w:r>
+        <w:t>rg</w:t>
+      </w:r>
+      <w:r>
+        <w:t xml:space="preserve">ed </w:t>
+      </w:r>
+      <w:r>
+        <w:t>afte</w:t>
+      </w:r>
+      <w:r>
+        <w:t xml:space="preserve">r being </w:t>
+      </w:r>
+      <w:r>
+        <w:t xml:space="preserve">seen in the </w:t>
+      </w:r>
+      <w:r>
+        <w:t xml:space="preserve">ER. </w:t>
+      </w:r>
+    </w:p>
+    <w:p>
+      <w:pPr>
+        <w:pStyle w:val="ListParagraph"/>
+        <w:numPr>
+          <w:ilvl w:val="0"/>
+          <w:numId w:val="1"/>
+        </w:numPr>
+      </w:pPr>
+      <w:r>
+        <w:t>A</w:t>
+      </w:r>
+      <w:r>
+        <w:t>p</w:t>
+      </w:r>
+      <w:r>
+        <w:t>pointment</w:t>
+      </w:r>
+      <w:r>
+        <w:t>s</w:t>
+      </w:r>
+    </w:p>
+    <w:p>
+      <w:pPr>
+        <w:pStyle w:val="ListParagraph"/>
+        <w:numPr>
+          <w:ilvl w:val="1"/>
+          <w:numId w:val="1"/>
+        </w:numPr>
+      </w:pPr>
+      <w:proofErr w:type="spellStart"/>
+      <w:r>
+        <w:t>A</w:t>
+      </w:r>
+      <w:r>
+        <w:t>pp</w:t>
+      </w:r>
+      <w:r>
+        <w:t>ointment</w:t>
+      </w:r>
+      <w:r>
+        <w:t>_id</w:t>
+      </w:r>
+      <w:proofErr w:type="spellEnd"/>
+    </w:p>
+    <w:p>
+      <w:pPr>
+        <w:pStyle w:val="ListParagraph"/>
+        <w:numPr>
+          <w:ilvl w:val="2"/>
+          <w:numId w:val="1"/>
+        </w:numPr>
+      </w:pPr>
+      <w:r>
+        <w:lastRenderedPageBreak/>
+        <w:t>A number to identify</w:t>
+      </w:r>
+      <w:r>
+        <w:t xml:space="preserve"> each appointment at the </w:t>
+      </w:r>
+      <w:r>
+        <w:t>Valley Regional Medical Center</w:t>
+      </w:r>
+      <w:r>
+        <w:t xml:space="preserve">. </w:t>
+      </w:r>
+    </w:p>
+    <w:p>
+      <w:pPr>
+        <w:pStyle w:val="ListParagraph"/>
+        <w:numPr>
+          <w:ilvl w:val="1"/>
+          <w:numId w:val="1"/>
+        </w:numPr>
+      </w:pPr>
+      <w:proofErr w:type="spellStart"/>
+      <w:r>
+        <w:t>P</w:t>
+      </w:r>
+      <w:r>
+        <w:t>ati</w:t>
+      </w:r>
+      <w:r>
+        <w:t>ent_id</w:t>
+      </w:r>
+      <w:proofErr w:type="spellEnd"/>
+    </w:p>
+    <w:p>
+      <w:pPr>
+        <w:pStyle w:val="ListParagraph"/>
+        <w:numPr>
+          <w:ilvl w:val="2"/>
+          <w:numId w:val="1"/>
+        </w:numPr>
+      </w:pPr>
+      <w:r>
+        <w:t>An id, referencing a specific patient. The details of the p</w:t>
+      </w:r>
+      <w:r>
+        <w:t>atient</w:t>
+      </w:r>
+      <w:r>
+        <w:t xml:space="preserve"> will be found withing the patient dataset. </w:t>
+      </w:r>
+    </w:p>
+    <w:p>
+      <w:pPr>
+        <w:pStyle w:val="ListParagraph"/>
+        <w:numPr>
+          <w:ilvl w:val="1"/>
+          <w:numId w:val="1"/>
+        </w:numPr>
+      </w:pPr>
+      <w:proofErr w:type="spellStart"/>
+      <w:r>
+        <w:t>P</w:t>
+      </w:r>
+      <w:r>
+        <w:t>rovi</w:t>
+      </w:r>
+      <w:r>
+        <w:t>der_id</w:t>
+      </w:r>
+      <w:proofErr w:type="spellEnd"/>
+    </w:p>
+    <w:p>
+      <w:pPr>
+        <w:pStyle w:val="ListParagraph"/>
+        <w:numPr>
+          <w:ilvl w:val="2"/>
+          <w:numId w:val="1"/>
+        </w:numPr>
+      </w:pPr>
+      <w:r>
+        <w:t>An id</w:t>
+      </w:r>
+      <w:r>
+        <w:t>,</w:t>
+      </w:r>
+      <w:r>
+        <w:t xml:space="preserve"> referencing a specific provider. The details of the provider will be found withing the provider dataset. </w:t>
+      </w:r>
+    </w:p>
+    <w:p>
+      <w:pPr>
+        <w:pStyle w:val="ListParagraph"/>
+        <w:numPr>
+          <w:ilvl w:val="1"/>
+          <w:numId w:val="1"/>
+        </w:numPr>
+      </w:pPr>
+      <w:r>
+        <w:t>D</w:t>
+      </w:r>
+      <w:r>
+        <w:t>e</w:t>
+      </w:r>
+      <w:r>
+        <w:t>part</w:t>
+      </w:r>
+      <w:r>
+        <w:t>ment</w:t>
+      </w:r>
+    </w:p>
+    <w:p>
+      <w:pPr>
+        <w:pStyle w:val="ListParagraph"/>
+        <w:numPr>
+          <w:ilvl w:val="2"/>
+          <w:numId w:val="1"/>
+        </w:numPr>
+      </w:pPr>
+      <w:r>
+        <w:t xml:space="preserve">Shows which department the appointment is associated with. </w:t>
+      </w:r>
+    </w:p>
+    <w:p>
+      <w:pPr>
+        <w:pStyle w:val="ListParagraph"/>
+        <w:numPr>
+          <w:ilvl w:val="1"/>
+          <w:numId w:val="1"/>
+        </w:numPr>
+      </w:pPr>
+      <w:proofErr w:type="spellStart"/>
+      <w:r>
+        <w:t>A</w:t>
+      </w:r>
+      <w:r>
+        <w:t>ppo</w:t>
+      </w:r>
+      <w:r>
+        <w:t>intment</w:t>
+      </w:r>
+      <w:r>
+        <w:t>_date</w:t>
+      </w:r>
+      <w:proofErr w:type="spellEnd"/>
+    </w:p>
+    <w:p>
+      <w:pPr>
+        <w:pStyle w:val="ListParagraph"/>
+        <w:numPr>
+          <w:ilvl w:val="2"/>
+          <w:numId w:val="1"/>
+        </w:numPr>
+      </w:pPr>
+      <w:r>
+        <w:t xml:space="preserve">Shows the date of the appointment. </w:t>
+      </w:r>
+    </w:p>
+    <w:p>
+      <w:pPr>
+        <w:pStyle w:val="ListParagraph"/>
+        <w:numPr>
+          <w:ilvl w:val="1"/>
+          <w:numId w:val="1"/>
+        </w:numPr>
+      </w:pPr>
+      <w:proofErr w:type="spellStart"/>
+      <w:r>
+        <w:t>A</w:t>
+      </w:r>
+      <w:r>
+        <w:t>pp</w:t>
+      </w:r>
+      <w:r>
+        <w:t>ointment</w:t>
+      </w:r>
+      <w:r>
+        <w:t>_day</w:t>
+      </w:r>
+      <w:proofErr w:type="spellEnd"/>
+    </w:p>
+    <w:p>
+      <w:pPr>
+        <w:pStyle w:val="ListParagraph"/>
+        <w:numPr>
+          <w:ilvl w:val="2"/>
+          <w:numId w:val="1"/>
+        </w:numPr>
+      </w:pPr>
+      <w:r>
+        <w:t xml:space="preserve">Shows the day of the week the appointment was on. </w:t>
+      </w:r>
+    </w:p>
+    <w:p>
+      <w:pPr>
+        <w:pStyle w:val="ListParagraph"/>
+        <w:numPr>
+          <w:ilvl w:val="1"/>
+          <w:numId w:val="1"/>
+        </w:numPr>
+      </w:pPr>
+      <w:proofErr w:type="spellStart"/>
+      <w:r>
+        <w:t>A</w:t>
+      </w:r>
+      <w:r>
+        <w:t>ppoint</w:t>
+      </w:r>
+      <w:r>
+        <w:t>ment_ty</w:t>
+      </w:r>
+      <w:r>
+        <w:t>pe</w:t>
+      </w:r>
+      <w:proofErr w:type="spellEnd"/>
+    </w:p>
+    <w:p>
+      <w:pPr>
+        <w:pStyle w:val="ListParagraph"/>
+        <w:numPr>
+          <w:ilvl w:val="2"/>
+          <w:numId w:val="1"/>
+        </w:numPr>
+      </w:pPr>
+      <w:r>
+        <w:t xml:space="preserve">Defines the type of appointment </w:t>
+      </w:r>
+    </w:p>
+    <w:p>
+      <w:pPr>
+        <w:pStyle w:val="ListParagraph"/>
+        <w:numPr>
+          <w:ilvl w:val="1"/>
+          <w:numId w:val="1"/>
+        </w:numPr>
+      </w:pPr>
+      <w:proofErr w:type="spellStart"/>
+      <w:r>
+        <w:t>A</w:t>
+      </w:r>
+      <w:r>
+        <w:t>pp</w:t>
+      </w:r>
+      <w:r>
+        <w:t>ointment</w:t>
+      </w:r>
+      <w:r>
+        <w:t>_</w:t>
+      </w:r>
+      <w:r>
+        <w:t>sta</w:t>
+      </w:r>
+      <w:r>
+        <w:t>tus</w:t>
+      </w:r>
+      <w:proofErr w:type="spellEnd"/>
+    </w:p>
+    <w:p>
+      <w:pPr>
+        <w:pStyle w:val="ListParagraph"/>
+        <w:numPr>
+          <w:ilvl w:val="2"/>
+          <w:numId w:val="1"/>
+        </w:numPr>
+      </w:pPr>
+      <w:r>
+        <w:t xml:space="preserve">Defines an appointment as either </w:t>
+      </w:r>
+      <w:r>
+        <w:t>Completed, Cancelled, or no-show</w:t>
+      </w:r>
+    </w:p>
+    <w:p>
+      <w:pPr>
+        <w:pStyle w:val="ListParagraph"/>
+        <w:numPr>
+          <w:ilvl w:val="1"/>
+          <w:numId w:val="1"/>
+        </w:numPr>
+      </w:pPr>
+      <w:proofErr w:type="spellStart"/>
+      <w:r>
+        <w:t>A</w:t>
+      </w:r>
+      <w:r>
+        <w:t>pp</w:t>
+      </w:r>
+      <w:r>
+        <w:t>ointment</w:t>
+      </w:r>
+      <w:r>
+        <w:t>_dura</w:t>
+      </w:r>
+      <w:r>
+        <w:t>tion</w:t>
+      </w:r>
+      <w:r>
+        <w:t>_</w:t>
+      </w:r>
+      <w:r>
+        <w:t>min</w:t>
+      </w:r>
+      <w:r>
+        <w:t>utes</w:t>
+      </w:r>
+      <w:proofErr w:type="spellEnd"/>
+    </w:p>
+    <w:p>
+      <w:pPr>
+        <w:pStyle w:val="ListParagraph"/>
+        <w:numPr>
+          <w:ilvl w:val="2"/>
+          <w:numId w:val="1"/>
+        </w:numPr>
+      </w:pPr>
+      <w:r>
+        <w:t xml:space="preserve">Shows length of time </w:t>
+      </w:r>
+      <w:r>
+        <w:t xml:space="preserve">for the appointment </w:t>
+      </w:r>
+    </w:p>
+    <w:p>
+      <w:pPr>
+        <w:pStyle w:val="ListParagraph"/>
+        <w:numPr>
+          <w:ilvl w:val="1"/>
+          <w:numId w:val="1"/>
+        </w:numPr>
+      </w:pPr>
+      <w:proofErr w:type="spellStart"/>
+      <w:r>
+        <w:t>P</w:t>
+      </w:r>
+      <w:r>
+        <w:t>atient</w:t>
+      </w:r>
+      <w:r>
+        <w:t>_</w:t>
+      </w:r>
+      <w:r>
+        <w:t>s</w:t>
+      </w:r>
+      <w:r>
+        <w:t>a</w:t>
+      </w:r>
+      <w:r>
+        <w:t>tient_</w:t>
+      </w:r>
+      <w:r>
+        <w:t>satis</w:t>
+      </w:r>
+      <w:r>
+        <w:t>factio</w:t>
+      </w:r>
+      <w:r>
+        <w:t>n_</w:t>
+      </w:r>
+      <w:r>
+        <w:t>scor</w:t>
+      </w:r>
+      <w:r>
+        <w:t>e</w:t>
+      </w:r>
+      <w:proofErr w:type="spellEnd"/>
       <w:r>
         <w:t xml:space="preserve"> </w:t>
       </w:r>
-      <w:r>
-        <w:t xml:space="preserve">No: </w:t>
-      </w:r>
-      <w:r>
-        <w:t>dis</w:t>
-      </w:r>
-      <w:r>
-        <w:t>cha</w:t>
-      </w:r>
-      <w:r>
-        <w:t>rg</w:t>
-      </w:r>
-      <w:r>
-        <w:t xml:space="preserve">ed </w:t>
-      </w:r>
-      <w:r>
-        <w:t>afte</w:t>
-      </w:r>
-      <w:r>
-        <w:t xml:space="preserve">r being </w:t>
-      </w:r>
-      <w:r>
-        <w:t xml:space="preserve">seen in the </w:t>
-      </w:r>
-      <w:r>
-        <w:t xml:space="preserve">ER. </w:t>
+    </w:p>
+    <w:p>
+      <w:pPr>
+        <w:pStyle w:val="ListParagraph"/>
+        <w:numPr>
+          <w:ilvl w:val="2"/>
+          <w:numId w:val="1"/>
+        </w:numPr>
+      </w:pPr>
+      <w:r>
+        <w:t xml:space="preserve">A </w:t>
+      </w:r>
+      <w:r>
+        <w:t xml:space="preserve">decimal scale from </w:t>
+      </w:r>
+      <w:r>
+        <w:t xml:space="preserve">1-5 </w:t>
+      </w:r>
+      <w:proofErr w:type="spellStart"/>
+      <w:r>
+        <w:t>ignifying</w:t>
+      </w:r>
+      <w:proofErr w:type="spellEnd"/>
+      <w:r>
+        <w:t xml:space="preserve"> patient satisfaction</w:t>
+      </w:r>
+    </w:p>
+    <w:p>
+      <w:pPr>
+        <w:pStyle w:val="ListParagraph"/>
+        <w:numPr>
+          <w:ilvl w:val="3"/>
+          <w:numId w:val="1"/>
+        </w:numPr>
+      </w:pPr>
+      <w:r>
+        <w:t xml:space="preserve">There </w:t>
+      </w:r>
+      <w:r>
+        <w:t>are</w:t>
+      </w:r>
+      <w:r>
+        <w:t xml:space="preserve"> about 1,000</w:t>
+      </w:r>
+      <w:r>
+        <w:t xml:space="preserve"> appointments with miss</w:t>
+      </w:r>
+      <w:r>
+        <w:t>ing</w:t>
+      </w:r>
+      <w:r>
+        <w:t xml:space="preserve"> satisfaction scores. </w:t>
+      </w:r>
+      <w:r>
+        <w:t xml:space="preserve">Null values will mean patients either canceled or no-show. </w:t>
       </w:r>
     </w:p>
     <w:p>
@@ -1623,16 +2069,7 @@
         </w:numPr>
       </w:pPr>
       <w:r>
-        <w:t>A</w:t>
-      </w:r>
-      <w:r>
-        <w:t>p</w:t>
-      </w:r>
-      <w:r>
-        <w:t>pointment</w:t>
-      </w:r>
-      <w:r>
-        <w:t>s</w:t>
+        <w:t>Patients</w:t>
       </w:r>
     </w:p>
     <w:p>
@@ -1645,16 +2082,7 @@
       </w:pPr>
       <w:proofErr w:type="spellStart"/>
       <w:r>
-        <w:t>A</w:t>
-      </w:r>
-      <w:r>
-        <w:t>pp</w:t>
-      </w:r>
-      <w:r>
-        <w:t>ointment</w:t>
-      </w:r>
-      <w:r>
-        <w:t>_id</w:t>
+        <w:t>Patient_id</w:t>
       </w:r>
       <w:proofErr w:type="spellEnd"/>
     </w:p>
@@ -1667,16 +2095,7 @@
         </w:numPr>
       </w:pPr>
       <w:r>
-        <w:t>A number to identify</w:t>
-      </w:r>
-      <w:r>
-        <w:t xml:space="preserve"> each appointment at the </w:t>
-      </w:r>
-      <w:r>
-        <w:t>Valley Regional Medical Center</w:t>
-      </w:r>
-      <w:r>
-        <w:t xml:space="preserve">. </w:t>
+        <w:t xml:space="preserve">Unique identifier for each patient. </w:t>
       </w:r>
     </w:p>
     <w:p>
@@ -1689,13 +2108,7 @@
       </w:pPr>
       <w:proofErr w:type="spellStart"/>
       <w:r>
-        <w:t>P</w:t>
-      </w:r>
-      <w:r>
-        <w:t>ati</w:t>
-      </w:r>
-      <w:r>
-        <w:t>ent_id</w:t>
+        <w:t>Patient_name</w:t>
       </w:r>
       <w:proofErr w:type="spellEnd"/>
     </w:p>
@@ -1708,14 +2121,104 @@
         </w:numPr>
       </w:pPr>
       <w:r>
+        <w:t xml:space="preserve">First and last name of patient </w:t>
+      </w:r>
+    </w:p>
+    <w:p>
+      <w:pPr>
+        <w:pStyle w:val="ListParagraph"/>
+        <w:numPr>
+          <w:ilvl w:val="3"/>
+          <w:numId w:val="1"/>
+        </w:numPr>
+      </w:pPr>
+      <w:r>
+        <w:t xml:space="preserve">First and last name are within the same record. I’m wondering if it’s best to do splitting so that first and last name have their own fields.  </w:t>
+      </w:r>
+    </w:p>
+    <w:p>
+      <w:pPr>
+        <w:pStyle w:val="ListParagraph"/>
+        <w:numPr>
+          <w:ilvl w:val="1"/>
+          <w:numId w:val="1"/>
+        </w:numPr>
+      </w:pPr>
+      <w:r>
+        <w:t>Age</w:t>
+      </w:r>
+    </w:p>
+    <w:p>
+      <w:pPr>
+        <w:pStyle w:val="ListParagraph"/>
+        <w:numPr>
+          <w:ilvl w:val="2"/>
+          <w:numId w:val="1"/>
+        </w:numPr>
+      </w:pPr>
+      <w:r>
+        <w:t>Age in years of patient</w:t>
+      </w:r>
+    </w:p>
+    <w:p>
+      <w:pPr>
+        <w:pStyle w:val="ListParagraph"/>
+        <w:numPr>
+          <w:ilvl w:val="1"/>
+          <w:numId w:val="1"/>
+        </w:numPr>
+      </w:pPr>
+      <w:r>
+        <w:t>Gender</w:t>
+      </w:r>
+    </w:p>
+    <w:p>
+      <w:pPr>
+        <w:pStyle w:val="ListParagraph"/>
+        <w:numPr>
+          <w:ilvl w:val="2"/>
+          <w:numId w:val="1"/>
+        </w:numPr>
+      </w:pPr>
+      <w:r>
+        <w:t xml:space="preserve">Biological sex of patient </w:t>
+      </w:r>
+    </w:p>
+    <w:p>
+      <w:pPr>
+        <w:pStyle w:val="ListParagraph"/>
+        <w:numPr>
+          <w:ilvl w:val="1"/>
+          <w:numId w:val="1"/>
+        </w:numPr>
+      </w:pPr>
+      <w:r>
+        <w:t xml:space="preserve">City </w:t>
+      </w:r>
+    </w:p>
+    <w:p>
+      <w:pPr>
+        <w:pStyle w:val="ListParagraph"/>
+        <w:numPr>
+          <w:ilvl w:val="2"/>
+          <w:numId w:val="1"/>
+        </w:numPr>
+      </w:pPr>
+      <w:r>
         <w:lastRenderedPageBreak/>
-        <w:t>An id, referencing a specific patient. The details of the p</w:t>
-      </w:r>
-      <w:r>
-        <w:t>atient</w:t>
-      </w:r>
-      <w:r>
-        <w:t xml:space="preserve"> will be found withing the patient dataset. </w:t>
+        <w:t xml:space="preserve">The city where the patient is from </w:t>
+      </w:r>
+    </w:p>
+    <w:p>
+      <w:pPr>
+        <w:pStyle w:val="ListParagraph"/>
+        <w:numPr>
+          <w:ilvl w:val="0"/>
+          <w:numId w:val="1"/>
+        </w:numPr>
+      </w:pPr>
+      <w:r>
+        <w:t>Providers</w:t>
       </w:r>
     </w:p>
     <w:p>
@@ -1728,13 +2231,7 @@
       </w:pPr>
       <w:proofErr w:type="spellStart"/>
       <w:r>
-        <w:t>P</w:t>
-      </w:r>
-      <w:r>
-        <w:t>rovi</w:t>
-      </w:r>
-      <w:r>
-        <w:t>der_id</w:t>
+        <w:t>Provider_id</w:t>
       </w:r>
       <w:proofErr w:type="spellEnd"/>
     </w:p>
@@ -1747,542 +2244,6 @@
         </w:numPr>
       </w:pPr>
       <w:r>
-        <w:t>An id</w:t>
-      </w:r>
-      <w:r>
-        <w:t>,</w:t>
-      </w:r>
-      <w:r>
-        <w:t xml:space="preserve"> referencing a specific provider. The details of the provider will be found withing the provider dataset. </w:t>
-      </w:r>
-    </w:p>
-    <w:p>
-      <w:pPr>
-        <w:pStyle w:val="ListParagraph"/>
-        <w:numPr>
-          <w:ilvl w:val="1"/>
-          <w:numId w:val="1"/>
-        </w:numPr>
-      </w:pPr>
-      <w:r>
-        <w:t>D</w:t>
-      </w:r>
-      <w:r>
-        <w:t>e</w:t>
-      </w:r>
-      <w:r>
-        <w:t>part</w:t>
-      </w:r>
-      <w:r>
-        <w:t>ment</w:t>
-      </w:r>
-    </w:p>
-    <w:p>
-      <w:pPr>
-        <w:pStyle w:val="ListParagraph"/>
-        <w:numPr>
-          <w:ilvl w:val="2"/>
-          <w:numId w:val="1"/>
-        </w:numPr>
-      </w:pPr>
-      <w:r>
-        <w:t xml:space="preserve">Shows which department the appointment is associated with. </w:t>
-      </w:r>
-    </w:p>
-    <w:p>
-      <w:pPr>
-        <w:pStyle w:val="ListParagraph"/>
-        <w:numPr>
-          <w:ilvl w:val="1"/>
-          <w:numId w:val="1"/>
-        </w:numPr>
-      </w:pPr>
-      <w:proofErr w:type="spellStart"/>
-      <w:r>
-        <w:t>A</w:t>
-      </w:r>
-      <w:r>
-        <w:t>ppo</w:t>
-      </w:r>
-      <w:r>
-        <w:t>intment</w:t>
-      </w:r>
-      <w:r>
-        <w:t>_date</w:t>
-      </w:r>
-      <w:proofErr w:type="spellEnd"/>
-    </w:p>
-    <w:p>
-      <w:pPr>
-        <w:pStyle w:val="ListParagraph"/>
-        <w:numPr>
-          <w:ilvl w:val="2"/>
-          <w:numId w:val="1"/>
-        </w:numPr>
-      </w:pPr>
-      <w:r>
-        <w:t xml:space="preserve">Shows the date of the appointment. </w:t>
-      </w:r>
-    </w:p>
-    <w:p>
-      <w:pPr>
-        <w:pStyle w:val="ListParagraph"/>
-        <w:numPr>
-          <w:ilvl w:val="1"/>
-          <w:numId w:val="1"/>
-        </w:numPr>
-      </w:pPr>
-      <w:proofErr w:type="spellStart"/>
-      <w:r>
-        <w:t>A</w:t>
-      </w:r>
-      <w:r>
-        <w:t>pp</w:t>
-      </w:r>
-      <w:r>
-        <w:t>ointment</w:t>
-      </w:r>
-      <w:r>
-        <w:t>_day</w:t>
-      </w:r>
-      <w:proofErr w:type="spellEnd"/>
-    </w:p>
-    <w:p>
-      <w:pPr>
-        <w:pStyle w:val="ListParagraph"/>
-        <w:numPr>
-          <w:ilvl w:val="2"/>
-          <w:numId w:val="1"/>
-        </w:numPr>
-      </w:pPr>
-      <w:r>
-        <w:t xml:space="preserve">Shows the day of the week the appointment was on. </w:t>
-      </w:r>
-    </w:p>
-    <w:p>
-      <w:pPr>
-        <w:pStyle w:val="ListParagraph"/>
-        <w:numPr>
-          <w:ilvl w:val="1"/>
-          <w:numId w:val="1"/>
-        </w:numPr>
-      </w:pPr>
-      <w:proofErr w:type="spellStart"/>
-      <w:r>
-        <w:t>A</w:t>
-      </w:r>
-      <w:r>
-        <w:t>ppoint</w:t>
-      </w:r>
-      <w:r>
-        <w:t>ment_ty</w:t>
-      </w:r>
-      <w:r>
-        <w:t>pe</w:t>
-      </w:r>
-      <w:proofErr w:type="spellEnd"/>
-    </w:p>
-    <w:p>
-      <w:pPr>
-        <w:pStyle w:val="ListParagraph"/>
-        <w:numPr>
-          <w:ilvl w:val="2"/>
-          <w:numId w:val="1"/>
-        </w:numPr>
-      </w:pPr>
-      <w:r>
-        <w:t xml:space="preserve">Defines the type of appointment </w:t>
-      </w:r>
-    </w:p>
-    <w:p>
-      <w:pPr>
-        <w:pStyle w:val="ListParagraph"/>
-        <w:numPr>
-          <w:ilvl w:val="1"/>
-          <w:numId w:val="1"/>
-        </w:numPr>
-      </w:pPr>
-      <w:proofErr w:type="spellStart"/>
-      <w:r>
-        <w:t>A</w:t>
-      </w:r>
-      <w:r>
-        <w:t>pp</w:t>
-      </w:r>
-      <w:r>
-        <w:t>ointment</w:t>
-      </w:r>
-      <w:r>
-        <w:t>_</w:t>
-      </w:r>
-      <w:r>
-        <w:t>sta</w:t>
-      </w:r>
-      <w:r>
-        <w:t>tus</w:t>
-      </w:r>
-      <w:proofErr w:type="spellEnd"/>
-    </w:p>
-    <w:p>
-      <w:pPr>
-        <w:pStyle w:val="ListParagraph"/>
-        <w:numPr>
-          <w:ilvl w:val="2"/>
-          <w:numId w:val="1"/>
-        </w:numPr>
-      </w:pPr>
-      <w:r>
-        <w:t xml:space="preserve">Defines an appointment as either </w:t>
-      </w:r>
-      <w:r>
-        <w:t>Completed, Cancelled, or no-show</w:t>
-      </w:r>
-    </w:p>
-    <w:p>
-      <w:pPr>
-        <w:pStyle w:val="ListParagraph"/>
-        <w:numPr>
-          <w:ilvl w:val="1"/>
-          <w:numId w:val="1"/>
-        </w:numPr>
-      </w:pPr>
-      <w:proofErr w:type="spellStart"/>
-      <w:r>
-        <w:t>A</w:t>
-      </w:r>
-      <w:r>
-        <w:t>pp</w:t>
-      </w:r>
-      <w:r>
-        <w:t>ointment</w:t>
-      </w:r>
-      <w:r>
-        <w:t>_dura</w:t>
-      </w:r>
-      <w:r>
-        <w:t>tion</w:t>
-      </w:r>
-      <w:r>
-        <w:t>_</w:t>
-      </w:r>
-      <w:r>
-        <w:t>min</w:t>
-      </w:r>
-      <w:r>
-        <w:t>utes</w:t>
-      </w:r>
-      <w:proofErr w:type="spellEnd"/>
-    </w:p>
-    <w:p>
-      <w:pPr>
-        <w:pStyle w:val="ListParagraph"/>
-        <w:numPr>
-          <w:ilvl w:val="2"/>
-          <w:numId w:val="1"/>
-        </w:numPr>
-      </w:pPr>
-      <w:r>
-        <w:t xml:space="preserve">Shows length of time </w:t>
-      </w:r>
-      <w:r>
-        <w:t xml:space="preserve">for the appointment </w:t>
-      </w:r>
-    </w:p>
-    <w:p>
-      <w:pPr>
-        <w:pStyle w:val="ListParagraph"/>
-        <w:numPr>
-          <w:ilvl w:val="1"/>
-          <w:numId w:val="1"/>
-        </w:numPr>
-      </w:pPr>
-      <w:proofErr w:type="spellStart"/>
-      <w:r>
-        <w:t>P</w:t>
-      </w:r>
-      <w:r>
-        <w:t>atient</w:t>
-      </w:r>
-      <w:r>
-        <w:t>_</w:t>
-      </w:r>
-      <w:r>
-        <w:t>s</w:t>
-      </w:r>
-      <w:r>
-        <w:t>a</w:t>
-      </w:r>
-      <w:r>
-        <w:t>tient_</w:t>
-      </w:r>
-      <w:r>
-        <w:t>satis</w:t>
-      </w:r>
-      <w:r>
-        <w:t>factio</w:t>
-      </w:r>
-      <w:r>
-        <w:t>n_</w:t>
-      </w:r>
-      <w:r>
-        <w:t>scor</w:t>
-      </w:r>
-      <w:r>
-        <w:t>e</w:t>
-      </w:r>
-      <w:proofErr w:type="spellEnd"/>
-      <w:r>
-        <w:t xml:space="preserve"> </w:t>
-      </w:r>
-    </w:p>
-    <w:p>
-      <w:pPr>
-        <w:pStyle w:val="ListParagraph"/>
-        <w:numPr>
-          <w:ilvl w:val="2"/>
-          <w:numId w:val="1"/>
-        </w:numPr>
-      </w:pPr>
-      <w:r>
-        <w:t xml:space="preserve">A </w:t>
-      </w:r>
-      <w:r>
-        <w:t xml:space="preserve">decimal scale from </w:t>
-      </w:r>
-      <w:r>
-        <w:t xml:space="preserve">1-5 </w:t>
-      </w:r>
-      <w:proofErr w:type="spellStart"/>
-      <w:r>
-        <w:t>ignifying</w:t>
-      </w:r>
-      <w:proofErr w:type="spellEnd"/>
-      <w:r>
-        <w:t xml:space="preserve"> patient satisfaction</w:t>
-      </w:r>
-    </w:p>
-    <w:p>
-      <w:pPr>
-        <w:pStyle w:val="ListParagraph"/>
-        <w:numPr>
-          <w:ilvl w:val="3"/>
-          <w:numId w:val="1"/>
-        </w:numPr>
-      </w:pPr>
-      <w:r>
-        <w:t xml:space="preserve">There </w:t>
-      </w:r>
-      <w:r>
-        <w:t>are</w:t>
-      </w:r>
-      <w:r>
-        <w:t xml:space="preserve"> about 1,000</w:t>
-      </w:r>
-      <w:r>
-        <w:t xml:space="preserve"> appointments with miss</w:t>
-      </w:r>
-      <w:r>
-        <w:t>ing</w:t>
-      </w:r>
-      <w:r>
-        <w:t xml:space="preserve"> satisfaction scores. </w:t>
-      </w:r>
-      <w:r>
-        <w:t xml:space="preserve">Null values will mean patients </w:t>
-      </w:r>
-      <w:proofErr w:type="gramStart"/>
-      <w:r>
-        <w:t>either</w:t>
-      </w:r>
-      <w:proofErr w:type="gramEnd"/>
-      <w:r>
-        <w:t xml:space="preserve"> canceled or no-show. </w:t>
-      </w:r>
-    </w:p>
-    <w:p>
-      <w:pPr>
-        <w:pStyle w:val="ListParagraph"/>
-        <w:numPr>
-          <w:ilvl w:val="0"/>
-          <w:numId w:val="1"/>
-        </w:numPr>
-      </w:pPr>
-      <w:r>
-        <w:t>Patients</w:t>
-      </w:r>
-    </w:p>
-    <w:p>
-      <w:pPr>
-        <w:pStyle w:val="ListParagraph"/>
-        <w:numPr>
-          <w:ilvl w:val="1"/>
-          <w:numId w:val="1"/>
-        </w:numPr>
-      </w:pPr>
-      <w:proofErr w:type="spellStart"/>
-      <w:r>
-        <w:t>Patient_id</w:t>
-      </w:r>
-      <w:proofErr w:type="spellEnd"/>
-    </w:p>
-    <w:p>
-      <w:pPr>
-        <w:pStyle w:val="ListParagraph"/>
-        <w:numPr>
-          <w:ilvl w:val="2"/>
-          <w:numId w:val="1"/>
-        </w:numPr>
-      </w:pPr>
-      <w:r>
-        <w:t xml:space="preserve">Unique identifier for each patient. </w:t>
-      </w:r>
-    </w:p>
-    <w:p>
-      <w:pPr>
-        <w:pStyle w:val="ListParagraph"/>
-        <w:numPr>
-          <w:ilvl w:val="1"/>
-          <w:numId w:val="1"/>
-        </w:numPr>
-      </w:pPr>
-      <w:proofErr w:type="spellStart"/>
-      <w:r>
-        <w:t>Patient_name</w:t>
-      </w:r>
-      <w:proofErr w:type="spellEnd"/>
-    </w:p>
-    <w:p>
-      <w:pPr>
-        <w:pStyle w:val="ListParagraph"/>
-        <w:numPr>
-          <w:ilvl w:val="2"/>
-          <w:numId w:val="1"/>
-        </w:numPr>
-      </w:pPr>
-      <w:r>
-        <w:t xml:space="preserve">First and last name of patient </w:t>
-      </w:r>
-    </w:p>
-    <w:p>
-      <w:pPr>
-        <w:pStyle w:val="ListParagraph"/>
-        <w:numPr>
-          <w:ilvl w:val="3"/>
-          <w:numId w:val="1"/>
-        </w:numPr>
-      </w:pPr>
-      <w:r>
-        <w:t xml:space="preserve">First and last name are within the same record. I’m wondering if it’s best to do splitting so that first and last name have their own fields.  </w:t>
-      </w:r>
-    </w:p>
-    <w:p>
-      <w:pPr>
-        <w:pStyle w:val="ListParagraph"/>
-        <w:numPr>
-          <w:ilvl w:val="1"/>
-          <w:numId w:val="1"/>
-        </w:numPr>
-      </w:pPr>
-      <w:r>
-        <w:t>Age</w:t>
-      </w:r>
-    </w:p>
-    <w:p>
-      <w:pPr>
-        <w:pStyle w:val="ListParagraph"/>
-        <w:numPr>
-          <w:ilvl w:val="2"/>
-          <w:numId w:val="1"/>
-        </w:numPr>
-      </w:pPr>
-      <w:r>
-        <w:t>Age in years of patient</w:t>
-      </w:r>
-    </w:p>
-    <w:p>
-      <w:pPr>
-        <w:pStyle w:val="ListParagraph"/>
-        <w:numPr>
-          <w:ilvl w:val="1"/>
-          <w:numId w:val="1"/>
-        </w:numPr>
-      </w:pPr>
-      <w:r>
-        <w:t>Gender</w:t>
-      </w:r>
-    </w:p>
-    <w:p>
-      <w:pPr>
-        <w:pStyle w:val="ListParagraph"/>
-        <w:numPr>
-          <w:ilvl w:val="2"/>
-          <w:numId w:val="1"/>
-        </w:numPr>
-      </w:pPr>
-      <w:r>
-        <w:t xml:space="preserve">Biological sex of patient </w:t>
-      </w:r>
-    </w:p>
-    <w:p>
-      <w:pPr>
-        <w:pStyle w:val="ListParagraph"/>
-        <w:numPr>
-          <w:ilvl w:val="1"/>
-          <w:numId w:val="1"/>
-        </w:numPr>
-      </w:pPr>
-      <w:r>
-        <w:t xml:space="preserve">City </w:t>
-      </w:r>
-    </w:p>
-    <w:p>
-      <w:pPr>
-        <w:pStyle w:val="ListParagraph"/>
-        <w:numPr>
-          <w:ilvl w:val="2"/>
-          <w:numId w:val="1"/>
-        </w:numPr>
-      </w:pPr>
-      <w:r>
-        <w:t xml:space="preserve">The city where the patient is from </w:t>
-      </w:r>
-    </w:p>
-    <w:p>
-      <w:pPr>
-        <w:pStyle w:val="ListParagraph"/>
-        <w:numPr>
-          <w:ilvl w:val="0"/>
-          <w:numId w:val="1"/>
-        </w:numPr>
-      </w:pPr>
-      <w:r>
-        <w:t>Providers</w:t>
-      </w:r>
-    </w:p>
-    <w:p>
-      <w:pPr>
-        <w:pStyle w:val="ListParagraph"/>
-        <w:numPr>
-          <w:ilvl w:val="1"/>
-          <w:numId w:val="1"/>
-        </w:numPr>
-      </w:pPr>
-      <w:proofErr w:type="spellStart"/>
-      <w:r>
-        <w:t>Provider_id</w:t>
-      </w:r>
-      <w:proofErr w:type="spellEnd"/>
-    </w:p>
-    <w:p>
-      <w:pPr>
-        <w:pStyle w:val="ListParagraph"/>
-        <w:numPr>
-          <w:ilvl w:val="2"/>
-          <w:numId w:val="1"/>
-        </w:numPr>
-      </w:pPr>
-      <w:r>
-        <w:lastRenderedPageBreak/>
         <w:t xml:space="preserve">Unique identifier for each provider. </w:t>
       </w:r>
     </w:p>
@@ -2553,15 +2514,8 @@
     </w:p>
     <w:p>
       <w:r>
-        <w:t xml:space="preserve">What questions </w:t>
-      </w:r>
-      <w:proofErr w:type="gramStart"/>
-      <w:r>
-        <w:t>I need</w:t>
-      </w:r>
-      <w:proofErr w:type="gramEnd"/>
-      <w:r>
-        <w:t xml:space="preserve"> to answer:</w:t>
+        <w:lastRenderedPageBreak/>
+        <w:t>What questions I need to answer:</w:t>
       </w:r>
     </w:p>
     <w:p>
@@ -2585,16 +2539,7 @@
         </w:numPr>
       </w:pPr>
       <w:r>
-        <w:lastRenderedPageBreak/>
-        <w:t xml:space="preserve">Are the complaints coming from all pts in general, or </w:t>
-      </w:r>
-      <w:proofErr w:type="gramStart"/>
-      <w:r>
-        <w:t>is</w:t>
-      </w:r>
-      <w:proofErr w:type="gramEnd"/>
-      <w:r>
-        <w:t xml:space="preserve"> the</w:t>
+        <w:t>Are the complaints coming from all pts in general, or is the</w:t>
       </w:r>
       <w:r>
         <w:t>re</w:t>
@@ -2796,7 +2741,11 @@
     </w:p>
     <w:p>
       <w:r>
-        <w:t xml:space="preserve">These four datasets form a valid relational model centered around patients. Primary keys are unique, foreign key relationships are intact, and no duplicate records were identified. The only mission values occur in patient satisfaction scores for canceled and no-show appointments and will remain NULL. One provider-name formatting inconsistency will be standardized. The ER dataset is suitable for exploratory analysis of wait times, patient volume, severity, admission status, and ED length of stay. </w:t>
+        <w:t xml:space="preserve">These four datasets form a valid relational model centered around patients. Primary keys are unique, foreign key relationships are intact, and no duplicate records were identified. The only mission values occur in patient satisfaction scores for canceled and no-show appointments and will remain NULL. One provider-name formatting inconsistency will be </w:t>
+      </w:r>
+      <w:r>
+        <w:lastRenderedPageBreak/>
+        <w:t xml:space="preserve">standardized. The ER dataset is suitable for exploratory analysis of wait times, patient volume, severity, admission status, and ED length of stay. </w:t>
       </w:r>
     </w:p>
     <w:sectPr>

</xml_diff>

<commit_message>
Udated SQL and Documentation phase 2 complete
</commit_message>
<xml_diff>
--- a/documentation/nicosys-healthcare-portfolio-documentation.docx
+++ b/documentation/nicosys-healthcare-portfolio-documentation.docx
@@ -128,7 +128,16 @@
         <w:t xml:space="preserve">Yes, the lower the severity level, the longer a patient will wait. </w:t>
       </w:r>
       <w:r>
-        <w:t xml:space="preserve">Low severity level patients are 36 times more likely to experience longer wait times exceeding 2 hours than medium severity level patients. </w:t>
+        <w:t>Low severity level patients are 36 times more likely to experience longer wait times exceeding 2 hours</w:t>
+      </w:r>
+      <w:r>
+        <w:t xml:space="preserve">, </w:t>
+      </w:r>
+      <w:r>
+        <w:t xml:space="preserve">than medium severity level patients. </w:t>
+      </w:r>
+      <w:r>
+        <w:t xml:space="preserve">Also High severity level patients never get seen past 1 hour, and Critical severity level patients get seen between 1-15 minutes. </w:t>
       </w:r>
     </w:p>
     <w:p>
@@ -147,6 +156,18 @@
       <w:pPr>
         <w:pStyle w:val="ListParagraph"/>
         <w:numPr>
+          <w:ilvl w:val="1"/>
+          <w:numId w:val="6"/>
+        </w:numPr>
+      </w:pPr>
+      <w:r>
+        <w:t xml:space="preserve">Yes, but not by much. Admitted patients wait an average of 76 minutes while discharged patients wait an average of 73 minutes. </w:t>
+      </w:r>
+    </w:p>
+    <w:p>
+      <w:pPr>
+        <w:pStyle w:val="ListParagraph"/>
+        <w:numPr>
           <w:ilvl w:val="0"/>
           <w:numId w:val="6"/>
         </w:numPr>
@@ -157,17 +178,79 @@
     </w:p>
     <w:p>
       <w:pPr>
+        <w:pStyle w:val="ListParagraph"/>
+        <w:numPr>
+          <w:ilvl w:val="1"/>
+          <w:numId w:val="6"/>
+        </w:numPr>
         <w:rPr>
           <w:u w:val="single"/>
         </w:rPr>
       </w:pPr>
-    </w:p>
-    <w:p>
-      <w:pPr>
+      <w:r>
+        <w:t xml:space="preserve">The days </w:t>
+      </w:r>
+      <w:r>
+        <w:t xml:space="preserve">experiencing the longest wait times </w:t>
+      </w:r>
+      <w:r>
+        <w:t>and hours experiencing</w:t>
+      </w:r>
+      <w:r>
+        <w:t xml:space="preserve"> the highest patient volumes </w:t>
+      </w:r>
+      <w:r>
+        <w:t>are composed of Low and Medium severity patients.</w:t>
+      </w:r>
+      <w:r>
+        <w:t xml:space="preserve"> </w:t>
+      </w:r>
+      <w:r>
+        <w:t>The average length of stay for these patients is 7 hours.</w:t>
+      </w:r>
+      <w:r>
+        <w:t xml:space="preserve"> There may not be enough staff to see all the patients at those days/times</w:t>
+      </w:r>
+      <w:r>
+        <w:t>.</w:t>
+      </w:r>
+    </w:p>
+    <w:p>
+      <w:pPr>
+        <w:pStyle w:val="ListParagraph"/>
+        <w:ind w:left="1440"/>
         <w:rPr>
           <w:u w:val="single"/>
         </w:rPr>
       </w:pPr>
+    </w:p>
+    <w:p>
+      <w:pPr>
+        <w:pStyle w:val="ListParagraph"/>
+        <w:ind w:left="1440"/>
+        <w:rPr>
+          <w:u w:val="single"/>
+        </w:rPr>
+      </w:pPr>
+    </w:p>
+    <w:p>
+      <w:pPr>
+        <w:pStyle w:val="ListParagraph"/>
+        <w:ind w:left="1440"/>
+        <w:rPr>
+          <w:u w:val="single"/>
+        </w:rPr>
+      </w:pPr>
+    </w:p>
+    <w:p>
+      <w:pPr>
+        <w:rPr>
+          <w:u w:val="single"/>
+        </w:rPr>
+      </w:pPr>
+      <w:r>
+        <w:t xml:space="preserve"> </w:t>
+      </w:r>
       <w:r>
         <w:rPr>
           <w:u w:val="single"/>
@@ -307,13 +390,8 @@
           <w:numId w:val="4"/>
         </w:numPr>
       </w:pPr>
-      <w:proofErr w:type="spellStart"/>
-      <w:r>
-        <w:t>Er_visits</w:t>
-      </w:r>
-      <w:proofErr w:type="spellEnd"/>
-      <w:r>
-        <w:t>:</w:t>
+      <w:r>
+        <w:t>Er_visits:</w:t>
       </w:r>
     </w:p>
     <w:p>
@@ -324,13 +402,8 @@
           <w:numId w:val="4"/>
         </w:numPr>
       </w:pPr>
-      <w:proofErr w:type="spellStart"/>
-      <w:r>
-        <w:t>Visit_id</w:t>
-      </w:r>
-      <w:proofErr w:type="spellEnd"/>
-      <w:r>
-        <w:t xml:space="preserve"> (PK)</w:t>
+      <w:r>
+        <w:t>Visit_id (PK)</w:t>
       </w:r>
     </w:p>
     <w:p>
@@ -341,13 +414,9 @@
           <w:numId w:val="4"/>
         </w:numPr>
       </w:pPr>
-      <w:proofErr w:type="spellStart"/>
-      <w:r>
-        <w:t>Patient_id</w:t>
-      </w:r>
-      <w:proofErr w:type="spellEnd"/>
-      <w:r>
-        <w:t xml:space="preserve"> (FK)</w:t>
+      <w:r>
+        <w:lastRenderedPageBreak/>
+        <w:t>Patient_id (FK)</w:t>
       </w:r>
     </w:p>
     <w:p>
@@ -373,13 +442,8 @@
           <w:numId w:val="4"/>
         </w:numPr>
       </w:pPr>
-      <w:proofErr w:type="spellStart"/>
-      <w:r>
-        <w:t>Appointment_id</w:t>
-      </w:r>
-      <w:proofErr w:type="spellEnd"/>
-      <w:r>
-        <w:t xml:space="preserve"> (PK)</w:t>
+      <w:r>
+        <w:t>Appointment_id (PK)</w:t>
       </w:r>
     </w:p>
     <w:p>
@@ -390,13 +454,8 @@
           <w:numId w:val="4"/>
         </w:numPr>
       </w:pPr>
-      <w:proofErr w:type="spellStart"/>
-      <w:r>
-        <w:t>Patient_id</w:t>
-      </w:r>
-      <w:proofErr w:type="spellEnd"/>
-      <w:r>
-        <w:t xml:space="preserve"> (FK)</w:t>
+      <w:r>
+        <w:t>Patient_id (FK)</w:t>
       </w:r>
     </w:p>
     <w:p>
@@ -407,13 +466,8 @@
           <w:numId w:val="4"/>
         </w:numPr>
       </w:pPr>
-      <w:proofErr w:type="spellStart"/>
-      <w:r>
-        <w:t>Provider_id</w:t>
-      </w:r>
-      <w:proofErr w:type="spellEnd"/>
-      <w:r>
-        <w:t xml:space="preserve"> (FK</w:t>
+      <w:r>
+        <w:t>Provider_id (FK</w:t>
       </w:r>
       <w:r>
         <w:t>)</w:t>
@@ -451,7 +505,6 @@
           <w:numId w:val="4"/>
         </w:numPr>
       </w:pPr>
-      <w:proofErr w:type="spellStart"/>
       <w:r>
         <w:t>P</w:t>
       </w:r>
@@ -462,11 +515,7 @@
         <w:t>tient_</w:t>
       </w:r>
       <w:r>
-        <w:t>id</w:t>
-      </w:r>
-      <w:proofErr w:type="spellEnd"/>
-      <w:r>
-        <w:t xml:space="preserve"> </w:t>
+        <w:t xml:space="preserve">id </w:t>
       </w:r>
       <w:r>
         <w:t>(</w:t>
@@ -507,7 +556,6 @@
           <w:numId w:val="4"/>
         </w:numPr>
       </w:pPr>
-      <w:proofErr w:type="spellStart"/>
       <w:r>
         <w:t>P</w:t>
       </w:r>
@@ -518,11 +566,7 @@
         <w:t>ider</w:t>
       </w:r>
       <w:r>
-        <w:t>_id</w:t>
-      </w:r>
-      <w:proofErr w:type="spellEnd"/>
-      <w:r>
-        <w:t xml:space="preserve"> </w:t>
+        <w:t xml:space="preserve">_id </w:t>
       </w:r>
       <w:r>
         <w:t>(</w:t>
@@ -556,7 +600,6 @@
           <w:numId w:val="3"/>
         </w:numPr>
       </w:pPr>
-      <w:proofErr w:type="spellStart"/>
       <w:r>
         <w:t>Er</w:t>
       </w:r>
@@ -567,11 +610,7 @@
         <w:t>vi</w:t>
       </w:r>
       <w:r>
-        <w:t>sits</w:t>
-      </w:r>
-      <w:proofErr w:type="spellEnd"/>
-      <w:r>
-        <w:t xml:space="preserve"> </w:t>
+        <w:t xml:space="preserve">sits </w:t>
       </w:r>
       <w:r>
         <w:t>dat</w:t>
@@ -842,7 +881,6 @@
           <w:numId w:val="1"/>
         </w:numPr>
       </w:pPr>
-      <w:proofErr w:type="spellStart"/>
       <w:r>
         <w:t>E</w:t>
       </w:r>
@@ -856,11 +894,7 @@
         <w:t>vis</w:t>
       </w:r>
       <w:r>
-        <w:t>its</w:t>
-      </w:r>
-      <w:proofErr w:type="spellEnd"/>
-      <w:r>
-        <w:t>:</w:t>
+        <w:t>its:</w:t>
       </w:r>
     </w:p>
     <w:p>
@@ -871,7 +905,6 @@
           <w:numId w:val="1"/>
         </w:numPr>
       </w:pPr>
-      <w:proofErr w:type="spellStart"/>
       <w:r>
         <w:t>V</w:t>
       </w:r>
@@ -881,7 +914,6 @@
       <w:r>
         <w:t>sit_id</w:t>
       </w:r>
-      <w:proofErr w:type="spellEnd"/>
     </w:p>
     <w:p>
       <w:pPr>
@@ -942,7 +974,6 @@
           <w:numId w:val="1"/>
         </w:numPr>
       </w:pPr>
-      <w:proofErr w:type="spellStart"/>
       <w:r>
         <w:t>P</w:t>
       </w:r>
@@ -955,7 +986,6 @@
       <w:r>
         <w:t>_id</w:t>
       </w:r>
-      <w:proofErr w:type="spellEnd"/>
     </w:p>
     <w:p>
       <w:pPr>
@@ -1070,7 +1100,6 @@
           <w:numId w:val="1"/>
         </w:numPr>
       </w:pPr>
-      <w:proofErr w:type="spellStart"/>
       <w:r>
         <w:t>A</w:t>
       </w:r>
@@ -1083,7 +1112,6 @@
       <w:r>
         <w:t>date</w:t>
       </w:r>
-      <w:proofErr w:type="spellEnd"/>
     </w:p>
     <w:p>
       <w:pPr>
@@ -1126,7 +1154,6 @@
           <w:numId w:val="1"/>
         </w:numPr>
       </w:pPr>
-      <w:proofErr w:type="spellStart"/>
       <w:r>
         <w:t>Arrival</w:t>
       </w:r>
@@ -1136,7 +1163,6 @@
       <w:r>
         <w:t>day</w:t>
       </w:r>
-      <w:proofErr w:type="spellEnd"/>
     </w:p>
     <w:p>
       <w:pPr>
@@ -1182,7 +1208,6 @@
           <w:numId w:val="1"/>
         </w:numPr>
       </w:pPr>
-      <w:proofErr w:type="spellStart"/>
       <w:r>
         <w:t>Ar</w:t>
       </w:r>
@@ -1195,7 +1220,6 @@
       <w:r>
         <w:t>r</w:t>
       </w:r>
-      <w:proofErr w:type="spellEnd"/>
     </w:p>
     <w:p>
       <w:pPr>
@@ -1259,7 +1283,6 @@
           <w:numId w:val="1"/>
         </w:numPr>
       </w:pPr>
-      <w:proofErr w:type="spellStart"/>
       <w:r>
         <w:t>S</w:t>
       </w:r>
@@ -1275,7 +1298,6 @@
       <w:r>
         <w:t>el</w:t>
       </w:r>
-      <w:proofErr w:type="spellEnd"/>
     </w:p>
     <w:p>
       <w:pPr>
@@ -1327,7 +1349,6 @@
           <w:numId w:val="1"/>
         </w:numPr>
       </w:pPr>
-      <w:proofErr w:type="spellStart"/>
       <w:r>
         <w:t>Wait_tim</w:t>
       </w:r>
@@ -1340,7 +1361,6 @@
       <w:r>
         <w:t>s</w:t>
       </w:r>
-      <w:proofErr w:type="spellEnd"/>
     </w:p>
     <w:p>
       <w:pPr>
@@ -1392,7 +1412,6 @@
           <w:numId w:val="1"/>
         </w:numPr>
       </w:pPr>
-      <w:proofErr w:type="spellStart"/>
       <w:r>
         <w:t>L</w:t>
       </w:r>
@@ -1414,7 +1433,6 @@
       <w:r>
         <w:t>ours</w:t>
       </w:r>
-      <w:proofErr w:type="spellEnd"/>
     </w:p>
     <w:p>
       <w:pPr>
@@ -1425,6 +1443,7 @@
         </w:numPr>
       </w:pPr>
       <w:r>
+        <w:lastRenderedPageBreak/>
         <w:t xml:space="preserve">The </w:t>
       </w:r>
       <w:r>
@@ -1473,15 +1492,7 @@
         </w:numPr>
       </w:pPr>
       <w:r>
-        <w:t>Hospital stay after admission is not included in this field (</w:t>
-      </w:r>
-      <w:proofErr w:type="spellStart"/>
-      <w:r>
-        <w:t>losh</w:t>
-      </w:r>
-      <w:proofErr w:type="spellEnd"/>
-      <w:r>
-        <w:t>)</w:t>
+        <w:t>Hospital stay after admission is not included in this field (losh)</w:t>
       </w:r>
     </w:p>
     <w:p>
@@ -1612,7 +1623,6 @@
           <w:numId w:val="1"/>
         </w:numPr>
       </w:pPr>
-      <w:proofErr w:type="spellStart"/>
       <w:r>
         <w:t>A</w:t>
       </w:r>
@@ -1625,7 +1635,6 @@
       <w:r>
         <w:t>_id</w:t>
       </w:r>
-      <w:proofErr w:type="spellEnd"/>
     </w:p>
     <w:p>
       <w:pPr>
@@ -1636,17 +1645,479 @@
         </w:numPr>
       </w:pPr>
       <w:r>
+        <w:t>A number to identify</w:t>
+      </w:r>
+      <w:r>
+        <w:t xml:space="preserve"> each appointment at the </w:t>
+      </w:r>
+      <w:r>
+        <w:t>Valley Regional Medical Center</w:t>
+      </w:r>
+      <w:r>
+        <w:t xml:space="preserve">. </w:t>
+      </w:r>
+    </w:p>
+    <w:p>
+      <w:pPr>
+        <w:pStyle w:val="ListParagraph"/>
+        <w:numPr>
+          <w:ilvl w:val="1"/>
+          <w:numId w:val="1"/>
+        </w:numPr>
+      </w:pPr>
+      <w:r>
+        <w:t>P</w:t>
+      </w:r>
+      <w:r>
+        <w:t>ati</w:t>
+      </w:r>
+      <w:r>
+        <w:t>ent_id</w:t>
+      </w:r>
+    </w:p>
+    <w:p>
+      <w:pPr>
+        <w:pStyle w:val="ListParagraph"/>
+        <w:numPr>
+          <w:ilvl w:val="2"/>
+          <w:numId w:val="1"/>
+        </w:numPr>
+      </w:pPr>
+      <w:r>
+        <w:t>An id, referencing a specific patient. The details of the p</w:t>
+      </w:r>
+      <w:r>
+        <w:t>atient</w:t>
+      </w:r>
+      <w:r>
+        <w:t xml:space="preserve"> will be found withing the patient dataset. </w:t>
+      </w:r>
+    </w:p>
+    <w:p>
+      <w:pPr>
+        <w:pStyle w:val="ListParagraph"/>
+        <w:numPr>
+          <w:ilvl w:val="1"/>
+          <w:numId w:val="1"/>
+        </w:numPr>
+      </w:pPr>
+      <w:r>
+        <w:t>P</w:t>
+      </w:r>
+      <w:r>
+        <w:t>rovi</w:t>
+      </w:r>
+      <w:r>
+        <w:t>der_id</w:t>
+      </w:r>
+    </w:p>
+    <w:p>
+      <w:pPr>
+        <w:pStyle w:val="ListParagraph"/>
+        <w:numPr>
+          <w:ilvl w:val="2"/>
+          <w:numId w:val="1"/>
+        </w:numPr>
+      </w:pPr>
+      <w:r>
+        <w:t>An id</w:t>
+      </w:r>
+      <w:r>
+        <w:t>,</w:t>
+      </w:r>
+      <w:r>
+        <w:t xml:space="preserve"> referencing a specific provider. The details of the provider will be found withing the provider dataset. </w:t>
+      </w:r>
+    </w:p>
+    <w:p>
+      <w:pPr>
+        <w:pStyle w:val="ListParagraph"/>
+        <w:numPr>
+          <w:ilvl w:val="1"/>
+          <w:numId w:val="1"/>
+        </w:numPr>
+      </w:pPr>
+      <w:r>
+        <w:t>D</w:t>
+      </w:r>
+      <w:r>
+        <w:t>e</w:t>
+      </w:r>
+      <w:r>
+        <w:t>part</w:t>
+      </w:r>
+      <w:r>
+        <w:t>ment</w:t>
+      </w:r>
+    </w:p>
+    <w:p>
+      <w:pPr>
+        <w:pStyle w:val="ListParagraph"/>
+        <w:numPr>
+          <w:ilvl w:val="2"/>
+          <w:numId w:val="1"/>
+        </w:numPr>
+      </w:pPr>
+      <w:r>
+        <w:t xml:space="preserve">Shows which department the appointment is associated with. </w:t>
+      </w:r>
+    </w:p>
+    <w:p>
+      <w:pPr>
+        <w:pStyle w:val="ListParagraph"/>
+        <w:numPr>
+          <w:ilvl w:val="1"/>
+          <w:numId w:val="1"/>
+        </w:numPr>
+      </w:pPr>
+      <w:r>
+        <w:t>A</w:t>
+      </w:r>
+      <w:r>
+        <w:t>ppo</w:t>
+      </w:r>
+      <w:r>
+        <w:t>intment</w:t>
+      </w:r>
+      <w:r>
+        <w:t>_date</w:t>
+      </w:r>
+    </w:p>
+    <w:p>
+      <w:pPr>
+        <w:pStyle w:val="ListParagraph"/>
+        <w:numPr>
+          <w:ilvl w:val="2"/>
+          <w:numId w:val="1"/>
+        </w:numPr>
+      </w:pPr>
+      <w:r>
+        <w:t xml:space="preserve">Shows the date of the appointment. </w:t>
+      </w:r>
+    </w:p>
+    <w:p>
+      <w:pPr>
+        <w:pStyle w:val="ListParagraph"/>
+        <w:numPr>
+          <w:ilvl w:val="1"/>
+          <w:numId w:val="1"/>
+        </w:numPr>
+      </w:pPr>
+      <w:r>
+        <w:t>A</w:t>
+      </w:r>
+      <w:r>
+        <w:t>pp</w:t>
+      </w:r>
+      <w:r>
+        <w:t>ointment</w:t>
+      </w:r>
+      <w:r>
+        <w:t>_day</w:t>
+      </w:r>
+    </w:p>
+    <w:p>
+      <w:pPr>
+        <w:pStyle w:val="ListParagraph"/>
+        <w:numPr>
+          <w:ilvl w:val="2"/>
+          <w:numId w:val="1"/>
+        </w:numPr>
+      </w:pPr>
+      <w:r>
+        <w:t xml:space="preserve">Shows the day of the week the appointment was on. </w:t>
+      </w:r>
+    </w:p>
+    <w:p>
+      <w:pPr>
+        <w:pStyle w:val="ListParagraph"/>
+        <w:numPr>
+          <w:ilvl w:val="1"/>
+          <w:numId w:val="1"/>
+        </w:numPr>
+      </w:pPr>
+      <w:r>
+        <w:t>A</w:t>
+      </w:r>
+      <w:r>
+        <w:t>ppoint</w:t>
+      </w:r>
+      <w:r>
+        <w:t>ment_ty</w:t>
+      </w:r>
+      <w:r>
+        <w:t>pe</w:t>
+      </w:r>
+    </w:p>
+    <w:p>
+      <w:pPr>
+        <w:pStyle w:val="ListParagraph"/>
+        <w:numPr>
+          <w:ilvl w:val="2"/>
+          <w:numId w:val="1"/>
+        </w:numPr>
+      </w:pPr>
+      <w:r>
+        <w:t xml:space="preserve">Defines the type of appointment </w:t>
+      </w:r>
+    </w:p>
+    <w:p>
+      <w:pPr>
+        <w:pStyle w:val="ListParagraph"/>
+        <w:numPr>
+          <w:ilvl w:val="1"/>
+          <w:numId w:val="1"/>
+        </w:numPr>
+      </w:pPr>
+      <w:r>
+        <w:t>A</w:t>
+      </w:r>
+      <w:r>
+        <w:t>pp</w:t>
+      </w:r>
+      <w:r>
+        <w:t>ointment</w:t>
+      </w:r>
+      <w:r>
+        <w:t>_</w:t>
+      </w:r>
+      <w:r>
+        <w:t>sta</w:t>
+      </w:r>
+      <w:r>
+        <w:t>tus</w:t>
+      </w:r>
+    </w:p>
+    <w:p>
+      <w:pPr>
+        <w:pStyle w:val="ListParagraph"/>
+        <w:numPr>
+          <w:ilvl w:val="2"/>
+          <w:numId w:val="1"/>
+        </w:numPr>
+      </w:pPr>
+      <w:r>
+        <w:t xml:space="preserve">Defines an appointment as either </w:t>
+      </w:r>
+      <w:r>
+        <w:t>Completed, Cancelled, or no-show</w:t>
+      </w:r>
+    </w:p>
+    <w:p>
+      <w:pPr>
+        <w:pStyle w:val="ListParagraph"/>
+        <w:numPr>
+          <w:ilvl w:val="1"/>
+          <w:numId w:val="1"/>
+        </w:numPr>
+      </w:pPr>
+      <w:r>
+        <w:t>A</w:t>
+      </w:r>
+      <w:r>
+        <w:t>pp</w:t>
+      </w:r>
+      <w:r>
+        <w:t>ointment</w:t>
+      </w:r>
+      <w:r>
+        <w:t>_dura</w:t>
+      </w:r>
+      <w:r>
+        <w:t>tion</w:t>
+      </w:r>
+      <w:r>
+        <w:t>_</w:t>
+      </w:r>
+      <w:r>
+        <w:t>min</w:t>
+      </w:r>
+      <w:r>
+        <w:t>utes</w:t>
+      </w:r>
+    </w:p>
+    <w:p>
+      <w:pPr>
+        <w:pStyle w:val="ListParagraph"/>
+        <w:numPr>
+          <w:ilvl w:val="2"/>
+          <w:numId w:val="1"/>
+        </w:numPr>
+      </w:pPr>
+      <w:r>
+        <w:t xml:space="preserve">Shows length of time </w:t>
+      </w:r>
+      <w:r>
+        <w:t xml:space="preserve">for the appointment </w:t>
+      </w:r>
+    </w:p>
+    <w:p>
+      <w:pPr>
+        <w:pStyle w:val="ListParagraph"/>
+        <w:numPr>
+          <w:ilvl w:val="1"/>
+          <w:numId w:val="1"/>
+        </w:numPr>
+      </w:pPr>
+      <w:r>
+        <w:t>P</w:t>
+      </w:r>
+      <w:r>
+        <w:t>atient</w:t>
+      </w:r>
+      <w:r>
+        <w:t>_</w:t>
+      </w:r>
+      <w:r>
+        <w:t>s</w:t>
+      </w:r>
+      <w:r>
+        <w:t>a</w:t>
+      </w:r>
+      <w:r>
+        <w:t>tient_</w:t>
+      </w:r>
+      <w:r>
+        <w:t>satis</w:t>
+      </w:r>
+      <w:r>
+        <w:t>factio</w:t>
+      </w:r>
+      <w:r>
+        <w:t>n_</w:t>
+      </w:r>
+      <w:r>
+        <w:t>scor</w:t>
+      </w:r>
+      <w:r>
+        <w:t>e</w:t>
+      </w:r>
+      <w:r>
+        <w:t xml:space="preserve"> </w:t>
+      </w:r>
+    </w:p>
+    <w:p>
+      <w:pPr>
+        <w:pStyle w:val="ListParagraph"/>
+        <w:numPr>
+          <w:ilvl w:val="2"/>
+          <w:numId w:val="1"/>
+        </w:numPr>
+      </w:pPr>
+      <w:r>
+        <w:t xml:space="preserve">A </w:t>
+      </w:r>
+      <w:r>
+        <w:t xml:space="preserve">decimal scale from </w:t>
+      </w:r>
+      <w:r>
+        <w:t xml:space="preserve">1-5 </w:t>
+      </w:r>
+      <w:r>
+        <w:t>ignifying patient satisfaction</w:t>
+      </w:r>
+    </w:p>
+    <w:p>
+      <w:pPr>
+        <w:pStyle w:val="ListParagraph"/>
+        <w:numPr>
+          <w:ilvl w:val="3"/>
+          <w:numId w:val="1"/>
+        </w:numPr>
+      </w:pPr>
+      <w:r>
+        <w:t xml:space="preserve">There </w:t>
+      </w:r>
+      <w:r>
+        <w:t>are</w:t>
+      </w:r>
+      <w:r>
+        <w:t xml:space="preserve"> about 1,000</w:t>
+      </w:r>
+      <w:r>
+        <w:t xml:space="preserve"> appointments with miss</w:t>
+      </w:r>
+      <w:r>
+        <w:t>ing</w:t>
+      </w:r>
+      <w:r>
+        <w:t xml:space="preserve"> satisfaction scores. </w:t>
+      </w:r>
+      <w:r>
+        <w:t xml:space="preserve">Null values will mean patients either canceled or no-show. </w:t>
+      </w:r>
+    </w:p>
+    <w:p>
+      <w:pPr>
+        <w:pStyle w:val="ListParagraph"/>
+        <w:numPr>
+          <w:ilvl w:val="0"/>
+          <w:numId w:val="1"/>
+        </w:numPr>
+      </w:pPr>
+      <w:r>
+        <w:t>Patients</w:t>
+      </w:r>
+    </w:p>
+    <w:p>
+      <w:pPr>
+        <w:pStyle w:val="ListParagraph"/>
+        <w:numPr>
+          <w:ilvl w:val="1"/>
+          <w:numId w:val="1"/>
+        </w:numPr>
+      </w:pPr>
+      <w:r>
+        <w:t>Patient_id</w:t>
+      </w:r>
+    </w:p>
+    <w:p>
+      <w:pPr>
+        <w:pStyle w:val="ListParagraph"/>
+        <w:numPr>
+          <w:ilvl w:val="2"/>
+          <w:numId w:val="1"/>
+        </w:numPr>
+      </w:pPr>
+      <w:r>
+        <w:t xml:space="preserve">Unique identifier for each patient. </w:t>
+      </w:r>
+    </w:p>
+    <w:p>
+      <w:pPr>
+        <w:pStyle w:val="ListParagraph"/>
+        <w:numPr>
+          <w:ilvl w:val="1"/>
+          <w:numId w:val="1"/>
+        </w:numPr>
+      </w:pPr>
+      <w:r>
+        <w:t>Patient_name</w:t>
+      </w:r>
+    </w:p>
+    <w:p>
+      <w:pPr>
+        <w:pStyle w:val="ListParagraph"/>
+        <w:numPr>
+          <w:ilvl w:val="2"/>
+          <w:numId w:val="1"/>
+        </w:numPr>
+      </w:pPr>
+      <w:r>
+        <w:t xml:space="preserve">First and last name of patient </w:t>
+      </w:r>
+    </w:p>
+    <w:p>
+      <w:pPr>
+        <w:pStyle w:val="ListParagraph"/>
+        <w:numPr>
+          <w:ilvl w:val="3"/>
+          <w:numId w:val="1"/>
+        </w:numPr>
+      </w:pPr>
+      <w:r>
         <w:lastRenderedPageBreak/>
-        <w:t>A number to identify</w:t>
-      </w:r>
-      <w:r>
-        <w:t xml:space="preserve"> each appointment at the </w:t>
-      </w:r>
-      <w:r>
-        <w:t>Valley Regional Medical Center</w:t>
-      </w:r>
-      <w:r>
-        <w:t xml:space="preserve">. </w:t>
+        <w:t xml:space="preserve">First and last name are within the same record. I’m wondering if it’s best to do splitting so that first and last name have their own fields.  </w:t>
       </w:r>
     </w:p>
     <w:p>
@@ -1657,17 +2128,9 @@
           <w:numId w:val="1"/>
         </w:numPr>
       </w:pPr>
-      <w:proofErr w:type="spellStart"/>
-      <w:r>
-        <w:t>P</w:t>
-      </w:r>
-      <w:r>
-        <w:t>ati</w:t>
-      </w:r>
-      <w:r>
-        <w:t>ent_id</w:t>
-      </w:r>
-      <w:proofErr w:type="spellEnd"/>
+      <w:r>
+        <w:t>Age</w:t>
+      </w:r>
     </w:p>
     <w:p>
       <w:pPr>
@@ -1678,13 +2141,7 @@
         </w:numPr>
       </w:pPr>
       <w:r>
-        <w:t>An id, referencing a specific patient. The details of the p</w:t>
-      </w:r>
-      <w:r>
-        <w:t>atient</w:t>
-      </w:r>
-      <w:r>
-        <w:t xml:space="preserve"> will be found withing the patient dataset. </w:t>
+        <w:t>Age in years of patient</w:t>
       </w:r>
     </w:p>
     <w:p>
@@ -1695,17 +2152,9 @@
           <w:numId w:val="1"/>
         </w:numPr>
       </w:pPr>
-      <w:proofErr w:type="spellStart"/>
-      <w:r>
-        <w:t>P</w:t>
-      </w:r>
-      <w:r>
-        <w:t>rovi</w:t>
-      </w:r>
-      <w:r>
-        <w:t>der_id</w:t>
-      </w:r>
-      <w:proofErr w:type="spellEnd"/>
+      <w:r>
+        <w:t>Gender</w:t>
+      </w:r>
     </w:p>
     <w:p>
       <w:pPr>
@@ -1716,13 +2165,7 @@
         </w:numPr>
       </w:pPr>
       <w:r>
-        <w:t>An id</w:t>
-      </w:r>
-      <w:r>
-        <w:t>,</w:t>
-      </w:r>
-      <w:r>
-        <w:t xml:space="preserve"> referencing a specific provider. The details of the provider will be found withing the provider dataset. </w:t>
+        <w:t xml:space="preserve">Biological sex of patient </w:t>
       </w:r>
     </w:p>
     <w:p>
@@ -1734,16 +2177,7 @@
         </w:numPr>
       </w:pPr>
       <w:r>
-        <w:t>D</w:t>
-      </w:r>
-      <w:r>
-        <w:t>e</w:t>
-      </w:r>
-      <w:r>
-        <w:t>part</w:t>
-      </w:r>
-      <w:r>
-        <w:t>ment</w:t>
+        <w:t xml:space="preserve">City </w:t>
       </w:r>
     </w:p>
     <w:p>
@@ -1755,7 +2189,19 @@
         </w:numPr>
       </w:pPr>
       <w:r>
-        <w:t xml:space="preserve">Shows which department the appointment is associated with. </w:t>
+        <w:t xml:space="preserve">The city where the patient is from </w:t>
+      </w:r>
+    </w:p>
+    <w:p>
+      <w:pPr>
+        <w:pStyle w:val="ListParagraph"/>
+        <w:numPr>
+          <w:ilvl w:val="0"/>
+          <w:numId w:val="1"/>
+        </w:numPr>
+      </w:pPr>
+      <w:r>
+        <w:t>Providers</w:t>
       </w:r>
     </w:p>
     <w:p>
@@ -1766,20 +2212,9 @@
           <w:numId w:val="1"/>
         </w:numPr>
       </w:pPr>
-      <w:proofErr w:type="spellStart"/>
-      <w:r>
-        <w:t>A</w:t>
-      </w:r>
-      <w:r>
-        <w:t>ppo</w:t>
-      </w:r>
-      <w:r>
-        <w:t>intment</w:t>
-      </w:r>
-      <w:r>
-        <w:t>_date</w:t>
-      </w:r>
-      <w:proofErr w:type="spellEnd"/>
+      <w:r>
+        <w:t>Provider_id</w:t>
+      </w:r>
     </w:p>
     <w:p>
       <w:pPr>
@@ -1790,7 +2225,7 @@
         </w:numPr>
       </w:pPr>
       <w:r>
-        <w:t xml:space="preserve">Shows the date of the appointment. </w:t>
+        <w:t xml:space="preserve">Unique identifier for each provider. </w:t>
       </w:r>
     </w:p>
     <w:p>
@@ -1801,20 +2236,9 @@
           <w:numId w:val="1"/>
         </w:numPr>
       </w:pPr>
-      <w:proofErr w:type="spellStart"/>
-      <w:r>
-        <w:t>A</w:t>
-      </w:r>
-      <w:r>
-        <w:t>pp</w:t>
-      </w:r>
-      <w:r>
-        <w:t>ointment</w:t>
-      </w:r>
-      <w:r>
-        <w:t>_day</w:t>
-      </w:r>
-      <w:proofErr w:type="spellEnd"/>
+      <w:r>
+        <w:t>Provider_name</w:t>
+      </w:r>
     </w:p>
     <w:p>
       <w:pPr>
@@ -1825,7 +2249,58 @@
         </w:numPr>
       </w:pPr>
       <w:r>
-        <w:t xml:space="preserve">Shows the day of the week the appointment was on. </w:t>
+        <w:t>First and last name of provider</w:t>
+      </w:r>
+    </w:p>
+    <w:p>
+      <w:pPr>
+        <w:pStyle w:val="ListParagraph"/>
+        <w:numPr>
+          <w:ilvl w:val="3"/>
+          <w:numId w:val="1"/>
+        </w:numPr>
+      </w:pPr>
+      <w:r>
+        <w:t xml:space="preserve">Jessica Allen (provider_id: 19) is the only provider with </w:t>
+      </w:r>
+      <w:r>
+        <w:t xml:space="preserve">‘Dr.’ within the provider_name field. Should all records have Dr., or since she’s the only one, can we just remove </w:t>
+      </w:r>
+      <w:r>
+        <w:t xml:space="preserve">Dr. from her record. Since they are all providers, it is already assumed that they are doctors. </w:t>
+      </w:r>
+    </w:p>
+    <w:p>
+      <w:pPr>
+        <w:pStyle w:val="ListParagraph"/>
+        <w:numPr>
+          <w:ilvl w:val="4"/>
+          <w:numId w:val="1"/>
+        </w:numPr>
+      </w:pPr>
+      <w:r>
+        <w:t xml:space="preserve">I removed “Dr.” prefix from provider_id: 19 record to standardize provider-name formatting. </w:t>
+      </w:r>
+    </w:p>
+    <w:p>
+      <w:pPr>
+        <w:pStyle w:val="ListParagraph"/>
+        <w:numPr>
+          <w:ilvl w:val="3"/>
+          <w:numId w:val="1"/>
+        </w:numPr>
+      </w:pPr>
+      <w:r>
+        <w:t xml:space="preserve">First </w:t>
+      </w:r>
+      <w:r>
+        <w:t xml:space="preserve">and last name are within the same record. I’m wondering if it’s best to do </w:t>
+      </w:r>
+      <w:r>
+        <w:t xml:space="preserve">splitting so that first and last name have their own fields. </w:t>
+      </w:r>
+      <w:r>
+        <w:t xml:space="preserve"> </w:t>
       </w:r>
     </w:p>
     <w:p>
@@ -1836,20 +2311,9 @@
           <w:numId w:val="1"/>
         </w:numPr>
       </w:pPr>
-      <w:proofErr w:type="spellStart"/>
-      <w:r>
-        <w:t>A</w:t>
-      </w:r>
-      <w:r>
-        <w:t>ppoint</w:t>
-      </w:r>
-      <w:r>
-        <w:t>ment_ty</w:t>
-      </w:r>
-      <w:r>
-        <w:t>pe</w:t>
-      </w:r>
-      <w:proofErr w:type="spellEnd"/>
+      <w:r>
+        <w:t>Department</w:t>
+      </w:r>
     </w:p>
     <w:p>
       <w:pPr>
@@ -1860,7 +2324,7 @@
         </w:numPr>
       </w:pPr>
       <w:r>
-        <w:t xml:space="preserve">Defines the type of appointment </w:t>
+        <w:t xml:space="preserve">The department which the provider is from </w:t>
       </w:r>
     </w:p>
     <w:p>
@@ -1871,518 +2335,9 @@
           <w:numId w:val="1"/>
         </w:numPr>
       </w:pPr>
-      <w:proofErr w:type="spellStart"/>
-      <w:r>
-        <w:t>A</w:t>
-      </w:r>
-      <w:r>
-        <w:t>pp</w:t>
-      </w:r>
-      <w:r>
-        <w:t>ointment</w:t>
-      </w:r>
-      <w:r>
-        <w:t>_</w:t>
-      </w:r>
-      <w:r>
-        <w:t>sta</w:t>
-      </w:r>
-      <w:r>
-        <w:t>tus</w:t>
-      </w:r>
-      <w:proofErr w:type="spellEnd"/>
-    </w:p>
-    <w:p>
-      <w:pPr>
-        <w:pStyle w:val="ListParagraph"/>
-        <w:numPr>
-          <w:ilvl w:val="2"/>
-          <w:numId w:val="1"/>
-        </w:numPr>
-      </w:pPr>
-      <w:r>
-        <w:t xml:space="preserve">Defines an appointment as either </w:t>
-      </w:r>
-      <w:r>
-        <w:t>Completed, Cancelled, or no-show</w:t>
-      </w:r>
-    </w:p>
-    <w:p>
-      <w:pPr>
-        <w:pStyle w:val="ListParagraph"/>
-        <w:numPr>
-          <w:ilvl w:val="1"/>
-          <w:numId w:val="1"/>
-        </w:numPr>
-      </w:pPr>
-      <w:proofErr w:type="spellStart"/>
-      <w:r>
-        <w:t>A</w:t>
-      </w:r>
-      <w:r>
-        <w:t>pp</w:t>
-      </w:r>
-      <w:r>
-        <w:t>ointment</w:t>
-      </w:r>
-      <w:r>
-        <w:t>_dura</w:t>
-      </w:r>
-      <w:r>
-        <w:t>tion</w:t>
-      </w:r>
-      <w:r>
-        <w:t>_</w:t>
-      </w:r>
-      <w:r>
-        <w:t>min</w:t>
-      </w:r>
-      <w:r>
-        <w:t>utes</w:t>
-      </w:r>
-      <w:proofErr w:type="spellEnd"/>
-    </w:p>
-    <w:p>
-      <w:pPr>
-        <w:pStyle w:val="ListParagraph"/>
-        <w:numPr>
-          <w:ilvl w:val="2"/>
-          <w:numId w:val="1"/>
-        </w:numPr>
-      </w:pPr>
-      <w:r>
-        <w:t xml:space="preserve">Shows length of time </w:t>
-      </w:r>
-      <w:r>
-        <w:t xml:space="preserve">for the appointment </w:t>
-      </w:r>
-    </w:p>
-    <w:p>
-      <w:pPr>
-        <w:pStyle w:val="ListParagraph"/>
-        <w:numPr>
-          <w:ilvl w:val="1"/>
-          <w:numId w:val="1"/>
-        </w:numPr>
-      </w:pPr>
-      <w:proofErr w:type="spellStart"/>
-      <w:r>
-        <w:t>P</w:t>
-      </w:r>
-      <w:r>
-        <w:t>atient</w:t>
-      </w:r>
-      <w:r>
-        <w:t>_</w:t>
-      </w:r>
-      <w:r>
-        <w:t>s</w:t>
-      </w:r>
-      <w:r>
-        <w:t>a</w:t>
-      </w:r>
-      <w:r>
-        <w:t>tient_</w:t>
-      </w:r>
-      <w:r>
-        <w:t>satis</w:t>
-      </w:r>
-      <w:r>
-        <w:t>factio</w:t>
-      </w:r>
-      <w:r>
-        <w:t>n_</w:t>
-      </w:r>
-      <w:r>
-        <w:t>scor</w:t>
-      </w:r>
-      <w:r>
-        <w:t>e</w:t>
-      </w:r>
-      <w:proofErr w:type="spellEnd"/>
-      <w:r>
-        <w:t xml:space="preserve"> </w:t>
-      </w:r>
-    </w:p>
-    <w:p>
-      <w:pPr>
-        <w:pStyle w:val="ListParagraph"/>
-        <w:numPr>
-          <w:ilvl w:val="2"/>
-          <w:numId w:val="1"/>
-        </w:numPr>
-      </w:pPr>
-      <w:r>
-        <w:t xml:space="preserve">A </w:t>
-      </w:r>
-      <w:r>
-        <w:t xml:space="preserve">decimal scale from </w:t>
-      </w:r>
-      <w:r>
-        <w:t xml:space="preserve">1-5 </w:t>
-      </w:r>
-      <w:proofErr w:type="spellStart"/>
-      <w:r>
-        <w:t>ignifying</w:t>
-      </w:r>
-      <w:proofErr w:type="spellEnd"/>
-      <w:r>
-        <w:t xml:space="preserve"> patient satisfaction</w:t>
-      </w:r>
-    </w:p>
-    <w:p>
-      <w:pPr>
-        <w:pStyle w:val="ListParagraph"/>
-        <w:numPr>
-          <w:ilvl w:val="3"/>
-          <w:numId w:val="1"/>
-        </w:numPr>
-      </w:pPr>
-      <w:r>
-        <w:t xml:space="preserve">There </w:t>
-      </w:r>
-      <w:r>
-        <w:t>are</w:t>
-      </w:r>
-      <w:r>
-        <w:t xml:space="preserve"> about 1,000</w:t>
-      </w:r>
-      <w:r>
-        <w:t xml:space="preserve"> appointments with miss</w:t>
-      </w:r>
-      <w:r>
-        <w:t>ing</w:t>
-      </w:r>
-      <w:r>
-        <w:t xml:space="preserve"> satisfaction scores. </w:t>
-      </w:r>
-      <w:r>
-        <w:t xml:space="preserve">Null values will mean patients either canceled or no-show. </w:t>
-      </w:r>
-    </w:p>
-    <w:p>
-      <w:pPr>
-        <w:pStyle w:val="ListParagraph"/>
-        <w:numPr>
-          <w:ilvl w:val="0"/>
-          <w:numId w:val="1"/>
-        </w:numPr>
-      </w:pPr>
-      <w:r>
-        <w:t>Patients</w:t>
-      </w:r>
-    </w:p>
-    <w:p>
-      <w:pPr>
-        <w:pStyle w:val="ListParagraph"/>
-        <w:numPr>
-          <w:ilvl w:val="1"/>
-          <w:numId w:val="1"/>
-        </w:numPr>
-      </w:pPr>
-      <w:proofErr w:type="spellStart"/>
-      <w:r>
-        <w:t>Patient_id</w:t>
-      </w:r>
-      <w:proofErr w:type="spellEnd"/>
-    </w:p>
-    <w:p>
-      <w:pPr>
-        <w:pStyle w:val="ListParagraph"/>
-        <w:numPr>
-          <w:ilvl w:val="2"/>
-          <w:numId w:val="1"/>
-        </w:numPr>
-      </w:pPr>
-      <w:r>
-        <w:t xml:space="preserve">Unique identifier for each patient. </w:t>
-      </w:r>
-    </w:p>
-    <w:p>
-      <w:pPr>
-        <w:pStyle w:val="ListParagraph"/>
-        <w:numPr>
-          <w:ilvl w:val="1"/>
-          <w:numId w:val="1"/>
-        </w:numPr>
-      </w:pPr>
-      <w:proofErr w:type="spellStart"/>
-      <w:r>
-        <w:t>Patient_name</w:t>
-      </w:r>
-      <w:proofErr w:type="spellEnd"/>
-    </w:p>
-    <w:p>
-      <w:pPr>
-        <w:pStyle w:val="ListParagraph"/>
-        <w:numPr>
-          <w:ilvl w:val="2"/>
-          <w:numId w:val="1"/>
-        </w:numPr>
-      </w:pPr>
-      <w:r>
-        <w:t xml:space="preserve">First and last name of patient </w:t>
-      </w:r>
-    </w:p>
-    <w:p>
-      <w:pPr>
-        <w:pStyle w:val="ListParagraph"/>
-        <w:numPr>
-          <w:ilvl w:val="3"/>
-          <w:numId w:val="1"/>
-        </w:numPr>
-      </w:pPr>
-      <w:r>
-        <w:t xml:space="preserve">First and last name are within the same record. I’m wondering if it’s best to do splitting so that first and last name have their own fields.  </w:t>
-      </w:r>
-    </w:p>
-    <w:p>
-      <w:pPr>
-        <w:pStyle w:val="ListParagraph"/>
-        <w:numPr>
-          <w:ilvl w:val="1"/>
-          <w:numId w:val="1"/>
-        </w:numPr>
-      </w:pPr>
-      <w:r>
-        <w:t>Age</w:t>
-      </w:r>
-    </w:p>
-    <w:p>
-      <w:pPr>
-        <w:pStyle w:val="ListParagraph"/>
-        <w:numPr>
-          <w:ilvl w:val="2"/>
-          <w:numId w:val="1"/>
-        </w:numPr>
-      </w:pPr>
-      <w:r>
-        <w:t>Age in years of patient</w:t>
-      </w:r>
-    </w:p>
-    <w:p>
-      <w:pPr>
-        <w:pStyle w:val="ListParagraph"/>
-        <w:numPr>
-          <w:ilvl w:val="1"/>
-          <w:numId w:val="1"/>
-        </w:numPr>
-      </w:pPr>
-      <w:r>
-        <w:t>Gender</w:t>
-      </w:r>
-    </w:p>
-    <w:p>
-      <w:pPr>
-        <w:pStyle w:val="ListParagraph"/>
-        <w:numPr>
-          <w:ilvl w:val="2"/>
-          <w:numId w:val="1"/>
-        </w:numPr>
-      </w:pPr>
-      <w:r>
-        <w:t xml:space="preserve">Biological sex of patient </w:t>
-      </w:r>
-    </w:p>
-    <w:p>
-      <w:pPr>
-        <w:pStyle w:val="ListParagraph"/>
-        <w:numPr>
-          <w:ilvl w:val="1"/>
-          <w:numId w:val="1"/>
-        </w:numPr>
-      </w:pPr>
-      <w:r>
-        <w:t xml:space="preserve">City </w:t>
-      </w:r>
-    </w:p>
-    <w:p>
-      <w:pPr>
-        <w:pStyle w:val="ListParagraph"/>
-        <w:numPr>
-          <w:ilvl w:val="2"/>
-          <w:numId w:val="1"/>
-        </w:numPr>
-      </w:pPr>
-      <w:r>
-        <w:lastRenderedPageBreak/>
-        <w:t xml:space="preserve">The city where the patient is from </w:t>
-      </w:r>
-    </w:p>
-    <w:p>
-      <w:pPr>
-        <w:pStyle w:val="ListParagraph"/>
-        <w:numPr>
-          <w:ilvl w:val="0"/>
-          <w:numId w:val="1"/>
-        </w:numPr>
-      </w:pPr>
-      <w:r>
-        <w:t>Providers</w:t>
-      </w:r>
-    </w:p>
-    <w:p>
-      <w:pPr>
-        <w:pStyle w:val="ListParagraph"/>
-        <w:numPr>
-          <w:ilvl w:val="1"/>
-          <w:numId w:val="1"/>
-        </w:numPr>
-      </w:pPr>
-      <w:proofErr w:type="spellStart"/>
-      <w:r>
-        <w:t>Provider_id</w:t>
-      </w:r>
-      <w:proofErr w:type="spellEnd"/>
-    </w:p>
-    <w:p>
-      <w:pPr>
-        <w:pStyle w:val="ListParagraph"/>
-        <w:numPr>
-          <w:ilvl w:val="2"/>
-          <w:numId w:val="1"/>
-        </w:numPr>
-      </w:pPr>
-      <w:r>
-        <w:t xml:space="preserve">Unique identifier for each provider. </w:t>
-      </w:r>
-    </w:p>
-    <w:p>
-      <w:pPr>
-        <w:pStyle w:val="ListParagraph"/>
-        <w:numPr>
-          <w:ilvl w:val="1"/>
-          <w:numId w:val="1"/>
-        </w:numPr>
-      </w:pPr>
-      <w:r>
-        <w:t>Provider_name</w:t>
-      </w:r>
-    </w:p>
-    <w:p>
-      <w:pPr>
-        <w:pStyle w:val="ListParagraph"/>
-        <w:numPr>
-          <w:ilvl w:val="2"/>
-          <w:numId w:val="1"/>
-        </w:numPr>
-      </w:pPr>
-      <w:r>
-        <w:t>First and last name of provider</w:t>
-      </w:r>
-    </w:p>
-    <w:p>
-      <w:pPr>
-        <w:pStyle w:val="ListParagraph"/>
-        <w:numPr>
-          <w:ilvl w:val="3"/>
-          <w:numId w:val="1"/>
-        </w:numPr>
-      </w:pPr>
-      <w:r>
-        <w:t>Jessica Allen (</w:t>
-      </w:r>
-      <w:proofErr w:type="spellStart"/>
-      <w:r>
-        <w:t>provider_id</w:t>
-      </w:r>
-      <w:proofErr w:type="spellEnd"/>
-      <w:r>
-        <w:t xml:space="preserve">: 19) is the only provider with </w:t>
-      </w:r>
-      <w:r>
-        <w:t xml:space="preserve">‘Dr.’ within the </w:t>
-      </w:r>
-      <w:proofErr w:type="spellStart"/>
-      <w:r>
-        <w:t>provider_name</w:t>
-      </w:r>
-      <w:proofErr w:type="spellEnd"/>
-      <w:r>
-        <w:t xml:space="preserve"> field. Should all records have Dr., or since she’s the only one, can we just remove </w:t>
-      </w:r>
-      <w:r>
-        <w:t xml:space="preserve">Dr. from her record. Since they are all providers, it is already assumed that they are doctors. </w:t>
-      </w:r>
-    </w:p>
-    <w:p>
-      <w:pPr>
-        <w:pStyle w:val="ListParagraph"/>
-        <w:numPr>
-          <w:ilvl w:val="4"/>
-          <w:numId w:val="1"/>
-        </w:numPr>
-      </w:pPr>
-      <w:r>
-        <w:t xml:space="preserve">I removed “Dr.” prefix from </w:t>
-      </w:r>
-      <w:proofErr w:type="spellStart"/>
-      <w:r>
-        <w:t>provider_id</w:t>
-      </w:r>
-      <w:proofErr w:type="spellEnd"/>
-      <w:r>
-        <w:t xml:space="preserve">: 19 record to standardize provider-name formatting. </w:t>
-      </w:r>
-    </w:p>
-    <w:p>
-      <w:pPr>
-        <w:pStyle w:val="ListParagraph"/>
-        <w:numPr>
-          <w:ilvl w:val="3"/>
-          <w:numId w:val="1"/>
-        </w:numPr>
-      </w:pPr>
-      <w:r>
-        <w:t xml:space="preserve">First </w:t>
-      </w:r>
-      <w:r>
-        <w:t xml:space="preserve">and last name are within the same record. I’m wondering if it’s best to do </w:t>
-      </w:r>
-      <w:r>
-        <w:t xml:space="preserve">splitting so that first and last name have their own fields. </w:t>
-      </w:r>
-      <w:r>
-        <w:t xml:space="preserve"> </w:t>
-      </w:r>
-    </w:p>
-    <w:p>
-      <w:pPr>
-        <w:pStyle w:val="ListParagraph"/>
-        <w:numPr>
-          <w:ilvl w:val="1"/>
-          <w:numId w:val="1"/>
-        </w:numPr>
-      </w:pPr>
-      <w:r>
-        <w:t>Department</w:t>
-      </w:r>
-    </w:p>
-    <w:p>
-      <w:pPr>
-        <w:pStyle w:val="ListParagraph"/>
-        <w:numPr>
-          <w:ilvl w:val="2"/>
-          <w:numId w:val="1"/>
-        </w:numPr>
-      </w:pPr>
-      <w:r>
-        <w:t xml:space="preserve">The department which the provider is from </w:t>
-      </w:r>
-    </w:p>
-    <w:p>
-      <w:pPr>
-        <w:pStyle w:val="ListParagraph"/>
-        <w:numPr>
-          <w:ilvl w:val="1"/>
-          <w:numId w:val="1"/>
-        </w:numPr>
-      </w:pPr>
-      <w:proofErr w:type="spellStart"/>
       <w:r>
         <w:t>Years_experience</w:t>
       </w:r>
-      <w:proofErr w:type="spellEnd"/>
     </w:p>
     <w:p>
       <w:pPr>
@@ -2424,6 +2379,7 @@
         <w:rPr>
           <w:u w:val="single"/>
         </w:rPr>
+        <w:lastRenderedPageBreak/>
         <w:t>7</w:t>
       </w:r>
       <w:r>
@@ -2514,7 +2470,6 @@
     </w:p>
     <w:p>
       <w:r>
-        <w:lastRenderedPageBreak/>
         <w:t>What questions I need to answer:</w:t>
       </w:r>
     </w:p>
@@ -2741,11 +2696,7 @@
     </w:p>
     <w:p>
       <w:r>
-        <w:t xml:space="preserve">These four datasets form a valid relational model centered around patients. Primary keys are unique, foreign key relationships are intact, and no duplicate records were identified. The only mission values occur in patient satisfaction scores for canceled and no-show appointments and will remain NULL. One provider-name formatting inconsistency will be </w:t>
-      </w:r>
-      <w:r>
-        <w:lastRenderedPageBreak/>
-        <w:t xml:space="preserve">standardized. The ER dataset is suitable for exploratory analysis of wait times, patient volume, severity, admission status, and ED length of stay. </w:t>
+        <w:t xml:space="preserve">These four datasets form a valid relational model centered around patients. Primary keys are unique, foreign key relationships are intact, and no duplicate records were identified. The only mission values occur in patient satisfaction scores for canceled and no-show appointments and will remain NULL. One provider-name formatting inconsistency will be standardized. The ER dataset is suitable for exploratory analysis of wait times, patient volume, severity, admission status, and ED length of stay. </w:t>
       </w:r>
     </w:p>
     <w:sectPr>

</xml_diff>

<commit_message>
Completed SQL results and updated project documentation
</commit_message>
<xml_diff>
--- a/documentation/nicosys-healthcare-portfolio-documentation.docx
+++ b/documentation/nicosys-healthcare-portfolio-documentation.docx
@@ -5,360 +5,1050 @@
     <w:p>
       <w:pPr>
         <w:rPr>
-          <w:u w:val="single"/>
-        </w:rPr>
-      </w:pPr>
-      <w:r>
-        <w:rPr>
-          <w:u w:val="single"/>
-        </w:rPr>
-        <w:t>Phase 2: Exploratory SQL | Created 7-10-2026 | Completed</w:t>
-      </w:r>
-    </w:p>
-    <w:p>
-      <w:r>
-        <w:t>Beginning to answer business questions:</w:t>
-      </w:r>
-    </w:p>
-    <w:p>
-      <w:pPr>
-        <w:pStyle w:val="ListParagraph"/>
-        <w:numPr>
-          <w:ilvl w:val="0"/>
-          <w:numId w:val="6"/>
-        </w:numPr>
-      </w:pPr>
-      <w:r>
-        <w:t>What is the average and median ER wait time?</w:t>
-      </w:r>
-    </w:p>
-    <w:p>
-      <w:pPr>
-        <w:pStyle w:val="ListParagraph"/>
-        <w:numPr>
-          <w:ilvl w:val="1"/>
-          <w:numId w:val="6"/>
-        </w:numPr>
-      </w:pPr>
-      <w:r>
-        <w:t>Average wait time is 74 minutes (74.31)</w:t>
-      </w:r>
-    </w:p>
-    <w:p>
-      <w:pPr>
-        <w:pStyle w:val="ListParagraph"/>
-        <w:numPr>
-          <w:ilvl w:val="1"/>
-          <w:numId w:val="6"/>
-        </w:numPr>
-      </w:pPr>
-      <w:r>
-        <w:t xml:space="preserve">Median wait time is 67 minutes </w:t>
-      </w:r>
-    </w:p>
-    <w:p>
-      <w:pPr>
-        <w:pStyle w:val="ListParagraph"/>
-        <w:numPr>
-          <w:ilvl w:val="0"/>
-          <w:numId w:val="6"/>
-        </w:numPr>
-      </w:pPr>
-      <w:r>
-        <w:t>Which days have the longest wait times?</w:t>
-      </w:r>
-    </w:p>
-    <w:p>
-      <w:pPr>
-        <w:pStyle w:val="ListParagraph"/>
-        <w:numPr>
-          <w:ilvl w:val="1"/>
-          <w:numId w:val="6"/>
-        </w:numPr>
-      </w:pPr>
-      <w:r>
-        <w:t xml:space="preserve">Monday, Tuesday, Thursday, and Saturday, experience wait times of 180 minutes (3 hours). </w:t>
-      </w:r>
-    </w:p>
-    <w:p>
-      <w:pPr>
-        <w:pStyle w:val="ListParagraph"/>
-        <w:numPr>
-          <w:ilvl w:val="0"/>
-          <w:numId w:val="6"/>
-        </w:numPr>
-      </w:pPr>
-      <w:r>
-        <w:t>Which hours experience the highest patient volume?</w:t>
-      </w:r>
-    </w:p>
-    <w:p>
-      <w:pPr>
-        <w:pStyle w:val="ListParagraph"/>
-        <w:numPr>
-          <w:ilvl w:val="1"/>
-          <w:numId w:val="6"/>
-        </w:numPr>
-      </w:pPr>
-      <w:r>
-        <w:t xml:space="preserve">The 1 and 10 hour experience the most patient volume at 4 patients. </w:t>
-      </w:r>
-    </w:p>
-    <w:p>
-      <w:pPr>
-        <w:pStyle w:val="ListParagraph"/>
-        <w:numPr>
-          <w:ilvl w:val="0"/>
-          <w:numId w:val="6"/>
-        </w:numPr>
-      </w:pPr>
-      <w:r>
-        <w:t>Does severity level affect wait-time?</w:t>
-      </w:r>
-    </w:p>
-    <w:p>
-      <w:pPr>
-        <w:pStyle w:val="ListParagraph"/>
-        <w:numPr>
-          <w:ilvl w:val="1"/>
-          <w:numId w:val="6"/>
-        </w:numPr>
-      </w:pPr>
-      <w:r>
-        <w:t xml:space="preserve">Yes, the lower the severity level, the longer a patient will wait. </w:t>
-      </w:r>
-      <w:r>
-        <w:t>Low severity level patients are 36 times more likely to experience longer wait times exceeding 2 hours</w:t>
-      </w:r>
-      <w:r>
-        <w:t xml:space="preserve">, </w:t>
-      </w:r>
-      <w:r>
-        <w:t xml:space="preserve">than medium severity level patients. </w:t>
-      </w:r>
-      <w:r>
-        <w:t xml:space="preserve">Also High severity level patients never get seen past 1 hour, and Critical severity level patients get seen between 1-15 minutes. </w:t>
-      </w:r>
-    </w:p>
-    <w:p>
-      <w:pPr>
-        <w:pStyle w:val="ListParagraph"/>
-        <w:numPr>
-          <w:ilvl w:val="0"/>
-          <w:numId w:val="6"/>
-        </w:numPr>
-      </w:pPr>
-      <w:r>
-        <w:t>Are admitted patients waiting longer than discharged patients?</w:t>
-      </w:r>
-    </w:p>
-    <w:p>
-      <w:pPr>
-        <w:pStyle w:val="ListParagraph"/>
-        <w:numPr>
-          <w:ilvl w:val="1"/>
-          <w:numId w:val="6"/>
-        </w:numPr>
-      </w:pPr>
-      <w:r>
-        <w:t xml:space="preserve">Yes, but not by much. Admitted patients wait an average of 76 minutes while discharged patients wait an average of 73 minutes. </w:t>
-      </w:r>
-    </w:p>
-    <w:p>
-      <w:pPr>
-        <w:pStyle w:val="ListParagraph"/>
-        <w:numPr>
-          <w:ilvl w:val="0"/>
-          <w:numId w:val="6"/>
-        </w:numPr>
-      </w:pPr>
-      <w:r>
-        <w:t>Are there operational bottlenecks that explain patient complaints?</w:t>
-      </w:r>
-    </w:p>
-    <w:p>
-      <w:pPr>
-        <w:pStyle w:val="ListParagraph"/>
-        <w:numPr>
-          <w:ilvl w:val="1"/>
-          <w:numId w:val="6"/>
-        </w:numPr>
-        <w:rPr>
-          <w:u w:val="single"/>
-        </w:rPr>
-      </w:pPr>
-      <w:r>
-        <w:t xml:space="preserve">The days </w:t>
-      </w:r>
-      <w:r>
-        <w:t xml:space="preserve">experiencing the longest wait times </w:t>
-      </w:r>
-      <w:r>
-        <w:t>and hours experiencing</w:t>
-      </w:r>
-      <w:r>
-        <w:t xml:space="preserve"> the highest patient volumes </w:t>
-      </w:r>
-      <w:r>
-        <w:t>are composed of Low and Medium severity patients.</w:t>
-      </w:r>
-      <w:r>
-        <w:t xml:space="preserve"> </w:t>
-      </w:r>
-      <w:r>
-        <w:t>The average length of stay for these patients is 7 hours.</w:t>
-      </w:r>
-      <w:r>
-        <w:t xml:space="preserve"> There may not be enough staff to see all the patients at those days/times</w:t>
-      </w:r>
-      <w:r>
-        <w:t>.</w:t>
-      </w:r>
-    </w:p>
-    <w:p>
-      <w:pPr>
-        <w:pStyle w:val="ListParagraph"/>
-        <w:ind w:left="1440"/>
-        <w:rPr>
-          <w:u w:val="single"/>
-        </w:rPr>
-      </w:pPr>
-    </w:p>
-    <w:p>
-      <w:pPr>
-        <w:pStyle w:val="ListParagraph"/>
-        <w:ind w:left="1440"/>
-        <w:rPr>
-          <w:u w:val="single"/>
-        </w:rPr>
-      </w:pPr>
-    </w:p>
-    <w:p>
-      <w:pPr>
-        <w:pStyle w:val="ListParagraph"/>
-        <w:ind w:left="1440"/>
-        <w:rPr>
-          <w:u w:val="single"/>
-        </w:rPr>
-      </w:pPr>
-    </w:p>
-    <w:p>
-      <w:pPr>
-        <w:rPr>
-          <w:u w:val="single"/>
-        </w:rPr>
-      </w:pPr>
-      <w:r>
-        <w:t xml:space="preserve"> </w:t>
-      </w:r>
-      <w:r>
-        <w:rPr>
-          <w:u w:val="single"/>
-        </w:rPr>
-        <w:t xml:space="preserve">Started </w:t>
-      </w:r>
-      <w:r>
-        <w:rPr>
-          <w:u w:val="single"/>
-        </w:rPr>
-        <w:t>7</w:t>
-      </w:r>
-      <w:r>
-        <w:rPr>
-          <w:u w:val="single"/>
-        </w:rPr>
-        <w:t>-</w:t>
-      </w:r>
-      <w:r>
-        <w:rPr>
-          <w:u w:val="single"/>
-        </w:rPr>
-        <w:t>4-2026</w:t>
-      </w:r>
-      <w:r>
-        <w:rPr>
-          <w:u w:val="single"/>
-        </w:rPr>
-        <w:t xml:space="preserve">: </w:t>
-      </w:r>
-      <w:r>
-        <w:rPr>
-          <w:u w:val="single"/>
-        </w:rPr>
-        <w:t>Phase</w:t>
-      </w:r>
-      <w:r>
-        <w:rPr>
-          <w:u w:val="single"/>
-        </w:rPr>
-        <w:t xml:space="preserve"> 1</w:t>
-      </w:r>
-      <w:r>
-        <w:rPr>
-          <w:u w:val="single"/>
-        </w:rPr>
-        <w:t xml:space="preserve"> </w:t>
-      </w:r>
-      <w:r>
-        <w:rPr>
-          <w:u w:val="single"/>
-        </w:rPr>
-        <w:t>–</w:t>
-      </w:r>
-      <w:r>
-        <w:rPr>
-          <w:u w:val="single"/>
-        </w:rPr>
-        <w:t xml:space="preserve"> </w:t>
-      </w:r>
-      <w:r>
-        <w:rPr>
-          <w:u w:val="single"/>
-        </w:rPr>
-        <w:t>Da</w:t>
-      </w:r>
-      <w:r>
-        <w:rPr>
-          <w:u w:val="single"/>
-        </w:rPr>
-        <w:t>ta Fami</w:t>
-      </w:r>
-      <w:r>
-        <w:rPr>
-          <w:u w:val="single"/>
-        </w:rPr>
-        <w:t>li</w:t>
-      </w:r>
-      <w:r>
-        <w:rPr>
-          <w:u w:val="single"/>
-        </w:rPr>
-        <w:t>ar</w:t>
-      </w:r>
-      <w:r>
-        <w:rPr>
-          <w:u w:val="single"/>
-        </w:rPr>
-        <w:t>izat</w:t>
-      </w:r>
-      <w:r>
-        <w:rPr>
-          <w:u w:val="single"/>
-        </w:rPr>
-        <w:t>ion</w:t>
-      </w:r>
-      <w:r>
-        <w:rPr>
-          <w:u w:val="single"/>
-        </w:rPr>
-        <w:t xml:space="preserve"> </w:t>
-      </w:r>
-      <w:r>
-        <w:rPr>
           <w:b/>
           <w:bCs/>
           <w:u w:val="single"/>
         </w:rPr>
+      </w:pPr>
+      <w:r>
+        <w:rPr>
+          <w:b/>
+          <w:bCs/>
+          <w:u w:val="single"/>
+        </w:rPr>
+        <w:t>Phase 3 — Excel Validation</w:t>
+      </w:r>
+    </w:p>
+    <w:p>
+      <w:r>
+        <w:t>Now we're entering a phase that many portfolio projects skip, but it's common in real analytics work.</w:t>
+      </w:r>
+    </w:p>
+    <w:p>
+      <w:pPr>
+        <w:rPr>
+          <w:b/>
+          <w:bCs/>
+          <w:u w:val="single"/>
+        </w:rPr>
+      </w:pPr>
+      <w:r>
+        <w:rPr>
+          <w:b/>
+          <w:bCs/>
+          <w:u w:val="single"/>
+        </w:rPr>
+        <w:t>Stakeholder Request</w:t>
+      </w:r>
+    </w:p>
+    <w:p>
+      <w:r>
+        <w:t>"Before these findings are presented to leadership, I'd like confidence that our SQL analysis is accurate. Please independently validate the key metrics using Excel."</w:t>
+      </w:r>
+    </w:p>
+    <w:p>
+      <w:r>
+        <w:t>Notice the wording.</w:t>
+      </w:r>
+    </w:p>
+    <w:p>
+      <w:r>
+        <w:t>The goal isn't to perform new analysis.</w:t>
+      </w:r>
+    </w:p>
+    <w:p>
+      <w:r>
+        <w:t>It's to verify that your SQL results are correct.</w:t>
+      </w:r>
+    </w:p>
+    <w:p>
+      <w:pPr>
+        <w:rPr>
+          <w:u w:val="single"/>
+        </w:rPr>
+      </w:pPr>
+      <w:r>
+        <w:rPr>
+          <w:u w:val="single"/>
+        </w:rPr>
+        <w:pict w14:anchorId="4A415D3E">
+          <v:rect id="_x0000_i1073" style="width:0;height:1.5pt" o:hralign="center" o:hrstd="t" o:hr="t" fillcolor="#a0a0a0" stroked="f"/>
+        </w:pict>
+      </w:r>
+    </w:p>
+    <w:p>
+      <w:pPr>
+        <w:rPr>
+          <w:b/>
+          <w:bCs/>
+          <w:u w:val="single"/>
+        </w:rPr>
+      </w:pPr>
+      <w:r>
+        <w:rPr>
+          <w:b/>
+          <w:bCs/>
+          <w:u w:val="single"/>
+        </w:rPr>
+        <w:t>Your validation checklist</w:t>
+      </w:r>
+    </w:p>
+    <w:p>
+      <w:r>
+        <w:t>I'd like you to recreate the major findings in Excel using PivotTables, formulas, or filters.</w:t>
+      </w:r>
+    </w:p>
+    <w:p>
+      <w:r>
+        <w:t>Validate these metrics:</w:t>
+      </w:r>
+    </w:p>
+    <w:p>
+      <w:pPr>
+        <w:rPr>
+          <w:b/>
+          <w:bCs/>
+        </w:rPr>
+      </w:pPr>
+      <w:r>
+        <w:rPr>
+          <w:b/>
+          <w:bCs/>
+        </w:rPr>
+        <w:t>1. Average ER wait time</w:t>
+      </w:r>
+    </w:p>
+    <w:p>
+      <w:r>
+        <w:t>Expected:</w:t>
+      </w:r>
+    </w:p>
+    <w:p>
+      <w:pPr>
+        <w:numPr>
+          <w:ilvl w:val="0"/>
+          <w:numId w:val="7"/>
+        </w:numPr>
+      </w:pPr>
+      <w:r>
+        <w:t>Average ≈ </w:t>
+      </w:r>
+      <w:r>
+        <w:rPr>
+          <w:b/>
+          <w:bCs/>
+        </w:rPr>
+        <w:t>74.31 minutes</w:t>
+      </w:r>
+    </w:p>
+    <w:p>
+      <w:r>
+        <w:pict w14:anchorId="48A2F741">
+          <v:rect id="_x0000_i1074" style="width:0;height:1.5pt" o:hralign="center" o:hrstd="t" o:hr="t" fillcolor="#a0a0a0" stroked="f"/>
+        </w:pict>
+      </w:r>
+    </w:p>
+    <w:p>
+      <w:pPr>
+        <w:rPr>
+          <w:b/>
+          <w:bCs/>
+        </w:rPr>
+      </w:pPr>
+      <w:r>
+        <w:rPr>
+          <w:b/>
+          <w:bCs/>
+        </w:rPr>
+        <w:t>2. Median ER wait time</w:t>
+      </w:r>
+    </w:p>
+    <w:p>
+      <w:r>
+        <w:t>Expected:</w:t>
+      </w:r>
+    </w:p>
+    <w:p>
+      <w:pPr>
+        <w:numPr>
+          <w:ilvl w:val="0"/>
+          <w:numId w:val="8"/>
+        </w:numPr>
+      </w:pPr>
+      <w:r>
+        <w:t>Median = </w:t>
+      </w:r>
+      <w:r>
+        <w:rPr>
+          <w:b/>
+          <w:bCs/>
+        </w:rPr>
+        <w:t>67 minutes</w:t>
+      </w:r>
+    </w:p>
+    <w:p>
+      <w:r>
+        <w:t>Use Excel's </w:t>
+      </w:r>
+      <w:proofErr w:type="gramStart"/>
+      <w:r>
+        <w:t>MEDIAN(</w:t>
+      </w:r>
+      <w:proofErr w:type="gramEnd"/>
+      <w:r>
+        <w:t>) function.</w:t>
+      </w:r>
+    </w:p>
+    <w:p>
+      <w:r>
+        <w:pict w14:anchorId="2EF44963">
+          <v:rect id="_x0000_i1075" style="width:0;height:1.5pt" o:hralign="center" o:hrstd="t" o:hr="t" fillcolor="#a0a0a0" stroked="f"/>
+        </w:pict>
+      </w:r>
+    </w:p>
+    <w:p>
+      <w:pPr>
+        <w:rPr>
+          <w:b/>
+          <w:bCs/>
+        </w:rPr>
+      </w:pPr>
+      <w:r>
+        <w:rPr>
+          <w:b/>
+          <w:bCs/>
+        </w:rPr>
+        <w:t>3. Wait time by day of week</w:t>
+      </w:r>
+    </w:p>
+    <w:p>
+      <w:r>
+        <w:t>Confirm:</w:t>
+      </w:r>
+    </w:p>
+    <w:p>
+      <w:pPr>
+        <w:numPr>
+          <w:ilvl w:val="0"/>
+          <w:numId w:val="9"/>
+        </w:numPr>
+      </w:pPr>
+      <w:r>
+        <w:t>Monday</w:t>
+      </w:r>
+    </w:p>
+    <w:p>
+      <w:pPr>
+        <w:numPr>
+          <w:ilvl w:val="0"/>
+          <w:numId w:val="9"/>
+        </w:numPr>
+      </w:pPr>
+      <w:r>
+        <w:t>Tuesday</w:t>
+      </w:r>
+    </w:p>
+    <w:p>
+      <w:pPr>
+        <w:numPr>
+          <w:ilvl w:val="0"/>
+          <w:numId w:val="9"/>
+        </w:numPr>
+      </w:pPr>
+      <w:r>
+        <w:t>Thursday</w:t>
+      </w:r>
+    </w:p>
+    <w:p>
+      <w:pPr>
+        <w:numPr>
+          <w:ilvl w:val="0"/>
+          <w:numId w:val="9"/>
+        </w:numPr>
+      </w:pPr>
+      <w:r>
+        <w:lastRenderedPageBreak/>
+        <w:t>Saturday</w:t>
+      </w:r>
+    </w:p>
+    <w:p>
+      <w:r>
+        <w:t>contain the longest observed wait times.</w:t>
+      </w:r>
+    </w:p>
+    <w:p>
+      <w:r>
+        <w:pict w14:anchorId="6CB02D75">
+          <v:rect id="_x0000_i1076" style="width:0;height:1.5pt" o:hralign="center" o:hrstd="t" o:hr="t" fillcolor="#a0a0a0" stroked="f"/>
+        </w:pict>
+      </w:r>
+    </w:p>
+    <w:p>
+      <w:pPr>
+        <w:rPr>
+          <w:b/>
+          <w:bCs/>
+        </w:rPr>
+      </w:pPr>
+      <w:r>
+        <w:rPr>
+          <w:b/>
+          <w:bCs/>
+        </w:rPr>
+        <w:t>4. Patient arrivals by hour</w:t>
+      </w:r>
+    </w:p>
+    <w:p>
+      <w:r>
+        <w:t>Recreate your SQL grouping using a PivotTable.</w:t>
+      </w:r>
+    </w:p>
+    <w:p>
+      <w:r>
+        <w:t>Confirm the top hours.</w:t>
+      </w:r>
+    </w:p>
+    <w:p>
+      <w:r>
+        <w:pict w14:anchorId="3DCCE12F">
+          <v:rect id="_x0000_i1077" style="width:0;height:1.5pt" o:hralign="center" o:hrstd="t" o:hr="t" fillcolor="#a0a0a0" stroked="f"/>
+        </w:pict>
+      </w:r>
+    </w:p>
+    <w:p>
+      <w:pPr>
+        <w:rPr>
+          <w:b/>
+          <w:bCs/>
+        </w:rPr>
+      </w:pPr>
+      <w:r>
+        <w:rPr>
+          <w:b/>
+          <w:bCs/>
+        </w:rPr>
+        <w:t>5. Wait time by severity</w:t>
+      </w:r>
+    </w:p>
+    <w:p>
+      <w:r>
+        <w:t>Confirm:</w:t>
+      </w:r>
+    </w:p>
+    <w:p>
+      <w:pPr>
+        <w:numPr>
+          <w:ilvl w:val="0"/>
+          <w:numId w:val="10"/>
+        </w:numPr>
+      </w:pPr>
+      <w:r>
+        <w:t>Critical</w:t>
+      </w:r>
+    </w:p>
+    <w:p>
+      <w:pPr>
+        <w:numPr>
+          <w:ilvl w:val="0"/>
+          <w:numId w:val="10"/>
+        </w:numPr>
+      </w:pPr>
+      <w:r>
+        <w:t>High</w:t>
+      </w:r>
+    </w:p>
+    <w:p>
+      <w:pPr>
+        <w:numPr>
+          <w:ilvl w:val="0"/>
+          <w:numId w:val="10"/>
+        </w:numPr>
+      </w:pPr>
+      <w:r>
+        <w:t>Medium</w:t>
+      </w:r>
+    </w:p>
+    <w:p>
+      <w:pPr>
+        <w:numPr>
+          <w:ilvl w:val="0"/>
+          <w:numId w:val="10"/>
+        </w:numPr>
+      </w:pPr>
+      <w:r>
+        <w:t>Low</w:t>
+      </w:r>
+    </w:p>
+    <w:p>
+      <w:r>
+        <w:t>Then compare average wait times.</w:t>
+      </w:r>
+    </w:p>
+    <w:p>
+      <w:r>
+        <w:pict w14:anchorId="77E78F54">
+          <v:rect id="_x0000_i1078" style="width:0;height:1.5pt" o:hralign="center" o:hrstd="t" o:hr="t" fillcolor="#a0a0a0" stroked="f"/>
+        </w:pict>
+      </w:r>
+    </w:p>
+    <w:p>
+      <w:pPr>
+        <w:rPr>
+          <w:b/>
+          <w:bCs/>
+        </w:rPr>
+      </w:pPr>
+      <w:r>
+        <w:rPr>
+          <w:b/>
+          <w:bCs/>
+        </w:rPr>
+        <w:t>6. Admission status</w:t>
+      </w:r>
+    </w:p>
+    <w:p>
+      <w:r>
+        <w:t>Confirm:</w:t>
+      </w:r>
+    </w:p>
+    <w:p>
+      <w:pPr>
+        <w:numPr>
+          <w:ilvl w:val="0"/>
+          <w:numId w:val="11"/>
+        </w:numPr>
+      </w:pPr>
+      <w:r>
+        <w:t>Average wait (Admitted)</w:t>
+      </w:r>
+    </w:p>
+    <w:p>
+      <w:pPr>
+        <w:numPr>
+          <w:ilvl w:val="0"/>
+          <w:numId w:val="11"/>
+        </w:numPr>
+      </w:pPr>
+      <w:r>
+        <w:t>Average wait (Not admitted)</w:t>
+      </w:r>
+    </w:p>
+    <w:p>
+      <w:r>
+        <w:pict w14:anchorId="09727FC2">
+          <v:rect id="_x0000_i1079" style="width:0;height:1.5pt" o:hralign="center" o:hrstd="t" o:hr="t" fillcolor="#a0a0a0" stroked="f"/>
+        </w:pict>
+      </w:r>
+    </w:p>
+    <w:p>
+      <w:pPr>
+        <w:rPr>
+          <w:b/>
+          <w:bCs/>
+        </w:rPr>
+      </w:pPr>
+      <w:r>
+        <w:rPr>
+          <w:b/>
+          <w:bCs/>
+        </w:rPr>
+        <w:t>7. Peak-period patient mix</w:t>
+      </w:r>
+    </w:p>
+    <w:p>
+      <w:r>
+        <w:t xml:space="preserve">Verify your final </w:t>
+      </w:r>
+      <w:proofErr w:type="gramStart"/>
+      <w:r>
+        <w:t>statistic</w:t>
+      </w:r>
+      <w:proofErr w:type="gramEnd"/>
+      <w:r>
+        <w:t>:</w:t>
+      </w:r>
+    </w:p>
+    <w:p>
+      <w:r>
+        <w:t>During peak-volume periods,</w:t>
+      </w:r>
+      <w:r>
+        <w:br/>
+        <w:t>39% Medium</w:t>
+      </w:r>
+      <w:r>
+        <w:br/>
+        <w:t>32% Low</w:t>
+      </w:r>
+    </w:p>
+    <w:p>
+      <w:r>
+        <w:pict w14:anchorId="089BDADF">
+          <v:rect id="_x0000_i1080" style="width:0;height:1.5pt" o:hralign="center" o:hrstd="t" o:hr="t" fillcolor="#a0a0a0" stroked="f"/>
+        </w:pict>
+      </w:r>
+    </w:p>
+    <w:p>
+      <w:pPr>
+        <w:rPr>
+          <w:b/>
+          <w:bCs/>
+        </w:rPr>
+      </w:pPr>
+      <w:r>
+        <w:rPr>
+          <w:b/>
+          <w:bCs/>
+        </w:rPr>
+        <w:t>Deliverables</w:t>
+      </w:r>
+    </w:p>
+    <w:p>
+      <w:r>
+        <w:lastRenderedPageBreak/>
+        <w:t>When you're finished, your Excel workbook might contain worksheets like:</w:t>
+      </w:r>
+    </w:p>
+    <w:p>
+      <w:r>
+        <w:t>01_Average_Median</w:t>
+      </w:r>
+      <w:r>
+        <w:br/>
+      </w:r>
+      <w:r>
+        <w:br/>
+        <w:t>02_Wait_Time_by_Day</w:t>
+      </w:r>
+      <w:r>
+        <w:br/>
+      </w:r>
+      <w:r>
+        <w:br/>
+        <w:t>03_Patient_Volume_by_Hour</w:t>
+      </w:r>
+      <w:r>
+        <w:br/>
+      </w:r>
+      <w:r>
+        <w:br/>
+        <w:t>04_Severity_Analysis</w:t>
+      </w:r>
+      <w:r>
+        <w:br/>
+      </w:r>
+      <w:r>
+        <w:br/>
+        <w:t>05_Admission_Analysis</w:t>
+      </w:r>
+      <w:r>
+        <w:br/>
+      </w:r>
+      <w:r>
+        <w:br/>
+        <w:t>06_Validation_Summary</w:t>
+      </w:r>
+    </w:p>
+    <w:p/>
+    <w:p>
+      <w:proofErr w:type="gramStart"/>
+      <w:r>
+        <w:t>each</w:t>
+      </w:r>
+      <w:proofErr w:type="gramEnd"/>
+      <w:r>
+        <w:t xml:space="preserve"> worksheet will more accurately be 1 for each business question I answered. </w:t>
+      </w:r>
+      <w:proofErr w:type="gramStart"/>
+      <w:r>
+        <w:t>So</w:t>
+      </w:r>
+      <w:proofErr w:type="gramEnd"/>
+      <w:r>
+        <w:t xml:space="preserve"> </w:t>
+      </w:r>
+      <w:proofErr w:type="gramStart"/>
+      <w:r>
+        <w:t>refer back</w:t>
+      </w:r>
+      <w:proofErr w:type="gramEnd"/>
+      <w:r>
+        <w:t xml:space="preserve"> to </w:t>
+      </w:r>
+      <w:proofErr w:type="gramStart"/>
+      <w:r>
+        <w:t xml:space="preserve">the </w:t>
+      </w:r>
+      <w:proofErr w:type="spellStart"/>
+      <w:r>
+        <w:t>the</w:t>
+      </w:r>
+      <w:proofErr w:type="spellEnd"/>
+      <w:proofErr w:type="gramEnd"/>
+      <w:r>
+        <w:t xml:space="preserve"> questions I answered in Phase 2, and that should be the number of worksheets in Phase 3. </w:t>
+      </w:r>
+    </w:p>
+    <w:p>
+      <w:pPr>
+        <w:rPr>
+          <w:u w:val="single"/>
+        </w:rPr>
+      </w:pPr>
+    </w:p>
+    <w:p>
+      <w:pPr>
+        <w:rPr>
+          <w:u w:val="single"/>
+        </w:rPr>
+      </w:pPr>
+    </w:p>
+    <w:p>
+      <w:pPr>
+        <w:rPr>
+          <w:u w:val="single"/>
+        </w:rPr>
+      </w:pPr>
+      <w:r>
+        <w:rPr>
+          <w:u w:val="single"/>
+        </w:rPr>
+        <w:t xml:space="preserve">Phase 2: Exploratory SQL | Created 7-10-2026 | </w:t>
+      </w:r>
+      <w:r>
+        <w:rPr>
+          <w:b/>
+          <w:bCs/>
+          <w:u w:val="single"/>
+        </w:rPr>
+        <w:t>Completed</w:t>
+      </w:r>
+      <w:r>
+        <w:rPr>
+          <w:b/>
+          <w:bCs/>
+          <w:u w:val="single"/>
+        </w:rPr>
+        <w:t xml:space="preserve"> 7/15/2026</w:t>
+      </w:r>
+    </w:p>
+    <w:p>
+      <w:r>
+        <w:t>Beginning to answer business questions:</w:t>
+      </w:r>
+    </w:p>
+    <w:p>
+      <w:pPr>
+        <w:pStyle w:val="ListParagraph"/>
+        <w:numPr>
+          <w:ilvl w:val="0"/>
+          <w:numId w:val="6"/>
+        </w:numPr>
+      </w:pPr>
+      <w:r>
+        <w:t xml:space="preserve">What </w:t>
+      </w:r>
+      <w:proofErr w:type="gramStart"/>
+      <w:r>
+        <w:t>is</w:t>
+      </w:r>
+      <w:proofErr w:type="gramEnd"/>
+      <w:r>
+        <w:t xml:space="preserve"> the average and median ER wait time?</w:t>
+      </w:r>
+    </w:p>
+    <w:p>
+      <w:pPr>
+        <w:pStyle w:val="ListParagraph"/>
+        <w:numPr>
+          <w:ilvl w:val="1"/>
+          <w:numId w:val="6"/>
+        </w:numPr>
+      </w:pPr>
+      <w:r>
+        <w:t>Average wait time is 74 minutes (74.31)</w:t>
+      </w:r>
+    </w:p>
+    <w:p>
+      <w:pPr>
+        <w:pStyle w:val="ListParagraph"/>
+        <w:numPr>
+          <w:ilvl w:val="1"/>
+          <w:numId w:val="6"/>
+        </w:numPr>
+      </w:pPr>
+      <w:r>
+        <w:t xml:space="preserve">Median </w:t>
+      </w:r>
+      <w:proofErr w:type="gramStart"/>
+      <w:r>
+        <w:t>wait</w:t>
+      </w:r>
+      <w:proofErr w:type="gramEnd"/>
+      <w:r>
+        <w:t xml:space="preserve"> time is 67 minutes </w:t>
+      </w:r>
+    </w:p>
+    <w:p>
+      <w:pPr>
+        <w:pStyle w:val="ListParagraph"/>
+        <w:numPr>
+          <w:ilvl w:val="0"/>
+          <w:numId w:val="6"/>
+        </w:numPr>
+      </w:pPr>
+      <w:r>
+        <w:t>Which days have the longest wait times?</w:t>
+      </w:r>
+    </w:p>
+    <w:p>
+      <w:pPr>
+        <w:pStyle w:val="ListParagraph"/>
+        <w:numPr>
+          <w:ilvl w:val="1"/>
+          <w:numId w:val="6"/>
+        </w:numPr>
+      </w:pPr>
+      <w:r>
+        <w:t xml:space="preserve">The longest observed ER wait times (180 minutes) occurred on Mondays, Tuesdays, Thursdays, and Saturday. </w:t>
+      </w:r>
+      <w:r>
+        <w:t xml:space="preserve"> </w:t>
+      </w:r>
+    </w:p>
+    <w:p>
+      <w:pPr>
+        <w:pStyle w:val="ListParagraph"/>
+        <w:numPr>
+          <w:ilvl w:val="0"/>
+          <w:numId w:val="6"/>
+        </w:numPr>
+      </w:pPr>
+      <w:r>
+        <w:t>Which hours experience the highest patient volume?</w:t>
+      </w:r>
+    </w:p>
+    <w:p>
+      <w:pPr>
+        <w:pStyle w:val="ListParagraph"/>
+        <w:numPr>
+          <w:ilvl w:val="1"/>
+          <w:numId w:val="6"/>
+        </w:numPr>
+      </w:pPr>
+      <w:r>
+        <w:t xml:space="preserve">The top </w:t>
+      </w:r>
+      <w:proofErr w:type="gramStart"/>
+      <w:r>
+        <w:t>3</w:t>
+      </w:r>
+      <w:r>
+        <w:t>,</w:t>
+      </w:r>
+      <w:proofErr w:type="gramEnd"/>
+      <w:r>
+        <w:t xml:space="preserve"> </w:t>
+      </w:r>
+      <w:r>
+        <w:t xml:space="preserve">hours of the day that experienced the most patients in a day are 02:00 at 144 pts, 21:00 at 141 pts, and 0:00 with 140 pts. </w:t>
+      </w:r>
+    </w:p>
+    <w:p>
+      <w:pPr>
+        <w:pStyle w:val="ListParagraph"/>
+        <w:numPr>
+          <w:ilvl w:val="0"/>
+          <w:numId w:val="6"/>
+        </w:numPr>
+      </w:pPr>
+      <w:r>
+        <w:t>Does severity level affect wait-time?</w:t>
+      </w:r>
+    </w:p>
+    <w:p>
+      <w:pPr>
+        <w:pStyle w:val="ListParagraph"/>
+        <w:numPr>
+          <w:ilvl w:val="1"/>
+          <w:numId w:val="6"/>
+        </w:numPr>
+      </w:pPr>
+      <w:r>
+        <w:t xml:space="preserve">Yes, the lower the severity level, the longer a patient will wait. </w:t>
+      </w:r>
+      <w:r>
+        <w:t>Low severity level patients are 36 times more likely to experience longer wait times exceeding 2 hours</w:t>
+      </w:r>
+      <w:r>
+        <w:t xml:space="preserve">, </w:t>
+      </w:r>
+      <w:r>
+        <w:t xml:space="preserve">than medium severity level patients. </w:t>
+      </w:r>
+      <w:proofErr w:type="gramStart"/>
+      <w:r>
+        <w:t>Also</w:t>
+      </w:r>
+      <w:proofErr w:type="gramEnd"/>
+      <w:r>
+        <w:t xml:space="preserve"> High severity </w:t>
+      </w:r>
+      <w:r>
+        <w:lastRenderedPageBreak/>
+        <w:t xml:space="preserve">level patients never get seen past 1 hour, and Critical severity level patients get </w:t>
+      </w:r>
+      <w:proofErr w:type="gramStart"/>
+      <w:r>
+        <w:t>seen</w:t>
+      </w:r>
+      <w:proofErr w:type="gramEnd"/>
+      <w:r>
+        <w:t xml:space="preserve"> between 1-15 minutes. </w:t>
+      </w:r>
+    </w:p>
+    <w:p>
+      <w:pPr>
+        <w:pStyle w:val="ListParagraph"/>
+        <w:numPr>
+          <w:ilvl w:val="0"/>
+          <w:numId w:val="6"/>
+        </w:numPr>
+      </w:pPr>
+      <w:r>
+        <w:t>Are admitted patients waiting longer than discharged patients?</w:t>
+      </w:r>
+    </w:p>
+    <w:p>
+      <w:pPr>
+        <w:pStyle w:val="ListParagraph"/>
+        <w:numPr>
+          <w:ilvl w:val="1"/>
+          <w:numId w:val="6"/>
+        </w:numPr>
+      </w:pPr>
+      <w:r>
+        <w:t xml:space="preserve">Yes, but not by much. Admitted patients wait an average of 76 minutes while discharged patients wait an average of 73 minutes. </w:t>
+      </w:r>
+    </w:p>
+    <w:p>
+      <w:pPr>
+        <w:pStyle w:val="ListParagraph"/>
+        <w:numPr>
+          <w:ilvl w:val="0"/>
+          <w:numId w:val="6"/>
+        </w:numPr>
+      </w:pPr>
+      <w:r>
+        <w:t>Are there operational bottlenecks that explain patient complaints?</w:t>
+      </w:r>
+    </w:p>
+    <w:p>
+      <w:pPr>
+        <w:pStyle w:val="ListParagraph"/>
+        <w:numPr>
+          <w:ilvl w:val="1"/>
+          <w:numId w:val="6"/>
+        </w:numPr>
+        <w:rPr>
+          <w:u w:val="single"/>
+        </w:rPr>
+      </w:pPr>
+      <w:r>
+        <w:t xml:space="preserve">During peak-volume periods, 39% of patients </w:t>
+      </w:r>
+      <w:r>
+        <w:t>were classified as</w:t>
+      </w:r>
+      <w:r>
+        <w:t xml:space="preserve"> </w:t>
+      </w:r>
+      <w:r>
+        <w:t>m</w:t>
+      </w:r>
+      <w:r>
+        <w:t xml:space="preserve">edium severity </w:t>
+      </w:r>
+      <w:r>
+        <w:t xml:space="preserve">and </w:t>
+      </w:r>
+      <w:r>
+        <w:t xml:space="preserve">32% </w:t>
+      </w:r>
+      <w:r>
+        <w:t>as</w:t>
+      </w:r>
+      <w:r>
+        <w:t xml:space="preserve"> low severity.</w:t>
+      </w:r>
+      <w:r>
+        <w:t xml:space="preserve"> These patient groups accounted for </w:t>
+      </w:r>
+      <w:proofErr w:type="gramStart"/>
+      <w:r>
+        <w:t>the majority of</w:t>
+      </w:r>
+      <w:proofErr w:type="gramEnd"/>
+      <w:r>
+        <w:t xml:space="preserve"> ER visits during the busiest periods of the day.</w:t>
+      </w:r>
+      <w:r>
+        <w:t xml:space="preserve"> </w:t>
+      </w:r>
+      <w:r>
+        <w:t>The average length of stay for these patients is 7 hours.</w:t>
+      </w:r>
+      <w:r>
+        <w:t xml:space="preserve"> </w:t>
+      </w:r>
+      <w:r>
+        <w:t xml:space="preserve">The findings suggest periods of increased demand that may exceed the operational capacity available. Additional investigation into staffing levels and patient flow is recommended. </w:t>
+      </w:r>
+    </w:p>
+    <w:p>
+      <w:pPr>
+        <w:pStyle w:val="ListParagraph"/>
+        <w:ind w:left="1440"/>
+        <w:rPr>
+          <w:u w:val="single"/>
+        </w:rPr>
+      </w:pPr>
+    </w:p>
+    <w:p>
+      <w:pPr>
+        <w:pStyle w:val="ListParagraph"/>
+        <w:ind w:left="1440"/>
+        <w:rPr>
+          <w:u w:val="single"/>
+        </w:rPr>
+      </w:pPr>
+    </w:p>
+    <w:p>
+      <w:pPr>
+        <w:pStyle w:val="ListParagraph"/>
+        <w:ind w:left="1440"/>
+        <w:rPr>
+          <w:u w:val="single"/>
+        </w:rPr>
+      </w:pPr>
+    </w:p>
+    <w:p>
+      <w:pPr>
+        <w:rPr>
+          <w:u w:val="single"/>
+        </w:rPr>
+      </w:pPr>
+      <w:r>
+        <w:t xml:space="preserve"> </w:t>
+      </w:r>
+      <w:r>
+        <w:rPr>
+          <w:u w:val="single"/>
+        </w:rPr>
+        <w:t xml:space="preserve">Started </w:t>
+      </w:r>
+      <w:r>
+        <w:rPr>
+          <w:u w:val="single"/>
+        </w:rPr>
+        <w:t>7</w:t>
+      </w:r>
+      <w:r>
+        <w:rPr>
+          <w:u w:val="single"/>
+        </w:rPr>
+        <w:t>-</w:t>
+      </w:r>
+      <w:r>
+        <w:rPr>
+          <w:u w:val="single"/>
+        </w:rPr>
+        <w:t>4-2026</w:t>
+      </w:r>
+      <w:r>
+        <w:rPr>
+          <w:u w:val="single"/>
+        </w:rPr>
+        <w:t xml:space="preserve">: </w:t>
+      </w:r>
+      <w:r>
+        <w:rPr>
+          <w:u w:val="single"/>
+        </w:rPr>
+        <w:t>Phase</w:t>
+      </w:r>
+      <w:r>
+        <w:rPr>
+          <w:u w:val="single"/>
+        </w:rPr>
+        <w:t xml:space="preserve"> 1</w:t>
+      </w:r>
+      <w:r>
+        <w:rPr>
+          <w:u w:val="single"/>
+        </w:rPr>
+        <w:t xml:space="preserve"> </w:t>
+      </w:r>
+      <w:r>
+        <w:rPr>
+          <w:u w:val="single"/>
+        </w:rPr>
+        <w:t>–</w:t>
+      </w:r>
+      <w:r>
+        <w:rPr>
+          <w:u w:val="single"/>
+        </w:rPr>
+        <w:t xml:space="preserve"> </w:t>
+      </w:r>
+      <w:r>
+        <w:rPr>
+          <w:u w:val="single"/>
+        </w:rPr>
+        <w:t>Da</w:t>
+      </w:r>
+      <w:r>
+        <w:rPr>
+          <w:u w:val="single"/>
+        </w:rPr>
+        <w:t>ta Fami</w:t>
+      </w:r>
+      <w:r>
+        <w:rPr>
+          <w:u w:val="single"/>
+        </w:rPr>
+        <w:t>li</w:t>
+      </w:r>
+      <w:r>
+        <w:rPr>
+          <w:u w:val="single"/>
+        </w:rPr>
+        <w:t>ar</w:t>
+      </w:r>
+      <w:r>
+        <w:rPr>
+          <w:u w:val="single"/>
+        </w:rPr>
+        <w:t>izat</w:t>
+      </w:r>
+      <w:r>
+        <w:rPr>
+          <w:u w:val="single"/>
+        </w:rPr>
+        <w:t>ion</w:t>
+      </w:r>
+      <w:r>
+        <w:rPr>
+          <w:u w:val="single"/>
+        </w:rPr>
+        <w:t xml:space="preserve"> </w:t>
+      </w:r>
+      <w:r>
+        <w:rPr>
+          <w:b/>
+          <w:bCs/>
+          <w:u w:val="single"/>
+        </w:rPr>
         <w:t>Completed 7/10/2026</w:t>
       </w:r>
     </w:p>
@@ -379,7 +1069,15 @@
     </w:p>
     <w:p>
       <w:r>
-        <w:t>2. Identify the primary and Foreign key(s).</w:t>
+        <w:t xml:space="preserve">2. Identify the primary and </w:t>
+      </w:r>
+      <w:proofErr w:type="gramStart"/>
+      <w:r>
+        <w:t>Foreign</w:t>
+      </w:r>
+      <w:proofErr w:type="gramEnd"/>
+      <w:r>
+        <w:t xml:space="preserve"> key(s).</w:t>
       </w:r>
     </w:p>
     <w:p>
@@ -390,8 +1088,13 @@
           <w:numId w:val="4"/>
         </w:numPr>
       </w:pPr>
-      <w:r>
-        <w:t>Er_visits:</w:t>
+      <w:proofErr w:type="spellStart"/>
+      <w:r>
+        <w:t>Er_visits</w:t>
+      </w:r>
+      <w:proofErr w:type="spellEnd"/>
+      <w:r>
+        <w:t>:</w:t>
       </w:r>
     </w:p>
     <w:p>
@@ -402,8 +1105,13 @@
           <w:numId w:val="4"/>
         </w:numPr>
       </w:pPr>
-      <w:r>
-        <w:t>Visit_id (PK)</w:t>
+      <w:proofErr w:type="spellStart"/>
+      <w:r>
+        <w:t>Visit_id</w:t>
+      </w:r>
+      <w:proofErr w:type="spellEnd"/>
+      <w:r>
+        <w:t xml:space="preserve"> (PK)</w:t>
       </w:r>
     </w:p>
     <w:p>
@@ -414,9 +1122,13 @@
           <w:numId w:val="4"/>
         </w:numPr>
       </w:pPr>
-      <w:r>
-        <w:lastRenderedPageBreak/>
-        <w:t>Patient_id (FK)</w:t>
+      <w:proofErr w:type="spellStart"/>
+      <w:r>
+        <w:t>Patient_id</w:t>
+      </w:r>
+      <w:proofErr w:type="spellEnd"/>
+      <w:r>
+        <w:t xml:space="preserve"> (FK)</w:t>
       </w:r>
     </w:p>
     <w:p>
@@ -442,8 +1154,13 @@
           <w:numId w:val="4"/>
         </w:numPr>
       </w:pPr>
-      <w:r>
-        <w:t>Appointment_id (PK)</w:t>
+      <w:proofErr w:type="spellStart"/>
+      <w:r>
+        <w:t>Appointment_id</w:t>
+      </w:r>
+      <w:proofErr w:type="spellEnd"/>
+      <w:r>
+        <w:t xml:space="preserve"> (PK)</w:t>
       </w:r>
     </w:p>
     <w:p>
@@ -454,8 +1171,13 @@
           <w:numId w:val="4"/>
         </w:numPr>
       </w:pPr>
-      <w:r>
-        <w:t>Patient_id (FK)</w:t>
+      <w:proofErr w:type="spellStart"/>
+      <w:r>
+        <w:t>Patient_id</w:t>
+      </w:r>
+      <w:proofErr w:type="spellEnd"/>
+      <w:r>
+        <w:t xml:space="preserve"> (FK)</w:t>
       </w:r>
     </w:p>
     <w:p>
@@ -466,8 +1188,13 @@
           <w:numId w:val="4"/>
         </w:numPr>
       </w:pPr>
-      <w:r>
-        <w:t>Provider_id (FK</w:t>
+      <w:proofErr w:type="spellStart"/>
+      <w:r>
+        <w:t>Provider_id</w:t>
+      </w:r>
+      <w:proofErr w:type="spellEnd"/>
+      <w:r>
+        <w:t xml:space="preserve"> (FK</w:t>
       </w:r>
       <w:r>
         <w:t>)</w:t>
@@ -505,6 +1232,7 @@
           <w:numId w:val="4"/>
         </w:numPr>
       </w:pPr>
+      <w:proofErr w:type="spellStart"/>
       <w:r>
         <w:t>P</w:t>
       </w:r>
@@ -515,7 +1243,11 @@
         <w:t>tient_</w:t>
       </w:r>
       <w:r>
-        <w:t xml:space="preserve">id </w:t>
+        <w:t>id</w:t>
+      </w:r>
+      <w:proofErr w:type="spellEnd"/>
+      <w:r>
+        <w:t xml:space="preserve"> </w:t>
       </w:r>
       <w:r>
         <w:t>(</w:t>
@@ -556,6 +1288,7 @@
           <w:numId w:val="4"/>
         </w:numPr>
       </w:pPr>
+      <w:proofErr w:type="spellStart"/>
       <w:r>
         <w:t>P</w:t>
       </w:r>
@@ -566,7 +1299,11 @@
         <w:t>ider</w:t>
       </w:r>
       <w:r>
-        <w:t xml:space="preserve">_id </w:t>
+        <w:t>_id</w:t>
+      </w:r>
+      <w:proofErr w:type="spellEnd"/>
+      <w:r>
+        <w:t xml:space="preserve"> </w:t>
       </w:r>
       <w:r>
         <w:t>(</w:t>
@@ -600,7 +1337,9 @@
           <w:numId w:val="3"/>
         </w:numPr>
       </w:pPr>
-      <w:r>
+      <w:proofErr w:type="spellStart"/>
+      <w:r>
+        <w:lastRenderedPageBreak/>
         <w:t>Er</w:t>
       </w:r>
       <w:r>
@@ -610,7 +1349,11 @@
         <w:t>vi</w:t>
       </w:r>
       <w:r>
-        <w:t xml:space="preserve">sits </w:t>
+        <w:t>sits</w:t>
+      </w:r>
+      <w:proofErr w:type="spellEnd"/>
+      <w:r>
+        <w:t xml:space="preserve"> </w:t>
       </w:r>
       <w:r>
         <w:t>dat</w:t>
@@ -630,6 +1373,7 @@
       <w:r>
         <w:t xml:space="preserve"> </w:t>
       </w:r>
+      <w:proofErr w:type="gramStart"/>
       <w:r>
         <w:t>patie</w:t>
       </w:r>
@@ -637,7 +1381,11 @@
         <w:t>nt</w:t>
       </w:r>
       <w:r>
-        <w:t>s data</w:t>
+        <w:t>s</w:t>
+      </w:r>
+      <w:proofErr w:type="gramEnd"/>
+      <w:r>
+        <w:t xml:space="preserve"> data</w:t>
       </w:r>
       <w:r>
         <w:t>se</w:t>
@@ -881,6 +1629,7 @@
           <w:numId w:val="1"/>
         </w:numPr>
       </w:pPr>
+      <w:proofErr w:type="spellStart"/>
       <w:r>
         <w:t>E</w:t>
       </w:r>
@@ -894,7 +1643,11 @@
         <w:t>vis</w:t>
       </w:r>
       <w:r>
-        <w:t>its:</w:t>
+        <w:t>its</w:t>
+      </w:r>
+      <w:proofErr w:type="spellEnd"/>
+      <w:r>
+        <w:t>:</w:t>
       </w:r>
     </w:p>
     <w:p>
@@ -905,6 +1658,7 @@
           <w:numId w:val="1"/>
         </w:numPr>
       </w:pPr>
+      <w:proofErr w:type="spellStart"/>
       <w:r>
         <w:t>V</w:t>
       </w:r>
@@ -914,6 +1668,7 @@
       <w:r>
         <w:t>sit_id</w:t>
       </w:r>
+      <w:proofErr w:type="spellEnd"/>
     </w:p>
     <w:p>
       <w:pPr>
@@ -936,7 +1691,15 @@
         <w:t>imary ke</w:t>
       </w:r>
       <w:r>
-        <w:t>y to i</w:t>
+        <w:t xml:space="preserve">y </w:t>
+      </w:r>
+      <w:proofErr w:type="gramStart"/>
+      <w:r>
+        <w:t>to</w:t>
+      </w:r>
+      <w:proofErr w:type="gramEnd"/>
+      <w:r>
+        <w:t xml:space="preserve"> i</w:t>
       </w:r>
       <w:r>
         <w:t>d</w:t>
@@ -974,6 +1737,7 @@
           <w:numId w:val="1"/>
         </w:numPr>
       </w:pPr>
+      <w:proofErr w:type="spellStart"/>
       <w:r>
         <w:t>P</w:t>
       </w:r>
@@ -986,6 +1750,7 @@
       <w:r>
         <w:t>_id</w:t>
       </w:r>
+      <w:proofErr w:type="spellEnd"/>
     </w:p>
     <w:p>
       <w:pPr>
@@ -1076,12 +1841,14 @@
       <w:r>
         <w:t xml:space="preserve">the </w:t>
       </w:r>
+      <w:proofErr w:type="gramStart"/>
       <w:r>
         <w:t>pati</w:t>
       </w:r>
       <w:r>
         <w:t>ents</w:t>
       </w:r>
+      <w:proofErr w:type="gramEnd"/>
       <w:r>
         <w:t xml:space="preserve"> da</w:t>
       </w:r>
@@ -1100,6 +1867,7 @@
           <w:numId w:val="1"/>
         </w:numPr>
       </w:pPr>
+      <w:proofErr w:type="spellStart"/>
       <w:r>
         <w:t>A</w:t>
       </w:r>
@@ -1112,6 +1880,7 @@
       <w:r>
         <w:t>date</w:t>
       </w:r>
+      <w:proofErr w:type="spellEnd"/>
     </w:p>
     <w:p>
       <w:pPr>
@@ -1154,6 +1923,7 @@
           <w:numId w:val="1"/>
         </w:numPr>
       </w:pPr>
+      <w:proofErr w:type="spellStart"/>
       <w:r>
         <w:t>Arrival</w:t>
       </w:r>
@@ -1163,6 +1933,7 @@
       <w:r>
         <w:t>day</w:t>
       </w:r>
+      <w:proofErr w:type="spellEnd"/>
     </w:p>
     <w:p>
       <w:pPr>
@@ -1208,6 +1979,7 @@
           <w:numId w:val="1"/>
         </w:numPr>
       </w:pPr>
+      <w:proofErr w:type="spellStart"/>
       <w:r>
         <w:t>Ar</w:t>
       </w:r>
@@ -1220,6 +1992,7 @@
       <w:r>
         <w:t>r</w:t>
       </w:r>
+      <w:proofErr w:type="spellEnd"/>
     </w:p>
     <w:p>
       <w:pPr>
@@ -1283,6 +2056,7 @@
           <w:numId w:val="1"/>
         </w:numPr>
       </w:pPr>
+      <w:proofErr w:type="spellStart"/>
       <w:r>
         <w:t>S</w:t>
       </w:r>
@@ -1298,6 +2072,7 @@
       <w:r>
         <w:t>el</w:t>
       </w:r>
+      <w:proofErr w:type="spellEnd"/>
     </w:p>
     <w:p>
       <w:pPr>
@@ -1349,6 +2124,7 @@
           <w:numId w:val="1"/>
         </w:numPr>
       </w:pPr>
+      <w:proofErr w:type="spellStart"/>
       <w:r>
         <w:t>Wait_tim</w:t>
       </w:r>
@@ -1361,6 +2137,7 @@
       <w:r>
         <w:t>s</w:t>
       </w:r>
+      <w:proofErr w:type="spellEnd"/>
     </w:p>
     <w:p>
       <w:pPr>
@@ -1412,6 +2189,7 @@
           <w:numId w:val="1"/>
         </w:numPr>
       </w:pPr>
+      <w:proofErr w:type="spellStart"/>
       <w:r>
         <w:t>L</w:t>
       </w:r>
@@ -1433,6 +2211,7 @@
       <w:r>
         <w:t>ours</w:t>
       </w:r>
+      <w:proofErr w:type="spellEnd"/>
     </w:p>
     <w:p>
       <w:pPr>
@@ -1443,57 +2222,944 @@
         </w:numPr>
       </w:pPr>
       <w:r>
+        <w:t xml:space="preserve">The </w:t>
+      </w:r>
+      <w:r>
+        <w:t>number</w:t>
+      </w:r>
+      <w:r>
+        <w:t xml:space="preserve"> of</w:t>
+      </w:r>
+      <w:r>
+        <w:t xml:space="preserve"> </w:t>
+      </w:r>
+      <w:proofErr w:type="gramStart"/>
+      <w:r>
+        <w:t>hour</w:t>
+      </w:r>
+      <w:proofErr w:type="gramEnd"/>
+      <w:r>
+        <w:t>(s)</w:t>
+      </w:r>
+      <w:r>
+        <w:t xml:space="preserve"> a </w:t>
+      </w:r>
+      <w:r>
+        <w:t>patient</w:t>
+      </w:r>
+      <w:r>
+        <w:t xml:space="preserve"> </w:t>
+      </w:r>
+      <w:r>
+        <w:t xml:space="preserve">stayed </w:t>
+      </w:r>
+      <w:r>
+        <w:t>in the E</w:t>
+      </w:r>
+      <w:r>
+        <w:t>R</w:t>
+      </w:r>
+      <w:r>
+        <w:t xml:space="preserve">, from arrival until discharge from the ER or admission to the hospital. </w:t>
+      </w:r>
+    </w:p>
+    <w:p>
+      <w:pPr>
+        <w:pStyle w:val="ListParagraph"/>
+        <w:numPr>
+          <w:ilvl w:val="3"/>
+          <w:numId w:val="1"/>
+        </w:numPr>
+      </w:pPr>
+      <w:r>
+        <w:t>Hospital stay after admission is not included in this field (</w:t>
+      </w:r>
+      <w:proofErr w:type="spellStart"/>
+      <w:r>
+        <w:t>losh</w:t>
+      </w:r>
+      <w:proofErr w:type="spellEnd"/>
+      <w:r>
+        <w:t>)</w:t>
+      </w:r>
+    </w:p>
+    <w:p>
+      <w:pPr>
+        <w:pStyle w:val="ListParagraph"/>
+        <w:numPr>
+          <w:ilvl w:val="1"/>
+          <w:numId w:val="1"/>
+        </w:numPr>
+      </w:pPr>
+      <w:r>
+        <w:t>A</w:t>
+      </w:r>
+      <w:r>
+        <w:t>dm</w:t>
+      </w:r>
+      <w:r>
+        <w:t>itted</w:t>
+      </w:r>
+    </w:p>
+    <w:p>
+      <w:pPr>
+        <w:pStyle w:val="ListParagraph"/>
+        <w:numPr>
+          <w:ilvl w:val="2"/>
+          <w:numId w:val="1"/>
+        </w:numPr>
+      </w:pPr>
+      <w:r>
+        <w:t xml:space="preserve">Yes: </w:t>
+      </w:r>
+      <w:r>
+        <w:t xml:space="preserve">Shows </w:t>
+      </w:r>
+      <w:r>
+        <w:t>pati</w:t>
+      </w:r>
+      <w:r>
+        <w:t xml:space="preserve">ents </w:t>
+      </w:r>
+      <w:r>
+        <w:t xml:space="preserve">who </w:t>
+      </w:r>
+      <w:r>
+        <w:t>hav</w:t>
+      </w:r>
+      <w:r>
+        <w:t>e</w:t>
+      </w:r>
+      <w:r>
+        <w:t xml:space="preserve"> be</w:t>
+      </w:r>
+      <w:r>
+        <w:t>en assi</w:t>
+      </w:r>
+      <w:r>
+        <w:t>gned to st</w:t>
+      </w:r>
+      <w:r>
+        <w:t>ay at t</w:t>
+      </w:r>
+      <w:r>
+        <w:t xml:space="preserve">he </w:t>
+      </w:r>
+      <w:proofErr w:type="gramStart"/>
+      <w:r>
+        <w:t>ho</w:t>
+      </w:r>
+      <w:r>
+        <w:t>spital</w:t>
+      </w:r>
+      <w:r>
+        <w:t xml:space="preserve">, </w:t>
+      </w:r>
+      <w:r>
+        <w:t xml:space="preserve"> or</w:t>
+      </w:r>
+      <w:proofErr w:type="gramEnd"/>
+      <w:r>
+        <w:t xml:space="preserve"> </w:t>
+      </w:r>
+      <w:r>
+        <w:t xml:space="preserve">No: </w:t>
+      </w:r>
+      <w:r>
+        <w:t>dis</w:t>
+      </w:r>
+      <w:r>
+        <w:t>cha</w:t>
+      </w:r>
+      <w:r>
+        <w:t>rg</w:t>
+      </w:r>
+      <w:r>
+        <w:t xml:space="preserve">ed </w:t>
+      </w:r>
+      <w:r>
+        <w:t>afte</w:t>
+      </w:r>
+      <w:r>
+        <w:t xml:space="preserve">r being </w:t>
+      </w:r>
+      <w:r>
+        <w:t xml:space="preserve">seen in the </w:t>
+      </w:r>
+      <w:r>
+        <w:t xml:space="preserve">ER. </w:t>
+      </w:r>
+    </w:p>
+    <w:p>
+      <w:pPr>
+        <w:pStyle w:val="ListParagraph"/>
+        <w:numPr>
+          <w:ilvl w:val="0"/>
+          <w:numId w:val="1"/>
+        </w:numPr>
+      </w:pPr>
+      <w:r>
+        <w:t>A</w:t>
+      </w:r>
+      <w:r>
+        <w:t>p</w:t>
+      </w:r>
+      <w:r>
+        <w:t>pointment</w:t>
+      </w:r>
+      <w:r>
+        <w:t>s</w:t>
+      </w:r>
+    </w:p>
+    <w:p>
+      <w:pPr>
+        <w:pStyle w:val="ListParagraph"/>
+        <w:numPr>
+          <w:ilvl w:val="1"/>
+          <w:numId w:val="1"/>
+        </w:numPr>
+      </w:pPr>
+      <w:proofErr w:type="spellStart"/>
+      <w:r>
+        <w:t>A</w:t>
+      </w:r>
+      <w:r>
+        <w:t>pp</w:t>
+      </w:r>
+      <w:r>
+        <w:t>ointment</w:t>
+      </w:r>
+      <w:r>
+        <w:t>_id</w:t>
+      </w:r>
+      <w:proofErr w:type="spellEnd"/>
+    </w:p>
+    <w:p>
+      <w:pPr>
+        <w:pStyle w:val="ListParagraph"/>
+        <w:numPr>
+          <w:ilvl w:val="2"/>
+          <w:numId w:val="1"/>
+        </w:numPr>
+      </w:pPr>
+      <w:r>
+        <w:t>A number to identify</w:t>
+      </w:r>
+      <w:r>
+        <w:t xml:space="preserve"> each appointment at the </w:t>
+      </w:r>
+      <w:r>
+        <w:t>Valley Regional Medical Center</w:t>
+      </w:r>
+      <w:r>
+        <w:t xml:space="preserve">. </w:t>
+      </w:r>
+    </w:p>
+    <w:p>
+      <w:pPr>
+        <w:pStyle w:val="ListParagraph"/>
+        <w:numPr>
+          <w:ilvl w:val="1"/>
+          <w:numId w:val="1"/>
+        </w:numPr>
+      </w:pPr>
+      <w:proofErr w:type="spellStart"/>
+      <w:r>
+        <w:t>P</w:t>
+      </w:r>
+      <w:r>
+        <w:t>ati</w:t>
+      </w:r>
+      <w:r>
+        <w:t>ent_id</w:t>
+      </w:r>
+      <w:proofErr w:type="spellEnd"/>
+    </w:p>
+    <w:p>
+      <w:pPr>
+        <w:pStyle w:val="ListParagraph"/>
+        <w:numPr>
+          <w:ilvl w:val="2"/>
+          <w:numId w:val="1"/>
+        </w:numPr>
+      </w:pPr>
+      <w:r>
         <w:lastRenderedPageBreak/>
-        <w:t xml:space="preserve">The </w:t>
-      </w:r>
-      <w:r>
-        <w:t>number</w:t>
-      </w:r>
-      <w:r>
-        <w:t xml:space="preserve"> of</w:t>
-      </w:r>
+        <w:t>An id, referencing a specific patient. The details of the p</w:t>
+      </w:r>
+      <w:r>
+        <w:t>atient</w:t>
+      </w:r>
+      <w:r>
+        <w:t xml:space="preserve"> will be found withing the patient dataset. </w:t>
+      </w:r>
+    </w:p>
+    <w:p>
+      <w:pPr>
+        <w:pStyle w:val="ListParagraph"/>
+        <w:numPr>
+          <w:ilvl w:val="1"/>
+          <w:numId w:val="1"/>
+        </w:numPr>
+      </w:pPr>
+      <w:proofErr w:type="spellStart"/>
+      <w:r>
+        <w:t>P</w:t>
+      </w:r>
+      <w:r>
+        <w:t>rovi</w:t>
+      </w:r>
+      <w:r>
+        <w:t>der_id</w:t>
+      </w:r>
+      <w:proofErr w:type="spellEnd"/>
+    </w:p>
+    <w:p>
+      <w:pPr>
+        <w:pStyle w:val="ListParagraph"/>
+        <w:numPr>
+          <w:ilvl w:val="2"/>
+          <w:numId w:val="1"/>
+        </w:numPr>
+      </w:pPr>
+      <w:r>
+        <w:t>An id</w:t>
+      </w:r>
+      <w:r>
+        <w:t>,</w:t>
+      </w:r>
+      <w:r>
+        <w:t xml:space="preserve"> referencing a specific provider. The details of the provider will be found withing the provider dataset. </w:t>
+      </w:r>
+    </w:p>
+    <w:p>
+      <w:pPr>
+        <w:pStyle w:val="ListParagraph"/>
+        <w:numPr>
+          <w:ilvl w:val="1"/>
+          <w:numId w:val="1"/>
+        </w:numPr>
+      </w:pPr>
+      <w:r>
+        <w:t>D</w:t>
+      </w:r>
+      <w:r>
+        <w:t>e</w:t>
+      </w:r>
+      <w:r>
+        <w:t>part</w:t>
+      </w:r>
+      <w:r>
+        <w:t>ment</w:t>
+      </w:r>
+    </w:p>
+    <w:p>
+      <w:pPr>
+        <w:pStyle w:val="ListParagraph"/>
+        <w:numPr>
+          <w:ilvl w:val="2"/>
+          <w:numId w:val="1"/>
+        </w:numPr>
+      </w:pPr>
+      <w:r>
+        <w:t xml:space="preserve">Shows which department the appointment is associated with. </w:t>
+      </w:r>
+    </w:p>
+    <w:p>
+      <w:pPr>
+        <w:pStyle w:val="ListParagraph"/>
+        <w:numPr>
+          <w:ilvl w:val="1"/>
+          <w:numId w:val="1"/>
+        </w:numPr>
+      </w:pPr>
+      <w:proofErr w:type="spellStart"/>
+      <w:r>
+        <w:t>A</w:t>
+      </w:r>
+      <w:r>
+        <w:t>ppo</w:t>
+      </w:r>
+      <w:r>
+        <w:t>intment</w:t>
+      </w:r>
+      <w:r>
+        <w:t>_date</w:t>
+      </w:r>
+      <w:proofErr w:type="spellEnd"/>
+    </w:p>
+    <w:p>
+      <w:pPr>
+        <w:pStyle w:val="ListParagraph"/>
+        <w:numPr>
+          <w:ilvl w:val="2"/>
+          <w:numId w:val="1"/>
+        </w:numPr>
+      </w:pPr>
+      <w:r>
+        <w:t xml:space="preserve">Shows the date of the appointment. </w:t>
+      </w:r>
+    </w:p>
+    <w:p>
+      <w:pPr>
+        <w:pStyle w:val="ListParagraph"/>
+        <w:numPr>
+          <w:ilvl w:val="1"/>
+          <w:numId w:val="1"/>
+        </w:numPr>
+      </w:pPr>
+      <w:proofErr w:type="spellStart"/>
+      <w:r>
+        <w:t>A</w:t>
+      </w:r>
+      <w:r>
+        <w:t>pp</w:t>
+      </w:r>
+      <w:r>
+        <w:t>ointment</w:t>
+      </w:r>
+      <w:r>
+        <w:t>_day</w:t>
+      </w:r>
+      <w:proofErr w:type="spellEnd"/>
+    </w:p>
+    <w:p>
+      <w:pPr>
+        <w:pStyle w:val="ListParagraph"/>
+        <w:numPr>
+          <w:ilvl w:val="2"/>
+          <w:numId w:val="1"/>
+        </w:numPr>
+      </w:pPr>
+      <w:r>
+        <w:t xml:space="preserve">Shows the day of the week the appointment was on. </w:t>
+      </w:r>
+    </w:p>
+    <w:p>
+      <w:pPr>
+        <w:pStyle w:val="ListParagraph"/>
+        <w:numPr>
+          <w:ilvl w:val="1"/>
+          <w:numId w:val="1"/>
+        </w:numPr>
+      </w:pPr>
+      <w:proofErr w:type="spellStart"/>
+      <w:r>
+        <w:t>A</w:t>
+      </w:r>
+      <w:r>
+        <w:t>ppoint</w:t>
+      </w:r>
+      <w:r>
+        <w:t>ment_ty</w:t>
+      </w:r>
+      <w:r>
+        <w:t>pe</w:t>
+      </w:r>
+      <w:proofErr w:type="spellEnd"/>
+    </w:p>
+    <w:p>
+      <w:pPr>
+        <w:pStyle w:val="ListParagraph"/>
+        <w:numPr>
+          <w:ilvl w:val="2"/>
+          <w:numId w:val="1"/>
+        </w:numPr>
+      </w:pPr>
+      <w:r>
+        <w:t xml:space="preserve">Defines the type of appointment </w:t>
+      </w:r>
+    </w:p>
+    <w:p>
+      <w:pPr>
+        <w:pStyle w:val="ListParagraph"/>
+        <w:numPr>
+          <w:ilvl w:val="1"/>
+          <w:numId w:val="1"/>
+        </w:numPr>
+      </w:pPr>
+      <w:proofErr w:type="spellStart"/>
+      <w:r>
+        <w:t>A</w:t>
+      </w:r>
+      <w:r>
+        <w:t>pp</w:t>
+      </w:r>
+      <w:r>
+        <w:t>ointment</w:t>
+      </w:r>
+      <w:r>
+        <w:t>_</w:t>
+      </w:r>
+      <w:r>
+        <w:t>sta</w:t>
+      </w:r>
+      <w:r>
+        <w:t>tus</w:t>
+      </w:r>
+      <w:proofErr w:type="spellEnd"/>
+    </w:p>
+    <w:p>
+      <w:pPr>
+        <w:pStyle w:val="ListParagraph"/>
+        <w:numPr>
+          <w:ilvl w:val="2"/>
+          <w:numId w:val="1"/>
+        </w:numPr>
+      </w:pPr>
+      <w:r>
+        <w:t xml:space="preserve">Defines an appointment as either </w:t>
+      </w:r>
+      <w:r>
+        <w:t>Completed, Cancelled, or no-show</w:t>
+      </w:r>
+    </w:p>
+    <w:p>
+      <w:pPr>
+        <w:pStyle w:val="ListParagraph"/>
+        <w:numPr>
+          <w:ilvl w:val="1"/>
+          <w:numId w:val="1"/>
+        </w:numPr>
+      </w:pPr>
+      <w:proofErr w:type="spellStart"/>
+      <w:r>
+        <w:t>A</w:t>
+      </w:r>
+      <w:r>
+        <w:t>pp</w:t>
+      </w:r>
+      <w:r>
+        <w:t>ointment</w:t>
+      </w:r>
+      <w:r>
+        <w:t>_dura</w:t>
+      </w:r>
+      <w:r>
+        <w:t>tion</w:t>
+      </w:r>
+      <w:r>
+        <w:t>_</w:t>
+      </w:r>
+      <w:r>
+        <w:t>min</w:t>
+      </w:r>
+      <w:r>
+        <w:t>utes</w:t>
+      </w:r>
+      <w:proofErr w:type="spellEnd"/>
+    </w:p>
+    <w:p>
+      <w:pPr>
+        <w:pStyle w:val="ListParagraph"/>
+        <w:numPr>
+          <w:ilvl w:val="2"/>
+          <w:numId w:val="1"/>
+        </w:numPr>
+      </w:pPr>
+      <w:r>
+        <w:t xml:space="preserve">Shows length of time </w:t>
+      </w:r>
+      <w:r>
+        <w:t xml:space="preserve">for the appointment </w:t>
+      </w:r>
+    </w:p>
+    <w:p>
+      <w:pPr>
+        <w:pStyle w:val="ListParagraph"/>
+        <w:numPr>
+          <w:ilvl w:val="1"/>
+          <w:numId w:val="1"/>
+        </w:numPr>
+      </w:pPr>
+      <w:proofErr w:type="spellStart"/>
+      <w:r>
+        <w:t>P</w:t>
+      </w:r>
+      <w:r>
+        <w:t>atient</w:t>
+      </w:r>
+      <w:r>
+        <w:t>_</w:t>
+      </w:r>
+      <w:r>
+        <w:t>s</w:t>
+      </w:r>
+      <w:r>
+        <w:t>a</w:t>
+      </w:r>
+      <w:r>
+        <w:t>tient_</w:t>
+      </w:r>
+      <w:r>
+        <w:t>satis</w:t>
+      </w:r>
+      <w:r>
+        <w:t>factio</w:t>
+      </w:r>
+      <w:r>
+        <w:t>n_</w:t>
+      </w:r>
+      <w:r>
+        <w:t>scor</w:t>
+      </w:r>
+      <w:r>
+        <w:t>e</w:t>
+      </w:r>
+      <w:proofErr w:type="spellEnd"/>
       <w:r>
         <w:t xml:space="preserve"> </w:t>
       </w:r>
-      <w:r>
-        <w:t>hour</w:t>
-      </w:r>
-      <w:r>
-        <w:t>(s)</w:t>
-      </w:r>
-      <w:r>
-        <w:t xml:space="preserve"> a </w:t>
-      </w:r>
-      <w:r>
-        <w:t>patient</w:t>
+    </w:p>
+    <w:p>
+      <w:pPr>
+        <w:pStyle w:val="ListParagraph"/>
+        <w:numPr>
+          <w:ilvl w:val="2"/>
+          <w:numId w:val="1"/>
+        </w:numPr>
+      </w:pPr>
+      <w:r>
+        <w:t xml:space="preserve">A </w:t>
+      </w:r>
+      <w:r>
+        <w:t xml:space="preserve">decimal scale from </w:t>
+      </w:r>
+      <w:r>
+        <w:t xml:space="preserve">1-5 </w:t>
+      </w:r>
+      <w:proofErr w:type="spellStart"/>
+      <w:r>
+        <w:t>ignifying</w:t>
+      </w:r>
+      <w:proofErr w:type="spellEnd"/>
+      <w:r>
+        <w:t xml:space="preserve"> patient satisfaction</w:t>
+      </w:r>
+    </w:p>
+    <w:p>
+      <w:pPr>
+        <w:pStyle w:val="ListParagraph"/>
+        <w:numPr>
+          <w:ilvl w:val="3"/>
+          <w:numId w:val="1"/>
+        </w:numPr>
+      </w:pPr>
+      <w:r>
+        <w:t xml:space="preserve">There </w:t>
+      </w:r>
+      <w:r>
+        <w:t>are</w:t>
+      </w:r>
+      <w:r>
+        <w:t xml:space="preserve"> about 1,000</w:t>
+      </w:r>
+      <w:r>
+        <w:t xml:space="preserve"> appointments with miss</w:t>
+      </w:r>
+      <w:r>
+        <w:t>ing</w:t>
+      </w:r>
+      <w:r>
+        <w:t xml:space="preserve"> satisfaction scores. </w:t>
+      </w:r>
+      <w:r>
+        <w:t xml:space="preserve">Null values will mean patients </w:t>
+      </w:r>
+      <w:proofErr w:type="gramStart"/>
+      <w:r>
+        <w:t>either</w:t>
+      </w:r>
+      <w:proofErr w:type="gramEnd"/>
+      <w:r>
+        <w:t xml:space="preserve"> canceled or no-show. </w:t>
+      </w:r>
+    </w:p>
+    <w:p>
+      <w:pPr>
+        <w:pStyle w:val="ListParagraph"/>
+        <w:numPr>
+          <w:ilvl w:val="0"/>
+          <w:numId w:val="1"/>
+        </w:numPr>
+      </w:pPr>
+      <w:r>
+        <w:t>Patients</w:t>
+      </w:r>
+    </w:p>
+    <w:p>
+      <w:pPr>
+        <w:pStyle w:val="ListParagraph"/>
+        <w:numPr>
+          <w:ilvl w:val="1"/>
+          <w:numId w:val="1"/>
+        </w:numPr>
+      </w:pPr>
+      <w:proofErr w:type="spellStart"/>
+      <w:r>
+        <w:t>Patient_id</w:t>
+      </w:r>
+      <w:proofErr w:type="spellEnd"/>
+    </w:p>
+    <w:p>
+      <w:pPr>
+        <w:pStyle w:val="ListParagraph"/>
+        <w:numPr>
+          <w:ilvl w:val="2"/>
+          <w:numId w:val="1"/>
+        </w:numPr>
+      </w:pPr>
+      <w:r>
+        <w:t xml:space="preserve">Unique identifier for each patient. </w:t>
+      </w:r>
+    </w:p>
+    <w:p>
+      <w:pPr>
+        <w:pStyle w:val="ListParagraph"/>
+        <w:numPr>
+          <w:ilvl w:val="1"/>
+          <w:numId w:val="1"/>
+        </w:numPr>
+      </w:pPr>
+      <w:proofErr w:type="spellStart"/>
+      <w:r>
+        <w:t>Patient_name</w:t>
+      </w:r>
+      <w:proofErr w:type="spellEnd"/>
+    </w:p>
+    <w:p>
+      <w:pPr>
+        <w:pStyle w:val="ListParagraph"/>
+        <w:numPr>
+          <w:ilvl w:val="2"/>
+          <w:numId w:val="1"/>
+        </w:numPr>
+      </w:pPr>
+      <w:r>
+        <w:t xml:space="preserve">First and last name of patient </w:t>
+      </w:r>
+    </w:p>
+    <w:p>
+      <w:pPr>
+        <w:pStyle w:val="ListParagraph"/>
+        <w:numPr>
+          <w:ilvl w:val="3"/>
+          <w:numId w:val="1"/>
+        </w:numPr>
+      </w:pPr>
+      <w:r>
+        <w:t xml:space="preserve">First and last name are within the same record. I’m wondering if it’s best to do splitting so that first and last name have their own fields.  </w:t>
+      </w:r>
+    </w:p>
+    <w:p>
+      <w:pPr>
+        <w:pStyle w:val="ListParagraph"/>
+        <w:numPr>
+          <w:ilvl w:val="1"/>
+          <w:numId w:val="1"/>
+        </w:numPr>
+      </w:pPr>
+      <w:r>
+        <w:t>Age</w:t>
+      </w:r>
+    </w:p>
+    <w:p>
+      <w:pPr>
+        <w:pStyle w:val="ListParagraph"/>
+        <w:numPr>
+          <w:ilvl w:val="2"/>
+          <w:numId w:val="1"/>
+        </w:numPr>
+      </w:pPr>
+      <w:r>
+        <w:t>Age in years of patient</w:t>
+      </w:r>
+    </w:p>
+    <w:p>
+      <w:pPr>
+        <w:pStyle w:val="ListParagraph"/>
+        <w:numPr>
+          <w:ilvl w:val="1"/>
+          <w:numId w:val="1"/>
+        </w:numPr>
+      </w:pPr>
+      <w:r>
+        <w:t>Gender</w:t>
+      </w:r>
+    </w:p>
+    <w:p>
+      <w:pPr>
+        <w:pStyle w:val="ListParagraph"/>
+        <w:numPr>
+          <w:ilvl w:val="2"/>
+          <w:numId w:val="1"/>
+        </w:numPr>
+      </w:pPr>
+      <w:r>
+        <w:t xml:space="preserve">Biological sex of patient </w:t>
+      </w:r>
+    </w:p>
+    <w:p>
+      <w:pPr>
+        <w:pStyle w:val="ListParagraph"/>
+        <w:numPr>
+          <w:ilvl w:val="1"/>
+          <w:numId w:val="1"/>
+        </w:numPr>
+      </w:pPr>
+      <w:r>
+        <w:t xml:space="preserve">City </w:t>
+      </w:r>
+    </w:p>
+    <w:p>
+      <w:pPr>
+        <w:pStyle w:val="ListParagraph"/>
+        <w:numPr>
+          <w:ilvl w:val="2"/>
+          <w:numId w:val="1"/>
+        </w:numPr>
+      </w:pPr>
+      <w:r>
+        <w:t xml:space="preserve">The city where the patient is from </w:t>
+      </w:r>
+    </w:p>
+    <w:p>
+      <w:pPr>
+        <w:pStyle w:val="ListParagraph"/>
+        <w:numPr>
+          <w:ilvl w:val="0"/>
+          <w:numId w:val="1"/>
+        </w:numPr>
+      </w:pPr>
+      <w:r>
+        <w:t>Providers</w:t>
+      </w:r>
+    </w:p>
+    <w:p>
+      <w:pPr>
+        <w:pStyle w:val="ListParagraph"/>
+        <w:numPr>
+          <w:ilvl w:val="1"/>
+          <w:numId w:val="1"/>
+        </w:numPr>
+      </w:pPr>
+      <w:proofErr w:type="spellStart"/>
+      <w:r>
+        <w:t>Provider_id</w:t>
+      </w:r>
+      <w:proofErr w:type="spellEnd"/>
+    </w:p>
+    <w:p>
+      <w:pPr>
+        <w:pStyle w:val="ListParagraph"/>
+        <w:numPr>
+          <w:ilvl w:val="2"/>
+          <w:numId w:val="1"/>
+        </w:numPr>
+      </w:pPr>
+      <w:r>
+        <w:lastRenderedPageBreak/>
+        <w:t xml:space="preserve">Unique identifier for each provider. </w:t>
+      </w:r>
+    </w:p>
+    <w:p>
+      <w:pPr>
+        <w:pStyle w:val="ListParagraph"/>
+        <w:numPr>
+          <w:ilvl w:val="1"/>
+          <w:numId w:val="1"/>
+        </w:numPr>
+      </w:pPr>
+      <w:r>
+        <w:t>Provider_name</w:t>
+      </w:r>
+    </w:p>
+    <w:p>
+      <w:pPr>
+        <w:pStyle w:val="ListParagraph"/>
+        <w:numPr>
+          <w:ilvl w:val="2"/>
+          <w:numId w:val="1"/>
+        </w:numPr>
+      </w:pPr>
+      <w:r>
+        <w:t>First and last name of provider</w:t>
+      </w:r>
+    </w:p>
+    <w:p>
+      <w:pPr>
+        <w:pStyle w:val="ListParagraph"/>
+        <w:numPr>
+          <w:ilvl w:val="3"/>
+          <w:numId w:val="1"/>
+        </w:numPr>
+      </w:pPr>
+      <w:r>
+        <w:t>Jessica Allen (</w:t>
+      </w:r>
+      <w:proofErr w:type="spellStart"/>
+      <w:r>
+        <w:t>provider_id</w:t>
+      </w:r>
+      <w:proofErr w:type="spellEnd"/>
+      <w:r>
+        <w:t xml:space="preserve">: 19) is the only provider with </w:t>
+      </w:r>
+      <w:r>
+        <w:t xml:space="preserve">‘Dr.’ within the </w:t>
+      </w:r>
+      <w:proofErr w:type="spellStart"/>
+      <w:r>
+        <w:t>provider_name</w:t>
+      </w:r>
+      <w:proofErr w:type="spellEnd"/>
+      <w:r>
+        <w:t xml:space="preserve"> field. Should all records have Dr., or since she’s the only one, can we just remove </w:t>
+      </w:r>
+      <w:r>
+        <w:t xml:space="preserve">Dr. from her record. Since they are all providers, it is already assumed that they are doctors. </w:t>
+      </w:r>
+    </w:p>
+    <w:p>
+      <w:pPr>
+        <w:pStyle w:val="ListParagraph"/>
+        <w:numPr>
+          <w:ilvl w:val="4"/>
+          <w:numId w:val="1"/>
+        </w:numPr>
+      </w:pPr>
+      <w:r>
+        <w:t xml:space="preserve">I removed “Dr.” prefix from </w:t>
+      </w:r>
+      <w:proofErr w:type="spellStart"/>
+      <w:r>
+        <w:t>provider_id</w:t>
+      </w:r>
+      <w:proofErr w:type="spellEnd"/>
+      <w:r>
+        <w:t xml:space="preserve">: 19 record to standardize provider-name formatting. </w:t>
+      </w:r>
+    </w:p>
+    <w:p>
+      <w:pPr>
+        <w:pStyle w:val="ListParagraph"/>
+        <w:numPr>
+          <w:ilvl w:val="3"/>
+          <w:numId w:val="1"/>
+        </w:numPr>
+      </w:pPr>
+      <w:r>
+        <w:t xml:space="preserve">First </w:t>
+      </w:r>
+      <w:r>
+        <w:t xml:space="preserve">and last name are within the same record. I’m wondering if it’s best to do </w:t>
+      </w:r>
+      <w:r>
+        <w:t xml:space="preserve">splitting so that first and last name have their own fields. </w:t>
       </w:r>
       <w:r>
         <w:t xml:space="preserve"> </w:t>
       </w:r>
-      <w:r>
-        <w:t xml:space="preserve">stayed </w:t>
-      </w:r>
-      <w:r>
-        <w:t>in the E</w:t>
-      </w:r>
-      <w:r>
-        <w:t>R</w:t>
-      </w:r>
-      <w:r>
-        <w:t xml:space="preserve">, from arrival until discharge from the ER or admission to the hospital. </w:t>
-      </w:r>
-    </w:p>
-    <w:p>
-      <w:pPr>
-        <w:pStyle w:val="ListParagraph"/>
-        <w:numPr>
-          <w:ilvl w:val="3"/>
-          <w:numId w:val="1"/>
-        </w:numPr>
-      </w:pPr>
-      <w:r>
-        <w:t>Hospital stay after admission is not included in this field (losh)</w:t>
-      </w:r>
     </w:p>
     <w:p>
       <w:pPr>
@@ -1504,13 +3170,7 @@
         </w:numPr>
       </w:pPr>
       <w:r>
-        <w:t>A</w:t>
-      </w:r>
-      <w:r>
-        <w:t>dm</w:t>
-      </w:r>
-      <w:r>
-        <w:t>itted</w:t>
+        <w:t>Department</w:t>
       </w:r>
     </w:p>
     <w:p>
@@ -1522,97 +3182,7 @@
         </w:numPr>
       </w:pPr>
       <w:r>
-        <w:t xml:space="preserve">Yes: </w:t>
-      </w:r>
-      <w:r>
-        <w:t xml:space="preserve">Shows </w:t>
-      </w:r>
-      <w:r>
-        <w:t>pati</w:t>
-      </w:r>
-      <w:r>
-        <w:t xml:space="preserve">ents </w:t>
-      </w:r>
-      <w:r>
-        <w:t xml:space="preserve">who </w:t>
-      </w:r>
-      <w:r>
-        <w:t>hav</w:t>
-      </w:r>
-      <w:r>
-        <w:t>e</w:t>
-      </w:r>
-      <w:r>
-        <w:t xml:space="preserve"> be</w:t>
-      </w:r>
-      <w:r>
-        <w:t>en assi</w:t>
-      </w:r>
-      <w:r>
-        <w:t>gned to st</w:t>
-      </w:r>
-      <w:r>
-        <w:t>ay at t</w:t>
-      </w:r>
-      <w:r>
-        <w:t>he ho</w:t>
-      </w:r>
-      <w:r>
-        <w:t>spital</w:t>
-      </w:r>
-      <w:r>
-        <w:t xml:space="preserve">, </w:t>
-      </w:r>
-      <w:r>
-        <w:t xml:space="preserve"> or </w:t>
-      </w:r>
-      <w:r>
-        <w:t xml:space="preserve">No: </w:t>
-      </w:r>
-      <w:r>
-        <w:t>dis</w:t>
-      </w:r>
-      <w:r>
-        <w:t>cha</w:t>
-      </w:r>
-      <w:r>
-        <w:t>rg</w:t>
-      </w:r>
-      <w:r>
-        <w:t xml:space="preserve">ed </w:t>
-      </w:r>
-      <w:r>
-        <w:t>afte</w:t>
-      </w:r>
-      <w:r>
-        <w:t xml:space="preserve">r being </w:t>
-      </w:r>
-      <w:r>
-        <w:t xml:space="preserve">seen in the </w:t>
-      </w:r>
-      <w:r>
-        <w:t xml:space="preserve">ER. </w:t>
-      </w:r>
-    </w:p>
-    <w:p>
-      <w:pPr>
-        <w:pStyle w:val="ListParagraph"/>
-        <w:numPr>
-          <w:ilvl w:val="0"/>
-          <w:numId w:val="1"/>
-        </w:numPr>
-      </w:pPr>
-      <w:r>
-        <w:t>A</w:t>
-      </w:r>
-      <w:r>
-        <w:t>p</w:t>
-      </w:r>
-      <w:r>
-        <w:t>pointment</w:t>
-      </w:r>
-      <w:r>
-        <w:t>s</w:t>
+        <w:t xml:space="preserve">The department which the provider is from </w:t>
       </w:r>
     </w:p>
     <w:p>
@@ -1623,721 +3193,11 @@
           <w:numId w:val="1"/>
         </w:numPr>
       </w:pPr>
-      <w:r>
-        <w:t>A</w:t>
-      </w:r>
-      <w:r>
-        <w:t>pp</w:t>
-      </w:r>
-      <w:r>
-        <w:t>ointment</w:t>
-      </w:r>
-      <w:r>
-        <w:t>_id</w:t>
-      </w:r>
-    </w:p>
-    <w:p>
-      <w:pPr>
-        <w:pStyle w:val="ListParagraph"/>
-        <w:numPr>
-          <w:ilvl w:val="2"/>
-          <w:numId w:val="1"/>
-        </w:numPr>
-      </w:pPr>
-      <w:r>
-        <w:t>A number to identify</w:t>
-      </w:r>
-      <w:r>
-        <w:t xml:space="preserve"> each appointment at the </w:t>
-      </w:r>
-      <w:r>
-        <w:t>Valley Regional Medical Center</w:t>
-      </w:r>
-      <w:r>
-        <w:t xml:space="preserve">. </w:t>
-      </w:r>
-    </w:p>
-    <w:p>
-      <w:pPr>
-        <w:pStyle w:val="ListParagraph"/>
-        <w:numPr>
-          <w:ilvl w:val="1"/>
-          <w:numId w:val="1"/>
-        </w:numPr>
-      </w:pPr>
-      <w:r>
-        <w:t>P</w:t>
-      </w:r>
-      <w:r>
-        <w:t>ati</w:t>
-      </w:r>
-      <w:r>
-        <w:t>ent_id</w:t>
-      </w:r>
-    </w:p>
-    <w:p>
-      <w:pPr>
-        <w:pStyle w:val="ListParagraph"/>
-        <w:numPr>
-          <w:ilvl w:val="2"/>
-          <w:numId w:val="1"/>
-        </w:numPr>
-      </w:pPr>
-      <w:r>
-        <w:t>An id, referencing a specific patient. The details of the p</w:t>
-      </w:r>
-      <w:r>
-        <w:t>atient</w:t>
-      </w:r>
-      <w:r>
-        <w:t xml:space="preserve"> will be found withing the patient dataset. </w:t>
-      </w:r>
-    </w:p>
-    <w:p>
-      <w:pPr>
-        <w:pStyle w:val="ListParagraph"/>
-        <w:numPr>
-          <w:ilvl w:val="1"/>
-          <w:numId w:val="1"/>
-        </w:numPr>
-      </w:pPr>
-      <w:r>
-        <w:t>P</w:t>
-      </w:r>
-      <w:r>
-        <w:t>rovi</w:t>
-      </w:r>
-      <w:r>
-        <w:t>der_id</w:t>
-      </w:r>
-    </w:p>
-    <w:p>
-      <w:pPr>
-        <w:pStyle w:val="ListParagraph"/>
-        <w:numPr>
-          <w:ilvl w:val="2"/>
-          <w:numId w:val="1"/>
-        </w:numPr>
-      </w:pPr>
-      <w:r>
-        <w:t>An id</w:t>
-      </w:r>
-      <w:r>
-        <w:t>,</w:t>
-      </w:r>
-      <w:r>
-        <w:t xml:space="preserve"> referencing a specific provider. The details of the provider will be found withing the provider dataset. </w:t>
-      </w:r>
-    </w:p>
-    <w:p>
-      <w:pPr>
-        <w:pStyle w:val="ListParagraph"/>
-        <w:numPr>
-          <w:ilvl w:val="1"/>
-          <w:numId w:val="1"/>
-        </w:numPr>
-      </w:pPr>
-      <w:r>
-        <w:t>D</w:t>
-      </w:r>
-      <w:r>
-        <w:t>e</w:t>
-      </w:r>
-      <w:r>
-        <w:t>part</w:t>
-      </w:r>
-      <w:r>
-        <w:t>ment</w:t>
-      </w:r>
-    </w:p>
-    <w:p>
-      <w:pPr>
-        <w:pStyle w:val="ListParagraph"/>
-        <w:numPr>
-          <w:ilvl w:val="2"/>
-          <w:numId w:val="1"/>
-        </w:numPr>
-      </w:pPr>
-      <w:r>
-        <w:t xml:space="preserve">Shows which department the appointment is associated with. </w:t>
-      </w:r>
-    </w:p>
-    <w:p>
-      <w:pPr>
-        <w:pStyle w:val="ListParagraph"/>
-        <w:numPr>
-          <w:ilvl w:val="1"/>
-          <w:numId w:val="1"/>
-        </w:numPr>
-      </w:pPr>
-      <w:r>
-        <w:t>A</w:t>
-      </w:r>
-      <w:r>
-        <w:t>ppo</w:t>
-      </w:r>
-      <w:r>
-        <w:t>intment</w:t>
-      </w:r>
-      <w:r>
-        <w:t>_date</w:t>
-      </w:r>
-    </w:p>
-    <w:p>
-      <w:pPr>
-        <w:pStyle w:val="ListParagraph"/>
-        <w:numPr>
-          <w:ilvl w:val="2"/>
-          <w:numId w:val="1"/>
-        </w:numPr>
-      </w:pPr>
-      <w:r>
-        <w:t xml:space="preserve">Shows the date of the appointment. </w:t>
-      </w:r>
-    </w:p>
-    <w:p>
-      <w:pPr>
-        <w:pStyle w:val="ListParagraph"/>
-        <w:numPr>
-          <w:ilvl w:val="1"/>
-          <w:numId w:val="1"/>
-        </w:numPr>
-      </w:pPr>
-      <w:r>
-        <w:t>A</w:t>
-      </w:r>
-      <w:r>
-        <w:t>pp</w:t>
-      </w:r>
-      <w:r>
-        <w:t>ointment</w:t>
-      </w:r>
-      <w:r>
-        <w:t>_day</w:t>
-      </w:r>
-    </w:p>
-    <w:p>
-      <w:pPr>
-        <w:pStyle w:val="ListParagraph"/>
-        <w:numPr>
-          <w:ilvl w:val="2"/>
-          <w:numId w:val="1"/>
-        </w:numPr>
-      </w:pPr>
-      <w:r>
-        <w:t xml:space="preserve">Shows the day of the week the appointment was on. </w:t>
-      </w:r>
-    </w:p>
-    <w:p>
-      <w:pPr>
-        <w:pStyle w:val="ListParagraph"/>
-        <w:numPr>
-          <w:ilvl w:val="1"/>
-          <w:numId w:val="1"/>
-        </w:numPr>
-      </w:pPr>
-      <w:r>
-        <w:t>A</w:t>
-      </w:r>
-      <w:r>
-        <w:t>ppoint</w:t>
-      </w:r>
-      <w:r>
-        <w:t>ment_ty</w:t>
-      </w:r>
-      <w:r>
-        <w:t>pe</w:t>
-      </w:r>
-    </w:p>
-    <w:p>
-      <w:pPr>
-        <w:pStyle w:val="ListParagraph"/>
-        <w:numPr>
-          <w:ilvl w:val="2"/>
-          <w:numId w:val="1"/>
-        </w:numPr>
-      </w:pPr>
-      <w:r>
-        <w:t xml:space="preserve">Defines the type of appointment </w:t>
-      </w:r>
-    </w:p>
-    <w:p>
-      <w:pPr>
-        <w:pStyle w:val="ListParagraph"/>
-        <w:numPr>
-          <w:ilvl w:val="1"/>
-          <w:numId w:val="1"/>
-        </w:numPr>
-      </w:pPr>
-      <w:r>
-        <w:t>A</w:t>
-      </w:r>
-      <w:r>
-        <w:t>pp</w:t>
-      </w:r>
-      <w:r>
-        <w:t>ointment</w:t>
-      </w:r>
-      <w:r>
-        <w:t>_</w:t>
-      </w:r>
-      <w:r>
-        <w:t>sta</w:t>
-      </w:r>
-      <w:r>
-        <w:t>tus</w:t>
-      </w:r>
-    </w:p>
-    <w:p>
-      <w:pPr>
-        <w:pStyle w:val="ListParagraph"/>
-        <w:numPr>
-          <w:ilvl w:val="2"/>
-          <w:numId w:val="1"/>
-        </w:numPr>
-      </w:pPr>
-      <w:r>
-        <w:t xml:space="preserve">Defines an appointment as either </w:t>
-      </w:r>
-      <w:r>
-        <w:t>Completed, Cancelled, or no-show</w:t>
-      </w:r>
-    </w:p>
-    <w:p>
-      <w:pPr>
-        <w:pStyle w:val="ListParagraph"/>
-        <w:numPr>
-          <w:ilvl w:val="1"/>
-          <w:numId w:val="1"/>
-        </w:numPr>
-      </w:pPr>
-      <w:r>
-        <w:t>A</w:t>
-      </w:r>
-      <w:r>
-        <w:t>pp</w:t>
-      </w:r>
-      <w:r>
-        <w:t>ointment</w:t>
-      </w:r>
-      <w:r>
-        <w:t>_dura</w:t>
-      </w:r>
-      <w:r>
-        <w:t>tion</w:t>
-      </w:r>
-      <w:r>
-        <w:t>_</w:t>
-      </w:r>
-      <w:r>
-        <w:t>min</w:t>
-      </w:r>
-      <w:r>
-        <w:t>utes</w:t>
-      </w:r>
-    </w:p>
-    <w:p>
-      <w:pPr>
-        <w:pStyle w:val="ListParagraph"/>
-        <w:numPr>
-          <w:ilvl w:val="2"/>
-          <w:numId w:val="1"/>
-        </w:numPr>
-      </w:pPr>
-      <w:r>
-        <w:t xml:space="preserve">Shows length of time </w:t>
-      </w:r>
-      <w:r>
-        <w:t xml:space="preserve">for the appointment </w:t>
-      </w:r>
-    </w:p>
-    <w:p>
-      <w:pPr>
-        <w:pStyle w:val="ListParagraph"/>
-        <w:numPr>
-          <w:ilvl w:val="1"/>
-          <w:numId w:val="1"/>
-        </w:numPr>
-      </w:pPr>
-      <w:r>
-        <w:t>P</w:t>
-      </w:r>
-      <w:r>
-        <w:t>atient</w:t>
-      </w:r>
-      <w:r>
-        <w:t>_</w:t>
-      </w:r>
-      <w:r>
-        <w:t>s</w:t>
-      </w:r>
-      <w:r>
-        <w:t>a</w:t>
-      </w:r>
-      <w:r>
-        <w:t>tient_</w:t>
-      </w:r>
-      <w:r>
-        <w:t>satis</w:t>
-      </w:r>
-      <w:r>
-        <w:t>factio</w:t>
-      </w:r>
-      <w:r>
-        <w:t>n_</w:t>
-      </w:r>
-      <w:r>
-        <w:t>scor</w:t>
-      </w:r>
-      <w:r>
-        <w:t>e</w:t>
-      </w:r>
-      <w:r>
-        <w:t xml:space="preserve"> </w:t>
-      </w:r>
-    </w:p>
-    <w:p>
-      <w:pPr>
-        <w:pStyle w:val="ListParagraph"/>
-        <w:numPr>
-          <w:ilvl w:val="2"/>
-          <w:numId w:val="1"/>
-        </w:numPr>
-      </w:pPr>
-      <w:r>
-        <w:t xml:space="preserve">A </w:t>
-      </w:r>
-      <w:r>
-        <w:t xml:space="preserve">decimal scale from </w:t>
-      </w:r>
-      <w:r>
-        <w:t xml:space="preserve">1-5 </w:t>
-      </w:r>
-      <w:r>
-        <w:t>ignifying patient satisfaction</w:t>
-      </w:r>
-    </w:p>
-    <w:p>
-      <w:pPr>
-        <w:pStyle w:val="ListParagraph"/>
-        <w:numPr>
-          <w:ilvl w:val="3"/>
-          <w:numId w:val="1"/>
-        </w:numPr>
-      </w:pPr>
-      <w:r>
-        <w:t xml:space="preserve">There </w:t>
-      </w:r>
-      <w:r>
-        <w:t>are</w:t>
-      </w:r>
-      <w:r>
-        <w:t xml:space="preserve"> about 1,000</w:t>
-      </w:r>
-      <w:r>
-        <w:t xml:space="preserve"> appointments with miss</w:t>
-      </w:r>
-      <w:r>
-        <w:t>ing</w:t>
-      </w:r>
-      <w:r>
-        <w:t xml:space="preserve"> satisfaction scores. </w:t>
-      </w:r>
-      <w:r>
-        <w:t xml:space="preserve">Null values will mean patients either canceled or no-show. </w:t>
-      </w:r>
-    </w:p>
-    <w:p>
-      <w:pPr>
-        <w:pStyle w:val="ListParagraph"/>
-        <w:numPr>
-          <w:ilvl w:val="0"/>
-          <w:numId w:val="1"/>
-        </w:numPr>
-      </w:pPr>
-      <w:r>
-        <w:t>Patients</w:t>
-      </w:r>
-    </w:p>
-    <w:p>
-      <w:pPr>
-        <w:pStyle w:val="ListParagraph"/>
-        <w:numPr>
-          <w:ilvl w:val="1"/>
-          <w:numId w:val="1"/>
-        </w:numPr>
-      </w:pPr>
-      <w:r>
-        <w:t>Patient_id</w:t>
-      </w:r>
-    </w:p>
-    <w:p>
-      <w:pPr>
-        <w:pStyle w:val="ListParagraph"/>
-        <w:numPr>
-          <w:ilvl w:val="2"/>
-          <w:numId w:val="1"/>
-        </w:numPr>
-      </w:pPr>
-      <w:r>
-        <w:t xml:space="preserve">Unique identifier for each patient. </w:t>
-      </w:r>
-    </w:p>
-    <w:p>
-      <w:pPr>
-        <w:pStyle w:val="ListParagraph"/>
-        <w:numPr>
-          <w:ilvl w:val="1"/>
-          <w:numId w:val="1"/>
-        </w:numPr>
-      </w:pPr>
-      <w:r>
-        <w:t>Patient_name</w:t>
-      </w:r>
-    </w:p>
-    <w:p>
-      <w:pPr>
-        <w:pStyle w:val="ListParagraph"/>
-        <w:numPr>
-          <w:ilvl w:val="2"/>
-          <w:numId w:val="1"/>
-        </w:numPr>
-      </w:pPr>
-      <w:r>
-        <w:t xml:space="preserve">First and last name of patient </w:t>
-      </w:r>
-    </w:p>
-    <w:p>
-      <w:pPr>
-        <w:pStyle w:val="ListParagraph"/>
-        <w:numPr>
-          <w:ilvl w:val="3"/>
-          <w:numId w:val="1"/>
-        </w:numPr>
-      </w:pPr>
-      <w:r>
-        <w:lastRenderedPageBreak/>
-        <w:t xml:space="preserve">First and last name are within the same record. I’m wondering if it’s best to do splitting so that first and last name have their own fields.  </w:t>
-      </w:r>
-    </w:p>
-    <w:p>
-      <w:pPr>
-        <w:pStyle w:val="ListParagraph"/>
-        <w:numPr>
-          <w:ilvl w:val="1"/>
-          <w:numId w:val="1"/>
-        </w:numPr>
-      </w:pPr>
-      <w:r>
-        <w:t>Age</w:t>
-      </w:r>
-    </w:p>
-    <w:p>
-      <w:pPr>
-        <w:pStyle w:val="ListParagraph"/>
-        <w:numPr>
-          <w:ilvl w:val="2"/>
-          <w:numId w:val="1"/>
-        </w:numPr>
-      </w:pPr>
-      <w:r>
-        <w:t>Age in years of patient</w:t>
-      </w:r>
-    </w:p>
-    <w:p>
-      <w:pPr>
-        <w:pStyle w:val="ListParagraph"/>
-        <w:numPr>
-          <w:ilvl w:val="1"/>
-          <w:numId w:val="1"/>
-        </w:numPr>
-      </w:pPr>
-      <w:r>
-        <w:t>Gender</w:t>
-      </w:r>
-    </w:p>
-    <w:p>
-      <w:pPr>
-        <w:pStyle w:val="ListParagraph"/>
-        <w:numPr>
-          <w:ilvl w:val="2"/>
-          <w:numId w:val="1"/>
-        </w:numPr>
-      </w:pPr>
-      <w:r>
-        <w:t xml:space="preserve">Biological sex of patient </w:t>
-      </w:r>
-    </w:p>
-    <w:p>
-      <w:pPr>
-        <w:pStyle w:val="ListParagraph"/>
-        <w:numPr>
-          <w:ilvl w:val="1"/>
-          <w:numId w:val="1"/>
-        </w:numPr>
-      </w:pPr>
-      <w:r>
-        <w:t xml:space="preserve">City </w:t>
-      </w:r>
-    </w:p>
-    <w:p>
-      <w:pPr>
-        <w:pStyle w:val="ListParagraph"/>
-        <w:numPr>
-          <w:ilvl w:val="2"/>
-          <w:numId w:val="1"/>
-        </w:numPr>
-      </w:pPr>
-      <w:r>
-        <w:t xml:space="preserve">The city where the patient is from </w:t>
-      </w:r>
-    </w:p>
-    <w:p>
-      <w:pPr>
-        <w:pStyle w:val="ListParagraph"/>
-        <w:numPr>
-          <w:ilvl w:val="0"/>
-          <w:numId w:val="1"/>
-        </w:numPr>
-      </w:pPr>
-      <w:r>
-        <w:t>Providers</w:t>
-      </w:r>
-    </w:p>
-    <w:p>
-      <w:pPr>
-        <w:pStyle w:val="ListParagraph"/>
-        <w:numPr>
-          <w:ilvl w:val="1"/>
-          <w:numId w:val="1"/>
-        </w:numPr>
-      </w:pPr>
-      <w:r>
-        <w:t>Provider_id</w:t>
-      </w:r>
-    </w:p>
-    <w:p>
-      <w:pPr>
-        <w:pStyle w:val="ListParagraph"/>
-        <w:numPr>
-          <w:ilvl w:val="2"/>
-          <w:numId w:val="1"/>
-        </w:numPr>
-      </w:pPr>
-      <w:r>
-        <w:t xml:space="preserve">Unique identifier for each provider. </w:t>
-      </w:r>
-    </w:p>
-    <w:p>
-      <w:pPr>
-        <w:pStyle w:val="ListParagraph"/>
-        <w:numPr>
-          <w:ilvl w:val="1"/>
-          <w:numId w:val="1"/>
-        </w:numPr>
-      </w:pPr>
-      <w:r>
-        <w:t>Provider_name</w:t>
-      </w:r>
-    </w:p>
-    <w:p>
-      <w:pPr>
-        <w:pStyle w:val="ListParagraph"/>
-        <w:numPr>
-          <w:ilvl w:val="2"/>
-          <w:numId w:val="1"/>
-        </w:numPr>
-      </w:pPr>
-      <w:r>
-        <w:t>First and last name of provider</w:t>
-      </w:r>
-    </w:p>
-    <w:p>
-      <w:pPr>
-        <w:pStyle w:val="ListParagraph"/>
-        <w:numPr>
-          <w:ilvl w:val="3"/>
-          <w:numId w:val="1"/>
-        </w:numPr>
-      </w:pPr>
-      <w:r>
-        <w:t xml:space="preserve">Jessica Allen (provider_id: 19) is the only provider with </w:t>
-      </w:r>
-      <w:r>
-        <w:t xml:space="preserve">‘Dr.’ within the provider_name field. Should all records have Dr., or since she’s the only one, can we just remove </w:t>
-      </w:r>
-      <w:r>
-        <w:t xml:space="preserve">Dr. from her record. Since they are all providers, it is already assumed that they are doctors. </w:t>
-      </w:r>
-    </w:p>
-    <w:p>
-      <w:pPr>
-        <w:pStyle w:val="ListParagraph"/>
-        <w:numPr>
-          <w:ilvl w:val="4"/>
-          <w:numId w:val="1"/>
-        </w:numPr>
-      </w:pPr>
-      <w:r>
-        <w:t xml:space="preserve">I removed “Dr.” prefix from provider_id: 19 record to standardize provider-name formatting. </w:t>
-      </w:r>
-    </w:p>
-    <w:p>
-      <w:pPr>
-        <w:pStyle w:val="ListParagraph"/>
-        <w:numPr>
-          <w:ilvl w:val="3"/>
-          <w:numId w:val="1"/>
-        </w:numPr>
-      </w:pPr>
-      <w:r>
-        <w:t xml:space="preserve">First </w:t>
-      </w:r>
-      <w:r>
-        <w:t xml:space="preserve">and last name are within the same record. I’m wondering if it’s best to do </w:t>
-      </w:r>
-      <w:r>
-        <w:t xml:space="preserve">splitting so that first and last name have their own fields. </w:t>
-      </w:r>
-      <w:r>
-        <w:t xml:space="preserve"> </w:t>
-      </w:r>
-    </w:p>
-    <w:p>
-      <w:pPr>
-        <w:pStyle w:val="ListParagraph"/>
-        <w:numPr>
-          <w:ilvl w:val="1"/>
-          <w:numId w:val="1"/>
-        </w:numPr>
-      </w:pPr>
-      <w:r>
-        <w:t>Department</w:t>
-      </w:r>
-    </w:p>
-    <w:p>
-      <w:pPr>
-        <w:pStyle w:val="ListParagraph"/>
-        <w:numPr>
-          <w:ilvl w:val="2"/>
-          <w:numId w:val="1"/>
-        </w:numPr>
-      </w:pPr>
-      <w:r>
-        <w:t xml:space="preserve">The department which the provider is from </w:t>
-      </w:r>
-    </w:p>
-    <w:p>
-      <w:pPr>
-        <w:pStyle w:val="ListParagraph"/>
-        <w:numPr>
-          <w:ilvl w:val="1"/>
-          <w:numId w:val="1"/>
-        </w:numPr>
-      </w:pPr>
+      <w:proofErr w:type="spellStart"/>
       <w:r>
         <w:t>Years_experience</w:t>
       </w:r>
+      <w:proofErr w:type="spellEnd"/>
     </w:p>
     <w:p>
       <w:pPr>
@@ -2379,7 +3239,6 @@
         <w:rPr>
           <w:u w:val="single"/>
         </w:rPr>
-        <w:lastRenderedPageBreak/>
         <w:t>7</w:t>
       </w:r>
       <w:r>
@@ -2470,7 +3329,15 @@
     </w:p>
     <w:p>
       <w:r>
-        <w:t>What questions I need to answer:</w:t>
+        <w:t xml:space="preserve">What questions </w:t>
+      </w:r>
+      <w:proofErr w:type="gramStart"/>
+      <w:r>
+        <w:t>I need</w:t>
+      </w:r>
+      <w:proofErr w:type="gramEnd"/>
+      <w:r>
+        <w:t xml:space="preserve"> to answer:</w:t>
       </w:r>
     </w:p>
     <w:p>
@@ -2494,7 +3361,16 @@
         </w:numPr>
       </w:pPr>
       <w:r>
-        <w:t>Are the complaints coming from all pts in general, or is the</w:t>
+        <w:lastRenderedPageBreak/>
+        <w:t xml:space="preserve">Are the complaints coming from all pts in general, or </w:t>
+      </w:r>
+      <w:proofErr w:type="gramStart"/>
+      <w:r>
+        <w:t>is</w:t>
+      </w:r>
+      <w:proofErr w:type="gramEnd"/>
+      <w:r>
+        <w:t xml:space="preserve"> the</w:t>
       </w:r>
       <w:r>
         <w:t>re</w:t>
@@ -2825,6 +3701,155 @@
     </w:lvl>
   </w:abstractNum>
   <w:abstractNum w:abstractNumId="1" w15:restartNumberingAfterBreak="0">
+    <w:nsid w:val="02A35EE1"/>
+    <w:multiLevelType w:val="multilevel"/>
+    <w:tmpl w:val="391AFDAA"/>
+    <w:lvl w:ilvl="0">
+      <w:start w:val="1"/>
+      <w:numFmt w:val="bullet"/>
+      <w:lvlText w:val=""/>
+      <w:lvlJc w:val="left"/>
+      <w:pPr>
+        <w:tabs>
+          <w:tab w:val="num" w:pos="720"/>
+        </w:tabs>
+        <w:ind w:left="720" w:hanging="360"/>
+      </w:pPr>
+      <w:rPr>
+        <w:rFonts w:ascii="Symbol" w:hAnsi="Symbol" w:hint="default"/>
+        <w:sz w:val="20"/>
+      </w:rPr>
+    </w:lvl>
+    <w:lvl w:ilvl="1" w:tentative="1">
+      <w:start w:val="1"/>
+      <w:numFmt w:val="bullet"/>
+      <w:lvlText w:val="o"/>
+      <w:lvlJc w:val="left"/>
+      <w:pPr>
+        <w:tabs>
+          <w:tab w:val="num" w:pos="1440"/>
+        </w:tabs>
+        <w:ind w:left="1440" w:hanging="360"/>
+      </w:pPr>
+      <w:rPr>
+        <w:rFonts w:ascii="Courier New" w:hAnsi="Courier New" w:hint="default"/>
+        <w:sz w:val="20"/>
+      </w:rPr>
+    </w:lvl>
+    <w:lvl w:ilvl="2" w:tentative="1">
+      <w:start w:val="1"/>
+      <w:numFmt w:val="bullet"/>
+      <w:lvlText w:val=""/>
+      <w:lvlJc w:val="left"/>
+      <w:pPr>
+        <w:tabs>
+          <w:tab w:val="num" w:pos="2160"/>
+        </w:tabs>
+        <w:ind w:left="2160" w:hanging="360"/>
+      </w:pPr>
+      <w:rPr>
+        <w:rFonts w:ascii="Wingdings" w:hAnsi="Wingdings" w:hint="default"/>
+        <w:sz w:val="20"/>
+      </w:rPr>
+    </w:lvl>
+    <w:lvl w:ilvl="3" w:tentative="1">
+      <w:start w:val="1"/>
+      <w:numFmt w:val="bullet"/>
+      <w:lvlText w:val=""/>
+      <w:lvlJc w:val="left"/>
+      <w:pPr>
+        <w:tabs>
+          <w:tab w:val="num" w:pos="2880"/>
+        </w:tabs>
+        <w:ind w:left="2880" w:hanging="360"/>
+      </w:pPr>
+      <w:rPr>
+        <w:rFonts w:ascii="Wingdings" w:hAnsi="Wingdings" w:hint="default"/>
+        <w:sz w:val="20"/>
+      </w:rPr>
+    </w:lvl>
+    <w:lvl w:ilvl="4" w:tentative="1">
+      <w:start w:val="1"/>
+      <w:numFmt w:val="bullet"/>
+      <w:lvlText w:val=""/>
+      <w:lvlJc w:val="left"/>
+      <w:pPr>
+        <w:tabs>
+          <w:tab w:val="num" w:pos="3600"/>
+        </w:tabs>
+        <w:ind w:left="3600" w:hanging="360"/>
+      </w:pPr>
+      <w:rPr>
+        <w:rFonts w:ascii="Wingdings" w:hAnsi="Wingdings" w:hint="default"/>
+        <w:sz w:val="20"/>
+      </w:rPr>
+    </w:lvl>
+    <w:lvl w:ilvl="5" w:tentative="1">
+      <w:start w:val="1"/>
+      <w:numFmt w:val="bullet"/>
+      <w:lvlText w:val=""/>
+      <w:lvlJc w:val="left"/>
+      <w:pPr>
+        <w:tabs>
+          <w:tab w:val="num" w:pos="4320"/>
+        </w:tabs>
+        <w:ind w:left="4320" w:hanging="360"/>
+      </w:pPr>
+      <w:rPr>
+        <w:rFonts w:ascii="Wingdings" w:hAnsi="Wingdings" w:hint="default"/>
+        <w:sz w:val="20"/>
+      </w:rPr>
+    </w:lvl>
+    <w:lvl w:ilvl="6" w:tentative="1">
+      <w:start w:val="1"/>
+      <w:numFmt w:val="bullet"/>
+      <w:lvlText w:val=""/>
+      <w:lvlJc w:val="left"/>
+      <w:pPr>
+        <w:tabs>
+          <w:tab w:val="num" w:pos="5040"/>
+        </w:tabs>
+        <w:ind w:left="5040" w:hanging="360"/>
+      </w:pPr>
+      <w:rPr>
+        <w:rFonts w:ascii="Wingdings" w:hAnsi="Wingdings" w:hint="default"/>
+        <w:sz w:val="20"/>
+      </w:rPr>
+    </w:lvl>
+    <w:lvl w:ilvl="7" w:tentative="1">
+      <w:start w:val="1"/>
+      <w:numFmt w:val="bullet"/>
+      <w:lvlText w:val=""/>
+      <w:lvlJc w:val="left"/>
+      <w:pPr>
+        <w:tabs>
+          <w:tab w:val="num" w:pos="5760"/>
+        </w:tabs>
+        <w:ind w:left="5760" w:hanging="360"/>
+      </w:pPr>
+      <w:rPr>
+        <w:rFonts w:ascii="Wingdings" w:hAnsi="Wingdings" w:hint="default"/>
+        <w:sz w:val="20"/>
+      </w:rPr>
+    </w:lvl>
+    <w:lvl w:ilvl="8" w:tentative="1">
+      <w:start w:val="1"/>
+      <w:numFmt w:val="bullet"/>
+      <w:lvlText w:val=""/>
+      <w:lvlJc w:val="left"/>
+      <w:pPr>
+        <w:tabs>
+          <w:tab w:val="num" w:pos="6480"/>
+        </w:tabs>
+        <w:ind w:left="6480" w:hanging="360"/>
+      </w:pPr>
+      <w:rPr>
+        <w:rFonts w:ascii="Wingdings" w:hAnsi="Wingdings" w:hint="default"/>
+        <w:sz w:val="20"/>
+      </w:rPr>
+    </w:lvl>
+  </w:abstractNum>
+  <w:abstractNum w:abstractNumId="2" w15:restartNumberingAfterBreak="0">
     <w:nsid w:val="06E949C4"/>
     <w:multiLevelType w:val="hybridMultilevel"/>
     <w:tmpl w:val="680ADCE0"/>
@@ -2937,7 +3962,454 @@
       </w:rPr>
     </w:lvl>
   </w:abstractNum>
-  <w:abstractNum w:abstractNumId="2" w15:restartNumberingAfterBreak="0">
+  <w:abstractNum w:abstractNumId="3" w15:restartNumberingAfterBreak="0">
+    <w:nsid w:val="0B474D0A"/>
+    <w:multiLevelType w:val="multilevel"/>
+    <w:tmpl w:val="575CCD42"/>
+    <w:lvl w:ilvl="0">
+      <w:start w:val="1"/>
+      <w:numFmt w:val="bullet"/>
+      <w:lvlText w:val=""/>
+      <w:lvlJc w:val="left"/>
+      <w:pPr>
+        <w:tabs>
+          <w:tab w:val="num" w:pos="720"/>
+        </w:tabs>
+        <w:ind w:left="720" w:hanging="360"/>
+      </w:pPr>
+      <w:rPr>
+        <w:rFonts w:ascii="Symbol" w:hAnsi="Symbol" w:hint="default"/>
+        <w:sz w:val="20"/>
+      </w:rPr>
+    </w:lvl>
+    <w:lvl w:ilvl="1" w:tentative="1">
+      <w:start w:val="1"/>
+      <w:numFmt w:val="bullet"/>
+      <w:lvlText w:val="o"/>
+      <w:lvlJc w:val="left"/>
+      <w:pPr>
+        <w:tabs>
+          <w:tab w:val="num" w:pos="1440"/>
+        </w:tabs>
+        <w:ind w:left="1440" w:hanging="360"/>
+      </w:pPr>
+      <w:rPr>
+        <w:rFonts w:ascii="Courier New" w:hAnsi="Courier New" w:hint="default"/>
+        <w:sz w:val="20"/>
+      </w:rPr>
+    </w:lvl>
+    <w:lvl w:ilvl="2" w:tentative="1">
+      <w:start w:val="1"/>
+      <w:numFmt w:val="bullet"/>
+      <w:lvlText w:val=""/>
+      <w:lvlJc w:val="left"/>
+      <w:pPr>
+        <w:tabs>
+          <w:tab w:val="num" w:pos="2160"/>
+        </w:tabs>
+        <w:ind w:left="2160" w:hanging="360"/>
+      </w:pPr>
+      <w:rPr>
+        <w:rFonts w:ascii="Wingdings" w:hAnsi="Wingdings" w:hint="default"/>
+        <w:sz w:val="20"/>
+      </w:rPr>
+    </w:lvl>
+    <w:lvl w:ilvl="3" w:tentative="1">
+      <w:start w:val="1"/>
+      <w:numFmt w:val="bullet"/>
+      <w:lvlText w:val=""/>
+      <w:lvlJc w:val="left"/>
+      <w:pPr>
+        <w:tabs>
+          <w:tab w:val="num" w:pos="2880"/>
+        </w:tabs>
+        <w:ind w:left="2880" w:hanging="360"/>
+      </w:pPr>
+      <w:rPr>
+        <w:rFonts w:ascii="Wingdings" w:hAnsi="Wingdings" w:hint="default"/>
+        <w:sz w:val="20"/>
+      </w:rPr>
+    </w:lvl>
+    <w:lvl w:ilvl="4" w:tentative="1">
+      <w:start w:val="1"/>
+      <w:numFmt w:val="bullet"/>
+      <w:lvlText w:val=""/>
+      <w:lvlJc w:val="left"/>
+      <w:pPr>
+        <w:tabs>
+          <w:tab w:val="num" w:pos="3600"/>
+        </w:tabs>
+        <w:ind w:left="3600" w:hanging="360"/>
+      </w:pPr>
+      <w:rPr>
+        <w:rFonts w:ascii="Wingdings" w:hAnsi="Wingdings" w:hint="default"/>
+        <w:sz w:val="20"/>
+      </w:rPr>
+    </w:lvl>
+    <w:lvl w:ilvl="5" w:tentative="1">
+      <w:start w:val="1"/>
+      <w:numFmt w:val="bullet"/>
+      <w:lvlText w:val=""/>
+      <w:lvlJc w:val="left"/>
+      <w:pPr>
+        <w:tabs>
+          <w:tab w:val="num" w:pos="4320"/>
+        </w:tabs>
+        <w:ind w:left="4320" w:hanging="360"/>
+      </w:pPr>
+      <w:rPr>
+        <w:rFonts w:ascii="Wingdings" w:hAnsi="Wingdings" w:hint="default"/>
+        <w:sz w:val="20"/>
+      </w:rPr>
+    </w:lvl>
+    <w:lvl w:ilvl="6" w:tentative="1">
+      <w:start w:val="1"/>
+      <w:numFmt w:val="bullet"/>
+      <w:lvlText w:val=""/>
+      <w:lvlJc w:val="left"/>
+      <w:pPr>
+        <w:tabs>
+          <w:tab w:val="num" w:pos="5040"/>
+        </w:tabs>
+        <w:ind w:left="5040" w:hanging="360"/>
+      </w:pPr>
+      <w:rPr>
+        <w:rFonts w:ascii="Wingdings" w:hAnsi="Wingdings" w:hint="default"/>
+        <w:sz w:val="20"/>
+      </w:rPr>
+    </w:lvl>
+    <w:lvl w:ilvl="7" w:tentative="1">
+      <w:start w:val="1"/>
+      <w:numFmt w:val="bullet"/>
+      <w:lvlText w:val=""/>
+      <w:lvlJc w:val="left"/>
+      <w:pPr>
+        <w:tabs>
+          <w:tab w:val="num" w:pos="5760"/>
+        </w:tabs>
+        <w:ind w:left="5760" w:hanging="360"/>
+      </w:pPr>
+      <w:rPr>
+        <w:rFonts w:ascii="Wingdings" w:hAnsi="Wingdings" w:hint="default"/>
+        <w:sz w:val="20"/>
+      </w:rPr>
+    </w:lvl>
+    <w:lvl w:ilvl="8" w:tentative="1">
+      <w:start w:val="1"/>
+      <w:numFmt w:val="bullet"/>
+      <w:lvlText w:val=""/>
+      <w:lvlJc w:val="left"/>
+      <w:pPr>
+        <w:tabs>
+          <w:tab w:val="num" w:pos="6480"/>
+        </w:tabs>
+        <w:ind w:left="6480" w:hanging="360"/>
+      </w:pPr>
+      <w:rPr>
+        <w:rFonts w:ascii="Wingdings" w:hAnsi="Wingdings" w:hint="default"/>
+        <w:sz w:val="20"/>
+      </w:rPr>
+    </w:lvl>
+  </w:abstractNum>
+  <w:abstractNum w:abstractNumId="4" w15:restartNumberingAfterBreak="0">
+    <w:nsid w:val="18E125A7"/>
+    <w:multiLevelType w:val="multilevel"/>
+    <w:tmpl w:val="74A8F35E"/>
+    <w:lvl w:ilvl="0">
+      <w:start w:val="1"/>
+      <w:numFmt w:val="bullet"/>
+      <w:lvlText w:val=""/>
+      <w:lvlJc w:val="left"/>
+      <w:pPr>
+        <w:tabs>
+          <w:tab w:val="num" w:pos="720"/>
+        </w:tabs>
+        <w:ind w:left="720" w:hanging="360"/>
+      </w:pPr>
+      <w:rPr>
+        <w:rFonts w:ascii="Symbol" w:hAnsi="Symbol" w:hint="default"/>
+        <w:sz w:val="20"/>
+      </w:rPr>
+    </w:lvl>
+    <w:lvl w:ilvl="1" w:tentative="1">
+      <w:start w:val="1"/>
+      <w:numFmt w:val="bullet"/>
+      <w:lvlText w:val="o"/>
+      <w:lvlJc w:val="left"/>
+      <w:pPr>
+        <w:tabs>
+          <w:tab w:val="num" w:pos="1440"/>
+        </w:tabs>
+        <w:ind w:left="1440" w:hanging="360"/>
+      </w:pPr>
+      <w:rPr>
+        <w:rFonts w:ascii="Courier New" w:hAnsi="Courier New" w:hint="default"/>
+        <w:sz w:val="20"/>
+      </w:rPr>
+    </w:lvl>
+    <w:lvl w:ilvl="2" w:tentative="1">
+      <w:start w:val="1"/>
+      <w:numFmt w:val="bullet"/>
+      <w:lvlText w:val=""/>
+      <w:lvlJc w:val="left"/>
+      <w:pPr>
+        <w:tabs>
+          <w:tab w:val="num" w:pos="2160"/>
+        </w:tabs>
+        <w:ind w:left="2160" w:hanging="360"/>
+      </w:pPr>
+      <w:rPr>
+        <w:rFonts w:ascii="Wingdings" w:hAnsi="Wingdings" w:hint="default"/>
+        <w:sz w:val="20"/>
+      </w:rPr>
+    </w:lvl>
+    <w:lvl w:ilvl="3" w:tentative="1">
+      <w:start w:val="1"/>
+      <w:numFmt w:val="bullet"/>
+      <w:lvlText w:val=""/>
+      <w:lvlJc w:val="left"/>
+      <w:pPr>
+        <w:tabs>
+          <w:tab w:val="num" w:pos="2880"/>
+        </w:tabs>
+        <w:ind w:left="2880" w:hanging="360"/>
+      </w:pPr>
+      <w:rPr>
+        <w:rFonts w:ascii="Wingdings" w:hAnsi="Wingdings" w:hint="default"/>
+        <w:sz w:val="20"/>
+      </w:rPr>
+    </w:lvl>
+    <w:lvl w:ilvl="4" w:tentative="1">
+      <w:start w:val="1"/>
+      <w:numFmt w:val="bullet"/>
+      <w:lvlText w:val=""/>
+      <w:lvlJc w:val="left"/>
+      <w:pPr>
+        <w:tabs>
+          <w:tab w:val="num" w:pos="3600"/>
+        </w:tabs>
+        <w:ind w:left="3600" w:hanging="360"/>
+      </w:pPr>
+      <w:rPr>
+        <w:rFonts w:ascii="Wingdings" w:hAnsi="Wingdings" w:hint="default"/>
+        <w:sz w:val="20"/>
+      </w:rPr>
+    </w:lvl>
+    <w:lvl w:ilvl="5" w:tentative="1">
+      <w:start w:val="1"/>
+      <w:numFmt w:val="bullet"/>
+      <w:lvlText w:val=""/>
+      <w:lvlJc w:val="left"/>
+      <w:pPr>
+        <w:tabs>
+          <w:tab w:val="num" w:pos="4320"/>
+        </w:tabs>
+        <w:ind w:left="4320" w:hanging="360"/>
+      </w:pPr>
+      <w:rPr>
+        <w:rFonts w:ascii="Wingdings" w:hAnsi="Wingdings" w:hint="default"/>
+        <w:sz w:val="20"/>
+      </w:rPr>
+    </w:lvl>
+    <w:lvl w:ilvl="6" w:tentative="1">
+      <w:start w:val="1"/>
+      <w:numFmt w:val="bullet"/>
+      <w:lvlText w:val=""/>
+      <w:lvlJc w:val="left"/>
+      <w:pPr>
+        <w:tabs>
+          <w:tab w:val="num" w:pos="5040"/>
+        </w:tabs>
+        <w:ind w:left="5040" w:hanging="360"/>
+      </w:pPr>
+      <w:rPr>
+        <w:rFonts w:ascii="Wingdings" w:hAnsi="Wingdings" w:hint="default"/>
+        <w:sz w:val="20"/>
+      </w:rPr>
+    </w:lvl>
+    <w:lvl w:ilvl="7" w:tentative="1">
+      <w:start w:val="1"/>
+      <w:numFmt w:val="bullet"/>
+      <w:lvlText w:val=""/>
+      <w:lvlJc w:val="left"/>
+      <w:pPr>
+        <w:tabs>
+          <w:tab w:val="num" w:pos="5760"/>
+        </w:tabs>
+        <w:ind w:left="5760" w:hanging="360"/>
+      </w:pPr>
+      <w:rPr>
+        <w:rFonts w:ascii="Wingdings" w:hAnsi="Wingdings" w:hint="default"/>
+        <w:sz w:val="20"/>
+      </w:rPr>
+    </w:lvl>
+    <w:lvl w:ilvl="8" w:tentative="1">
+      <w:start w:val="1"/>
+      <w:numFmt w:val="bullet"/>
+      <w:lvlText w:val=""/>
+      <w:lvlJc w:val="left"/>
+      <w:pPr>
+        <w:tabs>
+          <w:tab w:val="num" w:pos="6480"/>
+        </w:tabs>
+        <w:ind w:left="6480" w:hanging="360"/>
+      </w:pPr>
+      <w:rPr>
+        <w:rFonts w:ascii="Wingdings" w:hAnsi="Wingdings" w:hint="default"/>
+        <w:sz w:val="20"/>
+      </w:rPr>
+    </w:lvl>
+  </w:abstractNum>
+  <w:abstractNum w:abstractNumId="5" w15:restartNumberingAfterBreak="0">
+    <w:nsid w:val="35390A28"/>
+    <w:multiLevelType w:val="multilevel"/>
+    <w:tmpl w:val="C722E3D0"/>
+    <w:lvl w:ilvl="0">
+      <w:start w:val="1"/>
+      <w:numFmt w:val="bullet"/>
+      <w:lvlText w:val=""/>
+      <w:lvlJc w:val="left"/>
+      <w:pPr>
+        <w:tabs>
+          <w:tab w:val="num" w:pos="720"/>
+        </w:tabs>
+        <w:ind w:left="720" w:hanging="360"/>
+      </w:pPr>
+      <w:rPr>
+        <w:rFonts w:ascii="Symbol" w:hAnsi="Symbol" w:hint="default"/>
+        <w:sz w:val="20"/>
+      </w:rPr>
+    </w:lvl>
+    <w:lvl w:ilvl="1" w:tentative="1">
+      <w:start w:val="1"/>
+      <w:numFmt w:val="bullet"/>
+      <w:lvlText w:val="o"/>
+      <w:lvlJc w:val="left"/>
+      <w:pPr>
+        <w:tabs>
+          <w:tab w:val="num" w:pos="1440"/>
+        </w:tabs>
+        <w:ind w:left="1440" w:hanging="360"/>
+      </w:pPr>
+      <w:rPr>
+        <w:rFonts w:ascii="Courier New" w:hAnsi="Courier New" w:hint="default"/>
+        <w:sz w:val="20"/>
+      </w:rPr>
+    </w:lvl>
+    <w:lvl w:ilvl="2" w:tentative="1">
+      <w:start w:val="1"/>
+      <w:numFmt w:val="bullet"/>
+      <w:lvlText w:val=""/>
+      <w:lvlJc w:val="left"/>
+      <w:pPr>
+        <w:tabs>
+          <w:tab w:val="num" w:pos="2160"/>
+        </w:tabs>
+        <w:ind w:left="2160" w:hanging="360"/>
+      </w:pPr>
+      <w:rPr>
+        <w:rFonts w:ascii="Wingdings" w:hAnsi="Wingdings" w:hint="default"/>
+        <w:sz w:val="20"/>
+      </w:rPr>
+    </w:lvl>
+    <w:lvl w:ilvl="3" w:tentative="1">
+      <w:start w:val="1"/>
+      <w:numFmt w:val="bullet"/>
+      <w:lvlText w:val=""/>
+      <w:lvlJc w:val="left"/>
+      <w:pPr>
+        <w:tabs>
+          <w:tab w:val="num" w:pos="2880"/>
+        </w:tabs>
+        <w:ind w:left="2880" w:hanging="360"/>
+      </w:pPr>
+      <w:rPr>
+        <w:rFonts w:ascii="Wingdings" w:hAnsi="Wingdings" w:hint="default"/>
+        <w:sz w:val="20"/>
+      </w:rPr>
+    </w:lvl>
+    <w:lvl w:ilvl="4" w:tentative="1">
+      <w:start w:val="1"/>
+      <w:numFmt w:val="bullet"/>
+      <w:lvlText w:val=""/>
+      <w:lvlJc w:val="left"/>
+      <w:pPr>
+        <w:tabs>
+          <w:tab w:val="num" w:pos="3600"/>
+        </w:tabs>
+        <w:ind w:left="3600" w:hanging="360"/>
+      </w:pPr>
+      <w:rPr>
+        <w:rFonts w:ascii="Wingdings" w:hAnsi="Wingdings" w:hint="default"/>
+        <w:sz w:val="20"/>
+      </w:rPr>
+    </w:lvl>
+    <w:lvl w:ilvl="5" w:tentative="1">
+      <w:start w:val="1"/>
+      <w:numFmt w:val="bullet"/>
+      <w:lvlText w:val=""/>
+      <w:lvlJc w:val="left"/>
+      <w:pPr>
+        <w:tabs>
+          <w:tab w:val="num" w:pos="4320"/>
+        </w:tabs>
+        <w:ind w:left="4320" w:hanging="360"/>
+      </w:pPr>
+      <w:rPr>
+        <w:rFonts w:ascii="Wingdings" w:hAnsi="Wingdings" w:hint="default"/>
+        <w:sz w:val="20"/>
+      </w:rPr>
+    </w:lvl>
+    <w:lvl w:ilvl="6" w:tentative="1">
+      <w:start w:val="1"/>
+      <w:numFmt w:val="bullet"/>
+      <w:lvlText w:val=""/>
+      <w:lvlJc w:val="left"/>
+      <w:pPr>
+        <w:tabs>
+          <w:tab w:val="num" w:pos="5040"/>
+        </w:tabs>
+        <w:ind w:left="5040" w:hanging="360"/>
+      </w:pPr>
+      <w:rPr>
+        <w:rFonts w:ascii="Wingdings" w:hAnsi="Wingdings" w:hint="default"/>
+        <w:sz w:val="20"/>
+      </w:rPr>
+    </w:lvl>
+    <w:lvl w:ilvl="7" w:tentative="1">
+      <w:start w:val="1"/>
+      <w:numFmt w:val="bullet"/>
+      <w:lvlText w:val=""/>
+      <w:lvlJc w:val="left"/>
+      <w:pPr>
+        <w:tabs>
+          <w:tab w:val="num" w:pos="5760"/>
+        </w:tabs>
+        <w:ind w:left="5760" w:hanging="360"/>
+      </w:pPr>
+      <w:rPr>
+        <w:rFonts w:ascii="Wingdings" w:hAnsi="Wingdings" w:hint="default"/>
+        <w:sz w:val="20"/>
+      </w:rPr>
+    </w:lvl>
+    <w:lvl w:ilvl="8" w:tentative="1">
+      <w:start w:val="1"/>
+      <w:numFmt w:val="bullet"/>
+      <w:lvlText w:val=""/>
+      <w:lvlJc w:val="left"/>
+      <w:pPr>
+        <w:tabs>
+          <w:tab w:val="num" w:pos="6480"/>
+        </w:tabs>
+        <w:ind w:left="6480" w:hanging="360"/>
+      </w:pPr>
+      <w:rPr>
+        <w:rFonts w:ascii="Wingdings" w:hAnsi="Wingdings" w:hint="default"/>
+        <w:sz w:val="20"/>
+      </w:rPr>
+    </w:lvl>
+  </w:abstractNum>
+  <w:abstractNum w:abstractNumId="6" w15:restartNumberingAfterBreak="0">
     <w:nsid w:val="36EB21AD"/>
     <w:multiLevelType w:val="hybridMultilevel"/>
     <w:tmpl w:val="491E72A6"/>
@@ -3050,7 +4522,156 @@
       </w:rPr>
     </w:lvl>
   </w:abstractNum>
-  <w:abstractNum w:abstractNumId="3" w15:restartNumberingAfterBreak="0">
+  <w:abstractNum w:abstractNumId="7" w15:restartNumberingAfterBreak="0">
+    <w:nsid w:val="40AE15A9"/>
+    <w:multiLevelType w:val="multilevel"/>
+    <w:tmpl w:val="4622D6A2"/>
+    <w:lvl w:ilvl="0">
+      <w:start w:val="1"/>
+      <w:numFmt w:val="bullet"/>
+      <w:lvlText w:val=""/>
+      <w:lvlJc w:val="left"/>
+      <w:pPr>
+        <w:tabs>
+          <w:tab w:val="num" w:pos="720"/>
+        </w:tabs>
+        <w:ind w:left="720" w:hanging="360"/>
+      </w:pPr>
+      <w:rPr>
+        <w:rFonts w:ascii="Symbol" w:hAnsi="Symbol" w:hint="default"/>
+        <w:sz w:val="20"/>
+      </w:rPr>
+    </w:lvl>
+    <w:lvl w:ilvl="1" w:tentative="1">
+      <w:start w:val="1"/>
+      <w:numFmt w:val="bullet"/>
+      <w:lvlText w:val="o"/>
+      <w:lvlJc w:val="left"/>
+      <w:pPr>
+        <w:tabs>
+          <w:tab w:val="num" w:pos="1440"/>
+        </w:tabs>
+        <w:ind w:left="1440" w:hanging="360"/>
+      </w:pPr>
+      <w:rPr>
+        <w:rFonts w:ascii="Courier New" w:hAnsi="Courier New" w:hint="default"/>
+        <w:sz w:val="20"/>
+      </w:rPr>
+    </w:lvl>
+    <w:lvl w:ilvl="2" w:tentative="1">
+      <w:start w:val="1"/>
+      <w:numFmt w:val="bullet"/>
+      <w:lvlText w:val=""/>
+      <w:lvlJc w:val="left"/>
+      <w:pPr>
+        <w:tabs>
+          <w:tab w:val="num" w:pos="2160"/>
+        </w:tabs>
+        <w:ind w:left="2160" w:hanging="360"/>
+      </w:pPr>
+      <w:rPr>
+        <w:rFonts w:ascii="Wingdings" w:hAnsi="Wingdings" w:hint="default"/>
+        <w:sz w:val="20"/>
+      </w:rPr>
+    </w:lvl>
+    <w:lvl w:ilvl="3" w:tentative="1">
+      <w:start w:val="1"/>
+      <w:numFmt w:val="bullet"/>
+      <w:lvlText w:val=""/>
+      <w:lvlJc w:val="left"/>
+      <w:pPr>
+        <w:tabs>
+          <w:tab w:val="num" w:pos="2880"/>
+        </w:tabs>
+        <w:ind w:left="2880" w:hanging="360"/>
+      </w:pPr>
+      <w:rPr>
+        <w:rFonts w:ascii="Wingdings" w:hAnsi="Wingdings" w:hint="default"/>
+        <w:sz w:val="20"/>
+      </w:rPr>
+    </w:lvl>
+    <w:lvl w:ilvl="4" w:tentative="1">
+      <w:start w:val="1"/>
+      <w:numFmt w:val="bullet"/>
+      <w:lvlText w:val=""/>
+      <w:lvlJc w:val="left"/>
+      <w:pPr>
+        <w:tabs>
+          <w:tab w:val="num" w:pos="3600"/>
+        </w:tabs>
+        <w:ind w:left="3600" w:hanging="360"/>
+      </w:pPr>
+      <w:rPr>
+        <w:rFonts w:ascii="Wingdings" w:hAnsi="Wingdings" w:hint="default"/>
+        <w:sz w:val="20"/>
+      </w:rPr>
+    </w:lvl>
+    <w:lvl w:ilvl="5" w:tentative="1">
+      <w:start w:val="1"/>
+      <w:numFmt w:val="bullet"/>
+      <w:lvlText w:val=""/>
+      <w:lvlJc w:val="left"/>
+      <w:pPr>
+        <w:tabs>
+          <w:tab w:val="num" w:pos="4320"/>
+        </w:tabs>
+        <w:ind w:left="4320" w:hanging="360"/>
+      </w:pPr>
+      <w:rPr>
+        <w:rFonts w:ascii="Wingdings" w:hAnsi="Wingdings" w:hint="default"/>
+        <w:sz w:val="20"/>
+      </w:rPr>
+    </w:lvl>
+    <w:lvl w:ilvl="6" w:tentative="1">
+      <w:start w:val="1"/>
+      <w:numFmt w:val="bullet"/>
+      <w:lvlText w:val=""/>
+      <w:lvlJc w:val="left"/>
+      <w:pPr>
+        <w:tabs>
+          <w:tab w:val="num" w:pos="5040"/>
+        </w:tabs>
+        <w:ind w:left="5040" w:hanging="360"/>
+      </w:pPr>
+      <w:rPr>
+        <w:rFonts w:ascii="Wingdings" w:hAnsi="Wingdings" w:hint="default"/>
+        <w:sz w:val="20"/>
+      </w:rPr>
+    </w:lvl>
+    <w:lvl w:ilvl="7" w:tentative="1">
+      <w:start w:val="1"/>
+      <w:numFmt w:val="bullet"/>
+      <w:lvlText w:val=""/>
+      <w:lvlJc w:val="left"/>
+      <w:pPr>
+        <w:tabs>
+          <w:tab w:val="num" w:pos="5760"/>
+        </w:tabs>
+        <w:ind w:left="5760" w:hanging="360"/>
+      </w:pPr>
+      <w:rPr>
+        <w:rFonts w:ascii="Wingdings" w:hAnsi="Wingdings" w:hint="default"/>
+        <w:sz w:val="20"/>
+      </w:rPr>
+    </w:lvl>
+    <w:lvl w:ilvl="8" w:tentative="1">
+      <w:start w:val="1"/>
+      <w:numFmt w:val="bullet"/>
+      <w:lvlText w:val=""/>
+      <w:lvlJc w:val="left"/>
+      <w:pPr>
+        <w:tabs>
+          <w:tab w:val="num" w:pos="6480"/>
+        </w:tabs>
+        <w:ind w:left="6480" w:hanging="360"/>
+      </w:pPr>
+      <w:rPr>
+        <w:rFonts w:ascii="Wingdings" w:hAnsi="Wingdings" w:hint="default"/>
+        <w:sz w:val="20"/>
+      </w:rPr>
+    </w:lvl>
+  </w:abstractNum>
+  <w:abstractNum w:abstractNumId="8" w15:restartNumberingAfterBreak="0">
     <w:nsid w:val="4BB812BB"/>
     <w:multiLevelType w:val="hybridMultilevel"/>
     <w:tmpl w:val="B9BC14CC"/>
@@ -3163,7 +4784,7 @@
       </w:rPr>
     </w:lvl>
   </w:abstractNum>
-  <w:abstractNum w:abstractNumId="4" w15:restartNumberingAfterBreak="0">
+  <w:abstractNum w:abstractNumId="9" w15:restartNumberingAfterBreak="0">
     <w:nsid w:val="4FFE04F8"/>
     <w:multiLevelType w:val="hybridMultilevel"/>
     <w:tmpl w:val="90463A1C"/>
@@ -3276,7 +4897,7 @@
       </w:rPr>
     </w:lvl>
   </w:abstractNum>
-  <w:abstractNum w:abstractNumId="5" w15:restartNumberingAfterBreak="0">
+  <w:abstractNum w:abstractNumId="10" w15:restartNumberingAfterBreak="0">
     <w:nsid w:val="7EFD172B"/>
     <w:multiLevelType w:val="hybridMultilevel"/>
     <w:tmpl w:val="1FB48E52"/>
@@ -3393,18 +5014,33 @@
     <w:abstractNumId w:val="0"/>
   </w:num>
   <w:num w:numId="2" w16cid:durableId="1335840007">
+    <w:abstractNumId w:val="8"/>
+  </w:num>
+  <w:num w:numId="3" w16cid:durableId="2126342479">
+    <w:abstractNumId w:val="6"/>
+  </w:num>
+  <w:num w:numId="4" w16cid:durableId="2127002448">
+    <w:abstractNumId w:val="10"/>
+  </w:num>
+  <w:num w:numId="5" w16cid:durableId="823132378">
+    <w:abstractNumId w:val="9"/>
+  </w:num>
+  <w:num w:numId="6" w16cid:durableId="440222574">
+    <w:abstractNumId w:val="2"/>
+  </w:num>
+  <w:num w:numId="7" w16cid:durableId="27680315">
+    <w:abstractNumId w:val="4"/>
+  </w:num>
+  <w:num w:numId="8" w16cid:durableId="250510932">
+    <w:abstractNumId w:val="5"/>
+  </w:num>
+  <w:num w:numId="9" w16cid:durableId="1121608103">
+    <w:abstractNumId w:val="7"/>
+  </w:num>
+  <w:num w:numId="10" w16cid:durableId="88503663">
     <w:abstractNumId w:val="3"/>
   </w:num>
-  <w:num w:numId="3" w16cid:durableId="2126342479">
-    <w:abstractNumId w:val="2"/>
-  </w:num>
-  <w:num w:numId="4" w16cid:durableId="2127002448">
-    <w:abstractNumId w:val="5"/>
-  </w:num>
-  <w:num w:numId="5" w16cid:durableId="823132378">
-    <w:abstractNumId w:val="4"/>
-  </w:num>
-  <w:num w:numId="6" w16cid:durableId="440222574">
+  <w:num w:numId="11" w16cid:durableId="2135324667">
     <w:abstractNumId w:val="1"/>
   </w:num>
 </w:numbering>
@@ -4013,7 +5649,6 @@
   <w:style w:type="character" w:default="1" w:styleId="DefaultParagraphFont">
     <w:name w:val="Default Paragraph Font"/>
     <w:uiPriority w:val="1"/>
-    <w:semiHidden/>
     <w:unhideWhenUsed/>
   </w:style>
   <w:style w:type="table" w:default="1" w:styleId="TableNormal">

</xml_diff>

<commit_message>
Created .xlsx for validation and updated project documentation
</commit_message>
<xml_diff>
--- a/documentation/nicosys-healthcare-portfolio-documentation.docx
+++ b/documentation/nicosys-healthcare-portfolio-documentation.docx
@@ -72,7 +72,7 @@
           <w:u w:val="single"/>
         </w:rPr>
         <w:pict w14:anchorId="4A415D3E">
-          <v:rect id="_x0000_i1073" style="width:0;height:1.5pt" o:hralign="center" o:hrstd="t" o:hr="t" fillcolor="#a0a0a0" stroked="f"/>
+          <v:rect id="_x0000_i1025" style="width:0;height:1.5pt" o:hralign="center" o:hrstd="t" o:hr="t" fillcolor="#a0a0a0" stroked="f"/>
         </w:pict>
       </w:r>
     </w:p>
@@ -117,6 +117,13 @@
         </w:rPr>
         <w:t>1. Average ER wait time</w:t>
       </w:r>
+      <w:r>
+        <w:rPr>
+          <w:b/>
+          <w:bCs/>
+        </w:rPr>
+        <w:t xml:space="preserve"> (in SQL)</w:t>
+      </w:r>
     </w:p>
     <w:p>
       <w:r>
@@ -144,7 +151,7 @@
     <w:p>
       <w:r>
         <w:pict w14:anchorId="48A2F741">
-          <v:rect id="_x0000_i1074" style="width:0;height:1.5pt" o:hralign="center" o:hrstd="t" o:hr="t" fillcolor="#a0a0a0" stroked="f"/>
+          <v:rect id="_x0000_i1026" style="width:0;height:1.5pt" o:hralign="center" o:hrstd="t" o:hr="t" fillcolor="#a0a0a0" stroked="f"/>
         </w:pict>
       </w:r>
     </w:p>
@@ -162,6 +169,20 @@
         </w:rPr>
         <w:t>2. Median ER wait time</w:t>
       </w:r>
+      <w:r>
+        <w:rPr>
+          <w:b/>
+          <w:bCs/>
+        </w:rPr>
+        <w:t xml:space="preserve"> </w:t>
+      </w:r>
+      <w:r>
+        <w:rPr>
+          <w:b/>
+          <w:bCs/>
+        </w:rPr>
+        <w:t>(in SQL)</w:t>
+      </w:r>
     </w:p>
     <w:p>
       <w:r>
@@ -188,21 +209,13 @@
     </w:p>
     <w:p>
       <w:r>
-        <w:t>Use Excel's </w:t>
-      </w:r>
-      <w:proofErr w:type="gramStart"/>
-      <w:r>
-        <w:t>MEDIAN(</w:t>
-      </w:r>
-      <w:proofErr w:type="gramEnd"/>
-      <w:r>
-        <w:t>) function.</w:t>
+        <w:t>Use Excel's MEDIAN() function.</w:t>
       </w:r>
     </w:p>
     <w:p>
       <w:r>
         <w:pict w14:anchorId="2EF44963">
-          <v:rect id="_x0000_i1075" style="width:0;height:1.5pt" o:hralign="center" o:hrstd="t" o:hr="t" fillcolor="#a0a0a0" stroked="f"/>
+          <v:rect id="_x0000_i1027" style="width:0;height:1.5pt" o:hralign="center" o:hrstd="t" o:hr="t" fillcolor="#a0a0a0" stroked="f"/>
         </w:pict>
       </w:r>
     </w:p>
@@ -220,6 +233,20 @@
         </w:rPr>
         <w:t>3. Wait time by day of week</w:t>
       </w:r>
+      <w:r>
+        <w:rPr>
+          <w:b/>
+          <w:bCs/>
+        </w:rPr>
+        <w:t xml:space="preserve"> </w:t>
+      </w:r>
+      <w:r>
+        <w:rPr>
+          <w:b/>
+          <w:bCs/>
+        </w:rPr>
+        <w:t>(in SQL)</w:t>
+      </w:r>
     </w:p>
     <w:p>
       <w:r>
@@ -279,7 +306,7 @@
     <w:p>
       <w:r>
         <w:pict w14:anchorId="6CB02D75">
-          <v:rect id="_x0000_i1076" style="width:0;height:1.5pt" o:hralign="center" o:hrstd="t" o:hr="t" fillcolor="#a0a0a0" stroked="f"/>
+          <v:rect id="_x0000_i1028" style="width:0;height:1.5pt" o:hralign="center" o:hrstd="t" o:hr="t" fillcolor="#a0a0a0" stroked="f"/>
         </w:pict>
       </w:r>
     </w:p>
@@ -297,37 +324,80 @@
         </w:rPr>
         <w:t>4. Patient arrivals by hour</w:t>
       </w:r>
-    </w:p>
-    <w:p>
-      <w:r>
-        <w:t>Recreate your SQL grouping using a PivotTable.</w:t>
-      </w:r>
-    </w:p>
-    <w:p>
-      <w:r>
-        <w:t>Confirm the top hours.</w:t>
-      </w:r>
-    </w:p>
-    <w:p>
-      <w:r>
-        <w:pict w14:anchorId="3DCCE12F">
-          <v:rect id="_x0000_i1077" style="width:0;height:1.5pt" o:hralign="center" o:hrstd="t" o:hr="t" fillcolor="#a0a0a0" stroked="f"/>
-        </w:pict>
-      </w:r>
-    </w:p>
-    <w:p>
-      <w:pPr>
+      <w:r>
         <w:rPr>
           <w:b/>
           <w:bCs/>
         </w:rPr>
-      </w:pPr>
+        <w:t xml:space="preserve">; </w:t>
+      </w:r>
       <w:r>
         <w:rPr>
           <w:b/>
           <w:bCs/>
         </w:rPr>
+        <w:t>What hours of day see the most patients in the ER?</w:t>
+      </w:r>
+      <w:r>
+        <w:rPr>
+          <w:b/>
+          <w:bCs/>
+        </w:rPr>
+        <w:t xml:space="preserve"> </w:t>
+      </w:r>
+      <w:r>
+        <w:rPr>
+          <w:b/>
+          <w:bCs/>
+        </w:rPr>
+        <w:t>(in SQL)</w:t>
+      </w:r>
+    </w:p>
+    <w:p>
+      <w:r>
+        <w:t>Recreate your SQL grouping using a PivotTable.</w:t>
+      </w:r>
+    </w:p>
+    <w:p>
+      <w:r>
+        <w:t>Confirm the top hours.</w:t>
+      </w:r>
+    </w:p>
+    <w:p>
+      <w:r>
+        <w:pict w14:anchorId="3DCCE12F">
+          <v:rect id="_x0000_i1029" style="width:0;height:1.5pt" o:hralign="center" o:hrstd="t" o:hr="t" fillcolor="#a0a0a0" stroked="f"/>
+        </w:pict>
+      </w:r>
+    </w:p>
+    <w:p>
+      <w:r>
+        <w:rPr>
+          <w:b/>
+          <w:bCs/>
+        </w:rPr>
         <w:t>5. Wait time by severity</w:t>
+      </w:r>
+      <w:r>
+        <w:rPr>
+          <w:b/>
+          <w:bCs/>
+        </w:rPr>
+        <w:t xml:space="preserve"> (</w:t>
+      </w:r>
+      <w:r>
+        <w:rPr>
+          <w:b/>
+          <w:bCs/>
+        </w:rPr>
+        <w:t>What is the average wait time based off of severity level?</w:t>
+      </w:r>
+      <w:r>
+        <w:rPr>
+          <w:b/>
+          <w:bCs/>
+        </w:rPr>
+        <w:t>) – in SQL</w:t>
       </w:r>
     </w:p>
     <w:p>
@@ -387,7 +457,7 @@
     <w:p>
       <w:r>
         <w:pict w14:anchorId="77E78F54">
-          <v:rect id="_x0000_i1078" style="width:0;height:1.5pt" o:hralign="center" o:hrstd="t" o:hr="t" fillcolor="#a0a0a0" stroked="f"/>
+          <v:rect id="_x0000_i1030" style="width:0;height:1.5pt" o:hralign="center" o:hrstd="t" o:hr="t" fillcolor="#a0a0a0" stroked="f"/>
         </w:pict>
       </w:r>
     </w:p>
@@ -405,6 +475,41 @@
         </w:rPr>
         <w:t>6. Admission status</w:t>
       </w:r>
+      <w:r>
+        <w:rPr>
+          <w:b/>
+          <w:bCs/>
+        </w:rPr>
+        <w:t xml:space="preserve"> (</w:t>
+      </w:r>
+      <w:r>
+        <w:rPr>
+          <w:b/>
+          <w:bCs/>
+        </w:rPr>
+        <w:t>Are Admitted Patients waiting longer than di</w:t>
+      </w:r>
+      <w:r>
+        <w:rPr>
+          <w:b/>
+          <w:bCs/>
+        </w:rPr>
+        <w:t>sc</w:t>
+      </w:r>
+      <w:r>
+        <w:rPr>
+          <w:b/>
+          <w:bCs/>
+        </w:rPr>
+        <w:t>harged patients?</w:t>
+      </w:r>
+      <w:r>
+        <w:rPr>
+          <w:b/>
+          <w:bCs/>
+        </w:rPr>
+        <w:t>)</w:t>
+      </w:r>
     </w:p>
     <w:p>
       <w:r>
@@ -436,7 +541,7 @@
     <w:p>
       <w:r>
         <w:pict w14:anchorId="09727FC2">
-          <v:rect id="_x0000_i1079" style="width:0;height:1.5pt" o:hralign="center" o:hrstd="t" o:hr="t" fillcolor="#a0a0a0" stroked="f"/>
+          <v:rect id="_x0000_i1031" style="width:0;height:1.5pt" o:hralign="center" o:hrstd="t" o:hr="t" fillcolor="#a0a0a0" stroked="f"/>
         </w:pict>
       </w:r>
     </w:p>
@@ -454,18 +559,33 @@
         </w:rPr>
         <w:t>7. Peak-period patient mix</w:t>
       </w:r>
-    </w:p>
-    <w:p>
-      <w:r>
-        <w:t xml:space="preserve">Verify your final </w:t>
-      </w:r>
-      <w:proofErr w:type="gramStart"/>
-      <w:r>
-        <w:t>statistic</w:t>
-      </w:r>
-      <w:proofErr w:type="gramEnd"/>
-      <w:r>
-        <w:t>:</w:t>
+      <w:r>
+        <w:rPr>
+          <w:b/>
+          <w:bCs/>
+        </w:rPr>
+        <w:t xml:space="preserve">: For each severity level, what’s the amount of patients seen during peak times? In </w:t>
+      </w:r>
+      <w:proofErr w:type="spellStart"/>
+      <w:r>
+        <w:rPr>
+          <w:b/>
+          <w:bCs/>
+        </w:rPr>
+        <w:t>sql</w:t>
+      </w:r>
+      <w:proofErr w:type="spellEnd"/>
+      <w:r>
+        <w:rPr>
+          <w:b/>
+          <w:bCs/>
+        </w:rPr>
+        <w:t xml:space="preserve">. </w:t>
+      </w:r>
+    </w:p>
+    <w:p>
+      <w:r>
+        <w:t>Verify your final statistic:</w:t>
       </w:r>
     </w:p>
     <w:p>
@@ -483,8 +603,9 @@
     </w:p>
     <w:p>
       <w:r>
+        <w:lastRenderedPageBreak/>
         <w:pict w14:anchorId="089BDADF">
-          <v:rect id="_x0000_i1080" style="width:0;height:1.5pt" o:hralign="center" o:hrstd="t" o:hr="t" fillcolor="#a0a0a0" stroked="f"/>
+          <v:rect id="_x0000_i1032" style="width:0;height:1.5pt" o:hralign="center" o:hrstd="t" o:hr="t" fillcolor="#a0a0a0" stroked="f"/>
         </w:pict>
       </w:r>
     </w:p>
@@ -505,7 +626,6 @@
     </w:p>
     <w:p>
       <w:r>
-        <w:lastRenderedPageBreak/>
         <w:t>When you're finished, your Excel workbook might contain worksheets like:</w:t>
       </w:r>
     </w:p>
@@ -551,40 +671,14 @@
     </w:p>
     <w:p/>
     <w:p>
-      <w:proofErr w:type="gramStart"/>
-      <w:r>
-        <w:t>each</w:t>
-      </w:r>
-      <w:proofErr w:type="gramEnd"/>
-      <w:r>
-        <w:t xml:space="preserve"> worksheet will more accurately be 1 for each business question I answered. </w:t>
-      </w:r>
-      <w:proofErr w:type="gramStart"/>
-      <w:r>
-        <w:t>So</w:t>
-      </w:r>
-      <w:proofErr w:type="gramEnd"/>
-      <w:r>
-        <w:t xml:space="preserve"> </w:t>
-      </w:r>
-      <w:proofErr w:type="gramStart"/>
-      <w:r>
-        <w:t>refer back</w:t>
-      </w:r>
-      <w:proofErr w:type="gramEnd"/>
-      <w:r>
-        <w:t xml:space="preserve"> to </w:t>
-      </w:r>
-      <w:proofErr w:type="gramStart"/>
-      <w:r>
-        <w:t xml:space="preserve">the </w:t>
+      <w:r>
+        <w:t xml:space="preserve">each worksheet will more accurately be 1 for each business question I answered. So refer back to the </w:t>
       </w:r>
       <w:proofErr w:type="spellStart"/>
       <w:r>
         <w:t>the</w:t>
       </w:r>
       <w:proofErr w:type="spellEnd"/>
-      <w:proofErr w:type="gramEnd"/>
       <w:r>
         <w:t xml:space="preserve"> questions I answered in Phase 2, and that should be the number of worksheets in Phase 3. </w:t>
       </w:r>
@@ -646,15 +740,7 @@
         </w:numPr>
       </w:pPr>
       <w:r>
-        <w:t xml:space="preserve">What </w:t>
-      </w:r>
-      <w:proofErr w:type="gramStart"/>
-      <w:r>
-        <w:t>is</w:t>
-      </w:r>
-      <w:proofErr w:type="gramEnd"/>
-      <w:r>
-        <w:t xml:space="preserve"> the average and median ER wait time?</w:t>
+        <w:t>What is the average and median ER wait time?</w:t>
       </w:r>
     </w:p>
     <w:p>
@@ -678,15 +764,7 @@
         </w:numPr>
       </w:pPr>
       <w:r>
-        <w:t xml:space="preserve">Median </w:t>
-      </w:r>
-      <w:proofErr w:type="gramStart"/>
-      <w:r>
-        <w:t>wait</w:t>
-      </w:r>
-      <w:proofErr w:type="gramEnd"/>
-      <w:r>
-        <w:t xml:space="preserve"> time is 67 minutes </w:t>
+        <w:t xml:space="preserve">Median wait time is 67 minutes </w:t>
       </w:r>
     </w:p>
     <w:p>
@@ -737,18 +815,10 @@
         </w:numPr>
       </w:pPr>
       <w:r>
-        <w:t xml:space="preserve">The top </w:t>
-      </w:r>
-      <w:proofErr w:type="gramStart"/>
-      <w:r>
-        <w:t>3</w:t>
-      </w:r>
-      <w:r>
-        <w:t>,</w:t>
-      </w:r>
-      <w:proofErr w:type="gramEnd"/>
-      <w:r>
-        <w:t xml:space="preserve"> </w:t>
+        <w:t>The top 3</w:t>
+      </w:r>
+      <w:r>
+        <w:t xml:space="preserve">, </w:t>
       </w:r>
       <w:r>
         <w:t xml:space="preserve">hours of the day that experienced the most patients in a day are 02:00 at 144 pts, 21:00 at 141 pts, and 0:00 with 140 pts. </w:t>
@@ -775,6 +845,7 @@
         </w:numPr>
       </w:pPr>
       <w:r>
+        <w:lastRenderedPageBreak/>
         <w:t xml:space="preserve">Yes, the lower the severity level, the longer a patient will wait. </w:t>
       </w:r>
       <w:r>
@@ -786,25 +857,8 @@
       <w:r>
         <w:t xml:space="preserve">than medium severity level patients. </w:t>
       </w:r>
-      <w:proofErr w:type="gramStart"/>
-      <w:r>
-        <w:t>Also</w:t>
-      </w:r>
-      <w:proofErr w:type="gramEnd"/>
-      <w:r>
-        <w:t xml:space="preserve"> High severity </w:t>
-      </w:r>
-      <w:r>
-        <w:lastRenderedPageBreak/>
-        <w:t xml:space="preserve">level patients never get seen past 1 hour, and Critical severity level patients get </w:t>
-      </w:r>
-      <w:proofErr w:type="gramStart"/>
-      <w:r>
-        <w:t>seen</w:t>
-      </w:r>
-      <w:proofErr w:type="gramEnd"/>
-      <w:r>
-        <w:t xml:space="preserve"> between 1-15 minutes. </w:t>
+      <w:r>
+        <w:t xml:space="preserve">Also High severity level patients never get seen past 1 hour, and Critical severity level patients get seen between 1-15 minutes. </w:t>
       </w:r>
     </w:p>
     <w:p>
@@ -882,15 +936,7 @@
         <w:t xml:space="preserve"> low severity.</w:t>
       </w:r>
       <w:r>
-        <w:t xml:space="preserve"> These patient groups accounted for </w:t>
-      </w:r>
-      <w:proofErr w:type="gramStart"/>
-      <w:r>
-        <w:t>the majority of</w:t>
-      </w:r>
-      <w:proofErr w:type="gramEnd"/>
-      <w:r>
-        <w:t xml:space="preserve"> ER visits during the busiest periods of the day.</w:t>
+        <w:t xml:space="preserve"> These patient groups accounted for the majority of ER visits during the busiest periods of the day.</w:t>
       </w:r>
       <w:r>
         <w:t xml:space="preserve"> </w:t>
@@ -1069,15 +1115,7 @@
     </w:p>
     <w:p>
       <w:r>
-        <w:t xml:space="preserve">2. Identify the primary and </w:t>
-      </w:r>
-      <w:proofErr w:type="gramStart"/>
-      <w:r>
-        <w:t>Foreign</w:t>
-      </w:r>
-      <w:proofErr w:type="gramEnd"/>
-      <w:r>
-        <w:t xml:space="preserve"> key(s).</w:t>
+        <w:t>2. Identify the primary and Foreign key(s).</w:t>
       </w:r>
     </w:p>
     <w:p>
@@ -1323,6 +1361,7 @@
     </w:p>
     <w:p>
       <w:r>
+        <w:lastRenderedPageBreak/>
         <w:t>4. Determine how the tables relate to one another</w:t>
       </w:r>
       <w:r>
@@ -1339,7 +1378,6 @@
       </w:pPr>
       <w:proofErr w:type="spellStart"/>
       <w:r>
-        <w:lastRenderedPageBreak/>
         <w:t>Er</w:t>
       </w:r>
       <w:r>
@@ -1373,7 +1411,6 @@
       <w:r>
         <w:t xml:space="preserve"> </w:t>
       </w:r>
-      <w:proofErr w:type="gramStart"/>
       <w:r>
         <w:t>patie</w:t>
       </w:r>
@@ -1381,11 +1418,7 @@
         <w:t>nt</w:t>
       </w:r>
       <w:r>
-        <w:t>s</w:t>
-      </w:r>
-      <w:proofErr w:type="gramEnd"/>
-      <w:r>
-        <w:t xml:space="preserve"> data</w:t>
+        <w:t>s data</w:t>
       </w:r>
       <w:r>
         <w:t>se</w:t>
@@ -1691,15 +1724,7 @@
         <w:t>imary ke</w:t>
       </w:r>
       <w:r>
-        <w:t xml:space="preserve">y </w:t>
-      </w:r>
-      <w:proofErr w:type="gramStart"/>
-      <w:r>
-        <w:t>to</w:t>
-      </w:r>
-      <w:proofErr w:type="gramEnd"/>
-      <w:r>
-        <w:t xml:space="preserve"> i</w:t>
+        <w:t>y to i</w:t>
       </w:r>
       <w:r>
         <w:t>d</w:t>
@@ -1841,14 +1866,12 @@
       <w:r>
         <w:t xml:space="preserve">the </w:t>
       </w:r>
-      <w:proofErr w:type="gramStart"/>
       <w:r>
         <w:t>pati</w:t>
       </w:r>
       <w:r>
         <w:t>ents</w:t>
       </w:r>
-      <w:proofErr w:type="gramEnd"/>
       <w:r>
         <w:t xml:space="preserve"> da</w:t>
       </w:r>
@@ -2233,11 +2256,9 @@
       <w:r>
         <w:t xml:space="preserve"> </w:t>
       </w:r>
-      <w:proofErr w:type="gramStart"/>
       <w:r>
         <w:t>hour</w:t>
       </w:r>
-      <w:proofErr w:type="gramEnd"/>
       <w:r>
         <w:t>(s)</w:t>
       </w:r>
@@ -2343,11 +2364,7 @@
         <w:t>ay at t</w:t>
       </w:r>
       <w:r>
-        <w:t xml:space="preserve">he </w:t>
-      </w:r>
-      <w:proofErr w:type="gramStart"/>
-      <w:r>
-        <w:t>ho</w:t>
+        <w:t>he ho</w:t>
       </w:r>
       <w:r>
         <w:t>spital</w:t>
@@ -2356,38 +2373,511 @@
         <w:t xml:space="preserve">, </w:t>
       </w:r>
       <w:r>
-        <w:t xml:space="preserve"> or</w:t>
-      </w:r>
-      <w:proofErr w:type="gramEnd"/>
+        <w:t xml:space="preserve"> or </w:t>
+      </w:r>
+      <w:r>
+        <w:t xml:space="preserve">No: </w:t>
+      </w:r>
+      <w:r>
+        <w:t>dis</w:t>
+      </w:r>
+      <w:r>
+        <w:t>cha</w:t>
+      </w:r>
+      <w:r>
+        <w:t>rg</w:t>
+      </w:r>
+      <w:r>
+        <w:t xml:space="preserve">ed </w:t>
+      </w:r>
+      <w:r>
+        <w:t>afte</w:t>
+      </w:r>
+      <w:r>
+        <w:t xml:space="preserve">r being </w:t>
+      </w:r>
+      <w:r>
+        <w:t xml:space="preserve">seen in the </w:t>
+      </w:r>
+      <w:r>
+        <w:t xml:space="preserve">ER. </w:t>
+      </w:r>
+    </w:p>
+    <w:p>
+      <w:pPr>
+        <w:pStyle w:val="ListParagraph"/>
+        <w:numPr>
+          <w:ilvl w:val="0"/>
+          <w:numId w:val="1"/>
+        </w:numPr>
+      </w:pPr>
+      <w:r>
+        <w:t>A</w:t>
+      </w:r>
+      <w:r>
+        <w:t>p</w:t>
+      </w:r>
+      <w:r>
+        <w:t>pointment</w:t>
+      </w:r>
+      <w:r>
+        <w:t>s</w:t>
+      </w:r>
+    </w:p>
+    <w:p>
+      <w:pPr>
+        <w:pStyle w:val="ListParagraph"/>
+        <w:numPr>
+          <w:ilvl w:val="1"/>
+          <w:numId w:val="1"/>
+        </w:numPr>
+      </w:pPr>
+      <w:proofErr w:type="spellStart"/>
+      <w:r>
+        <w:t>A</w:t>
+      </w:r>
+      <w:r>
+        <w:t>pp</w:t>
+      </w:r>
+      <w:r>
+        <w:t>ointment</w:t>
+      </w:r>
+      <w:r>
+        <w:t>_id</w:t>
+      </w:r>
+      <w:proofErr w:type="spellEnd"/>
+    </w:p>
+    <w:p>
+      <w:pPr>
+        <w:pStyle w:val="ListParagraph"/>
+        <w:numPr>
+          <w:ilvl w:val="2"/>
+          <w:numId w:val="1"/>
+        </w:numPr>
+      </w:pPr>
+      <w:r>
+        <w:t>A number to identify</w:t>
+      </w:r>
+      <w:r>
+        <w:t xml:space="preserve"> each appointment at the </w:t>
+      </w:r>
+      <w:r>
+        <w:t>Valley Regional Medical Center</w:t>
+      </w:r>
+      <w:r>
+        <w:t xml:space="preserve">. </w:t>
+      </w:r>
+    </w:p>
+    <w:p>
+      <w:pPr>
+        <w:pStyle w:val="ListParagraph"/>
+        <w:numPr>
+          <w:ilvl w:val="1"/>
+          <w:numId w:val="1"/>
+        </w:numPr>
+      </w:pPr>
+      <w:proofErr w:type="spellStart"/>
+      <w:r>
+        <w:lastRenderedPageBreak/>
+        <w:t>P</w:t>
+      </w:r>
+      <w:r>
+        <w:t>ati</w:t>
+      </w:r>
+      <w:r>
+        <w:t>ent_id</w:t>
+      </w:r>
+      <w:proofErr w:type="spellEnd"/>
+    </w:p>
+    <w:p>
+      <w:pPr>
+        <w:pStyle w:val="ListParagraph"/>
+        <w:numPr>
+          <w:ilvl w:val="2"/>
+          <w:numId w:val="1"/>
+        </w:numPr>
+      </w:pPr>
+      <w:r>
+        <w:t>An id, referencing a specific patient. The details of the p</w:t>
+      </w:r>
+      <w:r>
+        <w:t>atient</w:t>
+      </w:r>
+      <w:r>
+        <w:t xml:space="preserve"> will be found withing the patient dataset. </w:t>
+      </w:r>
+    </w:p>
+    <w:p>
+      <w:pPr>
+        <w:pStyle w:val="ListParagraph"/>
+        <w:numPr>
+          <w:ilvl w:val="1"/>
+          <w:numId w:val="1"/>
+        </w:numPr>
+      </w:pPr>
+      <w:proofErr w:type="spellStart"/>
+      <w:r>
+        <w:t>P</w:t>
+      </w:r>
+      <w:r>
+        <w:t>rovi</w:t>
+      </w:r>
+      <w:r>
+        <w:t>der_id</w:t>
+      </w:r>
+      <w:proofErr w:type="spellEnd"/>
+    </w:p>
+    <w:p>
+      <w:pPr>
+        <w:pStyle w:val="ListParagraph"/>
+        <w:numPr>
+          <w:ilvl w:val="2"/>
+          <w:numId w:val="1"/>
+        </w:numPr>
+      </w:pPr>
+      <w:r>
+        <w:t>An id</w:t>
+      </w:r>
+      <w:r>
+        <w:t>,</w:t>
+      </w:r>
+      <w:r>
+        <w:t xml:space="preserve"> referencing a specific provider. The details of the provider will be found withing the provider dataset. </w:t>
+      </w:r>
+    </w:p>
+    <w:p>
+      <w:pPr>
+        <w:pStyle w:val="ListParagraph"/>
+        <w:numPr>
+          <w:ilvl w:val="1"/>
+          <w:numId w:val="1"/>
+        </w:numPr>
+      </w:pPr>
+      <w:r>
+        <w:t>D</w:t>
+      </w:r>
+      <w:r>
+        <w:t>e</w:t>
+      </w:r>
+      <w:r>
+        <w:t>part</w:t>
+      </w:r>
+      <w:r>
+        <w:t>ment</w:t>
+      </w:r>
+    </w:p>
+    <w:p>
+      <w:pPr>
+        <w:pStyle w:val="ListParagraph"/>
+        <w:numPr>
+          <w:ilvl w:val="2"/>
+          <w:numId w:val="1"/>
+        </w:numPr>
+      </w:pPr>
+      <w:r>
+        <w:t xml:space="preserve">Shows which department the appointment is associated with. </w:t>
+      </w:r>
+    </w:p>
+    <w:p>
+      <w:pPr>
+        <w:pStyle w:val="ListParagraph"/>
+        <w:numPr>
+          <w:ilvl w:val="1"/>
+          <w:numId w:val="1"/>
+        </w:numPr>
+      </w:pPr>
+      <w:proofErr w:type="spellStart"/>
+      <w:r>
+        <w:t>A</w:t>
+      </w:r>
+      <w:r>
+        <w:t>ppo</w:t>
+      </w:r>
+      <w:r>
+        <w:t>intment</w:t>
+      </w:r>
+      <w:r>
+        <w:t>_date</w:t>
+      </w:r>
+      <w:proofErr w:type="spellEnd"/>
+    </w:p>
+    <w:p>
+      <w:pPr>
+        <w:pStyle w:val="ListParagraph"/>
+        <w:numPr>
+          <w:ilvl w:val="2"/>
+          <w:numId w:val="1"/>
+        </w:numPr>
+      </w:pPr>
+      <w:r>
+        <w:t xml:space="preserve">Shows the date of the appointment. </w:t>
+      </w:r>
+    </w:p>
+    <w:p>
+      <w:pPr>
+        <w:pStyle w:val="ListParagraph"/>
+        <w:numPr>
+          <w:ilvl w:val="1"/>
+          <w:numId w:val="1"/>
+        </w:numPr>
+      </w:pPr>
+      <w:proofErr w:type="spellStart"/>
+      <w:r>
+        <w:t>A</w:t>
+      </w:r>
+      <w:r>
+        <w:t>pp</w:t>
+      </w:r>
+      <w:r>
+        <w:t>ointment</w:t>
+      </w:r>
+      <w:r>
+        <w:t>_day</w:t>
+      </w:r>
+      <w:proofErr w:type="spellEnd"/>
+    </w:p>
+    <w:p>
+      <w:pPr>
+        <w:pStyle w:val="ListParagraph"/>
+        <w:numPr>
+          <w:ilvl w:val="2"/>
+          <w:numId w:val="1"/>
+        </w:numPr>
+      </w:pPr>
+      <w:r>
+        <w:t xml:space="preserve">Shows the day of the week the appointment was on. </w:t>
+      </w:r>
+    </w:p>
+    <w:p>
+      <w:pPr>
+        <w:pStyle w:val="ListParagraph"/>
+        <w:numPr>
+          <w:ilvl w:val="1"/>
+          <w:numId w:val="1"/>
+        </w:numPr>
+      </w:pPr>
+      <w:proofErr w:type="spellStart"/>
+      <w:r>
+        <w:t>A</w:t>
+      </w:r>
+      <w:r>
+        <w:t>ppoint</w:t>
+      </w:r>
+      <w:r>
+        <w:t>ment_ty</w:t>
+      </w:r>
+      <w:r>
+        <w:t>pe</w:t>
+      </w:r>
+      <w:proofErr w:type="spellEnd"/>
+    </w:p>
+    <w:p>
+      <w:pPr>
+        <w:pStyle w:val="ListParagraph"/>
+        <w:numPr>
+          <w:ilvl w:val="2"/>
+          <w:numId w:val="1"/>
+        </w:numPr>
+      </w:pPr>
+      <w:r>
+        <w:t xml:space="preserve">Defines the type of appointment </w:t>
+      </w:r>
+    </w:p>
+    <w:p>
+      <w:pPr>
+        <w:pStyle w:val="ListParagraph"/>
+        <w:numPr>
+          <w:ilvl w:val="1"/>
+          <w:numId w:val="1"/>
+        </w:numPr>
+      </w:pPr>
+      <w:proofErr w:type="spellStart"/>
+      <w:r>
+        <w:t>A</w:t>
+      </w:r>
+      <w:r>
+        <w:t>pp</w:t>
+      </w:r>
+      <w:r>
+        <w:t>ointment</w:t>
+      </w:r>
+      <w:r>
+        <w:t>_</w:t>
+      </w:r>
+      <w:r>
+        <w:t>sta</w:t>
+      </w:r>
+      <w:r>
+        <w:t>tus</w:t>
+      </w:r>
+      <w:proofErr w:type="spellEnd"/>
+    </w:p>
+    <w:p>
+      <w:pPr>
+        <w:pStyle w:val="ListParagraph"/>
+        <w:numPr>
+          <w:ilvl w:val="2"/>
+          <w:numId w:val="1"/>
+        </w:numPr>
+      </w:pPr>
+      <w:r>
+        <w:t xml:space="preserve">Defines an appointment as either </w:t>
+      </w:r>
+      <w:r>
+        <w:t>Completed, Cancelled, or no-show</w:t>
+      </w:r>
+    </w:p>
+    <w:p>
+      <w:pPr>
+        <w:pStyle w:val="ListParagraph"/>
+        <w:numPr>
+          <w:ilvl w:val="1"/>
+          <w:numId w:val="1"/>
+        </w:numPr>
+      </w:pPr>
+      <w:proofErr w:type="spellStart"/>
+      <w:r>
+        <w:t>A</w:t>
+      </w:r>
+      <w:r>
+        <w:t>pp</w:t>
+      </w:r>
+      <w:r>
+        <w:t>ointment</w:t>
+      </w:r>
+      <w:r>
+        <w:t>_dura</w:t>
+      </w:r>
+      <w:r>
+        <w:t>tion</w:t>
+      </w:r>
+      <w:r>
+        <w:t>_</w:t>
+      </w:r>
+      <w:r>
+        <w:t>min</w:t>
+      </w:r>
+      <w:r>
+        <w:t>utes</w:t>
+      </w:r>
+      <w:proofErr w:type="spellEnd"/>
+    </w:p>
+    <w:p>
+      <w:pPr>
+        <w:pStyle w:val="ListParagraph"/>
+        <w:numPr>
+          <w:ilvl w:val="2"/>
+          <w:numId w:val="1"/>
+        </w:numPr>
+      </w:pPr>
+      <w:r>
+        <w:t xml:space="preserve">Shows length of time </w:t>
+      </w:r>
+      <w:r>
+        <w:t xml:space="preserve">for the appointment </w:t>
+      </w:r>
+    </w:p>
+    <w:p>
+      <w:pPr>
+        <w:pStyle w:val="ListParagraph"/>
+        <w:numPr>
+          <w:ilvl w:val="1"/>
+          <w:numId w:val="1"/>
+        </w:numPr>
+      </w:pPr>
+      <w:proofErr w:type="spellStart"/>
+      <w:r>
+        <w:t>P</w:t>
+      </w:r>
+      <w:r>
+        <w:t>atient</w:t>
+      </w:r>
+      <w:r>
+        <w:t>_</w:t>
+      </w:r>
+      <w:r>
+        <w:t>s</w:t>
+      </w:r>
+      <w:r>
+        <w:t>a</w:t>
+      </w:r>
+      <w:r>
+        <w:t>tient_</w:t>
+      </w:r>
+      <w:r>
+        <w:t>satis</w:t>
+      </w:r>
+      <w:r>
+        <w:t>factio</w:t>
+      </w:r>
+      <w:r>
+        <w:t>n_</w:t>
+      </w:r>
+      <w:r>
+        <w:t>scor</w:t>
+      </w:r>
+      <w:r>
+        <w:t>e</w:t>
+      </w:r>
+      <w:proofErr w:type="spellEnd"/>
       <w:r>
         <w:t xml:space="preserve"> </w:t>
       </w:r>
-      <w:r>
-        <w:t xml:space="preserve">No: </w:t>
-      </w:r>
-      <w:r>
-        <w:t>dis</w:t>
-      </w:r>
-      <w:r>
-        <w:t>cha</w:t>
-      </w:r>
-      <w:r>
-        <w:t>rg</w:t>
-      </w:r>
-      <w:r>
-        <w:t xml:space="preserve">ed </w:t>
-      </w:r>
-      <w:r>
-        <w:t>afte</w:t>
-      </w:r>
-      <w:r>
-        <w:t xml:space="preserve">r being </w:t>
-      </w:r>
-      <w:r>
-        <w:t xml:space="preserve">seen in the </w:t>
-      </w:r>
-      <w:r>
-        <w:t xml:space="preserve">ER. </w:t>
+    </w:p>
+    <w:p>
+      <w:pPr>
+        <w:pStyle w:val="ListParagraph"/>
+        <w:numPr>
+          <w:ilvl w:val="2"/>
+          <w:numId w:val="1"/>
+        </w:numPr>
+      </w:pPr>
+      <w:r>
+        <w:t xml:space="preserve">A </w:t>
+      </w:r>
+      <w:r>
+        <w:t xml:space="preserve">decimal scale from </w:t>
+      </w:r>
+      <w:r>
+        <w:t xml:space="preserve">1-5 </w:t>
+      </w:r>
+      <w:proofErr w:type="spellStart"/>
+      <w:r>
+        <w:t>ignifying</w:t>
+      </w:r>
+      <w:proofErr w:type="spellEnd"/>
+      <w:r>
+        <w:t xml:space="preserve"> patient satisfaction</w:t>
+      </w:r>
+    </w:p>
+    <w:p>
+      <w:pPr>
+        <w:pStyle w:val="ListParagraph"/>
+        <w:numPr>
+          <w:ilvl w:val="3"/>
+          <w:numId w:val="1"/>
+        </w:numPr>
+      </w:pPr>
+      <w:r>
+        <w:t xml:space="preserve">There </w:t>
+      </w:r>
+      <w:r>
+        <w:t>are</w:t>
+      </w:r>
+      <w:r>
+        <w:t xml:space="preserve"> about 1,000</w:t>
+      </w:r>
+      <w:r>
+        <w:t xml:space="preserve"> appointments with miss</w:t>
+      </w:r>
+      <w:r>
+        <w:t>ing</w:t>
+      </w:r>
+      <w:r>
+        <w:t xml:space="preserve"> satisfaction scores. </w:t>
+      </w:r>
+      <w:r>
+        <w:t xml:space="preserve">Null values will mean patients either canceled or no-show. </w:t>
       </w:r>
     </w:p>
     <w:p>
@@ -2399,16 +2889,7 @@
         </w:numPr>
       </w:pPr>
       <w:r>
-        <w:t>A</w:t>
-      </w:r>
-      <w:r>
-        <w:t>p</w:t>
-      </w:r>
-      <w:r>
-        <w:t>pointment</w:t>
-      </w:r>
-      <w:r>
-        <w:t>s</w:t>
+        <w:t>Patients</w:t>
       </w:r>
     </w:p>
     <w:p>
@@ -2421,16 +2902,7 @@
       </w:pPr>
       <w:proofErr w:type="spellStart"/>
       <w:r>
-        <w:t>A</w:t>
-      </w:r>
-      <w:r>
-        <w:t>pp</w:t>
-      </w:r>
-      <w:r>
-        <w:t>ointment</w:t>
-      </w:r>
-      <w:r>
-        <w:t>_id</w:t>
+        <w:t>Patient_id</w:t>
       </w:r>
       <w:proofErr w:type="spellEnd"/>
     </w:p>
@@ -2443,16 +2915,7 @@
         </w:numPr>
       </w:pPr>
       <w:r>
-        <w:t>A number to identify</w:t>
-      </w:r>
-      <w:r>
-        <w:t xml:space="preserve"> each appointment at the </w:t>
-      </w:r>
-      <w:r>
-        <w:t>Valley Regional Medical Center</w:t>
-      </w:r>
-      <w:r>
-        <w:t xml:space="preserve">. </w:t>
+        <w:t xml:space="preserve">Unique identifier for each patient. </w:t>
       </w:r>
     </w:p>
     <w:p>
@@ -2465,13 +2928,7 @@
       </w:pPr>
       <w:proofErr w:type="spellStart"/>
       <w:r>
-        <w:t>P</w:t>
-      </w:r>
-      <w:r>
-        <w:t>ati</w:t>
-      </w:r>
-      <w:r>
-        <w:t>ent_id</w:t>
+        <w:t>Patient_name</w:t>
       </w:r>
       <w:proofErr w:type="spellEnd"/>
     </w:p>
@@ -2484,33 +2941,117 @@
         </w:numPr>
       </w:pPr>
       <w:r>
+        <w:t xml:space="preserve">First and last name of patient </w:t>
+      </w:r>
+    </w:p>
+    <w:p>
+      <w:pPr>
+        <w:pStyle w:val="ListParagraph"/>
+        <w:numPr>
+          <w:ilvl w:val="3"/>
+          <w:numId w:val="1"/>
+        </w:numPr>
+      </w:pPr>
+      <w:r>
+        <w:t xml:space="preserve">First and last name are within the same record. I’m wondering if it’s best to do splitting so that first and last name have their own fields.  </w:t>
+      </w:r>
+    </w:p>
+    <w:p>
+      <w:pPr>
+        <w:pStyle w:val="ListParagraph"/>
+        <w:numPr>
+          <w:ilvl w:val="1"/>
+          <w:numId w:val="1"/>
+        </w:numPr>
+      </w:pPr>
+      <w:r>
+        <w:t>Age</w:t>
+      </w:r>
+    </w:p>
+    <w:p>
+      <w:pPr>
+        <w:pStyle w:val="ListParagraph"/>
+        <w:numPr>
+          <w:ilvl w:val="2"/>
+          <w:numId w:val="1"/>
+        </w:numPr>
+      </w:pPr>
+      <w:r>
+        <w:t>Age in years of patient</w:t>
+      </w:r>
+    </w:p>
+    <w:p>
+      <w:pPr>
+        <w:pStyle w:val="ListParagraph"/>
+        <w:numPr>
+          <w:ilvl w:val="1"/>
+          <w:numId w:val="1"/>
+        </w:numPr>
+      </w:pPr>
+      <w:r>
+        <w:t>Gender</w:t>
+      </w:r>
+    </w:p>
+    <w:p>
+      <w:pPr>
+        <w:pStyle w:val="ListParagraph"/>
+        <w:numPr>
+          <w:ilvl w:val="2"/>
+          <w:numId w:val="1"/>
+        </w:numPr>
+      </w:pPr>
+      <w:r>
+        <w:t xml:space="preserve">Biological sex of patient </w:t>
+      </w:r>
+    </w:p>
+    <w:p>
+      <w:pPr>
+        <w:pStyle w:val="ListParagraph"/>
+        <w:numPr>
+          <w:ilvl w:val="1"/>
+          <w:numId w:val="1"/>
+        </w:numPr>
+      </w:pPr>
+      <w:r>
+        <w:t xml:space="preserve">City </w:t>
+      </w:r>
+    </w:p>
+    <w:p>
+      <w:pPr>
+        <w:pStyle w:val="ListParagraph"/>
+        <w:numPr>
+          <w:ilvl w:val="2"/>
+          <w:numId w:val="1"/>
+        </w:numPr>
+      </w:pPr>
+      <w:r>
+        <w:t xml:space="preserve">The city where the patient is from </w:t>
+      </w:r>
+    </w:p>
+    <w:p>
+      <w:pPr>
+        <w:pStyle w:val="ListParagraph"/>
+        <w:numPr>
+          <w:ilvl w:val="0"/>
+          <w:numId w:val="1"/>
+        </w:numPr>
+      </w:pPr>
+      <w:r>
+        <w:t>Providers</w:t>
+      </w:r>
+    </w:p>
+    <w:p>
+      <w:pPr>
+        <w:pStyle w:val="ListParagraph"/>
+        <w:numPr>
+          <w:ilvl w:val="1"/>
+          <w:numId w:val="1"/>
+        </w:numPr>
+      </w:pPr>
+      <w:proofErr w:type="spellStart"/>
+      <w:r>
         <w:lastRenderedPageBreak/>
-        <w:t>An id, referencing a specific patient. The details of the p</w:t>
-      </w:r>
-      <w:r>
-        <w:t>atient</w:t>
-      </w:r>
-      <w:r>
-        <w:t xml:space="preserve"> will be found withing the patient dataset. </w:t>
-      </w:r>
-    </w:p>
-    <w:p>
-      <w:pPr>
-        <w:pStyle w:val="ListParagraph"/>
-        <w:numPr>
-          <w:ilvl w:val="1"/>
-          <w:numId w:val="1"/>
-        </w:numPr>
-      </w:pPr>
-      <w:proofErr w:type="spellStart"/>
-      <w:r>
-        <w:t>P</w:t>
-      </w:r>
-      <w:r>
-        <w:t>rovi</w:t>
-      </w:r>
-      <w:r>
-        <w:t>der_id</w:t>
+        <w:t>Provider_id</w:t>
       </w:r>
       <w:proofErr w:type="spellEnd"/>
     </w:p>
@@ -2523,542 +3064,6 @@
         </w:numPr>
       </w:pPr>
       <w:r>
-        <w:t>An id</w:t>
-      </w:r>
-      <w:r>
-        <w:t>,</w:t>
-      </w:r>
-      <w:r>
-        <w:t xml:space="preserve"> referencing a specific provider. The details of the provider will be found withing the provider dataset. </w:t>
-      </w:r>
-    </w:p>
-    <w:p>
-      <w:pPr>
-        <w:pStyle w:val="ListParagraph"/>
-        <w:numPr>
-          <w:ilvl w:val="1"/>
-          <w:numId w:val="1"/>
-        </w:numPr>
-      </w:pPr>
-      <w:r>
-        <w:t>D</w:t>
-      </w:r>
-      <w:r>
-        <w:t>e</w:t>
-      </w:r>
-      <w:r>
-        <w:t>part</w:t>
-      </w:r>
-      <w:r>
-        <w:t>ment</w:t>
-      </w:r>
-    </w:p>
-    <w:p>
-      <w:pPr>
-        <w:pStyle w:val="ListParagraph"/>
-        <w:numPr>
-          <w:ilvl w:val="2"/>
-          <w:numId w:val="1"/>
-        </w:numPr>
-      </w:pPr>
-      <w:r>
-        <w:t xml:space="preserve">Shows which department the appointment is associated with. </w:t>
-      </w:r>
-    </w:p>
-    <w:p>
-      <w:pPr>
-        <w:pStyle w:val="ListParagraph"/>
-        <w:numPr>
-          <w:ilvl w:val="1"/>
-          <w:numId w:val="1"/>
-        </w:numPr>
-      </w:pPr>
-      <w:proofErr w:type="spellStart"/>
-      <w:r>
-        <w:t>A</w:t>
-      </w:r>
-      <w:r>
-        <w:t>ppo</w:t>
-      </w:r>
-      <w:r>
-        <w:t>intment</w:t>
-      </w:r>
-      <w:r>
-        <w:t>_date</w:t>
-      </w:r>
-      <w:proofErr w:type="spellEnd"/>
-    </w:p>
-    <w:p>
-      <w:pPr>
-        <w:pStyle w:val="ListParagraph"/>
-        <w:numPr>
-          <w:ilvl w:val="2"/>
-          <w:numId w:val="1"/>
-        </w:numPr>
-      </w:pPr>
-      <w:r>
-        <w:t xml:space="preserve">Shows the date of the appointment. </w:t>
-      </w:r>
-    </w:p>
-    <w:p>
-      <w:pPr>
-        <w:pStyle w:val="ListParagraph"/>
-        <w:numPr>
-          <w:ilvl w:val="1"/>
-          <w:numId w:val="1"/>
-        </w:numPr>
-      </w:pPr>
-      <w:proofErr w:type="spellStart"/>
-      <w:r>
-        <w:t>A</w:t>
-      </w:r>
-      <w:r>
-        <w:t>pp</w:t>
-      </w:r>
-      <w:r>
-        <w:t>ointment</w:t>
-      </w:r>
-      <w:r>
-        <w:t>_day</w:t>
-      </w:r>
-      <w:proofErr w:type="spellEnd"/>
-    </w:p>
-    <w:p>
-      <w:pPr>
-        <w:pStyle w:val="ListParagraph"/>
-        <w:numPr>
-          <w:ilvl w:val="2"/>
-          <w:numId w:val="1"/>
-        </w:numPr>
-      </w:pPr>
-      <w:r>
-        <w:t xml:space="preserve">Shows the day of the week the appointment was on. </w:t>
-      </w:r>
-    </w:p>
-    <w:p>
-      <w:pPr>
-        <w:pStyle w:val="ListParagraph"/>
-        <w:numPr>
-          <w:ilvl w:val="1"/>
-          <w:numId w:val="1"/>
-        </w:numPr>
-      </w:pPr>
-      <w:proofErr w:type="spellStart"/>
-      <w:r>
-        <w:t>A</w:t>
-      </w:r>
-      <w:r>
-        <w:t>ppoint</w:t>
-      </w:r>
-      <w:r>
-        <w:t>ment_ty</w:t>
-      </w:r>
-      <w:r>
-        <w:t>pe</w:t>
-      </w:r>
-      <w:proofErr w:type="spellEnd"/>
-    </w:p>
-    <w:p>
-      <w:pPr>
-        <w:pStyle w:val="ListParagraph"/>
-        <w:numPr>
-          <w:ilvl w:val="2"/>
-          <w:numId w:val="1"/>
-        </w:numPr>
-      </w:pPr>
-      <w:r>
-        <w:t xml:space="preserve">Defines the type of appointment </w:t>
-      </w:r>
-    </w:p>
-    <w:p>
-      <w:pPr>
-        <w:pStyle w:val="ListParagraph"/>
-        <w:numPr>
-          <w:ilvl w:val="1"/>
-          <w:numId w:val="1"/>
-        </w:numPr>
-      </w:pPr>
-      <w:proofErr w:type="spellStart"/>
-      <w:r>
-        <w:t>A</w:t>
-      </w:r>
-      <w:r>
-        <w:t>pp</w:t>
-      </w:r>
-      <w:r>
-        <w:t>ointment</w:t>
-      </w:r>
-      <w:r>
-        <w:t>_</w:t>
-      </w:r>
-      <w:r>
-        <w:t>sta</w:t>
-      </w:r>
-      <w:r>
-        <w:t>tus</w:t>
-      </w:r>
-      <w:proofErr w:type="spellEnd"/>
-    </w:p>
-    <w:p>
-      <w:pPr>
-        <w:pStyle w:val="ListParagraph"/>
-        <w:numPr>
-          <w:ilvl w:val="2"/>
-          <w:numId w:val="1"/>
-        </w:numPr>
-      </w:pPr>
-      <w:r>
-        <w:t xml:space="preserve">Defines an appointment as either </w:t>
-      </w:r>
-      <w:r>
-        <w:t>Completed, Cancelled, or no-show</w:t>
-      </w:r>
-    </w:p>
-    <w:p>
-      <w:pPr>
-        <w:pStyle w:val="ListParagraph"/>
-        <w:numPr>
-          <w:ilvl w:val="1"/>
-          <w:numId w:val="1"/>
-        </w:numPr>
-      </w:pPr>
-      <w:proofErr w:type="spellStart"/>
-      <w:r>
-        <w:t>A</w:t>
-      </w:r>
-      <w:r>
-        <w:t>pp</w:t>
-      </w:r>
-      <w:r>
-        <w:t>ointment</w:t>
-      </w:r>
-      <w:r>
-        <w:t>_dura</w:t>
-      </w:r>
-      <w:r>
-        <w:t>tion</w:t>
-      </w:r>
-      <w:r>
-        <w:t>_</w:t>
-      </w:r>
-      <w:r>
-        <w:t>min</w:t>
-      </w:r>
-      <w:r>
-        <w:t>utes</w:t>
-      </w:r>
-      <w:proofErr w:type="spellEnd"/>
-    </w:p>
-    <w:p>
-      <w:pPr>
-        <w:pStyle w:val="ListParagraph"/>
-        <w:numPr>
-          <w:ilvl w:val="2"/>
-          <w:numId w:val="1"/>
-        </w:numPr>
-      </w:pPr>
-      <w:r>
-        <w:t xml:space="preserve">Shows length of time </w:t>
-      </w:r>
-      <w:r>
-        <w:t xml:space="preserve">for the appointment </w:t>
-      </w:r>
-    </w:p>
-    <w:p>
-      <w:pPr>
-        <w:pStyle w:val="ListParagraph"/>
-        <w:numPr>
-          <w:ilvl w:val="1"/>
-          <w:numId w:val="1"/>
-        </w:numPr>
-      </w:pPr>
-      <w:proofErr w:type="spellStart"/>
-      <w:r>
-        <w:t>P</w:t>
-      </w:r>
-      <w:r>
-        <w:t>atient</w:t>
-      </w:r>
-      <w:r>
-        <w:t>_</w:t>
-      </w:r>
-      <w:r>
-        <w:t>s</w:t>
-      </w:r>
-      <w:r>
-        <w:t>a</w:t>
-      </w:r>
-      <w:r>
-        <w:t>tient_</w:t>
-      </w:r>
-      <w:r>
-        <w:t>satis</w:t>
-      </w:r>
-      <w:r>
-        <w:t>factio</w:t>
-      </w:r>
-      <w:r>
-        <w:t>n_</w:t>
-      </w:r>
-      <w:r>
-        <w:t>scor</w:t>
-      </w:r>
-      <w:r>
-        <w:t>e</w:t>
-      </w:r>
-      <w:proofErr w:type="spellEnd"/>
-      <w:r>
-        <w:t xml:space="preserve"> </w:t>
-      </w:r>
-    </w:p>
-    <w:p>
-      <w:pPr>
-        <w:pStyle w:val="ListParagraph"/>
-        <w:numPr>
-          <w:ilvl w:val="2"/>
-          <w:numId w:val="1"/>
-        </w:numPr>
-      </w:pPr>
-      <w:r>
-        <w:t xml:space="preserve">A </w:t>
-      </w:r>
-      <w:r>
-        <w:t xml:space="preserve">decimal scale from </w:t>
-      </w:r>
-      <w:r>
-        <w:t xml:space="preserve">1-5 </w:t>
-      </w:r>
-      <w:proofErr w:type="spellStart"/>
-      <w:r>
-        <w:t>ignifying</w:t>
-      </w:r>
-      <w:proofErr w:type="spellEnd"/>
-      <w:r>
-        <w:t xml:space="preserve"> patient satisfaction</w:t>
-      </w:r>
-    </w:p>
-    <w:p>
-      <w:pPr>
-        <w:pStyle w:val="ListParagraph"/>
-        <w:numPr>
-          <w:ilvl w:val="3"/>
-          <w:numId w:val="1"/>
-        </w:numPr>
-      </w:pPr>
-      <w:r>
-        <w:t xml:space="preserve">There </w:t>
-      </w:r>
-      <w:r>
-        <w:t>are</w:t>
-      </w:r>
-      <w:r>
-        <w:t xml:space="preserve"> about 1,000</w:t>
-      </w:r>
-      <w:r>
-        <w:t xml:space="preserve"> appointments with miss</w:t>
-      </w:r>
-      <w:r>
-        <w:t>ing</w:t>
-      </w:r>
-      <w:r>
-        <w:t xml:space="preserve"> satisfaction scores. </w:t>
-      </w:r>
-      <w:r>
-        <w:t xml:space="preserve">Null values will mean patients </w:t>
-      </w:r>
-      <w:proofErr w:type="gramStart"/>
-      <w:r>
-        <w:t>either</w:t>
-      </w:r>
-      <w:proofErr w:type="gramEnd"/>
-      <w:r>
-        <w:t xml:space="preserve"> canceled or no-show. </w:t>
-      </w:r>
-    </w:p>
-    <w:p>
-      <w:pPr>
-        <w:pStyle w:val="ListParagraph"/>
-        <w:numPr>
-          <w:ilvl w:val="0"/>
-          <w:numId w:val="1"/>
-        </w:numPr>
-      </w:pPr>
-      <w:r>
-        <w:t>Patients</w:t>
-      </w:r>
-    </w:p>
-    <w:p>
-      <w:pPr>
-        <w:pStyle w:val="ListParagraph"/>
-        <w:numPr>
-          <w:ilvl w:val="1"/>
-          <w:numId w:val="1"/>
-        </w:numPr>
-      </w:pPr>
-      <w:proofErr w:type="spellStart"/>
-      <w:r>
-        <w:t>Patient_id</w:t>
-      </w:r>
-      <w:proofErr w:type="spellEnd"/>
-    </w:p>
-    <w:p>
-      <w:pPr>
-        <w:pStyle w:val="ListParagraph"/>
-        <w:numPr>
-          <w:ilvl w:val="2"/>
-          <w:numId w:val="1"/>
-        </w:numPr>
-      </w:pPr>
-      <w:r>
-        <w:t xml:space="preserve">Unique identifier for each patient. </w:t>
-      </w:r>
-    </w:p>
-    <w:p>
-      <w:pPr>
-        <w:pStyle w:val="ListParagraph"/>
-        <w:numPr>
-          <w:ilvl w:val="1"/>
-          <w:numId w:val="1"/>
-        </w:numPr>
-      </w:pPr>
-      <w:proofErr w:type="spellStart"/>
-      <w:r>
-        <w:t>Patient_name</w:t>
-      </w:r>
-      <w:proofErr w:type="spellEnd"/>
-    </w:p>
-    <w:p>
-      <w:pPr>
-        <w:pStyle w:val="ListParagraph"/>
-        <w:numPr>
-          <w:ilvl w:val="2"/>
-          <w:numId w:val="1"/>
-        </w:numPr>
-      </w:pPr>
-      <w:r>
-        <w:t xml:space="preserve">First and last name of patient </w:t>
-      </w:r>
-    </w:p>
-    <w:p>
-      <w:pPr>
-        <w:pStyle w:val="ListParagraph"/>
-        <w:numPr>
-          <w:ilvl w:val="3"/>
-          <w:numId w:val="1"/>
-        </w:numPr>
-      </w:pPr>
-      <w:r>
-        <w:t xml:space="preserve">First and last name are within the same record. I’m wondering if it’s best to do splitting so that first and last name have their own fields.  </w:t>
-      </w:r>
-    </w:p>
-    <w:p>
-      <w:pPr>
-        <w:pStyle w:val="ListParagraph"/>
-        <w:numPr>
-          <w:ilvl w:val="1"/>
-          <w:numId w:val="1"/>
-        </w:numPr>
-      </w:pPr>
-      <w:r>
-        <w:t>Age</w:t>
-      </w:r>
-    </w:p>
-    <w:p>
-      <w:pPr>
-        <w:pStyle w:val="ListParagraph"/>
-        <w:numPr>
-          <w:ilvl w:val="2"/>
-          <w:numId w:val="1"/>
-        </w:numPr>
-      </w:pPr>
-      <w:r>
-        <w:t>Age in years of patient</w:t>
-      </w:r>
-    </w:p>
-    <w:p>
-      <w:pPr>
-        <w:pStyle w:val="ListParagraph"/>
-        <w:numPr>
-          <w:ilvl w:val="1"/>
-          <w:numId w:val="1"/>
-        </w:numPr>
-      </w:pPr>
-      <w:r>
-        <w:t>Gender</w:t>
-      </w:r>
-    </w:p>
-    <w:p>
-      <w:pPr>
-        <w:pStyle w:val="ListParagraph"/>
-        <w:numPr>
-          <w:ilvl w:val="2"/>
-          <w:numId w:val="1"/>
-        </w:numPr>
-      </w:pPr>
-      <w:r>
-        <w:t xml:space="preserve">Biological sex of patient </w:t>
-      </w:r>
-    </w:p>
-    <w:p>
-      <w:pPr>
-        <w:pStyle w:val="ListParagraph"/>
-        <w:numPr>
-          <w:ilvl w:val="1"/>
-          <w:numId w:val="1"/>
-        </w:numPr>
-      </w:pPr>
-      <w:r>
-        <w:t xml:space="preserve">City </w:t>
-      </w:r>
-    </w:p>
-    <w:p>
-      <w:pPr>
-        <w:pStyle w:val="ListParagraph"/>
-        <w:numPr>
-          <w:ilvl w:val="2"/>
-          <w:numId w:val="1"/>
-        </w:numPr>
-      </w:pPr>
-      <w:r>
-        <w:t xml:space="preserve">The city where the patient is from </w:t>
-      </w:r>
-    </w:p>
-    <w:p>
-      <w:pPr>
-        <w:pStyle w:val="ListParagraph"/>
-        <w:numPr>
-          <w:ilvl w:val="0"/>
-          <w:numId w:val="1"/>
-        </w:numPr>
-      </w:pPr>
-      <w:r>
-        <w:t>Providers</w:t>
-      </w:r>
-    </w:p>
-    <w:p>
-      <w:pPr>
-        <w:pStyle w:val="ListParagraph"/>
-        <w:numPr>
-          <w:ilvl w:val="1"/>
-          <w:numId w:val="1"/>
-        </w:numPr>
-      </w:pPr>
-      <w:proofErr w:type="spellStart"/>
-      <w:r>
-        <w:t>Provider_id</w:t>
-      </w:r>
-      <w:proofErr w:type="spellEnd"/>
-    </w:p>
-    <w:p>
-      <w:pPr>
-        <w:pStyle w:val="ListParagraph"/>
-        <w:numPr>
-          <w:ilvl w:val="2"/>
-          <w:numId w:val="1"/>
-        </w:numPr>
-      </w:pPr>
-      <w:r>
-        <w:lastRenderedPageBreak/>
         <w:t xml:space="preserve">Unique identifier for each provider. </w:t>
       </w:r>
     </w:p>
@@ -3329,15 +3334,7 @@
     </w:p>
     <w:p>
       <w:r>
-        <w:t xml:space="preserve">What questions </w:t>
-      </w:r>
-      <w:proofErr w:type="gramStart"/>
-      <w:r>
-        <w:t>I need</w:t>
-      </w:r>
-      <w:proofErr w:type="gramEnd"/>
-      <w:r>
-        <w:t xml:space="preserve"> to answer:</w:t>
+        <w:t>What questions I need to answer:</w:t>
       </w:r>
     </w:p>
     <w:p>
@@ -3362,15 +3359,7 @@
       </w:pPr>
       <w:r>
         <w:lastRenderedPageBreak/>
-        <w:t xml:space="preserve">Are the complaints coming from all pts in general, or </w:t>
-      </w:r>
-      <w:proofErr w:type="gramStart"/>
-      <w:r>
-        <w:t>is</w:t>
-      </w:r>
-      <w:proofErr w:type="gramEnd"/>
-      <w:r>
-        <w:t xml:space="preserve"> the</w:t>
+        <w:t>Are the complaints coming from all pts in general, or is the</w:t>
       </w:r>
       <w:r>
         <w:t>re</w:t>
@@ -5649,6 +5638,7 @@
   <w:style w:type="character" w:default="1" w:styleId="DefaultParagraphFont">
     <w:name w:val="Default Paragraph Font"/>
     <w:uiPriority w:val="1"/>
+    <w:semiHidden/>
     <w:unhideWhenUsed/>
   </w:style>
   <w:style w:type="table" w:default="1" w:styleId="TableNormal">

</xml_diff>

<commit_message>
Created excel validation, still in progress, and updated project documentation
</commit_message>
<xml_diff>
--- a/documentation/nicosys-healthcare-portfolio-documentation.docx
+++ b/documentation/nicosys-healthcare-portfolio-documentation.docx
@@ -147,6 +147,16 @@
         </w:rPr>
         <w:t>74.31 minutes</w:t>
       </w:r>
+      <w:r>
+        <w:rPr>
+          <w:b/>
+          <w:bCs/>
+        </w:rPr>
+        <w:t xml:space="preserve"> | </w:t>
+      </w:r>
+      <w:r>
+        <w:t>Validated in Excel</w:t>
+      </w:r>
     </w:p>
     <w:p>
       <w:r>
@@ -174,37 +184,47 @@
           <w:b/>
           <w:bCs/>
         </w:rPr>
-        <w:t xml:space="preserve"> </w:t>
+        <w:t xml:space="preserve"> (in SQL)</w:t>
+      </w:r>
+    </w:p>
+    <w:p>
+      <w:r>
+        <w:t>Expected:</w:t>
+      </w:r>
+    </w:p>
+    <w:p>
+      <w:pPr>
+        <w:numPr>
+          <w:ilvl w:val="0"/>
+          <w:numId w:val="8"/>
+        </w:numPr>
+      </w:pPr>
+      <w:r>
+        <w:t>Median = </w:t>
       </w:r>
       <w:r>
         <w:rPr>
           <w:b/>
           <w:bCs/>
         </w:rPr>
-        <w:t>(in SQL)</w:t>
-      </w:r>
-    </w:p>
-    <w:p>
-      <w:r>
-        <w:t>Expected:</w:t>
-      </w:r>
-    </w:p>
-    <w:p>
-      <w:pPr>
-        <w:numPr>
-          <w:ilvl w:val="0"/>
-          <w:numId w:val="8"/>
-        </w:numPr>
-      </w:pPr>
-      <w:r>
-        <w:t>Median = </w:t>
+        <w:t>67 minutes</w:t>
       </w:r>
       <w:r>
         <w:rPr>
           <w:b/>
           <w:bCs/>
         </w:rPr>
-        <w:t>67 minutes</w:t>
+        <w:t xml:space="preserve"> </w:t>
+      </w:r>
+      <w:r>
+        <w:rPr>
+          <w:b/>
+          <w:bCs/>
+        </w:rPr>
+        <w:t xml:space="preserve">| </w:t>
+      </w:r>
+      <w:r>
+        <w:t>Validated in Excel</w:t>
       </w:r>
     </w:p>
     <w:p>
@@ -238,6 +258,64 @@
           <w:b/>
           <w:bCs/>
         </w:rPr>
+        <w:t xml:space="preserve"> (in SQL)</w:t>
+      </w:r>
+    </w:p>
+    <w:p>
+      <w:r>
+        <w:t>Confirm:</w:t>
+      </w:r>
+    </w:p>
+    <w:p>
+      <w:pPr>
+        <w:numPr>
+          <w:ilvl w:val="0"/>
+          <w:numId w:val="9"/>
+        </w:numPr>
+      </w:pPr>
+      <w:r>
+        <w:t>Monday</w:t>
+      </w:r>
+    </w:p>
+    <w:p>
+      <w:pPr>
+        <w:numPr>
+          <w:ilvl w:val="0"/>
+          <w:numId w:val="9"/>
+        </w:numPr>
+      </w:pPr>
+      <w:r>
+        <w:t>Tuesday</w:t>
+      </w:r>
+    </w:p>
+    <w:p>
+      <w:pPr>
+        <w:numPr>
+          <w:ilvl w:val="0"/>
+          <w:numId w:val="9"/>
+        </w:numPr>
+      </w:pPr>
+      <w:r>
+        <w:t>Thursday</w:t>
+      </w:r>
+    </w:p>
+    <w:p>
+      <w:pPr>
+        <w:numPr>
+          <w:ilvl w:val="0"/>
+          <w:numId w:val="9"/>
+        </w:numPr>
+      </w:pPr>
+      <w:r>
+        <w:lastRenderedPageBreak/>
+        <w:t>Saturday</w:t>
+      </w:r>
+    </w:p>
+    <w:p>
+      <w:r>
+        <w:t>contain the longest observed wait times.</w:t>
+      </w:r>
+      <w:r>
         <w:t xml:space="preserve"> </w:t>
       </w:r>
       <w:r>
@@ -245,62 +323,7 @@
           <w:b/>
           <w:bCs/>
         </w:rPr>
-        <w:t>(in SQL)</w:t>
-      </w:r>
-    </w:p>
-    <w:p>
-      <w:r>
-        <w:t>Confirm:</w:t>
-      </w:r>
-    </w:p>
-    <w:p>
-      <w:pPr>
-        <w:numPr>
-          <w:ilvl w:val="0"/>
-          <w:numId w:val="9"/>
-        </w:numPr>
-      </w:pPr>
-      <w:r>
-        <w:t>Monday</w:t>
-      </w:r>
-    </w:p>
-    <w:p>
-      <w:pPr>
-        <w:numPr>
-          <w:ilvl w:val="0"/>
-          <w:numId w:val="9"/>
-        </w:numPr>
-      </w:pPr>
-      <w:r>
-        <w:t>Tuesday</w:t>
-      </w:r>
-    </w:p>
-    <w:p>
-      <w:pPr>
-        <w:numPr>
-          <w:ilvl w:val="0"/>
-          <w:numId w:val="9"/>
-        </w:numPr>
-      </w:pPr>
-      <w:r>
-        <w:t>Thursday</w:t>
-      </w:r>
-    </w:p>
-    <w:p>
-      <w:pPr>
-        <w:numPr>
-          <w:ilvl w:val="0"/>
-          <w:numId w:val="9"/>
-        </w:numPr>
-      </w:pPr>
-      <w:r>
-        <w:lastRenderedPageBreak/>
-        <w:t>Saturday</w:t>
-      </w:r>
-    </w:p>
-    <w:p>
-      <w:r>
-        <w:t>contain the longest observed wait times.</w:t>
+        <w:t>Validated in Excel</w:t>
       </w:r>
     </w:p>
     <w:p>
@@ -336,31 +359,34 @@
           <w:b/>
           <w:bCs/>
         </w:rPr>
-        <w:t>What hours of day see the most patients in the ER?</w:t>
+        <w:t xml:space="preserve">What hours of day see the most patients in the ER? </w:t>
       </w:r>
       <w:r>
         <w:rPr>
           <w:b/>
           <w:bCs/>
         </w:rPr>
-        <w:t xml:space="preserve"> </w:t>
+        <w:t>(in SQL)</w:t>
+      </w:r>
+    </w:p>
+    <w:p>
+      <w:r>
+        <w:t>Recreate your SQL grouping using a PivotTable.</w:t>
+      </w:r>
+    </w:p>
+    <w:p>
+      <w:r>
+        <w:t>Confirm the top hours</w:t>
+      </w:r>
+      <w:r>
+        <w:t xml:space="preserve">: </w:t>
       </w:r>
       <w:r>
         <w:rPr>
           <w:b/>
           <w:bCs/>
         </w:rPr>
-        <w:t>(in SQL)</w:t>
-      </w:r>
-    </w:p>
-    <w:p>
-      <w:r>
-        <w:t>Recreate your SQL grouping using a PivotTable.</w:t>
-      </w:r>
-    </w:p>
-    <w:p>
-      <w:r>
-        <w:t>Confirm the top hours.</w:t>
+        <w:t>Validated in Excel: 2, 21, 0</w:t>
       </w:r>
     </w:p>
     <w:p>
@@ -415,6 +441,9 @@
       <w:r>
         <w:t>Critical</w:t>
       </w:r>
+      <w:r>
+        <w:t>: 7.4</w:t>
+      </w:r>
     </w:p>
     <w:p>
       <w:pPr>
@@ -426,6 +455,9 @@
       <w:r>
         <w:t>High</w:t>
       </w:r>
+      <w:r>
+        <w:t>: 35.22</w:t>
+      </w:r>
     </w:p>
     <w:p>
       <w:pPr>
@@ -437,6 +469,9 @@
       <w:r>
         <w:t>Medium</w:t>
       </w:r>
+      <w:r>
+        <w:t>: 73.16</w:t>
+      </w:r>
     </w:p>
     <w:p>
       <w:pPr>
@@ -448,10 +483,26 @@
       <w:r>
         <w:t>Low</w:t>
       </w:r>
+      <w:r>
+        <w:t>: 108.84</w:t>
+      </w:r>
     </w:p>
     <w:p>
       <w:r>
         <w:t>Then compare average wait times.</w:t>
+      </w:r>
+      <w:r>
+        <w:t xml:space="preserve"> </w:t>
+      </w:r>
+      <w:r>
+        <w:rPr>
+          <w:b/>
+          <w:bCs/>
+        </w:rPr>
+        <w:t>Validated in Excel</w:t>
+      </w:r>
+      <w:r>
+        <w:t xml:space="preserve"> </w:t>
       </w:r>
     </w:p>
     <w:p>
@@ -526,6 +577,9 @@
       <w:r>
         <w:t>Average wait (Admitted)</w:t>
       </w:r>
+      <w:r>
+        <w:t>: 75.60</w:t>
+      </w:r>
     </w:p>
     <w:p>
       <w:pPr>
@@ -536,6 +590,9 @@
       </w:pPr>
       <w:r>
         <w:t>Average wait (Not admitted)</w:t>
+      </w:r>
+      <w:r>
+        <w:t>: 73.06</w:t>
       </w:r>
     </w:p>
     <w:p>
@@ -564,28 +621,15 @@
           <w:b/>
           <w:bCs/>
         </w:rPr>
-        <w:t xml:space="preserve">: For each severity level, what’s the amount of patients seen during peak times? In </w:t>
-      </w:r>
-      <w:proofErr w:type="spellStart"/>
-      <w:r>
-        <w:rPr>
-          <w:b/>
-          <w:bCs/>
-        </w:rPr>
-        <w:t>sql</w:t>
-      </w:r>
-      <w:proofErr w:type="spellEnd"/>
-      <w:r>
-        <w:rPr>
-          <w:b/>
-          <w:bCs/>
-        </w:rPr>
-        <w:t xml:space="preserve">. </w:t>
+        <w:t xml:space="preserve">: For each severity level, what’s the amount of patients seen during peak times? In sql. </w:t>
       </w:r>
     </w:p>
     <w:p>
       <w:r>
         <w:t>Verify your final statistic:</w:t>
+      </w:r>
+      <w:r>
+        <w:t xml:space="preserve"> Validated in Excel</w:t>
       </w:r>
     </w:p>
     <w:p>
@@ -672,15 +716,7 @@
     <w:p/>
     <w:p>
       <w:r>
-        <w:t xml:space="preserve">each worksheet will more accurately be 1 for each business question I answered. So refer back to the </w:t>
-      </w:r>
-      <w:proofErr w:type="spellStart"/>
-      <w:r>
-        <w:t>the</w:t>
-      </w:r>
-      <w:proofErr w:type="spellEnd"/>
-      <w:r>
-        <w:t xml:space="preserve"> questions I answered in Phase 2, and that should be the number of worksheets in Phase 3. </w:t>
+        <w:t>each worksheet will more accurately be 1 for each business question I answered. So refer back to the the questions I answered in Phase 2, and that should be the number of worksheets in Phase 3. </w:t>
       </w:r>
     </w:p>
     <w:p>
@@ -1126,13 +1162,8 @@
           <w:numId w:val="4"/>
         </w:numPr>
       </w:pPr>
-      <w:proofErr w:type="spellStart"/>
-      <w:r>
-        <w:t>Er_visits</w:t>
-      </w:r>
-      <w:proofErr w:type="spellEnd"/>
-      <w:r>
-        <w:t>:</w:t>
+      <w:r>
+        <w:t>Er_visits:</w:t>
       </w:r>
     </w:p>
     <w:p>
@@ -1143,13 +1174,8 @@
           <w:numId w:val="4"/>
         </w:numPr>
       </w:pPr>
-      <w:proofErr w:type="spellStart"/>
-      <w:r>
-        <w:t>Visit_id</w:t>
-      </w:r>
-      <w:proofErr w:type="spellEnd"/>
-      <w:r>
-        <w:t xml:space="preserve"> (PK)</w:t>
+      <w:r>
+        <w:t>Visit_id (PK)</w:t>
       </w:r>
     </w:p>
     <w:p>
@@ -1160,13 +1186,8 @@
           <w:numId w:val="4"/>
         </w:numPr>
       </w:pPr>
-      <w:proofErr w:type="spellStart"/>
-      <w:r>
-        <w:t>Patient_id</w:t>
-      </w:r>
-      <w:proofErr w:type="spellEnd"/>
-      <w:r>
-        <w:t xml:space="preserve"> (FK)</w:t>
+      <w:r>
+        <w:t>Patient_id (FK)</w:t>
       </w:r>
     </w:p>
     <w:p>
@@ -1192,13 +1213,8 @@
           <w:numId w:val="4"/>
         </w:numPr>
       </w:pPr>
-      <w:proofErr w:type="spellStart"/>
-      <w:r>
-        <w:t>Appointment_id</w:t>
-      </w:r>
-      <w:proofErr w:type="spellEnd"/>
-      <w:r>
-        <w:t xml:space="preserve"> (PK)</w:t>
+      <w:r>
+        <w:t>Appointment_id (PK)</w:t>
       </w:r>
     </w:p>
     <w:p>
@@ -1209,13 +1225,8 @@
           <w:numId w:val="4"/>
         </w:numPr>
       </w:pPr>
-      <w:proofErr w:type="spellStart"/>
-      <w:r>
-        <w:t>Patient_id</w:t>
-      </w:r>
-      <w:proofErr w:type="spellEnd"/>
-      <w:r>
-        <w:t xml:space="preserve"> (FK)</w:t>
+      <w:r>
+        <w:t>Patient_id (FK)</w:t>
       </w:r>
     </w:p>
     <w:p>
@@ -1226,13 +1237,8 @@
           <w:numId w:val="4"/>
         </w:numPr>
       </w:pPr>
-      <w:proofErr w:type="spellStart"/>
-      <w:r>
-        <w:t>Provider_id</w:t>
-      </w:r>
-      <w:proofErr w:type="spellEnd"/>
-      <w:r>
-        <w:t xml:space="preserve"> (FK</w:t>
+      <w:r>
+        <w:t>Provider_id (FK</w:t>
       </w:r>
       <w:r>
         <w:t>)</w:t>
@@ -1270,7 +1276,6 @@
           <w:numId w:val="4"/>
         </w:numPr>
       </w:pPr>
-      <w:proofErr w:type="spellStart"/>
       <w:r>
         <w:t>P</w:t>
       </w:r>
@@ -1281,11 +1286,7 @@
         <w:t>tient_</w:t>
       </w:r>
       <w:r>
-        <w:t>id</w:t>
-      </w:r>
-      <w:proofErr w:type="spellEnd"/>
-      <w:r>
-        <w:t xml:space="preserve"> </w:t>
+        <w:t xml:space="preserve">id </w:t>
       </w:r>
       <w:r>
         <w:t>(</w:t>
@@ -1326,7 +1327,6 @@
           <w:numId w:val="4"/>
         </w:numPr>
       </w:pPr>
-      <w:proofErr w:type="spellStart"/>
       <w:r>
         <w:t>P</w:t>
       </w:r>
@@ -1337,11 +1337,7 @@
         <w:t>ider</w:t>
       </w:r>
       <w:r>
-        <w:t>_id</w:t>
-      </w:r>
-      <w:proofErr w:type="spellEnd"/>
-      <w:r>
-        <w:t xml:space="preserve"> </w:t>
+        <w:t xml:space="preserve">_id </w:t>
       </w:r>
       <w:r>
         <w:t>(</w:t>
@@ -1376,7 +1372,6 @@
           <w:numId w:val="3"/>
         </w:numPr>
       </w:pPr>
-      <w:proofErr w:type="spellStart"/>
       <w:r>
         <w:t>Er</w:t>
       </w:r>
@@ -1387,11 +1382,7 @@
         <w:t>vi</w:t>
       </w:r>
       <w:r>
-        <w:t>sits</w:t>
-      </w:r>
-      <w:proofErr w:type="spellEnd"/>
-      <w:r>
-        <w:t xml:space="preserve"> </w:t>
+        <w:t xml:space="preserve">sits </w:t>
       </w:r>
       <w:r>
         <w:t>dat</w:t>
@@ -1662,7 +1653,6 @@
           <w:numId w:val="1"/>
         </w:numPr>
       </w:pPr>
-      <w:proofErr w:type="spellStart"/>
       <w:r>
         <w:t>E</w:t>
       </w:r>
@@ -1676,11 +1666,7 @@
         <w:t>vis</w:t>
       </w:r>
       <w:r>
-        <w:t>its</w:t>
-      </w:r>
-      <w:proofErr w:type="spellEnd"/>
-      <w:r>
-        <w:t>:</w:t>
+        <w:t>its:</w:t>
       </w:r>
     </w:p>
     <w:p>
@@ -1691,7 +1677,6 @@
           <w:numId w:val="1"/>
         </w:numPr>
       </w:pPr>
-      <w:proofErr w:type="spellStart"/>
       <w:r>
         <w:t>V</w:t>
       </w:r>
@@ -1701,7 +1686,6 @@
       <w:r>
         <w:t>sit_id</w:t>
       </w:r>
-      <w:proofErr w:type="spellEnd"/>
     </w:p>
     <w:p>
       <w:pPr>
@@ -1762,7 +1746,6 @@
           <w:numId w:val="1"/>
         </w:numPr>
       </w:pPr>
-      <w:proofErr w:type="spellStart"/>
       <w:r>
         <w:t>P</w:t>
       </w:r>
@@ -1775,7 +1758,6 @@
       <w:r>
         <w:t>_id</w:t>
       </w:r>
-      <w:proofErr w:type="spellEnd"/>
     </w:p>
     <w:p>
       <w:pPr>
@@ -1890,7 +1872,6 @@
           <w:numId w:val="1"/>
         </w:numPr>
       </w:pPr>
-      <w:proofErr w:type="spellStart"/>
       <w:r>
         <w:t>A</w:t>
       </w:r>
@@ -1903,7 +1884,6 @@
       <w:r>
         <w:t>date</w:t>
       </w:r>
-      <w:proofErr w:type="spellEnd"/>
     </w:p>
     <w:p>
       <w:pPr>
@@ -1946,7 +1926,6 @@
           <w:numId w:val="1"/>
         </w:numPr>
       </w:pPr>
-      <w:proofErr w:type="spellStart"/>
       <w:r>
         <w:t>Arrival</w:t>
       </w:r>
@@ -1956,7 +1935,6 @@
       <w:r>
         <w:t>day</w:t>
       </w:r>
-      <w:proofErr w:type="spellEnd"/>
     </w:p>
     <w:p>
       <w:pPr>
@@ -2002,7 +1980,6 @@
           <w:numId w:val="1"/>
         </w:numPr>
       </w:pPr>
-      <w:proofErr w:type="spellStart"/>
       <w:r>
         <w:t>Ar</w:t>
       </w:r>
@@ -2015,7 +1992,6 @@
       <w:r>
         <w:t>r</w:t>
       </w:r>
-      <w:proofErr w:type="spellEnd"/>
     </w:p>
     <w:p>
       <w:pPr>
@@ -2079,7 +2055,6 @@
           <w:numId w:val="1"/>
         </w:numPr>
       </w:pPr>
-      <w:proofErr w:type="spellStart"/>
       <w:r>
         <w:t>S</w:t>
       </w:r>
@@ -2095,7 +2070,6 @@
       <w:r>
         <w:t>el</w:t>
       </w:r>
-      <w:proofErr w:type="spellEnd"/>
     </w:p>
     <w:p>
       <w:pPr>
@@ -2147,7 +2121,6 @@
           <w:numId w:val="1"/>
         </w:numPr>
       </w:pPr>
-      <w:proofErr w:type="spellStart"/>
       <w:r>
         <w:t>Wait_tim</w:t>
       </w:r>
@@ -2160,7 +2133,6 @@
       <w:r>
         <w:t>s</w:t>
       </w:r>
-      <w:proofErr w:type="spellEnd"/>
     </w:p>
     <w:p>
       <w:pPr>
@@ -2212,7 +2184,6 @@
           <w:numId w:val="1"/>
         </w:numPr>
       </w:pPr>
-      <w:proofErr w:type="spellStart"/>
       <w:r>
         <w:t>L</w:t>
       </w:r>
@@ -2234,7 +2205,6 @@
       <w:r>
         <w:t>ours</w:t>
       </w:r>
-      <w:proofErr w:type="spellEnd"/>
     </w:p>
     <w:p>
       <w:pPr>
@@ -2293,15 +2263,7 @@
         </w:numPr>
       </w:pPr>
       <w:r>
-        <w:t>Hospital stay after admission is not included in this field (</w:t>
-      </w:r>
-      <w:proofErr w:type="spellStart"/>
-      <w:r>
-        <w:t>losh</w:t>
-      </w:r>
-      <w:proofErr w:type="spellEnd"/>
-      <w:r>
-        <w:t>)</w:t>
+        <w:t>Hospital stay after admission is not included in this field (losh)</w:t>
       </w:r>
     </w:p>
     <w:p>
@@ -2432,7 +2394,6 @@
           <w:numId w:val="1"/>
         </w:numPr>
       </w:pPr>
-      <w:proofErr w:type="spellStart"/>
       <w:r>
         <w:t>A</w:t>
       </w:r>
@@ -2445,7 +2406,6 @@
       <w:r>
         <w:t>_id</w:t>
       </w:r>
-      <w:proofErr w:type="spellEnd"/>
     </w:p>
     <w:p>
       <w:pPr>
@@ -2476,7 +2436,6 @@
           <w:numId w:val="1"/>
         </w:numPr>
       </w:pPr>
-      <w:proofErr w:type="spellStart"/>
       <w:r>
         <w:lastRenderedPageBreak/>
         <w:t>P</w:t>
@@ -2487,7 +2446,6 @@
       <w:r>
         <w:t>ent_id</w:t>
       </w:r>
-      <w:proofErr w:type="spellEnd"/>
     </w:p>
     <w:p>
       <w:pPr>
@@ -2515,7 +2473,6 @@
           <w:numId w:val="1"/>
         </w:numPr>
       </w:pPr>
-      <w:proofErr w:type="spellStart"/>
       <w:r>
         <w:t>P</w:t>
       </w:r>
@@ -2525,7 +2482,6 @@
       <w:r>
         <w:t>der_id</w:t>
       </w:r>
-      <w:proofErr w:type="spellEnd"/>
     </w:p>
     <w:p>
       <w:pPr>
@@ -2586,7 +2542,6 @@
           <w:numId w:val="1"/>
         </w:numPr>
       </w:pPr>
-      <w:proofErr w:type="spellStart"/>
       <w:r>
         <w:t>A</w:t>
       </w:r>
@@ -2599,7 +2554,6 @@
       <w:r>
         <w:t>_date</w:t>
       </w:r>
-      <w:proofErr w:type="spellEnd"/>
     </w:p>
     <w:p>
       <w:pPr>
@@ -2621,7 +2575,6 @@
           <w:numId w:val="1"/>
         </w:numPr>
       </w:pPr>
-      <w:proofErr w:type="spellStart"/>
       <w:r>
         <w:t>A</w:t>
       </w:r>
@@ -2634,7 +2587,6 @@
       <w:r>
         <w:t>_day</w:t>
       </w:r>
-      <w:proofErr w:type="spellEnd"/>
     </w:p>
     <w:p>
       <w:pPr>
@@ -2656,7 +2608,6 @@
           <w:numId w:val="1"/>
         </w:numPr>
       </w:pPr>
-      <w:proofErr w:type="spellStart"/>
       <w:r>
         <w:t>A</w:t>
       </w:r>
@@ -2669,7 +2620,6 @@
       <w:r>
         <w:t>pe</w:t>
       </w:r>
-      <w:proofErr w:type="spellEnd"/>
     </w:p>
     <w:p>
       <w:pPr>
@@ -2691,7 +2641,6 @@
           <w:numId w:val="1"/>
         </w:numPr>
       </w:pPr>
-      <w:proofErr w:type="spellStart"/>
       <w:r>
         <w:t>A</w:t>
       </w:r>
@@ -2710,7 +2659,6 @@
       <w:r>
         <w:t>tus</w:t>
       </w:r>
-      <w:proofErr w:type="spellEnd"/>
     </w:p>
     <w:p>
       <w:pPr>
@@ -2735,7 +2683,6 @@
           <w:numId w:val="1"/>
         </w:numPr>
       </w:pPr>
-      <w:proofErr w:type="spellStart"/>
       <w:r>
         <w:t>A</w:t>
       </w:r>
@@ -2760,7 +2707,6 @@
       <w:r>
         <w:t>utes</w:t>
       </w:r>
-      <w:proofErr w:type="spellEnd"/>
     </w:p>
     <w:p>
       <w:pPr>
@@ -2785,7 +2731,6 @@
           <w:numId w:val="1"/>
         </w:numPr>
       </w:pPr>
-      <w:proofErr w:type="spellStart"/>
       <w:r>
         <w:t>P</w:t>
       </w:r>
@@ -2819,7 +2764,6 @@
       <w:r>
         <w:t>e</w:t>
       </w:r>
-      <w:proofErr w:type="spellEnd"/>
       <w:r>
         <w:t xml:space="preserve"> </w:t>
       </w:r>
@@ -2841,13 +2785,8 @@
       <w:r>
         <w:t xml:space="preserve">1-5 </w:t>
       </w:r>
-      <w:proofErr w:type="spellStart"/>
-      <w:r>
-        <w:t>ignifying</w:t>
-      </w:r>
-      <w:proofErr w:type="spellEnd"/>
-      <w:r>
-        <w:t xml:space="preserve"> patient satisfaction</w:t>
+      <w:r>
+        <w:t>ignifying patient satisfaction</w:t>
       </w:r>
     </w:p>
     <w:p>
@@ -2900,11 +2839,9 @@
           <w:numId w:val="1"/>
         </w:numPr>
       </w:pPr>
-      <w:proofErr w:type="spellStart"/>
       <w:r>
         <w:t>Patient_id</w:t>
       </w:r>
-      <w:proofErr w:type="spellEnd"/>
     </w:p>
     <w:p>
       <w:pPr>
@@ -2926,11 +2863,9 @@
           <w:numId w:val="1"/>
         </w:numPr>
       </w:pPr>
-      <w:proofErr w:type="spellStart"/>
       <w:r>
         <w:t>Patient_name</w:t>
       </w:r>
-      <w:proofErr w:type="spellEnd"/>
     </w:p>
     <w:p>
       <w:pPr>
@@ -3048,12 +2983,10 @@
           <w:numId w:val="1"/>
         </w:numPr>
       </w:pPr>
-      <w:proofErr w:type="spellStart"/>
       <w:r>
         <w:lastRenderedPageBreak/>
         <w:t>Provider_id</w:t>
       </w:r>
-      <w:proofErr w:type="spellEnd"/>
     </w:p>
     <w:p>
       <w:pPr>
@@ -3100,26 +3033,10 @@
         </w:numPr>
       </w:pPr>
       <w:r>
-        <w:t>Jessica Allen (</w:t>
-      </w:r>
-      <w:proofErr w:type="spellStart"/>
-      <w:r>
-        <w:t>provider_id</w:t>
-      </w:r>
-      <w:proofErr w:type="spellEnd"/>
-      <w:r>
-        <w:t xml:space="preserve">: 19) is the only provider with </w:t>
-      </w:r>
-      <w:r>
-        <w:t xml:space="preserve">‘Dr.’ within the </w:t>
-      </w:r>
-      <w:proofErr w:type="spellStart"/>
-      <w:r>
-        <w:t>provider_name</w:t>
-      </w:r>
-      <w:proofErr w:type="spellEnd"/>
-      <w:r>
-        <w:t xml:space="preserve"> field. Should all records have Dr., or since she’s the only one, can we just remove </w:t>
+        <w:t xml:space="preserve">Jessica Allen (provider_id: 19) is the only provider with </w:t>
+      </w:r>
+      <w:r>
+        <w:t xml:space="preserve">‘Dr.’ within the provider_name field. Should all records have Dr., or since she’s the only one, can we just remove </w:t>
       </w:r>
       <w:r>
         <w:t xml:space="preserve">Dr. from her record. Since they are all providers, it is already assumed that they are doctors. </w:t>
@@ -3134,15 +3051,7 @@
         </w:numPr>
       </w:pPr>
       <w:r>
-        <w:t xml:space="preserve">I removed “Dr.” prefix from </w:t>
-      </w:r>
-      <w:proofErr w:type="spellStart"/>
-      <w:r>
-        <w:t>provider_id</w:t>
-      </w:r>
-      <w:proofErr w:type="spellEnd"/>
-      <w:r>
-        <w:t xml:space="preserve">: 19 record to standardize provider-name formatting. </w:t>
+        <w:t xml:space="preserve">I removed “Dr.” prefix from provider_id: 19 record to standardize provider-name formatting. </w:t>
       </w:r>
     </w:p>
     <w:p>
@@ -3198,11 +3107,9 @@
           <w:numId w:val="1"/>
         </w:numPr>
       </w:pPr>
-      <w:proofErr w:type="spellStart"/>
       <w:r>
         <w:t>Years_experience</w:t>
       </w:r>
-      <w:proofErr w:type="spellEnd"/>
     </w:p>
     <w:p>
       <w:pPr>

</xml_diff>

<commit_message>
Dashbaord Crated project file updated
</commit_message>
<xml_diff>
--- a/documentation/nicosys-healthcare-portfolio-documentation.docx
+++ b/documentation/nicosys-healthcare-portfolio-documentation.docx
@@ -7,22 +7,345 @@
         <w:rPr>
           <w:b/>
           <w:bCs/>
-          <w:u w:val="single"/>
-        </w:rPr>
-      </w:pPr>
-      <w:r>
+        </w:rPr>
+      </w:pPr>
+      <w:r>
+        <w:rPr>
+          <w:b/>
+          <w:bCs/>
+        </w:rPr>
+        <w:t>Phase 4 — Power BI</w:t>
+      </w:r>
+      <w:r>
+        <w:rPr>
+          <w:b/>
+          <w:bCs/>
+        </w:rPr>
+        <w:t xml:space="preserve"> </w:t>
+      </w:r>
+    </w:p>
+    <w:p>
+      <w:pPr>
+        <w:rPr>
+          <w:b/>
+          <w:bCs/>
+        </w:rPr>
+      </w:pPr>
+      <w:r>
+        <w:rPr>
+          <w:b/>
+          <w:bCs/>
+        </w:rPr>
+        <w:t xml:space="preserve">All I need to finish now are my sliders for dashboard. </w:t>
+      </w:r>
+    </w:p>
+    <w:p>
+      <w:pPr>
+        <w:rPr>
+          <w:b/>
+          <w:bCs/>
+        </w:rPr>
+      </w:pPr>
+      <w:r>
+        <w:rPr>
+          <w:b/>
+          <w:bCs/>
+        </w:rPr>
+        <w:t>KPI Cards</w:t>
+      </w:r>
+    </w:p>
+    <w:p>
+      <w:pPr>
+        <w:numPr>
+          <w:ilvl w:val="0"/>
+          <w:numId w:val="12"/>
+        </w:numPr>
+      </w:pPr>
+      <w:r>
+        <w:t>Average ER Wait Time (74 min)</w:t>
+      </w:r>
+    </w:p>
+    <w:p>
+      <w:pPr>
+        <w:numPr>
+          <w:ilvl w:val="0"/>
+          <w:numId w:val="12"/>
+        </w:numPr>
+      </w:pPr>
+      <w:r>
+        <w:t>Median ER Wait Time (67 min)</w:t>
+      </w:r>
+    </w:p>
+    <w:p>
+      <w:pPr>
+        <w:numPr>
+          <w:ilvl w:val="0"/>
+          <w:numId w:val="12"/>
+        </w:numPr>
+      </w:pPr>
+      <w:r>
+        <w:t>Average Wait Time (Admitted)</w:t>
+      </w:r>
+    </w:p>
+    <w:p>
+      <w:pPr>
+        <w:numPr>
+          <w:ilvl w:val="0"/>
+          <w:numId w:val="12"/>
+        </w:numPr>
+      </w:pPr>
+      <w:r>
+        <w:t>Average Wait Time (Not Admitted)</w:t>
+      </w:r>
+    </w:p>
+    <w:p>
+      <w:pPr>
+        <w:rPr>
+          <w:b/>
+          <w:bCs/>
+        </w:rPr>
+      </w:pPr>
+    </w:p>
+    <w:p>
+      <w:pPr>
+        <w:rPr>
+          <w:b/>
+          <w:bCs/>
+        </w:rPr>
+      </w:pPr>
+      <w:r>
+        <w:rPr>
+          <w:b/>
+          <w:bCs/>
+        </w:rPr>
+        <w:t>Visual 1</w:t>
+      </w:r>
+    </w:p>
+    <w:p>
+      <w:r>
+        <w:t>Longest Observed Wait Times by Day</w:t>
+      </w:r>
+    </w:p>
+    <w:p>
+      <w:r>
+        <w:t>This directly answers:</w:t>
+      </w:r>
+    </w:p>
+    <w:p>
+      <w:r>
+        <w:t>Which days have the longest wait times?</w:t>
+      </w:r>
+    </w:p>
+    <w:p>
+      <w:pPr>
+        <w:rPr>
+          <w:b/>
+          <w:bCs/>
+        </w:rPr>
+      </w:pPr>
+    </w:p>
+    <w:p>
+      <w:pPr>
+        <w:rPr>
+          <w:b/>
+          <w:bCs/>
+        </w:rPr>
+      </w:pPr>
+      <w:r>
+        <w:rPr>
+          <w:b/>
+          <w:bCs/>
+        </w:rPr>
+        <w:t>Visual 2</w:t>
+      </w:r>
+    </w:p>
+    <w:p>
+      <w:r>
+        <w:t>Patient Volume by Hour</w:t>
+      </w:r>
+    </w:p>
+    <w:p>
+      <w:r>
+        <w:t>Answers:</w:t>
+      </w:r>
+    </w:p>
+    <w:p>
+      <w:r>
+        <w:t>Which hours experience the highest patient volume?</w:t>
+      </w:r>
+    </w:p>
+    <w:p>
+      <w:pPr>
+        <w:rPr>
+          <w:b/>
+          <w:bCs/>
+        </w:rPr>
+      </w:pPr>
+    </w:p>
+    <w:p>
+      <w:pPr>
+        <w:rPr>
+          <w:b/>
+          <w:bCs/>
+        </w:rPr>
+      </w:pPr>
+      <w:r>
+        <w:rPr>
+          <w:b/>
+          <w:bCs/>
+        </w:rPr>
+        <w:t>Visual 3</w:t>
+      </w:r>
+    </w:p>
+    <w:p>
+      <w:r>
+        <w:t>Average Wait Time by Severity</w:t>
+      </w:r>
+    </w:p>
+    <w:p>
+      <w:r>
+        <w:t>Answers:</w:t>
+      </w:r>
+    </w:p>
+    <w:p>
+      <w:r>
+        <w:t>Does severity level affect wait time?</w:t>
+      </w:r>
+    </w:p>
+    <w:p>
+      <w:pPr>
+        <w:rPr>
+          <w:b/>
+          <w:bCs/>
+        </w:rPr>
+      </w:pPr>
+    </w:p>
+    <w:p>
+      <w:pPr>
+        <w:rPr>
+          <w:b/>
+          <w:bCs/>
+        </w:rPr>
+      </w:pPr>
+      <w:r>
+        <w:rPr>
+          <w:b/>
+          <w:bCs/>
+        </w:rPr>
+        <w:t>Visual 4</w:t>
+      </w:r>
+    </w:p>
+    <w:p>
+      <w:r>
+        <w:t>Peak Hour Severity Distribution</w:t>
+      </w:r>
+    </w:p>
+    <w:p>
+      <w:r>
+        <w:t>Shows:</w:t>
+      </w:r>
+    </w:p>
+    <w:p>
+      <w:pPr>
+        <w:numPr>
+          <w:ilvl w:val="0"/>
+          <w:numId w:val="13"/>
+        </w:numPr>
+      </w:pPr>
+      <w:r>
+        <w:lastRenderedPageBreak/>
+        <w:t>Medium = 39%</w:t>
+      </w:r>
+    </w:p>
+    <w:p>
+      <w:pPr>
+        <w:numPr>
+          <w:ilvl w:val="0"/>
+          <w:numId w:val="13"/>
+        </w:numPr>
+      </w:pPr>
+      <w:r>
+        <w:t>Low = 32%</w:t>
+      </w:r>
+    </w:p>
+    <w:p>
+      <w:pPr>
+        <w:numPr>
+          <w:ilvl w:val="0"/>
+          <w:numId w:val="13"/>
+        </w:numPr>
+      </w:pPr>
+      <w:r>
+        <w:t>High</w:t>
+      </w:r>
+    </w:p>
+    <w:p>
+      <w:pPr>
+        <w:numPr>
+          <w:ilvl w:val="0"/>
+          <w:numId w:val="13"/>
+        </w:numPr>
+      </w:pPr>
+      <w:r>
+        <w:t>Critical</w:t>
+      </w:r>
+    </w:p>
+    <w:p>
+      <w:r>
+        <w:t>Supporting your operational conclusion.</w:t>
+      </w:r>
+    </w:p>
+    <w:p>
+      <w:pPr>
+        <w:rPr>
+          <w:b/>
+          <w:bCs/>
+        </w:rPr>
+      </w:pPr>
+    </w:p>
+    <w:p>
+      <w:r>
+        <w:t>Executive Insights</w:t>
+      </w:r>
+    </w:p>
+    <w:p>
+      <w:r>
+        <w:t>A text box with something like:</w:t>
+      </w:r>
+    </w:p>
+    <w:p>
+      <w:r>
+        <w:t>• Average ER wait time is 74 minutes.</w:t>
+      </w:r>
+    </w:p>
+    <w:p>
+      <w:r>
+        <w:t>• Longest waits occur on Monday, Tuesday, Thursday, and Saturday.</w:t>
+      </w:r>
+    </w:p>
+    <w:p>
+      <w:r>
+        <w:t>• Peak patient arrivals occur at 00:00, 02:00, and 21:00.</w:t>
+      </w:r>
+    </w:p>
+    <w:p>
+      <w:r>
+        <w:t>• Low- and Medium-severity patients account for 71% of visits during peak periods.</w:t>
+      </w:r>
+    </w:p>
+    <w:p>
+      <w:r>
+        <w:t>• Operational capacity should be evaluated during peak demand periods.</w:t>
+      </w:r>
+    </w:p>
+    <w:p>
+      <w:pPr>
         <w:rPr>
           <w:b/>
           <w:bCs/>
           <w:u w:val="single"/>
         </w:rPr>
-        <w:t>Phase 3 — Excel Validation</w:t>
-      </w:r>
-    </w:p>
-    <w:p>
-      <w:r>
-        <w:t>Now we're entering a phase that many portfolio projects skip, but it's common in real analytics work.</w:t>
-      </w:r>
+      </w:pPr>
     </w:p>
     <w:p>
       <w:pPr>
@@ -38,6 +361,28 @@
           <w:bCs/>
           <w:u w:val="single"/>
         </w:rPr>
+        <w:t>Phase 3 — Excel Validation</w:t>
+      </w:r>
+    </w:p>
+    <w:p>
+      <w:r>
+        <w:t>Now we're entering a phase that many portfolio projects skip, but it's common in real analytics work.</w:t>
+      </w:r>
+    </w:p>
+    <w:p>
+      <w:pPr>
+        <w:rPr>
+          <w:b/>
+          <w:bCs/>
+          <w:u w:val="single"/>
+        </w:rPr>
+      </w:pPr>
+      <w:r>
+        <w:rPr>
+          <w:b/>
+          <w:bCs/>
+          <w:u w:val="single"/>
+        </w:rPr>
         <w:t>Stakeholder Request</w:t>
       </w:r>
     </w:p>
@@ -115,6 +460,7 @@
           <w:b/>
           <w:bCs/>
         </w:rPr>
+        <w:lastRenderedPageBreak/>
         <w:t>1. Average ER wait time</w:t>
       </w:r>
       <w:r>
@@ -214,14 +560,7 @@
           <w:b/>
           <w:bCs/>
         </w:rPr>
-        <w:t xml:space="preserve"> </w:t>
-      </w:r>
-      <w:r>
-        <w:rPr>
-          <w:b/>
-          <w:bCs/>
-        </w:rPr>
-        <w:t xml:space="preserve">| </w:t>
+        <w:t xml:space="preserve"> | </w:t>
       </w:r>
       <w:r>
         <w:t>Validated in Excel</w:t>
@@ -307,7 +646,6 @@
         </w:numPr>
       </w:pPr>
       <w:r>
-        <w:lastRenderedPageBreak/>
         <w:t>Saturday</w:t>
       </w:r>
     </w:p>
@@ -467,6 +805,7 @@
         </w:numPr>
       </w:pPr>
       <w:r>
+        <w:lastRenderedPageBreak/>
         <w:t>Medium</w:t>
       </w:r>
       <w:r>
@@ -621,7 +960,23 @@
           <w:b/>
           <w:bCs/>
         </w:rPr>
-        <w:t xml:space="preserve">: For each severity level, what’s the amount of patients seen during peak times? In sql. </w:t>
+        <w:t xml:space="preserve">: For each severity level, what’s the amount of patients seen during peak times? In </w:t>
+      </w:r>
+      <w:proofErr w:type="spellStart"/>
+      <w:r>
+        <w:rPr>
+          <w:b/>
+          <w:bCs/>
+        </w:rPr>
+        <w:t>sql</w:t>
+      </w:r>
+      <w:proofErr w:type="spellEnd"/>
+      <w:r>
+        <w:rPr>
+          <w:b/>
+          <w:bCs/>
+        </w:rPr>
+        <w:t xml:space="preserve">. </w:t>
       </w:r>
     </w:p>
     <w:p>
@@ -647,7 +1002,6 @@
     </w:p>
     <w:p>
       <w:r>
-        <w:lastRenderedPageBreak/>
         <w:pict w14:anchorId="089BDADF">
           <v:rect id="_x0000_i1032" style="width:0;height:1.5pt" o:hralign="center" o:hrstd="t" o:hr="t" fillcolor="#a0a0a0" stroked="f"/>
         </w:pict>
@@ -716,7 +1070,16 @@
     <w:p/>
     <w:p>
       <w:r>
-        <w:t>each worksheet will more accurately be 1 for each business question I answered. So refer back to the the questions I answered in Phase 2, and that should be the number of worksheets in Phase 3. </w:t>
+        <w:lastRenderedPageBreak/>
+        <w:t xml:space="preserve">each worksheet will more accurately be 1 for each business question I answered. So refer back to the </w:t>
+      </w:r>
+      <w:proofErr w:type="spellStart"/>
+      <w:r>
+        <w:t>the</w:t>
+      </w:r>
+      <w:proofErr w:type="spellEnd"/>
+      <w:r>
+        <w:t xml:space="preserve"> questions I answered in Phase 2, and that should be the number of worksheets in Phase 3. </w:t>
       </w:r>
     </w:p>
     <w:p>
@@ -881,7 +1244,6 @@
         </w:numPr>
       </w:pPr>
       <w:r>
-        <w:lastRenderedPageBreak/>
         <w:t xml:space="preserve">Yes, the lower the severity level, the longer a patient will wait. </w:t>
       </w:r>
       <w:r>
@@ -1021,6 +1383,7 @@
         </w:rPr>
       </w:pPr>
       <w:r>
+        <w:lastRenderedPageBreak/>
         <w:t xml:space="preserve"> </w:t>
       </w:r>
       <w:r>
@@ -1162,8 +1525,13 @@
           <w:numId w:val="4"/>
         </w:numPr>
       </w:pPr>
-      <w:r>
-        <w:t>Er_visits:</w:t>
+      <w:proofErr w:type="spellStart"/>
+      <w:r>
+        <w:t>Er_visits</w:t>
+      </w:r>
+      <w:proofErr w:type="spellEnd"/>
+      <w:r>
+        <w:t>:</w:t>
       </w:r>
     </w:p>
     <w:p>
@@ -1174,8 +1542,13 @@
           <w:numId w:val="4"/>
         </w:numPr>
       </w:pPr>
-      <w:r>
-        <w:t>Visit_id (PK)</w:t>
+      <w:proofErr w:type="spellStart"/>
+      <w:r>
+        <w:t>Visit_id</w:t>
+      </w:r>
+      <w:proofErr w:type="spellEnd"/>
+      <w:r>
+        <w:t xml:space="preserve"> (PK)</w:t>
       </w:r>
     </w:p>
     <w:p>
@@ -1186,8 +1559,13 @@
           <w:numId w:val="4"/>
         </w:numPr>
       </w:pPr>
-      <w:r>
-        <w:t>Patient_id (FK)</w:t>
+      <w:proofErr w:type="spellStart"/>
+      <w:r>
+        <w:t>Patient_id</w:t>
+      </w:r>
+      <w:proofErr w:type="spellEnd"/>
+      <w:r>
+        <w:t xml:space="preserve"> (FK)</w:t>
       </w:r>
     </w:p>
     <w:p>
@@ -1213,8 +1591,13 @@
           <w:numId w:val="4"/>
         </w:numPr>
       </w:pPr>
-      <w:r>
-        <w:t>Appointment_id (PK)</w:t>
+      <w:proofErr w:type="spellStart"/>
+      <w:r>
+        <w:t>Appointment_id</w:t>
+      </w:r>
+      <w:proofErr w:type="spellEnd"/>
+      <w:r>
+        <w:t xml:space="preserve"> (PK)</w:t>
       </w:r>
     </w:p>
     <w:p>
@@ -1225,8 +1608,13 @@
           <w:numId w:val="4"/>
         </w:numPr>
       </w:pPr>
-      <w:r>
-        <w:t>Patient_id (FK)</w:t>
+      <w:proofErr w:type="spellStart"/>
+      <w:r>
+        <w:t>Patient_id</w:t>
+      </w:r>
+      <w:proofErr w:type="spellEnd"/>
+      <w:r>
+        <w:t xml:space="preserve"> (FK)</w:t>
       </w:r>
     </w:p>
     <w:p>
@@ -1237,8 +1625,13 @@
           <w:numId w:val="4"/>
         </w:numPr>
       </w:pPr>
-      <w:r>
-        <w:t>Provider_id (FK</w:t>
+      <w:proofErr w:type="spellStart"/>
+      <w:r>
+        <w:t>Provider_id</w:t>
+      </w:r>
+      <w:proofErr w:type="spellEnd"/>
+      <w:r>
+        <w:t xml:space="preserve"> (FK</w:t>
       </w:r>
       <w:r>
         <w:t>)</w:t>
@@ -1276,6 +1669,7 @@
           <w:numId w:val="4"/>
         </w:numPr>
       </w:pPr>
+      <w:proofErr w:type="spellStart"/>
       <w:r>
         <w:t>P</w:t>
       </w:r>
@@ -1286,7 +1680,11 @@
         <w:t>tient_</w:t>
       </w:r>
       <w:r>
-        <w:t xml:space="preserve">id </w:t>
+        <w:t>id</w:t>
+      </w:r>
+      <w:proofErr w:type="spellEnd"/>
+      <w:r>
+        <w:t xml:space="preserve"> </w:t>
       </w:r>
       <w:r>
         <w:t>(</w:t>
@@ -1327,6 +1725,7 @@
           <w:numId w:val="4"/>
         </w:numPr>
       </w:pPr>
+      <w:proofErr w:type="spellStart"/>
       <w:r>
         <w:t>P</w:t>
       </w:r>
@@ -1337,7 +1736,11 @@
         <w:t>ider</w:t>
       </w:r>
       <w:r>
-        <w:t xml:space="preserve">_id </w:t>
+        <w:t>_id</w:t>
+      </w:r>
+      <w:proofErr w:type="spellEnd"/>
+      <w:r>
+        <w:t xml:space="preserve"> </w:t>
       </w:r>
       <w:r>
         <w:t>(</w:t>
@@ -1357,7 +1760,6 @@
     </w:p>
     <w:p>
       <w:r>
-        <w:lastRenderedPageBreak/>
         <w:t>4. Determine how the tables relate to one another</w:t>
       </w:r>
       <w:r>
@@ -1372,6 +1774,7 @@
           <w:numId w:val="3"/>
         </w:numPr>
       </w:pPr>
+      <w:proofErr w:type="spellStart"/>
       <w:r>
         <w:t>Er</w:t>
       </w:r>
@@ -1382,7 +1785,11 @@
         <w:t>vi</w:t>
       </w:r>
       <w:r>
-        <w:t xml:space="preserve">sits </w:t>
+        <w:t>sits</w:t>
+      </w:r>
+      <w:proofErr w:type="spellEnd"/>
+      <w:r>
+        <w:t xml:space="preserve"> </w:t>
       </w:r>
       <w:r>
         <w:t>dat</w:t>
@@ -1653,6 +2060,7 @@
           <w:numId w:val="1"/>
         </w:numPr>
       </w:pPr>
+      <w:proofErr w:type="spellStart"/>
       <w:r>
         <w:t>E</w:t>
       </w:r>
@@ -1666,7 +2074,11 @@
         <w:t>vis</w:t>
       </w:r>
       <w:r>
-        <w:t>its:</w:t>
+        <w:t>its</w:t>
+      </w:r>
+      <w:proofErr w:type="spellEnd"/>
+      <w:r>
+        <w:t>:</w:t>
       </w:r>
     </w:p>
     <w:p>
@@ -1677,6 +2089,7 @@
           <w:numId w:val="1"/>
         </w:numPr>
       </w:pPr>
+      <w:proofErr w:type="spellStart"/>
       <w:r>
         <w:t>V</w:t>
       </w:r>
@@ -1686,6 +2099,7 @@
       <w:r>
         <w:t>sit_id</w:t>
       </w:r>
+      <w:proofErr w:type="spellEnd"/>
     </w:p>
     <w:p>
       <w:pPr>
@@ -1746,6 +2160,7 @@
           <w:numId w:val="1"/>
         </w:numPr>
       </w:pPr>
+      <w:proofErr w:type="spellStart"/>
       <w:r>
         <w:t>P</w:t>
       </w:r>
@@ -1758,6 +2173,7 @@
       <w:r>
         <w:t>_id</w:t>
       </w:r>
+      <w:proofErr w:type="spellEnd"/>
     </w:p>
     <w:p>
       <w:pPr>
@@ -1872,6 +2288,7 @@
           <w:numId w:val="1"/>
         </w:numPr>
       </w:pPr>
+      <w:proofErr w:type="spellStart"/>
       <w:r>
         <w:t>A</w:t>
       </w:r>
@@ -1884,6 +2301,7 @@
       <w:r>
         <w:t>date</w:t>
       </w:r>
+      <w:proofErr w:type="spellEnd"/>
     </w:p>
     <w:p>
       <w:pPr>
@@ -1926,7 +2344,9 @@
           <w:numId w:val="1"/>
         </w:numPr>
       </w:pPr>
-      <w:r>
+      <w:proofErr w:type="spellStart"/>
+      <w:r>
+        <w:lastRenderedPageBreak/>
         <w:t>Arrival</w:t>
       </w:r>
       <w:r>
@@ -1935,6 +2355,7 @@
       <w:r>
         <w:t>day</w:t>
       </w:r>
+      <w:proofErr w:type="spellEnd"/>
     </w:p>
     <w:p>
       <w:pPr>
@@ -1980,6 +2401,7 @@
           <w:numId w:val="1"/>
         </w:numPr>
       </w:pPr>
+      <w:proofErr w:type="spellStart"/>
       <w:r>
         <w:t>Ar</w:t>
       </w:r>
@@ -1992,6 +2414,7 @@
       <w:r>
         <w:t>r</w:t>
       </w:r>
+      <w:proofErr w:type="spellEnd"/>
     </w:p>
     <w:p>
       <w:pPr>
@@ -2055,6 +2478,7 @@
           <w:numId w:val="1"/>
         </w:numPr>
       </w:pPr>
+      <w:proofErr w:type="spellStart"/>
       <w:r>
         <w:t>S</w:t>
       </w:r>
@@ -2070,6 +2494,7 @@
       <w:r>
         <w:t>el</w:t>
       </w:r>
+      <w:proofErr w:type="spellEnd"/>
     </w:p>
     <w:p>
       <w:pPr>
@@ -2121,6 +2546,7 @@
           <w:numId w:val="1"/>
         </w:numPr>
       </w:pPr>
+      <w:proofErr w:type="spellStart"/>
       <w:r>
         <w:t>Wait_tim</w:t>
       </w:r>
@@ -2133,6 +2559,7 @@
       <w:r>
         <w:t>s</w:t>
       </w:r>
+      <w:proofErr w:type="spellEnd"/>
     </w:p>
     <w:p>
       <w:pPr>
@@ -2184,6 +2611,7 @@
           <w:numId w:val="1"/>
         </w:numPr>
       </w:pPr>
+      <w:proofErr w:type="spellStart"/>
       <w:r>
         <w:t>L</w:t>
       </w:r>
@@ -2205,6 +2633,7 @@
       <w:r>
         <w:t>ours</w:t>
       </w:r>
+      <w:proofErr w:type="spellEnd"/>
     </w:p>
     <w:p>
       <w:pPr>
@@ -2263,7 +2692,15 @@
         </w:numPr>
       </w:pPr>
       <w:r>
-        <w:t>Hospital stay after admission is not included in this field (losh)</w:t>
+        <w:t>Hospital stay after admission is not included in this field (</w:t>
+      </w:r>
+      <w:proofErr w:type="spellStart"/>
+      <w:r>
+        <w:t>losh</w:t>
+      </w:r>
+      <w:proofErr w:type="spellEnd"/>
+      <w:r>
+        <w:t>)</w:t>
       </w:r>
     </w:p>
     <w:p>
@@ -2394,6 +2831,7 @@
           <w:numId w:val="1"/>
         </w:numPr>
       </w:pPr>
+      <w:proofErr w:type="spellStart"/>
       <w:r>
         <w:t>A</w:t>
       </w:r>
@@ -2406,6 +2844,7 @@
       <w:r>
         <w:t>_id</w:t>
       </w:r>
+      <w:proofErr w:type="spellEnd"/>
     </w:p>
     <w:p>
       <w:pPr>
@@ -2436,15 +2875,352 @@
           <w:numId w:val="1"/>
         </w:numPr>
       </w:pPr>
+      <w:proofErr w:type="spellStart"/>
+      <w:r>
+        <w:t>P</w:t>
+      </w:r>
+      <w:r>
+        <w:t>ati</w:t>
+      </w:r>
+      <w:r>
+        <w:t>ent_id</w:t>
+      </w:r>
+      <w:proofErr w:type="spellEnd"/>
+    </w:p>
+    <w:p>
+      <w:pPr>
+        <w:pStyle w:val="ListParagraph"/>
+        <w:numPr>
+          <w:ilvl w:val="2"/>
+          <w:numId w:val="1"/>
+        </w:numPr>
+      </w:pPr>
+      <w:r>
+        <w:t>An id, referencing a specific patient. The details of the p</w:t>
+      </w:r>
+      <w:r>
+        <w:t>atient</w:t>
+      </w:r>
+      <w:r>
+        <w:t xml:space="preserve"> will be found withing the patient dataset. </w:t>
+      </w:r>
+    </w:p>
+    <w:p>
+      <w:pPr>
+        <w:pStyle w:val="ListParagraph"/>
+        <w:numPr>
+          <w:ilvl w:val="1"/>
+          <w:numId w:val="1"/>
+        </w:numPr>
+      </w:pPr>
+      <w:proofErr w:type="spellStart"/>
+      <w:r>
+        <w:t>P</w:t>
+      </w:r>
+      <w:r>
+        <w:t>rovi</w:t>
+      </w:r>
+      <w:r>
+        <w:t>der_id</w:t>
+      </w:r>
+      <w:proofErr w:type="spellEnd"/>
+    </w:p>
+    <w:p>
+      <w:pPr>
+        <w:pStyle w:val="ListParagraph"/>
+        <w:numPr>
+          <w:ilvl w:val="2"/>
+          <w:numId w:val="1"/>
+        </w:numPr>
+      </w:pPr>
+      <w:r>
+        <w:t>An id</w:t>
+      </w:r>
+      <w:r>
+        <w:t>,</w:t>
+      </w:r>
+      <w:r>
+        <w:t xml:space="preserve"> referencing a specific provider. The details of the provider will be found withing the provider dataset. </w:t>
+      </w:r>
+    </w:p>
+    <w:p>
+      <w:pPr>
+        <w:pStyle w:val="ListParagraph"/>
+        <w:numPr>
+          <w:ilvl w:val="1"/>
+          <w:numId w:val="1"/>
+        </w:numPr>
+      </w:pPr>
+      <w:r>
+        <w:t>D</w:t>
+      </w:r>
+      <w:r>
+        <w:t>e</w:t>
+      </w:r>
+      <w:r>
+        <w:t>part</w:t>
+      </w:r>
+      <w:r>
+        <w:t>ment</w:t>
+      </w:r>
+    </w:p>
+    <w:p>
+      <w:pPr>
+        <w:pStyle w:val="ListParagraph"/>
+        <w:numPr>
+          <w:ilvl w:val="2"/>
+          <w:numId w:val="1"/>
+        </w:numPr>
+      </w:pPr>
+      <w:r>
+        <w:t xml:space="preserve">Shows which department the appointment is associated with. </w:t>
+      </w:r>
+    </w:p>
+    <w:p>
+      <w:pPr>
+        <w:pStyle w:val="ListParagraph"/>
+        <w:numPr>
+          <w:ilvl w:val="1"/>
+          <w:numId w:val="1"/>
+        </w:numPr>
+      </w:pPr>
+      <w:proofErr w:type="spellStart"/>
+      <w:r>
+        <w:t>A</w:t>
+      </w:r>
+      <w:r>
+        <w:t>ppo</w:t>
+      </w:r>
+      <w:r>
+        <w:t>intment</w:t>
+      </w:r>
+      <w:r>
+        <w:t>_date</w:t>
+      </w:r>
+      <w:proofErr w:type="spellEnd"/>
+    </w:p>
+    <w:p>
+      <w:pPr>
+        <w:pStyle w:val="ListParagraph"/>
+        <w:numPr>
+          <w:ilvl w:val="2"/>
+          <w:numId w:val="1"/>
+        </w:numPr>
+      </w:pPr>
+      <w:r>
+        <w:t xml:space="preserve">Shows the date of the appointment. </w:t>
+      </w:r>
+    </w:p>
+    <w:p>
+      <w:pPr>
+        <w:pStyle w:val="ListParagraph"/>
+        <w:numPr>
+          <w:ilvl w:val="1"/>
+          <w:numId w:val="1"/>
+        </w:numPr>
+      </w:pPr>
+      <w:proofErr w:type="spellStart"/>
+      <w:r>
+        <w:t>A</w:t>
+      </w:r>
+      <w:r>
+        <w:t>pp</w:t>
+      </w:r>
+      <w:r>
+        <w:t>ointment</w:t>
+      </w:r>
+      <w:r>
+        <w:t>_day</w:t>
+      </w:r>
+      <w:proofErr w:type="spellEnd"/>
+    </w:p>
+    <w:p>
+      <w:pPr>
+        <w:pStyle w:val="ListParagraph"/>
+        <w:numPr>
+          <w:ilvl w:val="2"/>
+          <w:numId w:val="1"/>
+        </w:numPr>
+      </w:pPr>
+      <w:r>
+        <w:t xml:space="preserve">Shows the day of the week the appointment was on. </w:t>
+      </w:r>
+    </w:p>
+    <w:p>
+      <w:pPr>
+        <w:pStyle w:val="ListParagraph"/>
+        <w:numPr>
+          <w:ilvl w:val="1"/>
+          <w:numId w:val="1"/>
+        </w:numPr>
+      </w:pPr>
+      <w:proofErr w:type="spellStart"/>
+      <w:r>
+        <w:t>A</w:t>
+      </w:r>
+      <w:r>
+        <w:t>ppoint</w:t>
+      </w:r>
+      <w:r>
+        <w:t>ment_ty</w:t>
+      </w:r>
+      <w:r>
+        <w:t>pe</w:t>
+      </w:r>
+      <w:proofErr w:type="spellEnd"/>
+    </w:p>
+    <w:p>
+      <w:pPr>
+        <w:pStyle w:val="ListParagraph"/>
+        <w:numPr>
+          <w:ilvl w:val="2"/>
+          <w:numId w:val="1"/>
+        </w:numPr>
+      </w:pPr>
+      <w:r>
+        <w:t xml:space="preserve">Defines the type of appointment </w:t>
+      </w:r>
+    </w:p>
+    <w:p>
+      <w:pPr>
+        <w:pStyle w:val="ListParagraph"/>
+        <w:numPr>
+          <w:ilvl w:val="1"/>
+          <w:numId w:val="1"/>
+        </w:numPr>
+      </w:pPr>
+      <w:proofErr w:type="spellStart"/>
+      <w:r>
+        <w:t>A</w:t>
+      </w:r>
+      <w:r>
+        <w:t>pp</w:t>
+      </w:r>
+      <w:r>
+        <w:t>ointment</w:t>
+      </w:r>
+      <w:r>
+        <w:t>_</w:t>
+      </w:r>
+      <w:r>
+        <w:t>sta</w:t>
+      </w:r>
+      <w:r>
+        <w:t>tus</w:t>
+      </w:r>
+      <w:proofErr w:type="spellEnd"/>
+    </w:p>
+    <w:p>
+      <w:pPr>
+        <w:pStyle w:val="ListParagraph"/>
+        <w:numPr>
+          <w:ilvl w:val="2"/>
+          <w:numId w:val="1"/>
+        </w:numPr>
+      </w:pPr>
+      <w:r>
+        <w:t xml:space="preserve">Defines an appointment as either </w:t>
+      </w:r>
+      <w:r>
+        <w:t>Completed, Cancelled, or no-show</w:t>
+      </w:r>
+    </w:p>
+    <w:p>
+      <w:pPr>
+        <w:pStyle w:val="ListParagraph"/>
+        <w:numPr>
+          <w:ilvl w:val="1"/>
+          <w:numId w:val="1"/>
+        </w:numPr>
+      </w:pPr>
+      <w:proofErr w:type="spellStart"/>
+      <w:r>
+        <w:t>A</w:t>
+      </w:r>
+      <w:r>
+        <w:t>pp</w:t>
+      </w:r>
+      <w:r>
+        <w:t>ointment</w:t>
+      </w:r>
+      <w:r>
+        <w:t>_dura</w:t>
+      </w:r>
+      <w:r>
+        <w:t>tion</w:t>
+      </w:r>
+      <w:r>
+        <w:t>_</w:t>
+      </w:r>
+      <w:r>
+        <w:t>min</w:t>
+      </w:r>
+      <w:r>
+        <w:t>utes</w:t>
+      </w:r>
+      <w:proofErr w:type="spellEnd"/>
+    </w:p>
+    <w:p>
+      <w:pPr>
+        <w:pStyle w:val="ListParagraph"/>
+        <w:numPr>
+          <w:ilvl w:val="2"/>
+          <w:numId w:val="1"/>
+        </w:numPr>
+      </w:pPr>
+      <w:r>
+        <w:t xml:space="preserve">Shows length of time </w:t>
+      </w:r>
+      <w:r>
+        <w:t xml:space="preserve">for the appointment </w:t>
+      </w:r>
+    </w:p>
+    <w:p>
+      <w:pPr>
+        <w:pStyle w:val="ListParagraph"/>
+        <w:numPr>
+          <w:ilvl w:val="1"/>
+          <w:numId w:val="1"/>
+        </w:numPr>
+      </w:pPr>
+      <w:proofErr w:type="spellStart"/>
       <w:r>
         <w:lastRenderedPageBreak/>
         <w:t>P</w:t>
       </w:r>
       <w:r>
-        <w:t>ati</w:t>
-      </w:r>
-      <w:r>
-        <w:t>ent_id</w:t>
+        <w:t>atient</w:t>
+      </w:r>
+      <w:r>
+        <w:t>_</w:t>
+      </w:r>
+      <w:r>
+        <w:t>s</w:t>
+      </w:r>
+      <w:r>
+        <w:t>a</w:t>
+      </w:r>
+      <w:r>
+        <w:t>tient_</w:t>
+      </w:r>
+      <w:r>
+        <w:t>satis</w:t>
+      </w:r>
+      <w:r>
+        <w:t>factio</w:t>
+      </w:r>
+      <w:r>
+        <w:t>n_</w:t>
+      </w:r>
+      <w:r>
+        <w:t>scor</w:t>
+      </w:r>
+      <w:r>
+        <w:t>e</w:t>
+      </w:r>
+      <w:proofErr w:type="spellEnd"/>
+      <w:r>
+        <w:t xml:space="preserve"> </w:t>
       </w:r>
     </w:p>
     <w:p>
@@ -2456,13 +3232,63 @@
         </w:numPr>
       </w:pPr>
       <w:r>
-        <w:t>An id, referencing a specific patient. The details of the p</w:t>
-      </w:r>
-      <w:r>
-        <w:t>atient</w:t>
-      </w:r>
-      <w:r>
-        <w:t xml:space="preserve"> will be found withing the patient dataset. </w:t>
+        <w:t xml:space="preserve">A </w:t>
+      </w:r>
+      <w:r>
+        <w:t xml:space="preserve">decimal scale from </w:t>
+      </w:r>
+      <w:r>
+        <w:t xml:space="preserve">1-5 </w:t>
+      </w:r>
+      <w:proofErr w:type="spellStart"/>
+      <w:r>
+        <w:t>ignifying</w:t>
+      </w:r>
+      <w:proofErr w:type="spellEnd"/>
+      <w:r>
+        <w:t xml:space="preserve"> patient satisfaction</w:t>
+      </w:r>
+    </w:p>
+    <w:p>
+      <w:pPr>
+        <w:pStyle w:val="ListParagraph"/>
+        <w:numPr>
+          <w:ilvl w:val="3"/>
+          <w:numId w:val="1"/>
+        </w:numPr>
+      </w:pPr>
+      <w:r>
+        <w:t xml:space="preserve">There </w:t>
+      </w:r>
+      <w:r>
+        <w:t>are</w:t>
+      </w:r>
+      <w:r>
+        <w:t xml:space="preserve"> about 1,000</w:t>
+      </w:r>
+      <w:r>
+        <w:t xml:space="preserve"> appointments with miss</w:t>
+      </w:r>
+      <w:r>
+        <w:t>ing</w:t>
+      </w:r>
+      <w:r>
+        <w:t xml:space="preserve"> satisfaction scores. </w:t>
+      </w:r>
+      <w:r>
+        <w:t xml:space="preserve">Null values will mean patients either canceled or no-show. </w:t>
+      </w:r>
+    </w:p>
+    <w:p>
+      <w:pPr>
+        <w:pStyle w:val="ListParagraph"/>
+        <w:numPr>
+          <w:ilvl w:val="0"/>
+          <w:numId w:val="1"/>
+        </w:numPr>
+      </w:pPr>
+      <w:r>
+        <w:t>Patients</w:t>
       </w:r>
     </w:p>
     <w:p>
@@ -2473,15 +3299,11 @@
           <w:numId w:val="1"/>
         </w:numPr>
       </w:pPr>
-      <w:r>
-        <w:t>P</w:t>
-      </w:r>
-      <w:r>
-        <w:t>rovi</w:t>
-      </w:r>
-      <w:r>
-        <w:t>der_id</w:t>
-      </w:r>
+      <w:proofErr w:type="spellStart"/>
+      <w:r>
+        <w:t>Patient_id</w:t>
+      </w:r>
+      <w:proofErr w:type="spellEnd"/>
     </w:p>
     <w:p>
       <w:pPr>
@@ -2492,13 +3314,7 @@
         </w:numPr>
       </w:pPr>
       <w:r>
-        <w:t>An id</w:t>
-      </w:r>
-      <w:r>
-        <w:t>,</w:t>
-      </w:r>
-      <w:r>
-        <w:t xml:space="preserve"> referencing a specific provider. The details of the provider will be found withing the provider dataset. </w:t>
+        <w:t xml:space="preserve">Unique identifier for each patient. </w:t>
       </w:r>
     </w:p>
     <w:p>
@@ -2509,18 +3325,11 @@
           <w:numId w:val="1"/>
         </w:numPr>
       </w:pPr>
-      <w:r>
-        <w:t>D</w:t>
-      </w:r>
-      <w:r>
-        <w:t>e</w:t>
-      </w:r>
-      <w:r>
-        <w:t>part</w:t>
-      </w:r>
-      <w:r>
-        <w:t>ment</w:t>
-      </w:r>
+      <w:proofErr w:type="spellStart"/>
+      <w:r>
+        <w:t>Patient_name</w:t>
+      </w:r>
+      <w:proofErr w:type="spellEnd"/>
     </w:p>
     <w:p>
       <w:pPr>
@@ -2531,7 +3340,19 @@
         </w:numPr>
       </w:pPr>
       <w:r>
-        <w:t xml:space="preserve">Shows which department the appointment is associated with. </w:t>
+        <w:t xml:space="preserve">First and last name of patient </w:t>
+      </w:r>
+    </w:p>
+    <w:p>
+      <w:pPr>
+        <w:pStyle w:val="ListParagraph"/>
+        <w:numPr>
+          <w:ilvl w:val="3"/>
+          <w:numId w:val="1"/>
+        </w:numPr>
+      </w:pPr>
+      <w:r>
+        <w:t xml:space="preserve">First and last name are within the same record. I’m wondering if it’s best to do splitting so that first and last name have their own fields.  </w:t>
       </w:r>
     </w:p>
     <w:p>
@@ -2543,16 +3364,7 @@
         </w:numPr>
       </w:pPr>
       <w:r>
-        <w:t>A</w:t>
-      </w:r>
-      <w:r>
-        <w:t>ppo</w:t>
-      </w:r>
-      <w:r>
-        <w:t>intment</w:t>
-      </w:r>
-      <w:r>
-        <w:t>_date</w:t>
+        <w:t>Age</w:t>
       </w:r>
     </w:p>
     <w:p>
@@ -2564,7 +3376,7 @@
         </w:numPr>
       </w:pPr>
       <w:r>
-        <w:t xml:space="preserve">Shows the date of the appointment. </w:t>
+        <w:t>Age in years of patient</w:t>
       </w:r>
     </w:p>
     <w:p>
@@ -2576,16 +3388,7 @@
         </w:numPr>
       </w:pPr>
       <w:r>
-        <w:t>A</w:t>
-      </w:r>
-      <w:r>
-        <w:t>pp</w:t>
-      </w:r>
-      <w:r>
-        <w:t>ointment</w:t>
-      </w:r>
-      <w:r>
-        <w:t>_day</w:t>
+        <w:t>Gender</w:t>
       </w:r>
     </w:p>
     <w:p>
@@ -2597,7 +3400,7 @@
         </w:numPr>
       </w:pPr>
       <w:r>
-        <w:t xml:space="preserve">Shows the day of the week the appointment was on. </w:t>
+        <w:t xml:space="preserve">Biological sex of patient </w:t>
       </w:r>
     </w:p>
     <w:p>
@@ -2609,16 +3412,7 @@
         </w:numPr>
       </w:pPr>
       <w:r>
-        <w:t>A</w:t>
-      </w:r>
-      <w:r>
-        <w:t>ppoint</w:t>
-      </w:r>
-      <w:r>
-        <w:t>ment_ty</w:t>
-      </w:r>
-      <w:r>
-        <w:t>pe</w:t>
+        <w:t xml:space="preserve">City </w:t>
       </w:r>
     </w:p>
     <w:p>
@@ -2630,7 +3424,19 @@
         </w:numPr>
       </w:pPr>
       <w:r>
-        <w:t xml:space="preserve">Defines the type of appointment </w:t>
+        <w:t xml:space="preserve">The city where the patient is from </w:t>
+      </w:r>
+    </w:p>
+    <w:p>
+      <w:pPr>
+        <w:pStyle w:val="ListParagraph"/>
+        <w:numPr>
+          <w:ilvl w:val="0"/>
+          <w:numId w:val="1"/>
+        </w:numPr>
+      </w:pPr>
+      <w:r>
+        <w:t>Providers</w:t>
       </w:r>
     </w:p>
     <w:p>
@@ -2641,24 +3447,11 @@
           <w:numId w:val="1"/>
         </w:numPr>
       </w:pPr>
-      <w:r>
-        <w:t>A</w:t>
-      </w:r>
-      <w:r>
-        <w:t>pp</w:t>
-      </w:r>
-      <w:r>
-        <w:t>ointment</w:t>
-      </w:r>
-      <w:r>
-        <w:t>_</w:t>
-      </w:r>
-      <w:r>
-        <w:t>sta</w:t>
-      </w:r>
-      <w:r>
-        <w:t>tus</w:t>
-      </w:r>
+      <w:proofErr w:type="spellStart"/>
+      <w:r>
+        <w:t>Provider_id</w:t>
+      </w:r>
+      <w:proofErr w:type="spellEnd"/>
     </w:p>
     <w:p>
       <w:pPr>
@@ -2669,10 +3462,7 @@
         </w:numPr>
       </w:pPr>
       <w:r>
-        <w:t xml:space="preserve">Defines an appointment as either </w:t>
-      </w:r>
-      <w:r>
-        <w:t>Completed, Cancelled, or no-show</w:t>
+        <w:t xml:space="preserve">Unique identifier for each provider. </w:t>
       </w:r>
     </w:p>
     <w:p>
@@ -2684,28 +3474,7 @@
         </w:numPr>
       </w:pPr>
       <w:r>
-        <w:t>A</w:t>
-      </w:r>
-      <w:r>
-        <w:t>pp</w:t>
-      </w:r>
-      <w:r>
-        <w:t>ointment</w:t>
-      </w:r>
-      <w:r>
-        <w:t>_dura</w:t>
-      </w:r>
-      <w:r>
-        <w:t>tion</w:t>
-      </w:r>
-      <w:r>
-        <w:t>_</w:t>
-      </w:r>
-      <w:r>
-        <w:t>min</w:t>
-      </w:r>
-      <w:r>
-        <w:t>utes</w:t>
+        <w:t>Provider_name</w:t>
       </w:r>
     </w:p>
     <w:p>
@@ -2717,10 +3486,82 @@
         </w:numPr>
       </w:pPr>
       <w:r>
-        <w:t xml:space="preserve">Shows length of time </w:t>
-      </w:r>
-      <w:r>
-        <w:t xml:space="preserve">for the appointment </w:t>
+        <w:t>First and last name of provider</w:t>
+      </w:r>
+    </w:p>
+    <w:p>
+      <w:pPr>
+        <w:pStyle w:val="ListParagraph"/>
+        <w:numPr>
+          <w:ilvl w:val="3"/>
+          <w:numId w:val="1"/>
+        </w:numPr>
+      </w:pPr>
+      <w:r>
+        <w:t>Jessica Allen (</w:t>
+      </w:r>
+      <w:proofErr w:type="spellStart"/>
+      <w:r>
+        <w:t>provider_id</w:t>
+      </w:r>
+      <w:proofErr w:type="spellEnd"/>
+      <w:r>
+        <w:t xml:space="preserve">: 19) is the only provider with </w:t>
+      </w:r>
+      <w:r>
+        <w:t xml:space="preserve">‘Dr.’ within the </w:t>
+      </w:r>
+      <w:proofErr w:type="spellStart"/>
+      <w:r>
+        <w:t>provider_name</w:t>
+      </w:r>
+      <w:proofErr w:type="spellEnd"/>
+      <w:r>
+        <w:t xml:space="preserve"> field. Should all records have Dr., or since she’s the only one, can we just remove </w:t>
+      </w:r>
+      <w:r>
+        <w:t xml:space="preserve">Dr. from her record. Since they are all providers, it is already assumed that they are doctors. </w:t>
+      </w:r>
+    </w:p>
+    <w:p>
+      <w:pPr>
+        <w:pStyle w:val="ListParagraph"/>
+        <w:numPr>
+          <w:ilvl w:val="4"/>
+          <w:numId w:val="1"/>
+        </w:numPr>
+      </w:pPr>
+      <w:r>
+        <w:t xml:space="preserve">I removed “Dr.” prefix from </w:t>
+      </w:r>
+      <w:proofErr w:type="spellStart"/>
+      <w:r>
+        <w:t>provider_id</w:t>
+      </w:r>
+      <w:proofErr w:type="spellEnd"/>
+      <w:r>
+        <w:t xml:space="preserve">: 19 record to standardize provider-name formatting. </w:t>
+      </w:r>
+    </w:p>
+    <w:p>
+      <w:pPr>
+        <w:pStyle w:val="ListParagraph"/>
+        <w:numPr>
+          <w:ilvl w:val="3"/>
+          <w:numId w:val="1"/>
+        </w:numPr>
+      </w:pPr>
+      <w:r>
+        <w:t xml:space="preserve">First </w:t>
+      </w:r>
+      <w:r>
+        <w:t xml:space="preserve">and last name are within the same record. I’m wondering if it’s best to do </w:t>
+      </w:r>
+      <w:r>
+        <w:t xml:space="preserve">splitting so that first and last name have their own fields. </w:t>
+      </w:r>
+      <w:r>
+        <w:t xml:space="preserve"> </w:t>
       </w:r>
     </w:p>
     <w:p>
@@ -2732,40 +3573,7 @@
         </w:numPr>
       </w:pPr>
       <w:r>
-        <w:t>P</w:t>
-      </w:r>
-      <w:r>
-        <w:t>atient</w:t>
-      </w:r>
-      <w:r>
-        <w:t>_</w:t>
-      </w:r>
-      <w:r>
-        <w:t>s</w:t>
-      </w:r>
-      <w:r>
-        <w:t>a</w:t>
-      </w:r>
-      <w:r>
-        <w:t>tient_</w:t>
-      </w:r>
-      <w:r>
-        <w:t>satis</w:t>
-      </w:r>
-      <w:r>
-        <w:t>factio</w:t>
-      </w:r>
-      <w:r>
-        <w:t>n_</w:t>
-      </w:r>
-      <w:r>
-        <w:t>scor</w:t>
-      </w:r>
-      <w:r>
-        <w:t>e</w:t>
-      </w:r>
-      <w:r>
-        <w:t xml:space="preserve"> </w:t>
+        <w:t>Department</w:t>
       </w:r>
     </w:p>
     <w:p>
@@ -2777,58 +3585,7 @@
         </w:numPr>
       </w:pPr>
       <w:r>
-        <w:t xml:space="preserve">A </w:t>
-      </w:r>
-      <w:r>
-        <w:t xml:space="preserve">decimal scale from </w:t>
-      </w:r>
-      <w:r>
-        <w:t xml:space="preserve">1-5 </w:t>
-      </w:r>
-      <w:r>
-        <w:t>ignifying patient satisfaction</w:t>
-      </w:r>
-    </w:p>
-    <w:p>
-      <w:pPr>
-        <w:pStyle w:val="ListParagraph"/>
-        <w:numPr>
-          <w:ilvl w:val="3"/>
-          <w:numId w:val="1"/>
-        </w:numPr>
-      </w:pPr>
-      <w:r>
-        <w:t xml:space="preserve">There </w:t>
-      </w:r>
-      <w:r>
-        <w:t>are</w:t>
-      </w:r>
-      <w:r>
-        <w:t xml:space="preserve"> about 1,000</w:t>
-      </w:r>
-      <w:r>
-        <w:t xml:space="preserve"> appointments with miss</w:t>
-      </w:r>
-      <w:r>
-        <w:t>ing</w:t>
-      </w:r>
-      <w:r>
-        <w:t xml:space="preserve"> satisfaction scores. </w:t>
-      </w:r>
-      <w:r>
-        <w:t xml:space="preserve">Null values will mean patients either canceled or no-show. </w:t>
-      </w:r>
-    </w:p>
-    <w:p>
-      <w:pPr>
-        <w:pStyle w:val="ListParagraph"/>
-        <w:numPr>
-          <w:ilvl w:val="0"/>
-          <w:numId w:val="1"/>
-        </w:numPr>
-      </w:pPr>
-      <w:r>
-        <w:t>Patients</w:t>
+        <w:t xml:space="preserve">The department which the provider is from </w:t>
       </w:r>
     </w:p>
     <w:p>
@@ -2839,9 +3596,11 @@
           <w:numId w:val="1"/>
         </w:numPr>
       </w:pPr>
-      <w:r>
-        <w:t>Patient_id</w:t>
-      </w:r>
+      <w:proofErr w:type="spellStart"/>
+      <w:r>
+        <w:t>Years_experience</w:t>
+      </w:r>
+      <w:proofErr w:type="spellEnd"/>
     </w:p>
     <w:p>
       <w:pPr>
@@ -2852,279 +3611,12 @@
         </w:numPr>
       </w:pPr>
       <w:r>
-        <w:t xml:space="preserve">Unique identifier for each patient. </w:t>
-      </w:r>
-    </w:p>
-    <w:p>
-      <w:pPr>
-        <w:pStyle w:val="ListParagraph"/>
-        <w:numPr>
-          <w:ilvl w:val="1"/>
-          <w:numId w:val="1"/>
-        </w:numPr>
-      </w:pPr>
-      <w:r>
-        <w:t>Patient_name</w:t>
-      </w:r>
-    </w:p>
-    <w:p>
-      <w:pPr>
-        <w:pStyle w:val="ListParagraph"/>
-        <w:numPr>
-          <w:ilvl w:val="2"/>
-          <w:numId w:val="1"/>
-        </w:numPr>
-      </w:pPr>
-      <w:r>
-        <w:t xml:space="preserve">First and last name of patient </w:t>
-      </w:r>
-    </w:p>
-    <w:p>
-      <w:pPr>
-        <w:pStyle w:val="ListParagraph"/>
-        <w:numPr>
-          <w:ilvl w:val="3"/>
-          <w:numId w:val="1"/>
-        </w:numPr>
-      </w:pPr>
-      <w:r>
-        <w:t xml:space="preserve">First and last name are within the same record. I’m wondering if it’s best to do splitting so that first and last name have their own fields.  </w:t>
-      </w:r>
-    </w:p>
-    <w:p>
-      <w:pPr>
-        <w:pStyle w:val="ListParagraph"/>
-        <w:numPr>
-          <w:ilvl w:val="1"/>
-          <w:numId w:val="1"/>
-        </w:numPr>
-      </w:pPr>
-      <w:r>
-        <w:t>Age</w:t>
-      </w:r>
-    </w:p>
-    <w:p>
-      <w:pPr>
-        <w:pStyle w:val="ListParagraph"/>
-        <w:numPr>
-          <w:ilvl w:val="2"/>
-          <w:numId w:val="1"/>
-        </w:numPr>
-      </w:pPr>
-      <w:r>
-        <w:t>Age in years of patient</w:t>
-      </w:r>
-    </w:p>
-    <w:p>
-      <w:pPr>
-        <w:pStyle w:val="ListParagraph"/>
-        <w:numPr>
-          <w:ilvl w:val="1"/>
-          <w:numId w:val="1"/>
-        </w:numPr>
-      </w:pPr>
-      <w:r>
-        <w:t>Gender</w:t>
-      </w:r>
-    </w:p>
-    <w:p>
-      <w:pPr>
-        <w:pStyle w:val="ListParagraph"/>
-        <w:numPr>
-          <w:ilvl w:val="2"/>
-          <w:numId w:val="1"/>
-        </w:numPr>
-      </w:pPr>
-      <w:r>
-        <w:t xml:space="preserve">Biological sex of patient </w:t>
-      </w:r>
-    </w:p>
-    <w:p>
-      <w:pPr>
-        <w:pStyle w:val="ListParagraph"/>
-        <w:numPr>
-          <w:ilvl w:val="1"/>
-          <w:numId w:val="1"/>
-        </w:numPr>
-      </w:pPr>
-      <w:r>
-        <w:t xml:space="preserve">City </w:t>
-      </w:r>
-    </w:p>
-    <w:p>
-      <w:pPr>
-        <w:pStyle w:val="ListParagraph"/>
-        <w:numPr>
-          <w:ilvl w:val="2"/>
-          <w:numId w:val="1"/>
-        </w:numPr>
-      </w:pPr>
-      <w:r>
-        <w:t xml:space="preserve">The city where the patient is from </w:t>
-      </w:r>
-    </w:p>
-    <w:p>
-      <w:pPr>
-        <w:pStyle w:val="ListParagraph"/>
-        <w:numPr>
-          <w:ilvl w:val="0"/>
-          <w:numId w:val="1"/>
-        </w:numPr>
-      </w:pPr>
-      <w:r>
-        <w:t>Providers</w:t>
-      </w:r>
-    </w:p>
-    <w:p>
-      <w:pPr>
-        <w:pStyle w:val="ListParagraph"/>
-        <w:numPr>
-          <w:ilvl w:val="1"/>
-          <w:numId w:val="1"/>
-        </w:numPr>
-      </w:pPr>
+        <w:t>Number of years as a provider</w:t>
+      </w:r>
+    </w:p>
+    <w:p>
       <w:r>
         <w:lastRenderedPageBreak/>
-        <w:t>Provider_id</w:t>
-      </w:r>
-    </w:p>
-    <w:p>
-      <w:pPr>
-        <w:pStyle w:val="ListParagraph"/>
-        <w:numPr>
-          <w:ilvl w:val="2"/>
-          <w:numId w:val="1"/>
-        </w:numPr>
-      </w:pPr>
-      <w:r>
-        <w:t xml:space="preserve">Unique identifier for each provider. </w:t>
-      </w:r>
-    </w:p>
-    <w:p>
-      <w:pPr>
-        <w:pStyle w:val="ListParagraph"/>
-        <w:numPr>
-          <w:ilvl w:val="1"/>
-          <w:numId w:val="1"/>
-        </w:numPr>
-      </w:pPr>
-      <w:r>
-        <w:t>Provider_name</w:t>
-      </w:r>
-    </w:p>
-    <w:p>
-      <w:pPr>
-        <w:pStyle w:val="ListParagraph"/>
-        <w:numPr>
-          <w:ilvl w:val="2"/>
-          <w:numId w:val="1"/>
-        </w:numPr>
-      </w:pPr>
-      <w:r>
-        <w:t>First and last name of provider</w:t>
-      </w:r>
-    </w:p>
-    <w:p>
-      <w:pPr>
-        <w:pStyle w:val="ListParagraph"/>
-        <w:numPr>
-          <w:ilvl w:val="3"/>
-          <w:numId w:val="1"/>
-        </w:numPr>
-      </w:pPr>
-      <w:r>
-        <w:t xml:space="preserve">Jessica Allen (provider_id: 19) is the only provider with </w:t>
-      </w:r>
-      <w:r>
-        <w:t xml:space="preserve">‘Dr.’ within the provider_name field. Should all records have Dr., or since she’s the only one, can we just remove </w:t>
-      </w:r>
-      <w:r>
-        <w:t xml:space="preserve">Dr. from her record. Since they are all providers, it is already assumed that they are doctors. </w:t>
-      </w:r>
-    </w:p>
-    <w:p>
-      <w:pPr>
-        <w:pStyle w:val="ListParagraph"/>
-        <w:numPr>
-          <w:ilvl w:val="4"/>
-          <w:numId w:val="1"/>
-        </w:numPr>
-      </w:pPr>
-      <w:r>
-        <w:t xml:space="preserve">I removed “Dr.” prefix from provider_id: 19 record to standardize provider-name formatting. </w:t>
-      </w:r>
-    </w:p>
-    <w:p>
-      <w:pPr>
-        <w:pStyle w:val="ListParagraph"/>
-        <w:numPr>
-          <w:ilvl w:val="3"/>
-          <w:numId w:val="1"/>
-        </w:numPr>
-      </w:pPr>
-      <w:r>
-        <w:t xml:space="preserve">First </w:t>
-      </w:r>
-      <w:r>
-        <w:t xml:space="preserve">and last name are within the same record. I’m wondering if it’s best to do </w:t>
-      </w:r>
-      <w:r>
-        <w:t xml:space="preserve">splitting so that first and last name have their own fields. </w:t>
-      </w:r>
-      <w:r>
-        <w:t xml:space="preserve"> </w:t>
-      </w:r>
-    </w:p>
-    <w:p>
-      <w:pPr>
-        <w:pStyle w:val="ListParagraph"/>
-        <w:numPr>
-          <w:ilvl w:val="1"/>
-          <w:numId w:val="1"/>
-        </w:numPr>
-      </w:pPr>
-      <w:r>
-        <w:t>Department</w:t>
-      </w:r>
-    </w:p>
-    <w:p>
-      <w:pPr>
-        <w:pStyle w:val="ListParagraph"/>
-        <w:numPr>
-          <w:ilvl w:val="2"/>
-          <w:numId w:val="1"/>
-        </w:numPr>
-      </w:pPr>
-      <w:r>
-        <w:t xml:space="preserve">The department which the provider is from </w:t>
-      </w:r>
-    </w:p>
-    <w:p>
-      <w:pPr>
-        <w:pStyle w:val="ListParagraph"/>
-        <w:numPr>
-          <w:ilvl w:val="1"/>
-          <w:numId w:val="1"/>
-        </w:numPr>
-      </w:pPr>
-      <w:r>
-        <w:t>Years_experience</w:t>
-      </w:r>
-    </w:p>
-    <w:p>
-      <w:pPr>
-        <w:pStyle w:val="ListParagraph"/>
-        <w:numPr>
-          <w:ilvl w:val="2"/>
-          <w:numId w:val="1"/>
-        </w:numPr>
-      </w:pPr>
-      <w:r>
-        <w:t>Number of years as a provider</w:t>
-      </w:r>
-    </w:p>
-    <w:p>
-      <w:r>
         <w:t>6. Look for missing values, duplicate records, inconsistent formatting, or anything unusual.</w:t>
       </w:r>
     </w:p>
@@ -3265,7 +3757,6 @@
         </w:numPr>
       </w:pPr>
       <w:r>
-        <w:lastRenderedPageBreak/>
         <w:t>Are the complaints coming from all pts in general, or is the</w:t>
       </w:r>
       <w:r>
@@ -3484,6 +3975,155 @@
 <file path=word/numbering.xml><?xml version="1.0" encoding="utf-8"?>
 <w:numbering xmlns:wpc="http://schemas.microsoft.com/office/word/2010/wordprocessingCanvas" xmlns:cx="http://schemas.microsoft.com/office/drawing/2014/chartex" xmlns:cx1="http://schemas.microsoft.com/office/drawing/2015/9/8/chartex" xmlns:cx2="http://schemas.microsoft.com/office/drawing/2015/10/21/chartex" xmlns:cx3="http://schemas.microsoft.com/office/drawing/2016/5/9/chartex" xmlns:cx4="http://schemas.microsoft.com/office/drawing/2016/5/10/chartex" xmlns:cx5="http://schemas.microsoft.com/office/drawing/2016/5/11/chartex" xmlns:cx6="http://schemas.microsoft.com/office/drawing/2016/5/12/chartex" xmlns:cx7="http://schemas.microsoft.com/office/drawing/2016/5/13/chartex" xmlns:cx8="http://schemas.microsoft.com/office/drawing/2016/5/14/chartex" xmlns:mc="http://schemas.openxmlformats.org/markup-compatibility/2006" xmlns:aink="http://schemas.microsoft.com/office/drawing/2016/ink" xmlns:am3d="http://schemas.microsoft.com/office/drawing/2017/model3d" xmlns:o="urn:schemas-microsoft-com:office:office" xmlns:oel="http://schemas.microsoft.com/office/2019/extlst" xmlns:r="http://schemas.openxmlformats.org/officeDocument/2006/relationships" xmlns:m="http://schemas.openxmlformats.org/officeDocument/2006/math" xmlns:v="urn:schemas-microsoft-com:vml" xmlns:wp14="http://schemas.microsoft.com/office/word/2010/wordprocessingDrawing" xmlns:wp="http://schemas.openxmlformats.org/drawingml/2006/wordprocessingDrawing" xmlns:w10="urn:schemas-microsoft-com:office:word" xmlns:w="http://schemas.openxmlformats.org/wordprocessingml/2006/main" xmlns:w14="http://schemas.microsoft.com/office/word/2010/wordml" xmlns:w15="http://schemas.microsoft.com/office/word/2012/wordml" xmlns:w16cex="http://schemas.microsoft.com/office/word/2018/wordml/cex" xmlns:w16cid="http://schemas.microsoft.com/office/word/2016/wordml/cid" xmlns:w16="http://schemas.microsoft.com/office/word/2018/wordml" xmlns:w16du="http://schemas.microsoft.com/office/word/2023/wordml/word16du" xmlns:w16sdtdh="http://schemas.microsoft.com/office/word/2020/wordml/sdtdatahash" xmlns:w16sdtfl="http://schemas.microsoft.com/office/word/2024/wordml/sdtformatlock" xmlns:w16se="http://schemas.microsoft.com/office/word/2015/wordml/symex" xmlns:wpg="http://schemas.microsoft.com/office/word/2010/wordprocessingGroup" xmlns:wpi="http://schemas.microsoft.com/office/word/2010/wordprocessingInk" xmlns:wne="http://schemas.microsoft.com/office/word/2006/wordml" xmlns:wps="http://schemas.microsoft.com/office/word/2010/wordprocessingShape" mc:Ignorable="w14 w15 w16se w16cid w16 w16cex w16sdtdh w16sdtfl w16du wp14">
   <w:abstractNum w:abstractNumId="0" w15:restartNumberingAfterBreak="0">
+    <w:nsid w:val="005E5575"/>
+    <w:multiLevelType w:val="multilevel"/>
+    <w:tmpl w:val="6C986DF8"/>
+    <w:lvl w:ilvl="0">
+      <w:start w:val="1"/>
+      <w:numFmt w:val="bullet"/>
+      <w:lvlText w:val=""/>
+      <w:lvlJc w:val="left"/>
+      <w:pPr>
+        <w:tabs>
+          <w:tab w:val="num" w:pos="720"/>
+        </w:tabs>
+        <w:ind w:left="720" w:hanging="360"/>
+      </w:pPr>
+      <w:rPr>
+        <w:rFonts w:ascii="Symbol" w:hAnsi="Symbol" w:hint="default"/>
+        <w:sz w:val="20"/>
+      </w:rPr>
+    </w:lvl>
+    <w:lvl w:ilvl="1" w:tentative="1">
+      <w:start w:val="1"/>
+      <w:numFmt w:val="bullet"/>
+      <w:lvlText w:val="o"/>
+      <w:lvlJc w:val="left"/>
+      <w:pPr>
+        <w:tabs>
+          <w:tab w:val="num" w:pos="1440"/>
+        </w:tabs>
+        <w:ind w:left="1440" w:hanging="360"/>
+      </w:pPr>
+      <w:rPr>
+        <w:rFonts w:ascii="Courier New" w:hAnsi="Courier New" w:hint="default"/>
+        <w:sz w:val="20"/>
+      </w:rPr>
+    </w:lvl>
+    <w:lvl w:ilvl="2" w:tentative="1">
+      <w:start w:val="1"/>
+      <w:numFmt w:val="bullet"/>
+      <w:lvlText w:val=""/>
+      <w:lvlJc w:val="left"/>
+      <w:pPr>
+        <w:tabs>
+          <w:tab w:val="num" w:pos="2160"/>
+        </w:tabs>
+        <w:ind w:left="2160" w:hanging="360"/>
+      </w:pPr>
+      <w:rPr>
+        <w:rFonts w:ascii="Wingdings" w:hAnsi="Wingdings" w:hint="default"/>
+        <w:sz w:val="20"/>
+      </w:rPr>
+    </w:lvl>
+    <w:lvl w:ilvl="3" w:tentative="1">
+      <w:start w:val="1"/>
+      <w:numFmt w:val="bullet"/>
+      <w:lvlText w:val=""/>
+      <w:lvlJc w:val="left"/>
+      <w:pPr>
+        <w:tabs>
+          <w:tab w:val="num" w:pos="2880"/>
+        </w:tabs>
+        <w:ind w:left="2880" w:hanging="360"/>
+      </w:pPr>
+      <w:rPr>
+        <w:rFonts w:ascii="Wingdings" w:hAnsi="Wingdings" w:hint="default"/>
+        <w:sz w:val="20"/>
+      </w:rPr>
+    </w:lvl>
+    <w:lvl w:ilvl="4" w:tentative="1">
+      <w:start w:val="1"/>
+      <w:numFmt w:val="bullet"/>
+      <w:lvlText w:val=""/>
+      <w:lvlJc w:val="left"/>
+      <w:pPr>
+        <w:tabs>
+          <w:tab w:val="num" w:pos="3600"/>
+        </w:tabs>
+        <w:ind w:left="3600" w:hanging="360"/>
+      </w:pPr>
+      <w:rPr>
+        <w:rFonts w:ascii="Wingdings" w:hAnsi="Wingdings" w:hint="default"/>
+        <w:sz w:val="20"/>
+      </w:rPr>
+    </w:lvl>
+    <w:lvl w:ilvl="5" w:tentative="1">
+      <w:start w:val="1"/>
+      <w:numFmt w:val="bullet"/>
+      <w:lvlText w:val=""/>
+      <w:lvlJc w:val="left"/>
+      <w:pPr>
+        <w:tabs>
+          <w:tab w:val="num" w:pos="4320"/>
+        </w:tabs>
+        <w:ind w:left="4320" w:hanging="360"/>
+      </w:pPr>
+      <w:rPr>
+        <w:rFonts w:ascii="Wingdings" w:hAnsi="Wingdings" w:hint="default"/>
+        <w:sz w:val="20"/>
+      </w:rPr>
+    </w:lvl>
+    <w:lvl w:ilvl="6" w:tentative="1">
+      <w:start w:val="1"/>
+      <w:numFmt w:val="bullet"/>
+      <w:lvlText w:val=""/>
+      <w:lvlJc w:val="left"/>
+      <w:pPr>
+        <w:tabs>
+          <w:tab w:val="num" w:pos="5040"/>
+        </w:tabs>
+        <w:ind w:left="5040" w:hanging="360"/>
+      </w:pPr>
+      <w:rPr>
+        <w:rFonts w:ascii="Wingdings" w:hAnsi="Wingdings" w:hint="default"/>
+        <w:sz w:val="20"/>
+      </w:rPr>
+    </w:lvl>
+    <w:lvl w:ilvl="7" w:tentative="1">
+      <w:start w:val="1"/>
+      <w:numFmt w:val="bullet"/>
+      <w:lvlText w:val=""/>
+      <w:lvlJc w:val="left"/>
+      <w:pPr>
+        <w:tabs>
+          <w:tab w:val="num" w:pos="5760"/>
+        </w:tabs>
+        <w:ind w:left="5760" w:hanging="360"/>
+      </w:pPr>
+      <w:rPr>
+        <w:rFonts w:ascii="Wingdings" w:hAnsi="Wingdings" w:hint="default"/>
+        <w:sz w:val="20"/>
+      </w:rPr>
+    </w:lvl>
+    <w:lvl w:ilvl="8" w:tentative="1">
+      <w:start w:val="1"/>
+      <w:numFmt w:val="bullet"/>
+      <w:lvlText w:val=""/>
+      <w:lvlJc w:val="left"/>
+      <w:pPr>
+        <w:tabs>
+          <w:tab w:val="num" w:pos="6480"/>
+        </w:tabs>
+        <w:ind w:left="6480" w:hanging="360"/>
+      </w:pPr>
+      <w:rPr>
+        <w:rFonts w:ascii="Wingdings" w:hAnsi="Wingdings" w:hint="default"/>
+        <w:sz w:val="20"/>
+      </w:rPr>
+    </w:lvl>
+  </w:abstractNum>
+  <w:abstractNum w:abstractNumId="1" w15:restartNumberingAfterBreak="0">
     <w:nsid w:val="01A36D7F"/>
     <w:multiLevelType w:val="hybridMultilevel"/>
     <w:tmpl w:val="D464793A"/>
@@ -3596,7 +4236,7 @@
       </w:rPr>
     </w:lvl>
   </w:abstractNum>
-  <w:abstractNum w:abstractNumId="1" w15:restartNumberingAfterBreak="0">
+  <w:abstractNum w:abstractNumId="2" w15:restartNumberingAfterBreak="0">
     <w:nsid w:val="02A35EE1"/>
     <w:multiLevelType w:val="multilevel"/>
     <w:tmpl w:val="391AFDAA"/>
@@ -3745,7 +4385,7 @@
       </w:rPr>
     </w:lvl>
   </w:abstractNum>
-  <w:abstractNum w:abstractNumId="2" w15:restartNumberingAfterBreak="0">
+  <w:abstractNum w:abstractNumId="3" w15:restartNumberingAfterBreak="0">
     <w:nsid w:val="06E949C4"/>
     <w:multiLevelType w:val="hybridMultilevel"/>
     <w:tmpl w:val="680ADCE0"/>
@@ -3858,7 +4498,7 @@
       </w:rPr>
     </w:lvl>
   </w:abstractNum>
-  <w:abstractNum w:abstractNumId="3" w15:restartNumberingAfterBreak="0">
+  <w:abstractNum w:abstractNumId="4" w15:restartNumberingAfterBreak="0">
     <w:nsid w:val="0B474D0A"/>
     <w:multiLevelType w:val="multilevel"/>
     <w:tmpl w:val="575CCD42"/>
@@ -4007,7 +4647,7 @@
       </w:rPr>
     </w:lvl>
   </w:abstractNum>
-  <w:abstractNum w:abstractNumId="4" w15:restartNumberingAfterBreak="0">
+  <w:abstractNum w:abstractNumId="5" w15:restartNumberingAfterBreak="0">
     <w:nsid w:val="18E125A7"/>
     <w:multiLevelType w:val="multilevel"/>
     <w:tmpl w:val="74A8F35E"/>
@@ -4156,7 +4796,156 @@
       </w:rPr>
     </w:lvl>
   </w:abstractNum>
-  <w:abstractNum w:abstractNumId="5" w15:restartNumberingAfterBreak="0">
+  <w:abstractNum w:abstractNumId="6" w15:restartNumberingAfterBreak="0">
+    <w:nsid w:val="31875706"/>
+    <w:multiLevelType w:val="multilevel"/>
+    <w:tmpl w:val="A3BE4B36"/>
+    <w:lvl w:ilvl="0">
+      <w:start w:val="1"/>
+      <w:numFmt w:val="bullet"/>
+      <w:lvlText w:val=""/>
+      <w:lvlJc w:val="left"/>
+      <w:pPr>
+        <w:tabs>
+          <w:tab w:val="num" w:pos="720"/>
+        </w:tabs>
+        <w:ind w:left="720" w:hanging="360"/>
+      </w:pPr>
+      <w:rPr>
+        <w:rFonts w:ascii="Symbol" w:hAnsi="Symbol" w:hint="default"/>
+        <w:sz w:val="20"/>
+      </w:rPr>
+    </w:lvl>
+    <w:lvl w:ilvl="1" w:tentative="1">
+      <w:start w:val="1"/>
+      <w:numFmt w:val="bullet"/>
+      <w:lvlText w:val="o"/>
+      <w:lvlJc w:val="left"/>
+      <w:pPr>
+        <w:tabs>
+          <w:tab w:val="num" w:pos="1440"/>
+        </w:tabs>
+        <w:ind w:left="1440" w:hanging="360"/>
+      </w:pPr>
+      <w:rPr>
+        <w:rFonts w:ascii="Courier New" w:hAnsi="Courier New" w:hint="default"/>
+        <w:sz w:val="20"/>
+      </w:rPr>
+    </w:lvl>
+    <w:lvl w:ilvl="2" w:tentative="1">
+      <w:start w:val="1"/>
+      <w:numFmt w:val="bullet"/>
+      <w:lvlText w:val=""/>
+      <w:lvlJc w:val="left"/>
+      <w:pPr>
+        <w:tabs>
+          <w:tab w:val="num" w:pos="2160"/>
+        </w:tabs>
+        <w:ind w:left="2160" w:hanging="360"/>
+      </w:pPr>
+      <w:rPr>
+        <w:rFonts w:ascii="Wingdings" w:hAnsi="Wingdings" w:hint="default"/>
+        <w:sz w:val="20"/>
+      </w:rPr>
+    </w:lvl>
+    <w:lvl w:ilvl="3" w:tentative="1">
+      <w:start w:val="1"/>
+      <w:numFmt w:val="bullet"/>
+      <w:lvlText w:val=""/>
+      <w:lvlJc w:val="left"/>
+      <w:pPr>
+        <w:tabs>
+          <w:tab w:val="num" w:pos="2880"/>
+        </w:tabs>
+        <w:ind w:left="2880" w:hanging="360"/>
+      </w:pPr>
+      <w:rPr>
+        <w:rFonts w:ascii="Wingdings" w:hAnsi="Wingdings" w:hint="default"/>
+        <w:sz w:val="20"/>
+      </w:rPr>
+    </w:lvl>
+    <w:lvl w:ilvl="4" w:tentative="1">
+      <w:start w:val="1"/>
+      <w:numFmt w:val="bullet"/>
+      <w:lvlText w:val=""/>
+      <w:lvlJc w:val="left"/>
+      <w:pPr>
+        <w:tabs>
+          <w:tab w:val="num" w:pos="3600"/>
+        </w:tabs>
+        <w:ind w:left="3600" w:hanging="360"/>
+      </w:pPr>
+      <w:rPr>
+        <w:rFonts w:ascii="Wingdings" w:hAnsi="Wingdings" w:hint="default"/>
+        <w:sz w:val="20"/>
+      </w:rPr>
+    </w:lvl>
+    <w:lvl w:ilvl="5" w:tentative="1">
+      <w:start w:val="1"/>
+      <w:numFmt w:val="bullet"/>
+      <w:lvlText w:val=""/>
+      <w:lvlJc w:val="left"/>
+      <w:pPr>
+        <w:tabs>
+          <w:tab w:val="num" w:pos="4320"/>
+        </w:tabs>
+        <w:ind w:left="4320" w:hanging="360"/>
+      </w:pPr>
+      <w:rPr>
+        <w:rFonts w:ascii="Wingdings" w:hAnsi="Wingdings" w:hint="default"/>
+        <w:sz w:val="20"/>
+      </w:rPr>
+    </w:lvl>
+    <w:lvl w:ilvl="6" w:tentative="1">
+      <w:start w:val="1"/>
+      <w:numFmt w:val="bullet"/>
+      <w:lvlText w:val=""/>
+      <w:lvlJc w:val="left"/>
+      <w:pPr>
+        <w:tabs>
+          <w:tab w:val="num" w:pos="5040"/>
+        </w:tabs>
+        <w:ind w:left="5040" w:hanging="360"/>
+      </w:pPr>
+      <w:rPr>
+        <w:rFonts w:ascii="Wingdings" w:hAnsi="Wingdings" w:hint="default"/>
+        <w:sz w:val="20"/>
+      </w:rPr>
+    </w:lvl>
+    <w:lvl w:ilvl="7" w:tentative="1">
+      <w:start w:val="1"/>
+      <w:numFmt w:val="bullet"/>
+      <w:lvlText w:val=""/>
+      <w:lvlJc w:val="left"/>
+      <w:pPr>
+        <w:tabs>
+          <w:tab w:val="num" w:pos="5760"/>
+        </w:tabs>
+        <w:ind w:left="5760" w:hanging="360"/>
+      </w:pPr>
+      <w:rPr>
+        <w:rFonts w:ascii="Wingdings" w:hAnsi="Wingdings" w:hint="default"/>
+        <w:sz w:val="20"/>
+      </w:rPr>
+    </w:lvl>
+    <w:lvl w:ilvl="8" w:tentative="1">
+      <w:start w:val="1"/>
+      <w:numFmt w:val="bullet"/>
+      <w:lvlText w:val=""/>
+      <w:lvlJc w:val="left"/>
+      <w:pPr>
+        <w:tabs>
+          <w:tab w:val="num" w:pos="6480"/>
+        </w:tabs>
+        <w:ind w:left="6480" w:hanging="360"/>
+      </w:pPr>
+      <w:rPr>
+        <w:rFonts w:ascii="Wingdings" w:hAnsi="Wingdings" w:hint="default"/>
+        <w:sz w:val="20"/>
+      </w:rPr>
+    </w:lvl>
+  </w:abstractNum>
+  <w:abstractNum w:abstractNumId="7" w15:restartNumberingAfterBreak="0">
     <w:nsid w:val="35390A28"/>
     <w:multiLevelType w:val="multilevel"/>
     <w:tmpl w:val="C722E3D0"/>
@@ -4305,7 +5094,7 @@
       </w:rPr>
     </w:lvl>
   </w:abstractNum>
-  <w:abstractNum w:abstractNumId="6" w15:restartNumberingAfterBreak="0">
+  <w:abstractNum w:abstractNumId="8" w15:restartNumberingAfterBreak="0">
     <w:nsid w:val="36EB21AD"/>
     <w:multiLevelType w:val="hybridMultilevel"/>
     <w:tmpl w:val="491E72A6"/>
@@ -4418,7 +5207,7 @@
       </w:rPr>
     </w:lvl>
   </w:abstractNum>
-  <w:abstractNum w:abstractNumId="7" w15:restartNumberingAfterBreak="0">
+  <w:abstractNum w:abstractNumId="9" w15:restartNumberingAfterBreak="0">
     <w:nsid w:val="40AE15A9"/>
     <w:multiLevelType w:val="multilevel"/>
     <w:tmpl w:val="4622D6A2"/>
@@ -4567,7 +5356,7 @@
       </w:rPr>
     </w:lvl>
   </w:abstractNum>
-  <w:abstractNum w:abstractNumId="8" w15:restartNumberingAfterBreak="0">
+  <w:abstractNum w:abstractNumId="10" w15:restartNumberingAfterBreak="0">
     <w:nsid w:val="4BB812BB"/>
     <w:multiLevelType w:val="hybridMultilevel"/>
     <w:tmpl w:val="B9BC14CC"/>
@@ -4680,7 +5469,7 @@
       </w:rPr>
     </w:lvl>
   </w:abstractNum>
-  <w:abstractNum w:abstractNumId="9" w15:restartNumberingAfterBreak="0">
+  <w:abstractNum w:abstractNumId="11" w15:restartNumberingAfterBreak="0">
     <w:nsid w:val="4FFE04F8"/>
     <w:multiLevelType w:val="hybridMultilevel"/>
     <w:tmpl w:val="90463A1C"/>
@@ -4793,7 +5582,7 @@
       </w:rPr>
     </w:lvl>
   </w:abstractNum>
-  <w:abstractNum w:abstractNumId="10" w15:restartNumberingAfterBreak="0">
+  <w:abstractNum w:abstractNumId="12" w15:restartNumberingAfterBreak="0">
     <w:nsid w:val="7EFD172B"/>
     <w:multiLevelType w:val="hybridMultilevel"/>
     <w:tmpl w:val="1FB48E52"/>
@@ -4907,37 +5696,43 @@
     </w:lvl>
   </w:abstractNum>
   <w:num w:numId="1" w16cid:durableId="1004630363">
-    <w:abstractNumId w:val="0"/>
+    <w:abstractNumId w:val="1"/>
   </w:num>
   <w:num w:numId="2" w16cid:durableId="1335840007">
+    <w:abstractNumId w:val="10"/>
+  </w:num>
+  <w:num w:numId="3" w16cid:durableId="2126342479">
     <w:abstractNumId w:val="8"/>
   </w:num>
-  <w:num w:numId="3" w16cid:durableId="2126342479">
+  <w:num w:numId="4" w16cid:durableId="2127002448">
+    <w:abstractNumId w:val="12"/>
+  </w:num>
+  <w:num w:numId="5" w16cid:durableId="823132378">
+    <w:abstractNumId w:val="11"/>
+  </w:num>
+  <w:num w:numId="6" w16cid:durableId="440222574">
+    <w:abstractNumId w:val="3"/>
+  </w:num>
+  <w:num w:numId="7" w16cid:durableId="27680315">
+    <w:abstractNumId w:val="5"/>
+  </w:num>
+  <w:num w:numId="8" w16cid:durableId="250510932">
+    <w:abstractNumId w:val="7"/>
+  </w:num>
+  <w:num w:numId="9" w16cid:durableId="1121608103">
+    <w:abstractNumId w:val="9"/>
+  </w:num>
+  <w:num w:numId="10" w16cid:durableId="88503663">
+    <w:abstractNumId w:val="4"/>
+  </w:num>
+  <w:num w:numId="11" w16cid:durableId="2135324667">
+    <w:abstractNumId w:val="2"/>
+  </w:num>
+  <w:num w:numId="12" w16cid:durableId="1885826308">
     <w:abstractNumId w:val="6"/>
   </w:num>
-  <w:num w:numId="4" w16cid:durableId="2127002448">
-    <w:abstractNumId w:val="10"/>
-  </w:num>
-  <w:num w:numId="5" w16cid:durableId="823132378">
-    <w:abstractNumId w:val="9"/>
-  </w:num>
-  <w:num w:numId="6" w16cid:durableId="440222574">
-    <w:abstractNumId w:val="2"/>
-  </w:num>
-  <w:num w:numId="7" w16cid:durableId="27680315">
-    <w:abstractNumId w:val="4"/>
-  </w:num>
-  <w:num w:numId="8" w16cid:durableId="250510932">
-    <w:abstractNumId w:val="5"/>
-  </w:num>
-  <w:num w:numId="9" w16cid:durableId="1121608103">
-    <w:abstractNumId w:val="7"/>
-  </w:num>
-  <w:num w:numId="10" w16cid:durableId="88503663">
-    <w:abstractNumId w:val="3"/>
-  </w:num>
-  <w:num w:numId="11" w16cid:durableId="2135324667">
-    <w:abstractNumId w:val="1"/>
+  <w:num w:numId="13" w16cid:durableId="770049283">
+    <w:abstractNumId w:val="0"/>
   </w:num>
 </w:numbering>
 </file>
@@ -5545,7 +6340,6 @@
   <w:style w:type="character" w:default="1" w:styleId="DefaultParagraphFont">
     <w:name w:val="Default Paragraph Font"/>
     <w:uiPriority w:val="1"/>
-    <w:semiHidden/>
     <w:unhideWhenUsed/>
   </w:style>
   <w:style w:type="table" w:default="1" w:styleId="TableNormal">

</xml_diff>

<commit_message>
Power BI dashboard complete w summary and updated project documentation
</commit_message>
<xml_diff>
--- a/documentation/nicosys-healthcare-portfolio-documentation.docx
+++ b/documentation/nicosys-healthcare-portfolio-documentation.docx
@@ -23,6 +23,37 @@
         </w:rPr>
         <w:t xml:space="preserve"> </w:t>
       </w:r>
+      <w:r>
+        <w:t>(Completed 7/18/2026)</w:t>
+      </w:r>
+    </w:p>
+    <w:p>
+      <w:r>
+        <w:t>Executive Summary</w:t>
+      </w:r>
+    </w:p>
+    <w:p>
+      <w:r>
+        <w:t>Business Findings</w:t>
+      </w:r>
+    </w:p>
+    <w:p>
+      <w:r>
+        <w:t xml:space="preserve">Recommendations </w:t>
+      </w:r>
+    </w:p>
+    <w:p>
+      <w:r>
+        <w:t xml:space="preserve">Business Impact </w:t>
+      </w:r>
+    </w:p>
+    <w:p>
+      <w:pPr>
+        <w:rPr>
+          <w:b/>
+          <w:bCs/>
+        </w:rPr>
+      </w:pPr>
     </w:p>
     <w:p>
       <w:pPr>
@@ -209,7 +240,16 @@
     </w:p>
     <w:p>
       <w:r>
-        <w:t>Does severity level affect wait time?</w:t>
+        <w:lastRenderedPageBreak/>
+        <w:t xml:space="preserve">Does severity level affect </w:t>
+      </w:r>
+      <w:proofErr w:type="gramStart"/>
+      <w:r>
+        <w:t>wait</w:t>
+      </w:r>
+      <w:proofErr w:type="gramEnd"/>
+      <w:r>
+        <w:t xml:space="preserve"> time?</w:t>
       </w:r>
     </w:p>
     <w:p>
@@ -253,7 +293,6 @@
         </w:numPr>
       </w:pPr>
       <w:r>
-        <w:lastRenderedPageBreak/>
         <w:t>Medium = 39%</w:t>
       </w:r>
     </w:p>
@@ -403,6 +442,7 @@
     </w:p>
     <w:p>
       <w:r>
+        <w:lastRenderedPageBreak/>
         <w:t>It's to verify that your SQL results are correct.</w:t>
       </w:r>
     </w:p>
@@ -460,7 +500,6 @@
           <w:b/>
           <w:bCs/>
         </w:rPr>
-        <w:lastRenderedPageBreak/>
         <w:t>1. Average ER wait time</w:t>
       </w:r>
       <w:r>
@@ -568,7 +607,15 @@
     </w:p>
     <w:p>
       <w:r>
-        <w:t>Use Excel's MEDIAN() function.</w:t>
+        <w:t>Use Excel's </w:t>
+      </w:r>
+      <w:proofErr w:type="gramStart"/>
+      <w:r>
+        <w:t>MEDIAN(</w:t>
+      </w:r>
+      <w:proofErr w:type="gramEnd"/>
+      <w:r>
+        <w:t>) function.</w:t>
       </w:r>
     </w:p>
     <w:p>
@@ -740,6 +787,7 @@
           <w:b/>
           <w:bCs/>
         </w:rPr>
+        <w:lastRenderedPageBreak/>
         <w:t>5. Wait time by severity</w:t>
       </w:r>
       <w:r>
@@ -754,7 +802,23 @@
           <w:b/>
           <w:bCs/>
         </w:rPr>
-        <w:t>What is the average wait time based off of severity level?</w:t>
+        <w:t xml:space="preserve">What is the average wait time based </w:t>
+      </w:r>
+      <w:proofErr w:type="gramStart"/>
+      <w:r>
+        <w:rPr>
+          <w:b/>
+          <w:bCs/>
+        </w:rPr>
+        <w:t>off of</w:t>
+      </w:r>
+      <w:proofErr w:type="gramEnd"/>
+      <w:r>
+        <w:rPr>
+          <w:b/>
+          <w:bCs/>
+        </w:rPr>
+        <w:t xml:space="preserve"> severity level?</w:t>
       </w:r>
       <w:r>
         <w:rPr>
@@ -805,7 +869,6 @@
         </w:numPr>
       </w:pPr>
       <w:r>
-        <w:lastRenderedPageBreak/>
         <w:t>Medium</w:t>
       </w:r>
       <w:r>
@@ -960,7 +1023,23 @@
           <w:b/>
           <w:bCs/>
         </w:rPr>
-        <w:t xml:space="preserve">: For each severity level, what’s the amount of patients seen during peak times? In </w:t>
+        <w:t xml:space="preserve">: For each severity level, what’s the </w:t>
+      </w:r>
+      <w:proofErr w:type="gramStart"/>
+      <w:r>
+        <w:rPr>
+          <w:b/>
+          <w:bCs/>
+        </w:rPr>
+        <w:t>amount</w:t>
+      </w:r>
+      <w:proofErr w:type="gramEnd"/>
+      <w:r>
+        <w:rPr>
+          <w:b/>
+          <w:bCs/>
+        </w:rPr>
+        <w:t xml:space="preserve"> of patients seen during peak times? In </w:t>
       </w:r>
       <w:proofErr w:type="spellStart"/>
       <w:r>
@@ -981,7 +1060,15 @@
     </w:p>
     <w:p>
       <w:r>
-        <w:t>Verify your final statistic:</w:t>
+        <w:t xml:space="preserve">Verify your final </w:t>
+      </w:r>
+      <w:proofErr w:type="gramStart"/>
+      <w:r>
+        <w:t>statistic</w:t>
+      </w:r>
+      <w:proofErr w:type="gramEnd"/>
+      <w:r>
+        <w:t>:</w:t>
       </w:r>
       <w:r>
         <w:t xml:space="preserve"> Validated in Excel</w:t>
@@ -1050,6 +1137,9 @@
       </w:r>
       <w:r>
         <w:br/>
+      </w:r>
+      <w:r>
+        <w:lastRenderedPageBreak/>
         <w:t>04_Severity_Analysis</w:t>
       </w:r>
       <w:r>
@@ -1069,15 +1159,40 @@
     </w:p>
     <w:p/>
     <w:p>
-      <w:r>
-        <w:lastRenderedPageBreak/>
-        <w:t xml:space="preserve">each worksheet will more accurately be 1 for each business question I answered. So refer back to the </w:t>
+      <w:proofErr w:type="gramStart"/>
+      <w:r>
+        <w:t>each</w:t>
+      </w:r>
+      <w:proofErr w:type="gramEnd"/>
+      <w:r>
+        <w:t xml:space="preserve"> worksheet will more accurately be 1 for each business question I answered. </w:t>
+      </w:r>
+      <w:proofErr w:type="gramStart"/>
+      <w:r>
+        <w:t>So</w:t>
+      </w:r>
+      <w:proofErr w:type="gramEnd"/>
+      <w:r>
+        <w:t xml:space="preserve"> </w:t>
+      </w:r>
+      <w:proofErr w:type="gramStart"/>
+      <w:r>
+        <w:t>refer back</w:t>
+      </w:r>
+      <w:proofErr w:type="gramEnd"/>
+      <w:r>
+        <w:t xml:space="preserve"> to </w:t>
+      </w:r>
+      <w:proofErr w:type="gramStart"/>
+      <w:r>
+        <w:t xml:space="preserve">the </w:t>
       </w:r>
       <w:proofErr w:type="spellStart"/>
       <w:r>
         <w:t>the</w:t>
       </w:r>
       <w:proofErr w:type="spellEnd"/>
+      <w:proofErr w:type="gramEnd"/>
       <w:r>
         <w:t xml:space="preserve"> questions I answered in Phase 2, and that should be the number of worksheets in Phase 3. </w:t>
       </w:r>
@@ -1139,7 +1254,15 @@
         </w:numPr>
       </w:pPr>
       <w:r>
-        <w:t>What is the average and median ER wait time?</w:t>
+        <w:t xml:space="preserve">What </w:t>
+      </w:r>
+      <w:proofErr w:type="gramStart"/>
+      <w:r>
+        <w:t>is</w:t>
+      </w:r>
+      <w:proofErr w:type="gramEnd"/>
+      <w:r>
+        <w:t xml:space="preserve"> the average and median ER wait time?</w:t>
       </w:r>
     </w:p>
     <w:p>
@@ -1163,7 +1286,15 @@
         </w:numPr>
       </w:pPr>
       <w:r>
-        <w:t xml:space="preserve">Median wait time is 67 minutes </w:t>
+        <w:t xml:space="preserve">Median </w:t>
+      </w:r>
+      <w:proofErr w:type="gramStart"/>
+      <w:r>
+        <w:t>wait</w:t>
+      </w:r>
+      <w:proofErr w:type="gramEnd"/>
+      <w:r>
+        <w:t xml:space="preserve"> time is 67 minutes </w:t>
       </w:r>
     </w:p>
     <w:p>
@@ -1214,10 +1345,18 @@
         </w:numPr>
       </w:pPr>
       <w:r>
-        <w:t>The top 3</w:t>
-      </w:r>
-      <w:r>
-        <w:t xml:space="preserve">, </w:t>
+        <w:t xml:space="preserve">The top </w:t>
+      </w:r>
+      <w:proofErr w:type="gramStart"/>
+      <w:r>
+        <w:t>3</w:t>
+      </w:r>
+      <w:r>
+        <w:t>,</w:t>
+      </w:r>
+      <w:proofErr w:type="gramEnd"/>
+      <w:r>
+        <w:t xml:space="preserve"> </w:t>
       </w:r>
       <w:r>
         <w:t xml:space="preserve">hours of the day that experienced the most patients in a day are 02:00 at 144 pts, 21:00 at 141 pts, and 0:00 with 140 pts. </w:t>
@@ -1255,8 +1394,21 @@
       <w:r>
         <w:t xml:space="preserve">than medium severity level patients. </w:t>
       </w:r>
-      <w:r>
-        <w:t xml:space="preserve">Also High severity level patients never get seen past 1 hour, and Critical severity level patients get seen between 1-15 minutes. </w:t>
+      <w:proofErr w:type="gramStart"/>
+      <w:r>
+        <w:t>Also</w:t>
+      </w:r>
+      <w:proofErr w:type="gramEnd"/>
+      <w:r>
+        <w:t xml:space="preserve"> High severity level patients never get seen past 1 hour, and Critical severity level patients get </w:t>
+      </w:r>
+      <w:proofErr w:type="gramStart"/>
+      <w:r>
+        <w:t>seen</w:t>
+      </w:r>
+      <w:proofErr w:type="gramEnd"/>
+      <w:r>
+        <w:t xml:space="preserve"> between 1-15 minutes. </w:t>
       </w:r>
     </w:p>
     <w:p>
@@ -1334,7 +1486,19 @@
         <w:t xml:space="preserve"> low severity.</w:t>
       </w:r>
       <w:r>
-        <w:t xml:space="preserve"> These patient groups accounted for the majority of ER visits during the busiest periods of the day.</w:t>
+        <w:t xml:space="preserve"> These patient groups accounted for </w:t>
+      </w:r>
+      <w:proofErr w:type="gramStart"/>
+      <w:r>
+        <w:t xml:space="preserve">the </w:t>
+      </w:r>
+      <w:r>
+        <w:lastRenderedPageBreak/>
+        <w:t>majority of</w:t>
+      </w:r>
+      <w:proofErr w:type="gramEnd"/>
+      <w:r>
+        <w:t xml:space="preserve"> ER visits during the busiest periods of the day.</w:t>
       </w:r>
       <w:r>
         <w:t xml:space="preserve"> </w:t>
@@ -1383,7 +1547,6 @@
         </w:rPr>
       </w:pPr>
       <w:r>
-        <w:lastRenderedPageBreak/>
         <w:t xml:space="preserve"> </w:t>
       </w:r>
       <w:r>
@@ -1514,7 +1677,15 @@
     </w:p>
     <w:p>
       <w:r>
-        <w:t>2. Identify the primary and Foreign key(s).</w:t>
+        <w:t xml:space="preserve">2. Identify the primary and </w:t>
+      </w:r>
+      <w:proofErr w:type="gramStart"/>
+      <w:r>
+        <w:t>Foreign</w:t>
+      </w:r>
+      <w:proofErr w:type="gramEnd"/>
+      <w:r>
+        <w:t xml:space="preserve"> key(s).</w:t>
       </w:r>
     </w:p>
     <w:p>
@@ -1809,6 +1980,7 @@
       <w:r>
         <w:t xml:space="preserve"> </w:t>
       </w:r>
+      <w:proofErr w:type="gramStart"/>
       <w:r>
         <w:t>patie</w:t>
       </w:r>
@@ -1816,7 +1988,11 @@
         <w:t>nt</w:t>
       </w:r>
       <w:r>
-        <w:t>s data</w:t>
+        <w:t>s</w:t>
+      </w:r>
+      <w:proofErr w:type="gramEnd"/>
+      <w:r>
+        <w:t xml:space="preserve"> data</w:t>
       </w:r>
       <w:r>
         <w:t>se</w:t>
@@ -2091,6 +2267,7 @@
       </w:pPr>
       <w:proofErr w:type="spellStart"/>
       <w:r>
+        <w:lastRenderedPageBreak/>
         <w:t>V</w:t>
       </w:r>
       <w:r>
@@ -2122,7 +2299,15 @@
         <w:t>imary ke</w:t>
       </w:r>
       <w:r>
-        <w:t>y to i</w:t>
+        <w:t xml:space="preserve">y </w:t>
+      </w:r>
+      <w:proofErr w:type="gramStart"/>
+      <w:r>
+        <w:t>to</w:t>
+      </w:r>
+      <w:proofErr w:type="gramEnd"/>
+      <w:r>
+        <w:t xml:space="preserve"> i</w:t>
       </w:r>
       <w:r>
         <w:t>d</w:t>
@@ -2264,12 +2449,14 @@
       <w:r>
         <w:t xml:space="preserve">the </w:t>
       </w:r>
+      <w:proofErr w:type="gramStart"/>
       <w:r>
         <w:t>pati</w:t>
       </w:r>
       <w:r>
         <w:t>ents</w:t>
       </w:r>
+      <w:proofErr w:type="gramEnd"/>
       <w:r>
         <w:t xml:space="preserve"> da</w:t>
       </w:r>
@@ -2346,7 +2533,6 @@
       </w:pPr>
       <w:proofErr w:type="spellStart"/>
       <w:r>
-        <w:lastRenderedPageBreak/>
         <w:t>Arrival</w:t>
       </w:r>
       <w:r>
@@ -2655,9 +2841,11 @@
       <w:r>
         <w:t xml:space="preserve"> </w:t>
       </w:r>
+      <w:proofErr w:type="gramStart"/>
       <w:r>
         <w:t>hour</w:t>
       </w:r>
+      <w:proofErr w:type="gramEnd"/>
       <w:r>
         <w:t>(s)</w:t>
       </w:r>
@@ -2763,7 +2951,11 @@
         <w:t>ay at t</w:t>
       </w:r>
       <w:r>
-        <w:t>he ho</w:t>
+        <w:t xml:space="preserve">he </w:t>
+      </w:r>
+      <w:proofErr w:type="gramStart"/>
+      <w:r>
+        <w:t>ho</w:t>
       </w:r>
       <w:r>
         <w:t>spital</w:t>
@@ -2772,7 +2964,11 @@
         <w:t xml:space="preserve">, </w:t>
       </w:r>
       <w:r>
-        <w:t xml:space="preserve"> or </w:t>
+        <w:t xml:space="preserve"> or</w:t>
+      </w:r>
+      <w:proofErr w:type="gramEnd"/>
+      <w:r>
+        <w:t xml:space="preserve"> </w:t>
       </w:r>
       <w:r>
         <w:t xml:space="preserve">No: </w:t>
@@ -3043,6 +3239,7 @@
         </w:numPr>
       </w:pPr>
       <w:r>
+        <w:lastRenderedPageBreak/>
         <w:t xml:space="preserve">Shows the day of the week the appointment was on. </w:t>
       </w:r>
     </w:p>
@@ -3185,7 +3382,6 @@
       </w:pPr>
       <w:proofErr w:type="spellStart"/>
       <w:r>
-        <w:lastRenderedPageBreak/>
         <w:t>P</w:t>
       </w:r>
       <w:r>
@@ -3276,7 +3472,15 @@
         <w:t xml:space="preserve"> satisfaction scores. </w:t>
       </w:r>
       <w:r>
-        <w:t xml:space="preserve">Null values will mean patients either canceled or no-show. </w:t>
+        <w:t xml:space="preserve">Null values will mean patients </w:t>
+      </w:r>
+      <w:proofErr w:type="gramStart"/>
+      <w:r>
+        <w:t>either</w:t>
+      </w:r>
+      <w:proofErr w:type="gramEnd"/>
+      <w:r>
+        <w:t xml:space="preserve"> canceled or no-show. </w:t>
       </w:r>
     </w:p>
     <w:p>
@@ -3552,6 +3756,7 @@
         </w:numPr>
       </w:pPr>
       <w:r>
+        <w:lastRenderedPageBreak/>
         <w:t xml:space="preserve">First </w:t>
       </w:r>
       <w:r>
@@ -3616,7 +3821,6 @@
     </w:p>
     <w:p>
       <w:r>
-        <w:lastRenderedPageBreak/>
         <w:t>6. Look for missing values, duplicate records, inconsistent formatting, or anything unusual.</w:t>
       </w:r>
     </w:p>
@@ -3733,7 +3937,15 @@
     </w:p>
     <w:p>
       <w:r>
-        <w:t>What questions I need to answer:</w:t>
+        <w:t xml:space="preserve">What questions </w:t>
+      </w:r>
+      <w:proofErr w:type="gramStart"/>
+      <w:r>
+        <w:t>I need</w:t>
+      </w:r>
+      <w:proofErr w:type="gramEnd"/>
+      <w:r>
+        <w:t xml:space="preserve"> to answer:</w:t>
       </w:r>
     </w:p>
     <w:p>
@@ -3757,7 +3969,15 @@
         </w:numPr>
       </w:pPr>
       <w:r>
-        <w:t>Are the complaints coming from all pts in general, or is the</w:t>
+        <w:t xml:space="preserve">Are the complaints coming from all pts in general, or </w:t>
+      </w:r>
+      <w:proofErr w:type="gramStart"/>
+      <w:r>
+        <w:t>is</w:t>
+      </w:r>
+      <w:proofErr w:type="gramEnd"/>
+      <w:r>
+        <w:t xml:space="preserve"> the</w:t>
       </w:r>
       <w:r>
         <w:t>re</w:t>
@@ -3843,6 +4063,7 @@
         </w:numPr>
       </w:pPr>
       <w:r>
+        <w:lastRenderedPageBreak/>
         <w:t>Patients</w:t>
       </w:r>
     </w:p>
@@ -6340,6 +6561,7 @@
   <w:style w:type="character" w:default="1" w:styleId="DefaultParagraphFont">
     <w:name w:val="Default Paragraph Font"/>
     <w:uiPriority w:val="1"/>
+    <w:semiHidden/>
     <w:unhideWhenUsed/>
   </w:style>
   <w:style w:type="table" w:default="1" w:styleId="TableNormal">

</xml_diff>

<commit_message>
created FU analysis SQL file and updated project documentation
</commit_message>
<xml_diff>
--- a/documentation/nicosys-healthcare-portfolio-documentation.docx
+++ b/documentation/nicosys-healthcare-portfolio-documentation.docx
@@ -14,6 +14,1396 @@
           <w:b/>
           <w:bCs/>
         </w:rPr>
+        <w:t xml:space="preserve">Phase 5 -   </w:t>
+      </w:r>
+    </w:p>
+    <w:p>
+      <w:r>
+        <w:t>Remember format for SQL:</w:t>
+      </w:r>
+    </w:p>
+    <w:p>
+      <w:r>
+        <w:t>Business Question</w:t>
+      </w:r>
+    </w:p>
+    <w:p>
+      <w:r>
+        <w:t>Stakeholder</w:t>
+      </w:r>
+    </w:p>
+    <w:p>
+      <w:r>
+        <w:t>Purpose</w:t>
+      </w:r>
+    </w:p>
+    <w:p>
+      <w:r>
+        <w:t>SQL Query</w:t>
+      </w:r>
+    </w:p>
+    <w:p>
+      <w:r>
+        <w:t>Findings:</w:t>
+      </w:r>
+    </w:p>
+    <w:p>
+      <w:r>
+        <w:t xml:space="preserve">Business Insight </w:t>
+      </w:r>
+    </w:p>
+    <w:p>
+      <w:pPr>
+        <w:rPr>
+          <w:i/>
+          <w:iCs/>
+        </w:rPr>
+      </w:pPr>
+    </w:p>
+    <w:p>
+      <w:r>
+        <w:rPr>
+          <w:i/>
+          <w:iCs/>
+        </w:rPr>
+        <w:t>Stakeholders:</w:t>
+      </w:r>
+      <w:r>
+        <w:rPr>
+          <w:b/>
+          <w:bCs/>
+        </w:rPr>
+        <w:t xml:space="preserve"> </w:t>
+      </w:r>
+      <w:r>
+        <w:t>Leadership of Valley Regional Medical Center</w:t>
+      </w:r>
+    </w:p>
+    <w:p>
+      <w:pPr>
+        <w:rPr>
+          <w:u w:val="single"/>
+        </w:rPr>
+      </w:pPr>
+      <w:r>
+        <w:rPr>
+          <w:u w:val="single"/>
+        </w:rPr>
+        <w:t>Business Question 1</w:t>
+      </w:r>
+    </w:p>
+    <w:p>
+      <w:r>
+        <w:t>Which patient age groups experience the longest Emergency Department wait times?</w:t>
+      </w:r>
+    </w:p>
+    <w:p>
+      <w:pPr>
+        <w:rPr>
+          <w:b/>
+          <w:bCs/>
+        </w:rPr>
+      </w:pPr>
+      <w:r>
+        <w:rPr>
+          <w:b/>
+          <w:bCs/>
+        </w:rPr>
+        <w:t>Tables</w:t>
+      </w:r>
+      <w:r>
+        <w:rPr>
+          <w:b/>
+          <w:bCs/>
+        </w:rPr>
+        <w:t xml:space="preserve"> to use:</w:t>
+      </w:r>
+    </w:p>
+    <w:p>
+      <w:pPr>
+        <w:numPr>
+          <w:ilvl w:val="0"/>
+          <w:numId w:val="14"/>
+        </w:numPr>
+      </w:pPr>
+      <w:proofErr w:type="spellStart"/>
+      <w:r>
+        <w:t>er_visits</w:t>
+      </w:r>
+      <w:proofErr w:type="spellEnd"/>
+    </w:p>
+    <w:p>
+      <w:pPr>
+        <w:numPr>
+          <w:ilvl w:val="1"/>
+          <w:numId w:val="14"/>
+        </w:numPr>
+      </w:pPr>
+      <w:proofErr w:type="spellStart"/>
+      <w:r>
+        <w:t>patient_id</w:t>
+      </w:r>
+      <w:proofErr w:type="spellEnd"/>
+      <w:r>
+        <w:t xml:space="preserve"> for the inner join</w:t>
+      </w:r>
+    </w:p>
+    <w:p>
+      <w:pPr>
+        <w:numPr>
+          <w:ilvl w:val="1"/>
+          <w:numId w:val="14"/>
+        </w:numPr>
+      </w:pPr>
+      <w:proofErr w:type="spellStart"/>
+      <w:r>
+        <w:t>wait_time_minutes</w:t>
+      </w:r>
+      <w:proofErr w:type="spellEnd"/>
+    </w:p>
+    <w:p>
+      <w:pPr>
+        <w:numPr>
+          <w:ilvl w:val="0"/>
+          <w:numId w:val="14"/>
+        </w:numPr>
+      </w:pPr>
+      <w:r>
+        <w:t>patients</w:t>
+      </w:r>
+    </w:p>
+    <w:p>
+      <w:pPr>
+        <w:numPr>
+          <w:ilvl w:val="1"/>
+          <w:numId w:val="14"/>
+        </w:numPr>
+      </w:pPr>
+      <w:proofErr w:type="spellStart"/>
+      <w:r>
+        <w:t>patient_id</w:t>
+      </w:r>
+      <w:proofErr w:type="spellEnd"/>
+      <w:r>
+        <w:t xml:space="preserve"> for the inner</w:t>
+      </w:r>
+    </w:p>
+    <w:p>
+      <w:pPr>
+        <w:numPr>
+          <w:ilvl w:val="1"/>
+          <w:numId w:val="14"/>
+        </w:numPr>
+      </w:pPr>
+      <w:r>
+        <w:t>age</w:t>
+      </w:r>
+    </w:p>
+    <w:p>
+      <w:pPr>
+        <w:rPr>
+          <w:b/>
+          <w:bCs/>
+        </w:rPr>
+      </w:pPr>
+    </w:p>
+    <w:p>
+      <w:r>
+        <w:t>Which tables will I need to join?</w:t>
+      </w:r>
+    </w:p>
+    <w:p>
+      <w:r>
+        <w:t>Which columns from each table do I expect to use?</w:t>
+      </w:r>
+    </w:p>
+    <w:p>
+      <w:r>
+        <w:t>/*</w:t>
+      </w:r>
+    </w:p>
+    <w:p>
+      <w:r>
+        <w:t xml:space="preserve">Business Question: </w:t>
+      </w:r>
+    </w:p>
+    <w:p>
+      <w:r>
+        <w:t>Which patient age groups experience the longest Emergency Department wait times?</w:t>
+      </w:r>
+    </w:p>
+    <w:p/>
+    <w:p>
+      <w:r>
+        <w:lastRenderedPageBreak/>
+        <w:t xml:space="preserve">Stakeholder: </w:t>
+      </w:r>
+    </w:p>
+    <w:p>
+      <w:proofErr w:type="spellStart"/>
+      <w:r>
+        <w:t>Leadershiop</w:t>
+      </w:r>
+      <w:proofErr w:type="spellEnd"/>
+      <w:r>
+        <w:t xml:space="preserve"> of Valley Regional Medical Center</w:t>
+      </w:r>
+    </w:p>
+    <w:p/>
+    <w:p>
+      <w:r>
+        <w:t>Purpose:</w:t>
+      </w:r>
+    </w:p>
+    <w:p>
+      <w:r>
+        <w:t xml:space="preserve">To see if specific age demographics experience longer wait times than others. </w:t>
+      </w:r>
+    </w:p>
+    <w:p/>
+    <w:p>
+      <w:r>
+        <w:t>SQL Query: (see below)</w:t>
+      </w:r>
+    </w:p>
+    <w:p/>
+    <w:p>
+      <w:r>
+        <w:t>Findings:</w:t>
+      </w:r>
+    </w:p>
+    <w:p>
+      <w:r>
+        <w:t xml:space="preserve">The age groups that </w:t>
+      </w:r>
+      <w:proofErr w:type="spellStart"/>
+      <w:r>
+        <w:t>expereince</w:t>
+      </w:r>
+      <w:proofErr w:type="spellEnd"/>
+      <w:r>
+        <w:t xml:space="preserve"> the longest ER wait times or 180 minutes are, 53, 61, 74, and 76. </w:t>
+      </w:r>
+    </w:p>
+    <w:p>
+      <w:r>
+        <w:t xml:space="preserve">However, the wait time that has the most </w:t>
+      </w:r>
+      <w:proofErr w:type="spellStart"/>
+      <w:r>
+        <w:t>occurance</w:t>
+      </w:r>
+      <w:proofErr w:type="spellEnd"/>
+      <w:r>
+        <w:t xml:space="preserve"> is 179 </w:t>
+      </w:r>
+      <w:proofErr w:type="spellStart"/>
+      <w:r>
+        <w:t>mintues</w:t>
+      </w:r>
+      <w:proofErr w:type="spellEnd"/>
+      <w:r>
+        <w:t xml:space="preserve">, being experienced by 8 age groups. This is double that of age groups experiencing 180 minute wait times. </w:t>
+      </w:r>
+    </w:p>
+    <w:p/>
+    <w:p>
+      <w:r>
+        <w:t>Business Insight:</w:t>
+      </w:r>
+    </w:p>
+    <w:p>
+      <w:r>
+        <w:t>The patient age group experiencing the longest Emergency Department wait times of 180 minutes are, 53, 61, 74, and 76. People who wait 179 minutes occur 50% more than those waiting 180 minutes.</w:t>
+      </w:r>
+    </w:p>
+    <w:p>
+      <w:r>
+        <w:t xml:space="preserve">Everyone waiting 180 minutes was over 50 years old. While those waiting 179 minutes have 71% patients over the age of 40, and 29% under 31 years old. </w:t>
+      </w:r>
+    </w:p>
+    <w:p/>
+    <w:p>
+      <w:r>
+        <w:t>*/</w:t>
+      </w:r>
+    </w:p>
+    <w:p>
+      <w:r>
+        <w:t>--Which patient age groups experience the longest Emergency Department wait times?</w:t>
+      </w:r>
+    </w:p>
+    <w:p>
+      <w:r>
+        <w:t>Select</w:t>
+      </w:r>
+    </w:p>
+    <w:p>
+      <w:r>
+        <w:tab/>
+        <w:t xml:space="preserve">  </w:t>
+      </w:r>
+      <w:proofErr w:type="spellStart"/>
+      <w:r>
+        <w:t>pts.age</w:t>
+      </w:r>
+      <w:proofErr w:type="spellEnd"/>
+    </w:p>
+    <w:p>
+      <w:r>
+        <w:tab/>
+        <w:t>, max(</w:t>
+      </w:r>
+      <w:proofErr w:type="spellStart"/>
+      <w:r>
+        <w:t>wait_time_minutes</w:t>
+      </w:r>
+      <w:proofErr w:type="spellEnd"/>
+      <w:r>
+        <w:t xml:space="preserve">) </w:t>
+      </w:r>
+      <w:proofErr w:type="spellStart"/>
+      <w:r>
+        <w:t>max_wait_time_minutes</w:t>
+      </w:r>
+      <w:proofErr w:type="spellEnd"/>
+    </w:p>
+    <w:p>
+      <w:r>
+        <w:t>From</w:t>
+      </w:r>
+    </w:p>
+    <w:p>
+      <w:r>
+        <w:lastRenderedPageBreak/>
+        <w:tab/>
+      </w:r>
+      <w:proofErr w:type="spellStart"/>
+      <w:r>
+        <w:t>er_visits</w:t>
+      </w:r>
+      <w:proofErr w:type="spellEnd"/>
+      <w:r>
+        <w:t xml:space="preserve"> er</w:t>
+      </w:r>
+    </w:p>
+    <w:p>
+      <w:r>
+        <w:tab/>
+      </w:r>
+      <w:r>
+        <w:tab/>
+        <w:t>inner join patients pts</w:t>
+      </w:r>
+    </w:p>
+    <w:p>
+      <w:r>
+        <w:tab/>
+      </w:r>
+      <w:r>
+        <w:tab/>
+      </w:r>
+      <w:r>
+        <w:tab/>
+        <w:t xml:space="preserve">on </w:t>
+      </w:r>
+      <w:proofErr w:type="spellStart"/>
+      <w:r>
+        <w:t>er.patient_id</w:t>
+      </w:r>
+      <w:proofErr w:type="spellEnd"/>
+      <w:r>
+        <w:t>=</w:t>
+      </w:r>
+      <w:proofErr w:type="spellStart"/>
+      <w:r>
+        <w:t>pts.patient_id</w:t>
+      </w:r>
+      <w:proofErr w:type="spellEnd"/>
+    </w:p>
+    <w:p>
+      <w:r>
+        <w:t>Group By</w:t>
+      </w:r>
+    </w:p>
+    <w:p>
+      <w:r>
+        <w:tab/>
+      </w:r>
+      <w:proofErr w:type="spellStart"/>
+      <w:r>
+        <w:t>pts.age</w:t>
+      </w:r>
+      <w:proofErr w:type="spellEnd"/>
+    </w:p>
+    <w:p>
+      <w:r>
+        <w:t>Order By</w:t>
+      </w:r>
+    </w:p>
+    <w:p>
+      <w:r>
+        <w:tab/>
+      </w:r>
+      <w:proofErr w:type="spellStart"/>
+      <w:r>
+        <w:t>max_wait_time_minutes</w:t>
+      </w:r>
+      <w:proofErr w:type="spellEnd"/>
+      <w:r>
+        <w:t xml:space="preserve"> desc</w:t>
+      </w:r>
+    </w:p>
+    <w:p>
+      <w:r>
+        <w:t>;</w:t>
+      </w:r>
+    </w:p>
+    <w:p/>
+    <w:p>
+      <w:r>
+        <w:t xml:space="preserve">--Of the wait times, which occurs the most? 179 </w:t>
+      </w:r>
+      <w:proofErr w:type="spellStart"/>
+      <w:r>
+        <w:t>mintues</w:t>
+      </w:r>
+      <w:proofErr w:type="spellEnd"/>
+      <w:r>
+        <w:t xml:space="preserve"> occurs 8 times compared to 180 minutes </w:t>
+      </w:r>
+      <w:proofErr w:type="spellStart"/>
+      <w:r>
+        <w:t>occuring</w:t>
+      </w:r>
+      <w:proofErr w:type="spellEnd"/>
+      <w:r>
+        <w:t xml:space="preserve"> 4 times. </w:t>
+      </w:r>
+    </w:p>
+    <w:p>
+      <w:r>
+        <w:t>Select</w:t>
+      </w:r>
+    </w:p>
+    <w:p>
+      <w:r>
+        <w:tab/>
+        <w:t xml:space="preserve">  </w:t>
+      </w:r>
+      <w:proofErr w:type="spellStart"/>
+      <w:r>
+        <w:t>max_wait_time_minutes</w:t>
+      </w:r>
+      <w:proofErr w:type="spellEnd"/>
+    </w:p>
+    <w:p>
+      <w:r>
+        <w:tab/>
+        <w:t>, count(</w:t>
+      </w:r>
+      <w:proofErr w:type="spellStart"/>
+      <w:r>
+        <w:t>max_wait_time_minutes</w:t>
+      </w:r>
+      <w:proofErr w:type="spellEnd"/>
+      <w:r>
+        <w:t>)</w:t>
+      </w:r>
+    </w:p>
+    <w:p>
+      <w:r>
+        <w:t>From</w:t>
+      </w:r>
+    </w:p>
+    <w:p>
+      <w:r>
+        <w:tab/>
+        <w:t>(</w:t>
+      </w:r>
+    </w:p>
+    <w:p>
+      <w:r>
+        <w:tab/>
+      </w:r>
+      <w:r>
+        <w:tab/>
+        <w:t>Select</w:t>
+      </w:r>
+    </w:p>
+    <w:p>
+      <w:r>
+        <w:tab/>
+      </w:r>
+      <w:r>
+        <w:tab/>
+      </w:r>
+      <w:r>
+        <w:tab/>
+        <w:t xml:space="preserve">  </w:t>
+      </w:r>
+      <w:proofErr w:type="spellStart"/>
+      <w:r>
+        <w:t>pts.age</w:t>
+      </w:r>
+      <w:proofErr w:type="spellEnd"/>
+    </w:p>
+    <w:p>
+      <w:r>
+        <w:tab/>
+      </w:r>
+      <w:r>
+        <w:tab/>
+      </w:r>
+      <w:r>
+        <w:tab/>
+        <w:t>, max(</w:t>
+      </w:r>
+      <w:proofErr w:type="spellStart"/>
+      <w:r>
+        <w:t>wait_time_minutes</w:t>
+      </w:r>
+      <w:proofErr w:type="spellEnd"/>
+      <w:r>
+        <w:t xml:space="preserve">) </w:t>
+      </w:r>
+      <w:proofErr w:type="spellStart"/>
+      <w:r>
+        <w:t>max_wait_time_minutes</w:t>
+      </w:r>
+      <w:proofErr w:type="spellEnd"/>
+    </w:p>
+    <w:p>
+      <w:r>
+        <w:tab/>
+      </w:r>
+      <w:r>
+        <w:tab/>
+        <w:t>From</w:t>
+      </w:r>
+    </w:p>
+    <w:p>
+      <w:r>
+        <w:tab/>
+      </w:r>
+      <w:r>
+        <w:tab/>
+      </w:r>
+      <w:r>
+        <w:tab/>
+      </w:r>
+      <w:proofErr w:type="spellStart"/>
+      <w:r>
+        <w:t>er_visits</w:t>
+      </w:r>
+      <w:proofErr w:type="spellEnd"/>
+      <w:r>
+        <w:t xml:space="preserve"> er</w:t>
+      </w:r>
+    </w:p>
+    <w:p>
+      <w:r>
+        <w:tab/>
+      </w:r>
+      <w:r>
+        <w:tab/>
+      </w:r>
+      <w:r>
+        <w:tab/>
+      </w:r>
+      <w:r>
+        <w:tab/>
+        <w:t>inner join patients pts</w:t>
+      </w:r>
+    </w:p>
+    <w:p>
+      <w:r>
+        <w:tab/>
+      </w:r>
+      <w:r>
+        <w:tab/>
+      </w:r>
+      <w:r>
+        <w:tab/>
+      </w:r>
+      <w:r>
+        <w:tab/>
+      </w:r>
+      <w:r>
+        <w:tab/>
+        <w:t xml:space="preserve">on </w:t>
+      </w:r>
+      <w:proofErr w:type="spellStart"/>
+      <w:r>
+        <w:t>er.patient_id</w:t>
+      </w:r>
+      <w:proofErr w:type="spellEnd"/>
+      <w:r>
+        <w:t>=</w:t>
+      </w:r>
+      <w:proofErr w:type="spellStart"/>
+      <w:r>
+        <w:t>pts.patient_id</w:t>
+      </w:r>
+      <w:proofErr w:type="spellEnd"/>
+    </w:p>
+    <w:p>
+      <w:r>
+        <w:tab/>
+      </w:r>
+      <w:r>
+        <w:tab/>
+        <w:t>Group By</w:t>
+      </w:r>
+    </w:p>
+    <w:p>
+      <w:r>
+        <w:tab/>
+      </w:r>
+      <w:r>
+        <w:tab/>
+      </w:r>
+      <w:r>
+        <w:tab/>
+      </w:r>
+      <w:proofErr w:type="spellStart"/>
+      <w:r>
+        <w:t>pts.age</w:t>
+      </w:r>
+      <w:proofErr w:type="spellEnd"/>
+    </w:p>
+    <w:p>
+      <w:r>
+        <w:tab/>
+      </w:r>
+      <w:r>
+        <w:tab/>
+        <w:t>Order By</w:t>
+      </w:r>
+    </w:p>
+    <w:p>
+      <w:r>
+        <w:lastRenderedPageBreak/>
+        <w:tab/>
+      </w:r>
+      <w:r>
+        <w:tab/>
+      </w:r>
+      <w:r>
+        <w:tab/>
+      </w:r>
+      <w:proofErr w:type="spellStart"/>
+      <w:r>
+        <w:t>max_wait_time_minutes</w:t>
+      </w:r>
+      <w:proofErr w:type="spellEnd"/>
+      <w:r>
+        <w:t xml:space="preserve"> desc</w:t>
+      </w:r>
+    </w:p>
+    <w:p>
+      <w:r>
+        <w:tab/>
+        <w:t>)</w:t>
+      </w:r>
+    </w:p>
+    <w:p>
+      <w:r>
+        <w:t>Group By</w:t>
+      </w:r>
+    </w:p>
+    <w:p>
+      <w:r>
+        <w:tab/>
+      </w:r>
+      <w:proofErr w:type="spellStart"/>
+      <w:r>
+        <w:t>max_wait_time_minutes</w:t>
+      </w:r>
+      <w:proofErr w:type="spellEnd"/>
+    </w:p>
+    <w:p>
+      <w:r>
+        <w:t>Order By</w:t>
+      </w:r>
+    </w:p>
+    <w:p>
+      <w:r>
+        <w:tab/>
+      </w:r>
+      <w:proofErr w:type="spellStart"/>
+      <w:r>
+        <w:t>max_wait_time_minutes</w:t>
+      </w:r>
+      <w:proofErr w:type="spellEnd"/>
+      <w:r>
+        <w:t xml:space="preserve"> desc</w:t>
+      </w:r>
+    </w:p>
+    <w:p>
+      <w:r>
+        <w:t>;</w:t>
+      </w:r>
+    </w:p>
+    <w:p/>
+    <w:p>
+      <w:r>
+        <w:t>--What are the age groups experiencing wait times of 179 minutes? 89, 70, 52, 48, 42, 30, 24 (71% are over 40)</w:t>
+      </w:r>
+    </w:p>
+    <w:p>
+      <w:r>
+        <w:t>--What are the age groups experiencing wait times of 180 minutes? 76, 74, 61, 53 (All over 53)</w:t>
+      </w:r>
+    </w:p>
+    <w:p>
+      <w:r>
+        <w:t>Select</w:t>
+      </w:r>
+    </w:p>
+    <w:p>
+      <w:r>
+        <w:tab/>
+        <w:t xml:space="preserve">    </w:t>
+      </w:r>
+      <w:proofErr w:type="spellStart"/>
+      <w:r>
+        <w:t>pts.age</w:t>
+      </w:r>
+      <w:proofErr w:type="spellEnd"/>
+    </w:p>
+    <w:p>
+      <w:r>
+        <w:tab/>
+        <w:t>--, max(</w:t>
+      </w:r>
+      <w:proofErr w:type="spellStart"/>
+      <w:r>
+        <w:t>wait_time_minutes</w:t>
+      </w:r>
+      <w:proofErr w:type="spellEnd"/>
+      <w:r>
+        <w:t xml:space="preserve">) </w:t>
+      </w:r>
+      <w:proofErr w:type="spellStart"/>
+      <w:r>
+        <w:t>max_wait_time_minutes</w:t>
+      </w:r>
+      <w:proofErr w:type="spellEnd"/>
+    </w:p>
+    <w:p>
+      <w:r>
+        <w:t>From</w:t>
+      </w:r>
+    </w:p>
+    <w:p>
+      <w:r>
+        <w:tab/>
+      </w:r>
+      <w:proofErr w:type="spellStart"/>
+      <w:r>
+        <w:t>er_visits</w:t>
+      </w:r>
+      <w:proofErr w:type="spellEnd"/>
+      <w:r>
+        <w:t xml:space="preserve"> er</w:t>
+      </w:r>
+    </w:p>
+    <w:p>
+      <w:r>
+        <w:tab/>
+      </w:r>
+      <w:r>
+        <w:tab/>
+        <w:t>inner join patients pts</w:t>
+      </w:r>
+    </w:p>
+    <w:p>
+      <w:r>
+        <w:tab/>
+      </w:r>
+      <w:r>
+        <w:tab/>
+      </w:r>
+      <w:r>
+        <w:tab/>
+        <w:t xml:space="preserve">on </w:t>
+      </w:r>
+      <w:proofErr w:type="spellStart"/>
+      <w:r>
+        <w:t>er.patient_id</w:t>
+      </w:r>
+      <w:proofErr w:type="spellEnd"/>
+      <w:r>
+        <w:t>=</w:t>
+      </w:r>
+      <w:proofErr w:type="spellStart"/>
+      <w:r>
+        <w:t>pts.patient_id</w:t>
+      </w:r>
+      <w:proofErr w:type="spellEnd"/>
+    </w:p>
+    <w:p>
+      <w:r>
+        <w:t>Where</w:t>
+      </w:r>
+    </w:p>
+    <w:p>
+      <w:r>
+        <w:tab/>
+      </w:r>
+      <w:proofErr w:type="spellStart"/>
+      <w:r>
+        <w:t>wait_time_minutes</w:t>
+      </w:r>
+      <w:proofErr w:type="spellEnd"/>
+      <w:r>
+        <w:t xml:space="preserve"> = 179 --replace the wait time with 180 to see age groups experiencing 180 min wait times.</w:t>
+      </w:r>
+    </w:p>
+    <w:p>
+      <w:r>
+        <w:t>Group By</w:t>
+      </w:r>
+    </w:p>
+    <w:p>
+      <w:r>
+        <w:tab/>
+      </w:r>
+      <w:proofErr w:type="spellStart"/>
+      <w:r>
+        <w:t>pts.age</w:t>
+      </w:r>
+      <w:proofErr w:type="spellEnd"/>
+    </w:p>
+    <w:p>
+      <w:r>
+        <w:t>Order By</w:t>
+      </w:r>
+    </w:p>
+    <w:p>
+      <w:r>
+        <w:tab/>
+        <w:t>age desc</w:t>
+      </w:r>
+    </w:p>
+    <w:p>
+      <w:r>
+        <w:t>;</w:t>
+      </w:r>
+    </w:p>
+    <w:p>
+      <w:pPr>
+        <w:rPr>
+          <w:b/>
+          <w:bCs/>
+        </w:rPr>
+      </w:pPr>
+    </w:p>
+    <w:p>
+      <w:pPr>
+        <w:rPr>
+          <w:b/>
+          <w:bCs/>
+        </w:rPr>
+      </w:pPr>
+      <w:r>
+        <w:rPr>
+          <w:b/>
+          <w:bCs/>
+        </w:rPr>
+        <w:t>Business Question 2</w:t>
+      </w:r>
+    </w:p>
+    <w:p>
+      <w:pPr>
+        <w:rPr>
+          <w:b/>
+          <w:bCs/>
+        </w:rPr>
+      </w:pPr>
+      <w:r>
+        <w:rPr>
+          <w:b/>
+          <w:bCs/>
+        </w:rPr>
+        <w:t>Which cities generate the highest Emergency Department utilization?</w:t>
+      </w:r>
+    </w:p>
+    <w:p>
+      <w:pPr>
+        <w:rPr>
+          <w:b/>
+          <w:bCs/>
+        </w:rPr>
+      </w:pPr>
+      <w:r>
+        <w:rPr>
+          <w:b/>
+          <w:bCs/>
+        </w:rPr>
+        <w:t>Tables</w:t>
+      </w:r>
+    </w:p>
+    <w:p>
+      <w:pPr>
+        <w:numPr>
+          <w:ilvl w:val="0"/>
+          <w:numId w:val="15"/>
+        </w:numPr>
+      </w:pPr>
+      <w:r>
+        <w:t>patients</w:t>
+      </w:r>
+      <w:r>
+        <w:t xml:space="preserve"> pts</w:t>
+      </w:r>
+    </w:p>
+    <w:p>
+      <w:pPr>
+        <w:numPr>
+          <w:ilvl w:val="1"/>
+          <w:numId w:val="15"/>
+        </w:numPr>
+      </w:pPr>
+      <w:proofErr w:type="spellStart"/>
+      <w:r>
+        <w:t>patient_id</w:t>
+      </w:r>
+      <w:proofErr w:type="spellEnd"/>
+      <w:r>
+        <w:t xml:space="preserve"> for inner join</w:t>
+      </w:r>
+    </w:p>
+    <w:p>
+      <w:pPr>
+        <w:numPr>
+          <w:ilvl w:val="1"/>
+          <w:numId w:val="15"/>
+        </w:numPr>
+      </w:pPr>
+      <w:r>
+        <w:t>city</w:t>
+      </w:r>
+    </w:p>
+    <w:p>
+      <w:pPr>
+        <w:numPr>
+          <w:ilvl w:val="0"/>
+          <w:numId w:val="15"/>
+        </w:numPr>
+      </w:pPr>
+      <w:proofErr w:type="spellStart"/>
+      <w:r>
+        <w:t>er_visits</w:t>
+      </w:r>
+      <w:proofErr w:type="spellEnd"/>
+      <w:r>
+        <w:t xml:space="preserve"> er</w:t>
+      </w:r>
+    </w:p>
+    <w:p>
+      <w:pPr>
+        <w:numPr>
+          <w:ilvl w:val="1"/>
+          <w:numId w:val="15"/>
+        </w:numPr>
+      </w:pPr>
+      <w:proofErr w:type="spellStart"/>
+      <w:r>
+        <w:t>patient_id</w:t>
+      </w:r>
+      <w:proofErr w:type="spellEnd"/>
+      <w:r>
+        <w:t xml:space="preserve"> for inner join</w:t>
+      </w:r>
+    </w:p>
+    <w:p>
+      <w:pPr>
+        <w:numPr>
+          <w:ilvl w:val="2"/>
+          <w:numId w:val="15"/>
+        </w:numPr>
+      </w:pPr>
+      <w:r>
+        <w:t>count(</w:t>
+      </w:r>
+      <w:proofErr w:type="spellStart"/>
+      <w:r>
+        <w:t>patient_id</w:t>
+      </w:r>
+      <w:proofErr w:type="spellEnd"/>
+      <w:r>
+        <w:t>)</w:t>
+      </w:r>
+    </w:p>
+    <w:p>
+      <w:pPr>
+        <w:pStyle w:val="ListParagraph"/>
+        <w:numPr>
+          <w:ilvl w:val="0"/>
+          <w:numId w:val="15"/>
+        </w:numPr>
+      </w:pPr>
+      <w:r>
+        <w:t xml:space="preserve">inner join on </w:t>
+      </w:r>
+      <w:proofErr w:type="spellStart"/>
+      <w:r>
+        <w:t>patient_id</w:t>
+      </w:r>
+      <w:proofErr w:type="spellEnd"/>
+    </w:p>
+    <w:p>
+      <w:pPr>
+        <w:pStyle w:val="ListParagraph"/>
+        <w:numPr>
+          <w:ilvl w:val="0"/>
+          <w:numId w:val="15"/>
+        </w:numPr>
+      </w:pPr>
+      <w:r>
+        <w:t xml:space="preserve">group by </w:t>
+      </w:r>
+      <w:proofErr w:type="spellStart"/>
+      <w:r>
+        <w:t>pts.city</w:t>
+      </w:r>
+      <w:proofErr w:type="spellEnd"/>
+    </w:p>
+    <w:p/>
+    <w:p>
+      <w:pPr>
+        <w:rPr>
+          <w:b/>
+          <w:bCs/>
+        </w:rPr>
+      </w:pPr>
+      <w:r>
+        <w:rPr>
+          <w:b/>
+          <w:bCs/>
+        </w:rPr>
+        <w:t>Business Question 3</w:t>
+      </w:r>
+    </w:p>
+    <w:p>
+      <w:pPr>
+        <w:rPr>
+          <w:b/>
+          <w:bCs/>
+        </w:rPr>
+      </w:pPr>
+      <w:r>
+        <w:rPr>
+          <w:b/>
+          <w:bCs/>
+        </w:rPr>
+        <w:t>Does provider experience appear to influence patient satisfaction?</w:t>
+      </w:r>
+    </w:p>
+    <w:p>
+      <w:pPr>
+        <w:rPr>
+          <w:b/>
+          <w:bCs/>
+        </w:rPr>
+      </w:pPr>
+      <w:r>
+        <w:rPr>
+          <w:b/>
+          <w:bCs/>
+        </w:rPr>
+        <w:t>Tables</w:t>
+      </w:r>
+    </w:p>
+    <w:p>
+      <w:pPr>
+        <w:numPr>
+          <w:ilvl w:val="0"/>
+          <w:numId w:val="16"/>
+        </w:numPr>
+        <w:rPr>
+          <w:b/>
+          <w:bCs/>
+        </w:rPr>
+      </w:pPr>
+      <w:r>
+        <w:rPr>
+          <w:b/>
+          <w:bCs/>
+        </w:rPr>
+        <w:t>appointments</w:t>
+      </w:r>
+    </w:p>
+    <w:p>
+      <w:pPr>
+        <w:numPr>
+          <w:ilvl w:val="0"/>
+          <w:numId w:val="16"/>
+        </w:numPr>
+        <w:rPr>
+          <w:b/>
+          <w:bCs/>
+        </w:rPr>
+      </w:pPr>
+      <w:r>
+        <w:rPr>
+          <w:b/>
+          <w:bCs/>
+        </w:rPr>
+        <w:t>providers</w:t>
+      </w:r>
+    </w:p>
+    <w:p>
+      <w:pPr>
+        <w:rPr>
+          <w:b/>
+          <w:bCs/>
+        </w:rPr>
+      </w:pPr>
+    </w:p>
+    <w:p>
+      <w:pPr>
+        <w:rPr>
+          <w:b/>
+          <w:bCs/>
+        </w:rPr>
+      </w:pPr>
+    </w:p>
+    <w:p>
+      <w:pPr>
+        <w:rPr>
+          <w:b/>
+          <w:bCs/>
+        </w:rPr>
+      </w:pPr>
+    </w:p>
+    <w:p>
+      <w:pPr>
+        <w:rPr>
+          <w:b/>
+          <w:bCs/>
+        </w:rPr>
+      </w:pPr>
+    </w:p>
+    <w:p>
+      <w:pPr>
+        <w:rPr>
+          <w:b/>
+          <w:bCs/>
+        </w:rPr>
+      </w:pPr>
+    </w:p>
+    <w:p>
+      <w:pPr>
+        <w:rPr>
+          <w:b/>
+          <w:bCs/>
+        </w:rPr>
+      </w:pPr>
+    </w:p>
+    <w:p>
+      <w:pPr>
+        <w:rPr>
+          <w:b/>
+          <w:bCs/>
+        </w:rPr>
+      </w:pPr>
+      <w:r>
+        <w:rPr>
+          <w:b/>
+          <w:bCs/>
+        </w:rPr>
+        <w:t>Business Question 4</w:t>
+      </w:r>
+    </w:p>
+    <w:p>
+      <w:pPr>
+        <w:rPr>
+          <w:b/>
+          <w:bCs/>
+        </w:rPr>
+      </w:pPr>
+      <w:r>
+        <w:rPr>
+          <w:b/>
+          <w:bCs/>
+        </w:rPr>
+        <w:t>Which appointment types have the highest patient satisfaction?</w:t>
+      </w:r>
+    </w:p>
+    <w:p>
+      <w:pPr>
+        <w:rPr>
+          <w:b/>
+          <w:bCs/>
+        </w:rPr>
+      </w:pPr>
+      <w:r>
+        <w:rPr>
+          <w:b/>
+          <w:bCs/>
+        </w:rPr>
+        <w:lastRenderedPageBreak/>
+        <w:t>Tables</w:t>
+      </w:r>
+    </w:p>
+    <w:p>
+      <w:pPr>
+        <w:numPr>
+          <w:ilvl w:val="0"/>
+          <w:numId w:val="17"/>
+        </w:numPr>
+        <w:rPr>
+          <w:b/>
+          <w:bCs/>
+        </w:rPr>
+      </w:pPr>
+      <w:r>
+        <w:rPr>
+          <w:b/>
+          <w:bCs/>
+        </w:rPr>
+        <w:t>appointments</w:t>
+      </w:r>
+    </w:p>
+    <w:p>
+      <w:pPr>
+        <w:numPr>
+          <w:ilvl w:val="0"/>
+          <w:numId w:val="17"/>
+        </w:numPr>
+        <w:rPr>
+          <w:b/>
+          <w:bCs/>
+        </w:rPr>
+      </w:pPr>
+      <w:r>
+        <w:rPr>
+          <w:b/>
+          <w:bCs/>
+        </w:rPr>
+        <w:t>providers </w:t>
+      </w:r>
+      <w:r>
+        <w:rPr>
+          <w:b/>
+          <w:bCs/>
+          <w:i/>
+          <w:iCs/>
+        </w:rPr>
+        <w:t>(provider table isn't strictly required here, but including it lets you practice joins while keeping the business context realistic.)</w:t>
+      </w:r>
+    </w:p>
+    <w:p>
+      <w:pPr>
+        <w:rPr>
+          <w:b/>
+          <w:bCs/>
+        </w:rPr>
+      </w:pPr>
+    </w:p>
+    <w:p>
+      <w:pPr>
+        <w:rPr>
+          <w:b/>
+          <w:bCs/>
+        </w:rPr>
+      </w:pPr>
+      <w:r>
+        <w:rPr>
+          <w:b/>
+          <w:bCs/>
+        </w:rPr>
+        <w:t>Business Question 5</w:t>
+      </w:r>
+    </w:p>
+    <w:p>
+      <w:pPr>
+        <w:rPr>
+          <w:b/>
+          <w:bCs/>
+        </w:rPr>
+      </w:pPr>
+      <w:r>
+        <w:rPr>
+          <w:b/>
+          <w:bCs/>
+        </w:rPr>
+        <w:t>Which patient demographic groups have the highest appointment no-show rates?</w:t>
+      </w:r>
+    </w:p>
+    <w:p>
+      <w:pPr>
+        <w:rPr>
+          <w:b/>
+          <w:bCs/>
+        </w:rPr>
+      </w:pPr>
+      <w:r>
+        <w:rPr>
+          <w:b/>
+          <w:bCs/>
+        </w:rPr>
+        <w:t>Tables</w:t>
+      </w:r>
+    </w:p>
+    <w:p>
+      <w:pPr>
+        <w:numPr>
+          <w:ilvl w:val="0"/>
+          <w:numId w:val="18"/>
+        </w:numPr>
+        <w:rPr>
+          <w:b/>
+          <w:bCs/>
+        </w:rPr>
+      </w:pPr>
+      <w:r>
+        <w:rPr>
+          <w:b/>
+          <w:bCs/>
+        </w:rPr>
+        <w:t>appointments</w:t>
+      </w:r>
+    </w:p>
+    <w:p>
+      <w:pPr>
+        <w:rPr>
+          <w:b/>
+          <w:bCs/>
+        </w:rPr>
+      </w:pPr>
+    </w:p>
+    <w:p>
+      <w:pPr>
+        <w:rPr>
+          <w:b/>
+          <w:bCs/>
+        </w:rPr>
+      </w:pPr>
+    </w:p>
+    <w:p>
+      <w:pPr>
+        <w:rPr>
+          <w:b/>
+          <w:bCs/>
+        </w:rPr>
+      </w:pPr>
+    </w:p>
+    <w:p>
+      <w:pPr>
+        <w:rPr>
+          <w:b/>
+          <w:bCs/>
+        </w:rPr>
+      </w:pPr>
+      <w:r>
+        <w:rPr>
+          <w:b/>
+          <w:bCs/>
+        </w:rPr>
         <w:t>Phase 4 — Power BI</w:t>
       </w:r>
       <w:r>
@@ -154,6 +1544,7 @@
     </w:p>
     <w:p>
       <w:r>
+        <w:lastRenderedPageBreak/>
         <w:t>Longest Observed Wait Times by Day</w:t>
       </w:r>
     </w:p>
@@ -240,16 +1631,7 @@
     </w:p>
     <w:p>
       <w:r>
-        <w:lastRenderedPageBreak/>
-        <w:t xml:space="preserve">Does severity level affect </w:t>
-      </w:r>
-      <w:proofErr w:type="gramStart"/>
-      <w:r>
-        <w:t>wait</w:t>
-      </w:r>
-      <w:proofErr w:type="gramEnd"/>
-      <w:r>
-        <w:t xml:space="preserve"> time?</w:t>
+        <w:t>Does severity level affect wait time?</w:t>
       </w:r>
     </w:p>
     <w:p>
@@ -359,6 +1741,7 @@
     </w:p>
     <w:p>
       <w:r>
+        <w:lastRenderedPageBreak/>
         <w:t>• Longest waits occur on Monday, Tuesday, Thursday, and Saturday.</w:t>
       </w:r>
     </w:p>
@@ -442,7 +1825,6 @@
     </w:p>
     <w:p>
       <w:r>
-        <w:lastRenderedPageBreak/>
         <w:t>It's to verify that your SQL results are correct.</w:t>
       </w:r>
     </w:p>
@@ -607,15 +1989,7 @@
     </w:p>
     <w:p>
       <w:r>
-        <w:t>Use Excel's </w:t>
-      </w:r>
-      <w:proofErr w:type="gramStart"/>
-      <w:r>
-        <w:t>MEDIAN(</w:t>
-      </w:r>
-      <w:proofErr w:type="gramEnd"/>
-      <w:r>
-        <w:t>) function.</w:t>
+        <w:t>Use Excel's MEDIAN() function.</w:t>
       </w:r>
     </w:p>
     <w:p>
@@ -637,6 +2011,7 @@
           <w:b/>
           <w:bCs/>
         </w:rPr>
+        <w:lastRenderedPageBreak/>
         <w:t>3. Wait time by day of week</w:t>
       </w:r>
       <w:r>
@@ -787,7 +2162,6 @@
           <w:b/>
           <w:bCs/>
         </w:rPr>
-        <w:lastRenderedPageBreak/>
         <w:t>5. Wait time by severity</w:t>
       </w:r>
       <w:r>
@@ -802,23 +2176,7 @@
           <w:b/>
           <w:bCs/>
         </w:rPr>
-        <w:t xml:space="preserve">What is the average wait time based </w:t>
-      </w:r>
-      <w:proofErr w:type="gramStart"/>
-      <w:r>
-        <w:rPr>
-          <w:b/>
-          <w:bCs/>
-        </w:rPr>
-        <w:t>off of</w:t>
-      </w:r>
-      <w:proofErr w:type="gramEnd"/>
-      <w:r>
-        <w:rPr>
-          <w:b/>
-          <w:bCs/>
-        </w:rPr>
-        <w:t xml:space="preserve"> severity level?</w:t>
+        <w:t>What is the average wait time based off of severity level?</w:t>
       </w:r>
       <w:r>
         <w:rPr>
@@ -1016,6 +2374,7 @@
           <w:b/>
           <w:bCs/>
         </w:rPr>
+        <w:lastRenderedPageBreak/>
         <w:t>7. Peak-period patient mix</w:t>
       </w:r>
       <w:r>
@@ -1023,23 +2382,7 @@
           <w:b/>
           <w:bCs/>
         </w:rPr>
-        <w:t xml:space="preserve">: For each severity level, what’s the </w:t>
-      </w:r>
-      <w:proofErr w:type="gramStart"/>
-      <w:r>
-        <w:rPr>
-          <w:b/>
-          <w:bCs/>
-        </w:rPr>
-        <w:t>amount</w:t>
-      </w:r>
-      <w:proofErr w:type="gramEnd"/>
-      <w:r>
-        <w:rPr>
-          <w:b/>
-          <w:bCs/>
-        </w:rPr>
-        <w:t xml:space="preserve"> of patients seen during peak times? In </w:t>
+        <w:t xml:space="preserve">: For each severity level, what’s the amount of patients seen during peak times? In </w:t>
       </w:r>
       <w:proofErr w:type="spellStart"/>
       <w:r>
@@ -1060,15 +2403,7 @@
     </w:p>
     <w:p>
       <w:r>
-        <w:t xml:space="preserve">Verify your final </w:t>
-      </w:r>
-      <w:proofErr w:type="gramStart"/>
-      <w:r>
-        <w:t>statistic</w:t>
-      </w:r>
-      <w:proofErr w:type="gramEnd"/>
-      <w:r>
-        <w:t>:</w:t>
+        <w:t>Verify your final statistic:</w:t>
       </w:r>
       <w:r>
         <w:t xml:space="preserve"> Validated in Excel</w:t>
@@ -1137,9 +2472,6 @@
       </w:r>
       <w:r>
         <w:br/>
-      </w:r>
-      <w:r>
-        <w:lastRenderedPageBreak/>
         <w:t>04_Severity_Analysis</w:t>
       </w:r>
       <w:r>
@@ -1159,40 +2491,14 @@
     </w:p>
     <w:p/>
     <w:p>
-      <w:proofErr w:type="gramStart"/>
-      <w:r>
-        <w:t>each</w:t>
-      </w:r>
-      <w:proofErr w:type="gramEnd"/>
-      <w:r>
-        <w:t xml:space="preserve"> worksheet will more accurately be 1 for each business question I answered. </w:t>
-      </w:r>
-      <w:proofErr w:type="gramStart"/>
-      <w:r>
-        <w:t>So</w:t>
-      </w:r>
-      <w:proofErr w:type="gramEnd"/>
-      <w:r>
-        <w:t xml:space="preserve"> </w:t>
-      </w:r>
-      <w:proofErr w:type="gramStart"/>
-      <w:r>
-        <w:t>refer back</w:t>
-      </w:r>
-      <w:proofErr w:type="gramEnd"/>
-      <w:r>
-        <w:t xml:space="preserve"> to </w:t>
-      </w:r>
-      <w:proofErr w:type="gramStart"/>
-      <w:r>
-        <w:t xml:space="preserve">the </w:t>
+      <w:r>
+        <w:t xml:space="preserve">each worksheet will more accurately be 1 for each business question I answered. So refer back to the </w:t>
       </w:r>
       <w:proofErr w:type="spellStart"/>
       <w:r>
         <w:t>the</w:t>
       </w:r>
       <w:proofErr w:type="spellEnd"/>
-      <w:proofErr w:type="gramEnd"/>
       <w:r>
         <w:t xml:space="preserve"> questions I answered in Phase 2, and that should be the number of worksheets in Phase 3. </w:t>
       </w:r>
@@ -1254,15 +2560,7 @@
         </w:numPr>
       </w:pPr>
       <w:r>
-        <w:t xml:space="preserve">What </w:t>
-      </w:r>
-      <w:proofErr w:type="gramStart"/>
-      <w:r>
-        <w:t>is</w:t>
-      </w:r>
-      <w:proofErr w:type="gramEnd"/>
-      <w:r>
-        <w:t xml:space="preserve"> the average and median ER wait time?</w:t>
+        <w:t>What is the average and median ER wait time?</w:t>
       </w:r>
     </w:p>
     <w:p>
@@ -1286,15 +2584,7 @@
         </w:numPr>
       </w:pPr>
       <w:r>
-        <w:t xml:space="preserve">Median </w:t>
-      </w:r>
-      <w:proofErr w:type="gramStart"/>
-      <w:r>
-        <w:t>wait</w:t>
-      </w:r>
-      <w:proofErr w:type="gramEnd"/>
-      <w:r>
-        <w:t xml:space="preserve"> time is 67 minutes </w:t>
+        <w:t xml:space="preserve">Median wait time is 67 minutes </w:t>
       </w:r>
     </w:p>
     <w:p>
@@ -1318,6 +2608,7 @@
         </w:numPr>
       </w:pPr>
       <w:r>
+        <w:lastRenderedPageBreak/>
         <w:t xml:space="preserve">The longest observed ER wait times (180 minutes) occurred on Mondays, Tuesdays, Thursdays, and Saturday. </w:t>
       </w:r>
       <w:r>
@@ -1345,18 +2636,10 @@
         </w:numPr>
       </w:pPr>
       <w:r>
-        <w:t xml:space="preserve">The top </w:t>
-      </w:r>
-      <w:proofErr w:type="gramStart"/>
-      <w:r>
-        <w:t>3</w:t>
-      </w:r>
-      <w:r>
-        <w:t>,</w:t>
-      </w:r>
-      <w:proofErr w:type="gramEnd"/>
-      <w:r>
-        <w:t xml:space="preserve"> </w:t>
+        <w:t>The top 3</w:t>
+      </w:r>
+      <w:r>
+        <w:t xml:space="preserve">, </w:t>
       </w:r>
       <w:r>
         <w:t xml:space="preserve">hours of the day that experienced the most patients in a day are 02:00 at 144 pts, 21:00 at 141 pts, and 0:00 with 140 pts. </w:t>
@@ -1394,21 +2677,8 @@
       <w:r>
         <w:t xml:space="preserve">than medium severity level patients. </w:t>
       </w:r>
-      <w:proofErr w:type="gramStart"/>
-      <w:r>
-        <w:t>Also</w:t>
-      </w:r>
-      <w:proofErr w:type="gramEnd"/>
-      <w:r>
-        <w:t xml:space="preserve"> High severity level patients never get seen past 1 hour, and Critical severity level patients get </w:t>
-      </w:r>
-      <w:proofErr w:type="gramStart"/>
-      <w:r>
-        <w:t>seen</w:t>
-      </w:r>
-      <w:proofErr w:type="gramEnd"/>
-      <w:r>
-        <w:t xml:space="preserve"> between 1-15 minutes. </w:t>
+      <w:r>
+        <w:t xml:space="preserve">Also High severity level patients never get seen past 1 hour, and Critical severity level patients get seen between 1-15 minutes. </w:t>
       </w:r>
     </w:p>
     <w:p>
@@ -1486,19 +2756,7 @@
         <w:t xml:space="preserve"> low severity.</w:t>
       </w:r>
       <w:r>
-        <w:t xml:space="preserve"> These patient groups accounted for </w:t>
-      </w:r>
-      <w:proofErr w:type="gramStart"/>
-      <w:r>
-        <w:t xml:space="preserve">the </w:t>
-      </w:r>
-      <w:r>
-        <w:lastRenderedPageBreak/>
-        <w:t>majority of</w:t>
-      </w:r>
-      <w:proofErr w:type="gramEnd"/>
-      <w:r>
-        <w:t xml:space="preserve"> ER visits during the busiest periods of the day.</w:t>
+        <w:t xml:space="preserve"> These patient groups accounted for the majority of ER visits during the busiest periods of the day.</w:t>
       </w:r>
       <w:r>
         <w:t xml:space="preserve"> </w:t>
@@ -1677,15 +2935,7 @@
     </w:p>
     <w:p>
       <w:r>
-        <w:t xml:space="preserve">2. Identify the primary and </w:t>
-      </w:r>
-      <w:proofErr w:type="gramStart"/>
-      <w:r>
-        <w:t>Foreign</w:t>
-      </w:r>
-      <w:proofErr w:type="gramEnd"/>
-      <w:r>
-        <w:t xml:space="preserve"> key(s).</w:t>
+        <w:t>2. Identify the primary and Foreign key(s).</w:t>
       </w:r>
     </w:p>
     <w:p>
@@ -1798,6 +3048,7 @@
       </w:pPr>
       <w:proofErr w:type="spellStart"/>
       <w:r>
+        <w:lastRenderedPageBreak/>
         <w:t>Provider_id</w:t>
       </w:r>
       <w:proofErr w:type="spellEnd"/>
@@ -1980,7 +3231,6 @@
       <w:r>
         <w:t xml:space="preserve"> </w:t>
       </w:r>
-      <w:proofErr w:type="gramStart"/>
       <w:r>
         <w:t>patie</w:t>
       </w:r>
@@ -1988,11 +3238,7 @@
         <w:t>nt</w:t>
       </w:r>
       <w:r>
-        <w:t>s</w:t>
-      </w:r>
-      <w:proofErr w:type="gramEnd"/>
-      <w:r>
-        <w:t xml:space="preserve"> data</w:t>
+        <w:t>s data</w:t>
       </w:r>
       <w:r>
         <w:t>se</w:t>
@@ -2267,7 +3513,6 @@
       </w:pPr>
       <w:proofErr w:type="spellStart"/>
       <w:r>
-        <w:lastRenderedPageBreak/>
         <w:t>V</w:t>
       </w:r>
       <w:r>
@@ -2299,15 +3544,7 @@
         <w:t>imary ke</w:t>
       </w:r>
       <w:r>
-        <w:t xml:space="preserve">y </w:t>
-      </w:r>
-      <w:proofErr w:type="gramStart"/>
-      <w:r>
-        <w:t>to</w:t>
-      </w:r>
-      <w:proofErr w:type="gramEnd"/>
-      <w:r>
-        <w:t xml:space="preserve"> i</w:t>
+        <w:t>y to i</w:t>
       </w:r>
       <w:r>
         <w:t>d</w:t>
@@ -2449,14 +3686,12 @@
       <w:r>
         <w:t xml:space="preserve">the </w:t>
       </w:r>
-      <w:proofErr w:type="gramStart"/>
       <w:r>
         <w:t>pati</w:t>
       </w:r>
       <w:r>
         <w:t>ents</w:t>
       </w:r>
-      <w:proofErr w:type="gramEnd"/>
       <w:r>
         <w:t xml:space="preserve"> da</w:t>
       </w:r>
@@ -2841,11 +4076,9 @@
       <w:r>
         <w:t xml:space="preserve"> </w:t>
       </w:r>
-      <w:proofErr w:type="gramStart"/>
       <w:r>
         <w:t>hour</w:t>
       </w:r>
-      <w:proofErr w:type="gramEnd"/>
       <w:r>
         <w:t>(s)</w:t>
       </w:r>
@@ -2918,6 +4151,7 @@
         </w:numPr>
       </w:pPr>
       <w:r>
+        <w:lastRenderedPageBreak/>
         <w:t xml:space="preserve">Yes: </w:t>
       </w:r>
       <w:r>
@@ -2951,11 +4185,7 @@
         <w:t>ay at t</w:t>
       </w:r>
       <w:r>
-        <w:t xml:space="preserve">he </w:t>
-      </w:r>
-      <w:proofErr w:type="gramStart"/>
-      <w:r>
-        <w:t>ho</w:t>
+        <w:t>he ho</w:t>
       </w:r>
       <w:r>
         <w:t>spital</w:t>
@@ -2964,11 +4194,7 @@
         <w:t xml:space="preserve">, </w:t>
       </w:r>
       <w:r>
-        <w:t xml:space="preserve"> or</w:t>
-      </w:r>
-      <w:proofErr w:type="gramEnd"/>
-      <w:r>
-        <w:t xml:space="preserve"> </w:t>
+        <w:t xml:space="preserve"> or </w:t>
       </w:r>
       <w:r>
         <w:t xml:space="preserve">No: </w:t>
@@ -3239,7 +4465,6 @@
         </w:numPr>
       </w:pPr>
       <w:r>
-        <w:lastRenderedPageBreak/>
         <w:t xml:space="preserve">Shows the day of the week the appointment was on. </w:t>
       </w:r>
     </w:p>
@@ -3472,15 +4697,7 @@
         <w:t xml:space="preserve"> satisfaction scores. </w:t>
       </w:r>
       <w:r>
-        <w:t xml:space="preserve">Null values will mean patients </w:t>
-      </w:r>
-      <w:proofErr w:type="gramStart"/>
-      <w:r>
-        <w:t>either</w:t>
-      </w:r>
-      <w:proofErr w:type="gramEnd"/>
-      <w:r>
-        <w:t xml:space="preserve"> canceled or no-show. </w:t>
+        <w:t xml:space="preserve">Null values will mean patients either canceled or no-show. </w:t>
       </w:r>
     </w:p>
     <w:p>
@@ -3580,6 +4797,7 @@
         </w:numPr>
       </w:pPr>
       <w:r>
+        <w:lastRenderedPageBreak/>
         <w:t>Age in years of patient</w:t>
       </w:r>
     </w:p>
@@ -3756,7 +4974,6 @@
         </w:numPr>
       </w:pPr>
       <w:r>
-        <w:lastRenderedPageBreak/>
         <w:t xml:space="preserve">First </w:t>
       </w:r>
       <w:r>
@@ -3923,6 +5140,7 @@
     </w:p>
     <w:p>
       <w:r>
+        <w:lastRenderedPageBreak/>
         <w:t>Stakeholders are</w:t>
       </w:r>
       <w:r>
@@ -3937,15 +5155,7 @@
     </w:p>
     <w:p>
       <w:r>
-        <w:t xml:space="preserve">What questions </w:t>
-      </w:r>
-      <w:proofErr w:type="gramStart"/>
-      <w:r>
-        <w:t>I need</w:t>
-      </w:r>
-      <w:proofErr w:type="gramEnd"/>
-      <w:r>
-        <w:t xml:space="preserve"> to answer:</w:t>
+        <w:t>What questions I need to answer:</w:t>
       </w:r>
     </w:p>
     <w:p>
@@ -3969,15 +5179,7 @@
         </w:numPr>
       </w:pPr>
       <w:r>
-        <w:t xml:space="preserve">Are the complaints coming from all pts in general, or </w:t>
-      </w:r>
-      <w:proofErr w:type="gramStart"/>
-      <w:r>
-        <w:t>is</w:t>
-      </w:r>
-      <w:proofErr w:type="gramEnd"/>
-      <w:r>
-        <w:t xml:space="preserve"> the</w:t>
+        <w:t>Are the complaints coming from all pts in general, or is the</w:t>
       </w:r>
       <w:r>
         <w:t>re</w:t>
@@ -4063,7 +5265,6 @@
         </w:numPr>
       </w:pPr>
       <w:r>
-        <w:lastRenderedPageBreak/>
         <w:t>Patients</w:t>
       </w:r>
     </w:p>
@@ -4180,6 +5381,7 @@
     </w:p>
     <w:p>
       <w:r>
+        <w:lastRenderedPageBreak/>
         <w:t xml:space="preserve">These four datasets form a valid relational model centered around patients. Primary keys are unique, foreign key relationships are intact, and no duplicate records were identified. The only mission values occur in patient satisfaction scores for canceled and no-show appointments and will remain NULL. One provider-name formatting inconsistency will be standardized. The ER dataset is suitable for exploratory analysis of wait times, patient volume, severity, admission status, and ED length of stay. </w:t>
       </w:r>
     </w:p>
@@ -4869,6 +6071,304 @@
     </w:lvl>
   </w:abstractNum>
   <w:abstractNum w:abstractNumId="5" w15:restartNumberingAfterBreak="0">
+    <w:nsid w:val="0E7D07A7"/>
+    <w:multiLevelType w:val="multilevel"/>
+    <w:tmpl w:val="63DE9FC2"/>
+    <w:lvl w:ilvl="0">
+      <w:start w:val="1"/>
+      <w:numFmt w:val="bullet"/>
+      <w:lvlText w:val=""/>
+      <w:lvlJc w:val="left"/>
+      <w:pPr>
+        <w:tabs>
+          <w:tab w:val="num" w:pos="720"/>
+        </w:tabs>
+        <w:ind w:left="720" w:hanging="360"/>
+      </w:pPr>
+      <w:rPr>
+        <w:rFonts w:ascii="Symbol" w:hAnsi="Symbol" w:hint="default"/>
+        <w:sz w:val="20"/>
+      </w:rPr>
+    </w:lvl>
+    <w:lvl w:ilvl="1">
+      <w:start w:val="1"/>
+      <w:numFmt w:val="bullet"/>
+      <w:lvlText w:val="o"/>
+      <w:lvlJc w:val="left"/>
+      <w:pPr>
+        <w:tabs>
+          <w:tab w:val="num" w:pos="1440"/>
+        </w:tabs>
+        <w:ind w:left="1440" w:hanging="360"/>
+      </w:pPr>
+      <w:rPr>
+        <w:rFonts w:ascii="Courier New" w:hAnsi="Courier New" w:hint="default"/>
+        <w:sz w:val="20"/>
+      </w:rPr>
+    </w:lvl>
+    <w:lvl w:ilvl="2" w:tentative="1">
+      <w:start w:val="1"/>
+      <w:numFmt w:val="bullet"/>
+      <w:lvlText w:val=""/>
+      <w:lvlJc w:val="left"/>
+      <w:pPr>
+        <w:tabs>
+          <w:tab w:val="num" w:pos="2160"/>
+        </w:tabs>
+        <w:ind w:left="2160" w:hanging="360"/>
+      </w:pPr>
+      <w:rPr>
+        <w:rFonts w:ascii="Wingdings" w:hAnsi="Wingdings" w:hint="default"/>
+        <w:sz w:val="20"/>
+      </w:rPr>
+    </w:lvl>
+    <w:lvl w:ilvl="3" w:tentative="1">
+      <w:start w:val="1"/>
+      <w:numFmt w:val="bullet"/>
+      <w:lvlText w:val=""/>
+      <w:lvlJc w:val="left"/>
+      <w:pPr>
+        <w:tabs>
+          <w:tab w:val="num" w:pos="2880"/>
+        </w:tabs>
+        <w:ind w:left="2880" w:hanging="360"/>
+      </w:pPr>
+      <w:rPr>
+        <w:rFonts w:ascii="Wingdings" w:hAnsi="Wingdings" w:hint="default"/>
+        <w:sz w:val="20"/>
+      </w:rPr>
+    </w:lvl>
+    <w:lvl w:ilvl="4" w:tentative="1">
+      <w:start w:val="1"/>
+      <w:numFmt w:val="bullet"/>
+      <w:lvlText w:val=""/>
+      <w:lvlJc w:val="left"/>
+      <w:pPr>
+        <w:tabs>
+          <w:tab w:val="num" w:pos="3600"/>
+        </w:tabs>
+        <w:ind w:left="3600" w:hanging="360"/>
+      </w:pPr>
+      <w:rPr>
+        <w:rFonts w:ascii="Wingdings" w:hAnsi="Wingdings" w:hint="default"/>
+        <w:sz w:val="20"/>
+      </w:rPr>
+    </w:lvl>
+    <w:lvl w:ilvl="5" w:tentative="1">
+      <w:start w:val="1"/>
+      <w:numFmt w:val="bullet"/>
+      <w:lvlText w:val=""/>
+      <w:lvlJc w:val="left"/>
+      <w:pPr>
+        <w:tabs>
+          <w:tab w:val="num" w:pos="4320"/>
+        </w:tabs>
+        <w:ind w:left="4320" w:hanging="360"/>
+      </w:pPr>
+      <w:rPr>
+        <w:rFonts w:ascii="Wingdings" w:hAnsi="Wingdings" w:hint="default"/>
+        <w:sz w:val="20"/>
+      </w:rPr>
+    </w:lvl>
+    <w:lvl w:ilvl="6" w:tentative="1">
+      <w:start w:val="1"/>
+      <w:numFmt w:val="bullet"/>
+      <w:lvlText w:val=""/>
+      <w:lvlJc w:val="left"/>
+      <w:pPr>
+        <w:tabs>
+          <w:tab w:val="num" w:pos="5040"/>
+        </w:tabs>
+        <w:ind w:left="5040" w:hanging="360"/>
+      </w:pPr>
+      <w:rPr>
+        <w:rFonts w:ascii="Wingdings" w:hAnsi="Wingdings" w:hint="default"/>
+        <w:sz w:val="20"/>
+      </w:rPr>
+    </w:lvl>
+    <w:lvl w:ilvl="7" w:tentative="1">
+      <w:start w:val="1"/>
+      <w:numFmt w:val="bullet"/>
+      <w:lvlText w:val=""/>
+      <w:lvlJc w:val="left"/>
+      <w:pPr>
+        <w:tabs>
+          <w:tab w:val="num" w:pos="5760"/>
+        </w:tabs>
+        <w:ind w:left="5760" w:hanging="360"/>
+      </w:pPr>
+      <w:rPr>
+        <w:rFonts w:ascii="Wingdings" w:hAnsi="Wingdings" w:hint="default"/>
+        <w:sz w:val="20"/>
+      </w:rPr>
+    </w:lvl>
+    <w:lvl w:ilvl="8" w:tentative="1">
+      <w:start w:val="1"/>
+      <w:numFmt w:val="bullet"/>
+      <w:lvlText w:val=""/>
+      <w:lvlJc w:val="left"/>
+      <w:pPr>
+        <w:tabs>
+          <w:tab w:val="num" w:pos="6480"/>
+        </w:tabs>
+        <w:ind w:left="6480" w:hanging="360"/>
+      </w:pPr>
+      <w:rPr>
+        <w:rFonts w:ascii="Wingdings" w:hAnsi="Wingdings" w:hint="default"/>
+        <w:sz w:val="20"/>
+      </w:rPr>
+    </w:lvl>
+  </w:abstractNum>
+  <w:abstractNum w:abstractNumId="6" w15:restartNumberingAfterBreak="0">
+    <w:nsid w:val="164514C1"/>
+    <w:multiLevelType w:val="multilevel"/>
+    <w:tmpl w:val="C97AD7F8"/>
+    <w:lvl w:ilvl="0">
+      <w:start w:val="1"/>
+      <w:numFmt w:val="bullet"/>
+      <w:lvlText w:val=""/>
+      <w:lvlJc w:val="left"/>
+      <w:pPr>
+        <w:tabs>
+          <w:tab w:val="num" w:pos="720"/>
+        </w:tabs>
+        <w:ind w:left="720" w:hanging="360"/>
+      </w:pPr>
+      <w:rPr>
+        <w:rFonts w:ascii="Symbol" w:hAnsi="Symbol" w:hint="default"/>
+        <w:sz w:val="20"/>
+      </w:rPr>
+    </w:lvl>
+    <w:lvl w:ilvl="1" w:tentative="1">
+      <w:start w:val="1"/>
+      <w:numFmt w:val="bullet"/>
+      <w:lvlText w:val="o"/>
+      <w:lvlJc w:val="left"/>
+      <w:pPr>
+        <w:tabs>
+          <w:tab w:val="num" w:pos="1440"/>
+        </w:tabs>
+        <w:ind w:left="1440" w:hanging="360"/>
+      </w:pPr>
+      <w:rPr>
+        <w:rFonts w:ascii="Courier New" w:hAnsi="Courier New" w:hint="default"/>
+        <w:sz w:val="20"/>
+      </w:rPr>
+    </w:lvl>
+    <w:lvl w:ilvl="2" w:tentative="1">
+      <w:start w:val="1"/>
+      <w:numFmt w:val="bullet"/>
+      <w:lvlText w:val=""/>
+      <w:lvlJc w:val="left"/>
+      <w:pPr>
+        <w:tabs>
+          <w:tab w:val="num" w:pos="2160"/>
+        </w:tabs>
+        <w:ind w:left="2160" w:hanging="360"/>
+      </w:pPr>
+      <w:rPr>
+        <w:rFonts w:ascii="Wingdings" w:hAnsi="Wingdings" w:hint="default"/>
+        <w:sz w:val="20"/>
+      </w:rPr>
+    </w:lvl>
+    <w:lvl w:ilvl="3" w:tentative="1">
+      <w:start w:val="1"/>
+      <w:numFmt w:val="bullet"/>
+      <w:lvlText w:val=""/>
+      <w:lvlJc w:val="left"/>
+      <w:pPr>
+        <w:tabs>
+          <w:tab w:val="num" w:pos="2880"/>
+        </w:tabs>
+        <w:ind w:left="2880" w:hanging="360"/>
+      </w:pPr>
+      <w:rPr>
+        <w:rFonts w:ascii="Wingdings" w:hAnsi="Wingdings" w:hint="default"/>
+        <w:sz w:val="20"/>
+      </w:rPr>
+    </w:lvl>
+    <w:lvl w:ilvl="4" w:tentative="1">
+      <w:start w:val="1"/>
+      <w:numFmt w:val="bullet"/>
+      <w:lvlText w:val=""/>
+      <w:lvlJc w:val="left"/>
+      <w:pPr>
+        <w:tabs>
+          <w:tab w:val="num" w:pos="3600"/>
+        </w:tabs>
+        <w:ind w:left="3600" w:hanging="360"/>
+      </w:pPr>
+      <w:rPr>
+        <w:rFonts w:ascii="Wingdings" w:hAnsi="Wingdings" w:hint="default"/>
+        <w:sz w:val="20"/>
+      </w:rPr>
+    </w:lvl>
+    <w:lvl w:ilvl="5" w:tentative="1">
+      <w:start w:val="1"/>
+      <w:numFmt w:val="bullet"/>
+      <w:lvlText w:val=""/>
+      <w:lvlJc w:val="left"/>
+      <w:pPr>
+        <w:tabs>
+          <w:tab w:val="num" w:pos="4320"/>
+        </w:tabs>
+        <w:ind w:left="4320" w:hanging="360"/>
+      </w:pPr>
+      <w:rPr>
+        <w:rFonts w:ascii="Wingdings" w:hAnsi="Wingdings" w:hint="default"/>
+        <w:sz w:val="20"/>
+      </w:rPr>
+    </w:lvl>
+    <w:lvl w:ilvl="6" w:tentative="1">
+      <w:start w:val="1"/>
+      <w:numFmt w:val="bullet"/>
+      <w:lvlText w:val=""/>
+      <w:lvlJc w:val="left"/>
+      <w:pPr>
+        <w:tabs>
+          <w:tab w:val="num" w:pos="5040"/>
+        </w:tabs>
+        <w:ind w:left="5040" w:hanging="360"/>
+      </w:pPr>
+      <w:rPr>
+        <w:rFonts w:ascii="Wingdings" w:hAnsi="Wingdings" w:hint="default"/>
+        <w:sz w:val="20"/>
+      </w:rPr>
+    </w:lvl>
+    <w:lvl w:ilvl="7" w:tentative="1">
+      <w:start w:val="1"/>
+      <w:numFmt w:val="bullet"/>
+      <w:lvlText w:val=""/>
+      <w:lvlJc w:val="left"/>
+      <w:pPr>
+        <w:tabs>
+          <w:tab w:val="num" w:pos="5760"/>
+        </w:tabs>
+        <w:ind w:left="5760" w:hanging="360"/>
+      </w:pPr>
+      <w:rPr>
+        <w:rFonts w:ascii="Wingdings" w:hAnsi="Wingdings" w:hint="default"/>
+        <w:sz w:val="20"/>
+      </w:rPr>
+    </w:lvl>
+    <w:lvl w:ilvl="8" w:tentative="1">
+      <w:start w:val="1"/>
+      <w:numFmt w:val="bullet"/>
+      <w:lvlText w:val=""/>
+      <w:lvlJc w:val="left"/>
+      <w:pPr>
+        <w:tabs>
+          <w:tab w:val="num" w:pos="6480"/>
+        </w:tabs>
+        <w:ind w:left="6480" w:hanging="360"/>
+      </w:pPr>
+      <w:rPr>
+        <w:rFonts w:ascii="Wingdings" w:hAnsi="Wingdings" w:hint="default"/>
+        <w:sz w:val="20"/>
+      </w:rPr>
+    </w:lvl>
+  </w:abstractNum>
+  <w:abstractNum w:abstractNumId="7" w15:restartNumberingAfterBreak="0">
     <w:nsid w:val="18E125A7"/>
     <w:multiLevelType w:val="multilevel"/>
     <w:tmpl w:val="74A8F35E"/>
@@ -5017,7 +6517,156 @@
       </w:rPr>
     </w:lvl>
   </w:abstractNum>
-  <w:abstractNum w:abstractNumId="6" w15:restartNumberingAfterBreak="0">
+  <w:abstractNum w:abstractNumId="8" w15:restartNumberingAfterBreak="0">
+    <w:nsid w:val="1D6C6EBB"/>
+    <w:multiLevelType w:val="multilevel"/>
+    <w:tmpl w:val="981017AA"/>
+    <w:lvl w:ilvl="0">
+      <w:start w:val="1"/>
+      <w:numFmt w:val="bullet"/>
+      <w:lvlText w:val=""/>
+      <w:lvlJc w:val="left"/>
+      <w:pPr>
+        <w:tabs>
+          <w:tab w:val="num" w:pos="720"/>
+        </w:tabs>
+        <w:ind w:left="720" w:hanging="360"/>
+      </w:pPr>
+      <w:rPr>
+        <w:rFonts w:ascii="Symbol" w:hAnsi="Symbol" w:hint="default"/>
+        <w:sz w:val="20"/>
+      </w:rPr>
+    </w:lvl>
+    <w:lvl w:ilvl="1" w:tentative="1">
+      <w:start w:val="1"/>
+      <w:numFmt w:val="bullet"/>
+      <w:lvlText w:val="o"/>
+      <w:lvlJc w:val="left"/>
+      <w:pPr>
+        <w:tabs>
+          <w:tab w:val="num" w:pos="1440"/>
+        </w:tabs>
+        <w:ind w:left="1440" w:hanging="360"/>
+      </w:pPr>
+      <w:rPr>
+        <w:rFonts w:ascii="Courier New" w:hAnsi="Courier New" w:hint="default"/>
+        <w:sz w:val="20"/>
+      </w:rPr>
+    </w:lvl>
+    <w:lvl w:ilvl="2" w:tentative="1">
+      <w:start w:val="1"/>
+      <w:numFmt w:val="bullet"/>
+      <w:lvlText w:val=""/>
+      <w:lvlJc w:val="left"/>
+      <w:pPr>
+        <w:tabs>
+          <w:tab w:val="num" w:pos="2160"/>
+        </w:tabs>
+        <w:ind w:left="2160" w:hanging="360"/>
+      </w:pPr>
+      <w:rPr>
+        <w:rFonts w:ascii="Wingdings" w:hAnsi="Wingdings" w:hint="default"/>
+        <w:sz w:val="20"/>
+      </w:rPr>
+    </w:lvl>
+    <w:lvl w:ilvl="3" w:tentative="1">
+      <w:start w:val="1"/>
+      <w:numFmt w:val="bullet"/>
+      <w:lvlText w:val=""/>
+      <w:lvlJc w:val="left"/>
+      <w:pPr>
+        <w:tabs>
+          <w:tab w:val="num" w:pos="2880"/>
+        </w:tabs>
+        <w:ind w:left="2880" w:hanging="360"/>
+      </w:pPr>
+      <w:rPr>
+        <w:rFonts w:ascii="Wingdings" w:hAnsi="Wingdings" w:hint="default"/>
+        <w:sz w:val="20"/>
+      </w:rPr>
+    </w:lvl>
+    <w:lvl w:ilvl="4" w:tentative="1">
+      <w:start w:val="1"/>
+      <w:numFmt w:val="bullet"/>
+      <w:lvlText w:val=""/>
+      <w:lvlJc w:val="left"/>
+      <w:pPr>
+        <w:tabs>
+          <w:tab w:val="num" w:pos="3600"/>
+        </w:tabs>
+        <w:ind w:left="3600" w:hanging="360"/>
+      </w:pPr>
+      <w:rPr>
+        <w:rFonts w:ascii="Wingdings" w:hAnsi="Wingdings" w:hint="default"/>
+        <w:sz w:val="20"/>
+      </w:rPr>
+    </w:lvl>
+    <w:lvl w:ilvl="5" w:tentative="1">
+      <w:start w:val="1"/>
+      <w:numFmt w:val="bullet"/>
+      <w:lvlText w:val=""/>
+      <w:lvlJc w:val="left"/>
+      <w:pPr>
+        <w:tabs>
+          <w:tab w:val="num" w:pos="4320"/>
+        </w:tabs>
+        <w:ind w:left="4320" w:hanging="360"/>
+      </w:pPr>
+      <w:rPr>
+        <w:rFonts w:ascii="Wingdings" w:hAnsi="Wingdings" w:hint="default"/>
+        <w:sz w:val="20"/>
+      </w:rPr>
+    </w:lvl>
+    <w:lvl w:ilvl="6" w:tentative="1">
+      <w:start w:val="1"/>
+      <w:numFmt w:val="bullet"/>
+      <w:lvlText w:val=""/>
+      <w:lvlJc w:val="left"/>
+      <w:pPr>
+        <w:tabs>
+          <w:tab w:val="num" w:pos="5040"/>
+        </w:tabs>
+        <w:ind w:left="5040" w:hanging="360"/>
+      </w:pPr>
+      <w:rPr>
+        <w:rFonts w:ascii="Wingdings" w:hAnsi="Wingdings" w:hint="default"/>
+        <w:sz w:val="20"/>
+      </w:rPr>
+    </w:lvl>
+    <w:lvl w:ilvl="7" w:tentative="1">
+      <w:start w:val="1"/>
+      <w:numFmt w:val="bullet"/>
+      <w:lvlText w:val=""/>
+      <w:lvlJc w:val="left"/>
+      <w:pPr>
+        <w:tabs>
+          <w:tab w:val="num" w:pos="5760"/>
+        </w:tabs>
+        <w:ind w:left="5760" w:hanging="360"/>
+      </w:pPr>
+      <w:rPr>
+        <w:rFonts w:ascii="Wingdings" w:hAnsi="Wingdings" w:hint="default"/>
+        <w:sz w:val="20"/>
+      </w:rPr>
+    </w:lvl>
+    <w:lvl w:ilvl="8" w:tentative="1">
+      <w:start w:val="1"/>
+      <w:numFmt w:val="bullet"/>
+      <w:lvlText w:val=""/>
+      <w:lvlJc w:val="left"/>
+      <w:pPr>
+        <w:tabs>
+          <w:tab w:val="num" w:pos="6480"/>
+        </w:tabs>
+        <w:ind w:left="6480" w:hanging="360"/>
+      </w:pPr>
+      <w:rPr>
+        <w:rFonts w:ascii="Wingdings" w:hAnsi="Wingdings" w:hint="default"/>
+        <w:sz w:val="20"/>
+      </w:rPr>
+    </w:lvl>
+  </w:abstractNum>
+  <w:abstractNum w:abstractNumId="9" w15:restartNumberingAfterBreak="0">
     <w:nsid w:val="31875706"/>
     <w:multiLevelType w:val="multilevel"/>
     <w:tmpl w:val="A3BE4B36"/>
@@ -5166,7 +6815,7 @@
       </w:rPr>
     </w:lvl>
   </w:abstractNum>
-  <w:abstractNum w:abstractNumId="7" w15:restartNumberingAfterBreak="0">
+  <w:abstractNum w:abstractNumId="10" w15:restartNumberingAfterBreak="0">
     <w:nsid w:val="35390A28"/>
     <w:multiLevelType w:val="multilevel"/>
     <w:tmpl w:val="C722E3D0"/>
@@ -5315,7 +6964,7 @@
       </w:rPr>
     </w:lvl>
   </w:abstractNum>
-  <w:abstractNum w:abstractNumId="8" w15:restartNumberingAfterBreak="0">
+  <w:abstractNum w:abstractNumId="11" w15:restartNumberingAfterBreak="0">
     <w:nsid w:val="36EB21AD"/>
     <w:multiLevelType w:val="hybridMultilevel"/>
     <w:tmpl w:val="491E72A6"/>
@@ -5428,7 +7077,156 @@
       </w:rPr>
     </w:lvl>
   </w:abstractNum>
-  <w:abstractNum w:abstractNumId="9" w15:restartNumberingAfterBreak="0">
+  <w:abstractNum w:abstractNumId="12" w15:restartNumberingAfterBreak="0">
+    <w:nsid w:val="3EEA55E8"/>
+    <w:multiLevelType w:val="multilevel"/>
+    <w:tmpl w:val="D1927DA2"/>
+    <w:lvl w:ilvl="0">
+      <w:start w:val="1"/>
+      <w:numFmt w:val="bullet"/>
+      <w:lvlText w:val=""/>
+      <w:lvlJc w:val="left"/>
+      <w:pPr>
+        <w:tabs>
+          <w:tab w:val="num" w:pos="720"/>
+        </w:tabs>
+        <w:ind w:left="720" w:hanging="360"/>
+      </w:pPr>
+      <w:rPr>
+        <w:rFonts w:ascii="Symbol" w:hAnsi="Symbol" w:hint="default"/>
+        <w:sz w:val="20"/>
+      </w:rPr>
+    </w:lvl>
+    <w:lvl w:ilvl="1">
+      <w:start w:val="1"/>
+      <w:numFmt w:val="bullet"/>
+      <w:lvlText w:val="o"/>
+      <w:lvlJc w:val="left"/>
+      <w:pPr>
+        <w:tabs>
+          <w:tab w:val="num" w:pos="1440"/>
+        </w:tabs>
+        <w:ind w:left="1440" w:hanging="360"/>
+      </w:pPr>
+      <w:rPr>
+        <w:rFonts w:ascii="Courier New" w:hAnsi="Courier New" w:hint="default"/>
+        <w:sz w:val="20"/>
+      </w:rPr>
+    </w:lvl>
+    <w:lvl w:ilvl="2">
+      <w:start w:val="1"/>
+      <w:numFmt w:val="bullet"/>
+      <w:lvlText w:val=""/>
+      <w:lvlJc w:val="left"/>
+      <w:pPr>
+        <w:tabs>
+          <w:tab w:val="num" w:pos="2160"/>
+        </w:tabs>
+        <w:ind w:left="2160" w:hanging="360"/>
+      </w:pPr>
+      <w:rPr>
+        <w:rFonts w:ascii="Wingdings" w:hAnsi="Wingdings" w:hint="default"/>
+        <w:sz w:val="20"/>
+      </w:rPr>
+    </w:lvl>
+    <w:lvl w:ilvl="3" w:tentative="1">
+      <w:start w:val="1"/>
+      <w:numFmt w:val="bullet"/>
+      <w:lvlText w:val=""/>
+      <w:lvlJc w:val="left"/>
+      <w:pPr>
+        <w:tabs>
+          <w:tab w:val="num" w:pos="2880"/>
+        </w:tabs>
+        <w:ind w:left="2880" w:hanging="360"/>
+      </w:pPr>
+      <w:rPr>
+        <w:rFonts w:ascii="Wingdings" w:hAnsi="Wingdings" w:hint="default"/>
+        <w:sz w:val="20"/>
+      </w:rPr>
+    </w:lvl>
+    <w:lvl w:ilvl="4" w:tentative="1">
+      <w:start w:val="1"/>
+      <w:numFmt w:val="bullet"/>
+      <w:lvlText w:val=""/>
+      <w:lvlJc w:val="left"/>
+      <w:pPr>
+        <w:tabs>
+          <w:tab w:val="num" w:pos="3600"/>
+        </w:tabs>
+        <w:ind w:left="3600" w:hanging="360"/>
+      </w:pPr>
+      <w:rPr>
+        <w:rFonts w:ascii="Wingdings" w:hAnsi="Wingdings" w:hint="default"/>
+        <w:sz w:val="20"/>
+      </w:rPr>
+    </w:lvl>
+    <w:lvl w:ilvl="5" w:tentative="1">
+      <w:start w:val="1"/>
+      <w:numFmt w:val="bullet"/>
+      <w:lvlText w:val=""/>
+      <w:lvlJc w:val="left"/>
+      <w:pPr>
+        <w:tabs>
+          <w:tab w:val="num" w:pos="4320"/>
+        </w:tabs>
+        <w:ind w:left="4320" w:hanging="360"/>
+      </w:pPr>
+      <w:rPr>
+        <w:rFonts w:ascii="Wingdings" w:hAnsi="Wingdings" w:hint="default"/>
+        <w:sz w:val="20"/>
+      </w:rPr>
+    </w:lvl>
+    <w:lvl w:ilvl="6" w:tentative="1">
+      <w:start w:val="1"/>
+      <w:numFmt w:val="bullet"/>
+      <w:lvlText w:val=""/>
+      <w:lvlJc w:val="left"/>
+      <w:pPr>
+        <w:tabs>
+          <w:tab w:val="num" w:pos="5040"/>
+        </w:tabs>
+        <w:ind w:left="5040" w:hanging="360"/>
+      </w:pPr>
+      <w:rPr>
+        <w:rFonts w:ascii="Wingdings" w:hAnsi="Wingdings" w:hint="default"/>
+        <w:sz w:val="20"/>
+      </w:rPr>
+    </w:lvl>
+    <w:lvl w:ilvl="7" w:tentative="1">
+      <w:start w:val="1"/>
+      <w:numFmt w:val="bullet"/>
+      <w:lvlText w:val=""/>
+      <w:lvlJc w:val="left"/>
+      <w:pPr>
+        <w:tabs>
+          <w:tab w:val="num" w:pos="5760"/>
+        </w:tabs>
+        <w:ind w:left="5760" w:hanging="360"/>
+      </w:pPr>
+      <w:rPr>
+        <w:rFonts w:ascii="Wingdings" w:hAnsi="Wingdings" w:hint="default"/>
+        <w:sz w:val="20"/>
+      </w:rPr>
+    </w:lvl>
+    <w:lvl w:ilvl="8" w:tentative="1">
+      <w:start w:val="1"/>
+      <w:numFmt w:val="bullet"/>
+      <w:lvlText w:val=""/>
+      <w:lvlJc w:val="left"/>
+      <w:pPr>
+        <w:tabs>
+          <w:tab w:val="num" w:pos="6480"/>
+        </w:tabs>
+        <w:ind w:left="6480" w:hanging="360"/>
+      </w:pPr>
+      <w:rPr>
+        <w:rFonts w:ascii="Wingdings" w:hAnsi="Wingdings" w:hint="default"/>
+        <w:sz w:val="20"/>
+      </w:rPr>
+    </w:lvl>
+  </w:abstractNum>
+  <w:abstractNum w:abstractNumId="13" w15:restartNumberingAfterBreak="0">
     <w:nsid w:val="40AE15A9"/>
     <w:multiLevelType w:val="multilevel"/>
     <w:tmpl w:val="4622D6A2"/>
@@ -5577,7 +7375,7 @@
       </w:rPr>
     </w:lvl>
   </w:abstractNum>
-  <w:abstractNum w:abstractNumId="10" w15:restartNumberingAfterBreak="0">
+  <w:abstractNum w:abstractNumId="14" w15:restartNumberingAfterBreak="0">
     <w:nsid w:val="4BB812BB"/>
     <w:multiLevelType w:val="hybridMultilevel"/>
     <w:tmpl w:val="B9BC14CC"/>
@@ -5690,7 +7488,7 @@
       </w:rPr>
     </w:lvl>
   </w:abstractNum>
-  <w:abstractNum w:abstractNumId="11" w15:restartNumberingAfterBreak="0">
+  <w:abstractNum w:abstractNumId="15" w15:restartNumberingAfterBreak="0">
     <w:nsid w:val="4FFE04F8"/>
     <w:multiLevelType w:val="hybridMultilevel"/>
     <w:tmpl w:val="90463A1C"/>
@@ -5803,7 +7601,7 @@
       </w:rPr>
     </w:lvl>
   </w:abstractNum>
-  <w:abstractNum w:abstractNumId="12" w15:restartNumberingAfterBreak="0">
+  <w:abstractNum w:abstractNumId="16" w15:restartNumberingAfterBreak="0">
     <w:nsid w:val="7EFD172B"/>
     <w:multiLevelType w:val="hybridMultilevel"/>
     <w:tmpl w:val="1FB48E52"/>
@@ -5913,6 +7711,155 @@
       </w:pPr>
       <w:rPr>
         <w:rFonts w:ascii="Wingdings" w:hAnsi="Wingdings" w:hint="default"/>
+      </w:rPr>
+    </w:lvl>
+  </w:abstractNum>
+  <w:abstractNum w:abstractNumId="17" w15:restartNumberingAfterBreak="0">
+    <w:nsid w:val="7F8D15B4"/>
+    <w:multiLevelType w:val="multilevel"/>
+    <w:tmpl w:val="92CAE148"/>
+    <w:lvl w:ilvl="0">
+      <w:start w:val="1"/>
+      <w:numFmt w:val="bullet"/>
+      <w:lvlText w:val=""/>
+      <w:lvlJc w:val="left"/>
+      <w:pPr>
+        <w:tabs>
+          <w:tab w:val="num" w:pos="720"/>
+        </w:tabs>
+        <w:ind w:left="720" w:hanging="360"/>
+      </w:pPr>
+      <w:rPr>
+        <w:rFonts w:ascii="Symbol" w:hAnsi="Symbol" w:hint="default"/>
+        <w:sz w:val="20"/>
+      </w:rPr>
+    </w:lvl>
+    <w:lvl w:ilvl="1" w:tentative="1">
+      <w:start w:val="1"/>
+      <w:numFmt w:val="bullet"/>
+      <w:lvlText w:val="o"/>
+      <w:lvlJc w:val="left"/>
+      <w:pPr>
+        <w:tabs>
+          <w:tab w:val="num" w:pos="1440"/>
+        </w:tabs>
+        <w:ind w:left="1440" w:hanging="360"/>
+      </w:pPr>
+      <w:rPr>
+        <w:rFonts w:ascii="Courier New" w:hAnsi="Courier New" w:hint="default"/>
+        <w:sz w:val="20"/>
+      </w:rPr>
+    </w:lvl>
+    <w:lvl w:ilvl="2" w:tentative="1">
+      <w:start w:val="1"/>
+      <w:numFmt w:val="bullet"/>
+      <w:lvlText w:val=""/>
+      <w:lvlJc w:val="left"/>
+      <w:pPr>
+        <w:tabs>
+          <w:tab w:val="num" w:pos="2160"/>
+        </w:tabs>
+        <w:ind w:left="2160" w:hanging="360"/>
+      </w:pPr>
+      <w:rPr>
+        <w:rFonts w:ascii="Wingdings" w:hAnsi="Wingdings" w:hint="default"/>
+        <w:sz w:val="20"/>
+      </w:rPr>
+    </w:lvl>
+    <w:lvl w:ilvl="3" w:tentative="1">
+      <w:start w:val="1"/>
+      <w:numFmt w:val="bullet"/>
+      <w:lvlText w:val=""/>
+      <w:lvlJc w:val="left"/>
+      <w:pPr>
+        <w:tabs>
+          <w:tab w:val="num" w:pos="2880"/>
+        </w:tabs>
+        <w:ind w:left="2880" w:hanging="360"/>
+      </w:pPr>
+      <w:rPr>
+        <w:rFonts w:ascii="Wingdings" w:hAnsi="Wingdings" w:hint="default"/>
+        <w:sz w:val="20"/>
+      </w:rPr>
+    </w:lvl>
+    <w:lvl w:ilvl="4" w:tentative="1">
+      <w:start w:val="1"/>
+      <w:numFmt w:val="bullet"/>
+      <w:lvlText w:val=""/>
+      <w:lvlJc w:val="left"/>
+      <w:pPr>
+        <w:tabs>
+          <w:tab w:val="num" w:pos="3600"/>
+        </w:tabs>
+        <w:ind w:left="3600" w:hanging="360"/>
+      </w:pPr>
+      <w:rPr>
+        <w:rFonts w:ascii="Wingdings" w:hAnsi="Wingdings" w:hint="default"/>
+        <w:sz w:val="20"/>
+      </w:rPr>
+    </w:lvl>
+    <w:lvl w:ilvl="5" w:tentative="1">
+      <w:start w:val="1"/>
+      <w:numFmt w:val="bullet"/>
+      <w:lvlText w:val=""/>
+      <w:lvlJc w:val="left"/>
+      <w:pPr>
+        <w:tabs>
+          <w:tab w:val="num" w:pos="4320"/>
+        </w:tabs>
+        <w:ind w:left="4320" w:hanging="360"/>
+      </w:pPr>
+      <w:rPr>
+        <w:rFonts w:ascii="Wingdings" w:hAnsi="Wingdings" w:hint="default"/>
+        <w:sz w:val="20"/>
+      </w:rPr>
+    </w:lvl>
+    <w:lvl w:ilvl="6" w:tentative="1">
+      <w:start w:val="1"/>
+      <w:numFmt w:val="bullet"/>
+      <w:lvlText w:val=""/>
+      <w:lvlJc w:val="left"/>
+      <w:pPr>
+        <w:tabs>
+          <w:tab w:val="num" w:pos="5040"/>
+        </w:tabs>
+        <w:ind w:left="5040" w:hanging="360"/>
+      </w:pPr>
+      <w:rPr>
+        <w:rFonts w:ascii="Wingdings" w:hAnsi="Wingdings" w:hint="default"/>
+        <w:sz w:val="20"/>
+      </w:rPr>
+    </w:lvl>
+    <w:lvl w:ilvl="7" w:tentative="1">
+      <w:start w:val="1"/>
+      <w:numFmt w:val="bullet"/>
+      <w:lvlText w:val=""/>
+      <w:lvlJc w:val="left"/>
+      <w:pPr>
+        <w:tabs>
+          <w:tab w:val="num" w:pos="5760"/>
+        </w:tabs>
+        <w:ind w:left="5760" w:hanging="360"/>
+      </w:pPr>
+      <w:rPr>
+        <w:rFonts w:ascii="Wingdings" w:hAnsi="Wingdings" w:hint="default"/>
+        <w:sz w:val="20"/>
+      </w:rPr>
+    </w:lvl>
+    <w:lvl w:ilvl="8" w:tentative="1">
+      <w:start w:val="1"/>
+      <w:numFmt w:val="bullet"/>
+      <w:lvlText w:val=""/>
+      <w:lvlJc w:val="left"/>
+      <w:pPr>
+        <w:tabs>
+          <w:tab w:val="num" w:pos="6480"/>
+        </w:tabs>
+        <w:ind w:left="6480" w:hanging="360"/>
+      </w:pPr>
+      <w:rPr>
+        <w:rFonts w:ascii="Wingdings" w:hAnsi="Wingdings" w:hint="default"/>
+        <w:sz w:val="20"/>
       </w:rPr>
     </w:lvl>
   </w:abstractNum>
@@ -5920,28 +7867,28 @@
     <w:abstractNumId w:val="1"/>
   </w:num>
   <w:num w:numId="2" w16cid:durableId="1335840007">
-    <w:abstractNumId w:val="10"/>
+    <w:abstractNumId w:val="14"/>
   </w:num>
   <w:num w:numId="3" w16cid:durableId="2126342479">
-    <w:abstractNumId w:val="8"/>
+    <w:abstractNumId w:val="11"/>
   </w:num>
   <w:num w:numId="4" w16cid:durableId="2127002448">
-    <w:abstractNumId w:val="12"/>
+    <w:abstractNumId w:val="16"/>
   </w:num>
   <w:num w:numId="5" w16cid:durableId="823132378">
-    <w:abstractNumId w:val="11"/>
+    <w:abstractNumId w:val="15"/>
   </w:num>
   <w:num w:numId="6" w16cid:durableId="440222574">
     <w:abstractNumId w:val="3"/>
   </w:num>
   <w:num w:numId="7" w16cid:durableId="27680315">
-    <w:abstractNumId w:val="5"/>
+    <w:abstractNumId w:val="7"/>
   </w:num>
   <w:num w:numId="8" w16cid:durableId="250510932">
-    <w:abstractNumId w:val="7"/>
+    <w:abstractNumId w:val="10"/>
   </w:num>
   <w:num w:numId="9" w16cid:durableId="1121608103">
-    <w:abstractNumId w:val="9"/>
+    <w:abstractNumId w:val="13"/>
   </w:num>
   <w:num w:numId="10" w16cid:durableId="88503663">
     <w:abstractNumId w:val="4"/>
@@ -5950,10 +7897,25 @@
     <w:abstractNumId w:val="2"/>
   </w:num>
   <w:num w:numId="12" w16cid:durableId="1885826308">
-    <w:abstractNumId w:val="6"/>
+    <w:abstractNumId w:val="9"/>
   </w:num>
   <w:num w:numId="13" w16cid:durableId="770049283">
     <w:abstractNumId w:val="0"/>
+  </w:num>
+  <w:num w:numId="14" w16cid:durableId="981419930">
+    <w:abstractNumId w:val="5"/>
+  </w:num>
+  <w:num w:numId="15" w16cid:durableId="648553194">
+    <w:abstractNumId w:val="12"/>
+  </w:num>
+  <w:num w:numId="16" w16cid:durableId="189032665">
+    <w:abstractNumId w:val="17"/>
+  </w:num>
+  <w:num w:numId="17" w16cid:durableId="1673415509">
+    <w:abstractNumId w:val="6"/>
+  </w:num>
+  <w:num w:numId="18" w16cid:durableId="218516249">
+    <w:abstractNumId w:val="8"/>
   </w:num>
 </w:numbering>
 </file>
@@ -6561,7 +8523,6 @@
   <w:style w:type="character" w:default="1" w:styleId="DefaultParagraphFont">
     <w:name w:val="Default Paragraph Font"/>
     <w:uiPriority w:val="1"/>
-    <w:semiHidden/>
     <w:unhideWhenUsed/>
   </w:style>
   <w:style w:type="table" w:default="1" w:styleId="TableNormal">

</xml_diff>

<commit_message>
updated FU analysis 3
</commit_message>
<xml_diff>
--- a/documentation/nicosys-healthcare-portfolio-documentation.docx
+++ b/documentation/nicosys-healthcare-portfolio-documentation.docx
@@ -14,6 +14,13 @@
           <w:b/>
           <w:bCs/>
         </w:rPr>
+        <w:t xml:space="preserve"> </w:t>
+      </w:r>
+      <w:r>
+        <w:rPr>
+          <w:b/>
+          <w:bCs/>
+        </w:rPr>
         <w:t xml:space="preserve">Phase 5 -   </w:t>
       </w:r>
     </w:p>
@@ -126,11 +133,9 @@
           <w:numId w:val="14"/>
         </w:numPr>
       </w:pPr>
-      <w:proofErr w:type="spellStart"/>
       <w:r>
         <w:t>er_visits</w:t>
       </w:r>
-      <w:proofErr w:type="spellEnd"/>
     </w:p>
     <w:p>
       <w:pPr>
@@ -139,13 +144,8 @@
           <w:numId w:val="14"/>
         </w:numPr>
       </w:pPr>
-      <w:proofErr w:type="spellStart"/>
-      <w:r>
-        <w:t>patient_id</w:t>
-      </w:r>
-      <w:proofErr w:type="spellEnd"/>
-      <w:r>
-        <w:t xml:space="preserve"> for the inner join</w:t>
+      <w:r>
+        <w:t>patient_id for the inner join</w:t>
       </w:r>
     </w:p>
     <w:p>
@@ -155,11 +155,9 @@
           <w:numId w:val="14"/>
         </w:numPr>
       </w:pPr>
-      <w:proofErr w:type="spellStart"/>
       <w:r>
         <w:t>wait_time_minutes</w:t>
       </w:r>
-      <w:proofErr w:type="spellEnd"/>
     </w:p>
     <w:p>
       <w:pPr>
@@ -179,13 +177,8 @@
           <w:numId w:val="14"/>
         </w:numPr>
       </w:pPr>
-      <w:proofErr w:type="spellStart"/>
-      <w:r>
-        <w:t>patient_id</w:t>
-      </w:r>
-      <w:proofErr w:type="spellEnd"/>
-      <w:r>
-        <w:t xml:space="preserve"> for the inner</w:t>
+      <w:r>
+        <w:t>patient_id for the inner</w:t>
       </w:r>
     </w:p>
     <w:p>
@@ -240,13 +233,8 @@
       </w:r>
     </w:p>
     <w:p>
-      <w:proofErr w:type="spellStart"/>
-      <w:r>
-        <w:t>Leadershiop</w:t>
-      </w:r>
-      <w:proofErr w:type="spellEnd"/>
-      <w:r>
-        <w:t xml:space="preserve"> of Valley Regional Medical Center</w:t>
+      <w:r>
+        <w:t>Leadershiop of Valley Regional Medical Center</w:t>
       </w:r>
     </w:p>
     <w:p/>
@@ -274,36 +262,12 @@
     </w:p>
     <w:p>
       <w:r>
-        <w:t xml:space="preserve">The age groups that </w:t>
-      </w:r>
-      <w:proofErr w:type="spellStart"/>
-      <w:r>
-        <w:t>expereince</w:t>
-      </w:r>
-      <w:proofErr w:type="spellEnd"/>
-      <w:r>
-        <w:t xml:space="preserve"> the longest ER wait times or 180 minutes are, 53, 61, 74, and 76. </w:t>
-      </w:r>
-    </w:p>
-    <w:p>
-      <w:r>
-        <w:t xml:space="preserve">However, the wait time that has the most </w:t>
-      </w:r>
-      <w:proofErr w:type="spellStart"/>
-      <w:r>
-        <w:t>occurance</w:t>
-      </w:r>
-      <w:proofErr w:type="spellEnd"/>
-      <w:r>
-        <w:t xml:space="preserve"> is 179 </w:t>
-      </w:r>
-      <w:proofErr w:type="spellStart"/>
-      <w:r>
-        <w:t>mintues</w:t>
-      </w:r>
-      <w:proofErr w:type="spellEnd"/>
-      <w:r>
-        <w:t xml:space="preserve">, being experienced by 8 age groups. This is double that of age groups experiencing 180 minute wait times. </w:t>
+        <w:t xml:space="preserve">The age groups that expereince the longest ER wait times or 180 minutes are, 53, 61, 74, and 76. </w:t>
+      </w:r>
+    </w:p>
+    <w:p>
+      <w:r>
+        <w:t xml:space="preserve">However, the wait time that has the most occurance is 179 mintues, being experienced by 8 age groups. This is double that of age groups experiencing 180 minute wait times. </w:t>
       </w:r>
     </w:p>
     <w:p/>
@@ -341,32 +305,14 @@
     <w:p>
       <w:r>
         <w:tab/>
-        <w:t xml:space="preserve">  </w:t>
-      </w:r>
-      <w:proofErr w:type="spellStart"/>
-      <w:r>
-        <w:t>pts.age</w:t>
-      </w:r>
-      <w:proofErr w:type="spellEnd"/>
+        <w:t xml:space="preserve">  pts.age</w:t>
+      </w:r>
     </w:p>
     <w:p>
       <w:r>
         <w:tab/>
-        <w:t>, max(</w:t>
-      </w:r>
-      <w:proofErr w:type="spellStart"/>
-      <w:r>
-        <w:t>wait_time_minutes</w:t>
-      </w:r>
-      <w:proofErr w:type="spellEnd"/>
-      <w:r>
-        <w:t xml:space="preserve">) </w:t>
-      </w:r>
-      <w:proofErr w:type="spellStart"/>
-      <w:r>
-        <w:t>max_wait_time_minutes</w:t>
-      </w:r>
-      <w:proofErr w:type="spellEnd"/>
+        <w:t>, max(wait_time_minutes) max_wait_time_minutes</w:t>
+      </w:r>
     </w:p>
     <w:p>
       <w:r>
@@ -377,14 +323,7 @@
       <w:r>
         <w:lastRenderedPageBreak/>
         <w:tab/>
-      </w:r>
-      <w:proofErr w:type="spellStart"/>
-      <w:r>
-        <w:t>er_visits</w:t>
-      </w:r>
-      <w:proofErr w:type="spellEnd"/>
-      <w:r>
-        <w:t xml:space="preserve"> er</w:t>
+        <w:t>er_visits er</w:t>
       </w:r>
     </w:p>
     <w:p>
@@ -405,21 +344,8 @@
       </w:r>
       <w:r>
         <w:tab/>
-        <w:t xml:space="preserve">on </w:t>
-      </w:r>
-      <w:proofErr w:type="spellStart"/>
-      <w:r>
-        <w:t>er.patient_id</w:t>
-      </w:r>
-      <w:proofErr w:type="spellEnd"/>
-      <w:r>
-        <w:t>=</w:t>
-      </w:r>
-      <w:proofErr w:type="spellStart"/>
-      <w:r>
-        <w:t>pts.patient_id</w:t>
-      </w:r>
-      <w:proofErr w:type="spellEnd"/>
+        <w:t>on er.patient_id=pts.patient_id</w:t>
+      </w:r>
     </w:p>
     <w:p>
       <w:r>
@@ -429,12 +355,8 @@
     <w:p>
       <w:r>
         <w:tab/>
-      </w:r>
-      <w:proofErr w:type="spellStart"/>
-      <w:r>
         <w:t>pts.age</w:t>
       </w:r>
-      <w:proofErr w:type="spellEnd"/>
     </w:p>
     <w:p>
       <w:r>
@@ -444,14 +366,7 @@
     <w:p>
       <w:r>
         <w:tab/>
-      </w:r>
-      <w:proofErr w:type="spellStart"/>
-      <w:r>
-        <w:t>max_wait_time_minutes</w:t>
-      </w:r>
-      <w:proofErr w:type="spellEnd"/>
-      <w:r>
-        <w:t xml:space="preserve"> desc</w:t>
+        <w:t>max_wait_time_minutes desc</w:t>
       </w:r>
     </w:p>
     <w:p>
@@ -462,23 +377,7 @@
     <w:p/>
     <w:p>
       <w:r>
-        <w:t xml:space="preserve">--Of the wait times, which occurs the most? 179 </w:t>
-      </w:r>
-      <w:proofErr w:type="spellStart"/>
-      <w:r>
-        <w:t>mintues</w:t>
-      </w:r>
-      <w:proofErr w:type="spellEnd"/>
-      <w:r>
-        <w:t xml:space="preserve"> occurs 8 times compared to 180 minutes </w:t>
-      </w:r>
-      <w:proofErr w:type="spellStart"/>
-      <w:r>
-        <w:t>occuring</w:t>
-      </w:r>
-      <w:proofErr w:type="spellEnd"/>
-      <w:r>
-        <w:t xml:space="preserve"> 4 times. </w:t>
+        <w:t xml:space="preserve">--Of the wait times, which occurs the most? 179 mintues occurs 8 times compared to 180 minutes occuring 4 times. </w:t>
       </w:r>
     </w:p>
     <w:p>
@@ -489,26 +388,13 @@
     <w:p>
       <w:r>
         <w:tab/>
-        <w:t xml:space="preserve">  </w:t>
-      </w:r>
-      <w:proofErr w:type="spellStart"/>
-      <w:r>
-        <w:t>max_wait_time_minutes</w:t>
-      </w:r>
-      <w:proofErr w:type="spellEnd"/>
+        <w:t xml:space="preserve">  max_wait_time_minutes</w:t>
+      </w:r>
     </w:p>
     <w:p>
       <w:r>
         <w:tab/>
-        <w:t>, count(</w:t>
-      </w:r>
-      <w:proofErr w:type="spellStart"/>
-      <w:r>
-        <w:t>max_wait_time_minutes</w:t>
-      </w:r>
-      <w:proofErr w:type="spellEnd"/>
-      <w:r>
-        <w:t>)</w:t>
+        <w:t>, count(max_wait_time_minutes)</w:t>
       </w:r>
     </w:p>
     <w:p>
@@ -540,13 +426,8 @@
       </w:r>
       <w:r>
         <w:tab/>
-        <w:t xml:space="preserve">  </w:t>
-      </w:r>
-      <w:proofErr w:type="spellStart"/>
-      <w:r>
-        <w:t>pts.age</w:t>
-      </w:r>
-      <w:proofErr w:type="spellEnd"/>
+        <w:t xml:space="preserve">  pts.age</w:t>
+      </w:r>
     </w:p>
     <w:p>
       <w:r>
@@ -557,21 +438,8 @@
       </w:r>
       <w:r>
         <w:tab/>
-        <w:t>, max(</w:t>
-      </w:r>
-      <w:proofErr w:type="spellStart"/>
-      <w:r>
-        <w:t>wait_time_minutes</w:t>
-      </w:r>
-      <w:proofErr w:type="spellEnd"/>
-      <w:r>
-        <w:t xml:space="preserve">) </w:t>
-      </w:r>
-      <w:proofErr w:type="spellStart"/>
-      <w:r>
-        <w:t>max_wait_time_minutes</w:t>
-      </w:r>
-      <w:proofErr w:type="spellEnd"/>
+        <w:t>, max(wait_time_minutes) max_wait_time_minutes</w:t>
+      </w:r>
     </w:p>
     <w:p>
       <w:r>
@@ -591,14 +459,7 @@
       </w:r>
       <w:r>
         <w:tab/>
-      </w:r>
-      <w:proofErr w:type="spellStart"/>
-      <w:r>
-        <w:t>er_visits</w:t>
-      </w:r>
-      <w:proofErr w:type="spellEnd"/>
-      <w:r>
-        <w:t xml:space="preserve"> er</w:t>
+        <w:t>er_visits er</w:t>
       </w:r>
     </w:p>
     <w:p>
@@ -631,21 +492,8 @@
       </w:r>
       <w:r>
         <w:tab/>
-        <w:t xml:space="preserve">on </w:t>
-      </w:r>
-      <w:proofErr w:type="spellStart"/>
-      <w:r>
-        <w:t>er.patient_id</w:t>
-      </w:r>
-      <w:proofErr w:type="spellEnd"/>
-      <w:r>
-        <w:t>=</w:t>
-      </w:r>
-      <w:proofErr w:type="spellStart"/>
-      <w:r>
-        <w:t>pts.patient_id</w:t>
-      </w:r>
-      <w:proofErr w:type="spellEnd"/>
+        <w:t>on er.patient_id=pts.patient_id</w:t>
+      </w:r>
     </w:p>
     <w:p>
       <w:r>
@@ -665,12 +513,8 @@
       </w:r>
       <w:r>
         <w:tab/>
-      </w:r>
-      <w:proofErr w:type="spellStart"/>
-      <w:r>
         <w:t>pts.age</w:t>
       </w:r>
-      <w:proofErr w:type="spellEnd"/>
     </w:p>
     <w:p>
       <w:r>
@@ -691,14 +535,7 @@
       </w:r>
       <w:r>
         <w:tab/>
-      </w:r>
-      <w:proofErr w:type="spellStart"/>
-      <w:r>
-        <w:t>max_wait_time_minutes</w:t>
-      </w:r>
-      <w:proofErr w:type="spellEnd"/>
-      <w:r>
-        <w:t xml:space="preserve"> desc</w:t>
+        <w:t>max_wait_time_minutes desc</w:t>
       </w:r>
     </w:p>
     <w:p>
@@ -715,12 +552,8 @@
     <w:p>
       <w:r>
         <w:tab/>
-      </w:r>
-      <w:proofErr w:type="spellStart"/>
-      <w:r>
         <w:t>max_wait_time_minutes</w:t>
       </w:r>
-      <w:proofErr w:type="spellEnd"/>
     </w:p>
     <w:p>
       <w:r>
@@ -730,14 +563,7 @@
     <w:p>
       <w:r>
         <w:tab/>
-      </w:r>
-      <w:proofErr w:type="spellStart"/>
-      <w:r>
-        <w:t>max_wait_time_minutes</w:t>
-      </w:r>
-      <w:proofErr w:type="spellEnd"/>
-      <w:r>
-        <w:t xml:space="preserve"> desc</w:t>
+        <w:t>max_wait_time_minutes desc</w:t>
       </w:r>
     </w:p>
     <w:p>
@@ -764,32 +590,14 @@
     <w:p>
       <w:r>
         <w:tab/>
-        <w:t xml:space="preserve">    </w:t>
-      </w:r>
-      <w:proofErr w:type="spellStart"/>
-      <w:r>
-        <w:t>pts.age</w:t>
-      </w:r>
-      <w:proofErr w:type="spellEnd"/>
+        <w:t xml:space="preserve">    pts.age</w:t>
+      </w:r>
     </w:p>
     <w:p>
       <w:r>
         <w:tab/>
-        <w:t>--, max(</w:t>
-      </w:r>
-      <w:proofErr w:type="spellStart"/>
-      <w:r>
-        <w:t>wait_time_minutes</w:t>
-      </w:r>
-      <w:proofErr w:type="spellEnd"/>
-      <w:r>
-        <w:t xml:space="preserve">) </w:t>
-      </w:r>
-      <w:proofErr w:type="spellStart"/>
-      <w:r>
-        <w:t>max_wait_time_minutes</w:t>
-      </w:r>
-      <w:proofErr w:type="spellEnd"/>
+        <w:t>--, max(wait_time_minutes) max_wait_time_minutes</w:t>
+      </w:r>
     </w:p>
     <w:p>
       <w:r>
@@ -799,14 +607,7 @@
     <w:p>
       <w:r>
         <w:tab/>
-      </w:r>
-      <w:proofErr w:type="spellStart"/>
-      <w:r>
-        <w:t>er_visits</w:t>
-      </w:r>
-      <w:proofErr w:type="spellEnd"/>
-      <w:r>
-        <w:t xml:space="preserve"> er</w:t>
+        <w:t>er_visits er</w:t>
       </w:r>
     </w:p>
     <w:p>
@@ -827,21 +628,8 @@
       </w:r>
       <w:r>
         <w:tab/>
-        <w:t xml:space="preserve">on </w:t>
-      </w:r>
-      <w:proofErr w:type="spellStart"/>
-      <w:r>
-        <w:t>er.patient_id</w:t>
-      </w:r>
-      <w:proofErr w:type="spellEnd"/>
-      <w:r>
-        <w:t>=</w:t>
-      </w:r>
-      <w:proofErr w:type="spellStart"/>
-      <w:r>
-        <w:t>pts.patient_id</w:t>
-      </w:r>
-      <w:proofErr w:type="spellEnd"/>
+        <w:t>on er.patient_id=pts.patient_id</w:t>
+      </w:r>
     </w:p>
     <w:p>
       <w:r>
@@ -851,14 +639,7 @@
     <w:p>
       <w:r>
         <w:tab/>
-      </w:r>
-      <w:proofErr w:type="spellStart"/>
-      <w:r>
-        <w:t>wait_time_minutes</w:t>
-      </w:r>
-      <w:proofErr w:type="spellEnd"/>
-      <w:r>
-        <w:t xml:space="preserve"> = 179 --replace the wait time with 180 to see age groups experiencing 180 min wait times.</w:t>
+        <w:t>wait_time_minutes = 179 --replace the wait time with 180 to see age groups experiencing 180 min wait times.</w:t>
       </w:r>
     </w:p>
     <w:p>
@@ -869,12 +650,8 @@
     <w:p>
       <w:r>
         <w:tab/>
-      </w:r>
-      <w:proofErr w:type="spellStart"/>
-      <w:r>
         <w:t>pts.age</w:t>
       </w:r>
-      <w:proofErr w:type="spellEnd"/>
     </w:p>
     <w:p>
       <w:r>
@@ -966,13 +743,8 @@
           <w:numId w:val="15"/>
         </w:numPr>
       </w:pPr>
-      <w:proofErr w:type="spellStart"/>
-      <w:r>
-        <w:t>patient_id</w:t>
-      </w:r>
-      <w:proofErr w:type="spellEnd"/>
-      <w:r>
-        <w:t xml:space="preserve"> for inner join</w:t>
+      <w:r>
+        <w:t>patient_id for inner join</w:t>
       </w:r>
     </w:p>
     <w:p>
@@ -993,11 +765,9 @@
           <w:numId w:val="15"/>
         </w:numPr>
       </w:pPr>
-      <w:proofErr w:type="spellStart"/>
       <w:r>
         <w:t>er_visits</w:t>
       </w:r>
-      <w:proofErr w:type="spellEnd"/>
       <w:r>
         <w:t xml:space="preserve"> er</w:t>
       </w:r>
@@ -1009,13 +779,8 @@
           <w:numId w:val="15"/>
         </w:numPr>
       </w:pPr>
-      <w:proofErr w:type="spellStart"/>
-      <w:r>
-        <w:t>patient_id</w:t>
-      </w:r>
-      <w:proofErr w:type="spellEnd"/>
-      <w:r>
-        <w:t xml:space="preserve"> for inner join</w:t>
+      <w:r>
+        <w:t>patient_id for inner join</w:t>
       </w:r>
     </w:p>
     <w:p>
@@ -1026,15 +791,7 @@
         </w:numPr>
       </w:pPr>
       <w:r>
-        <w:t>count(</w:t>
-      </w:r>
-      <w:proofErr w:type="spellStart"/>
-      <w:r>
-        <w:t>patient_id</w:t>
-      </w:r>
-      <w:proofErr w:type="spellEnd"/>
-      <w:r>
-        <w:t>)</w:t>
+        <w:t>count(patient_id)</w:t>
       </w:r>
     </w:p>
     <w:p>
@@ -1046,13 +803,8 @@
         </w:numPr>
       </w:pPr>
       <w:r>
-        <w:t xml:space="preserve">inner join on </w:t>
-      </w:r>
-      <w:proofErr w:type="spellStart"/>
-      <w:r>
-        <w:t>patient_id</w:t>
-      </w:r>
-      <w:proofErr w:type="spellEnd"/>
+        <w:t>inner join on patient_id</w:t>
+      </w:r>
     </w:p>
     <w:p>
       <w:pPr>
@@ -1063,13 +815,8 @@
         </w:numPr>
       </w:pPr>
       <w:r>
-        <w:t xml:space="preserve">group by </w:t>
-      </w:r>
-      <w:proofErr w:type="spellStart"/>
-      <w:r>
-        <w:t>pts.city</w:t>
-      </w:r>
-      <w:proofErr w:type="spellEnd"/>
+        <w:t>group by pts.city</w:t>
+      </w:r>
     </w:p>
     <w:p/>
     <w:p>
@@ -2382,23 +2129,7 @@
           <w:b/>
           <w:bCs/>
         </w:rPr>
-        <w:t xml:space="preserve">: For each severity level, what’s the amount of patients seen during peak times? In </w:t>
-      </w:r>
-      <w:proofErr w:type="spellStart"/>
-      <w:r>
-        <w:rPr>
-          <w:b/>
-          <w:bCs/>
-        </w:rPr>
-        <w:t>sql</w:t>
-      </w:r>
-      <w:proofErr w:type="spellEnd"/>
-      <w:r>
-        <w:rPr>
-          <w:b/>
-          <w:bCs/>
-        </w:rPr>
-        <w:t xml:space="preserve">. </w:t>
+        <w:t xml:space="preserve">: For each severity level, what’s the amount of patients seen during peak times? In sql. </w:t>
       </w:r>
     </w:p>
     <w:p>
@@ -2492,15 +2223,7 @@
     <w:p/>
     <w:p>
       <w:r>
-        <w:t xml:space="preserve">each worksheet will more accurately be 1 for each business question I answered. So refer back to the </w:t>
-      </w:r>
-      <w:proofErr w:type="spellStart"/>
-      <w:r>
-        <w:t>the</w:t>
-      </w:r>
-      <w:proofErr w:type="spellEnd"/>
-      <w:r>
-        <w:t xml:space="preserve"> questions I answered in Phase 2, and that should be the number of worksheets in Phase 3. </w:t>
+        <w:t>each worksheet will more accurately be 1 for each business question I answered. So refer back to the the questions I answered in Phase 2, and that should be the number of worksheets in Phase 3. </w:t>
       </w:r>
     </w:p>
     <w:p>
@@ -2946,13 +2669,8 @@
           <w:numId w:val="4"/>
         </w:numPr>
       </w:pPr>
-      <w:proofErr w:type="spellStart"/>
-      <w:r>
-        <w:t>Er_visits</w:t>
-      </w:r>
-      <w:proofErr w:type="spellEnd"/>
-      <w:r>
-        <w:t>:</w:t>
+      <w:r>
+        <w:t>Er_visits:</w:t>
       </w:r>
     </w:p>
     <w:p>
@@ -2963,13 +2681,8 @@
           <w:numId w:val="4"/>
         </w:numPr>
       </w:pPr>
-      <w:proofErr w:type="spellStart"/>
-      <w:r>
-        <w:t>Visit_id</w:t>
-      </w:r>
-      <w:proofErr w:type="spellEnd"/>
-      <w:r>
-        <w:t xml:space="preserve"> (PK)</w:t>
+      <w:r>
+        <w:t>Visit_id (PK)</w:t>
       </w:r>
     </w:p>
     <w:p>
@@ -2980,13 +2693,8 @@
           <w:numId w:val="4"/>
         </w:numPr>
       </w:pPr>
-      <w:proofErr w:type="spellStart"/>
-      <w:r>
-        <w:t>Patient_id</w:t>
-      </w:r>
-      <w:proofErr w:type="spellEnd"/>
-      <w:r>
-        <w:t xml:space="preserve"> (FK)</w:t>
+      <w:r>
+        <w:t>Patient_id (FK)</w:t>
       </w:r>
     </w:p>
     <w:p>
@@ -3012,13 +2720,8 @@
           <w:numId w:val="4"/>
         </w:numPr>
       </w:pPr>
-      <w:proofErr w:type="spellStart"/>
-      <w:r>
-        <w:t>Appointment_id</w:t>
-      </w:r>
-      <w:proofErr w:type="spellEnd"/>
-      <w:r>
-        <w:t xml:space="preserve"> (PK)</w:t>
+      <w:r>
+        <w:t>Appointment_id (PK)</w:t>
       </w:r>
     </w:p>
     <w:p>
@@ -3029,13 +2732,8 @@
           <w:numId w:val="4"/>
         </w:numPr>
       </w:pPr>
-      <w:proofErr w:type="spellStart"/>
-      <w:r>
-        <w:t>Patient_id</w:t>
-      </w:r>
-      <w:proofErr w:type="spellEnd"/>
-      <w:r>
-        <w:t xml:space="preserve"> (FK)</w:t>
+      <w:r>
+        <w:t>Patient_id (FK)</w:t>
       </w:r>
     </w:p>
     <w:p>
@@ -3046,14 +2744,9 @@
           <w:numId w:val="4"/>
         </w:numPr>
       </w:pPr>
-      <w:proofErr w:type="spellStart"/>
       <w:r>
         <w:lastRenderedPageBreak/>
-        <w:t>Provider_id</w:t>
-      </w:r>
-      <w:proofErr w:type="spellEnd"/>
-      <w:r>
-        <w:t xml:space="preserve"> (FK</w:t>
+        <w:t>Provider_id (FK</w:t>
       </w:r>
       <w:r>
         <w:t>)</w:t>
@@ -3091,7 +2784,6 @@
           <w:numId w:val="4"/>
         </w:numPr>
       </w:pPr>
-      <w:proofErr w:type="spellStart"/>
       <w:r>
         <w:t>P</w:t>
       </w:r>
@@ -3102,11 +2794,7 @@
         <w:t>tient_</w:t>
       </w:r>
       <w:r>
-        <w:t>id</w:t>
-      </w:r>
-      <w:proofErr w:type="spellEnd"/>
-      <w:r>
-        <w:t xml:space="preserve"> </w:t>
+        <w:t xml:space="preserve">id </w:t>
       </w:r>
       <w:r>
         <w:t>(</w:t>
@@ -3147,7 +2835,6 @@
           <w:numId w:val="4"/>
         </w:numPr>
       </w:pPr>
-      <w:proofErr w:type="spellStart"/>
       <w:r>
         <w:t>P</w:t>
       </w:r>
@@ -3158,11 +2845,7 @@
         <w:t>ider</w:t>
       </w:r>
       <w:r>
-        <w:t>_id</w:t>
-      </w:r>
-      <w:proofErr w:type="spellEnd"/>
-      <w:r>
-        <w:t xml:space="preserve"> </w:t>
+        <w:t xml:space="preserve">_id </w:t>
       </w:r>
       <w:r>
         <w:t>(</w:t>
@@ -3196,7 +2879,6 @@
           <w:numId w:val="3"/>
         </w:numPr>
       </w:pPr>
-      <w:proofErr w:type="spellStart"/>
       <w:r>
         <w:t>Er</w:t>
       </w:r>
@@ -3207,11 +2889,7 @@
         <w:t>vi</w:t>
       </w:r>
       <w:r>
-        <w:t>sits</w:t>
-      </w:r>
-      <w:proofErr w:type="spellEnd"/>
-      <w:r>
-        <w:t xml:space="preserve"> </w:t>
+        <w:t xml:space="preserve">sits </w:t>
       </w:r>
       <w:r>
         <w:t>dat</w:t>
@@ -3482,7 +3160,6 @@
           <w:numId w:val="1"/>
         </w:numPr>
       </w:pPr>
-      <w:proofErr w:type="spellStart"/>
       <w:r>
         <w:t>E</w:t>
       </w:r>
@@ -3496,11 +3173,7 @@
         <w:t>vis</w:t>
       </w:r>
       <w:r>
-        <w:t>its</w:t>
-      </w:r>
-      <w:proofErr w:type="spellEnd"/>
-      <w:r>
-        <w:t>:</w:t>
+        <w:t>its:</w:t>
       </w:r>
     </w:p>
     <w:p>
@@ -3511,7 +3184,6 @@
           <w:numId w:val="1"/>
         </w:numPr>
       </w:pPr>
-      <w:proofErr w:type="spellStart"/>
       <w:r>
         <w:t>V</w:t>
       </w:r>
@@ -3521,7 +3193,6 @@
       <w:r>
         <w:t>sit_id</w:t>
       </w:r>
-      <w:proofErr w:type="spellEnd"/>
     </w:p>
     <w:p>
       <w:pPr>
@@ -3582,7 +3253,6 @@
           <w:numId w:val="1"/>
         </w:numPr>
       </w:pPr>
-      <w:proofErr w:type="spellStart"/>
       <w:r>
         <w:t>P</w:t>
       </w:r>
@@ -3595,7 +3265,6 @@
       <w:r>
         <w:t>_id</w:t>
       </w:r>
-      <w:proofErr w:type="spellEnd"/>
     </w:p>
     <w:p>
       <w:pPr>
@@ -3710,7 +3379,6 @@
           <w:numId w:val="1"/>
         </w:numPr>
       </w:pPr>
-      <w:proofErr w:type="spellStart"/>
       <w:r>
         <w:t>A</w:t>
       </w:r>
@@ -3723,7 +3391,6 @@
       <w:r>
         <w:t>date</w:t>
       </w:r>
-      <w:proofErr w:type="spellEnd"/>
     </w:p>
     <w:p>
       <w:pPr>
@@ -3766,7 +3433,6 @@
           <w:numId w:val="1"/>
         </w:numPr>
       </w:pPr>
-      <w:proofErr w:type="spellStart"/>
       <w:r>
         <w:t>Arrival</w:t>
       </w:r>
@@ -3776,7 +3442,6 @@
       <w:r>
         <w:t>day</w:t>
       </w:r>
-      <w:proofErr w:type="spellEnd"/>
     </w:p>
     <w:p>
       <w:pPr>
@@ -3822,7 +3487,6 @@
           <w:numId w:val="1"/>
         </w:numPr>
       </w:pPr>
-      <w:proofErr w:type="spellStart"/>
       <w:r>
         <w:t>Ar</w:t>
       </w:r>
@@ -3835,7 +3499,6 @@
       <w:r>
         <w:t>r</w:t>
       </w:r>
-      <w:proofErr w:type="spellEnd"/>
     </w:p>
     <w:p>
       <w:pPr>
@@ -3899,7 +3562,6 @@
           <w:numId w:val="1"/>
         </w:numPr>
       </w:pPr>
-      <w:proofErr w:type="spellStart"/>
       <w:r>
         <w:t>S</w:t>
       </w:r>
@@ -3915,7 +3577,6 @@
       <w:r>
         <w:t>el</w:t>
       </w:r>
-      <w:proofErr w:type="spellEnd"/>
     </w:p>
     <w:p>
       <w:pPr>
@@ -3967,7 +3628,6 @@
           <w:numId w:val="1"/>
         </w:numPr>
       </w:pPr>
-      <w:proofErr w:type="spellStart"/>
       <w:r>
         <w:t>Wait_tim</w:t>
       </w:r>
@@ -3980,7 +3640,6 @@
       <w:r>
         <w:t>s</w:t>
       </w:r>
-      <w:proofErr w:type="spellEnd"/>
     </w:p>
     <w:p>
       <w:pPr>
@@ -4032,7 +3691,6 @@
           <w:numId w:val="1"/>
         </w:numPr>
       </w:pPr>
-      <w:proofErr w:type="spellStart"/>
       <w:r>
         <w:t>L</w:t>
       </w:r>
@@ -4054,7 +3712,6 @@
       <w:r>
         <w:t>ours</w:t>
       </w:r>
-      <w:proofErr w:type="spellEnd"/>
     </w:p>
     <w:p>
       <w:pPr>
@@ -4113,15 +3770,7 @@
         </w:numPr>
       </w:pPr>
       <w:r>
-        <w:t>Hospital stay after admission is not included in this field (</w:t>
-      </w:r>
-      <w:proofErr w:type="spellStart"/>
-      <w:r>
-        <w:t>losh</w:t>
-      </w:r>
-      <w:proofErr w:type="spellEnd"/>
-      <w:r>
-        <w:t>)</w:t>
+        <w:t>Hospital stay after admission is not included in this field (losh)</w:t>
       </w:r>
     </w:p>
     <w:p>
@@ -4253,7 +3902,6 @@
           <w:numId w:val="1"/>
         </w:numPr>
       </w:pPr>
-      <w:proofErr w:type="spellStart"/>
       <w:r>
         <w:t>A</w:t>
       </w:r>
@@ -4266,7 +3914,6 @@
       <w:r>
         <w:t>_id</w:t>
       </w:r>
-      <w:proofErr w:type="spellEnd"/>
     </w:p>
     <w:p>
       <w:pPr>
@@ -4297,7 +3944,6 @@
           <w:numId w:val="1"/>
         </w:numPr>
       </w:pPr>
-      <w:proofErr w:type="spellStart"/>
       <w:r>
         <w:t>P</w:t>
       </w:r>
@@ -4307,7 +3953,6 @@
       <w:r>
         <w:t>ent_id</w:t>
       </w:r>
-      <w:proofErr w:type="spellEnd"/>
     </w:p>
     <w:p>
       <w:pPr>
@@ -4335,7 +3980,6 @@
           <w:numId w:val="1"/>
         </w:numPr>
       </w:pPr>
-      <w:proofErr w:type="spellStart"/>
       <w:r>
         <w:t>P</w:t>
       </w:r>
@@ -4345,7 +3989,6 @@
       <w:r>
         <w:t>der_id</w:t>
       </w:r>
-      <w:proofErr w:type="spellEnd"/>
     </w:p>
     <w:p>
       <w:pPr>
@@ -4406,7 +4049,6 @@
           <w:numId w:val="1"/>
         </w:numPr>
       </w:pPr>
-      <w:proofErr w:type="spellStart"/>
       <w:r>
         <w:t>A</w:t>
       </w:r>
@@ -4419,7 +4061,6 @@
       <w:r>
         <w:t>_date</w:t>
       </w:r>
-      <w:proofErr w:type="spellEnd"/>
     </w:p>
     <w:p>
       <w:pPr>
@@ -4441,7 +4082,6 @@
           <w:numId w:val="1"/>
         </w:numPr>
       </w:pPr>
-      <w:proofErr w:type="spellStart"/>
       <w:r>
         <w:t>A</w:t>
       </w:r>
@@ -4454,7 +4094,6 @@
       <w:r>
         <w:t>_day</w:t>
       </w:r>
-      <w:proofErr w:type="spellEnd"/>
     </w:p>
     <w:p>
       <w:pPr>
@@ -4476,7 +4115,6 @@
           <w:numId w:val="1"/>
         </w:numPr>
       </w:pPr>
-      <w:proofErr w:type="spellStart"/>
       <w:r>
         <w:t>A</w:t>
       </w:r>
@@ -4489,7 +4127,6 @@
       <w:r>
         <w:t>pe</w:t>
       </w:r>
-      <w:proofErr w:type="spellEnd"/>
     </w:p>
     <w:p>
       <w:pPr>
@@ -4511,7 +4148,6 @@
           <w:numId w:val="1"/>
         </w:numPr>
       </w:pPr>
-      <w:proofErr w:type="spellStart"/>
       <w:r>
         <w:t>A</w:t>
       </w:r>
@@ -4530,7 +4166,6 @@
       <w:r>
         <w:t>tus</w:t>
       </w:r>
-      <w:proofErr w:type="spellEnd"/>
     </w:p>
     <w:p>
       <w:pPr>
@@ -4555,7 +4190,6 @@
           <w:numId w:val="1"/>
         </w:numPr>
       </w:pPr>
-      <w:proofErr w:type="spellStart"/>
       <w:r>
         <w:t>A</w:t>
       </w:r>
@@ -4580,7 +4214,6 @@
       <w:r>
         <w:t>utes</w:t>
       </w:r>
-      <w:proofErr w:type="spellEnd"/>
     </w:p>
     <w:p>
       <w:pPr>
@@ -4605,7 +4238,6 @@
           <w:numId w:val="1"/>
         </w:numPr>
       </w:pPr>
-      <w:proofErr w:type="spellStart"/>
       <w:r>
         <w:t>P</w:t>
       </w:r>
@@ -4639,7 +4271,6 @@
       <w:r>
         <w:t>e</w:t>
       </w:r>
-      <w:proofErr w:type="spellEnd"/>
       <w:r>
         <w:t xml:space="preserve"> </w:t>
       </w:r>
@@ -4661,13 +4292,8 @@
       <w:r>
         <w:t xml:space="preserve">1-5 </w:t>
       </w:r>
-      <w:proofErr w:type="spellStart"/>
-      <w:r>
-        <w:t>ignifying</w:t>
-      </w:r>
-      <w:proofErr w:type="spellEnd"/>
-      <w:r>
-        <w:t xml:space="preserve"> patient satisfaction</w:t>
+      <w:r>
+        <w:t>ignifying patient satisfaction</w:t>
       </w:r>
     </w:p>
     <w:p>
@@ -4720,11 +4346,9 @@
           <w:numId w:val="1"/>
         </w:numPr>
       </w:pPr>
-      <w:proofErr w:type="spellStart"/>
       <w:r>
         <w:t>Patient_id</w:t>
       </w:r>
-      <w:proofErr w:type="spellEnd"/>
     </w:p>
     <w:p>
       <w:pPr>
@@ -4746,11 +4370,9 @@
           <w:numId w:val="1"/>
         </w:numPr>
       </w:pPr>
-      <w:proofErr w:type="spellStart"/>
       <w:r>
         <w:t>Patient_name</w:t>
       </w:r>
-      <w:proofErr w:type="spellEnd"/>
     </w:p>
     <w:p>
       <w:pPr>
@@ -4869,11 +4491,9 @@
           <w:numId w:val="1"/>
         </w:numPr>
       </w:pPr>
-      <w:proofErr w:type="spellStart"/>
       <w:r>
         <w:t>Provider_id</w:t>
       </w:r>
-      <w:proofErr w:type="spellEnd"/>
     </w:p>
     <w:p>
       <w:pPr>
@@ -4920,26 +4540,10 @@
         </w:numPr>
       </w:pPr>
       <w:r>
-        <w:t>Jessica Allen (</w:t>
-      </w:r>
-      <w:proofErr w:type="spellStart"/>
-      <w:r>
-        <w:t>provider_id</w:t>
-      </w:r>
-      <w:proofErr w:type="spellEnd"/>
-      <w:r>
-        <w:t xml:space="preserve">: 19) is the only provider with </w:t>
-      </w:r>
-      <w:r>
-        <w:t xml:space="preserve">‘Dr.’ within the </w:t>
-      </w:r>
-      <w:proofErr w:type="spellStart"/>
-      <w:r>
-        <w:t>provider_name</w:t>
-      </w:r>
-      <w:proofErr w:type="spellEnd"/>
-      <w:r>
-        <w:t xml:space="preserve"> field. Should all records have Dr., or since she’s the only one, can we just remove </w:t>
+        <w:t xml:space="preserve">Jessica Allen (provider_id: 19) is the only provider with </w:t>
+      </w:r>
+      <w:r>
+        <w:t xml:space="preserve">‘Dr.’ within the provider_name field. Should all records have Dr., or since she’s the only one, can we just remove </w:t>
       </w:r>
       <w:r>
         <w:t xml:space="preserve">Dr. from her record. Since they are all providers, it is already assumed that they are doctors. </w:t>
@@ -4954,15 +4558,7 @@
         </w:numPr>
       </w:pPr>
       <w:r>
-        <w:t xml:space="preserve">I removed “Dr.” prefix from </w:t>
-      </w:r>
-      <w:proofErr w:type="spellStart"/>
-      <w:r>
-        <w:t>provider_id</w:t>
-      </w:r>
-      <w:proofErr w:type="spellEnd"/>
-      <w:r>
-        <w:t xml:space="preserve">: 19 record to standardize provider-name formatting. </w:t>
+        <w:t xml:space="preserve">I removed “Dr.” prefix from provider_id: 19 record to standardize provider-name formatting. </w:t>
       </w:r>
     </w:p>
     <w:p>
@@ -5018,11 +4614,9 @@
           <w:numId w:val="1"/>
         </w:numPr>
       </w:pPr>
-      <w:proofErr w:type="spellStart"/>
       <w:r>
         <w:t>Years_experience</w:t>
       </w:r>
-      <w:proofErr w:type="spellEnd"/>
     </w:p>
     <w:p>
       <w:pPr>
@@ -8523,6 +8117,7 @@
   <w:style w:type="character" w:default="1" w:styleId="DefaultParagraphFont">
     <w:name w:val="Default Paragraph Font"/>
     <w:uiPriority w:val="1"/>
+    <w:semiHidden/>
     <w:unhideWhenUsed/>
   </w:style>
   <w:style w:type="table" w:default="1" w:styleId="TableNormal">

</xml_diff>

<commit_message>
Updated and completed FU analysis 3 and project documentation
</commit_message>
<xml_diff>
--- a/documentation/nicosys-healthcare-portfolio-documentation.docx
+++ b/documentation/nicosys-healthcare-portfolio-documentation.docx
@@ -98,6 +98,12 @@
         </w:rPr>
         <w:t>Business Question 1</w:t>
       </w:r>
+      <w:r>
+        <w:rPr>
+          <w:u w:val="single"/>
+        </w:rPr>
+        <w:t xml:space="preserve"> (Done)</w:t>
+      </w:r>
     </w:p>
     <w:p>
       <w:r>
@@ -111,94 +117,6 @@
           <w:bCs/>
         </w:rPr>
       </w:pPr>
-      <w:r>
-        <w:rPr>
-          <w:b/>
-          <w:bCs/>
-        </w:rPr>
-        <w:t>Tables</w:t>
-      </w:r>
-      <w:r>
-        <w:rPr>
-          <w:b/>
-          <w:bCs/>
-        </w:rPr>
-        <w:t xml:space="preserve"> to use:</w:t>
-      </w:r>
-    </w:p>
-    <w:p>
-      <w:pPr>
-        <w:numPr>
-          <w:ilvl w:val="0"/>
-          <w:numId w:val="14"/>
-        </w:numPr>
-      </w:pPr>
-      <w:r>
-        <w:t>er_visits</w:t>
-      </w:r>
-    </w:p>
-    <w:p>
-      <w:pPr>
-        <w:numPr>
-          <w:ilvl w:val="1"/>
-          <w:numId w:val="14"/>
-        </w:numPr>
-      </w:pPr>
-      <w:r>
-        <w:t>patient_id for the inner join</w:t>
-      </w:r>
-    </w:p>
-    <w:p>
-      <w:pPr>
-        <w:numPr>
-          <w:ilvl w:val="1"/>
-          <w:numId w:val="14"/>
-        </w:numPr>
-      </w:pPr>
-      <w:r>
-        <w:t>wait_time_minutes</w:t>
-      </w:r>
-    </w:p>
-    <w:p>
-      <w:pPr>
-        <w:numPr>
-          <w:ilvl w:val="0"/>
-          <w:numId w:val="14"/>
-        </w:numPr>
-      </w:pPr>
-      <w:r>
-        <w:t>patients</w:t>
-      </w:r>
-    </w:p>
-    <w:p>
-      <w:pPr>
-        <w:numPr>
-          <w:ilvl w:val="1"/>
-          <w:numId w:val="14"/>
-        </w:numPr>
-      </w:pPr>
-      <w:r>
-        <w:t>patient_id for the inner</w:t>
-      </w:r>
-    </w:p>
-    <w:p>
-      <w:pPr>
-        <w:numPr>
-          <w:ilvl w:val="1"/>
-          <w:numId w:val="14"/>
-        </w:numPr>
-      </w:pPr>
-      <w:r>
-        <w:t>age</w:t>
-      </w:r>
-    </w:p>
-    <w:p>
-      <w:pPr>
-        <w:rPr>
-          <w:b/>
-          <w:bCs/>
-        </w:rPr>
-      </w:pPr>
     </w:p>
     <w:p>
       <w:r>
@@ -228,7 +146,6 @@
     <w:p/>
     <w:p>
       <w:r>
-        <w:lastRenderedPageBreak/>
         <w:t xml:space="preserve">Stakeholder: </w:t>
       </w:r>
     </w:p>
@@ -321,7 +238,6 @@
     </w:p>
     <w:p>
       <w:r>
-        <w:lastRenderedPageBreak/>
         <w:tab/>
         <w:t>er_visits er</w:t>
       </w:r>
@@ -371,6 +287,7 @@
     </w:p>
     <w:p>
       <w:r>
+        <w:lastRenderedPageBreak/>
         <w:t>;</w:t>
       </w:r>
     </w:p>
@@ -527,7 +444,6 @@
     </w:p>
     <w:p>
       <w:r>
-        <w:lastRenderedPageBreak/>
         <w:tab/>
       </w:r>
       <w:r>
@@ -691,6 +607,13 @@
         </w:rPr>
         <w:t>Business Question 2</w:t>
       </w:r>
+      <w:r>
+        <w:rPr>
+          <w:b/>
+          <w:bCs/>
+        </w:rPr>
+        <w:t xml:space="preserve"> (Done)</w:t>
+      </w:r>
     </w:p>
     <w:p>
       <w:pPr>
@@ -708,114 +631,314 @@
       </w:r>
     </w:p>
     <w:p>
-      <w:pPr>
-        <w:rPr>
-          <w:b/>
-          <w:bCs/>
-        </w:rPr>
-      </w:pPr>
-      <w:r>
-        <w:rPr>
-          <w:b/>
-          <w:bCs/>
-        </w:rPr>
-        <w:t>Tables</w:t>
-      </w:r>
-    </w:p>
-    <w:p>
-      <w:pPr>
-        <w:numPr>
-          <w:ilvl w:val="0"/>
-          <w:numId w:val="15"/>
-        </w:numPr>
-      </w:pPr>
-      <w:r>
-        <w:t>patients</w:t>
-      </w:r>
-      <w:r>
-        <w:t xml:space="preserve"> pts</w:t>
-      </w:r>
-    </w:p>
-    <w:p>
-      <w:pPr>
-        <w:numPr>
-          <w:ilvl w:val="1"/>
-          <w:numId w:val="15"/>
-        </w:numPr>
-      </w:pPr>
-      <w:r>
-        <w:t>patient_id for inner join</w:t>
-      </w:r>
-    </w:p>
-    <w:p>
-      <w:pPr>
-        <w:numPr>
-          <w:ilvl w:val="1"/>
-          <w:numId w:val="15"/>
-        </w:numPr>
-      </w:pPr>
-      <w:r>
-        <w:t>city</w:t>
-      </w:r>
-    </w:p>
-    <w:p>
-      <w:pPr>
-        <w:numPr>
-          <w:ilvl w:val="0"/>
-          <w:numId w:val="15"/>
-        </w:numPr>
-      </w:pPr>
+      <w:r>
+        <w:rPr>
+          <w:i/>
+          <w:iCs/>
+        </w:rPr>
+        <w:t>/*</w:t>
+      </w:r>
+    </w:p>
+    <w:p>
+      <w:r>
+        <w:rPr>
+          <w:i/>
+          <w:iCs/>
+        </w:rPr>
+        <w:t xml:space="preserve">Business Question: </w:t>
+      </w:r>
+    </w:p>
+    <w:p>
+      <w:r>
+        <w:rPr>
+          <w:i/>
+          <w:iCs/>
+        </w:rPr>
+        <w:t>Which cities generate the highest Emergency Department utilization?</w:t>
+      </w:r>
+    </w:p>
+    <w:p>
+      <w:r>
+        <w:rPr>
+          <w:i/>
+          <w:iCs/>
+        </w:rPr>
+        <w:lastRenderedPageBreak/>
+        <w:t xml:space="preserve">Out of the 3 cities within the datasets, Henderson generates the highest Emergency Department utilization at 1103 visits. </w:t>
+      </w:r>
+    </w:p>
+    <w:p/>
+    <w:p>
+      <w:r>
+        <w:rPr>
+          <w:i/>
+          <w:iCs/>
+        </w:rPr>
+        <w:t xml:space="preserve">Stakeholder: </w:t>
+      </w:r>
+    </w:p>
+    <w:p>
+      <w:r>
+        <w:rPr>
+          <w:i/>
+          <w:iCs/>
+        </w:rPr>
+        <w:t>Leadership of Valley Regional Medical Center</w:t>
+      </w:r>
+    </w:p>
+    <w:p/>
+    <w:p>
+      <w:r>
+        <w:rPr>
+          <w:i/>
+          <w:iCs/>
+        </w:rPr>
+        <w:t>Purpose:</w:t>
+      </w:r>
+    </w:p>
+    <w:p>
+      <w:r>
+        <w:rPr>
+          <w:i/>
+          <w:iCs/>
+        </w:rPr>
+        <w:t xml:space="preserve">To see patient cities that visit the Emergency Department the most. </w:t>
+      </w:r>
+    </w:p>
+    <w:p/>
+    <w:p>
+      <w:r>
+        <w:rPr>
+          <w:i/>
+          <w:iCs/>
+        </w:rPr>
+        <w:t>SQL Query: (see below)</w:t>
+      </w:r>
+    </w:p>
+    <w:p/>
+    <w:p>
+      <w:r>
+        <w:rPr>
+          <w:i/>
+          <w:iCs/>
+        </w:rPr>
+        <w:t>Findings:</w:t>
+      </w:r>
+    </w:p>
+    <w:p>
+      <w:r>
+        <w:rPr>
+          <w:i/>
+          <w:iCs/>
+        </w:rPr>
+        <w:t xml:space="preserve">Henderson generated the highest Emergency Department utilization with 1103 ER visits. </w:t>
+      </w:r>
+    </w:p>
+    <w:p>
+      <w:r>
+        <w:rPr>
+          <w:i/>
+          <w:iCs/>
+        </w:rPr>
+        <w:t>North Las Vegas generated 970 ER visits.</w:t>
+      </w:r>
+    </w:p>
+    <w:p>
+      <w:r>
+        <w:rPr>
+          <w:i/>
+          <w:iCs/>
+        </w:rPr>
+        <w:t xml:space="preserve">Las Vegas generated 927 visits. </w:t>
+      </w:r>
+    </w:p>
+    <w:p/>
+    <w:p>
+      <w:r>
+        <w:rPr>
+          <w:i/>
+          <w:iCs/>
+        </w:rPr>
+        <w:t>Business Insight:</w:t>
+      </w:r>
+    </w:p>
+    <w:p>
+      <w:r>
+        <w:rPr>
+          <w:i/>
+          <w:iCs/>
+        </w:rPr>
+        <w:t xml:space="preserve">Representing the largest share among the three cities in the dataset, </w:t>
+      </w:r>
+    </w:p>
+    <w:p>
+      <w:r>
+        <w:rPr>
+          <w:i/>
+          <w:iCs/>
+        </w:rPr>
+        <w:t>Henerson residents accounted for approximately 37% of all Emergency Department visits.</w:t>
+      </w:r>
+    </w:p>
+    <w:p>
+      <w:r>
+        <w:rPr>
+          <w:i/>
+          <w:iCs/>
+        </w:rPr>
+        <w:t xml:space="preserve">North Las Vegas accounted for ~32%, while Las Vegas accounted for ~31%. </w:t>
+      </w:r>
+    </w:p>
+    <w:p/>
+    <w:p>
+      <w:proofErr w:type="spellStart"/>
+      <w:r>
+        <w:rPr>
+          <w:i/>
+          <w:iCs/>
+        </w:rPr>
+        <w:t>Recomendation</w:t>
+      </w:r>
+      <w:proofErr w:type="spellEnd"/>
+      <w:r>
+        <w:rPr>
+          <w:i/>
+          <w:iCs/>
+        </w:rPr>
+        <w:t>:</w:t>
+      </w:r>
+    </w:p>
+    <w:p>
+      <w:r>
+        <w:rPr>
+          <w:i/>
+          <w:iCs/>
+        </w:rPr>
+        <w:t>Look further into why Henderson residents account for the highest share of Emergency Department visits.</w:t>
+      </w:r>
+    </w:p>
+    <w:p>
+      <w:r>
+        <w:rPr>
+          <w:i/>
+          <w:iCs/>
+        </w:rPr>
+        <w:t xml:space="preserve">Additional analysis of patient demographics, level of severity, insurance type, and primary diagnoses may help determine </w:t>
+      </w:r>
+      <w:proofErr w:type="spellStart"/>
+      <w:r>
+        <w:rPr>
+          <w:i/>
+          <w:iCs/>
+        </w:rPr>
+        <w:t>wheter</w:t>
+      </w:r>
+      <w:proofErr w:type="spellEnd"/>
+      <w:r>
+        <w:rPr>
+          <w:i/>
+          <w:iCs/>
+        </w:rPr>
+        <w:t xml:space="preserve"> higher utilization reflects operational factors.</w:t>
+      </w:r>
+    </w:p>
+    <w:p>
+      <w:r>
+        <w:rPr>
+          <w:i/>
+          <w:iCs/>
+        </w:rPr>
+        <w:t>*/</w:t>
+      </w:r>
+    </w:p>
+    <w:p/>
+    <w:p>
+      <w:r>
+        <w:t>Select</w:t>
+      </w:r>
+    </w:p>
+    <w:p>
+      <w:r>
+        <w:t xml:space="preserve">      </w:t>
+      </w:r>
+      <w:proofErr w:type="spellStart"/>
+      <w:r>
+        <w:t>pts.city</w:t>
+      </w:r>
+      <w:proofErr w:type="spellEnd"/>
+    </w:p>
+    <w:p>
+      <w:r>
+        <w:t xml:space="preserve">    , count(*) as </w:t>
+      </w:r>
+      <w:proofErr w:type="spellStart"/>
+      <w:r>
+        <w:t>number_of_er_visits</w:t>
+      </w:r>
+      <w:proofErr w:type="spellEnd"/>
+      <w:r>
+        <w:t xml:space="preserve"> </w:t>
+      </w:r>
+    </w:p>
+    <w:p>
+      <w:r>
+        <w:t>From</w:t>
+      </w:r>
+    </w:p>
+    <w:p>
+      <w:r>
+        <w:t xml:space="preserve">    </w:t>
+      </w:r>
+      <w:proofErr w:type="spellStart"/>
       <w:r>
         <w:t>er_visits</w:t>
       </w:r>
+      <w:proofErr w:type="spellEnd"/>
       <w:r>
         <w:t xml:space="preserve"> er</w:t>
       </w:r>
     </w:p>
     <w:p>
-      <w:pPr>
-        <w:numPr>
-          <w:ilvl w:val="1"/>
-          <w:numId w:val="15"/>
-        </w:numPr>
-      </w:pPr>
-      <w:r>
-        <w:t>patient_id for inner join</w:t>
-      </w:r>
-    </w:p>
-    <w:p>
-      <w:pPr>
-        <w:numPr>
-          <w:ilvl w:val="2"/>
-          <w:numId w:val="15"/>
-        </w:numPr>
-      </w:pPr>
-      <w:r>
-        <w:t>count(patient_id)</w:t>
-      </w:r>
-    </w:p>
-    <w:p>
-      <w:pPr>
-        <w:pStyle w:val="ListParagraph"/>
-        <w:numPr>
-          <w:ilvl w:val="0"/>
-          <w:numId w:val="15"/>
-        </w:numPr>
-      </w:pPr>
-      <w:r>
-        <w:t>inner join on patient_id</w:t>
-      </w:r>
-    </w:p>
-    <w:p>
-      <w:pPr>
-        <w:pStyle w:val="ListParagraph"/>
-        <w:numPr>
-          <w:ilvl w:val="0"/>
-          <w:numId w:val="15"/>
-        </w:numPr>
-      </w:pPr>
-      <w:r>
-        <w:t>group by pts.city</w:t>
+      <w:r>
+        <w:t>        inner join patients pts</w:t>
+      </w:r>
+    </w:p>
+    <w:p>
+      <w:r>
+        <w:t xml:space="preserve">            on </w:t>
+      </w:r>
+      <w:proofErr w:type="spellStart"/>
+      <w:r>
+        <w:t>er.patient_id</w:t>
+      </w:r>
+      <w:proofErr w:type="spellEnd"/>
+      <w:r>
+        <w:t>=</w:t>
+      </w:r>
+      <w:proofErr w:type="spellStart"/>
+      <w:r>
+        <w:t>pts.patient_id</w:t>
+      </w:r>
+      <w:proofErr w:type="spellEnd"/>
+    </w:p>
+    <w:p>
+      <w:r>
+        <w:t>Group By</w:t>
+      </w:r>
+    </w:p>
+    <w:p>
+      <w:r>
+        <w:t xml:space="preserve">    </w:t>
+      </w:r>
+      <w:proofErr w:type="spellStart"/>
+      <w:r>
+        <w:t>pts.city</w:t>
+      </w:r>
+      <w:proofErr w:type="spellEnd"/>
+    </w:p>
+    <w:p>
+      <w:r>
+        <w:t>;</w:t>
       </w:r>
     </w:p>
     <w:p/>
@@ -832,6 +955,13 @@
           <w:bCs/>
         </w:rPr>
         <w:t>Business Question 3</w:t>
+      </w:r>
+      <w:r>
+        <w:rPr>
+          <w:b/>
+          <w:bCs/>
+        </w:rPr>
+        <w:t xml:space="preserve"> (Done)</w:t>
       </w:r>
     </w:p>
     <w:p>
@@ -904,6 +1034,1788 @@
     </w:p>
     <w:p>
       <w:pPr>
+        <w:pStyle w:val="ListParagraph"/>
+        <w:numPr>
+          <w:ilvl w:val="0"/>
+          <w:numId w:val="16"/>
+        </w:numPr>
+        <w:shd w:val="clear" w:color="auto" w:fill="1C1E26"/>
+        <w:spacing w:after="0" w:line="285" w:lineRule="atLeast"/>
+        <w:rPr>
+          <w:rFonts w:ascii="Consolas" w:eastAsia="Times New Roman" w:hAnsi="Consolas" w:cs="Times New Roman"/>
+          <w:color w:val="BBBBBB"/>
+          <w:kern w:val="0"/>
+          <w:sz w:val="21"/>
+          <w:szCs w:val="21"/>
+          <w14:ligatures w14:val="none"/>
+        </w:rPr>
+      </w:pPr>
+      <w:r>
+        <w:rPr>
+          <w:rFonts w:ascii="Consolas" w:eastAsia="Times New Roman" w:hAnsi="Consolas" w:cs="Times New Roman"/>
+          <w:i/>
+          <w:iCs/>
+          <w:color w:val="BBBBBB"/>
+          <w:kern w:val="0"/>
+          <w:sz w:val="21"/>
+          <w:szCs w:val="21"/>
+          <w14:ligatures w14:val="none"/>
+        </w:rPr>
+        <w:t>/*</w:t>
+      </w:r>
+    </w:p>
+    <w:p>
+      <w:pPr>
+        <w:pStyle w:val="ListParagraph"/>
+        <w:numPr>
+          <w:ilvl w:val="0"/>
+          <w:numId w:val="16"/>
+        </w:numPr>
+        <w:shd w:val="clear" w:color="auto" w:fill="1C1E26"/>
+        <w:spacing w:after="0" w:line="285" w:lineRule="atLeast"/>
+        <w:rPr>
+          <w:rFonts w:ascii="Consolas" w:eastAsia="Times New Roman" w:hAnsi="Consolas" w:cs="Times New Roman"/>
+          <w:color w:val="BBBBBB"/>
+          <w:kern w:val="0"/>
+          <w:sz w:val="21"/>
+          <w:szCs w:val="21"/>
+          <w14:ligatures w14:val="none"/>
+        </w:rPr>
+      </w:pPr>
+      <w:r>
+        <w:rPr>
+          <w:rFonts w:ascii="Consolas" w:eastAsia="Times New Roman" w:hAnsi="Consolas" w:cs="Times New Roman"/>
+          <w:i/>
+          <w:iCs/>
+          <w:color w:val="BBBBBB"/>
+          <w:kern w:val="0"/>
+          <w:sz w:val="21"/>
+          <w:szCs w:val="21"/>
+          <w14:ligatures w14:val="none"/>
+        </w:rPr>
+        <w:t xml:space="preserve">Business Question: </w:t>
+      </w:r>
+    </w:p>
+    <w:p>
+      <w:pPr>
+        <w:pStyle w:val="ListParagraph"/>
+        <w:numPr>
+          <w:ilvl w:val="0"/>
+          <w:numId w:val="16"/>
+        </w:numPr>
+        <w:shd w:val="clear" w:color="auto" w:fill="1C1E26"/>
+        <w:spacing w:after="0" w:line="285" w:lineRule="atLeast"/>
+        <w:rPr>
+          <w:rFonts w:ascii="Consolas" w:eastAsia="Times New Roman" w:hAnsi="Consolas" w:cs="Times New Roman"/>
+          <w:color w:val="BBBBBB"/>
+          <w:kern w:val="0"/>
+          <w:sz w:val="21"/>
+          <w:szCs w:val="21"/>
+          <w14:ligatures w14:val="none"/>
+        </w:rPr>
+      </w:pPr>
+      <w:r>
+        <w:rPr>
+          <w:rFonts w:ascii="Consolas" w:eastAsia="Times New Roman" w:hAnsi="Consolas" w:cs="Times New Roman"/>
+          <w:i/>
+          <w:iCs/>
+          <w:color w:val="BBBBBB"/>
+          <w:kern w:val="0"/>
+          <w:sz w:val="21"/>
+          <w:szCs w:val="21"/>
+          <w14:ligatures w14:val="none"/>
+        </w:rPr>
+        <w:t>Does provider Experience appear to influence patient satisfaction?</w:t>
+      </w:r>
+    </w:p>
+    <w:p>
+      <w:pPr>
+        <w:pStyle w:val="ListParagraph"/>
+        <w:numPr>
+          <w:ilvl w:val="0"/>
+          <w:numId w:val="16"/>
+        </w:numPr>
+        <w:shd w:val="clear" w:color="auto" w:fill="1C1E26"/>
+        <w:spacing w:after="0" w:line="285" w:lineRule="atLeast"/>
+        <w:rPr>
+          <w:rFonts w:ascii="Consolas" w:eastAsia="Times New Roman" w:hAnsi="Consolas" w:cs="Times New Roman"/>
+          <w:color w:val="BBBBBB"/>
+          <w:kern w:val="0"/>
+          <w:sz w:val="21"/>
+          <w:szCs w:val="21"/>
+          <w14:ligatures w14:val="none"/>
+        </w:rPr>
+      </w:pPr>
+    </w:p>
+    <w:p>
+      <w:pPr>
+        <w:pStyle w:val="ListParagraph"/>
+        <w:numPr>
+          <w:ilvl w:val="0"/>
+          <w:numId w:val="16"/>
+        </w:numPr>
+        <w:shd w:val="clear" w:color="auto" w:fill="1C1E26"/>
+        <w:spacing w:after="0" w:line="285" w:lineRule="atLeast"/>
+        <w:rPr>
+          <w:rFonts w:ascii="Consolas" w:eastAsia="Times New Roman" w:hAnsi="Consolas" w:cs="Times New Roman"/>
+          <w:color w:val="BBBBBB"/>
+          <w:kern w:val="0"/>
+          <w:sz w:val="21"/>
+          <w:szCs w:val="21"/>
+          <w14:ligatures w14:val="none"/>
+        </w:rPr>
+      </w:pPr>
+      <w:r>
+        <w:rPr>
+          <w:rFonts w:ascii="Consolas" w:eastAsia="Times New Roman" w:hAnsi="Consolas" w:cs="Times New Roman"/>
+          <w:i/>
+          <w:iCs/>
+          <w:color w:val="BBBBBB"/>
+          <w:kern w:val="0"/>
+          <w:sz w:val="21"/>
+          <w:szCs w:val="21"/>
+          <w14:ligatures w14:val="none"/>
+        </w:rPr>
+        <w:t xml:space="preserve">Stakeholder: </w:t>
+      </w:r>
+    </w:p>
+    <w:p>
+      <w:pPr>
+        <w:pStyle w:val="ListParagraph"/>
+        <w:numPr>
+          <w:ilvl w:val="0"/>
+          <w:numId w:val="16"/>
+        </w:numPr>
+        <w:shd w:val="clear" w:color="auto" w:fill="1C1E26"/>
+        <w:spacing w:after="0" w:line="285" w:lineRule="atLeast"/>
+        <w:rPr>
+          <w:rFonts w:ascii="Consolas" w:eastAsia="Times New Roman" w:hAnsi="Consolas" w:cs="Times New Roman"/>
+          <w:color w:val="BBBBBB"/>
+          <w:kern w:val="0"/>
+          <w:sz w:val="21"/>
+          <w:szCs w:val="21"/>
+          <w14:ligatures w14:val="none"/>
+        </w:rPr>
+      </w:pPr>
+      <w:r>
+        <w:rPr>
+          <w:rFonts w:ascii="Consolas" w:eastAsia="Times New Roman" w:hAnsi="Consolas" w:cs="Times New Roman"/>
+          <w:i/>
+          <w:iCs/>
+          <w:color w:val="BBBBBB"/>
+          <w:kern w:val="0"/>
+          <w:sz w:val="21"/>
+          <w:szCs w:val="21"/>
+          <w14:ligatures w14:val="none"/>
+        </w:rPr>
+        <w:t>Leadership of Valley Regional Medical Center</w:t>
+      </w:r>
+    </w:p>
+    <w:p>
+      <w:pPr>
+        <w:pStyle w:val="ListParagraph"/>
+        <w:numPr>
+          <w:ilvl w:val="0"/>
+          <w:numId w:val="16"/>
+        </w:numPr>
+        <w:shd w:val="clear" w:color="auto" w:fill="1C1E26"/>
+        <w:spacing w:after="0" w:line="285" w:lineRule="atLeast"/>
+        <w:rPr>
+          <w:rFonts w:ascii="Consolas" w:eastAsia="Times New Roman" w:hAnsi="Consolas" w:cs="Times New Roman"/>
+          <w:color w:val="BBBBBB"/>
+          <w:kern w:val="0"/>
+          <w:sz w:val="21"/>
+          <w:szCs w:val="21"/>
+          <w14:ligatures w14:val="none"/>
+        </w:rPr>
+      </w:pPr>
+    </w:p>
+    <w:p>
+      <w:pPr>
+        <w:pStyle w:val="ListParagraph"/>
+        <w:numPr>
+          <w:ilvl w:val="0"/>
+          <w:numId w:val="16"/>
+        </w:numPr>
+        <w:shd w:val="clear" w:color="auto" w:fill="1C1E26"/>
+        <w:spacing w:after="0" w:line="285" w:lineRule="atLeast"/>
+        <w:rPr>
+          <w:rFonts w:ascii="Consolas" w:eastAsia="Times New Roman" w:hAnsi="Consolas" w:cs="Times New Roman"/>
+          <w:color w:val="BBBBBB"/>
+          <w:kern w:val="0"/>
+          <w:sz w:val="21"/>
+          <w:szCs w:val="21"/>
+          <w14:ligatures w14:val="none"/>
+        </w:rPr>
+      </w:pPr>
+      <w:r>
+        <w:rPr>
+          <w:rFonts w:ascii="Consolas" w:eastAsia="Times New Roman" w:hAnsi="Consolas" w:cs="Times New Roman"/>
+          <w:i/>
+          <w:iCs/>
+          <w:color w:val="BBBBBB"/>
+          <w:kern w:val="0"/>
+          <w:sz w:val="21"/>
+          <w:szCs w:val="21"/>
+          <w14:ligatures w14:val="none"/>
+        </w:rPr>
+        <w:t>Purpose:</w:t>
+      </w:r>
+    </w:p>
+    <w:p>
+      <w:pPr>
+        <w:pStyle w:val="ListParagraph"/>
+        <w:numPr>
+          <w:ilvl w:val="0"/>
+          <w:numId w:val="16"/>
+        </w:numPr>
+        <w:shd w:val="clear" w:color="auto" w:fill="1C1E26"/>
+        <w:spacing w:after="0" w:line="285" w:lineRule="atLeast"/>
+        <w:rPr>
+          <w:rFonts w:ascii="Consolas" w:eastAsia="Times New Roman" w:hAnsi="Consolas" w:cs="Times New Roman"/>
+          <w:color w:val="BBBBBB"/>
+          <w:kern w:val="0"/>
+          <w:sz w:val="21"/>
+          <w:szCs w:val="21"/>
+          <w14:ligatures w14:val="none"/>
+        </w:rPr>
+      </w:pPr>
+      <w:r>
+        <w:rPr>
+          <w:rFonts w:ascii="Consolas" w:eastAsia="Times New Roman" w:hAnsi="Consolas" w:cs="Times New Roman"/>
+          <w:i/>
+          <w:iCs/>
+          <w:color w:val="BBBBBB"/>
+          <w:kern w:val="0"/>
+          <w:sz w:val="21"/>
+          <w:szCs w:val="21"/>
+          <w14:ligatures w14:val="none"/>
+        </w:rPr>
+        <w:t xml:space="preserve">To see if providers' years of experience has an </w:t>
+      </w:r>
+      <w:proofErr w:type="spellStart"/>
+      <w:r>
+        <w:rPr>
+          <w:rFonts w:ascii="Consolas" w:eastAsia="Times New Roman" w:hAnsi="Consolas" w:cs="Times New Roman"/>
+          <w:i/>
+          <w:iCs/>
+          <w:color w:val="BBBBBB"/>
+          <w:kern w:val="0"/>
+          <w:sz w:val="21"/>
+          <w:szCs w:val="21"/>
+          <w14:ligatures w14:val="none"/>
+        </w:rPr>
+        <w:t>affect</w:t>
+      </w:r>
+      <w:proofErr w:type="spellEnd"/>
+      <w:r>
+        <w:rPr>
+          <w:rFonts w:ascii="Consolas" w:eastAsia="Times New Roman" w:hAnsi="Consolas" w:cs="Times New Roman"/>
+          <w:i/>
+          <w:iCs/>
+          <w:color w:val="BBBBBB"/>
+          <w:kern w:val="0"/>
+          <w:sz w:val="21"/>
+          <w:szCs w:val="21"/>
+          <w14:ligatures w14:val="none"/>
+        </w:rPr>
+        <w:t xml:space="preserve"> on overall patient satisfaction scores. </w:t>
+      </w:r>
+    </w:p>
+    <w:p>
+      <w:pPr>
+        <w:pStyle w:val="ListParagraph"/>
+        <w:numPr>
+          <w:ilvl w:val="0"/>
+          <w:numId w:val="16"/>
+        </w:numPr>
+        <w:shd w:val="clear" w:color="auto" w:fill="1C1E26"/>
+        <w:spacing w:after="0" w:line="285" w:lineRule="atLeast"/>
+        <w:rPr>
+          <w:rFonts w:ascii="Consolas" w:eastAsia="Times New Roman" w:hAnsi="Consolas" w:cs="Times New Roman"/>
+          <w:color w:val="BBBBBB"/>
+          <w:kern w:val="0"/>
+          <w:sz w:val="21"/>
+          <w:szCs w:val="21"/>
+          <w14:ligatures w14:val="none"/>
+        </w:rPr>
+      </w:pPr>
+    </w:p>
+    <w:p>
+      <w:pPr>
+        <w:pStyle w:val="ListParagraph"/>
+        <w:numPr>
+          <w:ilvl w:val="0"/>
+          <w:numId w:val="16"/>
+        </w:numPr>
+        <w:shd w:val="clear" w:color="auto" w:fill="1C1E26"/>
+        <w:spacing w:after="0" w:line="285" w:lineRule="atLeast"/>
+        <w:rPr>
+          <w:rFonts w:ascii="Consolas" w:eastAsia="Times New Roman" w:hAnsi="Consolas" w:cs="Times New Roman"/>
+          <w:color w:val="BBBBBB"/>
+          <w:kern w:val="0"/>
+          <w:sz w:val="21"/>
+          <w:szCs w:val="21"/>
+          <w14:ligatures w14:val="none"/>
+        </w:rPr>
+      </w:pPr>
+      <w:r>
+        <w:rPr>
+          <w:rFonts w:ascii="Consolas" w:eastAsia="Times New Roman" w:hAnsi="Consolas" w:cs="Times New Roman"/>
+          <w:i/>
+          <w:iCs/>
+          <w:color w:val="BBBBBB"/>
+          <w:kern w:val="0"/>
+          <w:sz w:val="21"/>
+          <w:szCs w:val="21"/>
+          <w14:ligatures w14:val="none"/>
+        </w:rPr>
+        <w:t>SQL Query: (see below)</w:t>
+      </w:r>
+    </w:p>
+    <w:p>
+      <w:pPr>
+        <w:pStyle w:val="ListParagraph"/>
+        <w:numPr>
+          <w:ilvl w:val="0"/>
+          <w:numId w:val="16"/>
+        </w:numPr>
+        <w:shd w:val="clear" w:color="auto" w:fill="1C1E26"/>
+        <w:spacing w:after="0" w:line="285" w:lineRule="atLeast"/>
+        <w:rPr>
+          <w:rFonts w:ascii="Consolas" w:eastAsia="Times New Roman" w:hAnsi="Consolas" w:cs="Times New Roman"/>
+          <w:color w:val="BBBBBB"/>
+          <w:kern w:val="0"/>
+          <w:sz w:val="21"/>
+          <w:szCs w:val="21"/>
+          <w14:ligatures w14:val="none"/>
+        </w:rPr>
+      </w:pPr>
+    </w:p>
+    <w:p>
+      <w:pPr>
+        <w:pStyle w:val="ListParagraph"/>
+        <w:numPr>
+          <w:ilvl w:val="0"/>
+          <w:numId w:val="16"/>
+        </w:numPr>
+        <w:shd w:val="clear" w:color="auto" w:fill="1C1E26"/>
+        <w:spacing w:after="0" w:line="285" w:lineRule="atLeast"/>
+        <w:rPr>
+          <w:rFonts w:ascii="Consolas" w:eastAsia="Times New Roman" w:hAnsi="Consolas" w:cs="Times New Roman"/>
+          <w:color w:val="BBBBBB"/>
+          <w:kern w:val="0"/>
+          <w:sz w:val="21"/>
+          <w:szCs w:val="21"/>
+          <w14:ligatures w14:val="none"/>
+        </w:rPr>
+      </w:pPr>
+      <w:r>
+        <w:rPr>
+          <w:rFonts w:ascii="Consolas" w:eastAsia="Times New Roman" w:hAnsi="Consolas" w:cs="Times New Roman"/>
+          <w:i/>
+          <w:iCs/>
+          <w:color w:val="BBBBBB"/>
+          <w:kern w:val="0"/>
+          <w:sz w:val="21"/>
+          <w:szCs w:val="21"/>
+          <w14:ligatures w14:val="none"/>
+        </w:rPr>
+        <w:t>Findings:</w:t>
+      </w:r>
+    </w:p>
+    <w:p>
+      <w:pPr>
+        <w:pStyle w:val="ListParagraph"/>
+        <w:numPr>
+          <w:ilvl w:val="0"/>
+          <w:numId w:val="16"/>
+        </w:numPr>
+        <w:shd w:val="clear" w:color="auto" w:fill="1C1E26"/>
+        <w:spacing w:after="0" w:line="285" w:lineRule="atLeast"/>
+        <w:rPr>
+          <w:rFonts w:ascii="Consolas" w:eastAsia="Times New Roman" w:hAnsi="Consolas" w:cs="Times New Roman"/>
+          <w:color w:val="BBBBBB"/>
+          <w:kern w:val="0"/>
+          <w:sz w:val="21"/>
+          <w:szCs w:val="21"/>
+          <w14:ligatures w14:val="none"/>
+        </w:rPr>
+      </w:pPr>
+      <w:r>
+        <w:rPr>
+          <w:rFonts w:ascii="Consolas" w:eastAsia="Times New Roman" w:hAnsi="Consolas" w:cs="Times New Roman"/>
+          <w:i/>
+          <w:iCs/>
+          <w:color w:val="BBBBBB"/>
+          <w:kern w:val="0"/>
+          <w:sz w:val="21"/>
+          <w:szCs w:val="21"/>
+          <w14:ligatures w14:val="none"/>
+        </w:rPr>
+        <w:lastRenderedPageBreak/>
+        <w:t>Across the 15 categories of years of experience groups represented in the dataset, average patient satisfaction scores ranged from 4.14 to 4.22.</w:t>
+      </w:r>
+    </w:p>
+    <w:p>
+      <w:pPr>
+        <w:pStyle w:val="ListParagraph"/>
+        <w:numPr>
+          <w:ilvl w:val="0"/>
+          <w:numId w:val="16"/>
+        </w:numPr>
+        <w:shd w:val="clear" w:color="auto" w:fill="1C1E26"/>
+        <w:spacing w:after="0" w:line="285" w:lineRule="atLeast"/>
+        <w:rPr>
+          <w:rFonts w:ascii="Consolas" w:eastAsia="Times New Roman" w:hAnsi="Consolas" w:cs="Times New Roman"/>
+          <w:color w:val="BBBBBB"/>
+          <w:kern w:val="0"/>
+          <w:sz w:val="21"/>
+          <w:szCs w:val="21"/>
+          <w14:ligatures w14:val="none"/>
+        </w:rPr>
+      </w:pPr>
+      <w:r>
+        <w:rPr>
+          <w:rFonts w:ascii="Consolas" w:eastAsia="Times New Roman" w:hAnsi="Consolas" w:cs="Times New Roman"/>
+          <w:i/>
+          <w:iCs/>
+          <w:color w:val="BBBBBB"/>
+          <w:kern w:val="0"/>
+          <w:sz w:val="21"/>
+          <w:szCs w:val="21"/>
+          <w14:ligatures w14:val="none"/>
+        </w:rPr>
+        <w:t>All experience levels were associated with at least one maximum satisfaction score of 5.0, while minimum satisfaction scores ranged from 2.0 to 2.8.</w:t>
+      </w:r>
+    </w:p>
+    <w:p>
+      <w:pPr>
+        <w:pStyle w:val="ListParagraph"/>
+        <w:numPr>
+          <w:ilvl w:val="0"/>
+          <w:numId w:val="16"/>
+        </w:numPr>
+        <w:shd w:val="clear" w:color="auto" w:fill="1C1E26"/>
+        <w:spacing w:after="0" w:line="285" w:lineRule="atLeast"/>
+        <w:rPr>
+          <w:rFonts w:ascii="Consolas" w:eastAsia="Times New Roman" w:hAnsi="Consolas" w:cs="Times New Roman"/>
+          <w:color w:val="BBBBBB"/>
+          <w:kern w:val="0"/>
+          <w:sz w:val="21"/>
+          <w:szCs w:val="21"/>
+          <w14:ligatures w14:val="none"/>
+        </w:rPr>
+      </w:pPr>
+    </w:p>
+    <w:p>
+      <w:pPr>
+        <w:pStyle w:val="ListParagraph"/>
+        <w:numPr>
+          <w:ilvl w:val="0"/>
+          <w:numId w:val="16"/>
+        </w:numPr>
+        <w:shd w:val="clear" w:color="auto" w:fill="1C1E26"/>
+        <w:spacing w:after="0" w:line="285" w:lineRule="atLeast"/>
+        <w:rPr>
+          <w:rFonts w:ascii="Consolas" w:eastAsia="Times New Roman" w:hAnsi="Consolas" w:cs="Times New Roman"/>
+          <w:color w:val="BBBBBB"/>
+          <w:kern w:val="0"/>
+          <w:sz w:val="21"/>
+          <w:szCs w:val="21"/>
+          <w14:ligatures w14:val="none"/>
+        </w:rPr>
+      </w:pPr>
+      <w:r>
+        <w:rPr>
+          <w:rFonts w:ascii="Consolas" w:eastAsia="Times New Roman" w:hAnsi="Consolas" w:cs="Times New Roman"/>
+          <w:i/>
+          <w:iCs/>
+          <w:color w:val="BBBBBB"/>
+          <w:kern w:val="0"/>
+          <w:sz w:val="21"/>
+          <w:szCs w:val="21"/>
+          <w14:ligatures w14:val="none"/>
+        </w:rPr>
+        <w:t>Business Insight:</w:t>
+      </w:r>
+    </w:p>
+    <w:p>
+      <w:pPr>
+        <w:pStyle w:val="ListParagraph"/>
+        <w:numPr>
+          <w:ilvl w:val="0"/>
+          <w:numId w:val="16"/>
+        </w:numPr>
+        <w:shd w:val="clear" w:color="auto" w:fill="1C1E26"/>
+        <w:spacing w:after="0" w:line="285" w:lineRule="atLeast"/>
+        <w:rPr>
+          <w:rFonts w:ascii="Consolas" w:eastAsia="Times New Roman" w:hAnsi="Consolas" w:cs="Times New Roman"/>
+          <w:color w:val="BBBBBB"/>
+          <w:kern w:val="0"/>
+          <w:sz w:val="21"/>
+          <w:szCs w:val="21"/>
+          <w14:ligatures w14:val="none"/>
+        </w:rPr>
+      </w:pPr>
+      <w:r>
+        <w:rPr>
+          <w:rFonts w:ascii="Consolas" w:eastAsia="Times New Roman" w:hAnsi="Consolas" w:cs="Times New Roman"/>
+          <w:i/>
+          <w:iCs/>
+          <w:color w:val="BBBBBB"/>
+          <w:kern w:val="0"/>
+          <w:sz w:val="21"/>
+          <w:szCs w:val="21"/>
+          <w14:ligatures w14:val="none"/>
+        </w:rPr>
+        <w:t>Patient satisfaction remained consistently high across all years of provider experience.</w:t>
+      </w:r>
+    </w:p>
+    <w:p>
+      <w:pPr>
+        <w:pStyle w:val="ListParagraph"/>
+        <w:numPr>
+          <w:ilvl w:val="0"/>
+          <w:numId w:val="16"/>
+        </w:numPr>
+        <w:shd w:val="clear" w:color="auto" w:fill="1C1E26"/>
+        <w:spacing w:after="0" w:line="285" w:lineRule="atLeast"/>
+        <w:rPr>
+          <w:rFonts w:ascii="Consolas" w:eastAsia="Times New Roman" w:hAnsi="Consolas" w:cs="Times New Roman"/>
+          <w:color w:val="BBBBBB"/>
+          <w:kern w:val="0"/>
+          <w:sz w:val="21"/>
+          <w:szCs w:val="21"/>
+          <w14:ligatures w14:val="none"/>
+        </w:rPr>
+      </w:pPr>
+      <w:r>
+        <w:rPr>
+          <w:rFonts w:ascii="Consolas" w:eastAsia="Times New Roman" w:hAnsi="Consolas" w:cs="Times New Roman"/>
+          <w:i/>
+          <w:iCs/>
+          <w:color w:val="BBBBBB"/>
+          <w:kern w:val="0"/>
+          <w:sz w:val="21"/>
+          <w:szCs w:val="21"/>
+          <w14:ligatures w14:val="none"/>
+        </w:rPr>
+        <w:t>Since average satisfaction scores varied by only .08 points, there is little evidence that provider experience alone has a meaningful influence on patient satisfaction.  </w:t>
+      </w:r>
+    </w:p>
+    <w:p>
+      <w:pPr>
+        <w:pStyle w:val="ListParagraph"/>
+        <w:numPr>
+          <w:ilvl w:val="0"/>
+          <w:numId w:val="16"/>
+        </w:numPr>
+        <w:shd w:val="clear" w:color="auto" w:fill="1C1E26"/>
+        <w:spacing w:after="0" w:line="285" w:lineRule="atLeast"/>
+        <w:rPr>
+          <w:rFonts w:ascii="Consolas" w:eastAsia="Times New Roman" w:hAnsi="Consolas" w:cs="Times New Roman"/>
+          <w:color w:val="BBBBBB"/>
+          <w:kern w:val="0"/>
+          <w:sz w:val="21"/>
+          <w:szCs w:val="21"/>
+          <w14:ligatures w14:val="none"/>
+        </w:rPr>
+      </w:pPr>
+    </w:p>
+    <w:p>
+      <w:pPr>
+        <w:pStyle w:val="ListParagraph"/>
+        <w:numPr>
+          <w:ilvl w:val="0"/>
+          <w:numId w:val="16"/>
+        </w:numPr>
+        <w:shd w:val="clear" w:color="auto" w:fill="1C1E26"/>
+        <w:spacing w:after="0" w:line="285" w:lineRule="atLeast"/>
+        <w:rPr>
+          <w:rFonts w:ascii="Consolas" w:eastAsia="Times New Roman" w:hAnsi="Consolas" w:cs="Times New Roman"/>
+          <w:color w:val="BBBBBB"/>
+          <w:kern w:val="0"/>
+          <w:sz w:val="21"/>
+          <w:szCs w:val="21"/>
+          <w14:ligatures w14:val="none"/>
+        </w:rPr>
+      </w:pPr>
+      <w:proofErr w:type="spellStart"/>
+      <w:r>
+        <w:rPr>
+          <w:rFonts w:ascii="Consolas" w:eastAsia="Times New Roman" w:hAnsi="Consolas" w:cs="Times New Roman"/>
+          <w:i/>
+          <w:iCs/>
+          <w:color w:val="BBBBBB"/>
+          <w:kern w:val="0"/>
+          <w:sz w:val="21"/>
+          <w:szCs w:val="21"/>
+          <w14:ligatures w14:val="none"/>
+        </w:rPr>
+        <w:t>Recomendation</w:t>
+      </w:r>
+      <w:proofErr w:type="spellEnd"/>
+      <w:r>
+        <w:rPr>
+          <w:rFonts w:ascii="Consolas" w:eastAsia="Times New Roman" w:hAnsi="Consolas" w:cs="Times New Roman"/>
+          <w:i/>
+          <w:iCs/>
+          <w:color w:val="BBBBBB"/>
+          <w:kern w:val="0"/>
+          <w:sz w:val="21"/>
+          <w:szCs w:val="21"/>
+          <w14:ligatures w14:val="none"/>
+        </w:rPr>
+        <w:t>:</w:t>
+      </w:r>
+    </w:p>
+    <w:p>
+      <w:pPr>
+        <w:pStyle w:val="ListParagraph"/>
+        <w:numPr>
+          <w:ilvl w:val="0"/>
+          <w:numId w:val="16"/>
+        </w:numPr>
+        <w:shd w:val="clear" w:color="auto" w:fill="1C1E26"/>
+        <w:spacing w:after="0" w:line="285" w:lineRule="atLeast"/>
+        <w:rPr>
+          <w:rFonts w:ascii="Consolas" w:eastAsia="Times New Roman" w:hAnsi="Consolas" w:cs="Times New Roman"/>
+          <w:color w:val="BBBBBB"/>
+          <w:kern w:val="0"/>
+          <w:sz w:val="21"/>
+          <w:szCs w:val="21"/>
+          <w14:ligatures w14:val="none"/>
+        </w:rPr>
+      </w:pPr>
+      <w:r>
+        <w:rPr>
+          <w:rFonts w:ascii="Consolas" w:eastAsia="Times New Roman" w:hAnsi="Consolas" w:cs="Times New Roman"/>
+          <w:i/>
+          <w:iCs/>
+          <w:color w:val="BBBBBB"/>
+          <w:kern w:val="0"/>
+          <w:sz w:val="21"/>
+          <w:szCs w:val="21"/>
+          <w14:ligatures w14:val="none"/>
+        </w:rPr>
+        <w:t xml:space="preserve">Provider </w:t>
+      </w:r>
+      <w:proofErr w:type="spellStart"/>
+      <w:r>
+        <w:rPr>
+          <w:rFonts w:ascii="Consolas" w:eastAsia="Times New Roman" w:hAnsi="Consolas" w:cs="Times New Roman"/>
+          <w:i/>
+          <w:iCs/>
+          <w:color w:val="BBBBBB"/>
+          <w:kern w:val="0"/>
+          <w:sz w:val="21"/>
+          <w:szCs w:val="21"/>
+          <w14:ligatures w14:val="none"/>
+        </w:rPr>
+        <w:t>expereince</w:t>
+      </w:r>
+      <w:proofErr w:type="spellEnd"/>
+      <w:r>
+        <w:rPr>
+          <w:rFonts w:ascii="Consolas" w:eastAsia="Times New Roman" w:hAnsi="Consolas" w:cs="Times New Roman"/>
+          <w:i/>
+          <w:iCs/>
+          <w:color w:val="BBBBBB"/>
+          <w:kern w:val="0"/>
+          <w:sz w:val="21"/>
+          <w:szCs w:val="21"/>
+          <w14:ligatures w14:val="none"/>
+        </w:rPr>
+        <w:t xml:space="preserve"> does not appear to be a primary driver of patient satisfaction. </w:t>
+      </w:r>
+    </w:p>
+    <w:p>
+      <w:pPr>
+        <w:pStyle w:val="ListParagraph"/>
+        <w:numPr>
+          <w:ilvl w:val="0"/>
+          <w:numId w:val="16"/>
+        </w:numPr>
+        <w:shd w:val="clear" w:color="auto" w:fill="1C1E26"/>
+        <w:spacing w:after="0" w:line="285" w:lineRule="atLeast"/>
+        <w:rPr>
+          <w:rFonts w:ascii="Consolas" w:eastAsia="Times New Roman" w:hAnsi="Consolas" w:cs="Times New Roman"/>
+          <w:color w:val="BBBBBB"/>
+          <w:kern w:val="0"/>
+          <w:sz w:val="21"/>
+          <w:szCs w:val="21"/>
+          <w14:ligatures w14:val="none"/>
+        </w:rPr>
+      </w:pPr>
+      <w:r>
+        <w:rPr>
+          <w:rFonts w:ascii="Consolas" w:eastAsia="Times New Roman" w:hAnsi="Consolas" w:cs="Times New Roman"/>
+          <w:i/>
+          <w:iCs/>
+          <w:color w:val="BBBBBB"/>
+          <w:kern w:val="0"/>
+          <w:sz w:val="21"/>
+          <w:szCs w:val="21"/>
+          <w14:ligatures w14:val="none"/>
+        </w:rPr>
+        <w:t>Future analyses should investigate other factors such as appointment type, department, continuity of care, provider workload, patient characteristics, or other operational factors to better understand what influences satisfaction scores.  </w:t>
+      </w:r>
+    </w:p>
+    <w:p>
+      <w:pPr>
+        <w:pStyle w:val="ListParagraph"/>
+        <w:numPr>
+          <w:ilvl w:val="0"/>
+          <w:numId w:val="16"/>
+        </w:numPr>
+        <w:shd w:val="clear" w:color="auto" w:fill="1C1E26"/>
+        <w:spacing w:after="0" w:line="285" w:lineRule="atLeast"/>
+        <w:rPr>
+          <w:rFonts w:ascii="Consolas" w:eastAsia="Times New Roman" w:hAnsi="Consolas" w:cs="Times New Roman"/>
+          <w:color w:val="BBBBBB"/>
+          <w:kern w:val="0"/>
+          <w:sz w:val="21"/>
+          <w:szCs w:val="21"/>
+          <w14:ligatures w14:val="none"/>
+        </w:rPr>
+      </w:pPr>
+      <w:r>
+        <w:rPr>
+          <w:rFonts w:ascii="Consolas" w:eastAsia="Times New Roman" w:hAnsi="Consolas" w:cs="Times New Roman"/>
+          <w:i/>
+          <w:iCs/>
+          <w:color w:val="BBBBBB"/>
+          <w:kern w:val="0"/>
+          <w:sz w:val="21"/>
+          <w:szCs w:val="21"/>
+          <w14:ligatures w14:val="none"/>
+        </w:rPr>
+        <w:t>*/</w:t>
+      </w:r>
+    </w:p>
+    <w:p>
+      <w:pPr>
+        <w:pStyle w:val="ListParagraph"/>
+        <w:numPr>
+          <w:ilvl w:val="0"/>
+          <w:numId w:val="16"/>
+        </w:numPr>
+        <w:shd w:val="clear" w:color="auto" w:fill="1C1E26"/>
+        <w:spacing w:after="0" w:line="285" w:lineRule="atLeast"/>
+        <w:rPr>
+          <w:rFonts w:ascii="Consolas" w:eastAsia="Times New Roman" w:hAnsi="Consolas" w:cs="Times New Roman"/>
+          <w:color w:val="BBBBBB"/>
+          <w:kern w:val="0"/>
+          <w:sz w:val="21"/>
+          <w:szCs w:val="21"/>
+          <w14:ligatures w14:val="none"/>
+        </w:rPr>
+      </w:pPr>
+    </w:p>
+    <w:p>
+      <w:pPr>
+        <w:pStyle w:val="ListParagraph"/>
+        <w:numPr>
+          <w:ilvl w:val="0"/>
+          <w:numId w:val="16"/>
+        </w:numPr>
+        <w:shd w:val="clear" w:color="auto" w:fill="1C1E26"/>
+        <w:spacing w:after="0" w:line="285" w:lineRule="atLeast"/>
+        <w:rPr>
+          <w:rFonts w:ascii="Consolas" w:eastAsia="Times New Roman" w:hAnsi="Consolas" w:cs="Times New Roman"/>
+          <w:color w:val="BBBBBB"/>
+          <w:kern w:val="0"/>
+          <w:sz w:val="21"/>
+          <w:szCs w:val="21"/>
+          <w14:ligatures w14:val="none"/>
+        </w:rPr>
+      </w:pPr>
+      <w:r>
+        <w:rPr>
+          <w:rFonts w:ascii="Consolas" w:eastAsia="Times New Roman" w:hAnsi="Consolas" w:cs="Times New Roman"/>
+          <w:color w:val="B877DB"/>
+          <w:kern w:val="0"/>
+          <w:sz w:val="21"/>
+          <w:szCs w:val="21"/>
+          <w14:ligatures w14:val="none"/>
+        </w:rPr>
+        <w:t>Select</w:t>
+      </w:r>
+    </w:p>
+    <w:p>
+      <w:pPr>
+        <w:pStyle w:val="ListParagraph"/>
+        <w:numPr>
+          <w:ilvl w:val="0"/>
+          <w:numId w:val="16"/>
+        </w:numPr>
+        <w:shd w:val="clear" w:color="auto" w:fill="1C1E26"/>
+        <w:spacing w:after="0" w:line="285" w:lineRule="atLeast"/>
+        <w:rPr>
+          <w:rFonts w:ascii="Consolas" w:eastAsia="Times New Roman" w:hAnsi="Consolas" w:cs="Times New Roman"/>
+          <w:color w:val="BBBBBB"/>
+          <w:kern w:val="0"/>
+          <w:sz w:val="21"/>
+          <w:szCs w:val="21"/>
+          <w14:ligatures w14:val="none"/>
+        </w:rPr>
+      </w:pPr>
+      <w:r>
+        <w:rPr>
+          <w:rFonts w:ascii="Consolas" w:eastAsia="Times New Roman" w:hAnsi="Consolas" w:cs="Times New Roman"/>
+          <w:color w:val="BBBBBB"/>
+          <w:kern w:val="0"/>
+          <w:sz w:val="21"/>
+          <w:szCs w:val="21"/>
+          <w14:ligatures w14:val="none"/>
+        </w:rPr>
+        <w:t xml:space="preserve">      </w:t>
+      </w:r>
+      <w:proofErr w:type="spellStart"/>
+      <w:r>
+        <w:rPr>
+          <w:rFonts w:ascii="Consolas" w:eastAsia="Times New Roman" w:hAnsi="Consolas" w:cs="Times New Roman"/>
+          <w:color w:val="F09483"/>
+          <w:kern w:val="0"/>
+          <w:sz w:val="21"/>
+          <w:szCs w:val="21"/>
+          <w14:ligatures w14:val="none"/>
+        </w:rPr>
+        <w:t>prov</w:t>
+      </w:r>
+      <w:r>
+        <w:rPr>
+          <w:rFonts w:ascii="Consolas" w:eastAsia="Times New Roman" w:hAnsi="Consolas" w:cs="Times New Roman"/>
+          <w:color w:val="BBBBBB"/>
+          <w:kern w:val="0"/>
+          <w:sz w:val="21"/>
+          <w:szCs w:val="21"/>
+          <w14:ligatures w14:val="none"/>
+        </w:rPr>
+        <w:t>.</w:t>
+      </w:r>
+      <w:r>
+        <w:rPr>
+          <w:rFonts w:ascii="Consolas" w:eastAsia="Times New Roman" w:hAnsi="Consolas" w:cs="Times New Roman"/>
+          <w:color w:val="F09483"/>
+          <w:kern w:val="0"/>
+          <w:sz w:val="21"/>
+          <w:szCs w:val="21"/>
+          <w14:ligatures w14:val="none"/>
+        </w:rPr>
+        <w:t>years_experience</w:t>
+      </w:r>
+      <w:proofErr w:type="spellEnd"/>
+    </w:p>
+    <w:p>
+      <w:pPr>
+        <w:pStyle w:val="ListParagraph"/>
+        <w:numPr>
+          <w:ilvl w:val="0"/>
+          <w:numId w:val="16"/>
+        </w:numPr>
+        <w:shd w:val="clear" w:color="auto" w:fill="1C1E26"/>
+        <w:spacing w:after="0" w:line="285" w:lineRule="atLeast"/>
+        <w:rPr>
+          <w:rFonts w:ascii="Consolas" w:eastAsia="Times New Roman" w:hAnsi="Consolas" w:cs="Times New Roman"/>
+          <w:color w:val="BBBBBB"/>
+          <w:kern w:val="0"/>
+          <w:sz w:val="21"/>
+          <w:szCs w:val="21"/>
+          <w14:ligatures w14:val="none"/>
+        </w:rPr>
+      </w:pPr>
+      <w:r>
+        <w:rPr>
+          <w:rFonts w:ascii="Consolas" w:eastAsia="Times New Roman" w:hAnsi="Consolas" w:cs="Times New Roman"/>
+          <w:color w:val="BBBBBB"/>
+          <w:kern w:val="0"/>
+          <w:sz w:val="21"/>
+          <w:szCs w:val="21"/>
+          <w14:ligatures w14:val="none"/>
+        </w:rPr>
+        <w:t xml:space="preserve">    , </w:t>
+      </w:r>
+      <w:r>
+        <w:rPr>
+          <w:rFonts w:ascii="Consolas" w:eastAsia="Times New Roman" w:hAnsi="Consolas" w:cs="Times New Roman"/>
+          <w:color w:val="25B0BC"/>
+          <w:kern w:val="0"/>
+          <w:sz w:val="21"/>
+          <w:szCs w:val="21"/>
+          <w14:ligatures w14:val="none"/>
+        </w:rPr>
+        <w:t>max</w:t>
+      </w:r>
+      <w:r>
+        <w:rPr>
+          <w:rFonts w:ascii="Consolas" w:eastAsia="Times New Roman" w:hAnsi="Consolas" w:cs="Times New Roman"/>
+          <w:color w:val="BBBBBB"/>
+          <w:kern w:val="0"/>
+          <w:sz w:val="21"/>
+          <w:szCs w:val="21"/>
+          <w14:ligatures w14:val="none"/>
+        </w:rPr>
+        <w:t>(</w:t>
+      </w:r>
+      <w:proofErr w:type="spellStart"/>
+      <w:r>
+        <w:rPr>
+          <w:rFonts w:ascii="Consolas" w:eastAsia="Times New Roman" w:hAnsi="Consolas" w:cs="Times New Roman"/>
+          <w:color w:val="BBBBBB"/>
+          <w:kern w:val="0"/>
+          <w:sz w:val="21"/>
+          <w:szCs w:val="21"/>
+          <w14:ligatures w14:val="none"/>
+        </w:rPr>
+        <w:t>patient_satisfaction_score</w:t>
+      </w:r>
+      <w:proofErr w:type="spellEnd"/>
+      <w:r>
+        <w:rPr>
+          <w:rFonts w:ascii="Consolas" w:eastAsia="Times New Roman" w:hAnsi="Consolas" w:cs="Times New Roman"/>
+          <w:color w:val="BBBBBB"/>
+          <w:kern w:val="0"/>
+          <w:sz w:val="21"/>
+          <w:szCs w:val="21"/>
+          <w14:ligatures w14:val="none"/>
+        </w:rPr>
+        <w:t>)</w:t>
+      </w:r>
+    </w:p>
+    <w:p>
+      <w:pPr>
+        <w:pStyle w:val="ListParagraph"/>
+        <w:numPr>
+          <w:ilvl w:val="0"/>
+          <w:numId w:val="16"/>
+        </w:numPr>
+        <w:shd w:val="clear" w:color="auto" w:fill="1C1E26"/>
+        <w:spacing w:after="0" w:line="285" w:lineRule="atLeast"/>
+        <w:rPr>
+          <w:rFonts w:ascii="Consolas" w:eastAsia="Times New Roman" w:hAnsi="Consolas" w:cs="Times New Roman"/>
+          <w:color w:val="BBBBBB"/>
+          <w:kern w:val="0"/>
+          <w:sz w:val="21"/>
+          <w:szCs w:val="21"/>
+          <w14:ligatures w14:val="none"/>
+        </w:rPr>
+      </w:pPr>
+      <w:r>
+        <w:rPr>
+          <w:rFonts w:ascii="Consolas" w:eastAsia="Times New Roman" w:hAnsi="Consolas" w:cs="Times New Roman"/>
+          <w:color w:val="BBBBBB"/>
+          <w:kern w:val="0"/>
+          <w:sz w:val="21"/>
+          <w:szCs w:val="21"/>
+          <w14:ligatures w14:val="none"/>
+        </w:rPr>
+        <w:t xml:space="preserve">    , </w:t>
+      </w:r>
+      <w:r>
+        <w:rPr>
+          <w:rFonts w:ascii="Consolas" w:eastAsia="Times New Roman" w:hAnsi="Consolas" w:cs="Times New Roman"/>
+          <w:color w:val="25B0BC"/>
+          <w:kern w:val="0"/>
+          <w:sz w:val="21"/>
+          <w:szCs w:val="21"/>
+          <w14:ligatures w14:val="none"/>
+        </w:rPr>
+        <w:t>min</w:t>
+      </w:r>
+      <w:r>
+        <w:rPr>
+          <w:rFonts w:ascii="Consolas" w:eastAsia="Times New Roman" w:hAnsi="Consolas" w:cs="Times New Roman"/>
+          <w:color w:val="BBBBBB"/>
+          <w:kern w:val="0"/>
+          <w:sz w:val="21"/>
+          <w:szCs w:val="21"/>
+          <w14:ligatures w14:val="none"/>
+        </w:rPr>
+        <w:t>(</w:t>
+      </w:r>
+      <w:proofErr w:type="spellStart"/>
+      <w:r>
+        <w:rPr>
+          <w:rFonts w:ascii="Consolas" w:eastAsia="Times New Roman" w:hAnsi="Consolas" w:cs="Times New Roman"/>
+          <w:color w:val="BBBBBB"/>
+          <w:kern w:val="0"/>
+          <w:sz w:val="21"/>
+          <w:szCs w:val="21"/>
+          <w14:ligatures w14:val="none"/>
+        </w:rPr>
+        <w:t>patient_satisfaction_score</w:t>
+      </w:r>
+      <w:proofErr w:type="spellEnd"/>
+      <w:r>
+        <w:rPr>
+          <w:rFonts w:ascii="Consolas" w:eastAsia="Times New Roman" w:hAnsi="Consolas" w:cs="Times New Roman"/>
+          <w:color w:val="BBBBBB"/>
+          <w:kern w:val="0"/>
+          <w:sz w:val="21"/>
+          <w:szCs w:val="21"/>
+          <w14:ligatures w14:val="none"/>
+        </w:rPr>
+        <w:t>)</w:t>
+      </w:r>
+    </w:p>
+    <w:p>
+      <w:pPr>
+        <w:pStyle w:val="ListParagraph"/>
+        <w:numPr>
+          <w:ilvl w:val="0"/>
+          <w:numId w:val="16"/>
+        </w:numPr>
+        <w:shd w:val="clear" w:color="auto" w:fill="1C1E26"/>
+        <w:spacing w:after="0" w:line="285" w:lineRule="atLeast"/>
+        <w:rPr>
+          <w:rFonts w:ascii="Consolas" w:eastAsia="Times New Roman" w:hAnsi="Consolas" w:cs="Times New Roman"/>
+          <w:color w:val="BBBBBB"/>
+          <w:kern w:val="0"/>
+          <w:sz w:val="21"/>
+          <w:szCs w:val="21"/>
+          <w14:ligatures w14:val="none"/>
+        </w:rPr>
+      </w:pPr>
+      <w:r>
+        <w:rPr>
+          <w:rFonts w:ascii="Consolas" w:eastAsia="Times New Roman" w:hAnsi="Consolas" w:cs="Times New Roman"/>
+          <w:color w:val="BBBBBB"/>
+          <w:kern w:val="0"/>
+          <w:sz w:val="21"/>
+          <w:szCs w:val="21"/>
+          <w14:ligatures w14:val="none"/>
+        </w:rPr>
+        <w:t xml:space="preserve">    , </w:t>
+      </w:r>
+      <w:r>
+        <w:rPr>
+          <w:rFonts w:ascii="Consolas" w:eastAsia="Times New Roman" w:hAnsi="Consolas" w:cs="Times New Roman"/>
+          <w:color w:val="25B0BC"/>
+          <w:kern w:val="0"/>
+          <w:sz w:val="21"/>
+          <w:szCs w:val="21"/>
+          <w14:ligatures w14:val="none"/>
+        </w:rPr>
+        <w:t>round</w:t>
+      </w:r>
+      <w:r>
+        <w:rPr>
+          <w:rFonts w:ascii="Consolas" w:eastAsia="Times New Roman" w:hAnsi="Consolas" w:cs="Times New Roman"/>
+          <w:color w:val="BBBBBB"/>
+          <w:kern w:val="0"/>
+          <w:sz w:val="21"/>
+          <w:szCs w:val="21"/>
+          <w14:ligatures w14:val="none"/>
+        </w:rPr>
+        <w:t>(</w:t>
+      </w:r>
+      <w:r>
+        <w:rPr>
+          <w:rFonts w:ascii="Consolas" w:eastAsia="Times New Roman" w:hAnsi="Consolas" w:cs="Times New Roman"/>
+          <w:color w:val="25B0BC"/>
+          <w:kern w:val="0"/>
+          <w:sz w:val="21"/>
+          <w:szCs w:val="21"/>
+          <w14:ligatures w14:val="none"/>
+        </w:rPr>
+        <w:t>avg</w:t>
+      </w:r>
+      <w:r>
+        <w:rPr>
+          <w:rFonts w:ascii="Consolas" w:eastAsia="Times New Roman" w:hAnsi="Consolas" w:cs="Times New Roman"/>
+          <w:color w:val="BBBBBB"/>
+          <w:kern w:val="0"/>
+          <w:sz w:val="21"/>
+          <w:szCs w:val="21"/>
+          <w14:ligatures w14:val="none"/>
+        </w:rPr>
+        <w:t>(</w:t>
+      </w:r>
+      <w:proofErr w:type="spellStart"/>
+      <w:r>
+        <w:rPr>
+          <w:rFonts w:ascii="Consolas" w:eastAsia="Times New Roman" w:hAnsi="Consolas" w:cs="Times New Roman"/>
+          <w:color w:val="BBBBBB"/>
+          <w:kern w:val="0"/>
+          <w:sz w:val="21"/>
+          <w:szCs w:val="21"/>
+          <w14:ligatures w14:val="none"/>
+        </w:rPr>
+        <w:t>patient_satisfaction_score</w:t>
+      </w:r>
+      <w:proofErr w:type="spellEnd"/>
+      <w:r>
+        <w:rPr>
+          <w:rFonts w:ascii="Consolas" w:eastAsia="Times New Roman" w:hAnsi="Consolas" w:cs="Times New Roman"/>
+          <w:color w:val="BBBBBB"/>
+          <w:kern w:val="0"/>
+          <w:sz w:val="21"/>
+          <w:szCs w:val="21"/>
+          <w14:ligatures w14:val="none"/>
+        </w:rPr>
+        <w:t>),</w:t>
+      </w:r>
+      <w:r>
+        <w:rPr>
+          <w:rFonts w:ascii="Consolas" w:eastAsia="Times New Roman" w:hAnsi="Consolas" w:cs="Times New Roman"/>
+          <w:color w:val="F09483"/>
+          <w:kern w:val="0"/>
+          <w:sz w:val="21"/>
+          <w:szCs w:val="21"/>
+          <w14:ligatures w14:val="none"/>
+        </w:rPr>
+        <w:t>2</w:t>
+      </w:r>
+      <w:r>
+        <w:rPr>
+          <w:rFonts w:ascii="Consolas" w:eastAsia="Times New Roman" w:hAnsi="Consolas" w:cs="Times New Roman"/>
+          <w:color w:val="BBBBBB"/>
+          <w:kern w:val="0"/>
+          <w:sz w:val="21"/>
+          <w:szCs w:val="21"/>
+          <w14:ligatures w14:val="none"/>
+        </w:rPr>
+        <w:t xml:space="preserve">) </w:t>
+      </w:r>
+      <w:r>
+        <w:rPr>
+          <w:rFonts w:ascii="Consolas" w:eastAsia="Times New Roman" w:hAnsi="Consolas" w:cs="Times New Roman"/>
+          <w:color w:val="B877DB"/>
+          <w:kern w:val="0"/>
+          <w:sz w:val="21"/>
+          <w:szCs w:val="21"/>
+          <w14:ligatures w14:val="none"/>
+        </w:rPr>
+        <w:t>as</w:t>
+      </w:r>
+      <w:r>
+        <w:rPr>
+          <w:rFonts w:ascii="Consolas" w:eastAsia="Times New Roman" w:hAnsi="Consolas" w:cs="Times New Roman"/>
+          <w:color w:val="BBBBBB"/>
+          <w:kern w:val="0"/>
+          <w:sz w:val="21"/>
+          <w:szCs w:val="21"/>
+          <w14:ligatures w14:val="none"/>
+        </w:rPr>
+        <w:t xml:space="preserve"> </w:t>
+      </w:r>
+      <w:proofErr w:type="spellStart"/>
+      <w:r>
+        <w:rPr>
+          <w:rFonts w:ascii="Consolas" w:eastAsia="Times New Roman" w:hAnsi="Consolas" w:cs="Times New Roman"/>
+          <w:color w:val="BBBBBB"/>
+          <w:kern w:val="0"/>
+          <w:sz w:val="21"/>
+          <w:szCs w:val="21"/>
+          <w14:ligatures w14:val="none"/>
+        </w:rPr>
+        <w:t>avg_satisf_score</w:t>
+      </w:r>
+      <w:proofErr w:type="spellEnd"/>
+    </w:p>
+    <w:p>
+      <w:pPr>
+        <w:pStyle w:val="ListParagraph"/>
+        <w:numPr>
+          <w:ilvl w:val="0"/>
+          <w:numId w:val="16"/>
+        </w:numPr>
+        <w:shd w:val="clear" w:color="auto" w:fill="1C1E26"/>
+        <w:spacing w:after="0" w:line="285" w:lineRule="atLeast"/>
+        <w:rPr>
+          <w:rFonts w:ascii="Consolas" w:eastAsia="Times New Roman" w:hAnsi="Consolas" w:cs="Times New Roman"/>
+          <w:color w:val="BBBBBB"/>
+          <w:kern w:val="0"/>
+          <w:sz w:val="21"/>
+          <w:szCs w:val="21"/>
+          <w14:ligatures w14:val="none"/>
+        </w:rPr>
+      </w:pPr>
+    </w:p>
+    <w:p>
+      <w:pPr>
+        <w:pStyle w:val="ListParagraph"/>
+        <w:numPr>
+          <w:ilvl w:val="0"/>
+          <w:numId w:val="16"/>
+        </w:numPr>
+        <w:shd w:val="clear" w:color="auto" w:fill="1C1E26"/>
+        <w:spacing w:after="0" w:line="285" w:lineRule="atLeast"/>
+        <w:rPr>
+          <w:rFonts w:ascii="Consolas" w:eastAsia="Times New Roman" w:hAnsi="Consolas" w:cs="Times New Roman"/>
+          <w:color w:val="BBBBBB"/>
+          <w:kern w:val="0"/>
+          <w:sz w:val="21"/>
+          <w:szCs w:val="21"/>
+          <w14:ligatures w14:val="none"/>
+        </w:rPr>
+      </w:pPr>
+      <w:r>
+        <w:rPr>
+          <w:rFonts w:ascii="Consolas" w:eastAsia="Times New Roman" w:hAnsi="Consolas" w:cs="Times New Roman"/>
+          <w:color w:val="B877DB"/>
+          <w:kern w:val="0"/>
+          <w:sz w:val="21"/>
+          <w:szCs w:val="21"/>
+          <w14:ligatures w14:val="none"/>
+        </w:rPr>
+        <w:t>From</w:t>
+      </w:r>
+    </w:p>
+    <w:p>
+      <w:pPr>
+        <w:pStyle w:val="ListParagraph"/>
+        <w:numPr>
+          <w:ilvl w:val="0"/>
+          <w:numId w:val="16"/>
+        </w:numPr>
+        <w:shd w:val="clear" w:color="auto" w:fill="1C1E26"/>
+        <w:spacing w:after="0" w:line="285" w:lineRule="atLeast"/>
+        <w:rPr>
+          <w:rFonts w:ascii="Consolas" w:eastAsia="Times New Roman" w:hAnsi="Consolas" w:cs="Times New Roman"/>
+          <w:color w:val="BBBBBB"/>
+          <w:kern w:val="0"/>
+          <w:sz w:val="21"/>
+          <w:szCs w:val="21"/>
+          <w14:ligatures w14:val="none"/>
+        </w:rPr>
+      </w:pPr>
+      <w:r>
+        <w:rPr>
+          <w:rFonts w:ascii="Consolas" w:eastAsia="Times New Roman" w:hAnsi="Consolas" w:cs="Times New Roman"/>
+          <w:color w:val="BBBBBB"/>
+          <w:kern w:val="0"/>
+          <w:sz w:val="21"/>
+          <w:szCs w:val="21"/>
+          <w14:ligatures w14:val="none"/>
+        </w:rPr>
+        <w:t>    providers prov</w:t>
+      </w:r>
+    </w:p>
+    <w:p>
+      <w:pPr>
+        <w:pStyle w:val="ListParagraph"/>
+        <w:numPr>
+          <w:ilvl w:val="0"/>
+          <w:numId w:val="16"/>
+        </w:numPr>
+        <w:shd w:val="clear" w:color="auto" w:fill="1C1E26"/>
+        <w:spacing w:after="0" w:line="285" w:lineRule="atLeast"/>
+        <w:rPr>
+          <w:rFonts w:ascii="Consolas" w:eastAsia="Times New Roman" w:hAnsi="Consolas" w:cs="Times New Roman"/>
+          <w:color w:val="BBBBBB"/>
+          <w:kern w:val="0"/>
+          <w:sz w:val="21"/>
+          <w:szCs w:val="21"/>
+          <w14:ligatures w14:val="none"/>
+        </w:rPr>
+      </w:pPr>
+      <w:r>
+        <w:rPr>
+          <w:rFonts w:ascii="Consolas" w:eastAsia="Times New Roman" w:hAnsi="Consolas" w:cs="Times New Roman"/>
+          <w:color w:val="BBBBBB"/>
+          <w:kern w:val="0"/>
+          <w:sz w:val="21"/>
+          <w:szCs w:val="21"/>
+          <w14:ligatures w14:val="none"/>
+        </w:rPr>
+        <w:t xml:space="preserve">        </w:t>
+      </w:r>
+      <w:r>
+        <w:rPr>
+          <w:rFonts w:ascii="Consolas" w:eastAsia="Times New Roman" w:hAnsi="Consolas" w:cs="Times New Roman"/>
+          <w:color w:val="B877DB"/>
+          <w:kern w:val="0"/>
+          <w:sz w:val="21"/>
+          <w:szCs w:val="21"/>
+          <w14:ligatures w14:val="none"/>
+        </w:rPr>
+        <w:t>inner join</w:t>
+      </w:r>
+      <w:r>
+        <w:rPr>
+          <w:rFonts w:ascii="Consolas" w:eastAsia="Times New Roman" w:hAnsi="Consolas" w:cs="Times New Roman"/>
+          <w:color w:val="BBBBBB"/>
+          <w:kern w:val="0"/>
+          <w:sz w:val="21"/>
+          <w:szCs w:val="21"/>
+          <w14:ligatures w14:val="none"/>
+        </w:rPr>
+        <w:t xml:space="preserve"> appointments app</w:t>
+      </w:r>
+    </w:p>
+    <w:p>
+      <w:pPr>
+        <w:pStyle w:val="ListParagraph"/>
+        <w:numPr>
+          <w:ilvl w:val="0"/>
+          <w:numId w:val="16"/>
+        </w:numPr>
+        <w:shd w:val="clear" w:color="auto" w:fill="1C1E26"/>
+        <w:spacing w:after="0" w:line="285" w:lineRule="atLeast"/>
+        <w:rPr>
+          <w:rFonts w:ascii="Consolas" w:eastAsia="Times New Roman" w:hAnsi="Consolas" w:cs="Times New Roman"/>
+          <w:color w:val="BBBBBB"/>
+          <w:kern w:val="0"/>
+          <w:sz w:val="21"/>
+          <w:szCs w:val="21"/>
+          <w14:ligatures w14:val="none"/>
+        </w:rPr>
+      </w:pPr>
+      <w:r>
+        <w:rPr>
+          <w:rFonts w:ascii="Consolas" w:eastAsia="Times New Roman" w:hAnsi="Consolas" w:cs="Times New Roman"/>
+          <w:color w:val="BBBBBB"/>
+          <w:kern w:val="0"/>
+          <w:sz w:val="21"/>
+          <w:szCs w:val="21"/>
+          <w14:ligatures w14:val="none"/>
+        </w:rPr>
+        <w:t xml:space="preserve">            </w:t>
+      </w:r>
+      <w:r>
+        <w:rPr>
+          <w:rFonts w:ascii="Consolas" w:eastAsia="Times New Roman" w:hAnsi="Consolas" w:cs="Times New Roman"/>
+          <w:color w:val="B877DB"/>
+          <w:kern w:val="0"/>
+          <w:sz w:val="21"/>
+          <w:szCs w:val="21"/>
+          <w14:ligatures w14:val="none"/>
+        </w:rPr>
+        <w:t>on</w:t>
+      </w:r>
+      <w:r>
+        <w:rPr>
+          <w:rFonts w:ascii="Consolas" w:eastAsia="Times New Roman" w:hAnsi="Consolas" w:cs="Times New Roman"/>
+          <w:color w:val="BBBBBB"/>
+          <w:kern w:val="0"/>
+          <w:sz w:val="21"/>
+          <w:szCs w:val="21"/>
+          <w14:ligatures w14:val="none"/>
+        </w:rPr>
+        <w:t xml:space="preserve"> </w:t>
+      </w:r>
+      <w:proofErr w:type="spellStart"/>
+      <w:r>
+        <w:rPr>
+          <w:rFonts w:ascii="Consolas" w:eastAsia="Times New Roman" w:hAnsi="Consolas" w:cs="Times New Roman"/>
+          <w:color w:val="F09483"/>
+          <w:kern w:val="0"/>
+          <w:sz w:val="21"/>
+          <w:szCs w:val="21"/>
+          <w14:ligatures w14:val="none"/>
+        </w:rPr>
+        <w:t>prov</w:t>
+      </w:r>
+      <w:r>
+        <w:rPr>
+          <w:rFonts w:ascii="Consolas" w:eastAsia="Times New Roman" w:hAnsi="Consolas" w:cs="Times New Roman"/>
+          <w:color w:val="BBBBBB"/>
+          <w:kern w:val="0"/>
+          <w:sz w:val="21"/>
+          <w:szCs w:val="21"/>
+          <w14:ligatures w14:val="none"/>
+        </w:rPr>
+        <w:t>.</w:t>
+      </w:r>
+      <w:r>
+        <w:rPr>
+          <w:rFonts w:ascii="Consolas" w:eastAsia="Times New Roman" w:hAnsi="Consolas" w:cs="Times New Roman"/>
+          <w:color w:val="F09483"/>
+          <w:kern w:val="0"/>
+          <w:sz w:val="21"/>
+          <w:szCs w:val="21"/>
+          <w14:ligatures w14:val="none"/>
+        </w:rPr>
+        <w:t>provider_id</w:t>
+      </w:r>
+      <w:proofErr w:type="spellEnd"/>
+      <w:r>
+        <w:rPr>
+          <w:rFonts w:ascii="Consolas" w:eastAsia="Times New Roman" w:hAnsi="Consolas" w:cs="Times New Roman"/>
+          <w:color w:val="BBBBBB"/>
+          <w:kern w:val="0"/>
+          <w:sz w:val="21"/>
+          <w:szCs w:val="21"/>
+          <w14:ligatures w14:val="none"/>
+        </w:rPr>
+        <w:t>=</w:t>
+      </w:r>
+      <w:proofErr w:type="spellStart"/>
+      <w:r>
+        <w:rPr>
+          <w:rFonts w:ascii="Consolas" w:eastAsia="Times New Roman" w:hAnsi="Consolas" w:cs="Times New Roman"/>
+          <w:color w:val="F09483"/>
+          <w:kern w:val="0"/>
+          <w:sz w:val="21"/>
+          <w:szCs w:val="21"/>
+          <w14:ligatures w14:val="none"/>
+        </w:rPr>
+        <w:t>app</w:t>
+      </w:r>
+      <w:r>
+        <w:rPr>
+          <w:rFonts w:ascii="Consolas" w:eastAsia="Times New Roman" w:hAnsi="Consolas" w:cs="Times New Roman"/>
+          <w:color w:val="BBBBBB"/>
+          <w:kern w:val="0"/>
+          <w:sz w:val="21"/>
+          <w:szCs w:val="21"/>
+          <w14:ligatures w14:val="none"/>
+        </w:rPr>
+        <w:t>.</w:t>
+      </w:r>
+      <w:r>
+        <w:rPr>
+          <w:rFonts w:ascii="Consolas" w:eastAsia="Times New Roman" w:hAnsi="Consolas" w:cs="Times New Roman"/>
+          <w:color w:val="F09483"/>
+          <w:kern w:val="0"/>
+          <w:sz w:val="21"/>
+          <w:szCs w:val="21"/>
+          <w14:ligatures w14:val="none"/>
+        </w:rPr>
+        <w:t>provider_id</w:t>
+      </w:r>
+      <w:proofErr w:type="spellEnd"/>
+    </w:p>
+    <w:p>
+      <w:pPr>
+        <w:pStyle w:val="ListParagraph"/>
+        <w:numPr>
+          <w:ilvl w:val="0"/>
+          <w:numId w:val="16"/>
+        </w:numPr>
+        <w:shd w:val="clear" w:color="auto" w:fill="1C1E26"/>
+        <w:spacing w:after="0" w:line="285" w:lineRule="atLeast"/>
+        <w:rPr>
+          <w:rFonts w:ascii="Consolas" w:eastAsia="Times New Roman" w:hAnsi="Consolas" w:cs="Times New Roman"/>
+          <w:color w:val="BBBBBB"/>
+          <w:kern w:val="0"/>
+          <w:sz w:val="21"/>
+          <w:szCs w:val="21"/>
+          <w14:ligatures w14:val="none"/>
+        </w:rPr>
+      </w:pPr>
+    </w:p>
+    <w:p>
+      <w:pPr>
+        <w:pStyle w:val="ListParagraph"/>
+        <w:numPr>
+          <w:ilvl w:val="0"/>
+          <w:numId w:val="16"/>
+        </w:numPr>
+        <w:shd w:val="clear" w:color="auto" w:fill="1C1E26"/>
+        <w:spacing w:after="0" w:line="285" w:lineRule="atLeast"/>
+        <w:rPr>
+          <w:rFonts w:ascii="Consolas" w:eastAsia="Times New Roman" w:hAnsi="Consolas" w:cs="Times New Roman"/>
+          <w:color w:val="BBBBBB"/>
+          <w:kern w:val="0"/>
+          <w:sz w:val="21"/>
+          <w:szCs w:val="21"/>
+          <w14:ligatures w14:val="none"/>
+        </w:rPr>
+      </w:pPr>
+      <w:r>
+        <w:rPr>
+          <w:rFonts w:ascii="Consolas" w:eastAsia="Times New Roman" w:hAnsi="Consolas" w:cs="Times New Roman"/>
+          <w:color w:val="B877DB"/>
+          <w:kern w:val="0"/>
+          <w:sz w:val="21"/>
+          <w:szCs w:val="21"/>
+          <w14:ligatures w14:val="none"/>
+        </w:rPr>
+        <w:t>Group By</w:t>
+      </w:r>
+      <w:r>
+        <w:rPr>
+          <w:rFonts w:ascii="Consolas" w:eastAsia="Times New Roman" w:hAnsi="Consolas" w:cs="Times New Roman"/>
+          <w:color w:val="BBBBBB"/>
+          <w:kern w:val="0"/>
+          <w:sz w:val="21"/>
+          <w:szCs w:val="21"/>
+          <w14:ligatures w14:val="none"/>
+        </w:rPr>
+        <w:t xml:space="preserve">     </w:t>
+      </w:r>
+    </w:p>
+    <w:p>
+      <w:pPr>
+        <w:pStyle w:val="ListParagraph"/>
+        <w:numPr>
+          <w:ilvl w:val="0"/>
+          <w:numId w:val="16"/>
+        </w:numPr>
+        <w:shd w:val="clear" w:color="auto" w:fill="1C1E26"/>
+        <w:spacing w:after="0" w:line="285" w:lineRule="atLeast"/>
+        <w:rPr>
+          <w:rFonts w:ascii="Consolas" w:eastAsia="Times New Roman" w:hAnsi="Consolas" w:cs="Times New Roman"/>
+          <w:color w:val="BBBBBB"/>
+          <w:kern w:val="0"/>
+          <w:sz w:val="21"/>
+          <w:szCs w:val="21"/>
+          <w14:ligatures w14:val="none"/>
+        </w:rPr>
+      </w:pPr>
+      <w:r>
+        <w:rPr>
+          <w:rFonts w:ascii="Consolas" w:eastAsia="Times New Roman" w:hAnsi="Consolas" w:cs="Times New Roman"/>
+          <w:color w:val="BBBBBB"/>
+          <w:kern w:val="0"/>
+          <w:sz w:val="21"/>
+          <w:szCs w:val="21"/>
+          <w14:ligatures w14:val="none"/>
+        </w:rPr>
+        <w:t xml:space="preserve">    </w:t>
+      </w:r>
+      <w:proofErr w:type="spellStart"/>
+      <w:r>
+        <w:rPr>
+          <w:rFonts w:ascii="Consolas" w:eastAsia="Times New Roman" w:hAnsi="Consolas" w:cs="Times New Roman"/>
+          <w:color w:val="F09483"/>
+          <w:kern w:val="0"/>
+          <w:sz w:val="21"/>
+          <w:szCs w:val="21"/>
+          <w14:ligatures w14:val="none"/>
+        </w:rPr>
+        <w:t>prov</w:t>
+      </w:r>
+      <w:r>
+        <w:rPr>
+          <w:rFonts w:ascii="Consolas" w:eastAsia="Times New Roman" w:hAnsi="Consolas" w:cs="Times New Roman"/>
+          <w:color w:val="BBBBBB"/>
+          <w:kern w:val="0"/>
+          <w:sz w:val="21"/>
+          <w:szCs w:val="21"/>
+          <w14:ligatures w14:val="none"/>
+        </w:rPr>
+        <w:t>.</w:t>
+      </w:r>
+      <w:r>
+        <w:rPr>
+          <w:rFonts w:ascii="Consolas" w:eastAsia="Times New Roman" w:hAnsi="Consolas" w:cs="Times New Roman"/>
+          <w:color w:val="F09483"/>
+          <w:kern w:val="0"/>
+          <w:sz w:val="21"/>
+          <w:szCs w:val="21"/>
+          <w14:ligatures w14:val="none"/>
+        </w:rPr>
+        <w:t>years_experience</w:t>
+      </w:r>
+      <w:proofErr w:type="spellEnd"/>
+    </w:p>
+    <w:p>
+      <w:pPr>
+        <w:pStyle w:val="ListParagraph"/>
+        <w:numPr>
+          <w:ilvl w:val="0"/>
+          <w:numId w:val="16"/>
+        </w:numPr>
+        <w:shd w:val="clear" w:color="auto" w:fill="1C1E26"/>
+        <w:spacing w:after="0" w:line="285" w:lineRule="atLeast"/>
+        <w:rPr>
+          <w:rFonts w:ascii="Consolas" w:eastAsia="Times New Roman" w:hAnsi="Consolas" w:cs="Times New Roman"/>
+          <w:color w:val="BBBBBB"/>
+          <w:kern w:val="0"/>
+          <w:sz w:val="21"/>
+          <w:szCs w:val="21"/>
+          <w14:ligatures w14:val="none"/>
+        </w:rPr>
+      </w:pPr>
+    </w:p>
+    <w:p>
+      <w:pPr>
+        <w:pStyle w:val="ListParagraph"/>
+        <w:numPr>
+          <w:ilvl w:val="0"/>
+          <w:numId w:val="16"/>
+        </w:numPr>
+        <w:shd w:val="clear" w:color="auto" w:fill="1C1E26"/>
+        <w:spacing w:after="0" w:line="285" w:lineRule="atLeast"/>
+        <w:rPr>
+          <w:rFonts w:ascii="Consolas" w:eastAsia="Times New Roman" w:hAnsi="Consolas" w:cs="Times New Roman"/>
+          <w:color w:val="BBBBBB"/>
+          <w:kern w:val="0"/>
+          <w:sz w:val="21"/>
+          <w:szCs w:val="21"/>
+          <w14:ligatures w14:val="none"/>
+        </w:rPr>
+      </w:pPr>
+      <w:r>
+        <w:rPr>
+          <w:rFonts w:ascii="Consolas" w:eastAsia="Times New Roman" w:hAnsi="Consolas" w:cs="Times New Roman"/>
+          <w:color w:val="B877DB"/>
+          <w:kern w:val="0"/>
+          <w:sz w:val="21"/>
+          <w:szCs w:val="21"/>
+          <w14:ligatures w14:val="none"/>
+        </w:rPr>
+        <w:t>Order By</w:t>
+      </w:r>
+    </w:p>
+    <w:p>
+      <w:pPr>
+        <w:pStyle w:val="ListParagraph"/>
+        <w:numPr>
+          <w:ilvl w:val="0"/>
+          <w:numId w:val="16"/>
+        </w:numPr>
+        <w:shd w:val="clear" w:color="auto" w:fill="1C1E26"/>
+        <w:spacing w:after="0" w:line="285" w:lineRule="atLeast"/>
+        <w:rPr>
+          <w:rFonts w:ascii="Consolas" w:eastAsia="Times New Roman" w:hAnsi="Consolas" w:cs="Times New Roman"/>
+          <w:color w:val="BBBBBB"/>
+          <w:kern w:val="0"/>
+          <w:sz w:val="21"/>
+          <w:szCs w:val="21"/>
+          <w14:ligatures w14:val="none"/>
+        </w:rPr>
+      </w:pPr>
+      <w:r>
+        <w:rPr>
+          <w:rFonts w:ascii="Consolas" w:eastAsia="Times New Roman" w:hAnsi="Consolas" w:cs="Times New Roman"/>
+          <w:color w:val="BBBBBB"/>
+          <w:kern w:val="0"/>
+          <w:sz w:val="21"/>
+          <w:szCs w:val="21"/>
+          <w14:ligatures w14:val="none"/>
+        </w:rPr>
+        <w:t xml:space="preserve">    </w:t>
+      </w:r>
+      <w:proofErr w:type="spellStart"/>
+      <w:r>
+        <w:rPr>
+          <w:rFonts w:ascii="Consolas" w:eastAsia="Times New Roman" w:hAnsi="Consolas" w:cs="Times New Roman"/>
+          <w:color w:val="BBBBBB"/>
+          <w:kern w:val="0"/>
+          <w:sz w:val="21"/>
+          <w:szCs w:val="21"/>
+          <w14:ligatures w14:val="none"/>
+        </w:rPr>
+        <w:t>avg_satisf_score</w:t>
+      </w:r>
+      <w:proofErr w:type="spellEnd"/>
+      <w:r>
+        <w:rPr>
+          <w:rFonts w:ascii="Consolas" w:eastAsia="Times New Roman" w:hAnsi="Consolas" w:cs="Times New Roman"/>
+          <w:color w:val="BBBBBB"/>
+          <w:kern w:val="0"/>
+          <w:sz w:val="21"/>
+          <w:szCs w:val="21"/>
+          <w14:ligatures w14:val="none"/>
+        </w:rPr>
+        <w:t xml:space="preserve"> </w:t>
+      </w:r>
+      <w:r>
+        <w:rPr>
+          <w:rFonts w:ascii="Consolas" w:eastAsia="Times New Roman" w:hAnsi="Consolas" w:cs="Times New Roman"/>
+          <w:color w:val="B877DB"/>
+          <w:kern w:val="0"/>
+          <w:sz w:val="21"/>
+          <w:szCs w:val="21"/>
+          <w14:ligatures w14:val="none"/>
+        </w:rPr>
+        <w:t>desc</w:t>
+      </w:r>
+    </w:p>
+    <w:p>
+      <w:pPr>
+        <w:pStyle w:val="ListParagraph"/>
+        <w:numPr>
+          <w:ilvl w:val="0"/>
+          <w:numId w:val="16"/>
+        </w:numPr>
+        <w:shd w:val="clear" w:color="auto" w:fill="1C1E26"/>
+        <w:spacing w:after="0" w:line="285" w:lineRule="atLeast"/>
+        <w:rPr>
+          <w:rFonts w:ascii="Consolas" w:eastAsia="Times New Roman" w:hAnsi="Consolas" w:cs="Times New Roman"/>
+          <w:color w:val="BBBBBB"/>
+          <w:kern w:val="0"/>
+          <w:sz w:val="21"/>
+          <w:szCs w:val="21"/>
+          <w14:ligatures w14:val="none"/>
+        </w:rPr>
+      </w:pPr>
+      <w:r>
+        <w:rPr>
+          <w:rFonts w:ascii="Consolas" w:eastAsia="Times New Roman" w:hAnsi="Consolas" w:cs="Times New Roman"/>
+          <w:color w:val="BBBBBB"/>
+          <w:kern w:val="0"/>
+          <w:sz w:val="21"/>
+          <w:szCs w:val="21"/>
+          <w14:ligatures w14:val="none"/>
+        </w:rPr>
+        <w:t xml:space="preserve">    </w:t>
+      </w:r>
+      <w:r>
+        <w:rPr>
+          <w:rFonts w:ascii="Consolas" w:eastAsia="Times New Roman" w:hAnsi="Consolas" w:cs="Times New Roman"/>
+          <w:i/>
+          <w:iCs/>
+          <w:color w:val="BBBBBB"/>
+          <w:kern w:val="0"/>
+          <w:sz w:val="21"/>
+          <w:szCs w:val="21"/>
+          <w14:ligatures w14:val="none"/>
+        </w:rPr>
+        <w:t>--</w:t>
+      </w:r>
+      <w:proofErr w:type="spellStart"/>
+      <w:r>
+        <w:rPr>
+          <w:rFonts w:ascii="Consolas" w:eastAsia="Times New Roman" w:hAnsi="Consolas" w:cs="Times New Roman"/>
+          <w:i/>
+          <w:iCs/>
+          <w:color w:val="BBBBBB"/>
+          <w:kern w:val="0"/>
+          <w:sz w:val="21"/>
+          <w:szCs w:val="21"/>
+          <w14:ligatures w14:val="none"/>
+        </w:rPr>
+        <w:t>years_experience</w:t>
+      </w:r>
+      <w:proofErr w:type="spellEnd"/>
+    </w:p>
+    <w:p>
+      <w:pPr>
+        <w:pStyle w:val="ListParagraph"/>
+        <w:numPr>
+          <w:ilvl w:val="0"/>
+          <w:numId w:val="16"/>
+        </w:numPr>
+        <w:shd w:val="clear" w:color="auto" w:fill="1C1E26"/>
+        <w:spacing w:after="0" w:line="285" w:lineRule="atLeast"/>
+        <w:rPr>
+          <w:rFonts w:ascii="Consolas" w:eastAsia="Times New Roman" w:hAnsi="Consolas" w:cs="Times New Roman"/>
+          <w:color w:val="BBBBBB"/>
+          <w:kern w:val="0"/>
+          <w:sz w:val="21"/>
+          <w:szCs w:val="21"/>
+          <w14:ligatures w14:val="none"/>
+        </w:rPr>
+      </w:pPr>
+      <w:r>
+        <w:rPr>
+          <w:rFonts w:ascii="Consolas" w:eastAsia="Times New Roman" w:hAnsi="Consolas" w:cs="Times New Roman"/>
+          <w:color w:val="BBBBBB"/>
+          <w:kern w:val="0"/>
+          <w:sz w:val="21"/>
+          <w:szCs w:val="21"/>
+          <w14:ligatures w14:val="none"/>
+        </w:rPr>
+        <w:t>;</w:t>
+      </w:r>
+    </w:p>
+    <w:p>
+      <w:pPr>
+        <w:rPr>
+          <w:b/>
+          <w:bCs/>
+        </w:rPr>
+      </w:pPr>
+    </w:p>
+    <w:p>
+      <w:pPr>
         <w:rPr>
           <w:b/>
           <w:bCs/>
@@ -992,7 +2904,6 @@
           <w:b/>
           <w:bCs/>
         </w:rPr>
-        <w:lastRenderedPageBreak/>
         <w:t>Tables</w:t>
       </w:r>
     </w:p>
@@ -1230,6 +3141,7 @@
         </w:numPr>
       </w:pPr>
       <w:r>
+        <w:lastRenderedPageBreak/>
         <w:t>Average ER Wait Time (74 min)</w:t>
       </w:r>
     </w:p>
@@ -1291,7 +3203,6 @@
     </w:p>
     <w:p>
       <w:r>
-        <w:lastRenderedPageBreak/>
         <w:t>Longest Observed Wait Times by Day</w:t>
       </w:r>
     </w:p>
@@ -1455,6 +3366,7 @@
         </w:numPr>
       </w:pPr>
       <w:r>
+        <w:lastRenderedPageBreak/>
         <w:t>Critical</w:t>
       </w:r>
     </w:p>
@@ -1488,7 +3400,6 @@
     </w:p>
     <w:p>
       <w:r>
-        <w:lastRenderedPageBreak/>
         <w:t>• Longest waits occur on Monday, Tuesday, Thursday, and Saturday.</w:t>
       </w:r>
     </w:p>
@@ -1674,6 +3585,7 @@
     </w:p>
     <w:p>
       <w:r>
+        <w:lastRenderedPageBreak/>
         <w:pict w14:anchorId="48A2F741">
           <v:rect id="_x0000_i1026" style="width:0;height:1.5pt" o:hralign="center" o:hrstd="t" o:hr="t" fillcolor="#a0a0a0" stroked="f"/>
         </w:pict>
@@ -1758,7 +3670,6 @@
           <w:b/>
           <w:bCs/>
         </w:rPr>
-        <w:lastRenderedPageBreak/>
         <w:t>3. Wait time by day of week</w:t>
       </w:r>
       <w:r>
@@ -2014,6 +3925,7 @@
     </w:p>
     <w:p>
       <w:r>
+        <w:lastRenderedPageBreak/>
         <w:pict w14:anchorId="77E78F54">
           <v:rect id="_x0000_i1030" style="width:0;height:1.5pt" o:hralign="center" o:hrstd="t" o:hr="t" fillcolor="#a0a0a0" stroked="f"/>
         </w:pict>
@@ -2121,7 +4033,6 @@
           <w:b/>
           <w:bCs/>
         </w:rPr>
-        <w:lastRenderedPageBreak/>
         <w:t>7. Peak-period patient mix</w:t>
       </w:r>
       <w:r>
@@ -2331,7 +4242,6 @@
         </w:numPr>
       </w:pPr>
       <w:r>
-        <w:lastRenderedPageBreak/>
         <w:t xml:space="preserve">The longest observed ER wait times (180 minutes) occurred on Mondays, Tuesdays, Thursdays, and Saturday. </w:t>
       </w:r>
       <w:r>
@@ -2653,6 +4563,7 @@
     </w:p>
     <w:p>
       <w:r>
+        <w:lastRenderedPageBreak/>
         <w:t>1. Open each table.</w:t>
       </w:r>
     </w:p>
@@ -2745,7 +4656,6 @@
         </w:numPr>
       </w:pPr>
       <w:r>
-        <w:lastRenderedPageBreak/>
         <w:t>Provider_id (FK</w:t>
       </w:r>
       <w:r>
@@ -3563,6 +5473,7 @@
         </w:numPr>
       </w:pPr>
       <w:r>
+        <w:lastRenderedPageBreak/>
         <w:t>S</w:t>
       </w:r>
       <w:r>
@@ -3800,7 +5711,6 @@
         </w:numPr>
       </w:pPr>
       <w:r>
-        <w:lastRenderedPageBreak/>
         <w:t xml:space="preserve">Yes: </w:t>
       </w:r>
       <w:r>
@@ -4335,6 +6245,7 @@
         </w:numPr>
       </w:pPr>
       <w:r>
+        <w:lastRenderedPageBreak/>
         <w:t>Patients</w:t>
       </w:r>
     </w:p>
@@ -4419,7 +6330,6 @@
         </w:numPr>
       </w:pPr>
       <w:r>
-        <w:lastRenderedPageBreak/>
         <w:t>Age in years of patient</w:t>
       </w:r>
     </w:p>
@@ -4734,7 +6644,6 @@
     </w:p>
     <w:p>
       <w:r>
-        <w:lastRenderedPageBreak/>
         <w:t>Stakeholders are</w:t>
       </w:r>
       <w:r>
@@ -4946,6 +6855,7 @@
         </w:numPr>
       </w:pPr>
       <w:r>
+        <w:lastRenderedPageBreak/>
         <w:t xml:space="preserve">I can analyze the ER table and rank the patients by their wait times and then reveal any trends involving which days are busiest, what hours of the day, and possibly severity level. </w:t>
       </w:r>
     </w:p>
@@ -4975,7 +6885,6 @@
     </w:p>
     <w:p>
       <w:r>
-        <w:lastRenderedPageBreak/>
         <w:t xml:space="preserve">These four datasets form a valid relational model centered around patients. Primary keys are unique, foreign key relationships are intact, and no duplicate records were identified. The only mission values occur in patient satisfaction scores for canceled and no-show appointments and will remain NULL. One provider-name formatting inconsistency will be standardized. The ER dataset is suitable for exploratory analysis of wait times, patient volume, severity, admission status, and ED length of stay. </w:t>
       </w:r>
     </w:p>
@@ -8117,7 +10026,6 @@
   <w:style w:type="character" w:default="1" w:styleId="DefaultParagraphFont">
     <w:name w:val="Default Paragraph Font"/>
     <w:uiPriority w:val="1"/>
-    <w:semiHidden/>
     <w:unhideWhenUsed/>
   </w:style>
   <w:style w:type="table" w:default="1" w:styleId="TableNormal">

</xml_diff>

<commit_message>
Completed FU analysis and updated healthcare project documentation
</commit_message>
<xml_diff>
--- a/documentation/nicosys-healthcare-portfolio-documentation.docx
+++ b/documentation/nicosys-healthcare-portfolio-documentation.docx
@@ -3,6 +3,20 @@
 <w:document xmlns:wpc="http://schemas.microsoft.com/office/word/2010/wordprocessingCanvas" xmlns:cx="http://schemas.microsoft.com/office/drawing/2014/chartex" xmlns:cx1="http://schemas.microsoft.com/office/drawing/2015/9/8/chartex" xmlns:cx2="http://schemas.microsoft.com/office/drawing/2015/10/21/chartex" xmlns:cx3="http://schemas.microsoft.com/office/drawing/2016/5/9/chartex" xmlns:cx4="http://schemas.microsoft.com/office/drawing/2016/5/10/chartex" xmlns:cx5="http://schemas.microsoft.com/office/drawing/2016/5/11/chartex" xmlns:cx6="http://schemas.microsoft.com/office/drawing/2016/5/12/chartex" xmlns:cx7="http://schemas.microsoft.com/office/drawing/2016/5/13/chartex" xmlns:cx8="http://schemas.microsoft.com/office/drawing/2016/5/14/chartex" xmlns:mc="http://schemas.openxmlformats.org/markup-compatibility/2006" xmlns:aink="http://schemas.microsoft.com/office/drawing/2016/ink" xmlns:am3d="http://schemas.microsoft.com/office/drawing/2017/model3d" xmlns:o="urn:schemas-microsoft-com:office:office" xmlns:oel="http://schemas.microsoft.com/office/2019/extlst" xmlns:r="http://schemas.openxmlformats.org/officeDocument/2006/relationships" xmlns:m="http://schemas.openxmlformats.org/officeDocument/2006/math" xmlns:v="urn:schemas-microsoft-com:vml" xmlns:wp14="http://schemas.microsoft.com/office/word/2010/wordprocessingDrawing" xmlns:wp="http://schemas.openxmlformats.org/drawingml/2006/wordprocessingDrawing" xmlns:w10="urn:schemas-microsoft-com:office:word" xmlns:w="http://schemas.openxmlformats.org/wordprocessingml/2006/main" xmlns:w14="http://schemas.microsoft.com/office/word/2010/wordml" xmlns:w15="http://schemas.microsoft.com/office/word/2012/wordml" xmlns:w16cex="http://schemas.microsoft.com/office/word/2018/wordml/cex" xmlns:w16cid="http://schemas.microsoft.com/office/word/2016/wordml/cid" xmlns:w16="http://schemas.microsoft.com/office/word/2018/wordml" xmlns:w16du="http://schemas.microsoft.com/office/word/2023/wordml/word16du" xmlns:w16sdtdh="http://schemas.microsoft.com/office/word/2020/wordml/sdtdatahash" xmlns:w16sdtfl="http://schemas.microsoft.com/office/word/2024/wordml/sdtformatlock" xmlns:w16se="http://schemas.microsoft.com/office/word/2015/wordml/symex" xmlns:wpg="http://schemas.microsoft.com/office/word/2010/wordprocessingGroup" xmlns:wpi="http://schemas.microsoft.com/office/word/2010/wordprocessingInk" xmlns:wne="http://schemas.microsoft.com/office/word/2006/wordml" xmlns:wps="http://schemas.microsoft.com/office/word/2010/wordprocessingShape" mc:Ignorable="w14 w15 w16se w16cid w16 w16cex w16sdtdh w16sdtfl w16du wp14">
   <w:body>
     <w:p>
+      <w:r>
+        <w:t>The Healthcare Project is complete. I will now move on to my other 2 portfolio projects. Once all 3 projects are completed, I’ll will create</w:t>
+      </w:r>
+      <w:r>
+        <w:t xml:space="preserve"> </w:t>
+      </w:r>
+      <w:r>
+        <w:t>a Canva presentation that presents my portfolio in a more accessible format, summarizing each project’s business question, methodology, tools, and recommendations</w:t>
+      </w:r>
+      <w:r>
+        <w:t xml:space="preserve">, and finally update my resume and LinkedIn with Git Hub links and Canva presentation. </w:t>
+      </w:r>
+    </w:p>
+    <w:p>
       <w:pPr>
         <w:rPr>
           <w:b/>
@@ -21,7 +35,14 @@
           <w:b/>
           <w:bCs/>
         </w:rPr>
-        <w:t xml:space="preserve">Phase 5 -   </w:t>
+        <w:t xml:space="preserve">Phase 5 -  </w:t>
+      </w:r>
+      <w:r>
+        <w:rPr>
+          <w:b/>
+          <w:bCs/>
+        </w:rPr>
+        <w:t>Follow Up Analysis Completed on 7/24/2026</w:t>
       </w:r>
     </w:p>
     <w:p>
@@ -59,13 +80,571 @@
         <w:t xml:space="preserve">Business Insight </w:t>
       </w:r>
     </w:p>
-    <w:p>
-      <w:pPr>
+    <w:p/>
+    <w:p>
+      <w:r>
         <w:rPr>
           <w:i/>
           <w:iCs/>
         </w:rPr>
-      </w:pPr>
+        <w:t>Stakeholders:</w:t>
+      </w:r>
+      <w:r>
+        <w:rPr>
+          <w:b/>
+          <w:bCs/>
+        </w:rPr>
+        <w:t xml:space="preserve"> </w:t>
+      </w:r>
+      <w:r>
+        <w:t>Leadership of Valley Regional Medical Center</w:t>
+      </w:r>
+    </w:p>
+    <w:p>
+      <w:pPr>
+        <w:rPr>
+          <w:u w:val="single"/>
+        </w:rPr>
+      </w:pPr>
+      <w:r>
+        <w:rPr>
+          <w:u w:val="single"/>
+        </w:rPr>
+        <w:t>Business Question 1</w:t>
+      </w:r>
+      <w:r>
+        <w:rPr>
+          <w:u w:val="single"/>
+        </w:rPr>
+        <w:t xml:space="preserve"> (Done)</w:t>
+      </w:r>
+    </w:p>
+    <w:p>
+      <w:r>
+        <w:t>Which patient age groups experience the longest Emergency Department wait times?</w:t>
+      </w:r>
+    </w:p>
+    <w:p>
+      <w:pPr>
+        <w:rPr>
+          <w:b/>
+          <w:bCs/>
+        </w:rPr>
+      </w:pPr>
+    </w:p>
+    <w:p>
+      <w:r>
+        <w:t>Which tables will I need to join?</w:t>
+      </w:r>
+    </w:p>
+    <w:p>
+      <w:r>
+        <w:t>Which columns from each table do I expect to use?</w:t>
+      </w:r>
+    </w:p>
+    <w:p>
+      <w:r>
+        <w:t>/*</w:t>
+      </w:r>
+    </w:p>
+    <w:p>
+      <w:r>
+        <w:t xml:space="preserve">Business Question: </w:t>
+      </w:r>
+    </w:p>
+    <w:p>
+      <w:r>
+        <w:t>Which patient age groups experience the longest Emergency Department wait times?</w:t>
+      </w:r>
+    </w:p>
+    <w:p/>
+    <w:p>
+      <w:r>
+        <w:t xml:space="preserve">Stakeholder: </w:t>
+      </w:r>
+    </w:p>
+    <w:p>
+      <w:r>
+        <w:t>Leadershiop of Valley Regional Medical Center</w:t>
+      </w:r>
+    </w:p>
+    <w:p/>
+    <w:p>
+      <w:r>
+        <w:lastRenderedPageBreak/>
+        <w:t>Purpose:</w:t>
+      </w:r>
+    </w:p>
+    <w:p>
+      <w:r>
+        <w:t xml:space="preserve">To see if specific age demographics experience longer wait times than others. </w:t>
+      </w:r>
+    </w:p>
+    <w:p/>
+    <w:p>
+      <w:r>
+        <w:t>SQL Query: (see below)</w:t>
+      </w:r>
+    </w:p>
+    <w:p/>
+    <w:p>
+      <w:r>
+        <w:t>Findings:</w:t>
+      </w:r>
+    </w:p>
+    <w:p>
+      <w:r>
+        <w:t xml:space="preserve">The age groups that expereince the longest ER wait times or 180 minutes are, 53, 61, 74, and 76. </w:t>
+      </w:r>
+    </w:p>
+    <w:p>
+      <w:r>
+        <w:t xml:space="preserve">However, the wait time that has the most occurance is 179 mintues, being experienced by 8 age groups. This is double that of age groups experiencing 180 minute wait times. </w:t>
+      </w:r>
+    </w:p>
+    <w:p/>
+    <w:p>
+      <w:r>
+        <w:t>Business Insight:</w:t>
+      </w:r>
+    </w:p>
+    <w:p>
+      <w:r>
+        <w:t>The patient age group experiencing the longest Emergency Department wait times of 180 minutes are, 53, 61, 74, and 76. People who wait 179 minutes occur 50% more than those waiting 180 minutes.</w:t>
+      </w:r>
+    </w:p>
+    <w:p>
+      <w:r>
+        <w:t xml:space="preserve">Everyone waiting 180 minutes was over 50 years old. While those waiting 179 minutes have 71% patients over the age of 40, and 29% under 31 years old. </w:t>
+      </w:r>
+    </w:p>
+    <w:p/>
+    <w:p>
+      <w:r>
+        <w:t>*/</w:t>
+      </w:r>
+    </w:p>
+    <w:p>
+      <w:r>
+        <w:t>--Which patient age groups experience the longest Emergency Department wait times?</w:t>
+      </w:r>
+    </w:p>
+    <w:p>
+      <w:r>
+        <w:t>Select</w:t>
+      </w:r>
+    </w:p>
+    <w:p>
+      <w:r>
+        <w:tab/>
+        <w:t xml:space="preserve">  pts.age</w:t>
+      </w:r>
+    </w:p>
+    <w:p>
+      <w:r>
+        <w:tab/>
+        <w:t>, max(wait_time_minutes) max_wait_time_minutes</w:t>
+      </w:r>
+    </w:p>
+    <w:p>
+      <w:r>
+        <w:t>From</w:t>
+      </w:r>
+    </w:p>
+    <w:p>
+      <w:r>
+        <w:tab/>
+        <w:t>er_visits er</w:t>
+      </w:r>
+    </w:p>
+    <w:p>
+      <w:r>
+        <w:tab/>
+      </w:r>
+      <w:r>
+        <w:tab/>
+        <w:t>inner join patients pts</w:t>
+      </w:r>
+    </w:p>
+    <w:p>
+      <w:r>
+        <w:tab/>
+      </w:r>
+      <w:r>
+        <w:tab/>
+      </w:r>
+      <w:r>
+        <w:tab/>
+        <w:t>on er.patient_id=pts.patient_id</w:t>
+      </w:r>
+    </w:p>
+    <w:p>
+      <w:r>
+        <w:lastRenderedPageBreak/>
+        <w:t>Group By</w:t>
+      </w:r>
+    </w:p>
+    <w:p>
+      <w:r>
+        <w:tab/>
+        <w:t>pts.age</w:t>
+      </w:r>
+    </w:p>
+    <w:p>
+      <w:r>
+        <w:t>Order By</w:t>
+      </w:r>
+    </w:p>
+    <w:p>
+      <w:r>
+        <w:tab/>
+        <w:t>max_wait_time_minutes desc</w:t>
+      </w:r>
+    </w:p>
+    <w:p>
+      <w:r>
+        <w:t>;</w:t>
+      </w:r>
+    </w:p>
+    <w:p/>
+    <w:p>
+      <w:r>
+        <w:t xml:space="preserve">--Of the wait times, which occurs the most? 179 mintues occurs 8 times compared to 180 minutes occuring 4 times. </w:t>
+      </w:r>
+    </w:p>
+    <w:p>
+      <w:r>
+        <w:t>Select</w:t>
+      </w:r>
+    </w:p>
+    <w:p>
+      <w:r>
+        <w:tab/>
+        <w:t xml:space="preserve">  max_wait_time_minutes</w:t>
+      </w:r>
+    </w:p>
+    <w:p>
+      <w:r>
+        <w:tab/>
+        <w:t>, count(max_wait_time_minutes)</w:t>
+      </w:r>
+    </w:p>
+    <w:p>
+      <w:r>
+        <w:t>From</w:t>
+      </w:r>
+    </w:p>
+    <w:p>
+      <w:r>
+        <w:tab/>
+        <w:t>(</w:t>
+      </w:r>
+    </w:p>
+    <w:p>
+      <w:r>
+        <w:tab/>
+      </w:r>
+      <w:r>
+        <w:tab/>
+        <w:t>Select</w:t>
+      </w:r>
+    </w:p>
+    <w:p>
+      <w:r>
+        <w:tab/>
+      </w:r>
+      <w:r>
+        <w:tab/>
+      </w:r>
+      <w:r>
+        <w:tab/>
+        <w:t xml:space="preserve">  pts.age</w:t>
+      </w:r>
+    </w:p>
+    <w:p>
+      <w:r>
+        <w:tab/>
+      </w:r>
+      <w:r>
+        <w:tab/>
+      </w:r>
+      <w:r>
+        <w:tab/>
+        <w:t>, max(wait_time_minutes) max_wait_time_minutes</w:t>
+      </w:r>
+    </w:p>
+    <w:p>
+      <w:r>
+        <w:tab/>
+      </w:r>
+      <w:r>
+        <w:tab/>
+        <w:t>From</w:t>
+      </w:r>
+    </w:p>
+    <w:p>
+      <w:r>
+        <w:tab/>
+      </w:r>
+      <w:r>
+        <w:tab/>
+      </w:r>
+      <w:r>
+        <w:tab/>
+        <w:t>er_visits er</w:t>
+      </w:r>
+    </w:p>
+    <w:p>
+      <w:r>
+        <w:tab/>
+      </w:r>
+      <w:r>
+        <w:tab/>
+      </w:r>
+      <w:r>
+        <w:tab/>
+      </w:r>
+      <w:r>
+        <w:tab/>
+        <w:t>inner join patients pts</w:t>
+      </w:r>
+    </w:p>
+    <w:p>
+      <w:r>
+        <w:tab/>
+      </w:r>
+      <w:r>
+        <w:tab/>
+      </w:r>
+      <w:r>
+        <w:tab/>
+      </w:r>
+      <w:r>
+        <w:tab/>
+      </w:r>
+      <w:r>
+        <w:tab/>
+        <w:t>on er.patient_id=pts.patient_id</w:t>
+      </w:r>
+    </w:p>
+    <w:p>
+      <w:r>
+        <w:tab/>
+      </w:r>
+      <w:r>
+        <w:tab/>
+        <w:t>Group By</w:t>
+      </w:r>
+    </w:p>
+    <w:p>
+      <w:r>
+        <w:tab/>
+      </w:r>
+      <w:r>
+        <w:tab/>
+      </w:r>
+      <w:r>
+        <w:tab/>
+        <w:t>pts.age</w:t>
+      </w:r>
+    </w:p>
+    <w:p>
+      <w:r>
+        <w:tab/>
+      </w:r>
+      <w:r>
+        <w:tab/>
+        <w:t>Order By</w:t>
+      </w:r>
+    </w:p>
+    <w:p>
+      <w:r>
+        <w:tab/>
+      </w:r>
+      <w:r>
+        <w:tab/>
+      </w:r>
+      <w:r>
+        <w:tab/>
+        <w:t>max_wait_time_minutes desc</w:t>
+      </w:r>
+    </w:p>
+    <w:p>
+      <w:r>
+        <w:tab/>
+        <w:t>)</w:t>
+      </w:r>
+    </w:p>
+    <w:p>
+      <w:r>
+        <w:t>Group By</w:t>
+      </w:r>
+    </w:p>
+    <w:p>
+      <w:r>
+        <w:lastRenderedPageBreak/>
+        <w:tab/>
+        <w:t>max_wait_time_minutes</w:t>
+      </w:r>
+    </w:p>
+    <w:p>
+      <w:r>
+        <w:t>Order By</w:t>
+      </w:r>
+    </w:p>
+    <w:p>
+      <w:r>
+        <w:tab/>
+        <w:t>max_wait_time_minutes desc</w:t>
+      </w:r>
+    </w:p>
+    <w:p>
+      <w:r>
+        <w:t>;</w:t>
+      </w:r>
+    </w:p>
+    <w:p/>
+    <w:p>
+      <w:r>
+        <w:t>--What are the age groups experiencing wait times of 179 minutes? 89, 70, 52, 48, 42, 30, 24 (71% are over 40)</w:t>
+      </w:r>
+    </w:p>
+    <w:p>
+      <w:r>
+        <w:t>--What are the age groups experiencing wait times of 180 minutes? 76, 74, 61, 53 (All over 53)</w:t>
+      </w:r>
+    </w:p>
+    <w:p>
+      <w:r>
+        <w:t>Select</w:t>
+      </w:r>
+    </w:p>
+    <w:p>
+      <w:r>
+        <w:tab/>
+        <w:t xml:space="preserve">    pts.age</w:t>
+      </w:r>
+    </w:p>
+    <w:p>
+      <w:r>
+        <w:tab/>
+        <w:t>--, max(wait_time_minutes) max_wait_time_minutes</w:t>
+      </w:r>
+    </w:p>
+    <w:p>
+      <w:r>
+        <w:t>From</w:t>
+      </w:r>
+    </w:p>
+    <w:p>
+      <w:r>
+        <w:tab/>
+        <w:t>er_visits er</w:t>
+      </w:r>
+    </w:p>
+    <w:p>
+      <w:r>
+        <w:tab/>
+      </w:r>
+      <w:r>
+        <w:tab/>
+        <w:t>inner join patients pts</w:t>
+      </w:r>
+    </w:p>
+    <w:p>
+      <w:r>
+        <w:tab/>
+      </w:r>
+      <w:r>
+        <w:tab/>
+      </w:r>
+      <w:r>
+        <w:tab/>
+        <w:t>on er.patient_id=pts.patient_id</w:t>
+      </w:r>
+    </w:p>
+    <w:p>
+      <w:r>
+        <w:t>Where</w:t>
+      </w:r>
+    </w:p>
+    <w:p>
+      <w:r>
+        <w:tab/>
+        <w:t>wait_time_minutes = 179 --replace the wait time with 180 to see age groups experiencing 180 min wait times.</w:t>
+      </w:r>
+    </w:p>
+    <w:p>
+      <w:r>
+        <w:t>Group By</w:t>
+      </w:r>
+    </w:p>
+    <w:p>
+      <w:r>
+        <w:tab/>
+        <w:t>pts.age</w:t>
+      </w:r>
+    </w:p>
+    <w:p>
+      <w:r>
+        <w:t>Order By</w:t>
+      </w:r>
+    </w:p>
+    <w:p>
+      <w:r>
+        <w:tab/>
+        <w:t>age desc</w:t>
+      </w:r>
+    </w:p>
+    <w:p>
+      <w:r>
+        <w:t>;</w:t>
+      </w:r>
+    </w:p>
+    <w:p>
+      <w:pPr>
+        <w:rPr>
+          <w:b/>
+          <w:bCs/>
+        </w:rPr>
+      </w:pPr>
+    </w:p>
+    <w:p>
+      <w:pPr>
+        <w:rPr>
+          <w:b/>
+          <w:bCs/>
+        </w:rPr>
+      </w:pPr>
+      <w:r>
+        <w:rPr>
+          <w:b/>
+          <w:bCs/>
+        </w:rPr>
+        <w:t>Business Question 2</w:t>
+      </w:r>
+      <w:r>
+        <w:rPr>
+          <w:b/>
+          <w:bCs/>
+        </w:rPr>
+        <w:t xml:space="preserve"> (Done)</w:t>
+      </w:r>
+    </w:p>
+    <w:p>
+      <w:pPr>
+        <w:rPr>
+          <w:b/>
+          <w:bCs/>
+        </w:rPr>
+      </w:pPr>
+      <w:r>
+        <w:rPr>
+          <w:b/>
+          <w:bCs/>
+        </w:rPr>
+        <w:t>Which cities generate the highest Emergency Department utilization?</w:t>
+      </w:r>
     </w:p>
     <w:p>
       <w:r>
@@ -73,561 +652,8 @@
           <w:i/>
           <w:iCs/>
         </w:rPr>
-        <w:t>Stakeholders:</w:t>
-      </w:r>
-      <w:r>
-        <w:rPr>
-          <w:b/>
-          <w:bCs/>
-        </w:rPr>
-        <w:t xml:space="preserve"> </w:t>
-      </w:r>
-      <w:r>
-        <w:t>Leadership of Valley Regional Medical Center</w:t>
-      </w:r>
-    </w:p>
-    <w:p>
-      <w:pPr>
-        <w:rPr>
-          <w:u w:val="single"/>
-        </w:rPr>
-      </w:pPr>
-      <w:r>
-        <w:rPr>
-          <w:u w:val="single"/>
-        </w:rPr>
-        <w:t>Business Question 1</w:t>
-      </w:r>
-      <w:r>
-        <w:rPr>
-          <w:u w:val="single"/>
-        </w:rPr>
-        <w:t xml:space="preserve"> (Done)</w:t>
-      </w:r>
-    </w:p>
-    <w:p>
-      <w:r>
-        <w:t>Which patient age groups experience the longest Emergency Department wait times?</w:t>
-      </w:r>
-    </w:p>
-    <w:p>
-      <w:pPr>
-        <w:rPr>
-          <w:b/>
-          <w:bCs/>
-        </w:rPr>
-      </w:pPr>
-    </w:p>
-    <w:p>
-      <w:r>
-        <w:t>Which tables will I need to join?</w:t>
-      </w:r>
-    </w:p>
-    <w:p>
-      <w:r>
-        <w:t>Which columns from each table do I expect to use?</w:t>
-      </w:r>
-    </w:p>
-    <w:p>
-      <w:r>
+        <w:lastRenderedPageBreak/>
         <w:t>/*</w:t>
-      </w:r>
-    </w:p>
-    <w:p>
-      <w:r>
-        <w:t xml:space="preserve">Business Question: </w:t>
-      </w:r>
-    </w:p>
-    <w:p>
-      <w:r>
-        <w:t>Which patient age groups experience the longest Emergency Department wait times?</w:t>
-      </w:r>
-    </w:p>
-    <w:p/>
-    <w:p>
-      <w:r>
-        <w:t xml:space="preserve">Stakeholder: </w:t>
-      </w:r>
-    </w:p>
-    <w:p>
-      <w:r>
-        <w:t>Leadershiop of Valley Regional Medical Center</w:t>
-      </w:r>
-    </w:p>
-    <w:p/>
-    <w:p>
-      <w:r>
-        <w:t>Purpose:</w:t>
-      </w:r>
-    </w:p>
-    <w:p>
-      <w:r>
-        <w:t xml:space="preserve">To see if specific age demographics experience longer wait times than others. </w:t>
-      </w:r>
-    </w:p>
-    <w:p/>
-    <w:p>
-      <w:r>
-        <w:t>SQL Query: (see below)</w:t>
-      </w:r>
-    </w:p>
-    <w:p/>
-    <w:p>
-      <w:r>
-        <w:t>Findings:</w:t>
-      </w:r>
-    </w:p>
-    <w:p>
-      <w:r>
-        <w:t xml:space="preserve">The age groups that expereince the longest ER wait times or 180 minutes are, 53, 61, 74, and 76. </w:t>
-      </w:r>
-    </w:p>
-    <w:p>
-      <w:r>
-        <w:t xml:space="preserve">However, the wait time that has the most occurance is 179 mintues, being experienced by 8 age groups. This is double that of age groups experiencing 180 minute wait times. </w:t>
-      </w:r>
-    </w:p>
-    <w:p/>
-    <w:p>
-      <w:r>
-        <w:t>Business Insight:</w:t>
-      </w:r>
-    </w:p>
-    <w:p>
-      <w:r>
-        <w:t>The patient age group experiencing the longest Emergency Department wait times of 180 minutes are, 53, 61, 74, and 76. People who wait 179 minutes occur 50% more than those waiting 180 minutes.</w:t>
-      </w:r>
-    </w:p>
-    <w:p>
-      <w:r>
-        <w:t xml:space="preserve">Everyone waiting 180 minutes was over 50 years old. While those waiting 179 minutes have 71% patients over the age of 40, and 29% under 31 years old. </w:t>
-      </w:r>
-    </w:p>
-    <w:p/>
-    <w:p>
-      <w:r>
-        <w:t>*/</w:t>
-      </w:r>
-    </w:p>
-    <w:p>
-      <w:r>
-        <w:t>--Which patient age groups experience the longest Emergency Department wait times?</w:t>
-      </w:r>
-    </w:p>
-    <w:p>
-      <w:r>
-        <w:t>Select</w:t>
-      </w:r>
-    </w:p>
-    <w:p>
-      <w:r>
-        <w:tab/>
-        <w:t xml:space="preserve">  pts.age</w:t>
-      </w:r>
-    </w:p>
-    <w:p>
-      <w:r>
-        <w:tab/>
-        <w:t>, max(wait_time_minutes) max_wait_time_minutes</w:t>
-      </w:r>
-    </w:p>
-    <w:p>
-      <w:r>
-        <w:t>From</w:t>
-      </w:r>
-    </w:p>
-    <w:p>
-      <w:r>
-        <w:tab/>
-        <w:t>er_visits er</w:t>
-      </w:r>
-    </w:p>
-    <w:p>
-      <w:r>
-        <w:tab/>
-      </w:r>
-      <w:r>
-        <w:tab/>
-        <w:t>inner join patients pts</w:t>
-      </w:r>
-    </w:p>
-    <w:p>
-      <w:r>
-        <w:tab/>
-      </w:r>
-      <w:r>
-        <w:tab/>
-      </w:r>
-      <w:r>
-        <w:tab/>
-        <w:t>on er.patient_id=pts.patient_id</w:t>
-      </w:r>
-    </w:p>
-    <w:p>
-      <w:r>
-        <w:t>Group By</w:t>
-      </w:r>
-    </w:p>
-    <w:p>
-      <w:r>
-        <w:tab/>
-        <w:t>pts.age</w:t>
-      </w:r>
-    </w:p>
-    <w:p>
-      <w:r>
-        <w:t>Order By</w:t>
-      </w:r>
-    </w:p>
-    <w:p>
-      <w:r>
-        <w:tab/>
-        <w:t>max_wait_time_minutes desc</w:t>
-      </w:r>
-    </w:p>
-    <w:p>
-      <w:r>
-        <w:lastRenderedPageBreak/>
-        <w:t>;</w:t>
-      </w:r>
-    </w:p>
-    <w:p/>
-    <w:p>
-      <w:r>
-        <w:t xml:space="preserve">--Of the wait times, which occurs the most? 179 mintues occurs 8 times compared to 180 minutes occuring 4 times. </w:t>
-      </w:r>
-    </w:p>
-    <w:p>
-      <w:r>
-        <w:t>Select</w:t>
-      </w:r>
-    </w:p>
-    <w:p>
-      <w:r>
-        <w:tab/>
-        <w:t xml:space="preserve">  max_wait_time_minutes</w:t>
-      </w:r>
-    </w:p>
-    <w:p>
-      <w:r>
-        <w:tab/>
-        <w:t>, count(max_wait_time_minutes)</w:t>
-      </w:r>
-    </w:p>
-    <w:p>
-      <w:r>
-        <w:t>From</w:t>
-      </w:r>
-    </w:p>
-    <w:p>
-      <w:r>
-        <w:tab/>
-        <w:t>(</w:t>
-      </w:r>
-    </w:p>
-    <w:p>
-      <w:r>
-        <w:tab/>
-      </w:r>
-      <w:r>
-        <w:tab/>
-        <w:t>Select</w:t>
-      </w:r>
-    </w:p>
-    <w:p>
-      <w:r>
-        <w:tab/>
-      </w:r>
-      <w:r>
-        <w:tab/>
-      </w:r>
-      <w:r>
-        <w:tab/>
-        <w:t xml:space="preserve">  pts.age</w:t>
-      </w:r>
-    </w:p>
-    <w:p>
-      <w:r>
-        <w:tab/>
-      </w:r>
-      <w:r>
-        <w:tab/>
-      </w:r>
-      <w:r>
-        <w:tab/>
-        <w:t>, max(wait_time_minutes) max_wait_time_minutes</w:t>
-      </w:r>
-    </w:p>
-    <w:p>
-      <w:r>
-        <w:tab/>
-      </w:r>
-      <w:r>
-        <w:tab/>
-        <w:t>From</w:t>
-      </w:r>
-    </w:p>
-    <w:p>
-      <w:r>
-        <w:tab/>
-      </w:r>
-      <w:r>
-        <w:tab/>
-      </w:r>
-      <w:r>
-        <w:tab/>
-        <w:t>er_visits er</w:t>
-      </w:r>
-    </w:p>
-    <w:p>
-      <w:r>
-        <w:tab/>
-      </w:r>
-      <w:r>
-        <w:tab/>
-      </w:r>
-      <w:r>
-        <w:tab/>
-      </w:r>
-      <w:r>
-        <w:tab/>
-        <w:t>inner join patients pts</w:t>
-      </w:r>
-    </w:p>
-    <w:p>
-      <w:r>
-        <w:tab/>
-      </w:r>
-      <w:r>
-        <w:tab/>
-      </w:r>
-      <w:r>
-        <w:tab/>
-      </w:r>
-      <w:r>
-        <w:tab/>
-      </w:r>
-      <w:r>
-        <w:tab/>
-        <w:t>on er.patient_id=pts.patient_id</w:t>
-      </w:r>
-    </w:p>
-    <w:p>
-      <w:r>
-        <w:tab/>
-      </w:r>
-      <w:r>
-        <w:tab/>
-        <w:t>Group By</w:t>
-      </w:r>
-    </w:p>
-    <w:p>
-      <w:r>
-        <w:tab/>
-      </w:r>
-      <w:r>
-        <w:tab/>
-      </w:r>
-      <w:r>
-        <w:tab/>
-        <w:t>pts.age</w:t>
-      </w:r>
-    </w:p>
-    <w:p>
-      <w:r>
-        <w:tab/>
-      </w:r>
-      <w:r>
-        <w:tab/>
-        <w:t>Order By</w:t>
-      </w:r>
-    </w:p>
-    <w:p>
-      <w:r>
-        <w:tab/>
-      </w:r>
-      <w:r>
-        <w:tab/>
-      </w:r>
-      <w:r>
-        <w:tab/>
-        <w:t>max_wait_time_minutes desc</w:t>
-      </w:r>
-    </w:p>
-    <w:p>
-      <w:r>
-        <w:tab/>
-        <w:t>)</w:t>
-      </w:r>
-    </w:p>
-    <w:p>
-      <w:r>
-        <w:t>Group By</w:t>
-      </w:r>
-    </w:p>
-    <w:p>
-      <w:r>
-        <w:tab/>
-        <w:t>max_wait_time_minutes</w:t>
-      </w:r>
-    </w:p>
-    <w:p>
-      <w:r>
-        <w:t>Order By</w:t>
-      </w:r>
-    </w:p>
-    <w:p>
-      <w:r>
-        <w:tab/>
-        <w:t>max_wait_time_minutes desc</w:t>
-      </w:r>
-    </w:p>
-    <w:p>
-      <w:r>
-        <w:t>;</w:t>
-      </w:r>
-    </w:p>
-    <w:p/>
-    <w:p>
-      <w:r>
-        <w:t>--What are the age groups experiencing wait times of 179 minutes? 89, 70, 52, 48, 42, 30, 24 (71% are over 40)</w:t>
-      </w:r>
-    </w:p>
-    <w:p>
-      <w:r>
-        <w:t>--What are the age groups experiencing wait times of 180 minutes? 76, 74, 61, 53 (All over 53)</w:t>
-      </w:r>
-    </w:p>
-    <w:p>
-      <w:r>
-        <w:t>Select</w:t>
-      </w:r>
-    </w:p>
-    <w:p>
-      <w:r>
-        <w:tab/>
-        <w:t xml:space="preserve">    pts.age</w:t>
-      </w:r>
-    </w:p>
-    <w:p>
-      <w:r>
-        <w:tab/>
-        <w:t>--, max(wait_time_minutes) max_wait_time_minutes</w:t>
-      </w:r>
-    </w:p>
-    <w:p>
-      <w:r>
-        <w:t>From</w:t>
-      </w:r>
-    </w:p>
-    <w:p>
-      <w:r>
-        <w:tab/>
-        <w:t>er_visits er</w:t>
-      </w:r>
-    </w:p>
-    <w:p>
-      <w:r>
-        <w:tab/>
-      </w:r>
-      <w:r>
-        <w:tab/>
-        <w:t>inner join patients pts</w:t>
-      </w:r>
-    </w:p>
-    <w:p>
-      <w:r>
-        <w:tab/>
-      </w:r>
-      <w:r>
-        <w:tab/>
-      </w:r>
-      <w:r>
-        <w:tab/>
-        <w:t>on er.patient_id=pts.patient_id</w:t>
-      </w:r>
-    </w:p>
-    <w:p>
-      <w:r>
-        <w:t>Where</w:t>
-      </w:r>
-    </w:p>
-    <w:p>
-      <w:r>
-        <w:tab/>
-        <w:t>wait_time_minutes = 179 --replace the wait time with 180 to see age groups experiencing 180 min wait times.</w:t>
-      </w:r>
-    </w:p>
-    <w:p>
-      <w:r>
-        <w:t>Group By</w:t>
-      </w:r>
-    </w:p>
-    <w:p>
-      <w:r>
-        <w:tab/>
-        <w:t>pts.age</w:t>
-      </w:r>
-    </w:p>
-    <w:p>
-      <w:r>
-        <w:t>Order By</w:t>
-      </w:r>
-    </w:p>
-    <w:p>
-      <w:r>
-        <w:tab/>
-        <w:t>age desc</w:t>
-      </w:r>
-    </w:p>
-    <w:p>
-      <w:r>
-        <w:t>;</w:t>
-      </w:r>
-    </w:p>
-    <w:p>
-      <w:pPr>
-        <w:rPr>
-          <w:b/>
-          <w:bCs/>
-        </w:rPr>
-      </w:pPr>
-    </w:p>
-    <w:p>
-      <w:pPr>
-        <w:rPr>
-          <w:b/>
-          <w:bCs/>
-        </w:rPr>
-      </w:pPr>
-      <w:r>
-        <w:rPr>
-          <w:b/>
-          <w:bCs/>
-        </w:rPr>
-        <w:t>Business Question 2</w:t>
-      </w:r>
-      <w:r>
-        <w:rPr>
-          <w:b/>
-          <w:bCs/>
-        </w:rPr>
-        <w:t xml:space="preserve"> (Done)</w:t>
-      </w:r>
-    </w:p>
-    <w:p>
-      <w:pPr>
-        <w:rPr>
-          <w:b/>
-          <w:bCs/>
-        </w:rPr>
-      </w:pPr>
-      <w:r>
-        <w:rPr>
-          <w:b/>
-          <w:bCs/>
-        </w:rPr>
-        <w:t>Which cities generate the highest Emergency Department utilization?</w:t>
       </w:r>
     </w:p>
     <w:p>
@@ -636,7 +662,7 @@
           <w:i/>
           <w:iCs/>
         </w:rPr>
-        <w:t>/*</w:t>
+        <w:t xml:space="preserve">Business Question: </w:t>
       </w:r>
     </w:p>
     <w:p>
@@ -645,7 +671,7 @@
           <w:i/>
           <w:iCs/>
         </w:rPr>
-        <w:t xml:space="preserve">Business Question: </w:t>
+        <w:t>Which cities generate the highest Emergency Department utilization?</w:t>
       </w:r>
     </w:p>
     <w:p>
@@ -654,55 +680,55 @@
           <w:i/>
           <w:iCs/>
         </w:rPr>
-        <w:t>Which cities generate the highest Emergency Department utilization?</w:t>
-      </w:r>
-    </w:p>
+        <w:t xml:space="preserve">Out of the 3 cities within the datasets, Henderson generates the highest Emergency Department utilization at 1103 visits. </w:t>
+      </w:r>
+    </w:p>
+    <w:p/>
     <w:p>
       <w:r>
         <w:rPr>
           <w:i/>
           <w:iCs/>
         </w:rPr>
-        <w:lastRenderedPageBreak/>
-        <w:t xml:space="preserve">Out of the 3 cities within the datasets, Henderson generates the highest Emergency Department utilization at 1103 visits. </w:t>
-      </w:r>
-    </w:p>
-    <w:p/>
+        <w:t xml:space="preserve">Stakeholder: </w:t>
+      </w:r>
+    </w:p>
     <w:p>
       <w:r>
         <w:rPr>
           <w:i/>
           <w:iCs/>
         </w:rPr>
-        <w:t xml:space="preserve">Stakeholder: </w:t>
-      </w:r>
-    </w:p>
+        <w:t>Leadership of Valley Regional Medical Center</w:t>
+      </w:r>
+    </w:p>
+    <w:p/>
     <w:p>
       <w:r>
         <w:rPr>
           <w:i/>
           <w:iCs/>
         </w:rPr>
-        <w:t>Leadership of Valley Regional Medical Center</w:t>
-      </w:r>
-    </w:p>
-    <w:p/>
+        <w:t>Purpose:</w:t>
+      </w:r>
+    </w:p>
     <w:p>
       <w:r>
         <w:rPr>
           <w:i/>
           <w:iCs/>
         </w:rPr>
-        <w:t>Purpose:</w:t>
-      </w:r>
-    </w:p>
+        <w:t xml:space="preserve">To see patient cities that visit the Emergency Department the most. </w:t>
+      </w:r>
+    </w:p>
+    <w:p/>
     <w:p>
       <w:r>
         <w:rPr>
           <w:i/>
           <w:iCs/>
         </w:rPr>
-        <w:t xml:space="preserve">To see patient cities that visit the Emergency Department the most. </w:t>
+        <w:t>SQL Query: (see below)</w:t>
       </w:r>
     </w:p>
     <w:p/>
@@ -712,17 +738,16 @@
           <w:i/>
           <w:iCs/>
         </w:rPr>
-        <w:t>SQL Query: (see below)</w:t>
-      </w:r>
-    </w:p>
-    <w:p/>
+        <w:t>Findings:</w:t>
+      </w:r>
+    </w:p>
     <w:p>
       <w:r>
         <w:rPr>
           <w:i/>
           <w:iCs/>
         </w:rPr>
-        <w:t>Findings:</w:t>
+        <w:t xml:space="preserve">Henderson generated the highest Emergency Department utilization with 1103 ER visits. </w:t>
       </w:r>
     </w:p>
     <w:p>
@@ -731,7 +756,7 @@
           <w:i/>
           <w:iCs/>
         </w:rPr>
-        <w:t xml:space="preserve">Henderson generated the highest Emergency Department utilization with 1103 ER visits. </w:t>
+        <w:t>North Las Vegas generated 970 ER visits.</w:t>
       </w:r>
     </w:p>
     <w:p>
@@ -740,26 +765,26 @@
           <w:i/>
           <w:iCs/>
         </w:rPr>
-        <w:t>North Las Vegas generated 970 ER visits.</w:t>
-      </w:r>
-    </w:p>
+        <w:t xml:space="preserve">Las Vegas generated 927 visits. </w:t>
+      </w:r>
+    </w:p>
+    <w:p/>
     <w:p>
       <w:r>
         <w:rPr>
           <w:i/>
           <w:iCs/>
         </w:rPr>
-        <w:t xml:space="preserve">Las Vegas generated 927 visits. </w:t>
-      </w:r>
-    </w:p>
-    <w:p/>
+        <w:t>Business Insight:</w:t>
+      </w:r>
+    </w:p>
     <w:p>
       <w:r>
         <w:rPr>
           <w:i/>
           <w:iCs/>
         </w:rPr>
-        <w:t>Business Insight:</w:t>
+        <w:t xml:space="preserve">Representing the largest share among the three cities in the dataset, </w:t>
       </w:r>
     </w:p>
     <w:p>
@@ -768,7 +793,7 @@
           <w:i/>
           <w:iCs/>
         </w:rPr>
-        <w:t xml:space="preserve">Representing the largest share among the three cities in the dataset, </w:t>
+        <w:t>Henerson residents accounted for approximately 37% of all Emergency Department visits.</w:t>
       </w:r>
     </w:p>
     <w:p>
@@ -777,35 +802,35 @@
           <w:i/>
           <w:iCs/>
         </w:rPr>
-        <w:t>Henerson residents accounted for approximately 37% of all Emergency Department visits.</w:t>
-      </w:r>
-    </w:p>
-    <w:p>
+        <w:t xml:space="preserve">North Las Vegas accounted for ~32%, while Las Vegas accounted for ~31%. </w:t>
+      </w:r>
+    </w:p>
+    <w:p/>
+    <w:p>
+      <w:proofErr w:type="spellStart"/>
       <w:r>
         <w:rPr>
           <w:i/>
           <w:iCs/>
         </w:rPr>
-        <w:t xml:space="preserve">North Las Vegas accounted for ~32%, while Las Vegas accounted for ~31%. </w:t>
-      </w:r>
-    </w:p>
-    <w:p/>
-    <w:p>
-      <w:proofErr w:type="spellStart"/>
+        <w:t>Recomendation</w:t>
+      </w:r>
+      <w:proofErr w:type="spellEnd"/>
       <w:r>
         <w:rPr>
           <w:i/>
           <w:iCs/>
         </w:rPr>
-        <w:t>Recomendation</w:t>
-      </w:r>
-      <w:proofErr w:type="spellEnd"/>
+        <w:t>:</w:t>
+      </w:r>
+    </w:p>
+    <w:p>
       <w:r>
         <w:rPr>
           <w:i/>
           <w:iCs/>
         </w:rPr>
-        <w:t>:</w:t>
+        <w:t>Look further into why Henderson residents account for the highest share of Emergency Department visits.</w:t>
       </w:r>
     </w:p>
     <w:p>
@@ -814,15 +839,7 @@
           <w:i/>
           <w:iCs/>
         </w:rPr>
-        <w:t>Look further into why Henderson residents account for the highest share of Emergency Department visits.</w:t>
-      </w:r>
-    </w:p>
-    <w:p>
-      <w:r>
-        <w:rPr>
-          <w:i/>
-          <w:iCs/>
-        </w:rPr>
+        <w:lastRenderedPageBreak/>
         <w:t xml:space="preserve">Additional analysis of patient demographics, level of severity, insurance type, and primary diagnoses may help determine </w:t>
       </w:r>
       <w:proofErr w:type="spellStart"/>
@@ -1453,7 +1470,6 @@
           <w:szCs w:val="21"/>
           <w14:ligatures w14:val="none"/>
         </w:rPr>
-        <w:lastRenderedPageBreak/>
         <w:t>Across the 15 categories of years of experience groups represented in the dataset, average patient satisfaction scores ranged from 4.14 to 4.22.</w:t>
       </w:r>
     </w:p>
@@ -2876,20 +2892,427 @@
         </w:rPr>
         <w:t>Business Question 4</w:t>
       </w:r>
-    </w:p>
-    <w:p>
-      <w:pPr>
+      <w:r>
         <w:rPr>
           <w:b/>
           <w:bCs/>
         </w:rPr>
-      </w:pPr>
-      <w:r>
+        <w:t xml:space="preserve"> (Done)</w:t>
+      </w:r>
+    </w:p>
+    <w:p>
+      <w:r>
+        <w:t>Which appointment types have the highest patient satisfaction?</w:t>
+      </w:r>
+    </w:p>
+    <w:p>
+      <w:r>
+        <w:t>Tables</w:t>
+      </w:r>
+    </w:p>
+    <w:p>
+      <w:pPr>
+        <w:numPr>
+          <w:ilvl w:val="0"/>
+          <w:numId w:val="17"/>
+        </w:numPr>
+      </w:pPr>
+      <w:r>
+        <w:t>appointments</w:t>
+      </w:r>
+    </w:p>
+    <w:p>
+      <w:pPr>
+        <w:numPr>
+          <w:ilvl w:val="0"/>
+          <w:numId w:val="17"/>
+        </w:numPr>
+      </w:pPr>
+      <w:r>
+        <w:t>providers </w:t>
+      </w:r>
+      <w:r>
+        <w:rPr>
+          <w:i/>
+          <w:iCs/>
+        </w:rPr>
+        <w:t>(provider table isn't strictly required here, but including it lets you practice joins while keeping the business context realistic.)</w:t>
+      </w:r>
+    </w:p>
+    <w:p>
+      <w:r>
+        <w:t>/*</w:t>
+      </w:r>
+    </w:p>
+    <w:p>
+      <w:r>
+        <w:t xml:space="preserve">Business Question: </w:t>
+      </w:r>
+    </w:p>
+    <w:p>
+      <w:r>
+        <w:t>Which appointment types have the highest patient satisfaction?</w:t>
+      </w:r>
+    </w:p>
+    <w:p/>
+    <w:p>
+      <w:r>
+        <w:t>Stakeholder: Leadership of Valley Regional Medical Center</w:t>
+      </w:r>
+    </w:p>
+    <w:p/>
+    <w:p>
+      <w:r>
+        <w:t xml:space="preserve">Purpose: To define the appointment types associated with the </w:t>
+      </w:r>
+      <w:proofErr w:type="spellStart"/>
+      <w:r>
+        <w:t>higest</w:t>
+      </w:r>
+      <w:proofErr w:type="spellEnd"/>
+      <w:r>
+        <w:t xml:space="preserve"> patient satisfaction scores. </w:t>
+      </w:r>
+    </w:p>
+    <w:p/>
+    <w:p>
+      <w:r>
+        <w:t>SQL Query: (see below)</w:t>
+      </w:r>
+    </w:p>
+    <w:p/>
+    <w:p>
+      <w:r>
+        <w:t>Findings:</w:t>
+      </w:r>
+    </w:p>
+    <w:p>
+      <w:r>
+        <w:t>Average patient satisfaction remained consistent across appointment types, ranging only from 4.15-4.20.</w:t>
+      </w:r>
+    </w:p>
+    <w:p>
+      <w:r>
+        <w:lastRenderedPageBreak/>
+        <w:t>The highest average patient satisfaction score of 4.20 was generated by Procedure appointments. 19.68% of all appointments.</w:t>
+      </w:r>
+    </w:p>
+    <w:p>
+      <w:r>
+        <w:t xml:space="preserve">Follow-up appointments had an average score of 4.18. </w:t>
+      </w:r>
+    </w:p>
+    <w:p>
+      <w:r>
+        <w:t xml:space="preserve">Lab Work and Routine Checkup appointments had scores of 4.17. 20.5% (Lab Work) </w:t>
+      </w:r>
+    </w:p>
+    <w:p>
+      <w:r>
+        <w:t xml:space="preserve">Lastly, Consultations had an average patient satisfaction score of 4.15. </w:t>
+      </w:r>
+    </w:p>
+    <w:p/>
+    <w:p>
+      <w:r>
+        <w:t>Business Insight:</w:t>
+      </w:r>
+    </w:p>
+    <w:p>
+      <w:r>
+        <w:t xml:space="preserve">All appointment types generate average patient satisfaction scores within .05 points of each other. </w:t>
+      </w:r>
+    </w:p>
+    <w:p>
+      <w:r>
+        <w:t xml:space="preserve">The minimal </w:t>
+      </w:r>
+      <w:proofErr w:type="spellStart"/>
+      <w:r>
+        <w:t>differnce</w:t>
+      </w:r>
+      <w:proofErr w:type="spellEnd"/>
+      <w:r>
+        <w:t xml:space="preserve"> in avg patient satisfaction scores suggest that appointment types alone, do not greatly impact patient satisfaction scores. </w:t>
+      </w:r>
+    </w:p>
+    <w:p/>
+    <w:p>
+      <w:proofErr w:type="spellStart"/>
+      <w:r>
+        <w:t>Recomendation</w:t>
+      </w:r>
+      <w:proofErr w:type="spellEnd"/>
+      <w:r>
+        <w:t>:</w:t>
+      </w:r>
+    </w:p>
+    <w:p>
+      <w:r>
+        <w:t xml:space="preserve">Further </w:t>
+      </w:r>
+      <w:proofErr w:type="spellStart"/>
+      <w:r>
+        <w:t>investiagtion</w:t>
+      </w:r>
+      <w:proofErr w:type="spellEnd"/>
+      <w:r>
+        <w:t xml:space="preserve"> into patient data, severity level, </w:t>
+      </w:r>
+      <w:proofErr w:type="spellStart"/>
+      <w:r>
+        <w:t>appointment_duration_minutes</w:t>
+      </w:r>
+      <w:proofErr w:type="spellEnd"/>
+      <w:r>
+        <w:t xml:space="preserve">, and other procedural metrics could reveal more insight into what could be mainly influencing patient satisfaction scores.  </w:t>
+      </w:r>
+    </w:p>
+    <w:p>
+      <w:r>
+        <w:t>*/</w:t>
+      </w:r>
+    </w:p>
+    <w:p/>
+    <w:p>
+      <w:r>
+        <w:t>--datasets used</w:t>
+      </w:r>
+    </w:p>
+    <w:p>
+      <w:r>
+        <w:t>Select</w:t>
+      </w:r>
+    </w:p>
+    <w:p>
+      <w:r>
+        <w:tab/>
+        <w:t>*</w:t>
+      </w:r>
+    </w:p>
+    <w:p>
+      <w:r>
+        <w:t>From</w:t>
+      </w:r>
+    </w:p>
+    <w:p>
+      <w:r>
+        <w:tab/>
+        <w:t>appointments</w:t>
+      </w:r>
+    </w:p>
+    <w:p>
+      <w:r>
+        <w:t>;</w:t>
+      </w:r>
+    </w:p>
+    <w:p/>
+    <w:p>
+      <w:r>
+        <w:t>Select</w:t>
+      </w:r>
+    </w:p>
+    <w:p>
+      <w:r>
+        <w:tab/>
+        <w:t>*</w:t>
+      </w:r>
+    </w:p>
+    <w:p>
+      <w:r>
+        <w:lastRenderedPageBreak/>
+        <w:t>From</w:t>
+      </w:r>
+    </w:p>
+    <w:p>
+      <w:r>
+        <w:tab/>
+        <w:t>providers</w:t>
+      </w:r>
+    </w:p>
+    <w:p>
+      <w:r>
+        <w:t>;</w:t>
+      </w:r>
+    </w:p>
+    <w:p/>
+    <w:p>
+      <w:r>
+        <w:t xml:space="preserve">--query to answer: Which appointment types have the highest patient satisfaction? </w:t>
+      </w:r>
+    </w:p>
+    <w:p>
+      <w:r>
+        <w:t>Select</w:t>
+      </w:r>
+    </w:p>
+    <w:p>
+      <w:r>
+        <w:tab/>
+        <w:t xml:space="preserve">  </w:t>
+      </w:r>
+      <w:proofErr w:type="spellStart"/>
+      <w:r>
+        <w:t>app.appointment_type</w:t>
+      </w:r>
+      <w:proofErr w:type="spellEnd"/>
+    </w:p>
+    <w:p>
+      <w:r>
+        <w:tab/>
+        <w:t>, round(avg(</w:t>
+      </w:r>
+      <w:proofErr w:type="spellStart"/>
+      <w:r>
+        <w:t>patient_satisfaction_score</w:t>
+      </w:r>
+      <w:proofErr w:type="spellEnd"/>
+      <w:r>
+        <w:t xml:space="preserve">),2) </w:t>
+      </w:r>
+      <w:proofErr w:type="spellStart"/>
+      <w:r>
+        <w:t>avg_sat_score</w:t>
+      </w:r>
+      <w:proofErr w:type="spellEnd"/>
+    </w:p>
+    <w:p>
+      <w:r>
+        <w:tab/>
+        <w:t>, max(</w:t>
+      </w:r>
+      <w:proofErr w:type="spellStart"/>
+      <w:r>
+        <w:t>patient_satisfaction_score</w:t>
+      </w:r>
+      <w:proofErr w:type="spellEnd"/>
+      <w:r>
+        <w:t xml:space="preserve">) </w:t>
+      </w:r>
+      <w:proofErr w:type="spellStart"/>
+      <w:r>
+        <w:t>max_sat_score</w:t>
+      </w:r>
+      <w:proofErr w:type="spellEnd"/>
+    </w:p>
+    <w:p>
+      <w:r>
+        <w:tab/>
+        <w:t>, min(</w:t>
+      </w:r>
+      <w:proofErr w:type="spellStart"/>
+      <w:r>
+        <w:t>patient_satisfaction_score</w:t>
+      </w:r>
+      <w:proofErr w:type="spellEnd"/>
+      <w:r>
+        <w:t xml:space="preserve">) </w:t>
+      </w:r>
+      <w:proofErr w:type="spellStart"/>
+      <w:r>
+        <w:t>min_sat_score</w:t>
+      </w:r>
+      <w:proofErr w:type="spellEnd"/>
+    </w:p>
+    <w:p>
+      <w:r>
+        <w:tab/>
+        <w:t xml:space="preserve">, count(*) </w:t>
+      </w:r>
+      <w:proofErr w:type="spellStart"/>
+      <w:r>
+        <w:t>total_appointments</w:t>
+      </w:r>
+      <w:proofErr w:type="spellEnd"/>
+    </w:p>
+    <w:p>
+      <w:r>
+        <w:t>From</w:t>
+      </w:r>
+    </w:p>
+    <w:p>
+      <w:r>
+        <w:tab/>
+        <w:t>appointments app</w:t>
+      </w:r>
+    </w:p>
+    <w:p>
+      <w:r>
+        <w:tab/>
+      </w:r>
+      <w:r>
+        <w:tab/>
+        <w:t>inner join providers pro</w:t>
+      </w:r>
+    </w:p>
+    <w:p>
+      <w:r>
+        <w:tab/>
+      </w:r>
+      <w:r>
+        <w:tab/>
+      </w:r>
+      <w:r>
+        <w:tab/>
+        <w:t xml:space="preserve">on </w:t>
+      </w:r>
+      <w:proofErr w:type="spellStart"/>
+      <w:r>
+        <w:t>pro.provider_id</w:t>
+      </w:r>
+      <w:proofErr w:type="spellEnd"/>
+      <w:r>
+        <w:t>=</w:t>
+      </w:r>
+      <w:proofErr w:type="spellStart"/>
+      <w:r>
+        <w:t>app.provider_id</w:t>
+      </w:r>
+      <w:proofErr w:type="spellEnd"/>
+    </w:p>
+    <w:p>
+      <w:r>
+        <w:t>Group By</w:t>
+      </w:r>
+    </w:p>
+    <w:p>
+      <w:r>
+        <w:tab/>
+        <w:t xml:space="preserve">    </w:t>
+      </w:r>
+      <w:proofErr w:type="spellStart"/>
+      <w:r>
+        <w:t>app.appointment_type</w:t>
+      </w:r>
+      <w:proofErr w:type="spellEnd"/>
+    </w:p>
+    <w:p>
+      <w:r>
+        <w:t>Order By</w:t>
+      </w:r>
+    </w:p>
+    <w:p>
+      <w:r>
+        <w:tab/>
+      </w:r>
+      <w:proofErr w:type="spellStart"/>
+      <w:r>
+        <w:t>avg_sat_score</w:t>
+      </w:r>
+      <w:proofErr w:type="spellEnd"/>
+      <w:r>
+        <w:t xml:space="preserve"> desc</w:t>
+      </w:r>
+    </w:p>
+    <w:p>
+      <w:pPr>
         <w:rPr>
           <w:b/>
           <w:bCs/>
         </w:rPr>
-        <w:t>Which appointment types have the highest patient satisfaction?</w:t>
+      </w:pPr>
+      <w:r>
+        <w:t>;</w:t>
       </w:r>
     </w:p>
     <w:p>
@@ -2899,20 +3322,17 @@
           <w:bCs/>
         </w:rPr>
       </w:pPr>
-      <w:r>
+    </w:p>
+    <w:p>
+      <w:pPr>
         <w:rPr>
           <w:b/>
           <w:bCs/>
         </w:rPr>
-        <w:t>Tables</w:t>
-      </w:r>
-    </w:p>
-    <w:p>
-      <w:pPr>
-        <w:numPr>
-          <w:ilvl w:val="0"/>
-          <w:numId w:val="17"/>
-        </w:numPr>
+      </w:pPr>
+    </w:p>
+    <w:p>
+      <w:pPr>
         <w:rPr>
           <w:b/>
           <w:bCs/>
@@ -2923,35 +3343,1619 @@
           <w:b/>
           <w:bCs/>
         </w:rPr>
-        <w:t>appointments</w:t>
-      </w:r>
-    </w:p>
-    <w:p>
-      <w:pPr>
-        <w:numPr>
-          <w:ilvl w:val="0"/>
-          <w:numId w:val="17"/>
-        </w:numPr>
+        <w:t>Business Question 5</w:t>
+      </w:r>
+      <w:r>
         <w:rPr>
           <w:b/>
           <w:bCs/>
         </w:rPr>
-      </w:pPr>
-      <w:r>
+        <w:t xml:space="preserve"> (Done)</w:t>
+      </w:r>
+    </w:p>
+    <w:p>
+      <w:pPr>
         <w:rPr>
           <w:b/>
           <w:bCs/>
         </w:rPr>
-        <w:t>providers </w:t>
-      </w:r>
+      </w:pPr>
       <w:r>
         <w:rPr>
           <w:b/>
           <w:bCs/>
-          <w:i/>
-          <w:iCs/>
-        </w:rPr>
-        <w:t>(provider table isn't strictly required here, but including it lets you practice joins while keeping the business context realistic.)</w:t>
+        </w:rPr>
+        <w:t>Which patient demographic groups have the highest appointment no-show rates?</w:t>
+      </w:r>
+    </w:p>
+    <w:p>
+      <w:r>
+        <w:t>Tables</w:t>
+      </w:r>
+    </w:p>
+    <w:p>
+      <w:pPr>
+        <w:numPr>
+          <w:ilvl w:val="0"/>
+          <w:numId w:val="18"/>
+        </w:numPr>
+      </w:pPr>
+      <w:r>
+        <w:t>appointments</w:t>
+      </w:r>
+    </w:p>
+    <w:p>
+      <w:r>
+        <w:lastRenderedPageBreak/>
+        <w:t>/*</w:t>
+      </w:r>
+    </w:p>
+    <w:p>
+      <w:r>
+        <w:t xml:space="preserve">Business Question: </w:t>
+      </w:r>
+    </w:p>
+    <w:p>
+      <w:r>
+        <w:t>Which patient demographic groups account for the greatest number of appointment no-shows?</w:t>
+      </w:r>
+    </w:p>
+    <w:p/>
+    <w:p>
+      <w:r>
+        <w:t>Stakeholder: Leadership of Valley Regional Medical Center</w:t>
+      </w:r>
+    </w:p>
+    <w:p/>
+    <w:p>
+      <w:r>
+        <w:t>Purpose:</w:t>
+      </w:r>
+    </w:p>
+    <w:p>
+      <w:r>
+        <w:t>To uncover which demographic groups generate the highest no-show rates.</w:t>
+      </w:r>
+    </w:p>
+    <w:p/>
+    <w:p>
+      <w:r>
+        <w:t>SQL Query: (see below)</w:t>
+      </w:r>
+    </w:p>
+    <w:p/>
+    <w:p>
+      <w:r>
+        <w:t>Findings:</w:t>
+      </w:r>
+    </w:p>
+    <w:p>
+      <w:r>
+        <w:t xml:space="preserve">There are 722 </w:t>
+      </w:r>
+      <w:proofErr w:type="spellStart"/>
+      <w:r>
+        <w:t>occurances</w:t>
+      </w:r>
+      <w:proofErr w:type="spellEnd"/>
+      <w:r>
+        <w:t xml:space="preserve"> of no-show appointments</w:t>
+      </w:r>
+    </w:p>
+    <w:p>
+      <w:r>
+        <w:t xml:space="preserve">The no-show </w:t>
+      </w:r>
+      <w:proofErr w:type="spellStart"/>
+      <w:r>
+        <w:t>occurances</w:t>
+      </w:r>
+      <w:proofErr w:type="spellEnd"/>
+      <w:r>
+        <w:t xml:space="preserve"> are grouped by </w:t>
+      </w:r>
+      <w:proofErr w:type="spellStart"/>
+      <w:r>
+        <w:t>demoprahics</w:t>
+      </w:r>
+      <w:proofErr w:type="spellEnd"/>
+      <w:r>
+        <w:t xml:space="preserve"> from varying totals of 25-69.</w:t>
+      </w:r>
+    </w:p>
+    <w:p>
+      <w:r>
+        <w:t xml:space="preserve">There are 3 </w:t>
+      </w:r>
+      <w:proofErr w:type="spellStart"/>
+      <w:r>
+        <w:t>demographc</w:t>
+      </w:r>
+      <w:proofErr w:type="spellEnd"/>
+      <w:r>
+        <w:t xml:space="preserve"> groups that have the highest appointment no-show </w:t>
+      </w:r>
+      <w:proofErr w:type="spellStart"/>
+      <w:r>
+        <w:t>occurances</w:t>
+      </w:r>
+      <w:proofErr w:type="spellEnd"/>
+      <w:r>
+        <w:t xml:space="preserve"> of 69 and 51. Therefore, these have the highest no-show rates of ~10%(9.5%) and 7%(7.06%).</w:t>
+      </w:r>
+    </w:p>
+    <w:p>
+      <w:r>
+        <w:t>The following are demo details on the groups with the highest no-show rates:</w:t>
+      </w:r>
+    </w:p>
+    <w:p>
+      <w:r>
+        <w:t xml:space="preserve">69 no-shows from Older Adult Males from Henderson, 51 no-shows from Older Adult Females from Henderson, and 51 Older Adults Females from Las Vegas. </w:t>
+      </w:r>
+    </w:p>
+    <w:p/>
+    <w:p/>
+    <w:p/>
+    <w:p>
+      <w:r>
+        <w:t>Business Insight:</w:t>
+      </w:r>
+    </w:p>
+    <w:p>
+      <w:r>
+        <w:t>The highest no-show rates of 7% and 10%, are generated from Older Adult Men and Women from Henderson and Las Vegas.</w:t>
+      </w:r>
+    </w:p>
+    <w:p>
+      <w:r>
+        <w:lastRenderedPageBreak/>
+        <w:t xml:space="preserve">This demographic group represents approximately 24% (23.68%) of the overall no-show rate. </w:t>
+      </w:r>
+    </w:p>
+    <w:p/>
+    <w:p>
+      <w:proofErr w:type="spellStart"/>
+      <w:r>
+        <w:t>Recomendation</w:t>
+      </w:r>
+      <w:proofErr w:type="spellEnd"/>
+      <w:r>
+        <w:t>:</w:t>
+      </w:r>
+    </w:p>
+    <w:p>
+      <w:r>
+        <w:t xml:space="preserve">Further analysis into these 3 demographics regarding patient </w:t>
+      </w:r>
+      <w:proofErr w:type="spellStart"/>
+      <w:r>
+        <w:t>informtion</w:t>
+      </w:r>
+      <w:proofErr w:type="spellEnd"/>
+      <w:r>
+        <w:t>, appointment type, severity level, and other operational metrics to uncover what may be causing no-show appointment status.</w:t>
+      </w:r>
+    </w:p>
+    <w:p>
+      <w:r>
+        <w:t>*/</w:t>
+      </w:r>
+    </w:p>
+    <w:p/>
+    <w:p>
+      <w:r>
+        <w:t xml:space="preserve">--datasets used for this query </w:t>
+      </w:r>
+    </w:p>
+    <w:p>
+      <w:r>
+        <w:t>Select</w:t>
+      </w:r>
+    </w:p>
+    <w:p>
+      <w:r>
+        <w:tab/>
+        <w:t>*</w:t>
+      </w:r>
+    </w:p>
+    <w:p>
+      <w:r>
+        <w:t>From</w:t>
+      </w:r>
+    </w:p>
+    <w:p>
+      <w:r>
+        <w:tab/>
+        <w:t>patients</w:t>
+      </w:r>
+    </w:p>
+    <w:p>
+      <w:r>
+        <w:t>;</w:t>
+      </w:r>
+    </w:p>
+    <w:p/>
+    <w:p>
+      <w:r>
+        <w:t>Select</w:t>
+      </w:r>
+    </w:p>
+    <w:p>
+      <w:r>
+        <w:tab/>
+        <w:t>*</w:t>
+      </w:r>
+    </w:p>
+    <w:p>
+      <w:r>
+        <w:t>From</w:t>
+      </w:r>
+    </w:p>
+    <w:p>
+      <w:r>
+        <w:tab/>
+        <w:t>appointments</w:t>
+      </w:r>
+    </w:p>
+    <w:p>
+      <w:r>
+        <w:t>;</w:t>
+      </w:r>
+    </w:p>
+    <w:p/>
+    <w:p>
+      <w:r>
+        <w:t>--query used to answer: Which patient demographic groups account for the greatest number of appointment no-shows?</w:t>
+      </w:r>
+    </w:p>
+    <w:p>
+      <w:r>
+        <w:t>Select</w:t>
+      </w:r>
+    </w:p>
+    <w:p>
+      <w:r>
+        <w:tab/>
+        <w:t xml:space="preserve">  Count(*) </w:t>
+      </w:r>
+      <w:proofErr w:type="spellStart"/>
+      <w:r>
+        <w:t>total_no_show</w:t>
+      </w:r>
+      <w:proofErr w:type="spellEnd"/>
+    </w:p>
+    <w:p>
+      <w:r>
+        <w:tab/>
+        <w:t xml:space="preserve">, </w:t>
+      </w:r>
+      <w:proofErr w:type="spellStart"/>
+      <w:r>
+        <w:t>pts.gender</w:t>
+      </w:r>
+      <w:proofErr w:type="spellEnd"/>
+    </w:p>
+    <w:p>
+      <w:r>
+        <w:lastRenderedPageBreak/>
+        <w:tab/>
+        <w:t xml:space="preserve">, </w:t>
+      </w:r>
+      <w:proofErr w:type="spellStart"/>
+      <w:r>
+        <w:t>pts.city</w:t>
+      </w:r>
+      <w:proofErr w:type="spellEnd"/>
+    </w:p>
+    <w:p>
+      <w:r>
+        <w:tab/>
+        <w:t xml:space="preserve">, </w:t>
+      </w:r>
+      <w:proofErr w:type="spellStart"/>
+      <w:r>
+        <w:t>app.appointment_status</w:t>
+      </w:r>
+      <w:proofErr w:type="spellEnd"/>
+    </w:p>
+    <w:p>
+      <w:r>
+        <w:tab/>
+        <w:t>, case</w:t>
+      </w:r>
+    </w:p>
+    <w:p>
+      <w:r>
+        <w:tab/>
+      </w:r>
+      <w:r>
+        <w:tab/>
+      </w:r>
+      <w:r>
+        <w:tab/>
+        <w:t xml:space="preserve">when </w:t>
+      </w:r>
+      <w:proofErr w:type="spellStart"/>
+      <w:r>
+        <w:t>pts.age</w:t>
+      </w:r>
+      <w:proofErr w:type="spellEnd"/>
+      <w:r>
+        <w:t xml:space="preserve"> &lt;18 then 'Under_18'</w:t>
+      </w:r>
+    </w:p>
+    <w:p>
+      <w:r>
+        <w:tab/>
+      </w:r>
+      <w:r>
+        <w:tab/>
+      </w:r>
+      <w:r>
+        <w:tab/>
+        <w:t xml:space="preserve">when </w:t>
+      </w:r>
+      <w:proofErr w:type="spellStart"/>
+      <w:r>
+        <w:t>pts.age</w:t>
+      </w:r>
+      <w:proofErr w:type="spellEnd"/>
+      <w:r>
+        <w:t xml:space="preserve"> between 18 and 44 then '18-44'</w:t>
+      </w:r>
+    </w:p>
+    <w:p>
+      <w:r>
+        <w:tab/>
+      </w:r>
+      <w:r>
+        <w:tab/>
+      </w:r>
+      <w:r>
+        <w:tab/>
+        <w:t xml:space="preserve">when </w:t>
+      </w:r>
+      <w:proofErr w:type="spellStart"/>
+      <w:r>
+        <w:t>pts.age</w:t>
+      </w:r>
+      <w:proofErr w:type="spellEnd"/>
+      <w:r>
+        <w:t xml:space="preserve"> between 45 and 64 then '45-64' --middle age</w:t>
+      </w:r>
+    </w:p>
+    <w:p>
+      <w:r>
+        <w:tab/>
+      </w:r>
+      <w:r>
+        <w:tab/>
+      </w:r>
+      <w:r>
+        <w:tab/>
+        <w:t xml:space="preserve">when </w:t>
+      </w:r>
+      <w:proofErr w:type="spellStart"/>
+      <w:r>
+        <w:t>pts.age</w:t>
+      </w:r>
+      <w:proofErr w:type="spellEnd"/>
+      <w:r>
+        <w:t xml:space="preserve"> &gt;64 then '</w:t>
+      </w:r>
+      <w:proofErr w:type="spellStart"/>
+      <w:r>
+        <w:t>Older_Adults</w:t>
+      </w:r>
+      <w:proofErr w:type="spellEnd"/>
+      <w:r>
+        <w:t>'</w:t>
+      </w:r>
+    </w:p>
+    <w:p>
+      <w:r>
+        <w:tab/>
+      </w:r>
+      <w:r>
+        <w:tab/>
+      </w:r>
+      <w:r>
+        <w:tab/>
+        <w:t>else '</w:t>
+      </w:r>
+      <w:proofErr w:type="spellStart"/>
+      <w:r>
+        <w:t>Group_Not_Represented</w:t>
+      </w:r>
+      <w:proofErr w:type="spellEnd"/>
+      <w:r>
+        <w:t>'</w:t>
+      </w:r>
+    </w:p>
+    <w:p>
+      <w:r>
+        <w:tab/>
+      </w:r>
+      <w:r>
+        <w:tab/>
+        <w:t xml:space="preserve">  end as </w:t>
+      </w:r>
+      <w:proofErr w:type="spellStart"/>
+      <w:r>
+        <w:t>age_group</w:t>
+      </w:r>
+      <w:proofErr w:type="spellEnd"/>
+    </w:p>
+    <w:p>
+      <w:r>
+        <w:t>From</w:t>
+      </w:r>
+    </w:p>
+    <w:p>
+      <w:r>
+        <w:tab/>
+        <w:t>appointments app</w:t>
+      </w:r>
+    </w:p>
+    <w:p>
+      <w:r>
+        <w:tab/>
+      </w:r>
+      <w:r>
+        <w:tab/>
+        <w:t>inner join patients pts</w:t>
+      </w:r>
+    </w:p>
+    <w:p>
+      <w:r>
+        <w:tab/>
+      </w:r>
+      <w:r>
+        <w:tab/>
+      </w:r>
+      <w:r>
+        <w:tab/>
+        <w:t xml:space="preserve">on </w:t>
+      </w:r>
+      <w:proofErr w:type="spellStart"/>
+      <w:r>
+        <w:t>app.patient_id</w:t>
+      </w:r>
+      <w:proofErr w:type="spellEnd"/>
+      <w:r>
+        <w:t>=</w:t>
+      </w:r>
+      <w:proofErr w:type="spellStart"/>
+      <w:r>
+        <w:t>pts.patient_id</w:t>
+      </w:r>
+      <w:proofErr w:type="spellEnd"/>
+    </w:p>
+    <w:p>
+      <w:r>
+        <w:t>Where</w:t>
+      </w:r>
+    </w:p>
+    <w:p>
+      <w:r>
+        <w:tab/>
+      </w:r>
+      <w:proofErr w:type="spellStart"/>
+      <w:r>
+        <w:t>app.appointment_status</w:t>
+      </w:r>
+      <w:proofErr w:type="spellEnd"/>
+      <w:r>
+        <w:t xml:space="preserve"> = 'No-Show'</w:t>
+      </w:r>
+    </w:p>
+    <w:p>
+      <w:r>
+        <w:t>Group By</w:t>
+      </w:r>
+    </w:p>
+    <w:p>
+      <w:r>
+        <w:tab/>
+        <w:t xml:space="preserve">  </w:t>
+      </w:r>
+      <w:proofErr w:type="spellStart"/>
+      <w:r>
+        <w:t>app.appointment_status</w:t>
+      </w:r>
+      <w:proofErr w:type="spellEnd"/>
+    </w:p>
+    <w:p>
+      <w:r>
+        <w:tab/>
+        <w:t xml:space="preserve">, </w:t>
+      </w:r>
+      <w:proofErr w:type="spellStart"/>
+      <w:r>
+        <w:t>pts.gender</w:t>
+      </w:r>
+      <w:proofErr w:type="spellEnd"/>
+    </w:p>
+    <w:p>
+      <w:r>
+        <w:tab/>
+        <w:t xml:space="preserve">, </w:t>
+      </w:r>
+      <w:proofErr w:type="spellStart"/>
+      <w:r>
+        <w:t>age_group</w:t>
+      </w:r>
+      <w:proofErr w:type="spellEnd"/>
+    </w:p>
+    <w:p>
+      <w:r>
+        <w:tab/>
+        <w:t xml:space="preserve">, </w:t>
+      </w:r>
+      <w:proofErr w:type="spellStart"/>
+      <w:r>
+        <w:t>pts.city</w:t>
+      </w:r>
+      <w:proofErr w:type="spellEnd"/>
+    </w:p>
+    <w:p>
+      <w:r>
+        <w:t>Order By</w:t>
+      </w:r>
+    </w:p>
+    <w:p>
+      <w:r>
+        <w:tab/>
+      </w:r>
+      <w:proofErr w:type="spellStart"/>
+      <w:r>
+        <w:t>total_no_show</w:t>
+      </w:r>
+      <w:proofErr w:type="spellEnd"/>
+      <w:r>
+        <w:t xml:space="preserve"> desc</w:t>
+      </w:r>
+    </w:p>
+    <w:p>
+      <w:r>
+        <w:t>;</w:t>
+      </w:r>
+    </w:p>
+    <w:p/>
+    <w:p>
+      <w:r>
+        <w:t xml:space="preserve">--sum of </w:t>
+      </w:r>
+      <w:proofErr w:type="spellStart"/>
+      <w:r>
+        <w:t>total_no_shows</w:t>
+      </w:r>
+      <w:proofErr w:type="spellEnd"/>
+      <w:r>
+        <w:t>: 722</w:t>
+      </w:r>
+    </w:p>
+    <w:p>
+      <w:r>
+        <w:t>Select</w:t>
+      </w:r>
+    </w:p>
+    <w:p>
+      <w:r>
+        <w:lastRenderedPageBreak/>
+        <w:tab/>
+        <w:t>sum(</w:t>
+      </w:r>
+      <w:proofErr w:type="spellStart"/>
+      <w:r>
+        <w:t>total_no_show</w:t>
+      </w:r>
+      <w:proofErr w:type="spellEnd"/>
+      <w:r>
+        <w:t>)</w:t>
+      </w:r>
+    </w:p>
+    <w:p>
+      <w:r>
+        <w:t>From</w:t>
+      </w:r>
+    </w:p>
+    <w:p>
+      <w:r>
+        <w:tab/>
+        <w:t>(</w:t>
+      </w:r>
+    </w:p>
+    <w:p>
+      <w:r>
+        <w:tab/>
+      </w:r>
+      <w:r>
+        <w:tab/>
+        <w:t>Select</w:t>
+      </w:r>
+    </w:p>
+    <w:p>
+      <w:r>
+        <w:tab/>
+      </w:r>
+      <w:r>
+        <w:tab/>
+      </w:r>
+      <w:r>
+        <w:tab/>
+        <w:t xml:space="preserve">  Count(*) </w:t>
+      </w:r>
+      <w:proofErr w:type="spellStart"/>
+      <w:r>
+        <w:t>total_no_show</w:t>
+      </w:r>
+      <w:proofErr w:type="spellEnd"/>
+    </w:p>
+    <w:p>
+      <w:r>
+        <w:tab/>
+      </w:r>
+      <w:r>
+        <w:tab/>
+      </w:r>
+      <w:r>
+        <w:tab/>
+        <w:t xml:space="preserve">, </w:t>
+      </w:r>
+      <w:proofErr w:type="spellStart"/>
+      <w:r>
+        <w:t>pts.gender</w:t>
+      </w:r>
+      <w:proofErr w:type="spellEnd"/>
+    </w:p>
+    <w:p>
+      <w:r>
+        <w:tab/>
+      </w:r>
+      <w:r>
+        <w:tab/>
+      </w:r>
+      <w:r>
+        <w:tab/>
+        <w:t xml:space="preserve">, </w:t>
+      </w:r>
+      <w:proofErr w:type="spellStart"/>
+      <w:r>
+        <w:t>pts.city</w:t>
+      </w:r>
+      <w:proofErr w:type="spellEnd"/>
+    </w:p>
+    <w:p>
+      <w:r>
+        <w:tab/>
+      </w:r>
+      <w:r>
+        <w:tab/>
+      </w:r>
+      <w:r>
+        <w:tab/>
+        <w:t xml:space="preserve">, </w:t>
+      </w:r>
+      <w:proofErr w:type="spellStart"/>
+      <w:r>
+        <w:t>app.appointment_status</w:t>
+      </w:r>
+      <w:proofErr w:type="spellEnd"/>
+    </w:p>
+    <w:p>
+      <w:r>
+        <w:tab/>
+      </w:r>
+      <w:r>
+        <w:tab/>
+      </w:r>
+      <w:r>
+        <w:tab/>
+        <w:t>, case</w:t>
+      </w:r>
+    </w:p>
+    <w:p>
+      <w:r>
+        <w:tab/>
+      </w:r>
+      <w:r>
+        <w:tab/>
+      </w:r>
+      <w:r>
+        <w:tab/>
+      </w:r>
+      <w:r>
+        <w:tab/>
+      </w:r>
+      <w:r>
+        <w:tab/>
+        <w:t xml:space="preserve">when </w:t>
+      </w:r>
+      <w:proofErr w:type="spellStart"/>
+      <w:r>
+        <w:t>pts.age</w:t>
+      </w:r>
+      <w:proofErr w:type="spellEnd"/>
+      <w:r>
+        <w:t xml:space="preserve"> &lt;18 then 'Under_18'</w:t>
+      </w:r>
+    </w:p>
+    <w:p>
+      <w:r>
+        <w:tab/>
+      </w:r>
+      <w:r>
+        <w:tab/>
+      </w:r>
+      <w:r>
+        <w:tab/>
+      </w:r>
+      <w:r>
+        <w:tab/>
+      </w:r>
+      <w:r>
+        <w:tab/>
+        <w:t xml:space="preserve">when </w:t>
+      </w:r>
+      <w:proofErr w:type="spellStart"/>
+      <w:r>
+        <w:t>pts.age</w:t>
+      </w:r>
+      <w:proofErr w:type="spellEnd"/>
+      <w:r>
+        <w:t xml:space="preserve"> between 18 and 44 then '18-44'</w:t>
+      </w:r>
+    </w:p>
+    <w:p>
+      <w:r>
+        <w:tab/>
+      </w:r>
+      <w:r>
+        <w:tab/>
+      </w:r>
+      <w:r>
+        <w:tab/>
+      </w:r>
+      <w:r>
+        <w:tab/>
+      </w:r>
+      <w:r>
+        <w:tab/>
+        <w:t xml:space="preserve">when </w:t>
+      </w:r>
+      <w:proofErr w:type="spellStart"/>
+      <w:r>
+        <w:t>pts.age</w:t>
+      </w:r>
+      <w:proofErr w:type="spellEnd"/>
+      <w:r>
+        <w:t xml:space="preserve"> between 45 and 64 then '45-64' --middle age</w:t>
+      </w:r>
+    </w:p>
+    <w:p>
+      <w:r>
+        <w:tab/>
+      </w:r>
+      <w:r>
+        <w:tab/>
+      </w:r>
+      <w:r>
+        <w:tab/>
+      </w:r>
+      <w:r>
+        <w:tab/>
+      </w:r>
+      <w:r>
+        <w:tab/>
+        <w:t xml:space="preserve">when </w:t>
+      </w:r>
+      <w:proofErr w:type="spellStart"/>
+      <w:r>
+        <w:t>pts.age</w:t>
+      </w:r>
+      <w:proofErr w:type="spellEnd"/>
+      <w:r>
+        <w:t xml:space="preserve"> &gt;64 then '</w:t>
+      </w:r>
+      <w:proofErr w:type="spellStart"/>
+      <w:r>
+        <w:t>Older_Adults</w:t>
+      </w:r>
+      <w:proofErr w:type="spellEnd"/>
+      <w:r>
+        <w:t>'</w:t>
+      </w:r>
+    </w:p>
+    <w:p>
+      <w:r>
+        <w:tab/>
+      </w:r>
+      <w:r>
+        <w:tab/>
+      </w:r>
+      <w:r>
+        <w:tab/>
+      </w:r>
+      <w:r>
+        <w:tab/>
+      </w:r>
+      <w:r>
+        <w:tab/>
+        <w:t>else '</w:t>
+      </w:r>
+      <w:proofErr w:type="spellStart"/>
+      <w:r>
+        <w:t>Group_Not_Represented</w:t>
+      </w:r>
+      <w:proofErr w:type="spellEnd"/>
+      <w:r>
+        <w:t>'</w:t>
+      </w:r>
+    </w:p>
+    <w:p>
+      <w:r>
+        <w:tab/>
+      </w:r>
+      <w:r>
+        <w:tab/>
+      </w:r>
+      <w:r>
+        <w:tab/>
+      </w:r>
+      <w:r>
+        <w:tab/>
+        <w:t xml:space="preserve">  end as </w:t>
+      </w:r>
+      <w:proofErr w:type="spellStart"/>
+      <w:r>
+        <w:t>age_group</w:t>
+      </w:r>
+      <w:proofErr w:type="spellEnd"/>
+    </w:p>
+    <w:p>
+      <w:r>
+        <w:tab/>
+      </w:r>
+      <w:r>
+        <w:tab/>
+        <w:t>From</w:t>
+      </w:r>
+    </w:p>
+    <w:p>
+      <w:r>
+        <w:tab/>
+      </w:r>
+      <w:r>
+        <w:tab/>
+      </w:r>
+      <w:r>
+        <w:tab/>
+        <w:t>appointments app</w:t>
+      </w:r>
+    </w:p>
+    <w:p>
+      <w:r>
+        <w:tab/>
+      </w:r>
+      <w:r>
+        <w:tab/>
+      </w:r>
+      <w:r>
+        <w:tab/>
+      </w:r>
+      <w:r>
+        <w:tab/>
+        <w:t>inner join patients pts</w:t>
+      </w:r>
+    </w:p>
+    <w:p>
+      <w:r>
+        <w:tab/>
+      </w:r>
+      <w:r>
+        <w:tab/>
+      </w:r>
+      <w:r>
+        <w:tab/>
+      </w:r>
+      <w:r>
+        <w:tab/>
+      </w:r>
+      <w:r>
+        <w:tab/>
+        <w:t xml:space="preserve">on </w:t>
+      </w:r>
+      <w:proofErr w:type="spellStart"/>
+      <w:r>
+        <w:t>app.patient_id</w:t>
+      </w:r>
+      <w:proofErr w:type="spellEnd"/>
+      <w:r>
+        <w:t>=</w:t>
+      </w:r>
+      <w:proofErr w:type="spellStart"/>
+      <w:r>
+        <w:t>pts.patient_id</w:t>
+      </w:r>
+      <w:proofErr w:type="spellEnd"/>
+    </w:p>
+    <w:p>
+      <w:r>
+        <w:tab/>
+      </w:r>
+      <w:r>
+        <w:tab/>
+        <w:t>Where</w:t>
+      </w:r>
+    </w:p>
+    <w:p>
+      <w:r>
+        <w:tab/>
+      </w:r>
+      <w:r>
+        <w:tab/>
+      </w:r>
+      <w:r>
+        <w:tab/>
+      </w:r>
+      <w:proofErr w:type="spellStart"/>
+      <w:r>
+        <w:t>app.appointment_status</w:t>
+      </w:r>
+      <w:proofErr w:type="spellEnd"/>
+      <w:r>
+        <w:t xml:space="preserve"> = 'No-Show'</w:t>
+      </w:r>
+    </w:p>
+    <w:p>
+      <w:r>
+        <w:tab/>
+      </w:r>
+      <w:r>
+        <w:tab/>
+        <w:t>Group By</w:t>
+      </w:r>
+    </w:p>
+    <w:p>
+      <w:r>
+        <w:tab/>
+      </w:r>
+      <w:r>
+        <w:tab/>
+      </w:r>
+      <w:r>
+        <w:tab/>
+        <w:t xml:space="preserve">  </w:t>
+      </w:r>
+      <w:proofErr w:type="spellStart"/>
+      <w:r>
+        <w:t>app.appointment_status</w:t>
+      </w:r>
+      <w:proofErr w:type="spellEnd"/>
+    </w:p>
+    <w:p>
+      <w:r>
+        <w:tab/>
+      </w:r>
+      <w:r>
+        <w:tab/>
+      </w:r>
+      <w:r>
+        <w:tab/>
+        <w:t xml:space="preserve">, </w:t>
+      </w:r>
+      <w:proofErr w:type="spellStart"/>
+      <w:r>
+        <w:t>pts.gender</w:t>
+      </w:r>
+      <w:proofErr w:type="spellEnd"/>
+    </w:p>
+    <w:p>
+      <w:r>
+        <w:tab/>
+      </w:r>
+      <w:r>
+        <w:tab/>
+      </w:r>
+      <w:r>
+        <w:tab/>
+        <w:t xml:space="preserve">, </w:t>
+      </w:r>
+      <w:proofErr w:type="spellStart"/>
+      <w:r>
+        <w:t>age_group</w:t>
+      </w:r>
+      <w:proofErr w:type="spellEnd"/>
+    </w:p>
+    <w:p>
+      <w:r>
+        <w:lastRenderedPageBreak/>
+        <w:tab/>
+      </w:r>
+      <w:r>
+        <w:tab/>
+      </w:r>
+      <w:r>
+        <w:tab/>
+        <w:t xml:space="preserve">, </w:t>
+      </w:r>
+      <w:proofErr w:type="spellStart"/>
+      <w:r>
+        <w:t>pts.city</w:t>
+      </w:r>
+      <w:proofErr w:type="spellEnd"/>
+    </w:p>
+    <w:p>
+      <w:r>
+        <w:tab/>
+      </w:r>
+      <w:r>
+        <w:tab/>
+        <w:t>Order By</w:t>
+      </w:r>
+    </w:p>
+    <w:p>
+      <w:r>
+        <w:tab/>
+      </w:r>
+      <w:r>
+        <w:tab/>
+      </w:r>
+      <w:r>
+        <w:tab/>
+      </w:r>
+      <w:proofErr w:type="spellStart"/>
+      <w:r>
+        <w:t>total_no_show</w:t>
+      </w:r>
+      <w:proofErr w:type="spellEnd"/>
+      <w:r>
+        <w:t xml:space="preserve"> desc</w:t>
+      </w:r>
+    </w:p>
+    <w:p>
+      <w:r>
+        <w:tab/>
+        <w:t>)</w:t>
+      </w:r>
+    </w:p>
+    <w:p>
+      <w:r>
+        <w:t>;</w:t>
+      </w:r>
+    </w:p>
+    <w:p/>
+    <w:p>
+      <w:r>
+        <w:t xml:space="preserve">--Shows number of demographic groups experiencing specific </w:t>
+      </w:r>
+      <w:proofErr w:type="spellStart"/>
+      <w:r>
+        <w:t>total_no_show</w:t>
+      </w:r>
+      <w:proofErr w:type="spellEnd"/>
+      <w:r>
+        <w:t xml:space="preserve"> rates.</w:t>
+      </w:r>
+    </w:p>
+    <w:p>
+      <w:r>
+        <w:t>Select</w:t>
+      </w:r>
+    </w:p>
+    <w:p>
+      <w:r>
+        <w:tab/>
+        <w:t xml:space="preserve">  count(</w:t>
+      </w:r>
+      <w:proofErr w:type="spellStart"/>
+      <w:r>
+        <w:t>total_no_show</w:t>
+      </w:r>
+      <w:proofErr w:type="spellEnd"/>
+      <w:r>
+        <w:t xml:space="preserve">) </w:t>
+      </w:r>
+      <w:proofErr w:type="spellStart"/>
+      <w:r>
+        <w:t>total_demo_of_no_show</w:t>
+      </w:r>
+      <w:proofErr w:type="spellEnd"/>
+    </w:p>
+    <w:p>
+      <w:r>
+        <w:tab/>
+        <w:t xml:space="preserve">, </w:t>
+      </w:r>
+      <w:proofErr w:type="spellStart"/>
+      <w:r>
+        <w:t>total_no_show</w:t>
+      </w:r>
+      <w:proofErr w:type="spellEnd"/>
+    </w:p>
+    <w:p>
+      <w:r>
+        <w:t>From</w:t>
+      </w:r>
+    </w:p>
+    <w:p>
+      <w:r>
+        <w:tab/>
+        <w:t>(</w:t>
+      </w:r>
+    </w:p>
+    <w:p>
+      <w:r>
+        <w:tab/>
+      </w:r>
+      <w:r>
+        <w:tab/>
+        <w:t>Select</w:t>
+      </w:r>
+    </w:p>
+    <w:p>
+      <w:r>
+        <w:tab/>
+      </w:r>
+      <w:r>
+        <w:tab/>
+      </w:r>
+      <w:r>
+        <w:tab/>
+        <w:t xml:space="preserve">  Count(*) </w:t>
+      </w:r>
+      <w:proofErr w:type="spellStart"/>
+      <w:r>
+        <w:t>total_no_show</w:t>
+      </w:r>
+      <w:proofErr w:type="spellEnd"/>
+    </w:p>
+    <w:p>
+      <w:r>
+        <w:tab/>
+      </w:r>
+      <w:r>
+        <w:tab/>
+      </w:r>
+      <w:r>
+        <w:tab/>
+        <w:t xml:space="preserve">, </w:t>
+      </w:r>
+      <w:proofErr w:type="spellStart"/>
+      <w:r>
+        <w:t>pts.gender</w:t>
+      </w:r>
+      <w:proofErr w:type="spellEnd"/>
+    </w:p>
+    <w:p>
+      <w:r>
+        <w:tab/>
+      </w:r>
+      <w:r>
+        <w:tab/>
+      </w:r>
+      <w:r>
+        <w:tab/>
+        <w:t xml:space="preserve">, </w:t>
+      </w:r>
+      <w:proofErr w:type="spellStart"/>
+      <w:r>
+        <w:t>pts.city</w:t>
+      </w:r>
+      <w:proofErr w:type="spellEnd"/>
+    </w:p>
+    <w:p>
+      <w:r>
+        <w:tab/>
+      </w:r>
+      <w:r>
+        <w:tab/>
+      </w:r>
+      <w:r>
+        <w:tab/>
+        <w:t xml:space="preserve">, </w:t>
+      </w:r>
+      <w:proofErr w:type="spellStart"/>
+      <w:r>
+        <w:t>app.appointment_status</w:t>
+      </w:r>
+      <w:proofErr w:type="spellEnd"/>
+    </w:p>
+    <w:p>
+      <w:r>
+        <w:tab/>
+      </w:r>
+      <w:r>
+        <w:tab/>
+      </w:r>
+      <w:r>
+        <w:tab/>
+        <w:t>, case</w:t>
+      </w:r>
+    </w:p>
+    <w:p>
+      <w:r>
+        <w:tab/>
+      </w:r>
+      <w:r>
+        <w:tab/>
+      </w:r>
+      <w:r>
+        <w:tab/>
+      </w:r>
+      <w:r>
+        <w:tab/>
+      </w:r>
+      <w:r>
+        <w:tab/>
+        <w:t xml:space="preserve">when </w:t>
+      </w:r>
+      <w:proofErr w:type="spellStart"/>
+      <w:r>
+        <w:t>pts.age</w:t>
+      </w:r>
+      <w:proofErr w:type="spellEnd"/>
+      <w:r>
+        <w:t xml:space="preserve"> &lt;18 then 'Under_18'</w:t>
+      </w:r>
+    </w:p>
+    <w:p>
+      <w:r>
+        <w:tab/>
+      </w:r>
+      <w:r>
+        <w:tab/>
+      </w:r>
+      <w:r>
+        <w:tab/>
+      </w:r>
+      <w:r>
+        <w:tab/>
+      </w:r>
+      <w:r>
+        <w:tab/>
+        <w:t xml:space="preserve">when </w:t>
+      </w:r>
+      <w:proofErr w:type="spellStart"/>
+      <w:r>
+        <w:t>pts.age</w:t>
+      </w:r>
+      <w:proofErr w:type="spellEnd"/>
+      <w:r>
+        <w:t xml:space="preserve"> between 18 and 44 then '18-44'</w:t>
+      </w:r>
+    </w:p>
+    <w:p>
+      <w:r>
+        <w:tab/>
+      </w:r>
+      <w:r>
+        <w:tab/>
+      </w:r>
+      <w:r>
+        <w:tab/>
+      </w:r>
+      <w:r>
+        <w:tab/>
+      </w:r>
+      <w:r>
+        <w:tab/>
+        <w:t xml:space="preserve">when </w:t>
+      </w:r>
+      <w:proofErr w:type="spellStart"/>
+      <w:r>
+        <w:t>pts.age</w:t>
+      </w:r>
+      <w:proofErr w:type="spellEnd"/>
+      <w:r>
+        <w:t xml:space="preserve"> between 45 and 64 then '45-64' --middle age</w:t>
+      </w:r>
+    </w:p>
+    <w:p>
+      <w:r>
+        <w:tab/>
+      </w:r>
+      <w:r>
+        <w:tab/>
+      </w:r>
+      <w:r>
+        <w:tab/>
+      </w:r>
+      <w:r>
+        <w:tab/>
+      </w:r>
+      <w:r>
+        <w:tab/>
+        <w:t xml:space="preserve">when </w:t>
+      </w:r>
+      <w:proofErr w:type="spellStart"/>
+      <w:r>
+        <w:t>pts.age</w:t>
+      </w:r>
+      <w:proofErr w:type="spellEnd"/>
+      <w:r>
+        <w:t xml:space="preserve"> &gt;64 then '</w:t>
+      </w:r>
+      <w:proofErr w:type="spellStart"/>
+      <w:r>
+        <w:t>Older_Adults</w:t>
+      </w:r>
+      <w:proofErr w:type="spellEnd"/>
+      <w:r>
+        <w:t>'</w:t>
+      </w:r>
+    </w:p>
+    <w:p>
+      <w:r>
+        <w:tab/>
+      </w:r>
+      <w:r>
+        <w:tab/>
+      </w:r>
+      <w:r>
+        <w:tab/>
+      </w:r>
+      <w:r>
+        <w:tab/>
+      </w:r>
+      <w:r>
+        <w:tab/>
+        <w:t>else '</w:t>
+      </w:r>
+      <w:proofErr w:type="spellStart"/>
+      <w:r>
+        <w:t>Group_Not_Represented</w:t>
+      </w:r>
+      <w:proofErr w:type="spellEnd"/>
+      <w:r>
+        <w:t>'</w:t>
+      </w:r>
+    </w:p>
+    <w:p>
+      <w:r>
+        <w:tab/>
+      </w:r>
+      <w:r>
+        <w:tab/>
+      </w:r>
+      <w:r>
+        <w:tab/>
+      </w:r>
+      <w:r>
+        <w:tab/>
+        <w:t xml:space="preserve">  end as </w:t>
+      </w:r>
+      <w:proofErr w:type="spellStart"/>
+      <w:r>
+        <w:t>age_group</w:t>
+      </w:r>
+      <w:proofErr w:type="spellEnd"/>
+    </w:p>
+    <w:p>
+      <w:r>
+        <w:tab/>
+      </w:r>
+      <w:r>
+        <w:tab/>
+        <w:t>From</w:t>
+      </w:r>
+    </w:p>
+    <w:p>
+      <w:r>
+        <w:lastRenderedPageBreak/>
+        <w:tab/>
+      </w:r>
+      <w:r>
+        <w:tab/>
+      </w:r>
+      <w:r>
+        <w:tab/>
+        <w:t>appointments app</w:t>
+      </w:r>
+    </w:p>
+    <w:p>
+      <w:r>
+        <w:tab/>
+      </w:r>
+      <w:r>
+        <w:tab/>
+      </w:r>
+      <w:r>
+        <w:tab/>
+      </w:r>
+      <w:r>
+        <w:tab/>
+        <w:t>inner join patients pts</w:t>
+      </w:r>
+    </w:p>
+    <w:p>
+      <w:r>
+        <w:tab/>
+      </w:r>
+      <w:r>
+        <w:tab/>
+      </w:r>
+      <w:r>
+        <w:tab/>
+      </w:r>
+      <w:r>
+        <w:tab/>
+      </w:r>
+      <w:r>
+        <w:tab/>
+        <w:t xml:space="preserve">on </w:t>
+      </w:r>
+      <w:proofErr w:type="spellStart"/>
+      <w:r>
+        <w:t>app.patient_id</w:t>
+      </w:r>
+      <w:proofErr w:type="spellEnd"/>
+      <w:r>
+        <w:t>=</w:t>
+      </w:r>
+      <w:proofErr w:type="spellStart"/>
+      <w:r>
+        <w:t>pts.patient_id</w:t>
+      </w:r>
+      <w:proofErr w:type="spellEnd"/>
+    </w:p>
+    <w:p>
+      <w:r>
+        <w:tab/>
+      </w:r>
+      <w:r>
+        <w:tab/>
+        <w:t>Where</w:t>
+      </w:r>
+    </w:p>
+    <w:p>
+      <w:r>
+        <w:tab/>
+      </w:r>
+      <w:r>
+        <w:tab/>
+      </w:r>
+      <w:r>
+        <w:tab/>
+      </w:r>
+      <w:proofErr w:type="spellStart"/>
+      <w:r>
+        <w:t>app.appointment_status</w:t>
+      </w:r>
+      <w:proofErr w:type="spellEnd"/>
+      <w:r>
+        <w:t xml:space="preserve"> = 'No-Show'</w:t>
+      </w:r>
+    </w:p>
+    <w:p>
+      <w:r>
+        <w:tab/>
+      </w:r>
+      <w:r>
+        <w:tab/>
+        <w:t>Group By</w:t>
+      </w:r>
+    </w:p>
+    <w:p>
+      <w:r>
+        <w:tab/>
+      </w:r>
+      <w:r>
+        <w:tab/>
+      </w:r>
+      <w:r>
+        <w:tab/>
+        <w:t xml:space="preserve">  </w:t>
+      </w:r>
+      <w:proofErr w:type="spellStart"/>
+      <w:r>
+        <w:t>app.appointment_status</w:t>
+      </w:r>
+      <w:proofErr w:type="spellEnd"/>
+    </w:p>
+    <w:p>
+      <w:r>
+        <w:tab/>
+      </w:r>
+      <w:r>
+        <w:tab/>
+      </w:r>
+      <w:r>
+        <w:tab/>
+        <w:t xml:space="preserve">, </w:t>
+      </w:r>
+      <w:proofErr w:type="spellStart"/>
+      <w:r>
+        <w:t>pts.gender</w:t>
+      </w:r>
+      <w:proofErr w:type="spellEnd"/>
+    </w:p>
+    <w:p>
+      <w:r>
+        <w:tab/>
+      </w:r>
+      <w:r>
+        <w:tab/>
+      </w:r>
+      <w:r>
+        <w:tab/>
+        <w:t xml:space="preserve">, </w:t>
+      </w:r>
+      <w:proofErr w:type="spellStart"/>
+      <w:r>
+        <w:t>age_group</w:t>
+      </w:r>
+      <w:proofErr w:type="spellEnd"/>
+    </w:p>
+    <w:p>
+      <w:r>
+        <w:tab/>
+      </w:r>
+      <w:r>
+        <w:tab/>
+      </w:r>
+      <w:r>
+        <w:tab/>
+        <w:t xml:space="preserve">, </w:t>
+      </w:r>
+      <w:proofErr w:type="spellStart"/>
+      <w:r>
+        <w:t>pts.city</w:t>
+      </w:r>
+      <w:proofErr w:type="spellEnd"/>
+    </w:p>
+    <w:p>
+      <w:r>
+        <w:tab/>
+      </w:r>
+      <w:r>
+        <w:tab/>
+        <w:t>Order By</w:t>
+      </w:r>
+    </w:p>
+    <w:p>
+      <w:r>
+        <w:tab/>
+      </w:r>
+      <w:r>
+        <w:tab/>
+      </w:r>
+      <w:r>
+        <w:tab/>
+      </w:r>
+      <w:proofErr w:type="spellStart"/>
+      <w:r>
+        <w:t>total_no_show</w:t>
+      </w:r>
+      <w:proofErr w:type="spellEnd"/>
+      <w:r>
+        <w:t xml:space="preserve"> desc</w:t>
+      </w:r>
+    </w:p>
+    <w:p>
+      <w:r>
+        <w:tab/>
+        <w:t>)</w:t>
+      </w:r>
+    </w:p>
+    <w:p>
+      <w:r>
+        <w:t>Group By</w:t>
+      </w:r>
+    </w:p>
+    <w:p>
+      <w:r>
+        <w:tab/>
+      </w:r>
+      <w:proofErr w:type="spellStart"/>
+      <w:r>
+        <w:t>total_no_show</w:t>
+      </w:r>
+      <w:proofErr w:type="spellEnd"/>
+      <w:r>
+        <w:t xml:space="preserve"> </w:t>
       </w:r>
     </w:p>
     <w:p>
@@ -2961,6 +4965,9 @@
           <w:bCs/>
         </w:rPr>
       </w:pPr>
+      <w:r>
+        <w:t>;</w:t>
+      </w:r>
     </w:p>
     <w:p>
       <w:pPr>
@@ -2969,13 +4976,14 @@
           <w:bCs/>
         </w:rPr>
       </w:pPr>
-      <w:r>
+    </w:p>
+    <w:p>
+      <w:pPr>
         <w:rPr>
           <w:b/>
           <w:bCs/>
         </w:rPr>
-        <w:t>Business Question 5</w:t>
-      </w:r>
+      </w:pPr>
     </w:p>
     <w:p>
       <w:pPr>
@@ -2984,55 +4992,74 @@
           <w:bCs/>
         </w:rPr>
       </w:pPr>
-      <w:r>
+    </w:p>
+    <w:p>
+      <w:pPr>
         <w:rPr>
           <w:b/>
           <w:bCs/>
         </w:rPr>
-        <w:t>Which patient demographic groups have the highest appointment no-show rates?</w:t>
-      </w:r>
-    </w:p>
-    <w:p>
-      <w:pPr>
+      </w:pPr>
+      <w:r>
         <w:rPr>
           <w:b/>
           <w:bCs/>
         </w:rPr>
-      </w:pPr>
+        <w:t>Phase 4 — Power BI</w:t>
+      </w:r>
       <w:r>
         <w:rPr>
           <w:b/>
           <w:bCs/>
         </w:rPr>
-        <w:t>Tables</w:t>
-      </w:r>
-    </w:p>
-    <w:p>
-      <w:pPr>
-        <w:numPr>
-          <w:ilvl w:val="0"/>
-          <w:numId w:val="18"/>
-        </w:numPr>
+        <w:t xml:space="preserve"> </w:t>
+      </w:r>
+      <w:r>
+        <w:t>(Completed 7/18/2026)</w:t>
+      </w:r>
+    </w:p>
+    <w:p>
+      <w:r>
+        <w:t>Executive Summary</w:t>
+      </w:r>
+    </w:p>
+    <w:p>
+      <w:r>
+        <w:t>Business Findings</w:t>
+      </w:r>
+    </w:p>
+    <w:p>
+      <w:r>
+        <w:t xml:space="preserve">Recommendations </w:t>
+      </w:r>
+    </w:p>
+    <w:p>
+      <w:r>
+        <w:t xml:space="preserve">Business Impact </w:t>
+      </w:r>
+    </w:p>
+    <w:p>
+      <w:pPr>
         <w:rPr>
           <w:b/>
           <w:bCs/>
         </w:rPr>
       </w:pPr>
-      <w:r>
+    </w:p>
+    <w:p>
+      <w:pPr>
         <w:rPr>
           <w:b/>
           <w:bCs/>
         </w:rPr>
-        <w:t>appointments</w:t>
-      </w:r>
-    </w:p>
-    <w:p>
-      <w:pPr>
+      </w:pPr>
+      <w:r>
         <w:rPr>
           <w:b/>
           <w:bCs/>
         </w:rPr>
-      </w:pPr>
+        <w:t xml:space="preserve">All I need to finish now are my sliders for dashboard. </w:t>
+      </w:r>
     </w:p>
     <w:p>
       <w:pPr>
@@ -3041,14 +5068,58 @@
           <w:bCs/>
         </w:rPr>
       </w:pPr>
-    </w:p>
-    <w:p>
-      <w:pPr>
+      <w:r>
         <w:rPr>
           <w:b/>
           <w:bCs/>
         </w:rPr>
-      </w:pPr>
+        <w:lastRenderedPageBreak/>
+        <w:t>KPI Cards</w:t>
+      </w:r>
+    </w:p>
+    <w:p>
+      <w:pPr>
+        <w:numPr>
+          <w:ilvl w:val="0"/>
+          <w:numId w:val="12"/>
+        </w:numPr>
+      </w:pPr>
+      <w:r>
+        <w:t>Average ER Wait Time (74 min)</w:t>
+      </w:r>
+    </w:p>
+    <w:p>
+      <w:pPr>
+        <w:numPr>
+          <w:ilvl w:val="0"/>
+          <w:numId w:val="12"/>
+        </w:numPr>
+      </w:pPr>
+      <w:r>
+        <w:t>Median ER Wait Time (67 min)</w:t>
+      </w:r>
+    </w:p>
+    <w:p>
+      <w:pPr>
+        <w:numPr>
+          <w:ilvl w:val="0"/>
+          <w:numId w:val="12"/>
+        </w:numPr>
+      </w:pPr>
+      <w:r>
+        <w:t>Average Wait Time (Admitted)</w:t>
+      </w:r>
+    </w:p>
+    <w:p>
+      <w:pPr>
+        <w:numPr>
+          <w:ilvl w:val="0"/>
+          <w:numId w:val="12"/>
+        </w:numPr>
+      </w:pPr>
+      <w:r>
+        <w:t>Average Wait Time (Not Admitted)</w:t>
+      </w:r>
     </w:p>
     <w:p>
       <w:pPr>
@@ -3057,42 +5128,35 @@
           <w:bCs/>
         </w:rPr>
       </w:pPr>
-      <w:r>
+    </w:p>
+    <w:p>
+      <w:pPr>
         <w:rPr>
           <w:b/>
           <w:bCs/>
         </w:rPr>
-        <w:t>Phase 4 — Power BI</w:t>
-      </w:r>
+      </w:pPr>
       <w:r>
         <w:rPr>
           <w:b/>
           <w:bCs/>
         </w:rPr>
-        <w:t xml:space="preserve"> </w:t>
-      </w:r>
-      <w:r>
-        <w:t>(Completed 7/18/2026)</w:t>
-      </w:r>
-    </w:p>
-    <w:p>
-      <w:r>
-        <w:t>Executive Summary</w:t>
-      </w:r>
-    </w:p>
-    <w:p>
-      <w:r>
-        <w:t>Business Findings</w:t>
-      </w:r>
-    </w:p>
-    <w:p>
-      <w:r>
-        <w:t xml:space="preserve">Recommendations </w:t>
-      </w:r>
-    </w:p>
-    <w:p>
-      <w:r>
-        <w:t xml:space="preserve">Business Impact </w:t>
+        <w:t>Visual 1</w:t>
+      </w:r>
+    </w:p>
+    <w:p>
+      <w:r>
+        <w:t>Longest Observed Wait Times by Day</w:t>
+      </w:r>
+    </w:p>
+    <w:p>
+      <w:r>
+        <w:t>This directly answers:</w:t>
+      </w:r>
+    </w:p>
+    <w:p>
+      <w:r>
+        <w:t>Which days have the longest wait times?</w:t>
       </w:r>
     </w:p>
     <w:p>
@@ -3115,7 +5179,22 @@
           <w:b/>
           <w:bCs/>
         </w:rPr>
-        <w:t xml:space="preserve">All I need to finish now are my sliders for dashboard. </w:t>
+        <w:t>Visual 2</w:t>
+      </w:r>
+    </w:p>
+    <w:p>
+      <w:r>
+        <w:t>Patient Volume by Hour</w:t>
+      </w:r>
+    </w:p>
+    <w:p>
+      <w:r>
+        <w:t>Answers:</w:t>
+      </w:r>
+    </w:p>
+    <w:p>
+      <w:r>
+        <w:t>Which hours experience the highest patient volume?</w:t>
       </w:r>
     </w:p>
     <w:p>
@@ -3125,66 +5204,36 @@
           <w:bCs/>
         </w:rPr>
       </w:pPr>
-      <w:r>
+    </w:p>
+    <w:p>
+      <w:pPr>
         <w:rPr>
           <w:b/>
           <w:bCs/>
         </w:rPr>
-        <w:t>KPI Cards</w:t>
-      </w:r>
-    </w:p>
-    <w:p>
-      <w:pPr>
-        <w:numPr>
-          <w:ilvl w:val="0"/>
-          <w:numId w:val="12"/>
-        </w:numPr>
-      </w:pPr>
-      <w:r>
-        <w:lastRenderedPageBreak/>
-        <w:t>Average ER Wait Time (74 min)</w:t>
-      </w:r>
-    </w:p>
-    <w:p>
-      <w:pPr>
-        <w:numPr>
-          <w:ilvl w:val="0"/>
-          <w:numId w:val="12"/>
-        </w:numPr>
-      </w:pPr>
-      <w:r>
-        <w:t>Median ER Wait Time (67 min)</w:t>
-      </w:r>
-    </w:p>
-    <w:p>
-      <w:pPr>
-        <w:numPr>
-          <w:ilvl w:val="0"/>
-          <w:numId w:val="12"/>
-        </w:numPr>
-      </w:pPr>
-      <w:r>
-        <w:t>Average Wait Time (Admitted)</w:t>
-      </w:r>
-    </w:p>
-    <w:p>
-      <w:pPr>
-        <w:numPr>
-          <w:ilvl w:val="0"/>
-          <w:numId w:val="12"/>
-        </w:numPr>
-      </w:pPr>
-      <w:r>
-        <w:t>Average Wait Time (Not Admitted)</w:t>
-      </w:r>
-    </w:p>
-    <w:p>
-      <w:pPr>
+      </w:pPr>
+      <w:r>
         <w:rPr>
           <w:b/>
           <w:bCs/>
         </w:rPr>
-      </w:pPr>
+        <w:t>Visual 3</w:t>
+      </w:r>
+    </w:p>
+    <w:p>
+      <w:r>
+        <w:t>Average Wait Time by Severity</w:t>
+      </w:r>
+    </w:p>
+    <w:p>
+      <w:r>
+        <w:t>Answers:</w:t>
+      </w:r>
+    </w:p>
+    <w:p>
+      <w:r>
+        <w:t>Does severity level affect wait time?</w:t>
+      </w:r>
     </w:p>
     <w:p>
       <w:pPr>
@@ -3193,125 +5242,19 @@
           <w:bCs/>
         </w:rPr>
       </w:pPr>
-      <w:r>
+    </w:p>
+    <w:p>
+      <w:pPr>
         <w:rPr>
           <w:b/>
           <w:bCs/>
         </w:rPr>
-        <w:t>Visual 1</w:t>
-      </w:r>
-    </w:p>
-    <w:p>
-      <w:r>
-        <w:t>Longest Observed Wait Times by Day</w:t>
-      </w:r>
-    </w:p>
-    <w:p>
-      <w:r>
-        <w:t>This directly answers:</w:t>
-      </w:r>
-    </w:p>
-    <w:p>
-      <w:r>
-        <w:t>Which days have the longest wait times?</w:t>
-      </w:r>
-    </w:p>
-    <w:p>
-      <w:pPr>
+      </w:pPr>
+      <w:r>
         <w:rPr>
           <w:b/>
           <w:bCs/>
         </w:rPr>
-      </w:pPr>
-    </w:p>
-    <w:p>
-      <w:pPr>
-        <w:rPr>
-          <w:b/>
-          <w:bCs/>
-        </w:rPr>
-      </w:pPr>
-      <w:r>
-        <w:rPr>
-          <w:b/>
-          <w:bCs/>
-        </w:rPr>
-        <w:t>Visual 2</w:t>
-      </w:r>
-    </w:p>
-    <w:p>
-      <w:r>
-        <w:t>Patient Volume by Hour</w:t>
-      </w:r>
-    </w:p>
-    <w:p>
-      <w:r>
-        <w:t>Answers:</w:t>
-      </w:r>
-    </w:p>
-    <w:p>
-      <w:r>
-        <w:t>Which hours experience the highest patient volume?</w:t>
-      </w:r>
-    </w:p>
-    <w:p>
-      <w:pPr>
-        <w:rPr>
-          <w:b/>
-          <w:bCs/>
-        </w:rPr>
-      </w:pPr>
-    </w:p>
-    <w:p>
-      <w:pPr>
-        <w:rPr>
-          <w:b/>
-          <w:bCs/>
-        </w:rPr>
-      </w:pPr>
-      <w:r>
-        <w:rPr>
-          <w:b/>
-          <w:bCs/>
-        </w:rPr>
-        <w:t>Visual 3</w:t>
-      </w:r>
-    </w:p>
-    <w:p>
-      <w:r>
-        <w:t>Average Wait Time by Severity</w:t>
-      </w:r>
-    </w:p>
-    <w:p>
-      <w:r>
-        <w:t>Answers:</w:t>
-      </w:r>
-    </w:p>
-    <w:p>
-      <w:r>
-        <w:t>Does severity level affect wait time?</w:t>
-      </w:r>
-    </w:p>
-    <w:p>
-      <w:pPr>
-        <w:rPr>
-          <w:b/>
-          <w:bCs/>
-        </w:rPr>
-      </w:pPr>
-    </w:p>
-    <w:p>
-      <w:pPr>
-        <w:rPr>
-          <w:b/>
-          <w:bCs/>
-        </w:rPr>
-      </w:pPr>
-      <w:r>
-        <w:rPr>
-          <w:b/>
-          <w:bCs/>
-        </w:rPr>
         <w:t>Visual 4</w:t>
       </w:r>
     </w:p>
@@ -3355,6 +5298,7 @@
         </w:numPr>
       </w:pPr>
       <w:r>
+        <w:lastRenderedPageBreak/>
         <w:t>High</w:t>
       </w:r>
     </w:p>
@@ -3366,7 +5310,6 @@
         </w:numPr>
       </w:pPr>
       <w:r>
-        <w:lastRenderedPageBreak/>
         <w:t>Critical</w:t>
       </w:r>
     </w:p>
@@ -3563,6 +5506,7 @@
         </w:numPr>
       </w:pPr>
       <w:r>
+        <w:lastRenderedPageBreak/>
         <w:t>Average ≈ </w:t>
       </w:r>
       <w:r>
@@ -3585,7 +5529,6 @@
     </w:p>
     <w:p>
       <w:r>
-        <w:lastRenderedPageBreak/>
         <w:pict w14:anchorId="48A2F741">
           <v:rect id="_x0000_i1026" style="width:0;height:1.5pt" o:hralign="center" o:hrstd="t" o:hr="t" fillcolor="#a0a0a0" stroked="f"/>
         </w:pict>
@@ -3907,6 +5850,7 @@
     </w:p>
     <w:p>
       <w:r>
+        <w:lastRenderedPageBreak/>
         <w:t>Then compare average wait times.</w:t>
       </w:r>
       <w:r>
@@ -3925,7 +5869,6 @@
     </w:p>
     <w:p>
       <w:r>
-        <w:lastRenderedPageBreak/>
         <w:pict w14:anchorId="77E78F54">
           <v:rect id="_x0000_i1030" style="width:0;height:1.5pt" o:hralign="center" o:hrstd="t" o:hr="t" fillcolor="#a0a0a0" stroked="f"/>
         </w:pict>
@@ -4558,12 +6501,12 @@
     </w:p>
     <w:p>
       <w:r>
+        <w:lastRenderedPageBreak/>
         <w:t>Before writing a single query, I want you to:</w:t>
       </w:r>
     </w:p>
     <w:p>
       <w:r>
-        <w:lastRenderedPageBreak/>
         <w:t>1. Open each table.</w:t>
       </w:r>
     </w:p>
@@ -5419,6 +7362,7 @@
         </w:numPr>
       </w:pPr>
       <w:r>
+        <w:lastRenderedPageBreak/>
         <w:t xml:space="preserve">The </w:t>
       </w:r>
       <w:r>
@@ -5473,7 +7417,6 @@
         </w:numPr>
       </w:pPr>
       <w:r>
-        <w:lastRenderedPageBreak/>
         <w:t>S</w:t>
       </w:r>
       <w:r>
@@ -6215,6 +8158,7 @@
         </w:numPr>
       </w:pPr>
       <w:r>
+        <w:lastRenderedPageBreak/>
         <w:t xml:space="preserve">There </w:t>
       </w:r>
       <w:r>
@@ -6245,7 +8189,6 @@
         </w:numPr>
       </w:pPr>
       <w:r>
-        <w:lastRenderedPageBreak/>
         <w:t>Patients</w:t>
       </w:r>
     </w:p>
@@ -6547,6 +8490,7 @@
     </w:p>
     <w:p>
       <w:r>
+        <w:lastRenderedPageBreak/>
         <w:t>7. Sketch a simple entity-relationship (ER) diagram on paper or digitally.</w:t>
       </w:r>
     </w:p>
@@ -6843,6 +8787,7 @@
     <w:p/>
     <w:p>
       <w:r>
+        <w:lastRenderedPageBreak/>
         <w:t>SQL Analysis I plan to perform:</w:t>
       </w:r>
     </w:p>
@@ -6855,7 +8800,6 @@
         </w:numPr>
       </w:pPr>
       <w:r>
-        <w:lastRenderedPageBreak/>
         <w:t xml:space="preserve">I can analyze the ER table and rank the patients by their wait times and then reveal any trends involving which days are busiest, what hours of the day, and possibly severity level. </w:t>
       </w:r>
     </w:p>

</xml_diff>

<commit_message>
updated and completed readme and project documentation
</commit_message>
<xml_diff>
--- a/documentation/nicosys-healthcare-portfolio-documentation.docx
+++ b/documentation/nicosys-healthcare-portfolio-documentation.docx
@@ -1,16 +1,13 @@
 
 <file path=word/document.xml><?xml version="1.0" encoding="utf-8"?>
-<w:document xmlns:wpc="http://schemas.microsoft.com/office/word/2010/wordprocessingCanvas" xmlns:cx="http://schemas.microsoft.com/office/drawing/2014/chartex" xmlns:cx1="http://schemas.microsoft.com/office/drawing/2015/9/8/chartex" xmlns:cx2="http://schemas.microsoft.com/office/drawing/2015/10/21/chartex" xmlns:cx3="http://schemas.microsoft.com/office/drawing/2016/5/9/chartex" xmlns:cx4="http://schemas.microsoft.com/office/drawing/2016/5/10/chartex" xmlns:cx5="http://schemas.microsoft.com/office/drawing/2016/5/11/chartex" xmlns:cx6="http://schemas.microsoft.com/office/drawing/2016/5/12/chartex" xmlns:cx7="http://schemas.microsoft.com/office/drawing/2016/5/13/chartex" xmlns:cx8="http://schemas.microsoft.com/office/drawing/2016/5/14/chartex" xmlns:mc="http://schemas.openxmlformats.org/markup-compatibility/2006" xmlns:aink="http://schemas.microsoft.com/office/drawing/2016/ink" xmlns:am3d="http://schemas.microsoft.com/office/drawing/2017/model3d" xmlns:o="urn:schemas-microsoft-com:office:office" xmlns:oel="http://schemas.microsoft.com/office/2019/extlst" xmlns:r="http://schemas.openxmlformats.org/officeDocument/2006/relationships" xmlns:m="http://schemas.openxmlformats.org/officeDocument/2006/math" xmlns:v="urn:schemas-microsoft-com:vml" xmlns:wp14="http://schemas.microsoft.com/office/word/2010/wordprocessingDrawing" xmlns:wp="http://schemas.openxmlformats.org/drawingml/2006/wordprocessingDrawing" xmlns:w10="urn:schemas-microsoft-com:office:word" xmlns:w="http://schemas.openxmlformats.org/wordprocessingml/2006/main" xmlns:w14="http://schemas.microsoft.com/office/word/2010/wordml" xmlns:w15="http://schemas.microsoft.com/office/word/2012/wordml" xmlns:w16cex="http://schemas.microsoft.com/office/word/2018/wordml/cex" xmlns:w16cid="http://schemas.microsoft.com/office/word/2016/wordml/cid" xmlns:w16="http://schemas.microsoft.com/office/word/2018/wordml" xmlns:w16du="http://schemas.microsoft.com/office/word/2023/wordml/word16du" xmlns:w16sdtdh="http://schemas.microsoft.com/office/word/2020/wordml/sdtdatahash" xmlns:w16sdtfl="http://schemas.microsoft.com/office/word/2024/wordml/sdtformatlock" xmlns:w16se="http://schemas.microsoft.com/office/word/2015/wordml/symex" xmlns:wpg="http://schemas.microsoft.com/office/word/2010/wordprocessingGroup" xmlns:wpi="http://schemas.microsoft.com/office/word/2010/wordprocessingInk" xmlns:wne="http://schemas.microsoft.com/office/word/2006/wordml" xmlns:wps="http://schemas.microsoft.com/office/word/2010/wordprocessingShape" mc:Ignorable="w14 w15 w16se w16cid w16 w16cex w16sdtdh w16sdtfl w16du wp14">
+<w:document xmlns:wpc="http://schemas.microsoft.com/office/word/2010/wordprocessingCanvas" xmlns:cx="http://schemas.microsoft.com/office/drawing/2014/chartex" xmlns:cx1="http://schemas.microsoft.com/office/drawing/2015/9/8/chartex" xmlns:cx2="http://schemas.microsoft.com/office/drawing/2015/10/21/chartex" xmlns:cx3="http://schemas.microsoft.com/office/drawing/2016/5/9/chartex" xmlns:cx4="http://schemas.microsoft.com/office/drawing/2016/5/10/chartex" xmlns:cx5="http://schemas.microsoft.com/office/drawing/2016/5/11/chartex" xmlns:cx6="http://schemas.microsoft.com/office/drawing/2016/5/12/chartex" xmlns:cx7="http://schemas.microsoft.com/office/drawing/2016/5/13/chartex" xmlns:cx8="http://schemas.microsoft.com/office/drawing/2016/5/14/chartex" xmlns:mc="http://schemas.openxmlformats.org/markup-compatibility/2006" xmlns:aink="http://schemas.microsoft.com/office/drawing/2016/ink" xmlns:am3d="http://schemas.microsoft.com/office/drawing/2017/model3d" xmlns:o="urn:schemas-microsoft-com:office:office" xmlns:oel="http://schemas.microsoft.com/office/2019/extlst" xmlns:r="http://schemas.openxmlformats.org/officeDocument/2006/relationships" xmlns:m="http://schemas.openxmlformats.org/officeDocument/2006/math" xmlns:v="urn:schemas-microsoft-com:vml" xmlns:wp14="http://schemas.microsoft.com/office/word/2010/wordprocessingDrawing" xmlns:wp="http://schemas.openxmlformats.org/drawingml/2006/wordprocessingDrawing" xmlns:w10="urn:schemas-microsoft-com:office:word" xmlns:w="http://schemas.openxmlformats.org/wordprocessingml/2006/main" xmlns:w14="http://schemas.microsoft.com/office/word/2010/wordml" xmlns:w15="http://schemas.microsoft.com/office/word/2012/wordml" xmlns:w16cei="http://schemas.microsoft.com/office/word/2026/wordml/cei" xmlns:w16cex="http://schemas.microsoft.com/office/word/2018/wordml/cex" xmlns:w16cid="http://schemas.microsoft.com/office/word/2016/wordml/cid" xmlns:w16="http://schemas.microsoft.com/office/word/2018/wordml" xmlns:w16du="http://schemas.microsoft.com/office/word/2023/wordml/word16du" xmlns:w16sdtdh="http://schemas.microsoft.com/office/word/2020/wordml/sdtdatahash" xmlns:w16sdtfl="http://schemas.microsoft.com/office/word/2024/wordml/sdtformatlock" xmlns:w16se="http://schemas.microsoft.com/office/word/2015/wordml/symex" xmlns:wpg="http://schemas.microsoft.com/office/word/2010/wordprocessingGroup" xmlns:wpi="http://schemas.microsoft.com/office/word/2010/wordprocessingInk" xmlns:wne="http://schemas.microsoft.com/office/word/2006/wordml" xmlns:wps="http://schemas.microsoft.com/office/word/2010/wordprocessingShape" mc:Ignorable="w14 w15 w16se w16cid w16 w16cex w16sdtdh w16sdtfl w16du wp14">
   <w:body>
     <w:p>
       <w:r>
-        <w:t>The Healthcare Project is complete. I will now move on to my other 2 portfolio projects. Once all 3 projects are completed, I’ll will create</w:t>
-      </w:r>
-      <w:r>
-        <w:t xml:space="preserve"> </w:t>
-      </w:r>
-      <w:r>
-        <w:t>a Canva presentation that presents my portfolio in a more accessible format, summarizing each project’s business question, methodology, tools, and recommendations</w:t>
+        <w:t>The Healthcare Project is complete. I will now move on to my other 2 portfolio projects. Once all 3 projects are completed, I will create</w:t>
+      </w:r>
+      <w:r>
+        <w:t xml:space="preserve"> a Canva presentation that presents my portfolio in a more accessible format, summarizing each project’s business question, methodology, tools, and recommendations</w:t>
       </w:r>
       <w:r>
         <w:t xml:space="preserve">, and finally update my resume and LinkedIn with Git Hub links and Canva presentation. </w:t>
@@ -35,19 +32,55 @@
           <w:b/>
           <w:bCs/>
         </w:rPr>
-        <w:t xml:space="preserve">Phase 5 -  </w:t>
+        <w:t xml:space="preserve">Phase 5 - </w:t>
       </w:r>
       <w:r>
         <w:rPr>
           <w:b/>
           <w:bCs/>
         </w:rPr>
-        <w:t>Follow Up Analysis Completed on 7/24/2026</w:t>
-      </w:r>
-    </w:p>
-    <w:p>
-      <w:r>
-        <w:t>Remember format for SQL:</w:t>
+        <w:t>Follow Up Analysis Completed</w:t>
+      </w:r>
+      <w:r>
+        <w:rPr>
+          <w:b/>
+          <w:bCs/>
+        </w:rPr>
+        <w:t xml:space="preserve"> (4 Biz </w:t>
+      </w:r>
+      <w:proofErr w:type="spellStart"/>
+      <w:r>
+        <w:rPr>
+          <w:b/>
+          <w:bCs/>
+        </w:rPr>
+        <w:t>Ques</w:t>
+      </w:r>
+      <w:proofErr w:type="spellEnd"/>
+      <w:r>
+        <w:rPr>
+          <w:b/>
+          <w:bCs/>
+        </w:rPr>
+        <w:t>)</w:t>
+      </w:r>
+      <w:r>
+        <w:rPr>
+          <w:b/>
+          <w:bCs/>
+        </w:rPr>
+        <w:t xml:space="preserve"> on 7/24/2026</w:t>
+      </w:r>
+    </w:p>
+    <w:p>
+      <w:r>
+        <w:t xml:space="preserve">Remember </w:t>
+      </w:r>
+      <w:r>
+        <w:t xml:space="preserve">following </w:t>
+      </w:r>
+      <w:r>
+        <w:t>format for SQL:</w:t>
       </w:r>
     </w:p>
     <w:p>
@@ -177,7 +210,15 @@
     </w:p>
     <w:p>
       <w:r>
-        <w:t xml:space="preserve">To see if specific age demographics experience longer wait times than others. </w:t>
+        <w:t xml:space="preserve">To see if specific age demographics experience longer </w:t>
+      </w:r>
+      <w:proofErr w:type="gramStart"/>
+      <w:r>
+        <w:t>wait</w:t>
+      </w:r>
+      <w:proofErr w:type="gramEnd"/>
+      <w:r>
+        <w:t xml:space="preserve"> times than others. </w:t>
       </w:r>
     </w:p>
     <w:p/>
@@ -194,12 +235,28 @@
     </w:p>
     <w:p>
       <w:r>
-        <w:t xml:space="preserve">The age groups that expereince the longest ER wait times or 180 minutes are, 53, 61, 74, and 76. </w:t>
-      </w:r>
-    </w:p>
-    <w:p>
-      <w:r>
-        <w:t xml:space="preserve">However, the wait time that has the most occurance is 179 mintues, being experienced by 8 age groups. This is double that of age groups experiencing 180 minute wait times. </w:t>
+        <w:t xml:space="preserve">The age groups that expereince the longest ER wait times or 180 minutes </w:t>
+      </w:r>
+      <w:proofErr w:type="gramStart"/>
+      <w:r>
+        <w:t>are,</w:t>
+      </w:r>
+      <w:proofErr w:type="gramEnd"/>
+      <w:r>
+        <w:t xml:space="preserve"> 53, 61, 74, and 76. </w:t>
+      </w:r>
+    </w:p>
+    <w:p>
+      <w:r>
+        <w:t xml:space="preserve">However, the wait time that has the most occurance is 179 mintues, being experienced by 8 age groups. This is double that of age groups experiencing </w:t>
+      </w:r>
+      <w:proofErr w:type="gramStart"/>
+      <w:r>
+        <w:t>180 minute</w:t>
+      </w:r>
+      <w:proofErr w:type="gramEnd"/>
+      <w:r>
+        <w:t xml:space="preserve"> wait times. </w:t>
       </w:r>
     </w:p>
     <w:p/>
@@ -210,12 +267,28 @@
     </w:p>
     <w:p>
       <w:r>
-        <w:t>The patient age group experiencing the longest Emergency Department wait times of 180 minutes are, 53, 61, 74, and 76. People who wait 179 minutes occur 50% more than those waiting 180 minutes.</w:t>
-      </w:r>
-    </w:p>
-    <w:p>
-      <w:r>
-        <w:t xml:space="preserve">Everyone waiting 180 minutes was over 50 years old. While those waiting 179 minutes have 71% patients over the age of 40, and 29% under 31 years old. </w:t>
+        <w:t xml:space="preserve">The patient age group experiencing the longest Emergency Department wait times of 180 minutes </w:t>
+      </w:r>
+      <w:proofErr w:type="gramStart"/>
+      <w:r>
+        <w:t>are,</w:t>
+      </w:r>
+      <w:proofErr w:type="gramEnd"/>
+      <w:r>
+        <w:t xml:space="preserve"> 53, 61, 74, and 76. People who wait 179 minutes occur 50% more than those waiting 180 minutes.</w:t>
+      </w:r>
+    </w:p>
+    <w:p>
+      <w:r>
+        <w:t xml:space="preserve">Everyone waiting 180 minutes was over 50 years old. While those waiting 179 minutes </w:t>
+      </w:r>
+      <w:proofErr w:type="gramStart"/>
+      <w:r>
+        <w:t>have 71%</w:t>
+      </w:r>
+      <w:proofErr w:type="gramEnd"/>
+      <w:r>
+        <w:t xml:space="preserve"> patients over the age of 40, and 29% under 31 years old. </w:t>
       </w:r>
     </w:p>
     <w:p/>
@@ -263,19 +336,43 @@
       </w:r>
       <w:r>
         <w:tab/>
-        <w:t>inner join patients pts</w:t>
-      </w:r>
-    </w:p>
-    <w:p>
-      <w:r>
-        <w:tab/>
-      </w:r>
-      <w:r>
-        <w:tab/>
-      </w:r>
-      <w:r>
-        <w:tab/>
-        <w:t>on er.patient_id=pts.patient_id</w:t>
+        <w:t xml:space="preserve">inner join </w:t>
+      </w:r>
+      <w:proofErr w:type="gramStart"/>
+      <w:r>
+        <w:t>patients</w:t>
+      </w:r>
+      <w:proofErr w:type="gramEnd"/>
+      <w:r>
+        <w:t xml:space="preserve"> pts</w:t>
+      </w:r>
+    </w:p>
+    <w:p>
+      <w:r>
+        <w:tab/>
+      </w:r>
+      <w:r>
+        <w:tab/>
+      </w:r>
+      <w:r>
+        <w:tab/>
+        <w:t xml:space="preserve">on </w:t>
+      </w:r>
+      <w:proofErr w:type="gramStart"/>
+      <w:r>
+        <w:t>er.patient</w:t>
+      </w:r>
+      <w:proofErr w:type="gramEnd"/>
+      <w:r>
+        <w:t>_id=</w:t>
+      </w:r>
+      <w:proofErr w:type="gramStart"/>
+      <w:r>
+        <w:t>pts.patient</w:t>
+      </w:r>
+      <w:proofErr w:type="gramEnd"/>
+      <w:r>
+        <w:t>_id</w:t>
       </w:r>
     </w:p>
     <w:p>
@@ -406,25 +503,49 @@
       </w:r>
       <w:r>
         <w:tab/>
-        <w:t>inner join patients pts</w:t>
-      </w:r>
-    </w:p>
-    <w:p>
-      <w:r>
-        <w:tab/>
-      </w:r>
-      <w:r>
-        <w:tab/>
-      </w:r>
-      <w:r>
-        <w:tab/>
-      </w:r>
-      <w:r>
-        <w:tab/>
-      </w:r>
-      <w:r>
-        <w:tab/>
-        <w:t>on er.patient_id=pts.patient_id</w:t>
+        <w:t xml:space="preserve">inner join </w:t>
+      </w:r>
+      <w:proofErr w:type="gramStart"/>
+      <w:r>
+        <w:t>patients</w:t>
+      </w:r>
+      <w:proofErr w:type="gramEnd"/>
+      <w:r>
+        <w:t xml:space="preserve"> pts</w:t>
+      </w:r>
+    </w:p>
+    <w:p>
+      <w:r>
+        <w:tab/>
+      </w:r>
+      <w:r>
+        <w:tab/>
+      </w:r>
+      <w:r>
+        <w:tab/>
+      </w:r>
+      <w:r>
+        <w:tab/>
+      </w:r>
+      <w:r>
+        <w:tab/>
+        <w:t xml:space="preserve">on </w:t>
+      </w:r>
+      <w:proofErr w:type="gramStart"/>
+      <w:r>
+        <w:t>er.patient</w:t>
+      </w:r>
+      <w:proofErr w:type="gramEnd"/>
+      <w:r>
+        <w:t>_id=</w:t>
+      </w:r>
+      <w:proofErr w:type="gramStart"/>
+      <w:r>
+        <w:t>pts.patient</w:t>
+      </w:r>
+      <w:proofErr w:type="gramEnd"/>
+      <w:r>
+        <w:t>_id</w:t>
       </w:r>
     </w:p>
     <w:p>
@@ -506,12 +627,28 @@
     <w:p/>
     <w:p>
       <w:r>
-        <w:t>--What are the age groups experiencing wait times of 179 minutes? 89, 70, 52, 48, 42, 30, 24 (71% are over 40)</w:t>
-      </w:r>
-    </w:p>
-    <w:p>
-      <w:r>
-        <w:t>--What are the age groups experiencing wait times of 180 minutes? 76, 74, 61, 53 (All over 53)</w:t>
+        <w:t xml:space="preserve">--What are the age groups experiencing </w:t>
+      </w:r>
+      <w:proofErr w:type="gramStart"/>
+      <w:r>
+        <w:t>wait</w:t>
+      </w:r>
+      <w:proofErr w:type="gramEnd"/>
+      <w:r>
+        <w:t xml:space="preserve"> times of 179 minutes? 89, 70, 52, 48, 42, 30, 24 (71% are over 40)</w:t>
+      </w:r>
+    </w:p>
+    <w:p>
+      <w:r>
+        <w:t xml:space="preserve">--What are the age groups experiencing wait </w:t>
+      </w:r>
+      <w:proofErr w:type="gramStart"/>
+      <w:r>
+        <w:t>times of 180</w:t>
+      </w:r>
+      <w:proofErr w:type="gramEnd"/>
+      <w:r>
+        <w:t xml:space="preserve"> minutes? 76, 74, 61, 53 (All over 53)</w:t>
       </w:r>
     </w:p>
     <w:p>
@@ -548,25 +685,51 @@
       </w:r>
       <w:r>
         <w:tab/>
-        <w:t>inner join patients pts</w:t>
-      </w:r>
-    </w:p>
-    <w:p>
-      <w:r>
-        <w:tab/>
-      </w:r>
-      <w:r>
-        <w:tab/>
-      </w:r>
-      <w:r>
-        <w:tab/>
-        <w:t>on er.patient_id=pts.patient_id</w:t>
-      </w:r>
-    </w:p>
-    <w:p>
+        <w:t xml:space="preserve">inner join </w:t>
+      </w:r>
+      <w:proofErr w:type="gramStart"/>
+      <w:r>
+        <w:t>patients</w:t>
+      </w:r>
+      <w:proofErr w:type="gramEnd"/>
+      <w:r>
+        <w:t xml:space="preserve"> pts</w:t>
+      </w:r>
+    </w:p>
+    <w:p>
+      <w:r>
+        <w:tab/>
+      </w:r>
+      <w:r>
+        <w:tab/>
+      </w:r>
+      <w:r>
+        <w:tab/>
+        <w:t xml:space="preserve">on </w:t>
+      </w:r>
+      <w:proofErr w:type="gramStart"/>
+      <w:r>
+        <w:t>er.patient</w:t>
+      </w:r>
+      <w:proofErr w:type="gramEnd"/>
+      <w:r>
+        <w:t>_id=</w:t>
+      </w:r>
+      <w:proofErr w:type="gramStart"/>
+      <w:r>
+        <w:t>pts.patient</w:t>
+      </w:r>
+      <w:proofErr w:type="gramEnd"/>
+      <w:r>
+        <w:t>_id</w:t>
+      </w:r>
+    </w:p>
+    <w:p>
+      <w:proofErr w:type="gramStart"/>
       <w:r>
         <w:t>Where</w:t>
       </w:r>
+      <w:proofErr w:type="gramEnd"/>
     </w:p>
     <w:p>
       <w:r>
@@ -879,14 +1042,24 @@
         <w:t xml:space="preserve">      </w:t>
       </w:r>
       <w:proofErr w:type="spellStart"/>
+      <w:proofErr w:type="gramStart"/>
       <w:r>
         <w:t>pts.city</w:t>
       </w:r>
       <w:proofErr w:type="spellEnd"/>
-    </w:p>
-    <w:p>
-      <w:r>
-        <w:t xml:space="preserve">    , count(*) as </w:t>
+      <w:proofErr w:type="gramEnd"/>
+    </w:p>
+    <w:p>
+      <w:r>
+        <w:t xml:space="preserve">    , </w:t>
+      </w:r>
+      <w:proofErr w:type="gramStart"/>
+      <w:r>
+        <w:t>count(</w:t>
+      </w:r>
+      <w:proofErr w:type="gramEnd"/>
+      <w:r>
+        <w:t xml:space="preserve">*) as </w:t>
       </w:r>
       <w:proofErr w:type="spellStart"/>
       <w:r>
@@ -917,7 +1090,15 @@
     </w:p>
     <w:p>
       <w:r>
-        <w:t>        inner join patients pts</w:t>
+        <w:t xml:space="preserve">        inner join </w:t>
+      </w:r>
+      <w:proofErr w:type="gramStart"/>
+      <w:r>
+        <w:t>patients</w:t>
+      </w:r>
+      <w:proofErr w:type="gramEnd"/>
+      <w:r>
+        <w:t xml:space="preserve"> pts</w:t>
       </w:r>
     </w:p>
     <w:p>
@@ -925,16 +1106,26 @@
         <w:t xml:space="preserve">            on </w:t>
       </w:r>
       <w:proofErr w:type="spellStart"/>
-      <w:r>
-        <w:t>er.patient_id</w:t>
+      <w:proofErr w:type="gramStart"/>
+      <w:r>
+        <w:t>er.patient</w:t>
+      </w:r>
+      <w:proofErr w:type="gramEnd"/>
+      <w:r>
+        <w:t>_id</w:t>
       </w:r>
       <w:proofErr w:type="spellEnd"/>
       <w:r>
         <w:t>=</w:t>
       </w:r>
       <w:proofErr w:type="spellStart"/>
-      <w:r>
-        <w:t>pts.patient_id</w:t>
+      <w:proofErr w:type="gramStart"/>
+      <w:r>
+        <w:t>pts.patient</w:t>
+      </w:r>
+      <w:proofErr w:type="gramEnd"/>
+      <w:r>
+        <w:t>_id</w:t>
       </w:r>
       <w:proofErr w:type="spellEnd"/>
     </w:p>
@@ -948,10 +1139,12 @@
         <w:t xml:space="preserve">    </w:t>
       </w:r>
       <w:proofErr w:type="spellStart"/>
+      <w:proofErr w:type="gramStart"/>
       <w:r>
         <w:t>pts.city</w:t>
       </w:r>
       <w:proofErr w:type="spellEnd"/>
+      <w:proofErr w:type="gramEnd"/>
     </w:p>
     <w:p>
       <w:r>
@@ -1297,6 +1490,7 @@
           <w14:ligatures w14:val="none"/>
         </w:rPr>
       </w:pPr>
+      <w:proofErr w:type="gramStart"/>
       <w:r>
         <w:rPr>
           <w:rFonts w:ascii="Consolas" w:eastAsia="Times New Roman" w:hAnsi="Consolas" w:cs="Times New Roman"/>
@@ -1308,9 +1502,9 @@
           <w:szCs w:val="21"/>
           <w14:ligatures w14:val="none"/>
         </w:rPr>
-        <w:t xml:space="preserve">To see if providers' years of experience has an </w:t>
-      </w:r>
-      <w:proofErr w:type="spellStart"/>
+        <w:t>To see</w:t>
+      </w:r>
+      <w:proofErr w:type="gramEnd"/>
       <w:r>
         <w:rPr>
           <w:rFonts w:ascii="Consolas" w:eastAsia="Times New Roman" w:hAnsi="Consolas" w:cs="Times New Roman"/>
@@ -1322,9 +1516,10 @@
           <w:szCs w:val="21"/>
           <w14:ligatures w14:val="none"/>
         </w:rPr>
-        <w:t>affect</w:t>
-      </w:r>
-      <w:proofErr w:type="spellEnd"/>
+        <w:t xml:space="preserve"> if providers' years of experience has an </w:t>
+      </w:r>
+      <w:proofErr w:type="spellStart"/>
+      <w:proofErr w:type="gramStart"/>
       <w:r>
         <w:rPr>
           <w:rFonts w:ascii="Consolas" w:eastAsia="Times New Roman" w:hAnsi="Consolas" w:cs="Times New Roman"/>
@@ -1336,46 +1531,10 @@
           <w:szCs w:val="21"/>
           <w14:ligatures w14:val="none"/>
         </w:rPr>
-        <w:t xml:space="preserve"> on overall patient satisfaction scores. </w:t>
-      </w:r>
-    </w:p>
-    <w:p>
-      <w:pPr>
-        <w:pStyle w:val="ListParagraph"/>
-        <w:numPr>
-          <w:ilvl w:val="0"/>
-          <w:numId w:val="16"/>
-        </w:numPr>
-        <w:shd w:val="clear" w:color="auto" w:fill="1C1E26"/>
-        <w:spacing w:after="0" w:line="285" w:lineRule="atLeast"/>
-        <w:rPr>
-          <w:rFonts w:ascii="Consolas" w:eastAsia="Times New Roman" w:hAnsi="Consolas" w:cs="Times New Roman"/>
-          <w:color w:val="BBBBBB"/>
-          <w:kern w:val="0"/>
-          <w:sz w:val="21"/>
-          <w:szCs w:val="21"/>
-          <w14:ligatures w14:val="none"/>
-        </w:rPr>
-      </w:pPr>
-    </w:p>
-    <w:p>
-      <w:pPr>
-        <w:pStyle w:val="ListParagraph"/>
-        <w:numPr>
-          <w:ilvl w:val="0"/>
-          <w:numId w:val="16"/>
-        </w:numPr>
-        <w:shd w:val="clear" w:color="auto" w:fill="1C1E26"/>
-        <w:spacing w:after="0" w:line="285" w:lineRule="atLeast"/>
-        <w:rPr>
-          <w:rFonts w:ascii="Consolas" w:eastAsia="Times New Roman" w:hAnsi="Consolas" w:cs="Times New Roman"/>
-          <w:color w:val="BBBBBB"/>
-          <w:kern w:val="0"/>
-          <w:sz w:val="21"/>
-          <w:szCs w:val="21"/>
-          <w14:ligatures w14:val="none"/>
-        </w:rPr>
-      </w:pPr>
+        <w:t>affect</w:t>
+      </w:r>
+      <w:proofErr w:type="spellEnd"/>
+      <w:proofErr w:type="gramEnd"/>
       <w:r>
         <w:rPr>
           <w:rFonts w:ascii="Consolas" w:eastAsia="Times New Roman" w:hAnsi="Consolas" w:cs="Times New Roman"/>
@@ -1387,7 +1546,7 @@
           <w:szCs w:val="21"/>
           <w14:ligatures w14:val="none"/>
         </w:rPr>
-        <w:t>SQL Query: (see below)</w:t>
+        <w:t xml:space="preserve"> on overall patient satisfaction scores. </w:t>
       </w:r>
     </w:p>
     <w:p>
@@ -1438,8 +1597,27 @@
           <w:szCs w:val="21"/>
           <w14:ligatures w14:val="none"/>
         </w:rPr>
-        <w:t>Findings:</w:t>
-      </w:r>
+        <w:t>SQL Query: (see below)</w:t>
+      </w:r>
+    </w:p>
+    <w:p>
+      <w:pPr>
+        <w:pStyle w:val="ListParagraph"/>
+        <w:numPr>
+          <w:ilvl w:val="0"/>
+          <w:numId w:val="16"/>
+        </w:numPr>
+        <w:shd w:val="clear" w:color="auto" w:fill="1C1E26"/>
+        <w:spacing w:after="0" w:line="285" w:lineRule="atLeast"/>
+        <w:rPr>
+          <w:rFonts w:ascii="Consolas" w:eastAsia="Times New Roman" w:hAnsi="Consolas" w:cs="Times New Roman"/>
+          <w:color w:val="BBBBBB"/>
+          <w:kern w:val="0"/>
+          <w:sz w:val="21"/>
+          <w:szCs w:val="21"/>
+          <w14:ligatures w14:val="none"/>
+        </w:rPr>
+      </w:pPr>
     </w:p>
     <w:p>
       <w:pPr>
@@ -1470,7 +1648,7 @@
           <w:szCs w:val="21"/>
           <w14:ligatures w14:val="none"/>
         </w:rPr>
-        <w:t>Across the 15 categories of years of experience groups represented in the dataset, average patient satisfaction scores ranged from 4.14 to 4.22.</w:t>
+        <w:t>Findings:</w:t>
       </w:r>
     </w:p>
     <w:p>
@@ -1502,46 +1680,9 @@
           <w:szCs w:val="21"/>
           <w14:ligatures w14:val="none"/>
         </w:rPr>
-        <w:t>All experience levels were associated with at least one maximum satisfaction score of 5.0, while minimum satisfaction scores ranged from 2.0 to 2.8.</w:t>
-      </w:r>
-    </w:p>
-    <w:p>
-      <w:pPr>
-        <w:pStyle w:val="ListParagraph"/>
-        <w:numPr>
-          <w:ilvl w:val="0"/>
-          <w:numId w:val="16"/>
-        </w:numPr>
-        <w:shd w:val="clear" w:color="auto" w:fill="1C1E26"/>
-        <w:spacing w:after="0" w:line="285" w:lineRule="atLeast"/>
-        <w:rPr>
-          <w:rFonts w:ascii="Consolas" w:eastAsia="Times New Roman" w:hAnsi="Consolas" w:cs="Times New Roman"/>
-          <w:color w:val="BBBBBB"/>
-          <w:kern w:val="0"/>
-          <w:sz w:val="21"/>
-          <w:szCs w:val="21"/>
-          <w14:ligatures w14:val="none"/>
-        </w:rPr>
-      </w:pPr>
-    </w:p>
-    <w:p>
-      <w:pPr>
-        <w:pStyle w:val="ListParagraph"/>
-        <w:numPr>
-          <w:ilvl w:val="0"/>
-          <w:numId w:val="16"/>
-        </w:numPr>
-        <w:shd w:val="clear" w:color="auto" w:fill="1C1E26"/>
-        <w:spacing w:after="0" w:line="285" w:lineRule="atLeast"/>
-        <w:rPr>
-          <w:rFonts w:ascii="Consolas" w:eastAsia="Times New Roman" w:hAnsi="Consolas" w:cs="Times New Roman"/>
-          <w:color w:val="BBBBBB"/>
-          <w:kern w:val="0"/>
-          <w:sz w:val="21"/>
-          <w:szCs w:val="21"/>
-          <w14:ligatures w14:val="none"/>
-        </w:rPr>
-      </w:pPr>
+        <w:t xml:space="preserve">Across the 15 categories of years of experience groups represented in the dataset, average patient </w:t>
+      </w:r>
+      <w:proofErr w:type="gramStart"/>
       <w:r>
         <w:rPr>
           <w:rFonts w:ascii="Consolas" w:eastAsia="Times New Roman" w:hAnsi="Consolas" w:cs="Times New Roman"/>
@@ -1553,27 +1694,9 @@
           <w:szCs w:val="21"/>
           <w14:ligatures w14:val="none"/>
         </w:rPr>
-        <w:t>Business Insight:</w:t>
-      </w:r>
-    </w:p>
-    <w:p>
-      <w:pPr>
-        <w:pStyle w:val="ListParagraph"/>
-        <w:numPr>
-          <w:ilvl w:val="0"/>
-          <w:numId w:val="16"/>
-        </w:numPr>
-        <w:shd w:val="clear" w:color="auto" w:fill="1C1E26"/>
-        <w:spacing w:after="0" w:line="285" w:lineRule="atLeast"/>
-        <w:rPr>
-          <w:rFonts w:ascii="Consolas" w:eastAsia="Times New Roman" w:hAnsi="Consolas" w:cs="Times New Roman"/>
-          <w:color w:val="BBBBBB"/>
-          <w:kern w:val="0"/>
-          <w:sz w:val="21"/>
-          <w:szCs w:val="21"/>
-          <w14:ligatures w14:val="none"/>
-        </w:rPr>
-      </w:pPr>
+        <w:t>satisfaction scores</w:t>
+      </w:r>
+      <w:proofErr w:type="gramEnd"/>
       <w:r>
         <w:rPr>
           <w:rFonts w:ascii="Consolas" w:eastAsia="Times New Roman" w:hAnsi="Consolas" w:cs="Times New Roman"/>
@@ -1585,7 +1708,7 @@
           <w:szCs w:val="21"/>
           <w14:ligatures w14:val="none"/>
         </w:rPr>
-        <w:t>Patient satisfaction remained consistently high across all years of provider experience.</w:t>
+        <w:t xml:space="preserve"> ranged from 4.14 to 4.22.</w:t>
       </w:r>
     </w:p>
     <w:p>
@@ -1617,7 +1740,7 @@
           <w:szCs w:val="21"/>
           <w14:ligatures w14:val="none"/>
         </w:rPr>
-        <w:t>Since average satisfaction scores varied by only .08 points, there is little evidence that provider experience alone has a meaningful influence on patient satisfaction.  </w:t>
+        <w:t>All experience levels were associated with at least one maximum satisfaction score of 5.0, while minimum satisfaction scores ranged from 2.0 to 2.8.</w:t>
       </w:r>
     </w:p>
     <w:p>
@@ -1657,7 +1780,6 @@
           <w14:ligatures w14:val="none"/>
         </w:rPr>
       </w:pPr>
-      <w:proofErr w:type="spellStart"/>
       <w:r>
         <w:rPr>
           <w:rFonts w:ascii="Consolas" w:eastAsia="Times New Roman" w:hAnsi="Consolas" w:cs="Times New Roman"/>
@@ -1669,9 +1791,27 @@
           <w:szCs w:val="21"/>
           <w14:ligatures w14:val="none"/>
         </w:rPr>
-        <w:t>Recomendation</w:t>
-      </w:r>
-      <w:proofErr w:type="spellEnd"/>
+        <w:t>Business Insight:</w:t>
+      </w:r>
+    </w:p>
+    <w:p>
+      <w:pPr>
+        <w:pStyle w:val="ListParagraph"/>
+        <w:numPr>
+          <w:ilvl w:val="0"/>
+          <w:numId w:val="16"/>
+        </w:numPr>
+        <w:shd w:val="clear" w:color="auto" w:fill="1C1E26"/>
+        <w:spacing w:after="0" w:line="285" w:lineRule="atLeast"/>
+        <w:rPr>
+          <w:rFonts w:ascii="Consolas" w:eastAsia="Times New Roman" w:hAnsi="Consolas" w:cs="Times New Roman"/>
+          <w:color w:val="BBBBBB"/>
+          <w:kern w:val="0"/>
+          <w:sz w:val="21"/>
+          <w:szCs w:val="21"/>
+          <w14:ligatures w14:val="none"/>
+        </w:rPr>
+      </w:pPr>
       <w:r>
         <w:rPr>
           <w:rFonts w:ascii="Consolas" w:eastAsia="Times New Roman" w:hAnsi="Consolas" w:cs="Times New Roman"/>
@@ -1683,27 +1823,9 @@
           <w:szCs w:val="21"/>
           <w14:ligatures w14:val="none"/>
         </w:rPr>
-        <w:t>:</w:t>
-      </w:r>
-    </w:p>
-    <w:p>
-      <w:pPr>
-        <w:pStyle w:val="ListParagraph"/>
-        <w:numPr>
-          <w:ilvl w:val="0"/>
-          <w:numId w:val="16"/>
-        </w:numPr>
-        <w:shd w:val="clear" w:color="auto" w:fill="1C1E26"/>
-        <w:spacing w:after="0" w:line="285" w:lineRule="atLeast"/>
-        <w:rPr>
-          <w:rFonts w:ascii="Consolas" w:eastAsia="Times New Roman" w:hAnsi="Consolas" w:cs="Times New Roman"/>
-          <w:color w:val="BBBBBB"/>
-          <w:kern w:val="0"/>
-          <w:sz w:val="21"/>
-          <w:szCs w:val="21"/>
-          <w14:ligatures w14:val="none"/>
-        </w:rPr>
-      </w:pPr>
+        <w:t xml:space="preserve">Patient satisfaction remained consistently high </w:t>
+      </w:r>
+      <w:proofErr w:type="gramStart"/>
       <w:r>
         <w:rPr>
           <w:rFonts w:ascii="Consolas" w:eastAsia="Times New Roman" w:hAnsi="Consolas" w:cs="Times New Roman"/>
@@ -1715,9 +1837,9 @@
           <w:szCs w:val="21"/>
           <w14:ligatures w14:val="none"/>
         </w:rPr>
-        <w:t xml:space="preserve">Provider </w:t>
-      </w:r>
-      <w:proofErr w:type="spellStart"/>
+        <w:t>across</w:t>
+      </w:r>
+      <w:proofErr w:type="gramEnd"/>
       <w:r>
         <w:rPr>
           <w:rFonts w:ascii="Consolas" w:eastAsia="Times New Roman" w:hAnsi="Consolas" w:cs="Times New Roman"/>
@@ -1729,9 +1851,27 @@
           <w:szCs w:val="21"/>
           <w14:ligatures w14:val="none"/>
         </w:rPr>
-        <w:t>expereince</w:t>
-      </w:r>
-      <w:proofErr w:type="spellEnd"/>
+        <w:t xml:space="preserve"> all years of provider experience.</w:t>
+      </w:r>
+    </w:p>
+    <w:p>
+      <w:pPr>
+        <w:pStyle w:val="ListParagraph"/>
+        <w:numPr>
+          <w:ilvl w:val="0"/>
+          <w:numId w:val="16"/>
+        </w:numPr>
+        <w:shd w:val="clear" w:color="auto" w:fill="1C1E26"/>
+        <w:spacing w:after="0" w:line="285" w:lineRule="atLeast"/>
+        <w:rPr>
+          <w:rFonts w:ascii="Consolas" w:eastAsia="Times New Roman" w:hAnsi="Consolas" w:cs="Times New Roman"/>
+          <w:color w:val="BBBBBB"/>
+          <w:kern w:val="0"/>
+          <w:sz w:val="21"/>
+          <w:szCs w:val="21"/>
+          <w14:ligatures w14:val="none"/>
+        </w:rPr>
+      </w:pPr>
       <w:r>
         <w:rPr>
           <w:rFonts w:ascii="Consolas" w:eastAsia="Times New Roman" w:hAnsi="Consolas" w:cs="Times New Roman"/>
@@ -1743,7 +1883,7 @@
           <w:szCs w:val="21"/>
           <w14:ligatures w14:val="none"/>
         </w:rPr>
-        <w:t xml:space="preserve"> does not appear to be a primary driver of patient satisfaction. </w:t>
+        <w:t>Since average satisfaction scores varied by only .08 points, there is little evidence that provider experience alone has a meaningful influence on patient satisfaction.  </w:t>
       </w:r>
     </w:p>
     <w:p>
@@ -1764,6 +1904,26 @@
           <w14:ligatures w14:val="none"/>
         </w:rPr>
       </w:pPr>
+    </w:p>
+    <w:p>
+      <w:pPr>
+        <w:pStyle w:val="ListParagraph"/>
+        <w:numPr>
+          <w:ilvl w:val="0"/>
+          <w:numId w:val="16"/>
+        </w:numPr>
+        <w:shd w:val="clear" w:color="auto" w:fill="1C1E26"/>
+        <w:spacing w:after="0" w:line="285" w:lineRule="atLeast"/>
+        <w:rPr>
+          <w:rFonts w:ascii="Consolas" w:eastAsia="Times New Roman" w:hAnsi="Consolas" w:cs="Times New Roman"/>
+          <w:color w:val="BBBBBB"/>
+          <w:kern w:val="0"/>
+          <w:sz w:val="21"/>
+          <w:szCs w:val="21"/>
+          <w14:ligatures w14:val="none"/>
+        </w:rPr>
+      </w:pPr>
+      <w:proofErr w:type="spellStart"/>
       <w:r>
         <w:rPr>
           <w:rFonts w:ascii="Consolas" w:eastAsia="Times New Roman" w:hAnsi="Consolas" w:cs="Times New Roman"/>
@@ -1775,27 +1935,9 @@
           <w:szCs w:val="21"/>
           <w14:ligatures w14:val="none"/>
         </w:rPr>
-        <w:t>Future analyses should investigate other factors such as appointment type, department, continuity of care, provider workload, patient characteristics, or other operational factors to better understand what influences satisfaction scores.  </w:t>
-      </w:r>
-    </w:p>
-    <w:p>
-      <w:pPr>
-        <w:pStyle w:val="ListParagraph"/>
-        <w:numPr>
-          <w:ilvl w:val="0"/>
-          <w:numId w:val="16"/>
-        </w:numPr>
-        <w:shd w:val="clear" w:color="auto" w:fill="1C1E26"/>
-        <w:spacing w:after="0" w:line="285" w:lineRule="atLeast"/>
-        <w:rPr>
-          <w:rFonts w:ascii="Consolas" w:eastAsia="Times New Roman" w:hAnsi="Consolas" w:cs="Times New Roman"/>
-          <w:color w:val="BBBBBB"/>
-          <w:kern w:val="0"/>
-          <w:sz w:val="21"/>
-          <w:szCs w:val="21"/>
-          <w14:ligatures w14:val="none"/>
-        </w:rPr>
-      </w:pPr>
+        <w:t>Recomendation</w:t>
+      </w:r>
+      <w:proofErr w:type="spellEnd"/>
       <w:r>
         <w:rPr>
           <w:rFonts w:ascii="Consolas" w:eastAsia="Times New Roman" w:hAnsi="Consolas" w:cs="Times New Roman"/>
@@ -1807,7 +1949,7 @@
           <w:szCs w:val="21"/>
           <w14:ligatures w14:val="none"/>
         </w:rPr>
-        <w:t>*/</w:t>
+        <w:t>:</w:t>
       </w:r>
     </w:p>
     <w:p>
@@ -1828,941 +1970,6 @@
           <w14:ligatures w14:val="none"/>
         </w:rPr>
       </w:pPr>
-    </w:p>
-    <w:p>
-      <w:pPr>
-        <w:pStyle w:val="ListParagraph"/>
-        <w:numPr>
-          <w:ilvl w:val="0"/>
-          <w:numId w:val="16"/>
-        </w:numPr>
-        <w:shd w:val="clear" w:color="auto" w:fill="1C1E26"/>
-        <w:spacing w:after="0" w:line="285" w:lineRule="atLeast"/>
-        <w:rPr>
-          <w:rFonts w:ascii="Consolas" w:eastAsia="Times New Roman" w:hAnsi="Consolas" w:cs="Times New Roman"/>
-          <w:color w:val="BBBBBB"/>
-          <w:kern w:val="0"/>
-          <w:sz w:val="21"/>
-          <w:szCs w:val="21"/>
-          <w14:ligatures w14:val="none"/>
-        </w:rPr>
-      </w:pPr>
-      <w:r>
-        <w:rPr>
-          <w:rFonts w:ascii="Consolas" w:eastAsia="Times New Roman" w:hAnsi="Consolas" w:cs="Times New Roman"/>
-          <w:color w:val="B877DB"/>
-          <w:kern w:val="0"/>
-          <w:sz w:val="21"/>
-          <w:szCs w:val="21"/>
-          <w14:ligatures w14:val="none"/>
-        </w:rPr>
-        <w:t>Select</w:t>
-      </w:r>
-    </w:p>
-    <w:p>
-      <w:pPr>
-        <w:pStyle w:val="ListParagraph"/>
-        <w:numPr>
-          <w:ilvl w:val="0"/>
-          <w:numId w:val="16"/>
-        </w:numPr>
-        <w:shd w:val="clear" w:color="auto" w:fill="1C1E26"/>
-        <w:spacing w:after="0" w:line="285" w:lineRule="atLeast"/>
-        <w:rPr>
-          <w:rFonts w:ascii="Consolas" w:eastAsia="Times New Roman" w:hAnsi="Consolas" w:cs="Times New Roman"/>
-          <w:color w:val="BBBBBB"/>
-          <w:kern w:val="0"/>
-          <w:sz w:val="21"/>
-          <w:szCs w:val="21"/>
-          <w14:ligatures w14:val="none"/>
-        </w:rPr>
-      </w:pPr>
-      <w:r>
-        <w:rPr>
-          <w:rFonts w:ascii="Consolas" w:eastAsia="Times New Roman" w:hAnsi="Consolas" w:cs="Times New Roman"/>
-          <w:color w:val="BBBBBB"/>
-          <w:kern w:val="0"/>
-          <w:sz w:val="21"/>
-          <w:szCs w:val="21"/>
-          <w14:ligatures w14:val="none"/>
-        </w:rPr>
-        <w:t xml:space="preserve">      </w:t>
-      </w:r>
-      <w:proofErr w:type="spellStart"/>
-      <w:r>
-        <w:rPr>
-          <w:rFonts w:ascii="Consolas" w:eastAsia="Times New Roman" w:hAnsi="Consolas" w:cs="Times New Roman"/>
-          <w:color w:val="F09483"/>
-          <w:kern w:val="0"/>
-          <w:sz w:val="21"/>
-          <w:szCs w:val="21"/>
-          <w14:ligatures w14:val="none"/>
-        </w:rPr>
-        <w:t>prov</w:t>
-      </w:r>
-      <w:r>
-        <w:rPr>
-          <w:rFonts w:ascii="Consolas" w:eastAsia="Times New Roman" w:hAnsi="Consolas" w:cs="Times New Roman"/>
-          <w:color w:val="BBBBBB"/>
-          <w:kern w:val="0"/>
-          <w:sz w:val="21"/>
-          <w:szCs w:val="21"/>
-          <w14:ligatures w14:val="none"/>
-        </w:rPr>
-        <w:t>.</w:t>
-      </w:r>
-      <w:r>
-        <w:rPr>
-          <w:rFonts w:ascii="Consolas" w:eastAsia="Times New Roman" w:hAnsi="Consolas" w:cs="Times New Roman"/>
-          <w:color w:val="F09483"/>
-          <w:kern w:val="0"/>
-          <w:sz w:val="21"/>
-          <w:szCs w:val="21"/>
-          <w14:ligatures w14:val="none"/>
-        </w:rPr>
-        <w:t>years_experience</w:t>
-      </w:r>
-      <w:proofErr w:type="spellEnd"/>
-    </w:p>
-    <w:p>
-      <w:pPr>
-        <w:pStyle w:val="ListParagraph"/>
-        <w:numPr>
-          <w:ilvl w:val="0"/>
-          <w:numId w:val="16"/>
-        </w:numPr>
-        <w:shd w:val="clear" w:color="auto" w:fill="1C1E26"/>
-        <w:spacing w:after="0" w:line="285" w:lineRule="atLeast"/>
-        <w:rPr>
-          <w:rFonts w:ascii="Consolas" w:eastAsia="Times New Roman" w:hAnsi="Consolas" w:cs="Times New Roman"/>
-          <w:color w:val="BBBBBB"/>
-          <w:kern w:val="0"/>
-          <w:sz w:val="21"/>
-          <w:szCs w:val="21"/>
-          <w14:ligatures w14:val="none"/>
-        </w:rPr>
-      </w:pPr>
-      <w:r>
-        <w:rPr>
-          <w:rFonts w:ascii="Consolas" w:eastAsia="Times New Roman" w:hAnsi="Consolas" w:cs="Times New Roman"/>
-          <w:color w:val="BBBBBB"/>
-          <w:kern w:val="0"/>
-          <w:sz w:val="21"/>
-          <w:szCs w:val="21"/>
-          <w14:ligatures w14:val="none"/>
-        </w:rPr>
-        <w:t xml:space="preserve">    , </w:t>
-      </w:r>
-      <w:r>
-        <w:rPr>
-          <w:rFonts w:ascii="Consolas" w:eastAsia="Times New Roman" w:hAnsi="Consolas" w:cs="Times New Roman"/>
-          <w:color w:val="25B0BC"/>
-          <w:kern w:val="0"/>
-          <w:sz w:val="21"/>
-          <w:szCs w:val="21"/>
-          <w14:ligatures w14:val="none"/>
-        </w:rPr>
-        <w:t>max</w:t>
-      </w:r>
-      <w:r>
-        <w:rPr>
-          <w:rFonts w:ascii="Consolas" w:eastAsia="Times New Roman" w:hAnsi="Consolas" w:cs="Times New Roman"/>
-          <w:color w:val="BBBBBB"/>
-          <w:kern w:val="0"/>
-          <w:sz w:val="21"/>
-          <w:szCs w:val="21"/>
-          <w14:ligatures w14:val="none"/>
-        </w:rPr>
-        <w:t>(</w:t>
-      </w:r>
-      <w:proofErr w:type="spellStart"/>
-      <w:r>
-        <w:rPr>
-          <w:rFonts w:ascii="Consolas" w:eastAsia="Times New Roman" w:hAnsi="Consolas" w:cs="Times New Roman"/>
-          <w:color w:val="BBBBBB"/>
-          <w:kern w:val="0"/>
-          <w:sz w:val="21"/>
-          <w:szCs w:val="21"/>
-          <w14:ligatures w14:val="none"/>
-        </w:rPr>
-        <w:t>patient_satisfaction_score</w:t>
-      </w:r>
-      <w:proofErr w:type="spellEnd"/>
-      <w:r>
-        <w:rPr>
-          <w:rFonts w:ascii="Consolas" w:eastAsia="Times New Roman" w:hAnsi="Consolas" w:cs="Times New Roman"/>
-          <w:color w:val="BBBBBB"/>
-          <w:kern w:val="0"/>
-          <w:sz w:val="21"/>
-          <w:szCs w:val="21"/>
-          <w14:ligatures w14:val="none"/>
-        </w:rPr>
-        <w:t>)</w:t>
-      </w:r>
-    </w:p>
-    <w:p>
-      <w:pPr>
-        <w:pStyle w:val="ListParagraph"/>
-        <w:numPr>
-          <w:ilvl w:val="0"/>
-          <w:numId w:val="16"/>
-        </w:numPr>
-        <w:shd w:val="clear" w:color="auto" w:fill="1C1E26"/>
-        <w:spacing w:after="0" w:line="285" w:lineRule="atLeast"/>
-        <w:rPr>
-          <w:rFonts w:ascii="Consolas" w:eastAsia="Times New Roman" w:hAnsi="Consolas" w:cs="Times New Roman"/>
-          <w:color w:val="BBBBBB"/>
-          <w:kern w:val="0"/>
-          <w:sz w:val="21"/>
-          <w:szCs w:val="21"/>
-          <w14:ligatures w14:val="none"/>
-        </w:rPr>
-      </w:pPr>
-      <w:r>
-        <w:rPr>
-          <w:rFonts w:ascii="Consolas" w:eastAsia="Times New Roman" w:hAnsi="Consolas" w:cs="Times New Roman"/>
-          <w:color w:val="BBBBBB"/>
-          <w:kern w:val="0"/>
-          <w:sz w:val="21"/>
-          <w:szCs w:val="21"/>
-          <w14:ligatures w14:val="none"/>
-        </w:rPr>
-        <w:t xml:space="preserve">    , </w:t>
-      </w:r>
-      <w:r>
-        <w:rPr>
-          <w:rFonts w:ascii="Consolas" w:eastAsia="Times New Roman" w:hAnsi="Consolas" w:cs="Times New Roman"/>
-          <w:color w:val="25B0BC"/>
-          <w:kern w:val="0"/>
-          <w:sz w:val="21"/>
-          <w:szCs w:val="21"/>
-          <w14:ligatures w14:val="none"/>
-        </w:rPr>
-        <w:t>min</w:t>
-      </w:r>
-      <w:r>
-        <w:rPr>
-          <w:rFonts w:ascii="Consolas" w:eastAsia="Times New Roman" w:hAnsi="Consolas" w:cs="Times New Roman"/>
-          <w:color w:val="BBBBBB"/>
-          <w:kern w:val="0"/>
-          <w:sz w:val="21"/>
-          <w:szCs w:val="21"/>
-          <w14:ligatures w14:val="none"/>
-        </w:rPr>
-        <w:t>(</w:t>
-      </w:r>
-      <w:proofErr w:type="spellStart"/>
-      <w:r>
-        <w:rPr>
-          <w:rFonts w:ascii="Consolas" w:eastAsia="Times New Roman" w:hAnsi="Consolas" w:cs="Times New Roman"/>
-          <w:color w:val="BBBBBB"/>
-          <w:kern w:val="0"/>
-          <w:sz w:val="21"/>
-          <w:szCs w:val="21"/>
-          <w14:ligatures w14:val="none"/>
-        </w:rPr>
-        <w:t>patient_satisfaction_score</w:t>
-      </w:r>
-      <w:proofErr w:type="spellEnd"/>
-      <w:r>
-        <w:rPr>
-          <w:rFonts w:ascii="Consolas" w:eastAsia="Times New Roman" w:hAnsi="Consolas" w:cs="Times New Roman"/>
-          <w:color w:val="BBBBBB"/>
-          <w:kern w:val="0"/>
-          <w:sz w:val="21"/>
-          <w:szCs w:val="21"/>
-          <w14:ligatures w14:val="none"/>
-        </w:rPr>
-        <w:t>)</w:t>
-      </w:r>
-    </w:p>
-    <w:p>
-      <w:pPr>
-        <w:pStyle w:val="ListParagraph"/>
-        <w:numPr>
-          <w:ilvl w:val="0"/>
-          <w:numId w:val="16"/>
-        </w:numPr>
-        <w:shd w:val="clear" w:color="auto" w:fill="1C1E26"/>
-        <w:spacing w:after="0" w:line="285" w:lineRule="atLeast"/>
-        <w:rPr>
-          <w:rFonts w:ascii="Consolas" w:eastAsia="Times New Roman" w:hAnsi="Consolas" w:cs="Times New Roman"/>
-          <w:color w:val="BBBBBB"/>
-          <w:kern w:val="0"/>
-          <w:sz w:val="21"/>
-          <w:szCs w:val="21"/>
-          <w14:ligatures w14:val="none"/>
-        </w:rPr>
-      </w:pPr>
-      <w:r>
-        <w:rPr>
-          <w:rFonts w:ascii="Consolas" w:eastAsia="Times New Roman" w:hAnsi="Consolas" w:cs="Times New Roman"/>
-          <w:color w:val="BBBBBB"/>
-          <w:kern w:val="0"/>
-          <w:sz w:val="21"/>
-          <w:szCs w:val="21"/>
-          <w14:ligatures w14:val="none"/>
-        </w:rPr>
-        <w:t xml:space="preserve">    , </w:t>
-      </w:r>
-      <w:r>
-        <w:rPr>
-          <w:rFonts w:ascii="Consolas" w:eastAsia="Times New Roman" w:hAnsi="Consolas" w:cs="Times New Roman"/>
-          <w:color w:val="25B0BC"/>
-          <w:kern w:val="0"/>
-          <w:sz w:val="21"/>
-          <w:szCs w:val="21"/>
-          <w14:ligatures w14:val="none"/>
-        </w:rPr>
-        <w:t>round</w:t>
-      </w:r>
-      <w:r>
-        <w:rPr>
-          <w:rFonts w:ascii="Consolas" w:eastAsia="Times New Roman" w:hAnsi="Consolas" w:cs="Times New Roman"/>
-          <w:color w:val="BBBBBB"/>
-          <w:kern w:val="0"/>
-          <w:sz w:val="21"/>
-          <w:szCs w:val="21"/>
-          <w14:ligatures w14:val="none"/>
-        </w:rPr>
-        <w:t>(</w:t>
-      </w:r>
-      <w:r>
-        <w:rPr>
-          <w:rFonts w:ascii="Consolas" w:eastAsia="Times New Roman" w:hAnsi="Consolas" w:cs="Times New Roman"/>
-          <w:color w:val="25B0BC"/>
-          <w:kern w:val="0"/>
-          <w:sz w:val="21"/>
-          <w:szCs w:val="21"/>
-          <w14:ligatures w14:val="none"/>
-        </w:rPr>
-        <w:t>avg</w:t>
-      </w:r>
-      <w:r>
-        <w:rPr>
-          <w:rFonts w:ascii="Consolas" w:eastAsia="Times New Roman" w:hAnsi="Consolas" w:cs="Times New Roman"/>
-          <w:color w:val="BBBBBB"/>
-          <w:kern w:val="0"/>
-          <w:sz w:val="21"/>
-          <w:szCs w:val="21"/>
-          <w14:ligatures w14:val="none"/>
-        </w:rPr>
-        <w:t>(</w:t>
-      </w:r>
-      <w:proofErr w:type="spellStart"/>
-      <w:r>
-        <w:rPr>
-          <w:rFonts w:ascii="Consolas" w:eastAsia="Times New Roman" w:hAnsi="Consolas" w:cs="Times New Roman"/>
-          <w:color w:val="BBBBBB"/>
-          <w:kern w:val="0"/>
-          <w:sz w:val="21"/>
-          <w:szCs w:val="21"/>
-          <w14:ligatures w14:val="none"/>
-        </w:rPr>
-        <w:t>patient_satisfaction_score</w:t>
-      </w:r>
-      <w:proofErr w:type="spellEnd"/>
-      <w:r>
-        <w:rPr>
-          <w:rFonts w:ascii="Consolas" w:eastAsia="Times New Roman" w:hAnsi="Consolas" w:cs="Times New Roman"/>
-          <w:color w:val="BBBBBB"/>
-          <w:kern w:val="0"/>
-          <w:sz w:val="21"/>
-          <w:szCs w:val="21"/>
-          <w14:ligatures w14:val="none"/>
-        </w:rPr>
-        <w:t>),</w:t>
-      </w:r>
-      <w:r>
-        <w:rPr>
-          <w:rFonts w:ascii="Consolas" w:eastAsia="Times New Roman" w:hAnsi="Consolas" w:cs="Times New Roman"/>
-          <w:color w:val="F09483"/>
-          <w:kern w:val="0"/>
-          <w:sz w:val="21"/>
-          <w:szCs w:val="21"/>
-          <w14:ligatures w14:val="none"/>
-        </w:rPr>
-        <w:t>2</w:t>
-      </w:r>
-      <w:r>
-        <w:rPr>
-          <w:rFonts w:ascii="Consolas" w:eastAsia="Times New Roman" w:hAnsi="Consolas" w:cs="Times New Roman"/>
-          <w:color w:val="BBBBBB"/>
-          <w:kern w:val="0"/>
-          <w:sz w:val="21"/>
-          <w:szCs w:val="21"/>
-          <w14:ligatures w14:val="none"/>
-        </w:rPr>
-        <w:t xml:space="preserve">) </w:t>
-      </w:r>
-      <w:r>
-        <w:rPr>
-          <w:rFonts w:ascii="Consolas" w:eastAsia="Times New Roman" w:hAnsi="Consolas" w:cs="Times New Roman"/>
-          <w:color w:val="B877DB"/>
-          <w:kern w:val="0"/>
-          <w:sz w:val="21"/>
-          <w:szCs w:val="21"/>
-          <w14:ligatures w14:val="none"/>
-        </w:rPr>
-        <w:t>as</w:t>
-      </w:r>
-      <w:r>
-        <w:rPr>
-          <w:rFonts w:ascii="Consolas" w:eastAsia="Times New Roman" w:hAnsi="Consolas" w:cs="Times New Roman"/>
-          <w:color w:val="BBBBBB"/>
-          <w:kern w:val="0"/>
-          <w:sz w:val="21"/>
-          <w:szCs w:val="21"/>
-          <w14:ligatures w14:val="none"/>
-        </w:rPr>
-        <w:t xml:space="preserve"> </w:t>
-      </w:r>
-      <w:proofErr w:type="spellStart"/>
-      <w:r>
-        <w:rPr>
-          <w:rFonts w:ascii="Consolas" w:eastAsia="Times New Roman" w:hAnsi="Consolas" w:cs="Times New Roman"/>
-          <w:color w:val="BBBBBB"/>
-          <w:kern w:val="0"/>
-          <w:sz w:val="21"/>
-          <w:szCs w:val="21"/>
-          <w14:ligatures w14:val="none"/>
-        </w:rPr>
-        <w:t>avg_satisf_score</w:t>
-      </w:r>
-      <w:proofErr w:type="spellEnd"/>
-    </w:p>
-    <w:p>
-      <w:pPr>
-        <w:pStyle w:val="ListParagraph"/>
-        <w:numPr>
-          <w:ilvl w:val="0"/>
-          <w:numId w:val="16"/>
-        </w:numPr>
-        <w:shd w:val="clear" w:color="auto" w:fill="1C1E26"/>
-        <w:spacing w:after="0" w:line="285" w:lineRule="atLeast"/>
-        <w:rPr>
-          <w:rFonts w:ascii="Consolas" w:eastAsia="Times New Roman" w:hAnsi="Consolas" w:cs="Times New Roman"/>
-          <w:color w:val="BBBBBB"/>
-          <w:kern w:val="0"/>
-          <w:sz w:val="21"/>
-          <w:szCs w:val="21"/>
-          <w14:ligatures w14:val="none"/>
-        </w:rPr>
-      </w:pPr>
-    </w:p>
-    <w:p>
-      <w:pPr>
-        <w:pStyle w:val="ListParagraph"/>
-        <w:numPr>
-          <w:ilvl w:val="0"/>
-          <w:numId w:val="16"/>
-        </w:numPr>
-        <w:shd w:val="clear" w:color="auto" w:fill="1C1E26"/>
-        <w:spacing w:after="0" w:line="285" w:lineRule="atLeast"/>
-        <w:rPr>
-          <w:rFonts w:ascii="Consolas" w:eastAsia="Times New Roman" w:hAnsi="Consolas" w:cs="Times New Roman"/>
-          <w:color w:val="BBBBBB"/>
-          <w:kern w:val="0"/>
-          <w:sz w:val="21"/>
-          <w:szCs w:val="21"/>
-          <w14:ligatures w14:val="none"/>
-        </w:rPr>
-      </w:pPr>
-      <w:r>
-        <w:rPr>
-          <w:rFonts w:ascii="Consolas" w:eastAsia="Times New Roman" w:hAnsi="Consolas" w:cs="Times New Roman"/>
-          <w:color w:val="B877DB"/>
-          <w:kern w:val="0"/>
-          <w:sz w:val="21"/>
-          <w:szCs w:val="21"/>
-          <w14:ligatures w14:val="none"/>
-        </w:rPr>
-        <w:t>From</w:t>
-      </w:r>
-    </w:p>
-    <w:p>
-      <w:pPr>
-        <w:pStyle w:val="ListParagraph"/>
-        <w:numPr>
-          <w:ilvl w:val="0"/>
-          <w:numId w:val="16"/>
-        </w:numPr>
-        <w:shd w:val="clear" w:color="auto" w:fill="1C1E26"/>
-        <w:spacing w:after="0" w:line="285" w:lineRule="atLeast"/>
-        <w:rPr>
-          <w:rFonts w:ascii="Consolas" w:eastAsia="Times New Roman" w:hAnsi="Consolas" w:cs="Times New Roman"/>
-          <w:color w:val="BBBBBB"/>
-          <w:kern w:val="0"/>
-          <w:sz w:val="21"/>
-          <w:szCs w:val="21"/>
-          <w14:ligatures w14:val="none"/>
-        </w:rPr>
-      </w:pPr>
-      <w:r>
-        <w:rPr>
-          <w:rFonts w:ascii="Consolas" w:eastAsia="Times New Roman" w:hAnsi="Consolas" w:cs="Times New Roman"/>
-          <w:color w:val="BBBBBB"/>
-          <w:kern w:val="0"/>
-          <w:sz w:val="21"/>
-          <w:szCs w:val="21"/>
-          <w14:ligatures w14:val="none"/>
-        </w:rPr>
-        <w:t>    providers prov</w:t>
-      </w:r>
-    </w:p>
-    <w:p>
-      <w:pPr>
-        <w:pStyle w:val="ListParagraph"/>
-        <w:numPr>
-          <w:ilvl w:val="0"/>
-          <w:numId w:val="16"/>
-        </w:numPr>
-        <w:shd w:val="clear" w:color="auto" w:fill="1C1E26"/>
-        <w:spacing w:after="0" w:line="285" w:lineRule="atLeast"/>
-        <w:rPr>
-          <w:rFonts w:ascii="Consolas" w:eastAsia="Times New Roman" w:hAnsi="Consolas" w:cs="Times New Roman"/>
-          <w:color w:val="BBBBBB"/>
-          <w:kern w:val="0"/>
-          <w:sz w:val="21"/>
-          <w:szCs w:val="21"/>
-          <w14:ligatures w14:val="none"/>
-        </w:rPr>
-      </w:pPr>
-      <w:r>
-        <w:rPr>
-          <w:rFonts w:ascii="Consolas" w:eastAsia="Times New Roman" w:hAnsi="Consolas" w:cs="Times New Roman"/>
-          <w:color w:val="BBBBBB"/>
-          <w:kern w:val="0"/>
-          <w:sz w:val="21"/>
-          <w:szCs w:val="21"/>
-          <w14:ligatures w14:val="none"/>
-        </w:rPr>
-        <w:t xml:space="preserve">        </w:t>
-      </w:r>
-      <w:r>
-        <w:rPr>
-          <w:rFonts w:ascii="Consolas" w:eastAsia="Times New Roman" w:hAnsi="Consolas" w:cs="Times New Roman"/>
-          <w:color w:val="B877DB"/>
-          <w:kern w:val="0"/>
-          <w:sz w:val="21"/>
-          <w:szCs w:val="21"/>
-          <w14:ligatures w14:val="none"/>
-        </w:rPr>
-        <w:t>inner join</w:t>
-      </w:r>
-      <w:r>
-        <w:rPr>
-          <w:rFonts w:ascii="Consolas" w:eastAsia="Times New Roman" w:hAnsi="Consolas" w:cs="Times New Roman"/>
-          <w:color w:val="BBBBBB"/>
-          <w:kern w:val="0"/>
-          <w:sz w:val="21"/>
-          <w:szCs w:val="21"/>
-          <w14:ligatures w14:val="none"/>
-        </w:rPr>
-        <w:t xml:space="preserve"> appointments app</w:t>
-      </w:r>
-    </w:p>
-    <w:p>
-      <w:pPr>
-        <w:pStyle w:val="ListParagraph"/>
-        <w:numPr>
-          <w:ilvl w:val="0"/>
-          <w:numId w:val="16"/>
-        </w:numPr>
-        <w:shd w:val="clear" w:color="auto" w:fill="1C1E26"/>
-        <w:spacing w:after="0" w:line="285" w:lineRule="atLeast"/>
-        <w:rPr>
-          <w:rFonts w:ascii="Consolas" w:eastAsia="Times New Roman" w:hAnsi="Consolas" w:cs="Times New Roman"/>
-          <w:color w:val="BBBBBB"/>
-          <w:kern w:val="0"/>
-          <w:sz w:val="21"/>
-          <w:szCs w:val="21"/>
-          <w14:ligatures w14:val="none"/>
-        </w:rPr>
-      </w:pPr>
-      <w:r>
-        <w:rPr>
-          <w:rFonts w:ascii="Consolas" w:eastAsia="Times New Roman" w:hAnsi="Consolas" w:cs="Times New Roman"/>
-          <w:color w:val="BBBBBB"/>
-          <w:kern w:val="0"/>
-          <w:sz w:val="21"/>
-          <w:szCs w:val="21"/>
-          <w14:ligatures w14:val="none"/>
-        </w:rPr>
-        <w:t xml:space="preserve">            </w:t>
-      </w:r>
-      <w:r>
-        <w:rPr>
-          <w:rFonts w:ascii="Consolas" w:eastAsia="Times New Roman" w:hAnsi="Consolas" w:cs="Times New Roman"/>
-          <w:color w:val="B877DB"/>
-          <w:kern w:val="0"/>
-          <w:sz w:val="21"/>
-          <w:szCs w:val="21"/>
-          <w14:ligatures w14:val="none"/>
-        </w:rPr>
-        <w:t>on</w:t>
-      </w:r>
-      <w:r>
-        <w:rPr>
-          <w:rFonts w:ascii="Consolas" w:eastAsia="Times New Roman" w:hAnsi="Consolas" w:cs="Times New Roman"/>
-          <w:color w:val="BBBBBB"/>
-          <w:kern w:val="0"/>
-          <w:sz w:val="21"/>
-          <w:szCs w:val="21"/>
-          <w14:ligatures w14:val="none"/>
-        </w:rPr>
-        <w:t xml:space="preserve"> </w:t>
-      </w:r>
-      <w:proofErr w:type="spellStart"/>
-      <w:r>
-        <w:rPr>
-          <w:rFonts w:ascii="Consolas" w:eastAsia="Times New Roman" w:hAnsi="Consolas" w:cs="Times New Roman"/>
-          <w:color w:val="F09483"/>
-          <w:kern w:val="0"/>
-          <w:sz w:val="21"/>
-          <w:szCs w:val="21"/>
-          <w14:ligatures w14:val="none"/>
-        </w:rPr>
-        <w:t>prov</w:t>
-      </w:r>
-      <w:r>
-        <w:rPr>
-          <w:rFonts w:ascii="Consolas" w:eastAsia="Times New Roman" w:hAnsi="Consolas" w:cs="Times New Roman"/>
-          <w:color w:val="BBBBBB"/>
-          <w:kern w:val="0"/>
-          <w:sz w:val="21"/>
-          <w:szCs w:val="21"/>
-          <w14:ligatures w14:val="none"/>
-        </w:rPr>
-        <w:t>.</w:t>
-      </w:r>
-      <w:r>
-        <w:rPr>
-          <w:rFonts w:ascii="Consolas" w:eastAsia="Times New Roman" w:hAnsi="Consolas" w:cs="Times New Roman"/>
-          <w:color w:val="F09483"/>
-          <w:kern w:val="0"/>
-          <w:sz w:val="21"/>
-          <w:szCs w:val="21"/>
-          <w14:ligatures w14:val="none"/>
-        </w:rPr>
-        <w:t>provider_id</w:t>
-      </w:r>
-      <w:proofErr w:type="spellEnd"/>
-      <w:r>
-        <w:rPr>
-          <w:rFonts w:ascii="Consolas" w:eastAsia="Times New Roman" w:hAnsi="Consolas" w:cs="Times New Roman"/>
-          <w:color w:val="BBBBBB"/>
-          <w:kern w:val="0"/>
-          <w:sz w:val="21"/>
-          <w:szCs w:val="21"/>
-          <w14:ligatures w14:val="none"/>
-        </w:rPr>
-        <w:t>=</w:t>
-      </w:r>
-      <w:proofErr w:type="spellStart"/>
-      <w:r>
-        <w:rPr>
-          <w:rFonts w:ascii="Consolas" w:eastAsia="Times New Roman" w:hAnsi="Consolas" w:cs="Times New Roman"/>
-          <w:color w:val="F09483"/>
-          <w:kern w:val="0"/>
-          <w:sz w:val="21"/>
-          <w:szCs w:val="21"/>
-          <w14:ligatures w14:val="none"/>
-        </w:rPr>
-        <w:t>app</w:t>
-      </w:r>
-      <w:r>
-        <w:rPr>
-          <w:rFonts w:ascii="Consolas" w:eastAsia="Times New Roman" w:hAnsi="Consolas" w:cs="Times New Roman"/>
-          <w:color w:val="BBBBBB"/>
-          <w:kern w:val="0"/>
-          <w:sz w:val="21"/>
-          <w:szCs w:val="21"/>
-          <w14:ligatures w14:val="none"/>
-        </w:rPr>
-        <w:t>.</w:t>
-      </w:r>
-      <w:r>
-        <w:rPr>
-          <w:rFonts w:ascii="Consolas" w:eastAsia="Times New Roman" w:hAnsi="Consolas" w:cs="Times New Roman"/>
-          <w:color w:val="F09483"/>
-          <w:kern w:val="0"/>
-          <w:sz w:val="21"/>
-          <w:szCs w:val="21"/>
-          <w14:ligatures w14:val="none"/>
-        </w:rPr>
-        <w:t>provider_id</w:t>
-      </w:r>
-      <w:proofErr w:type="spellEnd"/>
-    </w:p>
-    <w:p>
-      <w:pPr>
-        <w:pStyle w:val="ListParagraph"/>
-        <w:numPr>
-          <w:ilvl w:val="0"/>
-          <w:numId w:val="16"/>
-        </w:numPr>
-        <w:shd w:val="clear" w:color="auto" w:fill="1C1E26"/>
-        <w:spacing w:after="0" w:line="285" w:lineRule="atLeast"/>
-        <w:rPr>
-          <w:rFonts w:ascii="Consolas" w:eastAsia="Times New Roman" w:hAnsi="Consolas" w:cs="Times New Roman"/>
-          <w:color w:val="BBBBBB"/>
-          <w:kern w:val="0"/>
-          <w:sz w:val="21"/>
-          <w:szCs w:val="21"/>
-          <w14:ligatures w14:val="none"/>
-        </w:rPr>
-      </w:pPr>
-    </w:p>
-    <w:p>
-      <w:pPr>
-        <w:pStyle w:val="ListParagraph"/>
-        <w:numPr>
-          <w:ilvl w:val="0"/>
-          <w:numId w:val="16"/>
-        </w:numPr>
-        <w:shd w:val="clear" w:color="auto" w:fill="1C1E26"/>
-        <w:spacing w:after="0" w:line="285" w:lineRule="atLeast"/>
-        <w:rPr>
-          <w:rFonts w:ascii="Consolas" w:eastAsia="Times New Roman" w:hAnsi="Consolas" w:cs="Times New Roman"/>
-          <w:color w:val="BBBBBB"/>
-          <w:kern w:val="0"/>
-          <w:sz w:val="21"/>
-          <w:szCs w:val="21"/>
-          <w14:ligatures w14:val="none"/>
-        </w:rPr>
-      </w:pPr>
-      <w:r>
-        <w:rPr>
-          <w:rFonts w:ascii="Consolas" w:eastAsia="Times New Roman" w:hAnsi="Consolas" w:cs="Times New Roman"/>
-          <w:color w:val="B877DB"/>
-          <w:kern w:val="0"/>
-          <w:sz w:val="21"/>
-          <w:szCs w:val="21"/>
-          <w14:ligatures w14:val="none"/>
-        </w:rPr>
-        <w:t>Group By</w:t>
-      </w:r>
-      <w:r>
-        <w:rPr>
-          <w:rFonts w:ascii="Consolas" w:eastAsia="Times New Roman" w:hAnsi="Consolas" w:cs="Times New Roman"/>
-          <w:color w:val="BBBBBB"/>
-          <w:kern w:val="0"/>
-          <w:sz w:val="21"/>
-          <w:szCs w:val="21"/>
-          <w14:ligatures w14:val="none"/>
-        </w:rPr>
-        <w:t xml:space="preserve">     </w:t>
-      </w:r>
-    </w:p>
-    <w:p>
-      <w:pPr>
-        <w:pStyle w:val="ListParagraph"/>
-        <w:numPr>
-          <w:ilvl w:val="0"/>
-          <w:numId w:val="16"/>
-        </w:numPr>
-        <w:shd w:val="clear" w:color="auto" w:fill="1C1E26"/>
-        <w:spacing w:after="0" w:line="285" w:lineRule="atLeast"/>
-        <w:rPr>
-          <w:rFonts w:ascii="Consolas" w:eastAsia="Times New Roman" w:hAnsi="Consolas" w:cs="Times New Roman"/>
-          <w:color w:val="BBBBBB"/>
-          <w:kern w:val="0"/>
-          <w:sz w:val="21"/>
-          <w:szCs w:val="21"/>
-          <w14:ligatures w14:val="none"/>
-        </w:rPr>
-      </w:pPr>
-      <w:r>
-        <w:rPr>
-          <w:rFonts w:ascii="Consolas" w:eastAsia="Times New Roman" w:hAnsi="Consolas" w:cs="Times New Roman"/>
-          <w:color w:val="BBBBBB"/>
-          <w:kern w:val="0"/>
-          <w:sz w:val="21"/>
-          <w:szCs w:val="21"/>
-          <w14:ligatures w14:val="none"/>
-        </w:rPr>
-        <w:t xml:space="preserve">    </w:t>
-      </w:r>
-      <w:proofErr w:type="spellStart"/>
-      <w:r>
-        <w:rPr>
-          <w:rFonts w:ascii="Consolas" w:eastAsia="Times New Roman" w:hAnsi="Consolas" w:cs="Times New Roman"/>
-          <w:color w:val="F09483"/>
-          <w:kern w:val="0"/>
-          <w:sz w:val="21"/>
-          <w:szCs w:val="21"/>
-          <w14:ligatures w14:val="none"/>
-        </w:rPr>
-        <w:t>prov</w:t>
-      </w:r>
-      <w:r>
-        <w:rPr>
-          <w:rFonts w:ascii="Consolas" w:eastAsia="Times New Roman" w:hAnsi="Consolas" w:cs="Times New Roman"/>
-          <w:color w:val="BBBBBB"/>
-          <w:kern w:val="0"/>
-          <w:sz w:val="21"/>
-          <w:szCs w:val="21"/>
-          <w14:ligatures w14:val="none"/>
-        </w:rPr>
-        <w:t>.</w:t>
-      </w:r>
-      <w:r>
-        <w:rPr>
-          <w:rFonts w:ascii="Consolas" w:eastAsia="Times New Roman" w:hAnsi="Consolas" w:cs="Times New Roman"/>
-          <w:color w:val="F09483"/>
-          <w:kern w:val="0"/>
-          <w:sz w:val="21"/>
-          <w:szCs w:val="21"/>
-          <w14:ligatures w14:val="none"/>
-        </w:rPr>
-        <w:t>years_experience</w:t>
-      </w:r>
-      <w:proofErr w:type="spellEnd"/>
-    </w:p>
-    <w:p>
-      <w:pPr>
-        <w:pStyle w:val="ListParagraph"/>
-        <w:numPr>
-          <w:ilvl w:val="0"/>
-          <w:numId w:val="16"/>
-        </w:numPr>
-        <w:shd w:val="clear" w:color="auto" w:fill="1C1E26"/>
-        <w:spacing w:after="0" w:line="285" w:lineRule="atLeast"/>
-        <w:rPr>
-          <w:rFonts w:ascii="Consolas" w:eastAsia="Times New Roman" w:hAnsi="Consolas" w:cs="Times New Roman"/>
-          <w:color w:val="BBBBBB"/>
-          <w:kern w:val="0"/>
-          <w:sz w:val="21"/>
-          <w:szCs w:val="21"/>
-          <w14:ligatures w14:val="none"/>
-        </w:rPr>
-      </w:pPr>
-    </w:p>
-    <w:p>
-      <w:pPr>
-        <w:pStyle w:val="ListParagraph"/>
-        <w:numPr>
-          <w:ilvl w:val="0"/>
-          <w:numId w:val="16"/>
-        </w:numPr>
-        <w:shd w:val="clear" w:color="auto" w:fill="1C1E26"/>
-        <w:spacing w:after="0" w:line="285" w:lineRule="atLeast"/>
-        <w:rPr>
-          <w:rFonts w:ascii="Consolas" w:eastAsia="Times New Roman" w:hAnsi="Consolas" w:cs="Times New Roman"/>
-          <w:color w:val="BBBBBB"/>
-          <w:kern w:val="0"/>
-          <w:sz w:val="21"/>
-          <w:szCs w:val="21"/>
-          <w14:ligatures w14:val="none"/>
-        </w:rPr>
-      </w:pPr>
-      <w:r>
-        <w:rPr>
-          <w:rFonts w:ascii="Consolas" w:eastAsia="Times New Roman" w:hAnsi="Consolas" w:cs="Times New Roman"/>
-          <w:color w:val="B877DB"/>
-          <w:kern w:val="0"/>
-          <w:sz w:val="21"/>
-          <w:szCs w:val="21"/>
-          <w14:ligatures w14:val="none"/>
-        </w:rPr>
-        <w:t>Order By</w:t>
-      </w:r>
-    </w:p>
-    <w:p>
-      <w:pPr>
-        <w:pStyle w:val="ListParagraph"/>
-        <w:numPr>
-          <w:ilvl w:val="0"/>
-          <w:numId w:val="16"/>
-        </w:numPr>
-        <w:shd w:val="clear" w:color="auto" w:fill="1C1E26"/>
-        <w:spacing w:after="0" w:line="285" w:lineRule="atLeast"/>
-        <w:rPr>
-          <w:rFonts w:ascii="Consolas" w:eastAsia="Times New Roman" w:hAnsi="Consolas" w:cs="Times New Roman"/>
-          <w:color w:val="BBBBBB"/>
-          <w:kern w:val="0"/>
-          <w:sz w:val="21"/>
-          <w:szCs w:val="21"/>
-          <w14:ligatures w14:val="none"/>
-        </w:rPr>
-      </w:pPr>
-      <w:r>
-        <w:rPr>
-          <w:rFonts w:ascii="Consolas" w:eastAsia="Times New Roman" w:hAnsi="Consolas" w:cs="Times New Roman"/>
-          <w:color w:val="BBBBBB"/>
-          <w:kern w:val="0"/>
-          <w:sz w:val="21"/>
-          <w:szCs w:val="21"/>
-          <w14:ligatures w14:val="none"/>
-        </w:rPr>
-        <w:t xml:space="preserve">    </w:t>
-      </w:r>
-      <w:proofErr w:type="spellStart"/>
-      <w:r>
-        <w:rPr>
-          <w:rFonts w:ascii="Consolas" w:eastAsia="Times New Roman" w:hAnsi="Consolas" w:cs="Times New Roman"/>
-          <w:color w:val="BBBBBB"/>
-          <w:kern w:val="0"/>
-          <w:sz w:val="21"/>
-          <w:szCs w:val="21"/>
-          <w14:ligatures w14:val="none"/>
-        </w:rPr>
-        <w:t>avg_satisf_score</w:t>
-      </w:r>
-      <w:proofErr w:type="spellEnd"/>
-      <w:r>
-        <w:rPr>
-          <w:rFonts w:ascii="Consolas" w:eastAsia="Times New Roman" w:hAnsi="Consolas" w:cs="Times New Roman"/>
-          <w:color w:val="BBBBBB"/>
-          <w:kern w:val="0"/>
-          <w:sz w:val="21"/>
-          <w:szCs w:val="21"/>
-          <w14:ligatures w14:val="none"/>
-        </w:rPr>
-        <w:t xml:space="preserve"> </w:t>
-      </w:r>
-      <w:r>
-        <w:rPr>
-          <w:rFonts w:ascii="Consolas" w:eastAsia="Times New Roman" w:hAnsi="Consolas" w:cs="Times New Roman"/>
-          <w:color w:val="B877DB"/>
-          <w:kern w:val="0"/>
-          <w:sz w:val="21"/>
-          <w:szCs w:val="21"/>
-          <w14:ligatures w14:val="none"/>
-        </w:rPr>
-        <w:t>desc</w:t>
-      </w:r>
-    </w:p>
-    <w:p>
-      <w:pPr>
-        <w:pStyle w:val="ListParagraph"/>
-        <w:numPr>
-          <w:ilvl w:val="0"/>
-          <w:numId w:val="16"/>
-        </w:numPr>
-        <w:shd w:val="clear" w:color="auto" w:fill="1C1E26"/>
-        <w:spacing w:after="0" w:line="285" w:lineRule="atLeast"/>
-        <w:rPr>
-          <w:rFonts w:ascii="Consolas" w:eastAsia="Times New Roman" w:hAnsi="Consolas" w:cs="Times New Roman"/>
-          <w:color w:val="BBBBBB"/>
-          <w:kern w:val="0"/>
-          <w:sz w:val="21"/>
-          <w:szCs w:val="21"/>
-          <w14:ligatures w14:val="none"/>
-        </w:rPr>
-      </w:pPr>
-      <w:r>
-        <w:rPr>
-          <w:rFonts w:ascii="Consolas" w:eastAsia="Times New Roman" w:hAnsi="Consolas" w:cs="Times New Roman"/>
-          <w:color w:val="BBBBBB"/>
-          <w:kern w:val="0"/>
-          <w:sz w:val="21"/>
-          <w:szCs w:val="21"/>
-          <w14:ligatures w14:val="none"/>
-        </w:rPr>
-        <w:t xml:space="preserve">    </w:t>
-      </w:r>
       <w:r>
         <w:rPr>
           <w:rFonts w:ascii="Consolas" w:eastAsia="Times New Roman" w:hAnsi="Consolas" w:cs="Times New Roman"/>
@@ -2774,7 +1981,7 @@
           <w:szCs w:val="21"/>
           <w14:ligatures w14:val="none"/>
         </w:rPr>
-        <w:t>--</w:t>
+        <w:t xml:space="preserve">Provider </w:t>
       </w:r>
       <w:proofErr w:type="spellStart"/>
       <w:r>
@@ -2788,9 +1995,22 @@
           <w:szCs w:val="21"/>
           <w14:ligatures w14:val="none"/>
         </w:rPr>
-        <w:t>years_experience</w:t>
+        <w:t>expereince</w:t>
       </w:r>
       <w:proofErr w:type="spellEnd"/>
+      <w:r>
+        <w:rPr>
+          <w:rFonts w:ascii="Consolas" w:eastAsia="Times New Roman" w:hAnsi="Consolas" w:cs="Times New Roman"/>
+          <w:i/>
+          <w:iCs/>
+          <w:color w:val="BBBBBB"/>
+          <w:kern w:val="0"/>
+          <w:sz w:val="21"/>
+          <w:szCs w:val="21"/>
+          <w14:ligatures w14:val="none"/>
+        </w:rPr>
+        <w:t xml:space="preserve"> does not appear to be a primary driver of patient satisfaction. </w:t>
+      </w:r>
     </w:p>
     <w:p>
       <w:pPr>
@@ -2813,12 +2033,1110 @@
       <w:r>
         <w:rPr>
           <w:rFonts w:ascii="Consolas" w:eastAsia="Times New Roman" w:hAnsi="Consolas" w:cs="Times New Roman"/>
+          <w:i/>
+          <w:iCs/>
           <w:color w:val="BBBBBB"/>
           <w:kern w:val="0"/>
           <w:sz w:val="21"/>
           <w:szCs w:val="21"/>
           <w14:ligatures w14:val="none"/>
         </w:rPr>
+        <w:t>Future analyses should investigate other factors such as appointment type, department, continuity of care, provider workload, patient characteristics, or other operational factors to better understand what influences satisfaction scores.  </w:t>
+      </w:r>
+    </w:p>
+    <w:p>
+      <w:pPr>
+        <w:pStyle w:val="ListParagraph"/>
+        <w:numPr>
+          <w:ilvl w:val="0"/>
+          <w:numId w:val="16"/>
+        </w:numPr>
+        <w:shd w:val="clear" w:color="auto" w:fill="1C1E26"/>
+        <w:spacing w:after="0" w:line="285" w:lineRule="atLeast"/>
+        <w:rPr>
+          <w:rFonts w:ascii="Consolas" w:eastAsia="Times New Roman" w:hAnsi="Consolas" w:cs="Times New Roman"/>
+          <w:color w:val="BBBBBB"/>
+          <w:kern w:val="0"/>
+          <w:sz w:val="21"/>
+          <w:szCs w:val="21"/>
+          <w14:ligatures w14:val="none"/>
+        </w:rPr>
+      </w:pPr>
+      <w:r>
+        <w:rPr>
+          <w:rFonts w:ascii="Consolas" w:eastAsia="Times New Roman" w:hAnsi="Consolas" w:cs="Times New Roman"/>
+          <w:i/>
+          <w:iCs/>
+          <w:color w:val="BBBBBB"/>
+          <w:kern w:val="0"/>
+          <w:sz w:val="21"/>
+          <w:szCs w:val="21"/>
+          <w14:ligatures w14:val="none"/>
+        </w:rPr>
+        <w:t>*/</w:t>
+      </w:r>
+    </w:p>
+    <w:p>
+      <w:pPr>
+        <w:pStyle w:val="ListParagraph"/>
+        <w:numPr>
+          <w:ilvl w:val="0"/>
+          <w:numId w:val="16"/>
+        </w:numPr>
+        <w:shd w:val="clear" w:color="auto" w:fill="1C1E26"/>
+        <w:spacing w:after="0" w:line="285" w:lineRule="atLeast"/>
+        <w:rPr>
+          <w:rFonts w:ascii="Consolas" w:eastAsia="Times New Roman" w:hAnsi="Consolas" w:cs="Times New Roman"/>
+          <w:color w:val="BBBBBB"/>
+          <w:kern w:val="0"/>
+          <w:sz w:val="21"/>
+          <w:szCs w:val="21"/>
+          <w14:ligatures w14:val="none"/>
+        </w:rPr>
+      </w:pPr>
+    </w:p>
+    <w:p>
+      <w:pPr>
+        <w:pStyle w:val="ListParagraph"/>
+        <w:numPr>
+          <w:ilvl w:val="0"/>
+          <w:numId w:val="16"/>
+        </w:numPr>
+        <w:shd w:val="clear" w:color="auto" w:fill="1C1E26"/>
+        <w:spacing w:after="0" w:line="285" w:lineRule="atLeast"/>
+        <w:rPr>
+          <w:rFonts w:ascii="Consolas" w:eastAsia="Times New Roman" w:hAnsi="Consolas" w:cs="Times New Roman"/>
+          <w:color w:val="BBBBBB"/>
+          <w:kern w:val="0"/>
+          <w:sz w:val="21"/>
+          <w:szCs w:val="21"/>
+          <w14:ligatures w14:val="none"/>
+        </w:rPr>
+      </w:pPr>
+      <w:r>
+        <w:rPr>
+          <w:rFonts w:ascii="Consolas" w:eastAsia="Times New Roman" w:hAnsi="Consolas" w:cs="Times New Roman"/>
+          <w:color w:val="B877DB"/>
+          <w:kern w:val="0"/>
+          <w:sz w:val="21"/>
+          <w:szCs w:val="21"/>
+          <w14:ligatures w14:val="none"/>
+        </w:rPr>
+        <w:t>Select</w:t>
+      </w:r>
+    </w:p>
+    <w:p>
+      <w:pPr>
+        <w:pStyle w:val="ListParagraph"/>
+        <w:numPr>
+          <w:ilvl w:val="0"/>
+          <w:numId w:val="16"/>
+        </w:numPr>
+        <w:shd w:val="clear" w:color="auto" w:fill="1C1E26"/>
+        <w:spacing w:after="0" w:line="285" w:lineRule="atLeast"/>
+        <w:rPr>
+          <w:rFonts w:ascii="Consolas" w:eastAsia="Times New Roman" w:hAnsi="Consolas" w:cs="Times New Roman"/>
+          <w:color w:val="BBBBBB"/>
+          <w:kern w:val="0"/>
+          <w:sz w:val="21"/>
+          <w:szCs w:val="21"/>
+          <w14:ligatures w14:val="none"/>
+        </w:rPr>
+      </w:pPr>
+      <w:r>
+        <w:rPr>
+          <w:rFonts w:ascii="Consolas" w:eastAsia="Times New Roman" w:hAnsi="Consolas" w:cs="Times New Roman"/>
+          <w:color w:val="BBBBBB"/>
+          <w:kern w:val="0"/>
+          <w:sz w:val="21"/>
+          <w:szCs w:val="21"/>
+          <w14:ligatures w14:val="none"/>
+        </w:rPr>
+        <w:t xml:space="preserve">      </w:t>
+      </w:r>
+      <w:proofErr w:type="spellStart"/>
+      <w:proofErr w:type="gramStart"/>
+      <w:r>
+        <w:rPr>
+          <w:rFonts w:ascii="Consolas" w:eastAsia="Times New Roman" w:hAnsi="Consolas" w:cs="Times New Roman"/>
+          <w:color w:val="F09483"/>
+          <w:kern w:val="0"/>
+          <w:sz w:val="21"/>
+          <w:szCs w:val="21"/>
+          <w14:ligatures w14:val="none"/>
+        </w:rPr>
+        <w:t>prov</w:t>
+      </w:r>
+      <w:r>
+        <w:rPr>
+          <w:rFonts w:ascii="Consolas" w:eastAsia="Times New Roman" w:hAnsi="Consolas" w:cs="Times New Roman"/>
+          <w:color w:val="BBBBBB"/>
+          <w:kern w:val="0"/>
+          <w:sz w:val="21"/>
+          <w:szCs w:val="21"/>
+          <w14:ligatures w14:val="none"/>
+        </w:rPr>
+        <w:t>.</w:t>
+      </w:r>
+      <w:r>
+        <w:rPr>
+          <w:rFonts w:ascii="Consolas" w:eastAsia="Times New Roman" w:hAnsi="Consolas" w:cs="Times New Roman"/>
+          <w:color w:val="F09483"/>
+          <w:kern w:val="0"/>
+          <w:sz w:val="21"/>
+          <w:szCs w:val="21"/>
+          <w14:ligatures w14:val="none"/>
+        </w:rPr>
+        <w:t>years</w:t>
+      </w:r>
+      <w:proofErr w:type="gramEnd"/>
+      <w:r>
+        <w:rPr>
+          <w:rFonts w:ascii="Consolas" w:eastAsia="Times New Roman" w:hAnsi="Consolas" w:cs="Times New Roman"/>
+          <w:color w:val="F09483"/>
+          <w:kern w:val="0"/>
+          <w:sz w:val="21"/>
+          <w:szCs w:val="21"/>
+          <w14:ligatures w14:val="none"/>
+        </w:rPr>
+        <w:t>_experience</w:t>
+      </w:r>
+      <w:proofErr w:type="spellEnd"/>
+    </w:p>
+    <w:p>
+      <w:pPr>
+        <w:pStyle w:val="ListParagraph"/>
+        <w:numPr>
+          <w:ilvl w:val="0"/>
+          <w:numId w:val="16"/>
+        </w:numPr>
+        <w:shd w:val="clear" w:color="auto" w:fill="1C1E26"/>
+        <w:spacing w:after="0" w:line="285" w:lineRule="atLeast"/>
+        <w:rPr>
+          <w:rFonts w:ascii="Consolas" w:eastAsia="Times New Roman" w:hAnsi="Consolas" w:cs="Times New Roman"/>
+          <w:color w:val="BBBBBB"/>
+          <w:kern w:val="0"/>
+          <w:sz w:val="21"/>
+          <w:szCs w:val="21"/>
+          <w14:ligatures w14:val="none"/>
+        </w:rPr>
+      </w:pPr>
+      <w:r>
+        <w:rPr>
+          <w:rFonts w:ascii="Consolas" w:eastAsia="Times New Roman" w:hAnsi="Consolas" w:cs="Times New Roman"/>
+          <w:color w:val="BBBBBB"/>
+          <w:kern w:val="0"/>
+          <w:sz w:val="21"/>
+          <w:szCs w:val="21"/>
+          <w14:ligatures w14:val="none"/>
+        </w:rPr>
+        <w:t xml:space="preserve">    , </w:t>
+      </w:r>
+      <w:r>
+        <w:rPr>
+          <w:rFonts w:ascii="Consolas" w:eastAsia="Times New Roman" w:hAnsi="Consolas" w:cs="Times New Roman"/>
+          <w:color w:val="25B0BC"/>
+          <w:kern w:val="0"/>
+          <w:sz w:val="21"/>
+          <w:szCs w:val="21"/>
+          <w14:ligatures w14:val="none"/>
+        </w:rPr>
+        <w:t>max</w:t>
+      </w:r>
+      <w:r>
+        <w:rPr>
+          <w:rFonts w:ascii="Consolas" w:eastAsia="Times New Roman" w:hAnsi="Consolas" w:cs="Times New Roman"/>
+          <w:color w:val="BBBBBB"/>
+          <w:kern w:val="0"/>
+          <w:sz w:val="21"/>
+          <w:szCs w:val="21"/>
+          <w14:ligatures w14:val="none"/>
+        </w:rPr>
+        <w:t>(</w:t>
+      </w:r>
+      <w:proofErr w:type="spellStart"/>
+      <w:r>
+        <w:rPr>
+          <w:rFonts w:ascii="Consolas" w:eastAsia="Times New Roman" w:hAnsi="Consolas" w:cs="Times New Roman"/>
+          <w:color w:val="BBBBBB"/>
+          <w:kern w:val="0"/>
+          <w:sz w:val="21"/>
+          <w:szCs w:val="21"/>
+          <w14:ligatures w14:val="none"/>
+        </w:rPr>
+        <w:t>patient_satisfaction_score</w:t>
+      </w:r>
+      <w:proofErr w:type="spellEnd"/>
+      <w:r>
+        <w:rPr>
+          <w:rFonts w:ascii="Consolas" w:eastAsia="Times New Roman" w:hAnsi="Consolas" w:cs="Times New Roman"/>
+          <w:color w:val="BBBBBB"/>
+          <w:kern w:val="0"/>
+          <w:sz w:val="21"/>
+          <w:szCs w:val="21"/>
+          <w14:ligatures w14:val="none"/>
+        </w:rPr>
+        <w:t>)</w:t>
+      </w:r>
+    </w:p>
+    <w:p>
+      <w:pPr>
+        <w:pStyle w:val="ListParagraph"/>
+        <w:numPr>
+          <w:ilvl w:val="0"/>
+          <w:numId w:val="16"/>
+        </w:numPr>
+        <w:shd w:val="clear" w:color="auto" w:fill="1C1E26"/>
+        <w:spacing w:after="0" w:line="285" w:lineRule="atLeast"/>
+        <w:rPr>
+          <w:rFonts w:ascii="Consolas" w:eastAsia="Times New Roman" w:hAnsi="Consolas" w:cs="Times New Roman"/>
+          <w:color w:val="BBBBBB"/>
+          <w:kern w:val="0"/>
+          <w:sz w:val="21"/>
+          <w:szCs w:val="21"/>
+          <w14:ligatures w14:val="none"/>
+        </w:rPr>
+      </w:pPr>
+      <w:r>
+        <w:rPr>
+          <w:rFonts w:ascii="Consolas" w:eastAsia="Times New Roman" w:hAnsi="Consolas" w:cs="Times New Roman"/>
+          <w:color w:val="BBBBBB"/>
+          <w:kern w:val="0"/>
+          <w:sz w:val="21"/>
+          <w:szCs w:val="21"/>
+          <w14:ligatures w14:val="none"/>
+        </w:rPr>
+        <w:t xml:space="preserve">    , </w:t>
+      </w:r>
+      <w:r>
+        <w:rPr>
+          <w:rFonts w:ascii="Consolas" w:eastAsia="Times New Roman" w:hAnsi="Consolas" w:cs="Times New Roman"/>
+          <w:color w:val="25B0BC"/>
+          <w:kern w:val="0"/>
+          <w:sz w:val="21"/>
+          <w:szCs w:val="21"/>
+          <w14:ligatures w14:val="none"/>
+        </w:rPr>
+        <w:t>min</w:t>
+      </w:r>
+      <w:r>
+        <w:rPr>
+          <w:rFonts w:ascii="Consolas" w:eastAsia="Times New Roman" w:hAnsi="Consolas" w:cs="Times New Roman"/>
+          <w:color w:val="BBBBBB"/>
+          <w:kern w:val="0"/>
+          <w:sz w:val="21"/>
+          <w:szCs w:val="21"/>
+          <w14:ligatures w14:val="none"/>
+        </w:rPr>
+        <w:t>(</w:t>
+      </w:r>
+      <w:proofErr w:type="spellStart"/>
+      <w:r>
+        <w:rPr>
+          <w:rFonts w:ascii="Consolas" w:eastAsia="Times New Roman" w:hAnsi="Consolas" w:cs="Times New Roman"/>
+          <w:color w:val="BBBBBB"/>
+          <w:kern w:val="0"/>
+          <w:sz w:val="21"/>
+          <w:szCs w:val="21"/>
+          <w14:ligatures w14:val="none"/>
+        </w:rPr>
+        <w:t>patient_satisfaction_score</w:t>
+      </w:r>
+      <w:proofErr w:type="spellEnd"/>
+      <w:r>
+        <w:rPr>
+          <w:rFonts w:ascii="Consolas" w:eastAsia="Times New Roman" w:hAnsi="Consolas" w:cs="Times New Roman"/>
+          <w:color w:val="BBBBBB"/>
+          <w:kern w:val="0"/>
+          <w:sz w:val="21"/>
+          <w:szCs w:val="21"/>
+          <w14:ligatures w14:val="none"/>
+        </w:rPr>
+        <w:t>)</w:t>
+      </w:r>
+    </w:p>
+    <w:p>
+      <w:pPr>
+        <w:pStyle w:val="ListParagraph"/>
+        <w:numPr>
+          <w:ilvl w:val="0"/>
+          <w:numId w:val="16"/>
+        </w:numPr>
+        <w:shd w:val="clear" w:color="auto" w:fill="1C1E26"/>
+        <w:spacing w:after="0" w:line="285" w:lineRule="atLeast"/>
+        <w:rPr>
+          <w:rFonts w:ascii="Consolas" w:eastAsia="Times New Roman" w:hAnsi="Consolas" w:cs="Times New Roman"/>
+          <w:color w:val="BBBBBB"/>
+          <w:kern w:val="0"/>
+          <w:sz w:val="21"/>
+          <w:szCs w:val="21"/>
+          <w14:ligatures w14:val="none"/>
+        </w:rPr>
+      </w:pPr>
+      <w:r>
+        <w:rPr>
+          <w:rFonts w:ascii="Consolas" w:eastAsia="Times New Roman" w:hAnsi="Consolas" w:cs="Times New Roman"/>
+          <w:color w:val="BBBBBB"/>
+          <w:kern w:val="0"/>
+          <w:sz w:val="21"/>
+          <w:szCs w:val="21"/>
+          <w14:ligatures w14:val="none"/>
+        </w:rPr>
+        <w:t xml:space="preserve">    , </w:t>
+      </w:r>
+      <w:r>
+        <w:rPr>
+          <w:rFonts w:ascii="Consolas" w:eastAsia="Times New Roman" w:hAnsi="Consolas" w:cs="Times New Roman"/>
+          <w:color w:val="25B0BC"/>
+          <w:kern w:val="0"/>
+          <w:sz w:val="21"/>
+          <w:szCs w:val="21"/>
+          <w14:ligatures w14:val="none"/>
+        </w:rPr>
+        <w:t>round</w:t>
+      </w:r>
+      <w:r>
+        <w:rPr>
+          <w:rFonts w:ascii="Consolas" w:eastAsia="Times New Roman" w:hAnsi="Consolas" w:cs="Times New Roman"/>
+          <w:color w:val="BBBBBB"/>
+          <w:kern w:val="0"/>
+          <w:sz w:val="21"/>
+          <w:szCs w:val="21"/>
+          <w14:ligatures w14:val="none"/>
+        </w:rPr>
+        <w:t>(</w:t>
+      </w:r>
+      <w:r>
+        <w:rPr>
+          <w:rFonts w:ascii="Consolas" w:eastAsia="Times New Roman" w:hAnsi="Consolas" w:cs="Times New Roman"/>
+          <w:color w:val="25B0BC"/>
+          <w:kern w:val="0"/>
+          <w:sz w:val="21"/>
+          <w:szCs w:val="21"/>
+          <w14:ligatures w14:val="none"/>
+        </w:rPr>
+        <w:t>avg</w:t>
+      </w:r>
+      <w:r>
+        <w:rPr>
+          <w:rFonts w:ascii="Consolas" w:eastAsia="Times New Roman" w:hAnsi="Consolas" w:cs="Times New Roman"/>
+          <w:color w:val="BBBBBB"/>
+          <w:kern w:val="0"/>
+          <w:sz w:val="21"/>
+          <w:szCs w:val="21"/>
+          <w14:ligatures w14:val="none"/>
+        </w:rPr>
+        <w:t>(</w:t>
+      </w:r>
+      <w:proofErr w:type="spellStart"/>
+      <w:r>
+        <w:rPr>
+          <w:rFonts w:ascii="Consolas" w:eastAsia="Times New Roman" w:hAnsi="Consolas" w:cs="Times New Roman"/>
+          <w:color w:val="BBBBBB"/>
+          <w:kern w:val="0"/>
+          <w:sz w:val="21"/>
+          <w:szCs w:val="21"/>
+          <w14:ligatures w14:val="none"/>
+        </w:rPr>
+        <w:t>patient_satisfaction_score</w:t>
+      </w:r>
+      <w:proofErr w:type="spellEnd"/>
+      <w:r>
+        <w:rPr>
+          <w:rFonts w:ascii="Consolas" w:eastAsia="Times New Roman" w:hAnsi="Consolas" w:cs="Times New Roman"/>
+          <w:color w:val="BBBBBB"/>
+          <w:kern w:val="0"/>
+          <w:sz w:val="21"/>
+          <w:szCs w:val="21"/>
+          <w14:ligatures w14:val="none"/>
+        </w:rPr>
+        <w:t>),</w:t>
+      </w:r>
+      <w:r>
+        <w:rPr>
+          <w:rFonts w:ascii="Consolas" w:eastAsia="Times New Roman" w:hAnsi="Consolas" w:cs="Times New Roman"/>
+          <w:color w:val="F09483"/>
+          <w:kern w:val="0"/>
+          <w:sz w:val="21"/>
+          <w:szCs w:val="21"/>
+          <w14:ligatures w14:val="none"/>
+        </w:rPr>
+        <w:t>2</w:t>
+      </w:r>
+      <w:r>
+        <w:rPr>
+          <w:rFonts w:ascii="Consolas" w:eastAsia="Times New Roman" w:hAnsi="Consolas" w:cs="Times New Roman"/>
+          <w:color w:val="BBBBBB"/>
+          <w:kern w:val="0"/>
+          <w:sz w:val="21"/>
+          <w:szCs w:val="21"/>
+          <w14:ligatures w14:val="none"/>
+        </w:rPr>
+        <w:t xml:space="preserve">) </w:t>
+      </w:r>
+      <w:r>
+        <w:rPr>
+          <w:rFonts w:ascii="Consolas" w:eastAsia="Times New Roman" w:hAnsi="Consolas" w:cs="Times New Roman"/>
+          <w:color w:val="B877DB"/>
+          <w:kern w:val="0"/>
+          <w:sz w:val="21"/>
+          <w:szCs w:val="21"/>
+          <w14:ligatures w14:val="none"/>
+        </w:rPr>
+        <w:t>as</w:t>
+      </w:r>
+      <w:r>
+        <w:rPr>
+          <w:rFonts w:ascii="Consolas" w:eastAsia="Times New Roman" w:hAnsi="Consolas" w:cs="Times New Roman"/>
+          <w:color w:val="BBBBBB"/>
+          <w:kern w:val="0"/>
+          <w:sz w:val="21"/>
+          <w:szCs w:val="21"/>
+          <w14:ligatures w14:val="none"/>
+        </w:rPr>
+        <w:t xml:space="preserve"> </w:t>
+      </w:r>
+      <w:proofErr w:type="spellStart"/>
+      <w:r>
+        <w:rPr>
+          <w:rFonts w:ascii="Consolas" w:eastAsia="Times New Roman" w:hAnsi="Consolas" w:cs="Times New Roman"/>
+          <w:color w:val="BBBBBB"/>
+          <w:kern w:val="0"/>
+          <w:sz w:val="21"/>
+          <w:szCs w:val="21"/>
+          <w14:ligatures w14:val="none"/>
+        </w:rPr>
+        <w:t>avg_satisf_score</w:t>
+      </w:r>
+      <w:proofErr w:type="spellEnd"/>
+    </w:p>
+    <w:p>
+      <w:pPr>
+        <w:pStyle w:val="ListParagraph"/>
+        <w:numPr>
+          <w:ilvl w:val="0"/>
+          <w:numId w:val="16"/>
+        </w:numPr>
+        <w:shd w:val="clear" w:color="auto" w:fill="1C1E26"/>
+        <w:spacing w:after="0" w:line="285" w:lineRule="atLeast"/>
+        <w:rPr>
+          <w:rFonts w:ascii="Consolas" w:eastAsia="Times New Roman" w:hAnsi="Consolas" w:cs="Times New Roman"/>
+          <w:color w:val="BBBBBB"/>
+          <w:kern w:val="0"/>
+          <w:sz w:val="21"/>
+          <w:szCs w:val="21"/>
+          <w14:ligatures w14:val="none"/>
+        </w:rPr>
+      </w:pPr>
+    </w:p>
+    <w:p>
+      <w:pPr>
+        <w:pStyle w:val="ListParagraph"/>
+        <w:numPr>
+          <w:ilvl w:val="0"/>
+          <w:numId w:val="16"/>
+        </w:numPr>
+        <w:shd w:val="clear" w:color="auto" w:fill="1C1E26"/>
+        <w:spacing w:after="0" w:line="285" w:lineRule="atLeast"/>
+        <w:rPr>
+          <w:rFonts w:ascii="Consolas" w:eastAsia="Times New Roman" w:hAnsi="Consolas" w:cs="Times New Roman"/>
+          <w:color w:val="BBBBBB"/>
+          <w:kern w:val="0"/>
+          <w:sz w:val="21"/>
+          <w:szCs w:val="21"/>
+          <w14:ligatures w14:val="none"/>
+        </w:rPr>
+      </w:pPr>
+      <w:r>
+        <w:rPr>
+          <w:rFonts w:ascii="Consolas" w:eastAsia="Times New Roman" w:hAnsi="Consolas" w:cs="Times New Roman"/>
+          <w:color w:val="B877DB"/>
+          <w:kern w:val="0"/>
+          <w:sz w:val="21"/>
+          <w:szCs w:val="21"/>
+          <w14:ligatures w14:val="none"/>
+        </w:rPr>
+        <w:t>From</w:t>
+      </w:r>
+    </w:p>
+    <w:p>
+      <w:pPr>
+        <w:pStyle w:val="ListParagraph"/>
+        <w:numPr>
+          <w:ilvl w:val="0"/>
+          <w:numId w:val="16"/>
+        </w:numPr>
+        <w:shd w:val="clear" w:color="auto" w:fill="1C1E26"/>
+        <w:spacing w:after="0" w:line="285" w:lineRule="atLeast"/>
+        <w:rPr>
+          <w:rFonts w:ascii="Consolas" w:eastAsia="Times New Roman" w:hAnsi="Consolas" w:cs="Times New Roman"/>
+          <w:color w:val="BBBBBB"/>
+          <w:kern w:val="0"/>
+          <w:sz w:val="21"/>
+          <w:szCs w:val="21"/>
+          <w14:ligatures w14:val="none"/>
+        </w:rPr>
+      </w:pPr>
+      <w:r>
+        <w:rPr>
+          <w:rFonts w:ascii="Consolas" w:eastAsia="Times New Roman" w:hAnsi="Consolas" w:cs="Times New Roman"/>
+          <w:color w:val="BBBBBB"/>
+          <w:kern w:val="0"/>
+          <w:sz w:val="21"/>
+          <w:szCs w:val="21"/>
+          <w14:ligatures w14:val="none"/>
+        </w:rPr>
+        <w:t>    providers prov</w:t>
+      </w:r>
+    </w:p>
+    <w:p>
+      <w:pPr>
+        <w:pStyle w:val="ListParagraph"/>
+        <w:numPr>
+          <w:ilvl w:val="0"/>
+          <w:numId w:val="16"/>
+        </w:numPr>
+        <w:shd w:val="clear" w:color="auto" w:fill="1C1E26"/>
+        <w:spacing w:after="0" w:line="285" w:lineRule="atLeast"/>
+        <w:rPr>
+          <w:rFonts w:ascii="Consolas" w:eastAsia="Times New Roman" w:hAnsi="Consolas" w:cs="Times New Roman"/>
+          <w:color w:val="BBBBBB"/>
+          <w:kern w:val="0"/>
+          <w:sz w:val="21"/>
+          <w:szCs w:val="21"/>
+          <w14:ligatures w14:val="none"/>
+        </w:rPr>
+      </w:pPr>
+      <w:r>
+        <w:rPr>
+          <w:rFonts w:ascii="Consolas" w:eastAsia="Times New Roman" w:hAnsi="Consolas" w:cs="Times New Roman"/>
+          <w:color w:val="BBBBBB"/>
+          <w:kern w:val="0"/>
+          <w:sz w:val="21"/>
+          <w:szCs w:val="21"/>
+          <w14:ligatures w14:val="none"/>
+        </w:rPr>
+        <w:t xml:space="preserve">        </w:t>
+      </w:r>
+      <w:r>
+        <w:rPr>
+          <w:rFonts w:ascii="Consolas" w:eastAsia="Times New Roman" w:hAnsi="Consolas" w:cs="Times New Roman"/>
+          <w:color w:val="B877DB"/>
+          <w:kern w:val="0"/>
+          <w:sz w:val="21"/>
+          <w:szCs w:val="21"/>
+          <w14:ligatures w14:val="none"/>
+        </w:rPr>
+        <w:t>inner join</w:t>
+      </w:r>
+      <w:r>
+        <w:rPr>
+          <w:rFonts w:ascii="Consolas" w:eastAsia="Times New Roman" w:hAnsi="Consolas" w:cs="Times New Roman"/>
+          <w:color w:val="BBBBBB"/>
+          <w:kern w:val="0"/>
+          <w:sz w:val="21"/>
+          <w:szCs w:val="21"/>
+          <w14:ligatures w14:val="none"/>
+        </w:rPr>
+        <w:t xml:space="preserve"> appointments app</w:t>
+      </w:r>
+    </w:p>
+    <w:p>
+      <w:pPr>
+        <w:pStyle w:val="ListParagraph"/>
+        <w:numPr>
+          <w:ilvl w:val="0"/>
+          <w:numId w:val="16"/>
+        </w:numPr>
+        <w:shd w:val="clear" w:color="auto" w:fill="1C1E26"/>
+        <w:spacing w:after="0" w:line="285" w:lineRule="atLeast"/>
+        <w:rPr>
+          <w:rFonts w:ascii="Consolas" w:eastAsia="Times New Roman" w:hAnsi="Consolas" w:cs="Times New Roman"/>
+          <w:color w:val="BBBBBB"/>
+          <w:kern w:val="0"/>
+          <w:sz w:val="21"/>
+          <w:szCs w:val="21"/>
+          <w14:ligatures w14:val="none"/>
+        </w:rPr>
+      </w:pPr>
+      <w:r>
+        <w:rPr>
+          <w:rFonts w:ascii="Consolas" w:eastAsia="Times New Roman" w:hAnsi="Consolas" w:cs="Times New Roman"/>
+          <w:color w:val="BBBBBB"/>
+          <w:kern w:val="0"/>
+          <w:sz w:val="21"/>
+          <w:szCs w:val="21"/>
+          <w14:ligatures w14:val="none"/>
+        </w:rPr>
+        <w:t xml:space="preserve">            </w:t>
+      </w:r>
+      <w:r>
+        <w:rPr>
+          <w:rFonts w:ascii="Consolas" w:eastAsia="Times New Roman" w:hAnsi="Consolas" w:cs="Times New Roman"/>
+          <w:color w:val="B877DB"/>
+          <w:kern w:val="0"/>
+          <w:sz w:val="21"/>
+          <w:szCs w:val="21"/>
+          <w14:ligatures w14:val="none"/>
+        </w:rPr>
+        <w:t>on</w:t>
+      </w:r>
+      <w:r>
+        <w:rPr>
+          <w:rFonts w:ascii="Consolas" w:eastAsia="Times New Roman" w:hAnsi="Consolas" w:cs="Times New Roman"/>
+          <w:color w:val="BBBBBB"/>
+          <w:kern w:val="0"/>
+          <w:sz w:val="21"/>
+          <w:szCs w:val="21"/>
+          <w14:ligatures w14:val="none"/>
+        </w:rPr>
+        <w:t xml:space="preserve"> </w:t>
+      </w:r>
+      <w:proofErr w:type="spellStart"/>
+      <w:proofErr w:type="gramStart"/>
+      <w:r>
+        <w:rPr>
+          <w:rFonts w:ascii="Consolas" w:eastAsia="Times New Roman" w:hAnsi="Consolas" w:cs="Times New Roman"/>
+          <w:color w:val="F09483"/>
+          <w:kern w:val="0"/>
+          <w:sz w:val="21"/>
+          <w:szCs w:val="21"/>
+          <w14:ligatures w14:val="none"/>
+        </w:rPr>
+        <w:t>prov</w:t>
+      </w:r>
+      <w:r>
+        <w:rPr>
+          <w:rFonts w:ascii="Consolas" w:eastAsia="Times New Roman" w:hAnsi="Consolas" w:cs="Times New Roman"/>
+          <w:color w:val="BBBBBB"/>
+          <w:kern w:val="0"/>
+          <w:sz w:val="21"/>
+          <w:szCs w:val="21"/>
+          <w14:ligatures w14:val="none"/>
+        </w:rPr>
+        <w:t>.</w:t>
+      </w:r>
+      <w:r>
+        <w:rPr>
+          <w:rFonts w:ascii="Consolas" w:eastAsia="Times New Roman" w:hAnsi="Consolas" w:cs="Times New Roman"/>
+          <w:color w:val="F09483"/>
+          <w:kern w:val="0"/>
+          <w:sz w:val="21"/>
+          <w:szCs w:val="21"/>
+          <w14:ligatures w14:val="none"/>
+        </w:rPr>
+        <w:t>provider</w:t>
+      </w:r>
+      <w:proofErr w:type="gramEnd"/>
+      <w:r>
+        <w:rPr>
+          <w:rFonts w:ascii="Consolas" w:eastAsia="Times New Roman" w:hAnsi="Consolas" w:cs="Times New Roman"/>
+          <w:color w:val="F09483"/>
+          <w:kern w:val="0"/>
+          <w:sz w:val="21"/>
+          <w:szCs w:val="21"/>
+          <w14:ligatures w14:val="none"/>
+        </w:rPr>
+        <w:t>_id</w:t>
+      </w:r>
+      <w:proofErr w:type="spellEnd"/>
+      <w:r>
+        <w:rPr>
+          <w:rFonts w:ascii="Consolas" w:eastAsia="Times New Roman" w:hAnsi="Consolas" w:cs="Times New Roman"/>
+          <w:color w:val="BBBBBB"/>
+          <w:kern w:val="0"/>
+          <w:sz w:val="21"/>
+          <w:szCs w:val="21"/>
+          <w14:ligatures w14:val="none"/>
+        </w:rPr>
+        <w:t>=</w:t>
+      </w:r>
+      <w:proofErr w:type="spellStart"/>
+      <w:proofErr w:type="gramStart"/>
+      <w:r>
+        <w:rPr>
+          <w:rFonts w:ascii="Consolas" w:eastAsia="Times New Roman" w:hAnsi="Consolas" w:cs="Times New Roman"/>
+          <w:color w:val="F09483"/>
+          <w:kern w:val="0"/>
+          <w:sz w:val="21"/>
+          <w:szCs w:val="21"/>
+          <w14:ligatures w14:val="none"/>
+        </w:rPr>
+        <w:t>app</w:t>
+      </w:r>
+      <w:r>
+        <w:rPr>
+          <w:rFonts w:ascii="Consolas" w:eastAsia="Times New Roman" w:hAnsi="Consolas" w:cs="Times New Roman"/>
+          <w:color w:val="BBBBBB"/>
+          <w:kern w:val="0"/>
+          <w:sz w:val="21"/>
+          <w:szCs w:val="21"/>
+          <w14:ligatures w14:val="none"/>
+        </w:rPr>
+        <w:t>.</w:t>
+      </w:r>
+      <w:r>
+        <w:rPr>
+          <w:rFonts w:ascii="Consolas" w:eastAsia="Times New Roman" w:hAnsi="Consolas" w:cs="Times New Roman"/>
+          <w:color w:val="F09483"/>
+          <w:kern w:val="0"/>
+          <w:sz w:val="21"/>
+          <w:szCs w:val="21"/>
+          <w14:ligatures w14:val="none"/>
+        </w:rPr>
+        <w:t>provider</w:t>
+      </w:r>
+      <w:proofErr w:type="gramEnd"/>
+      <w:r>
+        <w:rPr>
+          <w:rFonts w:ascii="Consolas" w:eastAsia="Times New Roman" w:hAnsi="Consolas" w:cs="Times New Roman"/>
+          <w:color w:val="F09483"/>
+          <w:kern w:val="0"/>
+          <w:sz w:val="21"/>
+          <w:szCs w:val="21"/>
+          <w14:ligatures w14:val="none"/>
+        </w:rPr>
+        <w:t>_id</w:t>
+      </w:r>
+      <w:proofErr w:type="spellEnd"/>
+    </w:p>
+    <w:p>
+      <w:pPr>
+        <w:pStyle w:val="ListParagraph"/>
+        <w:numPr>
+          <w:ilvl w:val="0"/>
+          <w:numId w:val="16"/>
+        </w:numPr>
+        <w:shd w:val="clear" w:color="auto" w:fill="1C1E26"/>
+        <w:spacing w:after="0" w:line="285" w:lineRule="atLeast"/>
+        <w:rPr>
+          <w:rFonts w:ascii="Consolas" w:eastAsia="Times New Roman" w:hAnsi="Consolas" w:cs="Times New Roman"/>
+          <w:color w:val="BBBBBB"/>
+          <w:kern w:val="0"/>
+          <w:sz w:val="21"/>
+          <w:szCs w:val="21"/>
+          <w14:ligatures w14:val="none"/>
+        </w:rPr>
+      </w:pPr>
+    </w:p>
+    <w:p>
+      <w:pPr>
+        <w:pStyle w:val="ListParagraph"/>
+        <w:numPr>
+          <w:ilvl w:val="0"/>
+          <w:numId w:val="16"/>
+        </w:numPr>
+        <w:shd w:val="clear" w:color="auto" w:fill="1C1E26"/>
+        <w:spacing w:after="0" w:line="285" w:lineRule="atLeast"/>
+        <w:rPr>
+          <w:rFonts w:ascii="Consolas" w:eastAsia="Times New Roman" w:hAnsi="Consolas" w:cs="Times New Roman"/>
+          <w:color w:val="BBBBBB"/>
+          <w:kern w:val="0"/>
+          <w:sz w:val="21"/>
+          <w:szCs w:val="21"/>
+          <w14:ligatures w14:val="none"/>
+        </w:rPr>
+      </w:pPr>
+      <w:r>
+        <w:rPr>
+          <w:rFonts w:ascii="Consolas" w:eastAsia="Times New Roman" w:hAnsi="Consolas" w:cs="Times New Roman"/>
+          <w:color w:val="B877DB"/>
+          <w:kern w:val="0"/>
+          <w:sz w:val="21"/>
+          <w:szCs w:val="21"/>
+          <w14:ligatures w14:val="none"/>
+        </w:rPr>
+        <w:t>Group By</w:t>
+      </w:r>
+      <w:r>
+        <w:rPr>
+          <w:rFonts w:ascii="Consolas" w:eastAsia="Times New Roman" w:hAnsi="Consolas" w:cs="Times New Roman"/>
+          <w:color w:val="BBBBBB"/>
+          <w:kern w:val="0"/>
+          <w:sz w:val="21"/>
+          <w:szCs w:val="21"/>
+          <w14:ligatures w14:val="none"/>
+        </w:rPr>
+        <w:t xml:space="preserve">     </w:t>
+      </w:r>
+    </w:p>
+    <w:p>
+      <w:pPr>
+        <w:pStyle w:val="ListParagraph"/>
+        <w:numPr>
+          <w:ilvl w:val="0"/>
+          <w:numId w:val="16"/>
+        </w:numPr>
+        <w:shd w:val="clear" w:color="auto" w:fill="1C1E26"/>
+        <w:spacing w:after="0" w:line="285" w:lineRule="atLeast"/>
+        <w:rPr>
+          <w:rFonts w:ascii="Consolas" w:eastAsia="Times New Roman" w:hAnsi="Consolas" w:cs="Times New Roman"/>
+          <w:color w:val="BBBBBB"/>
+          <w:kern w:val="0"/>
+          <w:sz w:val="21"/>
+          <w:szCs w:val="21"/>
+          <w14:ligatures w14:val="none"/>
+        </w:rPr>
+      </w:pPr>
+      <w:r>
+        <w:rPr>
+          <w:rFonts w:ascii="Consolas" w:eastAsia="Times New Roman" w:hAnsi="Consolas" w:cs="Times New Roman"/>
+          <w:color w:val="BBBBBB"/>
+          <w:kern w:val="0"/>
+          <w:sz w:val="21"/>
+          <w:szCs w:val="21"/>
+          <w14:ligatures w14:val="none"/>
+        </w:rPr>
+        <w:t xml:space="preserve">    </w:t>
+      </w:r>
+      <w:proofErr w:type="spellStart"/>
+      <w:proofErr w:type="gramStart"/>
+      <w:r>
+        <w:rPr>
+          <w:rFonts w:ascii="Consolas" w:eastAsia="Times New Roman" w:hAnsi="Consolas" w:cs="Times New Roman"/>
+          <w:color w:val="F09483"/>
+          <w:kern w:val="0"/>
+          <w:sz w:val="21"/>
+          <w:szCs w:val="21"/>
+          <w14:ligatures w14:val="none"/>
+        </w:rPr>
+        <w:t>prov</w:t>
+      </w:r>
+      <w:r>
+        <w:rPr>
+          <w:rFonts w:ascii="Consolas" w:eastAsia="Times New Roman" w:hAnsi="Consolas" w:cs="Times New Roman"/>
+          <w:color w:val="BBBBBB"/>
+          <w:kern w:val="0"/>
+          <w:sz w:val="21"/>
+          <w:szCs w:val="21"/>
+          <w14:ligatures w14:val="none"/>
+        </w:rPr>
+        <w:t>.</w:t>
+      </w:r>
+      <w:r>
+        <w:rPr>
+          <w:rFonts w:ascii="Consolas" w:eastAsia="Times New Roman" w:hAnsi="Consolas" w:cs="Times New Roman"/>
+          <w:color w:val="F09483"/>
+          <w:kern w:val="0"/>
+          <w:sz w:val="21"/>
+          <w:szCs w:val="21"/>
+          <w14:ligatures w14:val="none"/>
+        </w:rPr>
+        <w:t>years</w:t>
+      </w:r>
+      <w:proofErr w:type="gramEnd"/>
+      <w:r>
+        <w:rPr>
+          <w:rFonts w:ascii="Consolas" w:eastAsia="Times New Roman" w:hAnsi="Consolas" w:cs="Times New Roman"/>
+          <w:color w:val="F09483"/>
+          <w:kern w:val="0"/>
+          <w:sz w:val="21"/>
+          <w:szCs w:val="21"/>
+          <w14:ligatures w14:val="none"/>
+        </w:rPr>
+        <w:t>_experience</w:t>
+      </w:r>
+      <w:proofErr w:type="spellEnd"/>
+    </w:p>
+    <w:p>
+      <w:pPr>
+        <w:pStyle w:val="ListParagraph"/>
+        <w:numPr>
+          <w:ilvl w:val="0"/>
+          <w:numId w:val="16"/>
+        </w:numPr>
+        <w:shd w:val="clear" w:color="auto" w:fill="1C1E26"/>
+        <w:spacing w:after="0" w:line="285" w:lineRule="atLeast"/>
+        <w:rPr>
+          <w:rFonts w:ascii="Consolas" w:eastAsia="Times New Roman" w:hAnsi="Consolas" w:cs="Times New Roman"/>
+          <w:color w:val="BBBBBB"/>
+          <w:kern w:val="0"/>
+          <w:sz w:val="21"/>
+          <w:szCs w:val="21"/>
+          <w14:ligatures w14:val="none"/>
+        </w:rPr>
+      </w:pPr>
+    </w:p>
+    <w:p>
+      <w:pPr>
+        <w:pStyle w:val="ListParagraph"/>
+        <w:numPr>
+          <w:ilvl w:val="0"/>
+          <w:numId w:val="16"/>
+        </w:numPr>
+        <w:shd w:val="clear" w:color="auto" w:fill="1C1E26"/>
+        <w:spacing w:after="0" w:line="285" w:lineRule="atLeast"/>
+        <w:rPr>
+          <w:rFonts w:ascii="Consolas" w:eastAsia="Times New Roman" w:hAnsi="Consolas" w:cs="Times New Roman"/>
+          <w:color w:val="BBBBBB"/>
+          <w:kern w:val="0"/>
+          <w:sz w:val="21"/>
+          <w:szCs w:val="21"/>
+          <w14:ligatures w14:val="none"/>
+        </w:rPr>
+      </w:pPr>
+      <w:r>
+        <w:rPr>
+          <w:rFonts w:ascii="Consolas" w:eastAsia="Times New Roman" w:hAnsi="Consolas" w:cs="Times New Roman"/>
+          <w:color w:val="B877DB"/>
+          <w:kern w:val="0"/>
+          <w:sz w:val="21"/>
+          <w:szCs w:val="21"/>
+          <w14:ligatures w14:val="none"/>
+        </w:rPr>
+        <w:t>Order By</w:t>
+      </w:r>
+    </w:p>
+    <w:p>
+      <w:pPr>
+        <w:pStyle w:val="ListParagraph"/>
+        <w:numPr>
+          <w:ilvl w:val="0"/>
+          <w:numId w:val="16"/>
+        </w:numPr>
+        <w:shd w:val="clear" w:color="auto" w:fill="1C1E26"/>
+        <w:spacing w:after="0" w:line="285" w:lineRule="atLeast"/>
+        <w:rPr>
+          <w:rFonts w:ascii="Consolas" w:eastAsia="Times New Roman" w:hAnsi="Consolas" w:cs="Times New Roman"/>
+          <w:color w:val="BBBBBB"/>
+          <w:kern w:val="0"/>
+          <w:sz w:val="21"/>
+          <w:szCs w:val="21"/>
+          <w14:ligatures w14:val="none"/>
+        </w:rPr>
+      </w:pPr>
+      <w:r>
+        <w:rPr>
+          <w:rFonts w:ascii="Consolas" w:eastAsia="Times New Roman" w:hAnsi="Consolas" w:cs="Times New Roman"/>
+          <w:color w:val="BBBBBB"/>
+          <w:kern w:val="0"/>
+          <w:sz w:val="21"/>
+          <w:szCs w:val="21"/>
+          <w14:ligatures w14:val="none"/>
+        </w:rPr>
+        <w:t xml:space="preserve">    </w:t>
+      </w:r>
+      <w:proofErr w:type="spellStart"/>
+      <w:r>
+        <w:rPr>
+          <w:rFonts w:ascii="Consolas" w:eastAsia="Times New Roman" w:hAnsi="Consolas" w:cs="Times New Roman"/>
+          <w:color w:val="BBBBBB"/>
+          <w:kern w:val="0"/>
+          <w:sz w:val="21"/>
+          <w:szCs w:val="21"/>
+          <w14:ligatures w14:val="none"/>
+        </w:rPr>
+        <w:t>avg_satisf_score</w:t>
+      </w:r>
+      <w:proofErr w:type="spellEnd"/>
+      <w:r>
+        <w:rPr>
+          <w:rFonts w:ascii="Consolas" w:eastAsia="Times New Roman" w:hAnsi="Consolas" w:cs="Times New Roman"/>
+          <w:color w:val="BBBBBB"/>
+          <w:kern w:val="0"/>
+          <w:sz w:val="21"/>
+          <w:szCs w:val="21"/>
+          <w14:ligatures w14:val="none"/>
+        </w:rPr>
+        <w:t xml:space="preserve"> </w:t>
+      </w:r>
+      <w:r>
+        <w:rPr>
+          <w:rFonts w:ascii="Consolas" w:eastAsia="Times New Roman" w:hAnsi="Consolas" w:cs="Times New Roman"/>
+          <w:color w:val="B877DB"/>
+          <w:kern w:val="0"/>
+          <w:sz w:val="21"/>
+          <w:szCs w:val="21"/>
+          <w14:ligatures w14:val="none"/>
+        </w:rPr>
+        <w:t>desc</w:t>
+      </w:r>
+    </w:p>
+    <w:p>
+      <w:pPr>
+        <w:pStyle w:val="ListParagraph"/>
+        <w:numPr>
+          <w:ilvl w:val="0"/>
+          <w:numId w:val="16"/>
+        </w:numPr>
+        <w:shd w:val="clear" w:color="auto" w:fill="1C1E26"/>
+        <w:spacing w:after="0" w:line="285" w:lineRule="atLeast"/>
+        <w:rPr>
+          <w:rFonts w:ascii="Consolas" w:eastAsia="Times New Roman" w:hAnsi="Consolas" w:cs="Times New Roman"/>
+          <w:color w:val="BBBBBB"/>
+          <w:kern w:val="0"/>
+          <w:sz w:val="21"/>
+          <w:szCs w:val="21"/>
+          <w14:ligatures w14:val="none"/>
+        </w:rPr>
+      </w:pPr>
+      <w:r>
+        <w:rPr>
+          <w:rFonts w:ascii="Consolas" w:eastAsia="Times New Roman" w:hAnsi="Consolas" w:cs="Times New Roman"/>
+          <w:color w:val="BBBBBB"/>
+          <w:kern w:val="0"/>
+          <w:sz w:val="21"/>
+          <w:szCs w:val="21"/>
+          <w14:ligatures w14:val="none"/>
+        </w:rPr>
+        <w:t xml:space="preserve">    </w:t>
+      </w:r>
+      <w:r>
+        <w:rPr>
+          <w:rFonts w:ascii="Consolas" w:eastAsia="Times New Roman" w:hAnsi="Consolas" w:cs="Times New Roman"/>
+          <w:i/>
+          <w:iCs/>
+          <w:color w:val="BBBBBB"/>
+          <w:kern w:val="0"/>
+          <w:sz w:val="21"/>
+          <w:szCs w:val="21"/>
+          <w14:ligatures w14:val="none"/>
+        </w:rPr>
+        <w:t>--</w:t>
+      </w:r>
+      <w:proofErr w:type="spellStart"/>
+      <w:r>
+        <w:rPr>
+          <w:rFonts w:ascii="Consolas" w:eastAsia="Times New Roman" w:hAnsi="Consolas" w:cs="Times New Roman"/>
+          <w:i/>
+          <w:iCs/>
+          <w:color w:val="BBBBBB"/>
+          <w:kern w:val="0"/>
+          <w:sz w:val="21"/>
+          <w:szCs w:val="21"/>
+          <w14:ligatures w14:val="none"/>
+        </w:rPr>
+        <w:t>years_experience</w:t>
+      </w:r>
+      <w:proofErr w:type="spellEnd"/>
+    </w:p>
+    <w:p>
+      <w:pPr>
+        <w:pStyle w:val="ListParagraph"/>
+        <w:numPr>
+          <w:ilvl w:val="0"/>
+          <w:numId w:val="16"/>
+        </w:numPr>
+        <w:shd w:val="clear" w:color="auto" w:fill="1C1E26"/>
+        <w:spacing w:after="0" w:line="285" w:lineRule="atLeast"/>
+        <w:rPr>
+          <w:rFonts w:ascii="Consolas" w:eastAsia="Times New Roman" w:hAnsi="Consolas" w:cs="Times New Roman"/>
+          <w:color w:val="BBBBBB"/>
+          <w:kern w:val="0"/>
+          <w:sz w:val="21"/>
+          <w:szCs w:val="21"/>
+          <w14:ligatures w14:val="none"/>
+        </w:rPr>
+      </w:pPr>
+      <w:r>
+        <w:rPr>
+          <w:rFonts w:ascii="Consolas" w:eastAsia="Times New Roman" w:hAnsi="Consolas" w:cs="Times New Roman"/>
+          <w:color w:val="BBBBBB"/>
+          <w:kern w:val="0"/>
+          <w:sz w:val="21"/>
+          <w:szCs w:val="21"/>
+          <w14:ligatures w14:val="none"/>
+        </w:rPr>
         <w:t>;</w:t>
       </w:r>
     </w:p>
@@ -3033,7 +3351,15 @@
       </w:r>
       <w:proofErr w:type="spellEnd"/>
       <w:r>
-        <w:t xml:space="preserve"> in avg patient satisfaction scores suggest that appointment types alone, do not greatly impact patient satisfaction scores. </w:t>
+        <w:t xml:space="preserve"> in avg patient satisfaction scores suggest that appointment types </w:t>
+      </w:r>
+      <w:proofErr w:type="gramStart"/>
+      <w:r>
+        <w:t>alone,</w:t>
+      </w:r>
+      <w:proofErr w:type="gramEnd"/>
+      <w:r>
+        <w:t xml:space="preserve"> do not greatly impact patient satisfaction scores. </w:t>
       </w:r>
     </w:p>
     <w:p/>
@@ -3152,8 +3478,13 @@
         <w:t xml:space="preserve">  </w:t>
       </w:r>
       <w:proofErr w:type="spellStart"/>
-      <w:r>
-        <w:t>app.appointment_type</w:t>
+      <w:proofErr w:type="gramStart"/>
+      <w:r>
+        <w:t>app.appointment</w:t>
+      </w:r>
+      <w:proofErr w:type="gramEnd"/>
+      <w:r>
+        <w:t>_type</w:t>
       </w:r>
       <w:proofErr w:type="spellEnd"/>
     </w:p>
@@ -3217,7 +3548,15 @@
     <w:p>
       <w:r>
         <w:tab/>
-        <w:t xml:space="preserve">, count(*) </w:t>
+        <w:t xml:space="preserve">, </w:t>
+      </w:r>
+      <w:proofErr w:type="gramStart"/>
+      <w:r>
+        <w:t>count(</w:t>
+      </w:r>
+      <w:proofErr w:type="gramEnd"/>
+      <w:r>
+        <w:t xml:space="preserve">*) </w:t>
       </w:r>
       <w:proofErr w:type="spellStart"/>
       <w:r>
@@ -3257,16 +3596,26 @@
         <w:t xml:space="preserve">on </w:t>
       </w:r>
       <w:proofErr w:type="spellStart"/>
-      <w:r>
-        <w:t>pro.provider_id</w:t>
+      <w:proofErr w:type="gramStart"/>
+      <w:r>
+        <w:t>pro.provider</w:t>
+      </w:r>
+      <w:proofErr w:type="gramEnd"/>
+      <w:r>
+        <w:t>_id</w:t>
       </w:r>
       <w:proofErr w:type="spellEnd"/>
       <w:r>
         <w:t>=</w:t>
       </w:r>
       <w:proofErr w:type="spellStart"/>
-      <w:r>
-        <w:t>app.provider_id</w:t>
+      <w:proofErr w:type="gramStart"/>
+      <w:r>
+        <w:t>app.provider</w:t>
+      </w:r>
+      <w:proofErr w:type="gramEnd"/>
+      <w:r>
+        <w:t>_id</w:t>
       </w:r>
       <w:proofErr w:type="spellEnd"/>
     </w:p>
@@ -3281,8 +3630,13 @@
         <w:t xml:space="preserve">    </w:t>
       </w:r>
       <w:proofErr w:type="spellStart"/>
-      <w:r>
-        <w:t>app.appointment_type</w:t>
+      <w:proofErr w:type="gramStart"/>
+      <w:r>
+        <w:t>app.appointment</w:t>
+      </w:r>
+      <w:proofErr w:type="gramEnd"/>
+      <w:r>
+        <w:t>_type</w:t>
       </w:r>
       <w:proofErr w:type="spellEnd"/>
     </w:p>
@@ -3414,7 +3768,15 @@
     </w:p>
     <w:p>
       <w:r>
-        <w:t>To uncover which demographic groups generate the highest no-show rates.</w:t>
+        <w:t xml:space="preserve">To </w:t>
+      </w:r>
+      <w:proofErr w:type="gramStart"/>
+      <w:r>
+        <w:t>uncover</w:t>
+      </w:r>
+      <w:proofErr w:type="gramEnd"/>
+      <w:r>
+        <w:t xml:space="preserve"> which demographic groups generate the highest no-show rates.</w:t>
       </w:r>
     </w:p>
     <w:p/>
@@ -3481,7 +3843,23 @@
       </w:r>
       <w:proofErr w:type="spellEnd"/>
       <w:r>
-        <w:t xml:space="preserve"> of 69 and 51. Therefore, these have the highest no-show rates of ~10%(9.5%) and 7%(7.06%).</w:t>
+        <w:t xml:space="preserve"> of 69 and 51. Therefore, these have the highest no-show rates of ~10</w:t>
+      </w:r>
+      <w:proofErr w:type="gramStart"/>
+      <w:r>
+        <w:t>%(</w:t>
+      </w:r>
+      <w:proofErr w:type="gramEnd"/>
+      <w:r>
+        <w:t>9.5%) and 7</w:t>
+      </w:r>
+      <w:proofErr w:type="gramStart"/>
+      <w:r>
+        <w:t>%(</w:t>
+      </w:r>
+      <w:proofErr w:type="gramEnd"/>
+      <w:r>
+        <w:t>7.06%).</w:t>
       </w:r>
     </w:p>
     <w:p>
@@ -3617,7 +3995,15 @@
     <w:p>
       <w:r>
         <w:tab/>
-        <w:t xml:space="preserve">  Count(*) </w:t>
+        <w:t xml:space="preserve">  </w:t>
+      </w:r>
+      <w:proofErr w:type="gramStart"/>
+      <w:r>
+        <w:t>Count(</w:t>
+      </w:r>
+      <w:proofErr w:type="gramEnd"/>
+      <w:r>
+        <w:t xml:space="preserve">*) </w:t>
       </w:r>
       <w:proofErr w:type="spellStart"/>
       <w:r>
@@ -3631,10 +4017,12 @@
         <w:t xml:space="preserve">, </w:t>
       </w:r>
       <w:proofErr w:type="spellStart"/>
+      <w:proofErr w:type="gramStart"/>
       <w:r>
         <w:t>pts.gender</w:t>
       </w:r>
       <w:proofErr w:type="spellEnd"/>
+      <w:proofErr w:type="gramEnd"/>
     </w:p>
     <w:p>
       <w:r>
@@ -3643,10 +4031,12 @@
         <w:t xml:space="preserve">, </w:t>
       </w:r>
       <w:proofErr w:type="spellStart"/>
+      <w:proofErr w:type="gramStart"/>
       <w:r>
         <w:t>pts.city</w:t>
       </w:r>
       <w:proofErr w:type="spellEnd"/>
+      <w:proofErr w:type="gramEnd"/>
     </w:p>
     <w:p>
       <w:r>
@@ -3654,8 +4044,13 @@
         <w:t xml:space="preserve">, </w:t>
       </w:r>
       <w:proofErr w:type="spellStart"/>
-      <w:r>
-        <w:t>app.appointment_status</w:t>
+      <w:proofErr w:type="gramStart"/>
+      <w:r>
+        <w:t>app.appointment</w:t>
+      </w:r>
+      <w:proofErr w:type="gramEnd"/>
+      <w:r>
+        <w:t>_status</w:t>
       </w:r>
       <w:proofErr w:type="spellEnd"/>
     </w:p>
@@ -3804,7 +4199,15 @@
       </w:r>
       <w:r>
         <w:tab/>
-        <w:t>inner join patients pts</w:t>
+        <w:t xml:space="preserve">inner join </w:t>
+      </w:r>
+      <w:proofErr w:type="gramStart"/>
+      <w:r>
+        <w:t>patients</w:t>
+      </w:r>
+      <w:proofErr w:type="gramEnd"/>
+      <w:r>
+        <w:t xml:space="preserve"> pts</w:t>
       </w:r>
     </w:p>
     <w:p>
@@ -3819,31 +4222,48 @@
         <w:t xml:space="preserve">on </w:t>
       </w:r>
       <w:proofErr w:type="spellStart"/>
-      <w:r>
-        <w:t>app.patient_id</w:t>
+      <w:proofErr w:type="gramStart"/>
+      <w:r>
+        <w:t>app.patient</w:t>
+      </w:r>
+      <w:proofErr w:type="gramEnd"/>
+      <w:r>
+        <w:t>_id</w:t>
       </w:r>
       <w:proofErr w:type="spellEnd"/>
       <w:r>
         <w:t>=</w:t>
       </w:r>
       <w:proofErr w:type="spellStart"/>
-      <w:r>
-        <w:t>pts.patient_id</w:t>
+      <w:proofErr w:type="gramStart"/>
+      <w:r>
+        <w:t>pts.patient</w:t>
+      </w:r>
+      <w:proofErr w:type="gramEnd"/>
+      <w:r>
+        <w:t>_id</w:t>
       </w:r>
       <w:proofErr w:type="spellEnd"/>
     </w:p>
     <w:p>
+      <w:proofErr w:type="gramStart"/>
       <w:r>
         <w:t>Where</w:t>
       </w:r>
+      <w:proofErr w:type="gramEnd"/>
     </w:p>
     <w:p>
       <w:r>
         <w:tab/>
       </w:r>
       <w:proofErr w:type="spellStart"/>
-      <w:r>
-        <w:t>app.appointment_status</w:t>
+      <w:proofErr w:type="gramStart"/>
+      <w:r>
+        <w:t>app.appointment</w:t>
+      </w:r>
+      <w:proofErr w:type="gramEnd"/>
+      <w:r>
+        <w:t>_status</w:t>
       </w:r>
       <w:proofErr w:type="spellEnd"/>
       <w:r>
@@ -3861,8 +4281,13 @@
         <w:t xml:space="preserve">  </w:t>
       </w:r>
       <w:proofErr w:type="spellStart"/>
-      <w:r>
-        <w:t>app.appointment_status</w:t>
+      <w:proofErr w:type="gramStart"/>
+      <w:r>
+        <w:t>app.appointment</w:t>
+      </w:r>
+      <w:proofErr w:type="gramEnd"/>
+      <w:r>
+        <w:t>_status</w:t>
       </w:r>
       <w:proofErr w:type="spellEnd"/>
     </w:p>
@@ -3872,10 +4297,12 @@
         <w:t xml:space="preserve">, </w:t>
       </w:r>
       <w:proofErr w:type="spellStart"/>
+      <w:proofErr w:type="gramStart"/>
       <w:r>
         <w:t>pts.gender</w:t>
       </w:r>
       <w:proofErr w:type="spellEnd"/>
+      <w:proofErr w:type="gramEnd"/>
     </w:p>
     <w:p>
       <w:r>
@@ -3894,10 +4321,12 @@
         <w:t xml:space="preserve">, </w:t>
       </w:r>
       <w:proofErr w:type="spellStart"/>
+      <w:proofErr w:type="gramStart"/>
       <w:r>
         <w:t>pts.city</w:t>
       </w:r>
       <w:proofErr w:type="spellEnd"/>
+      <w:proofErr w:type="gramEnd"/>
     </w:p>
     <w:p>
       <w:r>
@@ -3985,7 +4414,15 @@
       </w:r>
       <w:r>
         <w:tab/>
-        <w:t xml:space="preserve">  Count(*) </w:t>
+        <w:t xml:space="preserve">  </w:t>
+      </w:r>
+      <w:proofErr w:type="gramStart"/>
+      <w:r>
+        <w:t>Count(</w:t>
+      </w:r>
+      <w:proofErr w:type="gramEnd"/>
+      <w:r>
+        <w:t xml:space="preserve">*) </w:t>
       </w:r>
       <w:proofErr w:type="spellStart"/>
       <w:r>
@@ -4005,10 +4442,12 @@
         <w:t xml:space="preserve">, </w:t>
       </w:r>
       <w:proofErr w:type="spellStart"/>
+      <w:proofErr w:type="gramStart"/>
       <w:r>
         <w:t>pts.gender</w:t>
       </w:r>
       <w:proofErr w:type="spellEnd"/>
+      <w:proofErr w:type="gramEnd"/>
     </w:p>
     <w:p>
       <w:r>
@@ -4022,10 +4461,12 @@
         <w:t xml:space="preserve">, </w:t>
       </w:r>
       <w:proofErr w:type="spellStart"/>
+      <w:proofErr w:type="gramStart"/>
       <w:r>
         <w:t>pts.city</w:t>
       </w:r>
       <w:proofErr w:type="spellEnd"/>
+      <w:proofErr w:type="gramEnd"/>
     </w:p>
     <w:p>
       <w:r>
@@ -4039,8 +4480,13 @@
         <w:t xml:space="preserve">, </w:t>
       </w:r>
       <w:proofErr w:type="spellStart"/>
-      <w:r>
-        <w:t>app.appointment_status</w:t>
+      <w:proofErr w:type="gramStart"/>
+      <w:r>
+        <w:t>app.appointment</w:t>
+      </w:r>
+      <w:proofErr w:type="gramEnd"/>
+      <w:r>
+        <w:t>_status</w:t>
       </w:r>
       <w:proofErr w:type="spellEnd"/>
     </w:p>
@@ -4247,7 +4693,15 @@
       </w:r>
       <w:r>
         <w:tab/>
-        <w:t>inner join patients pts</w:t>
+        <w:t xml:space="preserve">inner join </w:t>
+      </w:r>
+      <w:proofErr w:type="gramStart"/>
+      <w:r>
+        <w:t>patients</w:t>
+      </w:r>
+      <w:proofErr w:type="gramEnd"/>
+      <w:r>
+        <w:t xml:space="preserve"> pts</w:t>
       </w:r>
     </w:p>
     <w:p>
@@ -4268,16 +4722,26 @@
         <w:t xml:space="preserve">on </w:t>
       </w:r>
       <w:proofErr w:type="spellStart"/>
-      <w:r>
-        <w:t>app.patient_id</w:t>
+      <w:proofErr w:type="gramStart"/>
+      <w:r>
+        <w:t>app.patient</w:t>
+      </w:r>
+      <w:proofErr w:type="gramEnd"/>
+      <w:r>
+        <w:t>_id</w:t>
       </w:r>
       <w:proofErr w:type="spellEnd"/>
       <w:r>
         <w:t>=</w:t>
       </w:r>
       <w:proofErr w:type="spellStart"/>
-      <w:r>
-        <w:t>pts.patient_id</w:t>
+      <w:proofErr w:type="gramStart"/>
+      <w:r>
+        <w:t>pts.patient</w:t>
+      </w:r>
+      <w:proofErr w:type="gramEnd"/>
+      <w:r>
+        <w:t>_id</w:t>
       </w:r>
       <w:proofErr w:type="spellEnd"/>
     </w:p>
@@ -4287,8 +4751,12 @@
       </w:r>
       <w:r>
         <w:tab/>
+      </w:r>
+      <w:proofErr w:type="gramStart"/>
+      <w:r>
         <w:t>Where</w:t>
       </w:r>
+      <w:proofErr w:type="gramEnd"/>
     </w:p>
     <w:p>
       <w:r>
@@ -4301,8 +4769,13 @@
         <w:tab/>
       </w:r>
       <w:proofErr w:type="spellStart"/>
-      <w:r>
-        <w:t>app.appointment_status</w:t>
+      <w:proofErr w:type="gramStart"/>
+      <w:r>
+        <w:t>app.appointment</w:t>
+      </w:r>
+      <w:proofErr w:type="gramEnd"/>
+      <w:r>
+        <w:t>_status</w:t>
       </w:r>
       <w:proofErr w:type="spellEnd"/>
       <w:r>
@@ -4330,8 +4803,13 @@
         <w:t xml:space="preserve">  </w:t>
       </w:r>
       <w:proofErr w:type="spellStart"/>
-      <w:r>
-        <w:t>app.appointment_status</w:t>
+      <w:proofErr w:type="gramStart"/>
+      <w:r>
+        <w:t>app.appointment</w:t>
+      </w:r>
+      <w:proofErr w:type="gramEnd"/>
+      <w:r>
+        <w:t>_status</w:t>
       </w:r>
       <w:proofErr w:type="spellEnd"/>
     </w:p>
@@ -4347,10 +4825,12 @@
         <w:t xml:space="preserve">, </w:t>
       </w:r>
       <w:proofErr w:type="spellStart"/>
+      <w:proofErr w:type="gramStart"/>
       <w:r>
         <w:t>pts.gender</w:t>
       </w:r>
       <w:proofErr w:type="spellEnd"/>
+      <w:proofErr w:type="gramEnd"/>
     </w:p>
     <w:p>
       <w:r>
@@ -4382,10 +4862,12 @@
         <w:t xml:space="preserve">, </w:t>
       </w:r>
       <w:proofErr w:type="spellStart"/>
+      <w:proofErr w:type="gramStart"/>
       <w:r>
         <w:t>pts.city</w:t>
       </w:r>
       <w:proofErr w:type="spellEnd"/>
+      <w:proofErr w:type="gramEnd"/>
     </w:p>
     <w:p>
       <w:r>
@@ -4504,7 +4986,15 @@
       </w:r>
       <w:r>
         <w:tab/>
-        <w:t xml:space="preserve">  Count(*) </w:t>
+        <w:t xml:space="preserve">  </w:t>
+      </w:r>
+      <w:proofErr w:type="gramStart"/>
+      <w:r>
+        <w:t>Count(</w:t>
+      </w:r>
+      <w:proofErr w:type="gramEnd"/>
+      <w:r>
+        <w:t xml:space="preserve">*) </w:t>
       </w:r>
       <w:proofErr w:type="spellStart"/>
       <w:r>
@@ -4524,10 +5014,12 @@
         <w:t xml:space="preserve">, </w:t>
       </w:r>
       <w:proofErr w:type="spellStart"/>
+      <w:proofErr w:type="gramStart"/>
       <w:r>
         <w:t>pts.gender</w:t>
       </w:r>
       <w:proofErr w:type="spellEnd"/>
+      <w:proofErr w:type="gramEnd"/>
     </w:p>
     <w:p>
       <w:r>
@@ -4541,10 +5033,12 @@
         <w:t xml:space="preserve">, </w:t>
       </w:r>
       <w:proofErr w:type="spellStart"/>
+      <w:proofErr w:type="gramStart"/>
       <w:r>
         <w:t>pts.city</w:t>
       </w:r>
       <w:proofErr w:type="spellEnd"/>
+      <w:proofErr w:type="gramEnd"/>
     </w:p>
     <w:p>
       <w:r>
@@ -4558,8 +5052,13 @@
         <w:t xml:space="preserve">, </w:t>
       </w:r>
       <w:proofErr w:type="spellStart"/>
-      <w:r>
-        <w:t>app.appointment_status</w:t>
+      <w:proofErr w:type="gramStart"/>
+      <w:r>
+        <w:t>app.appointment</w:t>
+      </w:r>
+      <w:proofErr w:type="gramEnd"/>
+      <w:r>
+        <w:t>_status</w:t>
       </w:r>
       <w:proofErr w:type="spellEnd"/>
     </w:p>
@@ -4767,7 +5266,15 @@
       </w:r>
       <w:r>
         <w:tab/>
-        <w:t>inner join patients pts</w:t>
+        <w:t xml:space="preserve">inner join </w:t>
+      </w:r>
+      <w:proofErr w:type="gramStart"/>
+      <w:r>
+        <w:t>patients</w:t>
+      </w:r>
+      <w:proofErr w:type="gramEnd"/>
+      <w:r>
+        <w:t xml:space="preserve"> pts</w:t>
       </w:r>
     </w:p>
     <w:p>
@@ -4788,16 +5295,26 @@
         <w:t xml:space="preserve">on </w:t>
       </w:r>
       <w:proofErr w:type="spellStart"/>
-      <w:r>
-        <w:t>app.patient_id</w:t>
+      <w:proofErr w:type="gramStart"/>
+      <w:r>
+        <w:t>app.patient</w:t>
+      </w:r>
+      <w:proofErr w:type="gramEnd"/>
+      <w:r>
+        <w:t>_id</w:t>
       </w:r>
       <w:proofErr w:type="spellEnd"/>
       <w:r>
         <w:t>=</w:t>
       </w:r>
       <w:proofErr w:type="spellStart"/>
-      <w:r>
-        <w:t>pts.patient_id</w:t>
+      <w:proofErr w:type="gramStart"/>
+      <w:r>
+        <w:t>pts.patient</w:t>
+      </w:r>
+      <w:proofErr w:type="gramEnd"/>
+      <w:r>
+        <w:t>_id</w:t>
       </w:r>
       <w:proofErr w:type="spellEnd"/>
     </w:p>
@@ -4807,8 +5324,12 @@
       </w:r>
       <w:r>
         <w:tab/>
+      </w:r>
+      <w:proofErr w:type="gramStart"/>
+      <w:r>
         <w:t>Where</w:t>
       </w:r>
+      <w:proofErr w:type="gramEnd"/>
     </w:p>
     <w:p>
       <w:r>
@@ -4821,8 +5342,13 @@
         <w:tab/>
       </w:r>
       <w:proofErr w:type="spellStart"/>
-      <w:r>
-        <w:t>app.appointment_status</w:t>
+      <w:proofErr w:type="gramStart"/>
+      <w:r>
+        <w:t>app.appointment</w:t>
+      </w:r>
+      <w:proofErr w:type="gramEnd"/>
+      <w:r>
+        <w:t>_status</w:t>
       </w:r>
       <w:proofErr w:type="spellEnd"/>
       <w:r>
@@ -4850,8 +5376,13 @@
         <w:t xml:space="preserve">  </w:t>
       </w:r>
       <w:proofErr w:type="spellStart"/>
-      <w:r>
-        <w:t>app.appointment_status</w:t>
+      <w:proofErr w:type="gramStart"/>
+      <w:r>
+        <w:t>app.appointment</w:t>
+      </w:r>
+      <w:proofErr w:type="gramEnd"/>
+      <w:r>
+        <w:t>_status</w:t>
       </w:r>
       <w:proofErr w:type="spellEnd"/>
     </w:p>
@@ -4867,10 +5398,12 @@
         <w:t xml:space="preserve">, </w:t>
       </w:r>
       <w:proofErr w:type="spellStart"/>
+      <w:proofErr w:type="gramStart"/>
       <w:r>
         <w:t>pts.gender</w:t>
       </w:r>
       <w:proofErr w:type="spellEnd"/>
+      <w:proofErr w:type="gramEnd"/>
     </w:p>
     <w:p>
       <w:r>
@@ -4901,10 +5434,12 @@
         <w:t xml:space="preserve">, </w:t>
       </w:r>
       <w:proofErr w:type="spellStart"/>
+      <w:proofErr w:type="gramStart"/>
       <w:r>
         <w:t>pts.city</w:t>
       </w:r>
       <w:proofErr w:type="spellEnd"/>
+      <w:proofErr w:type="gramEnd"/>
     </w:p>
     <w:p>
       <w:r>
@@ -5232,7 +5767,15 @@
     </w:p>
     <w:p>
       <w:r>
-        <w:t>Does severity level affect wait time?</w:t>
+        <w:t xml:space="preserve">Does severity level affect </w:t>
+      </w:r>
+      <w:proofErr w:type="gramStart"/>
+      <w:r>
+        <w:t>wait</w:t>
+      </w:r>
+      <w:proofErr w:type="gramEnd"/>
+      <w:r>
+        <w:t xml:space="preserve"> time?</w:t>
       </w:r>
     </w:p>
     <w:p>
@@ -5591,7 +6134,15 @@
     </w:p>
     <w:p>
       <w:r>
-        <w:t>Use Excel's MEDIAN() function.</w:t>
+        <w:t>Use Excel's </w:t>
+      </w:r>
+      <w:proofErr w:type="gramStart"/>
+      <w:r>
+        <w:t>MEDIAN(</w:t>
+      </w:r>
+      <w:proofErr w:type="gramEnd"/>
+      <w:r>
+        <w:t>) function.</w:t>
       </w:r>
     </w:p>
     <w:p>
@@ -5777,7 +6328,23 @@
           <w:b/>
           <w:bCs/>
         </w:rPr>
-        <w:t>What is the average wait time based off of severity level?</w:t>
+        <w:t xml:space="preserve">What is the average wait time based </w:t>
+      </w:r>
+      <w:proofErr w:type="gramStart"/>
+      <w:r>
+        <w:rPr>
+          <w:b/>
+          <w:bCs/>
+        </w:rPr>
+        <w:t>off of</w:t>
+      </w:r>
+      <w:proofErr w:type="gramEnd"/>
+      <w:r>
+        <w:rPr>
+          <w:b/>
+          <w:bCs/>
+        </w:rPr>
+        <w:t xml:space="preserve"> severity level?</w:t>
       </w:r>
       <w:r>
         <w:rPr>
@@ -5983,12 +6550,36 @@
           <w:b/>
           <w:bCs/>
         </w:rPr>
-        <w:t xml:space="preserve">: For each severity level, what’s the amount of patients seen during peak times? In sql. </w:t>
-      </w:r>
-    </w:p>
-    <w:p>
-      <w:r>
-        <w:t>Verify your final statistic:</w:t>
+        <w:t xml:space="preserve">: For each severity level, what’s the </w:t>
+      </w:r>
+      <w:proofErr w:type="gramStart"/>
+      <w:r>
+        <w:rPr>
+          <w:b/>
+          <w:bCs/>
+        </w:rPr>
+        <w:t>amount</w:t>
+      </w:r>
+      <w:proofErr w:type="gramEnd"/>
+      <w:r>
+        <w:rPr>
+          <w:b/>
+          <w:bCs/>
+        </w:rPr>
+        <w:t xml:space="preserve"> of patients seen during peak times? In sql. </w:t>
+      </w:r>
+    </w:p>
+    <w:p>
+      <w:r>
+        <w:t xml:space="preserve">Verify your final </w:t>
+      </w:r>
+      <w:proofErr w:type="gramStart"/>
+      <w:r>
+        <w:t>statistic</w:t>
+      </w:r>
+      <w:proofErr w:type="gramEnd"/>
+      <w:r>
+        <w:t>:</w:t>
       </w:r>
       <w:r>
         <w:t xml:space="preserve"> Validated in Excel</w:t>
@@ -6076,8 +6667,37 @@
     </w:p>
     <w:p/>
     <w:p>
-      <w:r>
-        <w:t>each worksheet will more accurately be 1 for each business question I answered. So refer back to the the questions I answered in Phase 2, and that should be the number of worksheets in Phase 3. </w:t>
+      <w:proofErr w:type="gramStart"/>
+      <w:r>
+        <w:t>each</w:t>
+      </w:r>
+      <w:proofErr w:type="gramEnd"/>
+      <w:r>
+        <w:t xml:space="preserve"> worksheet will more accurately be 1 for each business question I answered. </w:t>
+      </w:r>
+      <w:proofErr w:type="gramStart"/>
+      <w:r>
+        <w:t>So</w:t>
+      </w:r>
+      <w:proofErr w:type="gramEnd"/>
+      <w:r>
+        <w:t xml:space="preserve"> </w:t>
+      </w:r>
+      <w:proofErr w:type="gramStart"/>
+      <w:r>
+        <w:t>refer back</w:t>
+      </w:r>
+      <w:proofErr w:type="gramEnd"/>
+      <w:r>
+        <w:t xml:space="preserve"> to </w:t>
+      </w:r>
+      <w:proofErr w:type="gramStart"/>
+      <w:r>
+        <w:t>the the</w:t>
+      </w:r>
+      <w:proofErr w:type="gramEnd"/>
+      <w:r>
+        <w:t xml:space="preserve"> questions I answered in Phase 2, and that should be the number of worksheets in Phase 3. </w:t>
       </w:r>
     </w:p>
     <w:p>
@@ -6137,7 +6757,15 @@
         </w:numPr>
       </w:pPr>
       <w:r>
-        <w:t>What is the average and median ER wait time?</w:t>
+        <w:t xml:space="preserve">What </w:t>
+      </w:r>
+      <w:proofErr w:type="gramStart"/>
+      <w:r>
+        <w:t>is</w:t>
+      </w:r>
+      <w:proofErr w:type="gramEnd"/>
+      <w:r>
+        <w:t xml:space="preserve"> the average and median ER wait time?</w:t>
       </w:r>
     </w:p>
     <w:p>
@@ -6161,7 +6789,15 @@
         </w:numPr>
       </w:pPr>
       <w:r>
-        <w:t xml:space="preserve">Median wait time is 67 minutes </w:t>
+        <w:t xml:space="preserve">Median </w:t>
+      </w:r>
+      <w:proofErr w:type="gramStart"/>
+      <w:r>
+        <w:t>wait</w:t>
+      </w:r>
+      <w:proofErr w:type="gramEnd"/>
+      <w:r>
+        <w:t xml:space="preserve"> time is 67 minutes </w:t>
       </w:r>
     </w:p>
     <w:p>
@@ -6212,10 +6848,18 @@
         </w:numPr>
       </w:pPr>
       <w:r>
-        <w:t>The top 3</w:t>
-      </w:r>
-      <w:r>
-        <w:t xml:space="preserve">, </w:t>
+        <w:t xml:space="preserve">The top </w:t>
+      </w:r>
+      <w:proofErr w:type="gramStart"/>
+      <w:r>
+        <w:t>3</w:t>
+      </w:r>
+      <w:r>
+        <w:t>,</w:t>
+      </w:r>
+      <w:proofErr w:type="gramEnd"/>
+      <w:r>
+        <w:t xml:space="preserve"> </w:t>
       </w:r>
       <w:r>
         <w:t xml:space="preserve">hours of the day that experienced the most patients in a day are 02:00 at 144 pts, 21:00 at 141 pts, and 0:00 with 140 pts. </w:t>
@@ -6253,8 +6897,21 @@
       <w:r>
         <w:t xml:space="preserve">than medium severity level patients. </w:t>
       </w:r>
-      <w:r>
-        <w:t xml:space="preserve">Also High severity level patients never get seen past 1 hour, and Critical severity level patients get seen between 1-15 minutes. </w:t>
+      <w:proofErr w:type="gramStart"/>
+      <w:r>
+        <w:t>Also</w:t>
+      </w:r>
+      <w:proofErr w:type="gramEnd"/>
+      <w:r>
+        <w:t xml:space="preserve"> High severity level patients never get seen past 1 hour, and Critical severity level patients get </w:t>
+      </w:r>
+      <w:proofErr w:type="gramStart"/>
+      <w:r>
+        <w:t>seen</w:t>
+      </w:r>
+      <w:proofErr w:type="gramEnd"/>
+      <w:r>
+        <w:t xml:space="preserve"> between 1-15 minutes. </w:t>
       </w:r>
     </w:p>
     <w:p>
@@ -6332,7 +6989,15 @@
         <w:t xml:space="preserve"> low severity.</w:t>
       </w:r>
       <w:r>
-        <w:t xml:space="preserve"> These patient groups accounted for the majority of ER visits during the busiest periods of the day.</w:t>
+        <w:t xml:space="preserve"> These patient groups accounted for </w:t>
+      </w:r>
+      <w:proofErr w:type="gramStart"/>
+      <w:r>
+        <w:t>the majority of</w:t>
+      </w:r>
+      <w:proofErr w:type="gramEnd"/>
+      <w:r>
+        <w:t xml:space="preserve"> ER visits during the busiest periods of the day.</w:t>
       </w:r>
       <w:r>
         <w:t xml:space="preserve"> </w:t>
@@ -6512,7 +7177,15 @@
     </w:p>
     <w:p>
       <w:r>
-        <w:t>2. Identify the primary and Foreign key(s).</w:t>
+        <w:t xml:space="preserve">2. Identify the primary and </w:t>
+      </w:r>
+      <w:proofErr w:type="gramStart"/>
+      <w:r>
+        <w:t>Foreign</w:t>
+      </w:r>
+      <w:proofErr w:type="gramEnd"/>
+      <w:r>
+        <w:t xml:space="preserve"> key(s).</w:t>
       </w:r>
     </w:p>
     <w:p>
@@ -6762,6 +7435,7 @@
       <w:r>
         <w:t xml:space="preserve"> </w:t>
       </w:r>
+      <w:proofErr w:type="gramStart"/>
       <w:r>
         <w:t>patie</w:t>
       </w:r>
@@ -6769,7 +7443,11 @@
         <w:t>nt</w:t>
       </w:r>
       <w:r>
-        <w:t>s data</w:t>
+        <w:t>s</w:t>
+      </w:r>
+      <w:proofErr w:type="gramEnd"/>
+      <w:r>
+        <w:t xml:space="preserve"> data</w:t>
       </w:r>
       <w:r>
         <w:t>se</w:t>
@@ -7068,7 +7746,15 @@
         <w:t>imary ke</w:t>
       </w:r>
       <w:r>
-        <w:t>y to i</w:t>
+        <w:t xml:space="preserve">y </w:t>
+      </w:r>
+      <w:proofErr w:type="gramStart"/>
+      <w:r>
+        <w:t>to</w:t>
+      </w:r>
+      <w:proofErr w:type="gramEnd"/>
+      <w:r>
+        <w:t xml:space="preserve"> i</w:t>
       </w:r>
       <w:r>
         <w:t>d</w:t>
@@ -7208,12 +7894,14 @@
       <w:r>
         <w:t xml:space="preserve">the </w:t>
       </w:r>
+      <w:proofErr w:type="gramStart"/>
       <w:r>
         <w:t>pati</w:t>
       </w:r>
       <w:r>
         <w:t>ents</w:t>
       </w:r>
+      <w:proofErr w:type="gramEnd"/>
       <w:r>
         <w:t xml:space="preserve"> da</w:t>
       </w:r>
@@ -7587,9 +8275,11 @@
       <w:r>
         <w:t xml:space="preserve"> </w:t>
       </w:r>
+      <w:proofErr w:type="gramStart"/>
       <w:r>
         <w:t>hour</w:t>
       </w:r>
+      <w:proofErr w:type="gramEnd"/>
       <w:r>
         <w:t>(s)</w:t>
       </w:r>
@@ -7687,7 +8377,11 @@
         <w:t>ay at t</w:t>
       </w:r>
       <w:r>
-        <w:t>he ho</w:t>
+        <w:t xml:space="preserve">he </w:t>
+      </w:r>
+      <w:proofErr w:type="gramStart"/>
+      <w:r>
+        <w:t>ho</w:t>
       </w:r>
       <w:r>
         <w:t>spital</w:t>
@@ -7696,7 +8390,11 @@
         <w:t xml:space="preserve">, </w:t>
       </w:r>
       <w:r>
-        <w:t xml:space="preserve"> or </w:t>
+        <w:t xml:space="preserve"> or</w:t>
+      </w:r>
+      <w:proofErr w:type="gramEnd"/>
+      <w:r>
+        <w:t xml:space="preserve"> </w:t>
       </w:r>
       <w:r>
         <w:t xml:space="preserve">No: </w:t>
@@ -8177,7 +8875,15 @@
         <w:t xml:space="preserve"> satisfaction scores. </w:t>
       </w:r>
       <w:r>
-        <w:t xml:space="preserve">Null values will mean patients either canceled or no-show. </w:t>
+        <w:t xml:space="preserve">Null values will mean patients </w:t>
+      </w:r>
+      <w:proofErr w:type="gramStart"/>
+      <w:r>
+        <w:t>either</w:t>
+      </w:r>
+      <w:proofErr w:type="gramEnd"/>
+      <w:r>
+        <w:t xml:space="preserve"> canceled or no-show. </w:t>
       </w:r>
     </w:p>
     <w:p>
@@ -8583,7 +9289,21 @@
         <w:t>waiting</w:t>
       </w:r>
       <w:r>
-        <w:t xml:space="preserve"> times in the Emergency Department. What could be causing these wit times?</w:t>
+        <w:t xml:space="preserve"> times in the Emergency Department. What could be causing these </w:t>
+      </w:r>
+      <w:proofErr w:type="gramStart"/>
+      <w:r>
+        <w:t>w</w:t>
+      </w:r>
+      <w:r>
+        <w:t>a</w:t>
+      </w:r>
+      <w:r>
+        <w:t>it</w:t>
+      </w:r>
+      <w:proofErr w:type="gramEnd"/>
+      <w:r>
+        <w:t xml:space="preserve"> times?</w:t>
       </w:r>
     </w:p>
     <w:p>
@@ -8602,7 +9322,15 @@
     </w:p>
     <w:p>
       <w:r>
-        <w:t>What questions I need to answer:</w:t>
+        <w:t xml:space="preserve">What questions </w:t>
+      </w:r>
+      <w:proofErr w:type="gramStart"/>
+      <w:r>
+        <w:t>I need</w:t>
+      </w:r>
+      <w:proofErr w:type="gramEnd"/>
+      <w:r>
+        <w:t xml:space="preserve"> to answer:</w:t>
       </w:r>
     </w:p>
     <w:p>
@@ -8626,7 +9354,15 @@
         </w:numPr>
       </w:pPr>
       <w:r>
-        <w:t>Are the complaints coming from all pts in general, or is the</w:t>
+        <w:t xml:space="preserve">Are the complaints coming from all pts in general, or </w:t>
+      </w:r>
+      <w:proofErr w:type="gramStart"/>
+      <w:r>
+        <w:t>is</w:t>
+      </w:r>
+      <w:proofErr w:type="gramEnd"/>
+      <w:r>
+        <w:t xml:space="preserve"> the</w:t>
       </w:r>
       <w:r>
         <w:t>re</w:t>
@@ -8843,7 +9579,7 @@
 </file>
 
 <file path=word/numbering.xml><?xml version="1.0" encoding="utf-8"?>
-<w:numbering xmlns:wpc="http://schemas.microsoft.com/office/word/2010/wordprocessingCanvas" xmlns:cx="http://schemas.microsoft.com/office/drawing/2014/chartex" xmlns:cx1="http://schemas.microsoft.com/office/drawing/2015/9/8/chartex" xmlns:cx2="http://schemas.microsoft.com/office/drawing/2015/10/21/chartex" xmlns:cx3="http://schemas.microsoft.com/office/drawing/2016/5/9/chartex" xmlns:cx4="http://schemas.microsoft.com/office/drawing/2016/5/10/chartex" xmlns:cx5="http://schemas.microsoft.com/office/drawing/2016/5/11/chartex" xmlns:cx6="http://schemas.microsoft.com/office/drawing/2016/5/12/chartex" xmlns:cx7="http://schemas.microsoft.com/office/drawing/2016/5/13/chartex" xmlns:cx8="http://schemas.microsoft.com/office/drawing/2016/5/14/chartex" xmlns:mc="http://schemas.openxmlformats.org/markup-compatibility/2006" xmlns:aink="http://schemas.microsoft.com/office/drawing/2016/ink" xmlns:am3d="http://schemas.microsoft.com/office/drawing/2017/model3d" xmlns:o="urn:schemas-microsoft-com:office:office" xmlns:oel="http://schemas.microsoft.com/office/2019/extlst" xmlns:r="http://schemas.openxmlformats.org/officeDocument/2006/relationships" xmlns:m="http://schemas.openxmlformats.org/officeDocument/2006/math" xmlns:v="urn:schemas-microsoft-com:vml" xmlns:wp14="http://schemas.microsoft.com/office/word/2010/wordprocessingDrawing" xmlns:wp="http://schemas.openxmlformats.org/drawingml/2006/wordprocessingDrawing" xmlns:w10="urn:schemas-microsoft-com:office:word" xmlns:w="http://schemas.openxmlformats.org/wordprocessingml/2006/main" xmlns:w14="http://schemas.microsoft.com/office/word/2010/wordml" xmlns:w15="http://schemas.microsoft.com/office/word/2012/wordml" xmlns:w16cex="http://schemas.microsoft.com/office/word/2018/wordml/cex" xmlns:w16cid="http://schemas.microsoft.com/office/word/2016/wordml/cid" xmlns:w16="http://schemas.microsoft.com/office/word/2018/wordml" xmlns:w16du="http://schemas.microsoft.com/office/word/2023/wordml/word16du" xmlns:w16sdtdh="http://schemas.microsoft.com/office/word/2020/wordml/sdtdatahash" xmlns:w16sdtfl="http://schemas.microsoft.com/office/word/2024/wordml/sdtformatlock" xmlns:w16se="http://schemas.microsoft.com/office/word/2015/wordml/symex" xmlns:wpg="http://schemas.microsoft.com/office/word/2010/wordprocessingGroup" xmlns:wpi="http://schemas.microsoft.com/office/word/2010/wordprocessingInk" xmlns:wne="http://schemas.microsoft.com/office/word/2006/wordml" xmlns:wps="http://schemas.microsoft.com/office/word/2010/wordprocessingShape" mc:Ignorable="w14 w15 w16se w16cid w16 w16cex w16sdtdh w16sdtfl w16du wp14">
+<w:numbering xmlns:wpc="http://schemas.microsoft.com/office/word/2010/wordprocessingCanvas" xmlns:cx="http://schemas.microsoft.com/office/drawing/2014/chartex" xmlns:cx1="http://schemas.microsoft.com/office/drawing/2015/9/8/chartex" xmlns:cx2="http://schemas.microsoft.com/office/drawing/2015/10/21/chartex" xmlns:cx3="http://schemas.microsoft.com/office/drawing/2016/5/9/chartex" xmlns:cx4="http://schemas.microsoft.com/office/drawing/2016/5/10/chartex" xmlns:cx5="http://schemas.microsoft.com/office/drawing/2016/5/11/chartex" xmlns:cx6="http://schemas.microsoft.com/office/drawing/2016/5/12/chartex" xmlns:cx7="http://schemas.microsoft.com/office/drawing/2016/5/13/chartex" xmlns:cx8="http://schemas.microsoft.com/office/drawing/2016/5/14/chartex" xmlns:mc="http://schemas.openxmlformats.org/markup-compatibility/2006" xmlns:aink="http://schemas.microsoft.com/office/drawing/2016/ink" xmlns:am3d="http://schemas.microsoft.com/office/drawing/2017/model3d" xmlns:o="urn:schemas-microsoft-com:office:office" xmlns:oel="http://schemas.microsoft.com/office/2019/extlst" xmlns:r="http://schemas.openxmlformats.org/officeDocument/2006/relationships" xmlns:m="http://schemas.openxmlformats.org/officeDocument/2006/math" xmlns:v="urn:schemas-microsoft-com:vml" xmlns:wp14="http://schemas.microsoft.com/office/word/2010/wordprocessingDrawing" xmlns:wp="http://schemas.openxmlformats.org/drawingml/2006/wordprocessingDrawing" xmlns:w10="urn:schemas-microsoft-com:office:word" xmlns:w="http://schemas.openxmlformats.org/wordprocessingml/2006/main" xmlns:w14="http://schemas.microsoft.com/office/word/2010/wordml" xmlns:w15="http://schemas.microsoft.com/office/word/2012/wordml" xmlns:w16cei="http://schemas.microsoft.com/office/word/2026/wordml/cei" xmlns:w16cex="http://schemas.microsoft.com/office/word/2018/wordml/cex" xmlns:w16cid="http://schemas.microsoft.com/office/word/2016/wordml/cid" xmlns:w16="http://schemas.microsoft.com/office/word/2018/wordml" xmlns:w16du="http://schemas.microsoft.com/office/word/2023/wordml/word16du" xmlns:w16sdtdh="http://schemas.microsoft.com/office/word/2020/wordml/sdtdatahash" xmlns:w16sdtfl="http://schemas.microsoft.com/office/word/2024/wordml/sdtformatlock" xmlns:w16se="http://schemas.microsoft.com/office/word/2015/wordml/symex" xmlns:wpg="http://schemas.microsoft.com/office/word/2010/wordprocessingGroup" xmlns:wpi="http://schemas.microsoft.com/office/word/2010/wordprocessingInk" xmlns:wne="http://schemas.microsoft.com/office/word/2006/wordml" xmlns:wps="http://schemas.microsoft.com/office/word/2010/wordprocessingShape" mc:Ignorable="w14 w15 w16se w16cid w16 w16cex w16sdtdh w16sdtfl w16du wp14">
   <w:abstractNum w:abstractNumId="0" w15:restartNumberingAfterBreak="0">
     <w:nsid w:val="005E5575"/>
     <w:multiLevelType w:val="multilevel"/>
@@ -11970,6 +12706,7 @@
   <w:style w:type="character" w:default="1" w:styleId="DefaultParagraphFont">
     <w:name w:val="Default Paragraph Font"/>
     <w:uiPriority w:val="1"/>
+    <w:semiHidden/>
     <w:unhideWhenUsed/>
   </w:style>
   <w:style w:type="table" w:default="1" w:styleId="TableNormal">

</xml_diff>